<commit_message>
MetaMapper v2: incorporate sfdc-soup/sfdc-happy-api design improvements
- Data model: add Is_Circular__c, Is_Dynamic_Reference__c, Context_Data__c (pills),
  Source__c, Summary_JSON__c fields
- Architecture: type-specific handler pattern (IDependencyTypeHandler interface +
  CustomFieldHandler, ApexClassHandler, FlowHandler)
- Query strategy: reduce IN chunk to 100 IDs, add QueryMore, HTTP 414 reactive split
- Supplemental queries: cover 6 MetadataComponentDependency gaps
- Exports: add package.xml format
- UI: circular/dynamic/supplemental node flags, stats tile, Source filter in graph

Co-Authored-By: Claude Sonnet 4.6 <noreply@anthropic.com>
</commit_message>
<xml_diff>
--- a/projects/meta-mapper/MetaMapper_Technical_Design.docx
+++ b/projects/meta-mapper/MetaMapper_Technical_Design.docx
@@ -38,7 +38,7 @@
           <w:color w:val="706E6B"/>
           <w:sz w:val="24"/>
         </w:rPr>
-        <w:t>Version 1.0  |  March 2026</w:t>
+        <w:t>Version 2.0  |  March 2026</w:t>
       </w:r>
     </w:p>
     <w:p/>
@@ -59,13 +59,13 @@
         <w:rPr>
           <w:i/>
           <w:color w:val="181818"/>
-          <w:sz w:val="22"/>
+          <w:sz w:val="20"/>
         </w:rPr>
-        <w:t>Architecture: 100% Native Salesforce Application</w:t>
+        <w:t>Architecture: 100% Native Salesforce  |  Enterprise/LDV  |  Open Source</w:t>
         <w:br/>
-        <w:t>Target Environment: Large / Enterprise Organizations (LDV &amp; High Complexity)</w:t>
+        <w:t>GitHub: energidi/claude-knowledge-base / projects/meta-mapper</w:t>
         <w:br/>
-        <w:t>Open Source | GitHub: energidi/claude-knowledge-base / projects/meta-mapper</w:t>
+        <w:t>Reference implementations: sfdc-soup v18.4.0  |  sfdc-happy-api v3.1.0</w:t>
       </w:r>
     </w:p>
     <w:p>
@@ -106,7 +106,7 @@
           <w:color w:val="181818"/>
           <w:sz w:val="21"/>
         </w:rPr>
-        <w:t>MetaMapper is a native Salesforce change-intelligence application designed to safely map and visualize deep metadata dependencies. Inspired by off-platform tools like HappySoup.io, MetaMapper operates entirely within the Salesforce trust boundary, making it fully compliant with Enterprise InfoSec policies.</w:t>
+        <w:t>MetaMapper is a native Salesforce change-intelligence application that safely maps and visualizes deep metadata dependencies. Inspired by off-platform tools like HappySoup.io, MetaMapper operates entirely within the Salesforce trust boundary, making it fully compliant with Enterprise InfoSec policies.</w:t>
       </w:r>
     </w:p>
     <w:p>
@@ -120,7 +120,7 @@
           <w:color w:val="181818"/>
           <w:sz w:val="21"/>
         </w:rPr>
-        <w:t>By utilizing Asynchronous Queueable chaining and Custom Object state management, it bypasses standard synchronous Governor Limits (10-second CPU, 6MB Heap) to recursively query the Tooling API and build multi-level dependency graphs.</w:t>
+        <w:t>By utilizing Asynchronous Queueable chaining and Custom Object state management, it bypasses synchronous Governor Limits to recursively query the Tooling API and build multi-level dependency graphs. All runtime data stays inside the org - no external APIs, no CDN calls at runtime.</w:t>
       </w:r>
     </w:p>
     <w:p>
@@ -134,7 +134,7 @@
           <w:color w:val="181818"/>
           <w:sz w:val="21"/>
         </w:rPr>
-        <w:t>MetaMapper is distributed as an open-source SFDX project. All runtime data remains inside the org - no external APIs, no CDN calls at runtime.</w:t>
+        <w:t>Version 2.0 of this design incorporates architectural improvements derived from analysis of sfdc-soup (v18.4.0) and sfdc-happy-api (v3.1.0) - the leading open-source reference implementations for this problem space.</w:t>
       </w:r>
     </w:p>
     <w:p>
@@ -233,7 +233,7 @@
                 <w:color w:val="181818"/>
                 <w:sz w:val="20"/>
               </w:rPr>
-              <w:t>Deployment model</w:t>
+              <w:t>Deployment</w:t>
             </w:r>
           </w:p>
         </w:tc>
@@ -248,7 +248,7 @@
                 <w:color w:val="181818"/>
                 <w:sz w:val="20"/>
               </w:rPr>
-              <w:t>Unlocked Package + SFDX project on GitHub</w:t>
+              <w:t>Unlocked Package + SFDX on GitHub</w:t>
             </w:r>
           </w:p>
         </w:tc>
@@ -263,7 +263,7 @@
                 <w:color w:val="181818"/>
                 <w:sz w:val="20"/>
               </w:rPr>
-              <w:t>Open source, version-controlled, no AppExchange dependency</w:t>
+              <w:t>Open source, version-controlled, no AppExchange</w:t>
             </w:r>
           </w:p>
         </w:tc>
@@ -295,7 +295,7 @@
                 <w:color w:val="181818"/>
                 <w:sz w:val="20"/>
               </w:rPr>
-              <w:t>Apache ECharts bundled as Static Resource</w:t>
+              <w:t>Apache ECharts (Static Resource)</w:t>
             </w:r>
           </w:p>
         </w:tc>
@@ -327,7 +327,7 @@
                 <w:color w:val="181818"/>
                 <w:sz w:val="20"/>
               </w:rPr>
-              <w:t>Live progress updates</w:t>
+              <w:t>Live progress</w:t>
             </w:r>
           </w:p>
         </w:tc>
@@ -389,7 +389,7 @@
                 <w:color w:val="181818"/>
                 <w:sz w:val="20"/>
               </w:rPr>
-              <w:t>Visited_IDs__c JSON field on Dependency_Job__c</w:t>
+              <w:t>Visited_IDs__c + Is_Circular__c flag</w:t>
             </w:r>
           </w:p>
         </w:tc>
@@ -404,7 +404,7 @@
                 <w:color w:val="181818"/>
                 <w:sz w:val="20"/>
               </w:rPr>
-              <w:t>Prevents infinite Queueable chains on circular metadata dependencies</w:t>
+              <w:t>Mark circular nodes for UI display; skip re-traversal</w:t>
             </w:r>
           </w:p>
         </w:tc>
@@ -436,7 +436,7 @@
                 <w:color w:val="181818"/>
                 <w:sz w:val="20"/>
               </w:rPr>
-              <w:t>OAuth 2.0 loopback via Connected App + Named Credential</w:t>
+              <w:t>OAuth 2.0 loopback via Named Credential</w:t>
             </w:r>
           </w:p>
         </w:tc>
@@ -468,7 +468,7 @@
                 <w:color w:val="181818"/>
                 <w:sz w:val="20"/>
               </w:rPr>
-              <w:t>Security enforcement</w:t>
+              <w:t>Security</w:t>
             </w:r>
           </w:p>
         </w:tc>
@@ -483,7 +483,7 @@
                 <w:color w:val="181818"/>
                 <w:sz w:val="20"/>
               </w:rPr>
-              <w:t>USER_MODE on all DML/SOQL; Private OWD; Permission Set</w:t>
+              <w:t>USER_MODE on all DML/SOQL; Private OWD</w:t>
             </w:r>
           </w:p>
         </w:tc>
@@ -498,7 +498,7 @@
                 <w:color w:val="181818"/>
                 <w:sz w:val="20"/>
               </w:rPr>
-              <w:t>Enterprise InfoSec compliant; runtime FLS and CRUD checks</w:t>
+              <w:t>Enterprise InfoSec compliant; runtime FLS and CRUD</w:t>
             </w:r>
           </w:p>
         </w:tc>
@@ -515,7 +515,7 @@
                 <w:color w:val="181818"/>
                 <w:sz w:val="20"/>
               </w:rPr>
-              <w:t>Data lifecycle</w:t>
+              <w:t>DLM</w:t>
             </w:r>
           </w:p>
         </w:tc>
@@ -530,7 +530,7 @@
                 <w:color w:val="181818"/>
                 <w:sz w:val="20"/>
               </w:rPr>
-              <w:t>Nightly Batch hard-delete of Jobs older than 24 hours</w:t>
+              <w:t>Nightly Batch hard-delete Jobs &gt; 24h</w:t>
             </w:r>
           </w:p>
         </w:tc>
@@ -545,7 +545,7 @@
                 <w:color w:val="181818"/>
                 <w:sz w:val="20"/>
               </w:rPr>
-              <w:t>Prevents storage bloat in LDV environments</w:t>
+              <w:t>Prevent storage bloat in LDV environments</w:t>
             </w:r>
           </w:p>
         </w:tc>
@@ -562,7 +562,7 @@
                 <w:color w:val="181818"/>
                 <w:sz w:val="20"/>
               </w:rPr>
-              <w:t>Source API version</w:t>
+              <w:t>IN clause chunk size</w:t>
             </w:r>
           </w:p>
         </w:tc>
@@ -577,7 +577,7 @@
                 <w:color w:val="181818"/>
                 <w:sz w:val="20"/>
               </w:rPr>
-              <w:t>v66.0</w:t>
+              <w:t>100 IDs max per Tooling API query</w:t>
             </w:r>
           </w:p>
         </w:tc>
@@ -585,6 +585,147 @@
           <w:tcPr>
             <w:tcW w:type="dxa" w:w="3022"/>
             <w:shd w:val="clear" w:color="auto" w:fill="FFFFFF"/>
+          </w:tcPr>
+          <w:p>
+            <w:r>
+              <w:rPr>
+                <w:color w:val="181818"/>
+                <w:sz w:val="20"/>
+              </w:rPr>
+              <w:t>sfdc-soup confirmed HTTP 414 above ~300 IDs; 100 is safe</w:t>
+            </w:r>
+          </w:p>
+        </w:tc>
+      </w:tr>
+      <w:tr>
+        <w:tc>
+          <w:tcPr>
+            <w:tcW w:type="dxa" w:w="3022"/>
+            <w:shd w:val="clear" w:color="auto" w:fill="F2F4F7"/>
+          </w:tcPr>
+          <w:p>
+            <w:r>
+              <w:rPr>
+                <w:color w:val="181818"/>
+                <w:sz w:val="20"/>
+              </w:rPr>
+              <w:t>Supplemental queries</w:t>
+            </w:r>
+          </w:p>
+        </w:tc>
+        <w:tc>
+          <w:tcPr>
+            <w:tcW w:type="dxa" w:w="3022"/>
+            <w:shd w:val="clear" w:color="auto" w:fill="F2F4F7"/>
+          </w:tcPr>
+          <w:p>
+            <w:r>
+              <w:rPr>
+                <w:color w:val="181818"/>
+                <w:sz w:val="20"/>
+              </w:rPr>
+              <w:t>Type-specific handler classes</w:t>
+            </w:r>
+          </w:p>
+        </w:tc>
+        <w:tc>
+          <w:tcPr>
+            <w:tcW w:type="dxa" w:w="3022"/>
+            <w:shd w:val="clear" w:color="auto" w:fill="F2F4F7"/>
+          </w:tcPr>
+          <w:p>
+            <w:r>
+              <w:rPr>
+                <w:color w:val="181818"/>
+                <w:sz w:val="20"/>
+              </w:rPr>
+              <w:t>MetadataComponentDependency misses 6 dependency categories</w:t>
+            </w:r>
+          </w:p>
+        </w:tc>
+      </w:tr>
+      <w:tr>
+        <w:tc>
+          <w:tcPr>
+            <w:tcW w:type="dxa" w:w="3022"/>
+            <w:shd w:val="clear" w:color="auto" w:fill="FFFFFF"/>
+          </w:tcPr>
+          <w:p>
+            <w:r>
+              <w:rPr>
+                <w:color w:val="181818"/>
+                <w:sz w:val="20"/>
+              </w:rPr>
+              <w:t>QueryMore</w:t>
+            </w:r>
+          </w:p>
+        </w:tc>
+        <w:tc>
+          <w:tcPr>
+            <w:tcW w:type="dxa" w:w="3022"/>
+            <w:shd w:val="clear" w:color="auto" w:fill="FFFFFF"/>
+          </w:tcPr>
+          <w:p>
+            <w:r>
+              <w:rPr>
+                <w:color w:val="181818"/>
+                <w:sz w:val="20"/>
+              </w:rPr>
+              <w:t>Iterative nextRecordsUrl follow</w:t>
+            </w:r>
+          </w:p>
+        </w:tc>
+        <w:tc>
+          <w:tcPr>
+            <w:tcW w:type="dxa" w:w="3022"/>
+            <w:shd w:val="clear" w:color="auto" w:fill="FFFFFF"/>
+          </w:tcPr>
+          <w:p>
+            <w:r>
+              <w:rPr>
+                <w:color w:val="181818"/>
+                <w:sz w:val="20"/>
+              </w:rPr>
+              <w:t>Tooling API caps at 2,000 rows per response</w:t>
+            </w:r>
+          </w:p>
+        </w:tc>
+      </w:tr>
+      <w:tr>
+        <w:tc>
+          <w:tcPr>
+            <w:tcW w:type="dxa" w:w="3022"/>
+            <w:shd w:val="clear" w:color="auto" w:fill="F2F4F7"/>
+          </w:tcPr>
+          <w:p>
+            <w:r>
+              <w:rPr>
+                <w:color w:val="181818"/>
+                <w:sz w:val="20"/>
+              </w:rPr>
+              <w:t>Source API version</w:t>
+            </w:r>
+          </w:p>
+        </w:tc>
+        <w:tc>
+          <w:tcPr>
+            <w:tcW w:type="dxa" w:w="3022"/>
+            <w:shd w:val="clear" w:color="auto" w:fill="F2F4F7"/>
+          </w:tcPr>
+          <w:p>
+            <w:r>
+              <w:rPr>
+                <w:color w:val="181818"/>
+                <w:sz w:val="20"/>
+              </w:rPr>
+              <w:t>v66.0</w:t>
+            </w:r>
+          </w:p>
+        </w:tc>
+        <w:tc>
+          <w:tcPr>
+            <w:tcW w:type="dxa" w:w="3022"/>
+            <w:shd w:val="clear" w:color="auto" w:fill="F2F4F7"/>
           </w:tcPr>
           <w:p>
             <w:r>
@@ -632,7 +773,7 @@
           <w:color w:val="181818"/>
           <w:sz w:val="21"/>
         </w:rPr>
-        <w:t>MetaMapper uses a Custom Object state-management architecture to act as both a temporary processing queue and a historical record, persisting engine state between Queueable executions.</w:t>
+        <w:t>MetaMapper uses a Custom Object state-management architecture. State persists between Queueable executions in the database, enabling unlimited depth traversal without hitting synchronous transaction limits.</w:t>
       </w:r>
     </w:p>
     <w:p>
@@ -753,7 +894,7 @@
                 <w:color w:val="181818"/>
                 <w:sz w:val="20"/>
               </w:rPr>
-              <w:t>CustomField, ValidationRule, Flow, ApexClass, etc.</w:t>
+              <w:t>CustomField, ValidationRule, Flow, ApexClass, ApexTrigger, WorkflowRule, etc.</w:t>
             </w:r>
           </w:p>
         </w:tc>
@@ -894,7 +1035,7 @@
                 <w:color w:val="181818"/>
                 <w:sz w:val="20"/>
               </w:rPr>
-              <w:t>Default: true. Drops inactive Flow versions to preserve heap</w:t>
+              <w:t>Default: true. Drops inactive Flow versions to preserve heap.</w:t>
             </w:r>
           </w:p>
         </w:tc>
@@ -1083,6 +1224,53 @@
                 <w:sz w:val="20"/>
               </w:rPr>
               <w:t>Running counter published to progress bar via Platform Event</w:t>
+            </w:r>
+          </w:p>
+        </w:tc>
+      </w:tr>
+      <w:tr>
+        <w:tc>
+          <w:tcPr>
+            <w:tcW w:type="dxa" w:w="3022"/>
+            <w:shd w:val="clear" w:color="auto" w:fill="F2F4F7"/>
+          </w:tcPr>
+          <w:p>
+            <w:r>
+              <w:rPr>
+                <w:color w:val="181818"/>
+                <w:sz w:val="20"/>
+              </w:rPr>
+              <w:t>Summary_JSON__c</w:t>
+            </w:r>
+          </w:p>
+        </w:tc>
+        <w:tc>
+          <w:tcPr>
+            <w:tcW w:type="dxa" w:w="3022"/>
+            <w:shd w:val="clear" w:color="auto" w:fill="F2F4F7"/>
+          </w:tcPr>
+          <w:p>
+            <w:r>
+              <w:rPr>
+                <w:color w:val="181818"/>
+                <w:sz w:val="20"/>
+              </w:rPr>
+              <w:t>Long Text 32768</w:t>
+            </w:r>
+          </w:p>
+        </w:tc>
+        <w:tc>
+          <w:tcPr>
+            <w:tcW w:type="dxa" w:w="3022"/>
+            <w:shd w:val="clear" w:color="auto" w:fill="F2F4F7"/>
+          </w:tcPr>
+          <w:p>
+            <w:r>
+              <w:rPr>
+                <w:color w:val="181818"/>
+                <w:sz w:val="20"/>
+              </w:rPr>
+              <w:t>JSON map {MetadataType: count} - populated on Completed; drives stats tile in UI</w:t>
             </w:r>
           </w:p>
         </w:tc>
@@ -1494,6 +1682,194 @@
           </w:p>
         </w:tc>
       </w:tr>
+      <w:tr>
+        <w:tc>
+          <w:tcPr>
+            <w:tcW w:type="dxa" w:w="3022"/>
+            <w:shd w:val="clear" w:color="auto" w:fill="FFFFFF"/>
+          </w:tcPr>
+          <w:p>
+            <w:r>
+              <w:rPr>
+                <w:color w:val="181818"/>
+                <w:sz w:val="20"/>
+              </w:rPr>
+              <w:t>Is_Circular__c</w:t>
+            </w:r>
+          </w:p>
+        </w:tc>
+        <w:tc>
+          <w:tcPr>
+            <w:tcW w:type="dxa" w:w="3022"/>
+            <w:shd w:val="clear" w:color="auto" w:fill="FFFFFF"/>
+          </w:tcPr>
+          <w:p>
+            <w:r>
+              <w:rPr>
+                <w:color w:val="181818"/>
+                <w:sz w:val="20"/>
+              </w:rPr>
+              <w:t>Checkbox</w:t>
+            </w:r>
+          </w:p>
+        </w:tc>
+        <w:tc>
+          <w:tcPr>
+            <w:tcW w:type="dxa" w:w="3022"/>
+            <w:shd w:val="clear" w:color="auto" w:fill="FFFFFF"/>
+          </w:tcPr>
+          <w:p>
+            <w:r>
+              <w:rPr>
+                <w:color w:val="181818"/>
+                <w:sz w:val="20"/>
+              </w:rPr>
+              <w:t>True if node already appears higher in the tree - displayed but not re-traversed</w:t>
+            </w:r>
+          </w:p>
+        </w:tc>
+      </w:tr>
+      <w:tr>
+        <w:tc>
+          <w:tcPr>
+            <w:tcW w:type="dxa" w:w="3022"/>
+            <w:shd w:val="clear" w:color="auto" w:fill="F2F4F7"/>
+          </w:tcPr>
+          <w:p>
+            <w:r>
+              <w:rPr>
+                <w:color w:val="181818"/>
+                <w:sz w:val="20"/>
+              </w:rPr>
+              <w:t>Is_Dynamic_Reference__c</w:t>
+            </w:r>
+          </w:p>
+        </w:tc>
+        <w:tc>
+          <w:tcPr>
+            <w:tcW w:type="dxa" w:w="3022"/>
+            <w:shd w:val="clear" w:color="auto" w:fill="F2F4F7"/>
+          </w:tcPr>
+          <w:p>
+            <w:r>
+              <w:rPr>
+                <w:color w:val="181818"/>
+                <w:sz w:val="20"/>
+              </w:rPr>
+              <w:t>Checkbox</w:t>
+            </w:r>
+          </w:p>
+        </w:tc>
+        <w:tc>
+          <w:tcPr>
+            <w:tcW w:type="dxa" w:w="3022"/>
+            <w:shd w:val="clear" w:color="auto" w:fill="F2F4F7"/>
+          </w:tcPr>
+          <w:p>
+            <w:r>
+              <w:rPr>
+                <w:color w:val="181818"/>
+                <w:sz w:val="20"/>
+              </w:rPr>
+              <w:t>True if reference cannot be statically resolved (e.g. dynamic Apex string)</w:t>
+            </w:r>
+          </w:p>
+        </w:tc>
+      </w:tr>
+      <w:tr>
+        <w:tc>
+          <w:tcPr>
+            <w:tcW w:type="dxa" w:w="3022"/>
+            <w:shd w:val="clear" w:color="auto" w:fill="FFFFFF"/>
+          </w:tcPr>
+          <w:p>
+            <w:r>
+              <w:rPr>
+                <w:color w:val="181818"/>
+                <w:sz w:val="20"/>
+              </w:rPr>
+              <w:t>Context_Data__c</w:t>
+            </w:r>
+          </w:p>
+        </w:tc>
+        <w:tc>
+          <w:tcPr>
+            <w:tcW w:type="dxa" w:w="3022"/>
+            <w:shd w:val="clear" w:color="auto" w:fill="FFFFFF"/>
+          </w:tcPr>
+          <w:p>
+            <w:r>
+              <w:rPr>
+                <w:color w:val="181818"/>
+                <w:sz w:val="20"/>
+              </w:rPr>
+              <w:t>Long Text 32768</w:t>
+            </w:r>
+          </w:p>
+        </w:tc>
+        <w:tc>
+          <w:tcPr>
+            <w:tcW w:type="dxa" w:w="3022"/>
+            <w:shd w:val="clear" w:color="auto" w:fill="FFFFFF"/>
+          </w:tcPr>
+          <w:p>
+            <w:r>
+              <w:rPr>
+                <w:color w:val="181818"/>
+                <w:sz w:val="20"/>
+              </w:rPr>
+              <w:t>JSON pills: isWrite, activeVersions, filterUsage, parentObject, etc.</w:t>
+            </w:r>
+          </w:p>
+        </w:tc>
+      </w:tr>
+      <w:tr>
+        <w:tc>
+          <w:tcPr>
+            <w:tcW w:type="dxa" w:w="3022"/>
+            <w:shd w:val="clear" w:color="auto" w:fill="F2F4F7"/>
+          </w:tcPr>
+          <w:p>
+            <w:r>
+              <w:rPr>
+                <w:color w:val="181818"/>
+                <w:sz w:val="20"/>
+              </w:rPr>
+              <w:t>Source__c</w:t>
+            </w:r>
+          </w:p>
+        </w:tc>
+        <w:tc>
+          <w:tcPr>
+            <w:tcW w:type="dxa" w:w="3022"/>
+            <w:shd w:val="clear" w:color="auto" w:fill="F2F4F7"/>
+          </w:tcPr>
+          <w:p>
+            <w:r>
+              <w:rPr>
+                <w:color w:val="181818"/>
+                <w:sz w:val="20"/>
+              </w:rPr>
+              <w:t>Picklist</w:t>
+            </w:r>
+          </w:p>
+        </w:tc>
+        <w:tc>
+          <w:tcPr>
+            <w:tcW w:type="dxa" w:w="3022"/>
+            <w:shd w:val="clear" w:color="auto" w:fill="F2F4F7"/>
+          </w:tcPr>
+          <w:p>
+            <w:r>
+              <w:rPr>
+                <w:color w:val="181818"/>
+                <w:sz w:val="20"/>
+              </w:rPr>
+              <w:t>ToolingAPI or Supplemental - tracks discovery method</w:t>
+            </w:r>
+          </w:p>
+        </w:tc>
+      </w:tr>
     </w:tbl>
     <w:p/>
     <w:p>
@@ -1507,7 +1883,7 @@
           <w:color w:val="0070D2"/>
           <w:sz w:val="28"/>
         </w:rPr>
-        <w:t>3.3 Dependency_Status__e (Platform Event)</w:t>
+        <w:t>3.3 Context_Data__c (Pills) by Metadata Type</w:t>
       </w:r>
     </w:p>
     <w:tbl>
@@ -1535,7 +1911,7 @@
                 <w:color w:val="FFFFFF"/>
                 <w:sz w:val="20"/>
               </w:rPr>
-              <w:t>Field</w:t>
+              <w:t>Type</w:t>
             </w:r>
           </w:p>
         </w:tc>
@@ -1551,7 +1927,7 @@
                 <w:color w:val="FFFFFF"/>
                 <w:sz w:val="20"/>
               </w:rPr>
-              <w:t>Type</w:t>
+              <w:t>JSON Shape</w:t>
             </w:r>
           </w:p>
         </w:tc>
@@ -1584,7 +1960,7 @@
                 <w:color w:val="181818"/>
                 <w:sz w:val="20"/>
               </w:rPr>
-              <w:t>Job_Id__c</w:t>
+              <w:t>ApexClass / ApexTrigger</w:t>
             </w:r>
           </w:p>
         </w:tc>
@@ -1599,7 +1975,7 @@
                 <w:color w:val="181818"/>
                 <w:sz w:val="20"/>
               </w:rPr>
-              <w:t>Text 18</w:t>
+              <w:t>{"isWrite": true}</w:t>
             </w:r>
           </w:p>
         </w:tc>
@@ -1614,7 +1990,7 @@
                 <w:color w:val="181818"/>
                 <w:sz w:val="20"/>
               </w:rPr>
-              <w:t>Links event to the parent Dependency_Job__c</w:t>
+              <w:t>Whether the class writes to the target field/object</w:t>
             </w:r>
           </w:p>
         </w:tc>
@@ -1631,7 +2007,7 @@
                 <w:color w:val="181818"/>
                 <w:sz w:val="20"/>
               </w:rPr>
-              <w:t>Status__c</w:t>
+              <w:t>Flow</w:t>
             </w:r>
           </w:p>
         </w:tc>
@@ -1646,7 +2022,7 @@
                 <w:color w:val="181818"/>
                 <w:sz w:val="20"/>
               </w:rPr>
-              <w:t>Text 50</w:t>
+              <w:t>{"activeVersions": 3, "isActive": true}</w:t>
             </w:r>
           </w:p>
         </w:tc>
@@ -1661,7 +2037,7 @@
                 <w:color w:val="181818"/>
                 <w:sz w:val="20"/>
               </w:rPr>
-              <w:t>Mirrors Job Status__c value</w:t>
+              <w:t>Active version count and current status</w:t>
             </w:r>
           </w:p>
         </w:tc>
@@ -1678,7 +2054,7 @@
                 <w:color w:val="181818"/>
                 <w:sz w:val="20"/>
               </w:rPr>
-              <w:t>Nodes_Processed__c</w:t>
+              <w:t>WorkflowRule</w:t>
             </w:r>
           </w:p>
         </w:tc>
@@ -1693,7 +2069,7 @@
                 <w:color w:val="181818"/>
                 <w:sz w:val="20"/>
               </w:rPr>
-              <w:t>Number</w:t>
+              <w:t>{"isActive": true, "triggerType": "onInsertOrUpdate"}</w:t>
             </w:r>
           </w:p>
         </w:tc>
@@ -1708,7 +2084,7 @@
                 <w:color w:val="181818"/>
                 <w:sz w:val="20"/>
               </w:rPr>
-              <w:t>Current progress counter</w:t>
+              <w:t>Rule activation and trigger type</w:t>
             </w:r>
           </w:p>
         </w:tc>
@@ -1725,7 +2101,7 @@
                 <w:color w:val="181818"/>
                 <w:sz w:val="20"/>
               </w:rPr>
-              <w:t>Message__c</w:t>
+              <w:t>CustomField</w:t>
             </w:r>
           </w:p>
         </w:tc>
@@ -1740,7 +2116,7 @@
                 <w:color w:val="181818"/>
                 <w:sz w:val="20"/>
               </w:rPr>
-              <w:t>Text 255</w:t>
+              <w:t>{"parentObject": "Account", "parentType": "CustomObject"}</w:t>
             </w:r>
           </w:p>
         </w:tc>
@@ -1755,7 +2131,54 @@
                 <w:color w:val="181818"/>
                 <w:sz w:val="20"/>
               </w:rPr>
-              <w:t>Human-readable status message</w:t>
+              <w:t>Parent object context</w:t>
+            </w:r>
+          </w:p>
+        </w:tc>
+      </w:tr>
+      <w:tr>
+        <w:tc>
+          <w:tcPr>
+            <w:tcW w:type="dxa" w:w="3022"/>
+            <w:shd w:val="clear" w:color="auto" w:fill="F2F4F7"/>
+          </w:tcPr>
+          <w:p>
+            <w:r>
+              <w:rPr>
+                <w:color w:val="181818"/>
+                <w:sz w:val="20"/>
+              </w:rPr>
+              <w:t>Report</w:t>
+            </w:r>
+          </w:p>
+        </w:tc>
+        <w:tc>
+          <w:tcPr>
+            <w:tcW w:type="dxa" w:w="3022"/>
+            <w:shd w:val="clear" w:color="auto" w:fill="F2F4F7"/>
+          </w:tcPr>
+          <w:p>
+            <w:r>
+              <w:rPr>
+                <w:color w:val="181818"/>
+                <w:sz w:val="20"/>
+              </w:rPr>
+              <w:t>{"filterUsage": ["filter", "grouping", "column"]}</w:t>
+            </w:r>
+          </w:p>
+        </w:tc>
+        <w:tc>
+          <w:tcPr>
+            <w:tcW w:type="dxa" w:w="3022"/>
+            <w:shd w:val="clear" w:color="auto" w:fill="F2F4F7"/>
+          </w:tcPr>
+          <w:p>
+            <w:r>
+              <w:rPr>
+                <w:color w:val="181818"/>
+                <w:sz w:val="20"/>
+              </w:rPr>
+              <w:t>How the field is used in the report</w:t>
             </w:r>
           </w:p>
         </w:tc>
@@ -1773,7 +2196,273 @@
           <w:color w:val="0070D2"/>
           <w:sz w:val="28"/>
         </w:rPr>
-        <w:t>3.4 Data Lifecycle Management</w:t>
+        <w:t>3.4 Dependency_Status__e (Platform Event)</w:t>
+      </w:r>
+    </w:p>
+    <w:tbl>
+      <w:tblPr>
+        <w:tblStyle w:val="TableGrid"/>
+        <w:tblW w:type="auto" w:w="0"/>
+        <w:jc w:val="left"/>
+        <w:tblLook w:firstColumn="1" w:firstRow="1" w:lastColumn="0" w:lastRow="0" w:noHBand="0" w:noVBand="1" w:val="04A0"/>
+      </w:tblPr>
+      <w:tblGrid>
+        <w:gridCol w:w="3022"/>
+        <w:gridCol w:w="3022"/>
+        <w:gridCol w:w="3022"/>
+      </w:tblGrid>
+      <w:tr>
+        <w:tc>
+          <w:tcPr>
+            <w:tcW w:type="dxa" w:w="3022"/>
+            <w:shd w:val="clear" w:color="auto" w:fill="032D60"/>
+          </w:tcPr>
+          <w:p>
+            <w:r>
+              <w:rPr>
+                <w:b/>
+                <w:color w:val="FFFFFF"/>
+                <w:sz w:val="20"/>
+              </w:rPr>
+              <w:t>Field</w:t>
+            </w:r>
+          </w:p>
+        </w:tc>
+        <w:tc>
+          <w:tcPr>
+            <w:tcW w:type="dxa" w:w="3022"/>
+            <w:shd w:val="clear" w:color="auto" w:fill="032D60"/>
+          </w:tcPr>
+          <w:p>
+            <w:r>
+              <w:rPr>
+                <w:b/>
+                <w:color w:val="FFFFFF"/>
+                <w:sz w:val="20"/>
+              </w:rPr>
+              <w:t>Type</w:t>
+            </w:r>
+          </w:p>
+        </w:tc>
+        <w:tc>
+          <w:tcPr>
+            <w:tcW w:type="dxa" w:w="3022"/>
+            <w:shd w:val="clear" w:color="auto" w:fill="032D60"/>
+          </w:tcPr>
+          <w:p>
+            <w:r>
+              <w:rPr>
+                <w:b/>
+                <w:color w:val="FFFFFF"/>
+                <w:sz w:val="20"/>
+              </w:rPr>
+              <w:t>Notes</w:t>
+            </w:r>
+          </w:p>
+        </w:tc>
+      </w:tr>
+      <w:tr>
+        <w:tc>
+          <w:tcPr>
+            <w:tcW w:type="dxa" w:w="3022"/>
+            <w:shd w:val="clear" w:color="auto" w:fill="F2F4F7"/>
+          </w:tcPr>
+          <w:p>
+            <w:r>
+              <w:rPr>
+                <w:color w:val="181818"/>
+                <w:sz w:val="20"/>
+              </w:rPr>
+              <w:t>Job_Id__c</w:t>
+            </w:r>
+          </w:p>
+        </w:tc>
+        <w:tc>
+          <w:tcPr>
+            <w:tcW w:type="dxa" w:w="3022"/>
+            <w:shd w:val="clear" w:color="auto" w:fill="F2F4F7"/>
+          </w:tcPr>
+          <w:p>
+            <w:r>
+              <w:rPr>
+                <w:color w:val="181818"/>
+                <w:sz w:val="20"/>
+              </w:rPr>
+              <w:t>Text 18</w:t>
+            </w:r>
+          </w:p>
+        </w:tc>
+        <w:tc>
+          <w:tcPr>
+            <w:tcW w:type="dxa" w:w="3022"/>
+            <w:shd w:val="clear" w:color="auto" w:fill="F2F4F7"/>
+          </w:tcPr>
+          <w:p>
+            <w:r>
+              <w:rPr>
+                <w:color w:val="181818"/>
+                <w:sz w:val="20"/>
+              </w:rPr>
+              <w:t>Links event to parent Dependency_Job__c</w:t>
+            </w:r>
+          </w:p>
+        </w:tc>
+      </w:tr>
+      <w:tr>
+        <w:tc>
+          <w:tcPr>
+            <w:tcW w:type="dxa" w:w="3022"/>
+            <w:shd w:val="clear" w:color="auto" w:fill="FFFFFF"/>
+          </w:tcPr>
+          <w:p>
+            <w:r>
+              <w:rPr>
+                <w:color w:val="181818"/>
+                <w:sz w:val="20"/>
+              </w:rPr>
+              <w:t>Status__c</w:t>
+            </w:r>
+          </w:p>
+        </w:tc>
+        <w:tc>
+          <w:tcPr>
+            <w:tcW w:type="dxa" w:w="3022"/>
+            <w:shd w:val="clear" w:color="auto" w:fill="FFFFFF"/>
+          </w:tcPr>
+          <w:p>
+            <w:r>
+              <w:rPr>
+                <w:color w:val="181818"/>
+                <w:sz w:val="20"/>
+              </w:rPr>
+              <w:t>Text 50</w:t>
+            </w:r>
+          </w:p>
+        </w:tc>
+        <w:tc>
+          <w:tcPr>
+            <w:tcW w:type="dxa" w:w="3022"/>
+            <w:shd w:val="clear" w:color="auto" w:fill="FFFFFF"/>
+          </w:tcPr>
+          <w:p>
+            <w:r>
+              <w:rPr>
+                <w:color w:val="181818"/>
+                <w:sz w:val="20"/>
+              </w:rPr>
+              <w:t>Mirrors Job Status__c</w:t>
+            </w:r>
+          </w:p>
+        </w:tc>
+      </w:tr>
+      <w:tr>
+        <w:tc>
+          <w:tcPr>
+            <w:tcW w:type="dxa" w:w="3022"/>
+            <w:shd w:val="clear" w:color="auto" w:fill="F2F4F7"/>
+          </w:tcPr>
+          <w:p>
+            <w:r>
+              <w:rPr>
+                <w:color w:val="181818"/>
+                <w:sz w:val="20"/>
+              </w:rPr>
+              <w:t>Nodes_Processed__c</w:t>
+            </w:r>
+          </w:p>
+        </w:tc>
+        <w:tc>
+          <w:tcPr>
+            <w:tcW w:type="dxa" w:w="3022"/>
+            <w:shd w:val="clear" w:color="auto" w:fill="F2F4F7"/>
+          </w:tcPr>
+          <w:p>
+            <w:r>
+              <w:rPr>
+                <w:color w:val="181818"/>
+                <w:sz w:val="20"/>
+              </w:rPr>
+              <w:t>Number</w:t>
+            </w:r>
+          </w:p>
+        </w:tc>
+        <w:tc>
+          <w:tcPr>
+            <w:tcW w:type="dxa" w:w="3022"/>
+            <w:shd w:val="clear" w:color="auto" w:fill="F2F4F7"/>
+          </w:tcPr>
+          <w:p>
+            <w:r>
+              <w:rPr>
+                <w:color w:val="181818"/>
+                <w:sz w:val="20"/>
+              </w:rPr>
+              <w:t>Current progress counter</w:t>
+            </w:r>
+          </w:p>
+        </w:tc>
+      </w:tr>
+      <w:tr>
+        <w:tc>
+          <w:tcPr>
+            <w:tcW w:type="dxa" w:w="3022"/>
+            <w:shd w:val="clear" w:color="auto" w:fill="FFFFFF"/>
+          </w:tcPr>
+          <w:p>
+            <w:r>
+              <w:rPr>
+                <w:color w:val="181818"/>
+                <w:sz w:val="20"/>
+              </w:rPr>
+              <w:t>Message__c</w:t>
+            </w:r>
+          </w:p>
+        </w:tc>
+        <w:tc>
+          <w:tcPr>
+            <w:tcW w:type="dxa" w:w="3022"/>
+            <w:shd w:val="clear" w:color="auto" w:fill="FFFFFF"/>
+          </w:tcPr>
+          <w:p>
+            <w:r>
+              <w:rPr>
+                <w:color w:val="181818"/>
+                <w:sz w:val="20"/>
+              </w:rPr>
+              <w:t>Text 255</w:t>
+            </w:r>
+          </w:p>
+        </w:tc>
+        <w:tc>
+          <w:tcPr>
+            <w:tcW w:type="dxa" w:w="3022"/>
+            <w:shd w:val="clear" w:color="auto" w:fill="FFFFFF"/>
+          </w:tcPr>
+          <w:p>
+            <w:r>
+              <w:rPr>
+                <w:color w:val="181818"/>
+                <w:sz w:val="20"/>
+              </w:rPr>
+              <w:t>Human-readable status message</w:t>
+            </w:r>
+          </w:p>
+        </w:tc>
+      </w:tr>
+    </w:tbl>
+    <w:p/>
+    <w:p>
+      <w:pPr>
+        <w:pStyle w:val="Heading2"/>
+        <w:spacing w:before="240" w:after="120"/>
+      </w:pPr>
+      <w:r>
+        <w:rPr>
+          <w:b/>
+          <w:color w:val="0070D2"/>
+          <w:sz w:val="28"/>
+        </w:rPr>
+        <w:t>3.5 Data Lifecycle Management</w:t>
       </w:r>
     </w:p>
     <w:p>
@@ -1787,7 +2476,7 @@
           <w:color w:val="181818"/>
           <w:sz w:val="21"/>
         </w:rPr>
-        <w:t>A Scheduled Apex Batch (DependencyCleanupBatch) runs nightly at 02:00 to hard-delete any Dependency_Job__c records older than 24 hours. Deletion cascades to all child Dependency_Node__c records via the Master-Detail relationship.</w:t>
+        <w:t>DependencyCleanupBatch runs nightly at 02:00 and hard-deletes Dependency_Job__c records older than 24 hours. Deletion cascades to all child Dependency_Node__c records via the Master-Detail relationship.</w:t>
       </w:r>
     </w:p>
     <w:p>
@@ -1823,7 +2512,7 @@
           <w:color w:val="181818"/>
           <w:sz w:val="21"/>
         </w:rPr>
-        <w:t>The processing engine is built around a self-chaining Queueable pattern that uses the database as its state machine, enabling unlimited depth traversal without hitting synchronous transaction limits.</w:t>
+        <w:t>The engine uses a self-chaining Queueable pattern with the database as its state machine. Type-specific handler classes supplement the Tooling API for dependency categories it cannot resolve.</w:t>
       </w:r>
     </w:p>
     <w:p>
@@ -1851,7 +2540,7 @@
           <w:color w:val="181818"/>
           <w:sz w:val="21"/>
         </w:rPr>
-        <w:t>1. User submits a search via LWC. The @AuraEnabled controller creates a Dependency_Job__c (Status: Initializing), inserts the root Dependency_Node__c (Is_Processed__c = false), and enqueues DependencyQueueable.</w:t>
+        <w:t>1. User submits via LWC. Controller creates Dependency_Job__c (Initializing), inserts root Dependency_Node__c (Is_Processed__c = false), enqueues DependencyQueueable.</w:t>
       </w:r>
     </w:p>
     <w:p>
@@ -1865,7 +2554,7 @@
           <w:color w:val="181818"/>
           <w:sz w:val="21"/>
         </w:rPr>
-        <w:t>2. DependencyQueueable.execute() queries a batch of unprocessed nodes (Is_Processed__c = false, limit 50).</w:t>
+        <w:t>2. DependencyQueueable.execute() queries up to 50 unprocessed nodes.</w:t>
       </w:r>
     </w:p>
     <w:p>
@@ -1879,7 +2568,7 @@
           <w:color w:val="181818"/>
           <w:sz w:val="21"/>
         </w:rPr>
-        <w:t>3. The Visited_IDs__c JSON field is deserialized into a Set&lt;String&gt;. Any Tooling API result whose Metadata_ID__c is already in this set is skipped (cycle detection).</w:t>
+        <w:t>3. Visited_IDs__c is deserialized into a Set&lt;String&gt;. Results already in this set get Is_Circular__c = true and are inserted but not enqueued for traversal.</w:t>
       </w:r>
     </w:p>
     <w:p>
@@ -1893,7 +2582,7 @@
           <w:color w:val="181818"/>
           <w:sz w:val="21"/>
         </w:rPr>
-        <w:t>4. For each unprocessed node, a Tooling API callout is made via the Named Credential. Results are chunked using the IN operator (max 200 IDs per query).</w:t>
+        <w:t>4. For each node batch: Tooling API callout (chunked at 100 IDs max; QueryMore loop for &gt;2,000 results). HTTP 414/431 triggers reactive batch split.</w:t>
       </w:r>
     </w:p>
     <w:p>
@@ -1907,7 +2596,7 @@
           <w:color w:val="181818"/>
           <w:sz w:val="21"/>
         </w:rPr>
-        <w:t>5. New child Dependency_Node__c records are bulk-inserted (WITH USER_MODE). Current nodes are marked Is_Processed__c = true.</w:t>
+        <w:t>5. New Dependency_Node__c children inserted with Source__c = ToolingAPI (WITH USER_MODE).</w:t>
       </w:r>
     </w:p>
     <w:p>
@@ -1921,7 +2610,7 @@
           <w:color w:val="181818"/>
           <w:sz w:val="21"/>
         </w:rPr>
-        <w:t>6. The visited set is updated and re-serialized to Visited_IDs__c. Nodes_Processed__c is incremented. A Dependency_Status__e event is published.</w:t>
+        <w:t>6. DependencyTypeHandlerFactory dispatches to type-specific handler. Supplemental nodes inserted with Source__c = Supplemental.</w:t>
       </w:r>
     </w:p>
     <w:p>
@@ -1935,7 +2624,7 @@
           <w:color w:val="181818"/>
           <w:sz w:val="21"/>
         </w:rPr>
-        <w:t>7. Limit check: if callout usage &gt; 80% or heap &gt; 80% of limit, a fresh DependencyQueueable instance is enqueued and the current execution returns.</w:t>
+        <w:t>7. Current nodes marked Is_Processed__c = true. Visited set updated and re-serialized. Dependency_Status__e published.</w:t>
       </w:r>
     </w:p>
     <w:p>
@@ -1949,7 +2638,7 @@
           <w:color w:val="181818"/>
           <w:sz w:val="21"/>
         </w:rPr>
-        <w:t>8. When no unprocessed nodes remain, the Job transitions to Completed. DependencyNotificationService fires a Custom Notification (bell) and email.</w:t>
+        <w:t>8. Limit check: if callouts or heap &gt; 80%, enqueue fresh instance and return.</w:t>
       </w:r>
     </w:p>
     <w:p>
@@ -1963,7 +2652,21 @@
           <w:color w:val="181818"/>
           <w:sz w:val="21"/>
         </w:rPr>
-        <w:t>9. On any unhandled exception, the Job transitions to Failed with the full stack in Error_Message__c, and a failure Platform Event is published.</w:t>
+        <w:t>9. On Completed: compute Summary_JSON__c, send Custom Notification + email.</w:t>
+      </w:r>
+    </w:p>
+    <w:p>
+      <w:pPr>
+        <w:pStyle w:val="ListBullet"/>
+        <w:spacing w:after="40"/>
+        <w:ind w:left="283"/>
+      </w:pPr>
+      <w:r>
+        <w:rPr>
+          <w:color w:val="181818"/>
+          <w:sz w:val="21"/>
+        </w:rPr>
+        <w:t>10. On exception: update Job to Failed, publish failure event.</w:t>
       </w:r>
     </w:p>
     <w:p>
@@ -1977,12 +2680,12 @@
           <w:color w:val="0070D2"/>
           <w:sz w:val="28"/>
         </w:rPr>
-        <w:t>4.2 Limit Guardrail Pattern</w:t>
+        <w:t>4.2 Limit Guardrail</w:t>
       </w:r>
     </w:p>
     <w:p>
       <w:pPr>
-        <w:spacing w:before="80" w:after="80"/>
+        <w:spacing w:before="60" w:after="60"/>
         <w:ind w:left="454"/>
         <w:shd w:val="clear" w:color="auto" w:fill="EAECF0"/>
       </w:pPr>
@@ -2014,7 +2717,7 @@
           <w:color w:val="0070D2"/>
           <w:sz w:val="28"/>
         </w:rPr>
-        <w:t>4.3 Active Flows Only Optimization</w:t>
+        <w:t>4.3 Circular Reference Handling</w:t>
       </w:r>
     </w:p>
     <w:p>
@@ -2028,7 +2731,35 @@
           <w:color w:val="181818"/>
           <w:sz w:val="21"/>
         </w:rPr>
-        <w:t>When Active_Flows_Only__c is true (default), DependencyService filters Tooling API results to exclude inactive Flow versions before any DML is performed. In large orgs with many Flow version histories, this significantly reduces heap consumption and DML operations.</w:t>
+        <w:t>Nodes whose Metadata_ID__c is already in the Visited_IDs__c set are inserted with Is_Circular__c = true and are NOT added to the unprocessed queue - preventing infinite traversal while still displaying the circular relationship in the tree and graph views.</w:t>
+      </w:r>
+    </w:p>
+    <w:p>
+      <w:pPr>
+        <w:pStyle w:val="Heading2"/>
+        <w:spacing w:before="240" w:after="120"/>
+      </w:pPr>
+      <w:r>
+        <w:rPr>
+          <w:b/>
+          <w:color w:val="0070D2"/>
+          <w:sz w:val="28"/>
+        </w:rPr>
+        <w:t>4.4 Active Flows Only Optimization</w:t>
+      </w:r>
+    </w:p>
+    <w:p>
+      <w:pPr>
+        <w:spacing w:after="80"/>
+      </w:pPr>
+      <w:r>
+        <w:rPr>
+          <w:b w:val="0"/>
+          <w:i w:val="0"/>
+          <w:color w:val="181818"/>
+          <w:sz w:val="21"/>
+        </w:rPr>
+        <w:t>When Active_Flows_Only__c is true (default), inactive Flow versions are filtered before DML. In large orgs with extensive Flow version histories, this significantly reduces heap consumption and DML operations.</w:t>
       </w:r>
     </w:p>
     <w:p>
@@ -2042,7 +2773,7 @@
           <w:color w:val="032D60"/>
           <w:sz w:val="36"/>
         </w:rPr>
-        <w:t>5. Integration &amp; Tooling API Strategy</w:t>
+        <w:t>5. Supplemental Query Strategy</w:t>
       </w:r>
     </w:p>
     <w:p>
@@ -2064,8 +2795,423 @@
           <w:color w:val="181818"/>
           <w:sz w:val="21"/>
         </w:rPr>
-        <w:t>Querying the MetadataComponentDependency Tooling API object from within asynchronous Apex requires a loopback authentication mechanism, as session-based callouts are not permitted in async contexts.</w:t>
+        <w:t>MetadataComponentDependency does not track 6 critical dependency categories. Type-specific handler classes fill these gaps using secondary Tooling API, SOQL, and Metadata API queries.</w:t>
       </w:r>
+    </w:p>
+    <w:tbl>
+      <w:tblPr>
+        <w:tblStyle w:val="TableGrid"/>
+        <w:tblW w:type="auto" w:w="0"/>
+        <w:jc w:val="left"/>
+        <w:tblLook w:firstColumn="1" w:firstRow="1" w:lastColumn="0" w:lastRow="0" w:noHBand="0" w:noVBand="1" w:val="04A0"/>
+      </w:tblPr>
+      <w:tblGrid>
+        <w:gridCol w:w="3022"/>
+        <w:gridCol w:w="3022"/>
+        <w:gridCol w:w="3022"/>
+      </w:tblGrid>
+      <w:tr>
+        <w:tc>
+          <w:tcPr>
+            <w:tcW w:type="dxa" w:w="3022"/>
+            <w:shd w:val="clear" w:color="auto" w:fill="032D60"/>
+          </w:tcPr>
+          <w:p>
+            <w:r>
+              <w:rPr>
+                <w:b/>
+                <w:color w:val="FFFFFF"/>
+                <w:sz w:val="20"/>
+              </w:rPr>
+              <w:t>Gap</w:t>
+            </w:r>
+          </w:p>
+        </w:tc>
+        <w:tc>
+          <w:tcPr>
+            <w:tcW w:type="dxa" w:w="3022"/>
+            <w:shd w:val="clear" w:color="auto" w:fill="032D60"/>
+          </w:tcPr>
+          <w:p>
+            <w:r>
+              <w:rPr>
+                <w:b/>
+                <w:color w:val="FFFFFF"/>
+                <w:sz w:val="20"/>
+              </w:rPr>
+              <w:t>Handler</w:t>
+            </w:r>
+          </w:p>
+        </w:tc>
+        <w:tc>
+          <w:tcPr>
+            <w:tcW w:type="dxa" w:w="3022"/>
+            <w:shd w:val="clear" w:color="auto" w:fill="032D60"/>
+          </w:tcPr>
+          <w:p>
+            <w:r>
+              <w:rPr>
+                <w:b/>
+                <w:color w:val="FFFFFF"/>
+                <w:sz w:val="20"/>
+              </w:rPr>
+              <w:t>Strategy</w:t>
+            </w:r>
+          </w:p>
+        </w:tc>
+      </w:tr>
+      <w:tr>
+        <w:tc>
+          <w:tcPr>
+            <w:tcW w:type="dxa" w:w="3022"/>
+            <w:shd w:val="clear" w:color="auto" w:fill="F2F4F7"/>
+          </w:tcPr>
+          <w:p>
+            <w:r>
+              <w:rPr>
+                <w:color w:val="181818"/>
+                <w:sz w:val="20"/>
+              </w:rPr>
+              <w:t>Workflow Field Updates -&gt; Custom Field</w:t>
+            </w:r>
+          </w:p>
+        </w:tc>
+        <w:tc>
+          <w:tcPr>
+            <w:tcW w:type="dxa" w:w="3022"/>
+            <w:shd w:val="clear" w:color="auto" w:fill="F2F4F7"/>
+          </w:tcPr>
+          <w:p>
+            <w:r>
+              <w:rPr>
+                <w:color w:val="181818"/>
+                <w:sz w:val="20"/>
+              </w:rPr>
+              <w:t>CustomFieldHandler</w:t>
+            </w:r>
+          </w:p>
+        </w:tc>
+        <w:tc>
+          <w:tcPr>
+            <w:tcW w:type="dxa" w:w="3022"/>
+            <w:shd w:val="clear" w:color="auto" w:fill="F2F4F7"/>
+          </w:tcPr>
+          <w:p>
+            <w:r>
+              <w:rPr>
+                <w:color w:val="181818"/>
+                <w:sz w:val="20"/>
+              </w:rPr>
+              <w:t>Query WorkflowFieldUpdate WHERE Field = :apiName</w:t>
+            </w:r>
+          </w:p>
+        </w:tc>
+      </w:tr>
+      <w:tr>
+        <w:tc>
+          <w:tcPr>
+            <w:tcW w:type="dxa" w:w="3022"/>
+            <w:shd w:val="clear" w:color="auto" w:fill="FFFFFF"/>
+          </w:tcPr>
+          <w:p>
+            <w:r>
+              <w:rPr>
+                <w:color w:val="181818"/>
+                <w:sz w:val="20"/>
+              </w:rPr>
+              <w:t>Validation Rule formulas</w:t>
+            </w:r>
+          </w:p>
+        </w:tc>
+        <w:tc>
+          <w:tcPr>
+            <w:tcW w:type="dxa" w:w="3022"/>
+            <w:shd w:val="clear" w:color="auto" w:fill="FFFFFF"/>
+          </w:tcPr>
+          <w:p>
+            <w:r>
+              <w:rPr>
+                <w:color w:val="181818"/>
+                <w:sz w:val="20"/>
+              </w:rPr>
+              <w:t>CustomFieldHandler</w:t>
+            </w:r>
+          </w:p>
+        </w:tc>
+        <w:tc>
+          <w:tcPr>
+            <w:tcW w:type="dxa" w:w="3022"/>
+            <w:shd w:val="clear" w:color="auto" w:fill="FFFFFF"/>
+          </w:tcPr>
+          <w:p>
+            <w:r>
+              <w:rPr>
+                <w:color w:val="181818"/>
+                <w:sz w:val="20"/>
+              </w:rPr>
+              <w:t>Query ValidationRule bodies; regex match field API name</w:t>
+            </w:r>
+          </w:p>
+        </w:tc>
+      </w:tr>
+      <w:tr>
+        <w:tc>
+          <w:tcPr>
+            <w:tcW w:type="dxa" w:w="3022"/>
+            <w:shd w:val="clear" w:color="auto" w:fill="F2F4F7"/>
+          </w:tcPr>
+          <w:p>
+            <w:r>
+              <w:rPr>
+                <w:color w:val="181818"/>
+                <w:sz w:val="20"/>
+              </w:rPr>
+              <w:t>FlexiPage visibility rules</w:t>
+            </w:r>
+          </w:p>
+        </w:tc>
+        <w:tc>
+          <w:tcPr>
+            <w:tcW w:type="dxa" w:w="3022"/>
+            <w:shd w:val="clear" w:color="auto" w:fill="F2F4F7"/>
+          </w:tcPr>
+          <w:p>
+            <w:r>
+              <w:rPr>
+                <w:color w:val="181818"/>
+                <w:sz w:val="20"/>
+              </w:rPr>
+              <w:t>CustomFieldHandler</w:t>
+            </w:r>
+          </w:p>
+        </w:tc>
+        <w:tc>
+          <w:tcPr>
+            <w:tcW w:type="dxa" w:w="3022"/>
+            <w:shd w:val="clear" w:color="auto" w:fill="F2F4F7"/>
+          </w:tcPr>
+          <w:p>
+            <w:r>
+              <w:rPr>
+                <w:color w:val="181818"/>
+                <w:sz w:val="20"/>
+              </w:rPr>
+              <w:t>Query FlexiPage metadata; parse XML for field references</w:t>
+            </w:r>
+          </w:p>
+        </w:tc>
+      </w:tr>
+      <w:tr>
+        <w:tc>
+          <w:tcPr>
+            <w:tcW w:type="dxa" w:w="3022"/>
+            <w:shd w:val="clear" w:color="auto" w:fill="FFFFFF"/>
+          </w:tcPr>
+          <w:p>
+            <w:r>
+              <w:rPr>
+                <w:color w:val="181818"/>
+                <w:sz w:val="20"/>
+              </w:rPr>
+              <w:t>Custom Metadata Type record lookups</w:t>
+            </w:r>
+          </w:p>
+        </w:tc>
+        <w:tc>
+          <w:tcPr>
+            <w:tcW w:type="dxa" w:w="3022"/>
+            <w:shd w:val="clear" w:color="auto" w:fill="FFFFFF"/>
+          </w:tcPr>
+          <w:p>
+            <w:r>
+              <w:rPr>
+                <w:color w:val="181818"/>
+                <w:sz w:val="20"/>
+              </w:rPr>
+              <w:t>CustomFieldHandler / ApexClassHandler</w:t>
+            </w:r>
+          </w:p>
+        </w:tc>
+        <w:tc>
+          <w:tcPr>
+            <w:tcW w:type="dxa" w:w="3022"/>
+            <w:shd w:val="clear" w:color="auto" w:fill="FFFFFF"/>
+          </w:tcPr>
+          <w:p>
+            <w:r>
+              <w:rPr>
+                <w:color w:val="181818"/>
+                <w:sz w:val="20"/>
+              </w:rPr>
+              <w:t>SOQL on CMT records; filter fields named class, handler, type, instance</w:t>
+            </w:r>
+          </w:p>
+        </w:tc>
+      </w:tr>
+      <w:tr>
+        <w:tc>
+          <w:tcPr>
+            <w:tcW w:type="dxa" w:w="3022"/>
+            <w:shd w:val="clear" w:color="auto" w:fill="F2F4F7"/>
+          </w:tcPr>
+          <w:p>
+            <w:r>
+              <w:rPr>
+                <w:color w:val="181818"/>
+                <w:sz w:val="20"/>
+              </w:rPr>
+              <w:t>Lookup field relationships</w:t>
+            </w:r>
+          </w:p>
+        </w:tc>
+        <w:tc>
+          <w:tcPr>
+            <w:tcW w:type="dxa" w:w="3022"/>
+            <w:shd w:val="clear" w:color="auto" w:fill="F2F4F7"/>
+          </w:tcPr>
+          <w:p>
+            <w:r>
+              <w:rPr>
+                <w:color w:val="181818"/>
+                <w:sz w:val="20"/>
+              </w:rPr>
+              <w:t>CustomFieldHandler</w:t>
+            </w:r>
+          </w:p>
+        </w:tc>
+        <w:tc>
+          <w:tcPr>
+            <w:tcW w:type="dxa" w:w="3022"/>
+            <w:shd w:val="clear" w:color="auto" w:fill="F2F4F7"/>
+          </w:tcPr>
+          <w:p>
+            <w:r>
+              <w:rPr>
+                <w:color w:val="181818"/>
+                <w:sz w:val="20"/>
+              </w:rPr>
+              <w:t>Query CustomField WHERE ReferenceTo = :objectName</w:t>
+            </w:r>
+          </w:p>
+        </w:tc>
+      </w:tr>
+      <w:tr>
+        <w:tc>
+          <w:tcPr>
+            <w:tcW w:type="dxa" w:w="3022"/>
+            <w:shd w:val="clear" w:color="auto" w:fill="FFFFFF"/>
+          </w:tcPr>
+          <w:p>
+            <w:r>
+              <w:rPr>
+                <w:color w:val="181818"/>
+                <w:sz w:val="20"/>
+              </w:rPr>
+              <w:t>Dynamic Apex string references</w:t>
+            </w:r>
+          </w:p>
+        </w:tc>
+        <w:tc>
+          <w:tcPr>
+            <w:tcW w:type="dxa" w:w="3022"/>
+            <w:shd w:val="clear" w:color="auto" w:fill="FFFFFF"/>
+          </w:tcPr>
+          <w:p>
+            <w:r>
+              <w:rPr>
+                <w:color w:val="181818"/>
+                <w:sz w:val="20"/>
+              </w:rPr>
+              <w:t>ApexClassHandler</w:t>
+            </w:r>
+          </w:p>
+        </w:tc>
+        <w:tc>
+          <w:tcPr>
+            <w:tcW w:type="dxa" w:w="3022"/>
+            <w:shd w:val="clear" w:color="auto" w:fill="FFFFFF"/>
+          </w:tcPr>
+          <w:p>
+            <w:r>
+              <w:rPr>
+                <w:color w:val="181818"/>
+                <w:sz w:val="20"/>
+              </w:rPr>
+              <w:t>Flag Is_Dynamic_Reference__c = true; cannot be statically resolved</w:t>
+            </w:r>
+          </w:p>
+        </w:tc>
+      </w:tr>
+    </w:tbl>
+    <w:p/>
+    <w:p>
+      <w:pPr>
+        <w:pStyle w:val="Heading2"/>
+        <w:spacing w:before="240" w:after="120"/>
+      </w:pPr>
+      <w:r>
+        <w:rPr>
+          <w:b/>
+          <w:color w:val="0070D2"/>
+          <w:sz w:val="28"/>
+        </w:rPr>
+        <w:t>5.1 IDependencyTypeHandler Interface</w:t>
+      </w:r>
+    </w:p>
+    <w:p>
+      <w:pPr>
+        <w:spacing w:before="60" w:after="60"/>
+        <w:ind w:left="454"/>
+        <w:shd w:val="clear" w:color="auto" w:fill="EAECF0"/>
+      </w:pPr>
+      <w:r>
+        <w:rPr>
+          <w:rFonts w:ascii="Courier New" w:hAnsi="Courier New"/>
+          <w:color w:val="1E1E2E"/>
+          <w:sz w:val="18"/>
+        </w:rPr>
+        <w:t>public interface IDependencyTypeHandler {</w:t>
+        <w:br/>
+        <w:t xml:space="preserve">    List&lt;Dependency_Node__c&gt; findSupplemental(Id jobId, List&lt;Dependency_Node__c&gt; nodesOfType);</w:t>
+        <w:br/>
+        <w:t>}</w:t>
+      </w:r>
+    </w:p>
+    <w:p>
+      <w:pPr>
+        <w:spacing w:after="80"/>
+      </w:pPr>
+      <w:r>
+        <w:rPr>
+          <w:b w:val="0"/>
+          <w:i w:val="0"/>
+          <w:color w:val="181818"/>
+          <w:sz w:val="21"/>
+        </w:rPr>
+        <w:t>Each handler receives the current batch of nodes of its type, executes supplemental queries, and returns additional Dependency_Node__c records for bulk insert. Handlers are stateless and independently testable.</w:t>
+      </w:r>
+    </w:p>
+    <w:p>
+      <w:pPr>
+        <w:pStyle w:val="Heading1"/>
+        <w:spacing w:before="360" w:after="120"/>
+      </w:pPr>
+      <w:r>
+        <w:rPr>
+          <w:b/>
+          <w:color w:val="032D60"/>
+          <w:sz w:val="36"/>
+        </w:rPr>
+        <w:t>6. Integration &amp; Tooling API Strategy</w:t>
+      </w:r>
+    </w:p>
+    <w:p>
+      <w:pPr>
+        <w:spacing w:before="40" w:after="40"/>
+        <w:pBdr>
+          <w:bottom w:val="single" w:sz="4" w:space="1" w:color="0070D2"/>
+        </w:pBdr>
+      </w:pPr>
     </w:p>
     <w:p>
       <w:pPr>
@@ -2078,7 +3224,7 @@
           <w:color w:val="0070D2"/>
           <w:sz w:val="28"/>
         </w:rPr>
-        <w:t>5.1 Loopback Auth Setup (Post-Install, Manual)</w:t>
+        <w:t>6.1 Loopback Auth (Post-Install, Manual)</w:t>
       </w:r>
     </w:p>
     <w:tbl>
@@ -2217,7 +3363,7 @@
                 <w:color w:val="181818"/>
                 <w:sz w:val="20"/>
               </w:rPr>
-              <w:t>Name: MetaMapper_Tooling_API; URL: org instance URL; Protocol: OAuth 2.0 via Auth Provider</w:t>
+              <w:t>Name: MetaMapper_Tooling_API; URL: org instance URL; OAuth 2.0 via Auth Provider</w:t>
             </w:r>
           </w:p>
         </w:tc>
@@ -2235,7 +3381,7 @@
           <w:color w:val="181818"/>
           <w:sz w:val="21"/>
         </w:rPr>
-        <w:t>These three items cannot be source-tracked. Step-by-step setup instructions are in setup/SETUP.md.</w:t>
+        <w:t>Cannot be source-tracked. Step-by-step setup in setup/SETUP.md.</w:t>
       </w:r>
     </w:p>
     <w:p>
@@ -2249,80 +3395,184 @@
           <w:color w:val="0070D2"/>
           <w:sz w:val="28"/>
         </w:rPr>
-        <w:t>5.2 Callout Pattern</w:t>
+        <w:t>6.2 Query Strategy Details</w:t>
       </w:r>
     </w:p>
-    <w:p>
-      <w:pPr>
-        <w:spacing w:before="80" w:after="80"/>
-        <w:ind w:left="454"/>
-        <w:shd w:val="clear" w:color="auto" w:fill="EAECF0"/>
-      </w:pPr>
-      <w:r>
-        <w:rPr>
-          <w:rFonts w:ascii="Courier New" w:hAnsi="Courier New"/>
-          <w:color w:val="1E1E2E"/>
-          <w:sz w:val="18"/>
-        </w:rPr>
-        <w:t>callout:MetaMapper_Tooling_API/services/data/v66.0/tooling/query/?q=SELECT+...</w:t>
-      </w:r>
-    </w:p>
-    <w:p>
-      <w:pPr>
-        <w:pStyle w:val="Heading2"/>
-        <w:spacing w:before="240" w:after="120"/>
-      </w:pPr>
-      <w:r>
-        <w:rPr>
-          <w:b/>
-          <w:color w:val="0070D2"/>
-          <w:sz w:val="28"/>
-        </w:rPr>
-        <w:t>5.3 IN Operator Chunking</w:t>
-      </w:r>
-    </w:p>
-    <w:p>
-      <w:pPr>
-        <w:spacing w:after="80"/>
-      </w:pPr>
-      <w:r>
-        <w:rPr>
-          <w:b w:val="0"/>
-          <w:i w:val="0"/>
-          <w:color w:val="181818"/>
-          <w:sz w:val="21"/>
-        </w:rPr>
-        <w:t>Tooling API SOQL IN clauses are capped at 1,000 values. DependencyService chunks Metadata ID lists into groups of 200 per query. Multiple queries are issued within the same Queueable execution where needed, consuming callout budget efficiently.</w:t>
-      </w:r>
-    </w:p>
-    <w:p>
-      <w:pPr>
-        <w:pStyle w:val="Heading2"/>
-        <w:spacing w:before="240" w:after="120"/>
-      </w:pPr>
-      <w:r>
-        <w:rPr>
-          <w:b/>
-          <w:color w:val="0070D2"/>
-          <w:sz w:val="28"/>
-        </w:rPr>
-        <w:t>5.4 Known Tooling API Limitation</w:t>
-      </w:r>
-    </w:p>
-    <w:p>
-      <w:pPr>
-        <w:spacing w:after="80"/>
-      </w:pPr>
-      <w:r>
-        <w:rPr>
-          <w:b w:val="0"/>
-          <w:i w:val="0"/>
-          <w:color w:val="181818"/>
-          <w:sz w:val="21"/>
-        </w:rPr>
-        <w:t>MetadataComponentDependency does not capture dynamic Apex string references or some formula field cross-object lookups. Results represent only statically analyzable dependencies. This limitation is surfaced in the application UI and documented in README.md.</w:t>
-      </w:r>
-    </w:p>
+    <w:tbl>
+      <w:tblPr>
+        <w:tblStyle w:val="TableGrid"/>
+        <w:tblW w:type="auto" w:w="0"/>
+        <w:jc w:val="left"/>
+        <w:tblLook w:firstColumn="1" w:firstRow="1" w:lastColumn="0" w:lastRow="0" w:noHBand="0" w:noVBand="1" w:val="04A0"/>
+      </w:tblPr>
+      <w:tblGrid>
+        <w:gridCol w:w="4533"/>
+        <w:gridCol w:w="4533"/>
+      </w:tblGrid>
+      <w:tr>
+        <w:tc>
+          <w:tcPr>
+            <w:tcW w:type="dxa" w:w="4533"/>
+            <w:shd w:val="clear" w:color="auto" w:fill="032D60"/>
+          </w:tcPr>
+          <w:p>
+            <w:r>
+              <w:rPr>
+                <w:b/>
+                <w:color w:val="FFFFFF"/>
+                <w:sz w:val="20"/>
+              </w:rPr>
+              <w:t>Strategy</w:t>
+            </w:r>
+          </w:p>
+        </w:tc>
+        <w:tc>
+          <w:tcPr>
+            <w:tcW w:type="dxa" w:w="4533"/>
+            <w:shd w:val="clear" w:color="auto" w:fill="032D60"/>
+          </w:tcPr>
+          <w:p>
+            <w:r>
+              <w:rPr>
+                <w:b/>
+                <w:color w:val="FFFFFF"/>
+                <w:sz w:val="20"/>
+              </w:rPr>
+              <w:t>Detail</w:t>
+            </w:r>
+          </w:p>
+        </w:tc>
+      </w:tr>
+      <w:tr>
+        <w:tc>
+          <w:tcPr>
+            <w:tcW w:type="dxa" w:w="4533"/>
+            <w:shd w:val="clear" w:color="auto" w:fill="F2F4F7"/>
+          </w:tcPr>
+          <w:p>
+            <w:r>
+              <w:rPr>
+                <w:color w:val="181818"/>
+                <w:sz w:val="20"/>
+              </w:rPr>
+              <w:t>IN clause chunk</w:t>
+            </w:r>
+          </w:p>
+        </w:tc>
+        <w:tc>
+          <w:tcPr>
+            <w:tcW w:type="dxa" w:w="4533"/>
+            <w:shd w:val="clear" w:color="auto" w:fill="F2F4F7"/>
+          </w:tcPr>
+          <w:p>
+            <w:r>
+              <w:rPr>
+                <w:color w:val="181818"/>
+                <w:sz w:val="20"/>
+              </w:rPr>
+              <w:t>100 IDs maximum per query (HTTP 414 safe limit per sfdc-soup)</w:t>
+            </w:r>
+          </w:p>
+        </w:tc>
+      </w:tr>
+      <w:tr>
+        <w:tc>
+          <w:tcPr>
+            <w:tcW w:type="dxa" w:w="4533"/>
+            <w:shd w:val="clear" w:color="auto" w:fill="FFFFFF"/>
+          </w:tcPr>
+          <w:p>
+            <w:r>
+              <w:rPr>
+                <w:color w:val="181818"/>
+                <w:sz w:val="20"/>
+              </w:rPr>
+              <w:t>QueryMore</w:t>
+            </w:r>
+          </w:p>
+        </w:tc>
+        <w:tc>
+          <w:tcPr>
+            <w:tcW w:type="dxa" w:w="4533"/>
+            <w:shd w:val="clear" w:color="auto" w:fill="FFFFFF"/>
+          </w:tcPr>
+          <w:p>
+            <w:r>
+              <w:rPr>
+                <w:color w:val="181818"/>
+                <w:sz w:val="20"/>
+              </w:rPr>
+              <w:t>Follow nextRecordsUrl iteratively until done = true (handles &gt;2,000 row result sets)</w:t>
+            </w:r>
+          </w:p>
+        </w:tc>
+      </w:tr>
+      <w:tr>
+        <w:tc>
+          <w:tcPr>
+            <w:tcW w:type="dxa" w:w="4533"/>
+            <w:shd w:val="clear" w:color="auto" w:fill="F2F4F7"/>
+          </w:tcPr>
+          <w:p>
+            <w:r>
+              <w:rPr>
+                <w:color w:val="181818"/>
+                <w:sz w:val="20"/>
+              </w:rPr>
+              <w:t>HTTP 414/431</w:t>
+            </w:r>
+          </w:p>
+        </w:tc>
+        <w:tc>
+          <w:tcPr>
+            <w:tcW w:type="dxa" w:w="4533"/>
+            <w:shd w:val="clear" w:color="auto" w:fill="F2F4F7"/>
+          </w:tcPr>
+          <w:p>
+            <w:r>
+              <w:rPr>
+                <w:color w:val="181818"/>
+                <w:sz w:val="20"/>
+              </w:rPr>
+              <w:t>Split batch in half, retry both halves; log to Error_Message__c; do not fail the job</w:t>
+            </w:r>
+          </w:p>
+        </w:tc>
+      </w:tr>
+      <w:tr>
+        <w:tc>
+          <w:tcPr>
+            <w:tcW w:type="dxa" w:w="4533"/>
+            <w:shd w:val="clear" w:color="auto" w:fill="FFFFFF"/>
+          </w:tcPr>
+          <w:p>
+            <w:r>
+              <w:rPr>
+                <w:color w:val="181818"/>
+                <w:sz w:val="20"/>
+              </w:rPr>
+              <w:t>Callout target</w:t>
+            </w:r>
+          </w:p>
+        </w:tc>
+        <w:tc>
+          <w:tcPr>
+            <w:tcW w:type="dxa" w:w="4533"/>
+            <w:shd w:val="clear" w:color="auto" w:fill="FFFFFF"/>
+          </w:tcPr>
+          <w:p>
+            <w:r>
+              <w:rPr>
+                <w:color w:val="181818"/>
+                <w:sz w:val="20"/>
+              </w:rPr>
+              <w:t>callout:MetaMapper_Tooling_API/services/data/v66.0/tooling/query/?q=...</w:t>
+            </w:r>
+          </w:p>
+        </w:tc>
+      </w:tr>
+    </w:tbl>
+    <w:p/>
     <w:p>
       <w:pPr>
         <w:pStyle w:val="Heading1"/>
@@ -2334,7 +3584,7 @@
           <w:color w:val="032D60"/>
           <w:sz w:val="36"/>
         </w:rPr>
-        <w:t>6. Security &amp; Visibility</w:t>
+        <w:t>7. Security &amp; Visibility</w:t>
       </w:r>
     </w:p>
     <w:p>
@@ -2449,7 +3699,7 @@
                 <w:color w:val="181818"/>
                 <w:sz w:val="20"/>
               </w:rPr>
-              <w:t>MetaMapper_Admin: CRUD on both custom objects, Named Credential principal, LWC/Controller access</w:t>
+              <w:t>MetaMapper_Admin: CRUD on both objects, Named Credential principal, LWC/Controller access</w:t>
             </w:r>
           </w:p>
         </w:tc>
@@ -2513,7 +3763,7 @@
                 <w:color w:val="181818"/>
                 <w:sz w:val="20"/>
               </w:rPr>
-              <w:t>No credentials in source. Named Credential handles token storage and refresh automatically.</w:t>
+              <w:t>No credentials in source. Named Credential handles token storage and refresh.</w:t>
             </w:r>
           </w:p>
         </w:tc>
@@ -2545,7 +3795,7 @@
                 <w:color w:val="181818"/>
                 <w:sz w:val="20"/>
               </w:rPr>
-              <w:t>Zero runtime egress. All callouts target the org own Tooling API endpoint via Named Credential.</w:t>
+              <w:t>Zero runtime egress. All callouts target the org own Tooling API endpoint.</w:t>
             </w:r>
           </w:p>
         </w:tc>
@@ -2595,7 +3845,7 @@
           <w:color w:val="032D60"/>
           <w:sz w:val="36"/>
         </w:rPr>
-        <w:t>7. UI/UX &amp; Presentation Layer</w:t>
+        <w:t>8. UI/UX &amp; Presentation Layer</w:t>
       </w:r>
     </w:p>
     <w:p>
@@ -2617,7 +3867,7 @@
           <w:color w:val="181818"/>
           <w:sz w:val="21"/>
         </w:rPr>
-        <w:t>MetaMapper follows a "Precision Intelligence" aesthetic direction: native SLDS scaffolding as the foundation, with deliberate use of data density, monospace type for metadata names, and a rich ECharts graph theme that makes the dependency visualization the visual centerpiece.</w:t>
+        <w:t>"Precision Intelligence" aesthetic direction: SLDS scaffolding as foundation, monospace type for metadata names, ECharts graph as the visual centerpiece - feels like a live circuit diagram of the org.</w:t>
       </w:r>
     </w:p>
     <w:p>
@@ -2631,7 +3881,7 @@
           <w:color w:val="0070D2"/>
           <w:sz w:val="28"/>
         </w:rPr>
-        <w:t>7.1 Color Palette</w:t>
+        <w:t>8.1 Color Palette</w:t>
       </w:r>
     </w:p>
     <w:p>
@@ -2645,7 +3895,7 @@
           <w:color w:val="181818"/>
           <w:sz w:val="21"/>
         </w:rPr>
-        <w:t>Application Shell (SLDS tokens)</w:t>
+        <w:t>Application Shell (SLDS)</w:t>
       </w:r>
     </w:p>
     <w:tbl>
@@ -2893,7 +4143,7 @@
                 <w:color w:val="181818"/>
                 <w:sz w:val="20"/>
               </w:rPr>
-              <w:t>Section headers, stat tile values, emphasis</w:t>
+              <w:t>Section headers, stat tile values</w:t>
             </w:r>
           </w:p>
         </w:tc>
@@ -2910,7 +4160,7 @@
                 <w:color w:val="181818"/>
                 <w:sz w:val="20"/>
               </w:rPr>
-              <w:t>Border subtle</w:t>
+              <w:t>Success</w:t>
             </w:r>
           </w:p>
         </w:tc>
@@ -2925,7 +4175,7 @@
                 <w:color w:val="181818"/>
                 <w:sz w:val="20"/>
               </w:rPr>
-              <w:t>#DDDBDA</w:t>
+              <w:t>#2E844A</w:t>
             </w:r>
           </w:p>
         </w:tc>
@@ -2940,7 +4190,7 @@
                 <w:color w:val="181818"/>
                 <w:sz w:val="20"/>
               </w:rPr>
-              <w:t>Card borders, dividers</w:t>
+              <w:t>Completed job status</w:t>
             </w:r>
           </w:p>
         </w:tc>
@@ -2957,7 +4207,7 @@
                 <w:color w:val="181818"/>
                 <w:sz w:val="20"/>
               </w:rPr>
-              <w:t>Text primary</w:t>
+              <w:t>Warning</w:t>
             </w:r>
           </w:p>
         </w:tc>
@@ -2972,7 +4222,7 @@
                 <w:color w:val="181818"/>
                 <w:sz w:val="20"/>
               </w:rPr>
-              <w:t>#181818</w:t>
+              <w:t>#E07A00</w:t>
             </w:r>
           </w:p>
         </w:tc>
@@ -2987,7 +4237,7 @@
                 <w:color w:val="181818"/>
                 <w:sz w:val="20"/>
               </w:rPr>
-              <w:t>Body copy, metadata names</w:t>
+              <w:t>Processing status</w:t>
             </w:r>
           </w:p>
         </w:tc>
@@ -3004,7 +4254,7 @@
                 <w:color w:val="181818"/>
                 <w:sz w:val="20"/>
               </w:rPr>
-              <w:t>Text secondary</w:t>
+              <w:t>Destructive</w:t>
             </w:r>
           </w:p>
         </w:tc>
@@ -3019,7 +4269,7 @@
                 <w:color w:val="181818"/>
                 <w:sz w:val="20"/>
               </w:rPr>
-              <w:t>#706E6B</w:t>
+              <w:t>#BA0517</w:t>
             </w:r>
           </w:p>
         </w:tc>
@@ -3034,148 +4284,7 @@
                 <w:color w:val="181818"/>
                 <w:sz w:val="20"/>
               </w:rPr>
-              <w:t>Labels, hints, ALL-CAPS section markers</w:t>
-            </w:r>
-          </w:p>
-        </w:tc>
-      </w:tr>
-      <w:tr>
-        <w:tc>
-          <w:tcPr>
-            <w:tcW w:type="dxa" w:w="3022"/>
-            <w:shd w:val="clear" w:color="auto" w:fill="FFFFFF"/>
-          </w:tcPr>
-          <w:p>
-            <w:r>
-              <w:rPr>
-                <w:color w:val="181818"/>
-                <w:sz w:val="20"/>
-              </w:rPr>
-              <w:t>Success</w:t>
-            </w:r>
-          </w:p>
-        </w:tc>
-        <w:tc>
-          <w:tcPr>
-            <w:tcW w:type="dxa" w:w="3022"/>
-            <w:shd w:val="clear" w:color="auto" w:fill="FFFFFF"/>
-          </w:tcPr>
-          <w:p>
-            <w:r>
-              <w:rPr>
-                <w:color w:val="181818"/>
-                <w:sz w:val="20"/>
-              </w:rPr>
-              <w:t>#2E844A</w:t>
-            </w:r>
-          </w:p>
-        </w:tc>
-        <w:tc>
-          <w:tcPr>
-            <w:tcW w:type="dxa" w:w="3022"/>
-            <w:shd w:val="clear" w:color="auto" w:fill="FFFFFF"/>
-          </w:tcPr>
-          <w:p>
-            <w:r>
-              <w:rPr>
-                <w:color w:val="181818"/>
-                <w:sz w:val="20"/>
-              </w:rPr>
-              <w:t>Completed job status</w:t>
-            </w:r>
-          </w:p>
-        </w:tc>
-      </w:tr>
-      <w:tr>
-        <w:tc>
-          <w:tcPr>
-            <w:tcW w:type="dxa" w:w="3022"/>
-            <w:shd w:val="clear" w:color="auto" w:fill="F2F4F7"/>
-          </w:tcPr>
-          <w:p>
-            <w:r>
-              <w:rPr>
-                <w:color w:val="181818"/>
-                <w:sz w:val="20"/>
-              </w:rPr>
-              <w:t>Warning</w:t>
-            </w:r>
-          </w:p>
-        </w:tc>
-        <w:tc>
-          <w:tcPr>
-            <w:tcW w:type="dxa" w:w="3022"/>
-            <w:shd w:val="clear" w:color="auto" w:fill="F2F4F7"/>
-          </w:tcPr>
-          <w:p>
-            <w:r>
-              <w:rPr>
-                <w:color w:val="181818"/>
-                <w:sz w:val="20"/>
-              </w:rPr>
-              <w:t>#E07A00</w:t>
-            </w:r>
-          </w:p>
-        </w:tc>
-        <w:tc>
-          <w:tcPr>
-            <w:tcW w:type="dxa" w:w="3022"/>
-            <w:shd w:val="clear" w:color="auto" w:fill="F2F4F7"/>
-          </w:tcPr>
-          <w:p>
-            <w:r>
-              <w:rPr>
-                <w:color w:val="181818"/>
-                <w:sz w:val="20"/>
-              </w:rPr>
-              <w:t>Processing status, warnings</w:t>
-            </w:r>
-          </w:p>
-        </w:tc>
-      </w:tr>
-      <w:tr>
-        <w:tc>
-          <w:tcPr>
-            <w:tcW w:type="dxa" w:w="3022"/>
-            <w:shd w:val="clear" w:color="auto" w:fill="FFFFFF"/>
-          </w:tcPr>
-          <w:p>
-            <w:r>
-              <w:rPr>
-                <w:color w:val="181818"/>
-                <w:sz w:val="20"/>
-              </w:rPr>
-              <w:t>Destructive</w:t>
-            </w:r>
-          </w:p>
-        </w:tc>
-        <w:tc>
-          <w:tcPr>
-            <w:tcW w:type="dxa" w:w="3022"/>
-            <w:shd w:val="clear" w:color="auto" w:fill="FFFFFF"/>
-          </w:tcPr>
-          <w:p>
-            <w:r>
-              <w:rPr>
-                <w:color w:val="181818"/>
-                <w:sz w:val="20"/>
-              </w:rPr>
-              <w:t>#BA0517</w:t>
-            </w:r>
-          </w:p>
-        </w:tc>
-        <w:tc>
-          <w:tcPr>
-            <w:tcW w:type="dxa" w:w="3022"/>
-            <w:shd w:val="clear" w:color="auto" w:fill="FFFFFF"/>
-          </w:tcPr>
-          <w:p>
-            <w:r>
-              <w:rPr>
-                <w:color w:val="181818"/>
-                <w:sz w:val="20"/>
-              </w:rPr>
-              <w:t>Error state, failed jobs</w:t>
+              <w:t>Error / Failed status</w:t>
             </w:r>
           </w:p>
         </w:tc>
@@ -3237,7 +4346,7 @@
                 <w:color w:val="FFFFFF"/>
                 <w:sz w:val="20"/>
               </w:rPr>
-              <w:t>Hex Color</w:t>
+              <w:t>Hex</w:t>
             </w:r>
           </w:p>
         </w:tc>
@@ -3835,7 +4944,7 @@
           <w:color w:val="0070D2"/>
           <w:sz w:val="28"/>
         </w:rPr>
-        <w:t>7.2 Typography</w:t>
+        <w:t>8.2 Typography</w:t>
       </w:r>
     </w:p>
     <w:tbl>
@@ -3910,7 +5019,7 @@
                 <w:color w:val="181818"/>
                 <w:sz w:val="20"/>
               </w:rPr>
-              <w:t>font-family: SFMono-Regular, Consolas, monospace; font-size: 0.8125rem - distinguishes data from labels</w:t>
+              <w:t>font-family: SFMono-Regular, Consolas, monospace; font-size: 0.8125rem</w:t>
             </w:r>
           </w:p>
         </w:tc>
@@ -3974,7 +5083,7 @@
                 <w:color w:val="181818"/>
                 <w:sz w:val="20"/>
               </w:rPr>
-              <w:t>font-size: 1.5rem; font-weight: 300; color: #032D60 - dashboard readout feel</w:t>
+              <w:t>font-size: 1.5rem; font-weight: 300; color: #032D60</w:t>
             </w:r>
           </w:p>
         </w:tc>
@@ -4024,7 +5133,7 @@
           <w:color w:val="0070D2"/>
           <w:sz w:val="28"/>
         </w:rPr>
-        <w:t>7.3 Screen Layouts (Wireframes)</w:t>
+        <w:t>8.3 Screen Layouts</w:t>
       </w:r>
     </w:p>
     <w:p>
@@ -4043,7 +5152,7 @@
     </w:p>
     <w:p>
       <w:pPr>
-        <w:spacing w:before="80" w:after="80"/>
+        <w:spacing w:before="60" w:after="60"/>
         <w:ind w:left="454"/>
         <w:shd w:val="clear" w:color="auto" w:fill="EAECF0"/>
       </w:pPr>
@@ -4053,12 +5162,9 @@
           <w:color w:val="1E1E2E"/>
           <w:sz w:val="18"/>
         </w:rPr>
-        <w:t>METAMAPPER                                           [?] Help</w:t>
-        <w:br/>
-        <w:t>Salesforce Metadata Dependency Analyzer</w:t>
+        <w:t>METAMAPPER</w:t>
         <w:br/>
         <w:t>-----------------------------------------------------------------------</w:t>
-        <w:br/>
         <w:br/>
         <w:t xml:space="preserve">  ANALYZE A METADATA COMPONENT</w:t>
         <w:br/>
@@ -4102,7 +5208,7 @@
     </w:p>
     <w:p>
       <w:pPr>
-        <w:spacing w:before="80" w:after="80"/>
+        <w:spacing w:before="60" w:after="60"/>
         <w:ind w:left="454"/>
         <w:shd w:val="clear" w:color="auto" w:fill="EAECF0"/>
       </w:pPr>
@@ -4112,11 +5218,6 @@
           <w:color w:val="1E1E2E"/>
           <w:sz w:val="18"/>
         </w:rPr>
-        <w:t>METAMAPPER</w:t>
-        <w:br/>
-        <w:t>-----------------------------------------------------------------------</w:t>
-        <w:br/>
-        <w:br/>
         <w:t xml:space="preserve">  ANALYZING DEPENDENCIES</w:t>
         <w:br/>
         <w:t xml:space="preserve">  Account.Industry__c  &gt;  CustomField</w:t>
@@ -4133,18 +5234,13 @@
         <w:t xml:space="preserve">  Traversal depth: Level 3  *  Last found: OpportunityLineItem</w:t>
         <w:br/>
         <w:br/>
-        <w:t xml:space="preserve">                                              [Cancel Job]</w:t>
-        <w:br/>
-        <w:br/>
         <w:t xml:space="preserve">  ACTIVITY LOG</w:t>
         <w:br/>
-        <w:t xml:space="preserve">  0:43  Found 12 dependencies on Level 3</w:t>
+        <w:t xml:space="preserve">  0:43  Found 12 dependencies on Level 3 (4 supplemental)</w:t>
         <w:br/>
         <w:t xml:space="preserve">  0:31  Found 38 dependencies on Level 2</w:t>
         <w:br/>
-        <w:t xml:space="preserve">  0:12  Found 77 dependencies on Level 1</w:t>
-        <w:br/>
-        <w:t xml:space="preserve">  0:00  Job started</w:t>
+        <w:t xml:space="preserve">  0:00  Job started                                  [Cancel Job]</w:t>
       </w:r>
     </w:p>
     <w:p>
@@ -4163,7 +5259,7 @@
     </w:p>
     <w:p>
       <w:pPr>
-        <w:spacing w:before="80" w:after="80"/>
+        <w:spacing w:before="60" w:after="60"/>
         <w:ind w:left="454"/>
         <w:shd w:val="clear" w:color="auto" w:fill="EAECF0"/>
       </w:pPr>
@@ -4175,28 +5271,28 @@
         </w:rPr>
         <w:t xml:space="preserve">  Account.Industry__c  &gt;  CustomField  *  Complete  *  127 nodes</w:t>
         <w:br/>
+        <w:t xml:space="preserve">  ApexClass(23) Flow(18) ValidationRule(9) Trigger(4) Other(73)</w:t>
         <w:br/>
-        <w:t xml:space="preserve">  [ Tree View ]  [ Graph View ]               [v CSV]  [v JSON]</w:t>
         <w:br/>
-        <w:t xml:space="preserve">  ---------------------------------------------------------------</w:t>
+        <w:t xml:space="preserve">  [ Tree View ]  [ Graph View ]          [v CSV]  [v JSON]  [v package.xml]</w:t>
         <w:br/>
-        <w:t xml:space="preserve">  NAME                          TYPE              LEVEL</w:t>
+        <w:t xml:space="preserve">  -----------------------------------------------------------------------</w:t>
         <w:br/>
-        <w:t xml:space="preserve">  ---------------------------------------------------------------</w:t>
+        <w:t xml:space="preserve">  NAME                          TYPE              LEVEL   FLAGS</w:t>
+        <w:br/>
+        <w:t xml:space="preserve">  -----------------------------------------------------------------------</w:t>
         <w:br/>
         <w:t xml:space="preserve">  v Account.Industry__c         CustomField         0</w:t>
         <w:br/>
-        <w:t xml:space="preserve">    v Opportunity_Stage_Rule     ValidationRule      1</w:t>
+        <w:t xml:space="preserve">    v Opportunity_Stage_Rule     ValidationRule      1     [Supplemental]</w:t>
         <w:br/>
         <w:t xml:space="preserve">        Revenue_Flow_v3          Flow                2</w:t>
         <w:br/>
-        <w:t xml:space="preserve">        Deal_Alert_Email         EmailTemplate       2</w:t>
-        <w:br/>
         <w:t xml:space="preserve">    v IndustryTrigger            ApexTrigger         1</w:t>
         <w:br/>
-        <w:t xml:space="preserve">        IndustryService          ApexClass           2</w:t>
+        <w:t xml:space="preserve">        IndustryService          ApexClass           2     [Write]</w:t>
         <w:br/>
-        <w:t xml:space="preserve">    &gt; Industry_Dashboard         Dashboard           1  (6 more)</w:t>
+        <w:t xml:space="preserve">        DynamicHandler           ApexClass           2     [Dynamic Ref]</w:t>
       </w:r>
     </w:p>
     <w:p>
@@ -4215,7 +5311,7 @@
     </w:p>
     <w:p>
       <w:pPr>
-        <w:spacing w:before="80" w:after="80"/>
+        <w:spacing w:before="60" w:after="60"/>
         <w:ind w:left="454"/>
         <w:shd w:val="clear" w:color="auto" w:fill="EAECF0"/>
       </w:pPr>
@@ -4225,7 +5321,7 @@
           <w:color w:val="1E1E2E"/>
           <w:sz w:val="18"/>
         </w:rPr>
-        <w:t xml:space="preserve">  [ Tree View ]  [ Graph View ]               [v CSV]  [v JSON]</w:t>
+        <w:t xml:space="preserve">  [ Tree View ]  [ Graph View ]          [v CSV]  [v JSON]  [v package.xml]</w:t>
         <w:br/>
         <w:t xml:space="preserve">  +-----------------------------------------+----------------------+</w:t>
         <w:br/>
@@ -4237,23 +5333,19 @@
         <w:br/>
         <w:t xml:space="preserve">  |       [VR]&lt;---[TARGET]---&gt;[L]           | * CustomField        |</w:t>
         <w:br/>
-        <w:t xml:space="preserve">  |                C.Industry               | * ValidationRule     |</w:t>
+        <w:t xml:space="preserve">  |                C.Industry               |                      |</w:t>
         <w:br/>
-        <w:t xml:space="preserve">  |       [ET]&lt;-----__c----&gt;[AT]            | * LWC Component      |</w:t>
+        <w:t xml:space="preserve">  |       [ET]&lt;-----__c----&gt;[AT]            | FILTERS              |</w:t>
         <w:br/>
-        <w:t xml:space="preserve">  |                         |               | * ApexTrigger        |</w:t>
+        <w:t xml:space="preserve">  |       (circular)        |               | [x] ApexClass  (23)  |</w:t>
         <w:br/>
-        <w:t xml:space="preserve">  |                        [AC]             +----------------------+</w:t>
+        <w:t xml:space="preserve">  |                        [AC]~dynamic     | [x] Flow       (18)  |</w:t>
         <w:br/>
-        <w:t xml:space="preserve">  |                                         | FILTERS              |</w:t>
+        <w:t xml:space="preserve">  |                                         | [ ] Other      (73)  |</w:t>
         <w:br/>
-        <w:t xml:space="preserve">  | [+] [-]  [Fit]  [Reset]                 | [x] ApexClass  (23)  |</w:t>
+        <w:t xml:space="preserve">  | [+] [-]  [Fit]  [Reset]                 |                      |</w:t>
         <w:br/>
-        <w:t xml:space="preserve">  |                                         | [x] Flow       (18)  |</w:t>
-        <w:br/>
-        <w:t xml:space="preserve">  |  Click node: highlight + dim others     | [x] Validation (9)   |</w:t>
-        <w:br/>
-        <w:t xml:space="preserve">  |  Scroll: zoom  |  Drag: pan             | [ ] Other      (73)  |</w:t>
+        <w:t xml:space="preserve">  | ~ = dynamic ref  o = circular           | [x] Supplemental     |</w:t>
         <w:br/>
         <w:t xml:space="preserve">  +-----------------------------------------+----------------------+</w:t>
       </w:r>
@@ -4269,7 +5361,7 @@
           <w:color w:val="0070D2"/>
           <w:sz w:val="28"/>
         </w:rPr>
-        <w:t>7.4 Component States</w:t>
+        <w:t>8.4 Component States</w:t>
       </w:r>
     </w:p>
     <w:tbl>
@@ -4346,7 +5438,7 @@
                 <w:color w:val="181818"/>
                 <w:sz w:val="20"/>
               </w:rPr>
-              <w:t>Metadata Type Dropdown</w:t>
+              <w:t>Submit Button</w:t>
             </w:r>
           </w:p>
         </w:tc>
@@ -4376,7 +5468,7 @@
                 <w:color w:val="181818"/>
                 <w:sz w:val="20"/>
               </w:rPr>
-              <w:t>Placeholder: "Select metadata type..."</w:t>
+              <w:t>"Analyze Dependencies" - SLDS brand variant</w:t>
             </w:r>
           </w:p>
         </w:tc>
@@ -4393,7 +5485,7 @@
                 <w:color w:val="181818"/>
                 <w:sz w:val="20"/>
               </w:rPr>
-              <w:t>Metadata Type Dropdown</w:t>
+              <w:t>Submit Button</w:t>
             </w:r>
           </w:p>
         </w:tc>
@@ -4408,7 +5500,7 @@
                 <w:color w:val="181818"/>
                 <w:sz w:val="20"/>
               </w:rPr>
-              <w:t>Selected</w:t>
+              <w:t>Loading</w:t>
             </w:r>
           </w:p>
         </w:tc>
@@ -4423,7 +5515,7 @@
                 <w:color w:val="181818"/>
                 <w:sz w:val="20"/>
               </w:rPr>
-              <w:t>Shows type label; triggers conditional field visibility</w:t>
+              <w:t>Spinner + "Starting analysis..." - disabled</w:t>
             </w:r>
           </w:p>
         </w:tc>
@@ -4440,7 +5532,7 @@
                 <w:color w:val="181818"/>
                 <w:sz w:val="20"/>
               </w:rPr>
-              <w:t>Typeahead Object Lookup</w:t>
+              <w:t>Typeahead Lookup</w:t>
             </w:r>
           </w:p>
         </w:tc>
@@ -4470,7 +5562,7 @@
                 <w:color w:val="181818"/>
                 <w:sz w:val="20"/>
               </w:rPr>
-              <w:t>Hidden when type does not require object scope (e.g. ApexClass)</w:t>
+              <w:t>Hidden when type does not require object scope</w:t>
             </w:r>
           </w:p>
         </w:tc>
@@ -4487,7 +5579,7 @@
                 <w:color w:val="181818"/>
                 <w:sz w:val="20"/>
               </w:rPr>
-              <w:t>Typeahead Object Lookup</w:t>
+              <w:t>Typeahead Lookup</w:t>
             </w:r>
           </w:p>
         </w:tc>
@@ -4517,7 +5609,7 @@
                 <w:color w:val="181818"/>
                 <w:sz w:val="20"/>
               </w:rPr>
-              <w:t>Inline spinner, then dropdown: ObjectLabel + ApiName in monospace</w:t>
+              <w:t>Inline spinner then dropdown: ObjectLabel + ApiName in monospace</w:t>
             </w:r>
           </w:p>
         </w:tc>
@@ -4534,7 +5626,7 @@
                 <w:color w:val="181818"/>
                 <w:sz w:val="20"/>
               </w:rPr>
-              <w:t>Submit Button</w:t>
+              <w:t>Progress Bar</w:t>
             </w:r>
           </w:p>
         </w:tc>
@@ -4549,7 +5641,7 @@
                 <w:color w:val="181818"/>
                 <w:sz w:val="20"/>
               </w:rPr>
-              <w:t>Default</w:t>
+              <w:t>Indeterminate</w:t>
             </w:r>
           </w:p>
         </w:tc>
@@ -4564,7 +5656,7 @@
                 <w:color w:val="181818"/>
                 <w:sz w:val="20"/>
               </w:rPr>
-              <w:t>"Analyze Dependencies" - SLDS brand variant</w:t>
+              <w:t>Pulse animation until first Platform Event arrives</w:t>
             </w:r>
           </w:p>
         </w:tc>
@@ -4581,7 +5673,7 @@
                 <w:color w:val="181818"/>
                 <w:sz w:val="20"/>
               </w:rPr>
-              <w:t>Submit Button</w:t>
+              <w:t>Progress Bar</w:t>
             </w:r>
           </w:p>
         </w:tc>
@@ -4596,7 +5688,7 @@
                 <w:color w:val="181818"/>
                 <w:sz w:val="20"/>
               </w:rPr>
-              <w:t>Loading</w:t>
+              <w:t>Determinate</w:t>
             </w:r>
           </w:p>
         </w:tc>
@@ -4611,7 +5703,7 @@
                 <w:color w:val="181818"/>
                 <w:sz w:val="20"/>
               </w:rPr>
-              <w:t>Spinner + "Starting analysis..." - disabled</w:t>
+              <w:t>Fills from Nodes_Processed__c</w:t>
             </w:r>
           </w:p>
         </w:tc>
@@ -4628,7 +5720,7 @@
                 <w:color w:val="181818"/>
                 <w:sz w:val="20"/>
               </w:rPr>
-              <w:t>Submit Button</w:t>
+              <w:t>Job Status Badge</w:t>
             </w:r>
           </w:p>
         </w:tc>
@@ -4643,7 +5735,7 @@
                 <w:color w:val="181818"/>
                 <w:sz w:val="20"/>
               </w:rPr>
-              <w:t>Disabled</w:t>
+              <w:t>Initializing</w:t>
             </w:r>
           </w:p>
         </w:tc>
@@ -4658,7 +5750,7 @@
                 <w:color w:val="181818"/>
                 <w:sz w:val="20"/>
               </w:rPr>
-              <w:t>When required fields are empty</w:t>
+              <w:t>Gray spinner</w:t>
             </w:r>
           </w:p>
         </w:tc>
@@ -4675,7 +5767,7 @@
                 <w:color w:val="181818"/>
                 <w:sz w:val="20"/>
               </w:rPr>
-              <w:t>Progress Bar</w:t>
+              <w:t>Job Status Badge</w:t>
             </w:r>
           </w:p>
         </w:tc>
@@ -4690,7 +5782,7 @@
                 <w:color w:val="181818"/>
                 <w:sz w:val="20"/>
               </w:rPr>
-              <w:t>Indeterminate</w:t>
+              <w:t>Processing</w:t>
             </w:r>
           </w:p>
         </w:tc>
@@ -4705,7 +5797,7 @@
                 <w:color w:val="181818"/>
                 <w:sz w:val="20"/>
               </w:rPr>
-              <w:t>Pulse animation until first Dependency_Status__e event arrives</w:t>
+              <w:t>Amber spinner</w:t>
             </w:r>
           </w:p>
         </w:tc>
@@ -4722,7 +5814,7 @@
                 <w:color w:val="181818"/>
                 <w:sz w:val="20"/>
               </w:rPr>
-              <w:t>Progress Bar</w:t>
+              <w:t>Job Status Badge</w:t>
             </w:r>
           </w:p>
         </w:tc>
@@ -4737,7 +5829,7 @@
                 <w:color w:val="181818"/>
                 <w:sz w:val="20"/>
               </w:rPr>
-              <w:t>Determinate</w:t>
+              <w:t>Completed</w:t>
             </w:r>
           </w:p>
         </w:tc>
@@ -4752,7 +5844,7 @@
                 <w:color w:val="181818"/>
                 <w:sz w:val="20"/>
               </w:rPr>
-              <w:t>Fills based on Nodes_Processed__c vs rolling estimated total</w:t>
+              <w:t>Green checkmark</w:t>
             </w:r>
           </w:p>
         </w:tc>
@@ -4784,7 +5876,7 @@
                 <w:color w:val="181818"/>
                 <w:sz w:val="20"/>
               </w:rPr>
-              <w:t>Initializing</w:t>
+              <w:t>Failed</w:t>
             </w:r>
           </w:p>
         </w:tc>
@@ -4799,7 +5891,7 @@
                 <w:color w:val="181818"/>
                 <w:sz w:val="20"/>
               </w:rPr>
-              <w:t>Gray spinner</w:t>
+              <w:t>Red error icon</w:t>
             </w:r>
           </w:p>
         </w:tc>
@@ -4816,7 +5908,7 @@
                 <w:color w:val="181818"/>
                 <w:sz w:val="20"/>
               </w:rPr>
-              <w:t>Job Status Badge</w:t>
+              <w:t>Node flag - Circular</w:t>
             </w:r>
           </w:p>
         </w:tc>
@@ -4831,7 +5923,7 @@
                 <w:color w:val="181818"/>
                 <w:sz w:val="20"/>
               </w:rPr>
-              <w:t>Processing</w:t>
+              <w:t>Tree + Graph</w:t>
             </w:r>
           </w:p>
         </w:tc>
@@ -4846,7 +5938,7 @@
                 <w:color w:val="181818"/>
                 <w:sz w:val="20"/>
               </w:rPr>
-              <w:t>Amber spinner</w:t>
+              <w:t>Dashed border / dimmed opacity; tooltip: "Already referenced above"</w:t>
             </w:r>
           </w:p>
         </w:tc>
@@ -4863,7 +5955,7 @@
                 <w:color w:val="181818"/>
                 <w:sz w:val="20"/>
               </w:rPr>
-              <w:t>Job Status Badge</w:t>
+              <w:t>Node flag - Dynamic</w:t>
             </w:r>
           </w:p>
         </w:tc>
@@ -4878,7 +5970,7 @@
                 <w:color w:val="181818"/>
                 <w:sz w:val="20"/>
               </w:rPr>
-              <w:t>Completed</w:t>
+              <w:t>Tree + Graph</w:t>
             </w:r>
           </w:p>
         </w:tc>
@@ -4893,7 +5985,7 @@
                 <w:color w:val="181818"/>
                 <w:sz w:val="20"/>
               </w:rPr>
-              <w:t>Green checkmark</w:t>
+              <w:t>~ prefix; tooltip: "Dynamic reference - manual review required"</w:t>
             </w:r>
           </w:p>
         </w:tc>
@@ -4910,7 +6002,7 @@
                 <w:color w:val="181818"/>
                 <w:sz w:val="20"/>
               </w:rPr>
-              <w:t>Job Status Badge</w:t>
+              <w:t>Node flag - Supplemental</w:t>
             </w:r>
           </w:p>
         </w:tc>
@@ -4925,7 +6017,7 @@
                 <w:color w:val="181818"/>
                 <w:sz w:val="20"/>
               </w:rPr>
-              <w:t>Failed</w:t>
+              <w:t>Tree</w:t>
             </w:r>
           </w:p>
         </w:tc>
@@ -4940,7 +6032,7 @@
                 <w:color w:val="181818"/>
                 <w:sz w:val="20"/>
               </w:rPr>
-              <w:t>Red error icon</w:t>
+              <w:t>[Supplemental] badge; tooltip: "Found via secondary query"</w:t>
             </w:r>
           </w:p>
         </w:tc>
@@ -4958,7 +6050,7 @@
           <w:color w:val="0070D2"/>
           <w:sz w:val="28"/>
         </w:rPr>
-        <w:t>7.5 Interaction Patterns</w:t>
+        <w:t>8.5 Interaction Patterns</w:t>
       </w:r>
     </w:p>
     <w:p>
@@ -4986,7 +6078,7 @@
           <w:color w:val="181818"/>
           <w:sz w:val="21"/>
         </w:rPr>
-        <w:t>Scroll wheel: zoom in/out (ECharts built-in)</w:t>
+        <w:t>Scroll wheel: zoom. Click + drag background: pan.</w:t>
       </w:r>
     </w:p>
     <w:p>
@@ -5000,7 +6092,7 @@
           <w:color w:val="181818"/>
           <w:sz w:val="21"/>
         </w:rPr>
-        <w:t>Click + drag background: pan the canvas</w:t>
+        <w:t>Click a node: highlights node + direct edges; all others dim to 20% opacity; detail tooltip shows type, API name, depth, Source__c, Context_Data__c pills.</w:t>
       </w:r>
     </w:p>
     <w:p>
@@ -5014,7 +6106,7 @@
           <w:color w:val="181818"/>
           <w:sz w:val="21"/>
         </w:rPr>
-        <w:t>Click a node: highlights that node + direct edges; all other nodes dim to 20% opacity; detail tooltip shows type, API name, depth level</w:t>
+        <w:t>Double-click: center and zoom to node.</w:t>
       </w:r>
     </w:p>
     <w:p>
@@ -5028,7 +6120,7 @@
           <w:color w:val="181818"/>
           <w:sz w:val="21"/>
         </w:rPr>
-        <w:t>Double-click a node: centers and zooms to that node</w:t>
+        <w:t>Type filter checkboxes: hide/show node types and their edges live.</w:t>
       </w:r>
     </w:p>
     <w:p>
@@ -5042,7 +6134,21 @@
           <w:color w:val="181818"/>
           <w:sz w:val="21"/>
         </w:rPr>
-        <w:t>Hover a node: tooltip with full Metadata_Name__c in monospace, type badge, depth level</w:t>
+        <w:t>Source filter: toggle "Supplemental" to show/hide supplemental-only nodes.</w:t>
+      </w:r>
+    </w:p>
+    <w:p>
+      <w:pPr>
+        <w:spacing w:after="80"/>
+      </w:pPr>
+      <w:r>
+        <w:rPr>
+          <w:b/>
+          <w:i w:val="0"/>
+          <w:color w:val="181818"/>
+          <w:sz w:val="21"/>
+        </w:rPr>
+        <w:t>Export formats</w:t>
       </w:r>
     </w:p>
     <w:p>
@@ -5056,21 +6162,7 @@
           <w:color w:val="181818"/>
           <w:sz w:val="21"/>
         </w:rPr>
-        <w:t>Type filter checkboxes (sidebar): toggling a type hides/shows matching nodes and their edges live</w:t>
-      </w:r>
-    </w:p>
-    <w:p>
-      <w:pPr>
-        <w:spacing w:after="80"/>
-      </w:pPr>
-      <w:r>
-        <w:rPr>
-          <w:b/>
-          <w:i w:val="0"/>
-          <w:color w:val="181818"/>
-          <w:sz w:val="21"/>
-        </w:rPr>
-        <w:t>Tree View</w:t>
+        <w:t>CSV: Level, Metadata_Type, Metadata_Name, Metadata_ID, Parent_Name, Is_Circular, Is_Dynamic, Source</w:t>
       </w:r>
     </w:p>
     <w:p>
@@ -5084,7 +6176,7 @@
           <w:color w:val="181818"/>
           <w:sz w:val="21"/>
         </w:rPr>
-        <w:t>Chevron expand/collapse on nodes with children (lightning-tree-grid standard)</w:t>
+        <w:t>JSON: nested tree with Context_Data__c pills included</w:t>
       </w:r>
     </w:p>
     <w:p>
@@ -5098,133 +6190,7 @@
           <w:color w:val="181818"/>
           <w:sz w:val="21"/>
         </w:rPr>
-        <w:t>Row click: popover showing full Metadata_Name__c and Metadata_ID__c in monospace</w:t>
-      </w:r>
-    </w:p>
-    <w:p>
-      <w:pPr>
-        <w:pStyle w:val="ListBullet"/>
-        <w:spacing w:after="40"/>
-        <w:ind w:left="283"/>
-      </w:pPr>
-      <w:r>
-        <w:rPr>
-          <w:color w:val="181818"/>
-          <w:sz w:val="21"/>
-        </w:rPr>
-        <w:t>All metadata names rendered in monospace throughout</w:t>
-      </w:r>
-    </w:p>
-    <w:p>
-      <w:pPr>
-        <w:spacing w:after="80"/>
-      </w:pPr>
-      <w:r>
-        <w:rPr>
-          <w:b/>
-          <w:i w:val="0"/>
-          <w:color w:val="181818"/>
-          <w:sz w:val="21"/>
-        </w:rPr>
-        <w:t>Export</w:t>
-      </w:r>
-    </w:p>
-    <w:p>
-      <w:pPr>
-        <w:pStyle w:val="ListBullet"/>
-        <w:spacing w:after="40"/>
-        <w:ind w:left="283"/>
-      </w:pPr>
-      <w:r>
-        <w:rPr>
-          <w:color w:val="181818"/>
-          <w:sz w:val="21"/>
-        </w:rPr>
-        <w:t>CSV: flat list with columns Level, Metadata_Type, Metadata_Name, Metadata_ID, Parent_Name</w:t>
-      </w:r>
-    </w:p>
-    <w:p>
-      <w:pPr>
-        <w:pStyle w:val="ListBullet"/>
-        <w:spacing w:after="40"/>
-        <w:ind w:left="283"/>
-      </w:pPr>
-      <w:r>
-        <w:rPr>
-          <w:color w:val="181818"/>
-          <w:sz w:val="21"/>
-        </w:rPr>
-        <w:t>JSON: nested tree structure mirroring the Dependency_Node__c hierarchy</w:t>
-      </w:r>
-    </w:p>
-    <w:p>
-      <w:pPr>
-        <w:pStyle w:val="ListBullet"/>
-        <w:spacing w:after="40"/>
-        <w:ind w:left="283"/>
-      </w:pPr>
-      <w:r>
-        <w:rPr>
-          <w:color w:val="181818"/>
-          <w:sz w:val="21"/>
-        </w:rPr>
-        <w:t>Both trigger browser download - filename: MetaMapper_{APIName}_{timestamp}.csv / .json</w:t>
-      </w:r>
-    </w:p>
-    <w:p>
-      <w:pPr>
-        <w:pStyle w:val="ListBullet"/>
-        <w:spacing w:after="40"/>
-        <w:ind w:left="283"/>
-      </w:pPr>
-      <w:r>
-        <w:rPr>
-          <w:color w:val="181818"/>
-          <w:sz w:val="21"/>
-        </w:rPr>
-        <w:t>No server round-trip - pure client-side generation in the LWC</w:t>
-      </w:r>
-    </w:p>
-    <w:p>
-      <w:pPr>
-        <w:spacing w:after="80"/>
-      </w:pPr>
-      <w:r>
-        <w:rPr>
-          <w:b/>
-          <w:i w:val="0"/>
-          <w:color w:val="181818"/>
-          <w:sz w:val="21"/>
-        </w:rPr>
-        <w:t>Notifications</w:t>
-      </w:r>
-    </w:p>
-    <w:p>
-      <w:pPr>
-        <w:pStyle w:val="ListBullet"/>
-        <w:spacing w:after="40"/>
-        <w:ind w:left="283"/>
-      </w:pPr>
-      <w:r>
-        <w:rPr>
-          <w:color w:val="181818"/>
-          <w:sz w:val="21"/>
-        </w:rPr>
-        <w:t>Bell (Custom Notification): fires on Completed or Failed; clicking navigates to Results screen for that job</w:t>
-      </w:r>
-    </w:p>
-    <w:p>
-      <w:pPr>
-        <w:pStyle w:val="ListBullet"/>
-        <w:spacing w:after="40"/>
-        <w:ind w:left="283"/>
-      </w:pPr>
-      <w:r>
-        <w:rPr>
-          <w:color w:val="181818"/>
-          <w:sz w:val="21"/>
-        </w:rPr>
-        <w:t>Email: fires on Completed with summary of job target, node count, and duration</w:t>
+        <w:t>package.xml: valid Salesforce deployment manifest grouped by &lt;types&gt;; excludes managed package components (namespace-prefixed)</w:t>
       </w:r>
     </w:p>
     <w:p>
@@ -5238,7 +6204,7 @@
           <w:color w:val="032D60"/>
           <w:sz w:val="36"/>
         </w:rPr>
-        <w:t>8. Apex Class Inventory</w:t>
+        <w:t>9. Apex Class Inventory</w:t>
       </w:r>
     </w:p>
     <w:p>
@@ -5306,7 +6272,7 @@
                 <w:color w:val="FFFFFF"/>
                 <w:sz w:val="20"/>
               </w:rPr>
-              <w:t>Key Methods / Responsibility</w:t>
+              <w:t>Responsibility</w:t>
             </w:r>
           </w:p>
         </w:tc>
@@ -5400,7 +6366,7 @@
                 <w:color w:val="181818"/>
                 <w:sz w:val="20"/>
               </w:rPr>
-              <w:t>buildToolingQuery(), applyFlowFilter(), extractMetadataIds()</w:t>
+              <w:t>buildToolingQuery() (100-ID chunks), QueryMore loop, HTTP 414 reactive split, applyFlowFilter(), buildContextData()</w:t>
             </w:r>
           </w:p>
         </w:tc>
@@ -5417,7 +6383,7 @@
                 <w:color w:val="181818"/>
                 <w:sz w:val="20"/>
               </w:rPr>
-              <w:t>DependencyQueueable</w:t>
+              <w:t>IDependencyTypeHandler</w:t>
             </w:r>
           </w:p>
         </w:tc>
@@ -5432,7 +6398,7 @@
                 <w:color w:val="181818"/>
                 <w:sz w:val="20"/>
               </w:rPr>
-              <w:t>Queueable + AllowsCallouts</w:t>
+              <w:t>Interface</w:t>
             </w:r>
           </w:p>
         </w:tc>
@@ -5447,7 +6413,7 @@
                 <w:color w:val="181818"/>
                 <w:sz w:val="20"/>
               </w:rPr>
-              <w:t>execute(): engine loop, cycle detection, limit guardrails, self-chaining</w:t>
+              <w:t>findSupplemental(Id jobId, List&lt;Dependency_Node__c&gt; nodesOfType)</w:t>
             </w:r>
           </w:p>
         </w:tc>
@@ -5464,7 +6430,7 @@
                 <w:color w:val="181818"/>
                 <w:sz w:val="20"/>
               </w:rPr>
-              <w:t>DependencyNotificationService</w:t>
+              <w:t>DependencyTypeHandlerFactory</w:t>
             </w:r>
           </w:p>
         </w:tc>
@@ -5479,7 +6445,7 @@
                 <w:color w:val="181818"/>
                 <w:sz w:val="20"/>
               </w:rPr>
-              <w:t>Utility</w:t>
+              <w:t>Factory</w:t>
             </w:r>
           </w:p>
         </w:tc>
@@ -5494,7 +6460,7 @@
                 <w:color w:val="181818"/>
                 <w:sz w:val="20"/>
               </w:rPr>
-              <w:t>publishProgress(), sendCompletionNotification()</w:t>
+              <w:t>getHandler(String metadataType) - returns correct handler or no-op</w:t>
             </w:r>
           </w:p>
         </w:tc>
@@ -5511,7 +6477,7 @@
                 <w:color w:val="181818"/>
                 <w:sz w:val="20"/>
               </w:rPr>
-              <w:t>DependencyCleanupBatch</w:t>
+              <w:t>CustomFieldHandler</w:t>
             </w:r>
           </w:p>
         </w:tc>
@@ -5526,7 +6492,7 @@
                 <w:color w:val="181818"/>
                 <w:sz w:val="20"/>
               </w:rPr>
-              <w:t>Batchable</w:t>
+              <w:t>Handler</w:t>
             </w:r>
           </w:p>
         </w:tc>
@@ -5541,7 +6507,7 @@
                 <w:color w:val="181818"/>
                 <w:sz w:val="20"/>
               </w:rPr>
-              <w:t>Hard-deletes Dependency_Job__c records older than 24 hours</w:t>
+              <w:t>WorkflowFieldUpdate, ValidationRule regex, FlexiPage XML, CMT lookups, Lookup relationships</w:t>
             </w:r>
           </w:p>
         </w:tc>
@@ -5558,7 +6524,7 @@
                 <w:color w:val="181818"/>
                 <w:sz w:val="20"/>
               </w:rPr>
-              <w:t>DependencyCleanupScheduler</w:t>
+              <w:t>ApexClassHandler</w:t>
             </w:r>
           </w:p>
         </w:tc>
@@ -5573,7 +6539,7 @@
                 <w:color w:val="181818"/>
                 <w:sz w:val="20"/>
               </w:rPr>
-              <w:t>Schedulable</w:t>
+              <w:t>Handler</w:t>
             </w:r>
           </w:p>
         </w:tc>
@@ -5588,7 +6554,242 @@
                 <w:color w:val="181818"/>
                 <w:sz w:val="20"/>
               </w:rPr>
-              <w:t>Schedules DependencyCleanupBatch nightly at 02:00</w:t>
+              <w:t>CMT record field references; flags Is_Dynamic_Reference__c</w:t>
+            </w:r>
+          </w:p>
+        </w:tc>
+      </w:tr>
+      <w:tr>
+        <w:tc>
+          <w:tcPr>
+            <w:tcW w:type="dxa" w:w="3022"/>
+            <w:shd w:val="clear" w:color="auto" w:fill="F2F4F7"/>
+          </w:tcPr>
+          <w:p>
+            <w:r>
+              <w:rPr>
+                <w:color w:val="181818"/>
+                <w:sz w:val="20"/>
+              </w:rPr>
+              <w:t>FlowHandler</w:t>
+            </w:r>
+          </w:p>
+        </w:tc>
+        <w:tc>
+          <w:tcPr>
+            <w:tcW w:type="dxa" w:w="3022"/>
+            <w:shd w:val="clear" w:color="auto" w:fill="F2F4F7"/>
+          </w:tcPr>
+          <w:p>
+            <w:r>
+              <w:rPr>
+                <w:color w:val="181818"/>
+                <w:sz w:val="20"/>
+              </w:rPr>
+              <w:t>Handler</w:t>
+            </w:r>
+          </w:p>
+        </w:tc>
+        <w:tc>
+          <w:tcPr>
+            <w:tcW w:type="dxa" w:w="3022"/>
+            <w:shd w:val="clear" w:color="auto" w:fill="F2F4F7"/>
+          </w:tcPr>
+          <w:p>
+            <w:r>
+              <w:rPr>
+                <w:color w:val="181818"/>
+                <w:sz w:val="20"/>
+              </w:rPr>
+              <w:t>QuickActionDefinition trigger flows, subflow references, WebLink URLs</w:t>
+            </w:r>
+          </w:p>
+        </w:tc>
+      </w:tr>
+      <w:tr>
+        <w:tc>
+          <w:tcPr>
+            <w:tcW w:type="dxa" w:w="3022"/>
+            <w:shd w:val="clear" w:color="auto" w:fill="FFFFFF"/>
+          </w:tcPr>
+          <w:p>
+            <w:r>
+              <w:rPr>
+                <w:color w:val="181818"/>
+                <w:sz w:val="20"/>
+              </w:rPr>
+              <w:t>DependencyQueueable</w:t>
+            </w:r>
+          </w:p>
+        </w:tc>
+        <w:tc>
+          <w:tcPr>
+            <w:tcW w:type="dxa" w:w="3022"/>
+            <w:shd w:val="clear" w:color="auto" w:fill="FFFFFF"/>
+          </w:tcPr>
+          <w:p>
+            <w:r>
+              <w:rPr>
+                <w:color w:val="181818"/>
+                <w:sz w:val="20"/>
+              </w:rPr>
+              <w:t>Queueable + AllowsCallouts</w:t>
+            </w:r>
+          </w:p>
+        </w:tc>
+        <w:tc>
+          <w:tcPr>
+            <w:tcW w:type="dxa" w:w="3022"/>
+            <w:shd w:val="clear" w:color="auto" w:fill="FFFFFF"/>
+          </w:tcPr>
+          <w:p>
+            <w:r>
+              <w:rPr>
+                <w:color w:val="181818"/>
+                <w:sz w:val="20"/>
+              </w:rPr>
+              <w:t>Full engine: callouts, handler dispatch, cycle detection, limit guardrails, QueryMore, self-chaining</w:t>
+            </w:r>
+          </w:p>
+        </w:tc>
+      </w:tr>
+      <w:tr>
+        <w:tc>
+          <w:tcPr>
+            <w:tcW w:type="dxa" w:w="3022"/>
+            <w:shd w:val="clear" w:color="auto" w:fill="F2F4F7"/>
+          </w:tcPr>
+          <w:p>
+            <w:r>
+              <w:rPr>
+                <w:color w:val="181818"/>
+                <w:sz w:val="20"/>
+              </w:rPr>
+              <w:t>DependencyNotificationService</w:t>
+            </w:r>
+          </w:p>
+        </w:tc>
+        <w:tc>
+          <w:tcPr>
+            <w:tcW w:type="dxa" w:w="3022"/>
+            <w:shd w:val="clear" w:color="auto" w:fill="F2F4F7"/>
+          </w:tcPr>
+          <w:p>
+            <w:r>
+              <w:rPr>
+                <w:color w:val="181818"/>
+                <w:sz w:val="20"/>
+              </w:rPr>
+              <w:t>Utility</w:t>
+            </w:r>
+          </w:p>
+        </w:tc>
+        <w:tc>
+          <w:tcPr>
+            <w:tcW w:type="dxa" w:w="3022"/>
+            <w:shd w:val="clear" w:color="auto" w:fill="F2F4F7"/>
+          </w:tcPr>
+          <w:p>
+            <w:r>
+              <w:rPr>
+                <w:color w:val="181818"/>
+                <w:sz w:val="20"/>
+              </w:rPr>
+              <w:t>publishProgress(), sendCompletionNotification() (bell + email)</w:t>
+            </w:r>
+          </w:p>
+        </w:tc>
+      </w:tr>
+      <w:tr>
+        <w:tc>
+          <w:tcPr>
+            <w:tcW w:type="dxa" w:w="3022"/>
+            <w:shd w:val="clear" w:color="auto" w:fill="FFFFFF"/>
+          </w:tcPr>
+          <w:p>
+            <w:r>
+              <w:rPr>
+                <w:color w:val="181818"/>
+                <w:sz w:val="20"/>
+              </w:rPr>
+              <w:t>DependencyCleanupBatch</w:t>
+            </w:r>
+          </w:p>
+        </w:tc>
+        <w:tc>
+          <w:tcPr>
+            <w:tcW w:type="dxa" w:w="3022"/>
+            <w:shd w:val="clear" w:color="auto" w:fill="FFFFFF"/>
+          </w:tcPr>
+          <w:p>
+            <w:r>
+              <w:rPr>
+                <w:color w:val="181818"/>
+                <w:sz w:val="20"/>
+              </w:rPr>
+              <w:t>Batchable</w:t>
+            </w:r>
+          </w:p>
+        </w:tc>
+        <w:tc>
+          <w:tcPr>
+            <w:tcW w:type="dxa" w:w="3022"/>
+            <w:shd w:val="clear" w:color="auto" w:fill="FFFFFF"/>
+          </w:tcPr>
+          <w:p>
+            <w:r>
+              <w:rPr>
+                <w:color w:val="181818"/>
+                <w:sz w:val="20"/>
+              </w:rPr>
+              <w:t>Hard-deletes Dependency_Job__c &gt; 24 hours</w:t>
+            </w:r>
+          </w:p>
+        </w:tc>
+      </w:tr>
+      <w:tr>
+        <w:tc>
+          <w:tcPr>
+            <w:tcW w:type="dxa" w:w="3022"/>
+            <w:shd w:val="clear" w:color="auto" w:fill="F2F4F7"/>
+          </w:tcPr>
+          <w:p>
+            <w:r>
+              <w:rPr>
+                <w:color w:val="181818"/>
+                <w:sz w:val="20"/>
+              </w:rPr>
+              <w:t>DependencyCleanupScheduler</w:t>
+            </w:r>
+          </w:p>
+        </w:tc>
+        <w:tc>
+          <w:tcPr>
+            <w:tcW w:type="dxa" w:w="3022"/>
+            <w:shd w:val="clear" w:color="auto" w:fill="F2F4F7"/>
+          </w:tcPr>
+          <w:p>
+            <w:r>
+              <w:rPr>
+                <w:color w:val="181818"/>
+                <w:sz w:val="20"/>
+              </w:rPr>
+              <w:t>Schedulable</w:t>
+            </w:r>
+          </w:p>
+        </w:tc>
+        <w:tc>
+          <w:tcPr>
+            <w:tcW w:type="dxa" w:w="3022"/>
+            <w:shd w:val="clear" w:color="auto" w:fill="F2F4F7"/>
+          </w:tcPr>
+          <w:p>
+            <w:r>
+              <w:rPr>
+                <w:color w:val="181818"/>
+                <w:sz w:val="20"/>
+              </w:rPr>
+              <w:t>Schedules cleanup at 02:00</w:t>
             </w:r>
           </w:p>
         </w:tc>
@@ -5606,7 +6807,7 @@
           <w:color w:val="032D60"/>
           <w:sz w:val="36"/>
         </w:rPr>
-        <w:t>9. Testing Strategy</w:t>
+        <w:t>10. Testing Strategy</w:t>
       </w:r>
     </w:p>
     <w:p>
@@ -5628,7 +6829,7 @@
           <w:color w:val="181818"/>
           <w:sz w:val="21"/>
         </w:rPr>
-        <w:t>Every Apex class requires Positive, Negative, Edge, and Scale test scenarios. Minimum 90% code coverage enforced.</w:t>
+        <w:t>Every class: Positive, Negative, Edge, Scale. Minimum 90% coverage. HttpCalloutMock for all Tooling API responses.</w:t>
       </w:r>
     </w:p>
     <w:tbl>
@@ -5703,7 +6904,7 @@
                 <w:color w:val="181818"/>
                 <w:sz w:val="20"/>
               </w:rPr>
-              <w:t>Valid job creation, missing/invalid params, FLS enforcement, typeahead empty/partial match</w:t>
+              <w:t>Valid create, missing params, FLS enforcement, typeahead empty/partial</w:t>
             </w:r>
           </w:p>
         </w:tc>
@@ -5735,7 +6936,7 @@
                 <w:color w:val="181818"/>
                 <w:sz w:val="20"/>
               </w:rPr>
-              <w:t>Query string formatting, Flow filter active vs. inactive, JSON parse edge cases, IN chunk boundaries</w:t>
+              <w:t>100-ID chunking, QueryMore multi-page, HTTP 414 reactive split, Flow filter, JSON parse edge cases</w:t>
             </w:r>
           </w:p>
         </w:tc>
@@ -5767,7 +6968,7 @@
                 <w:color w:val="181818"/>
                 <w:sz w:val="20"/>
               </w:rPr>
-              <w:t>Normal traversal, circular dependency (no infinite loop), limit guardrail triggers self-chain, Completed transition, Failed on callout exception</w:t>
+              <w:t>Normal traversal, circular node Is_Circular__c, limit guardrail self-chain, Completed + Summary_JSON__c, Failed on callout exception</w:t>
             </w:r>
           </w:p>
         </w:tc>
@@ -5799,27 +7000,109 @@
                 <w:color w:val="181818"/>
                 <w:sz w:val="20"/>
               </w:rPr>
-              <w:t>Deletes records &gt;24h, preserves records &lt;24h, handles empty batch scope</w:t>
+              <w:t>Deletes &gt;24h, preserves &lt;24h, empty batch</w:t>
+            </w:r>
+          </w:p>
+        </w:tc>
+      </w:tr>
+      <w:tr>
+        <w:tc>
+          <w:tcPr>
+            <w:tcW w:type="dxa" w:w="4533"/>
+            <w:shd w:val="clear" w:color="auto" w:fill="F2F4F7"/>
+          </w:tcPr>
+          <w:p>
+            <w:r>
+              <w:rPr>
+                <w:color w:val="181818"/>
+                <w:sz w:val="20"/>
+              </w:rPr>
+              <w:t>CustomFieldHandlerTest</w:t>
+            </w:r>
+          </w:p>
+        </w:tc>
+        <w:tc>
+          <w:tcPr>
+            <w:tcW w:type="dxa" w:w="4533"/>
+            <w:shd w:val="clear" w:color="auto" w:fill="F2F4F7"/>
+          </w:tcPr>
+          <w:p>
+            <w:r>
+              <w:rPr>
+                <w:color w:val="181818"/>
+                <w:sz w:val="20"/>
+              </w:rPr>
+              <w:t>WorkflowFieldUpdate hit, ValidationRule formula match, no results</w:t>
+            </w:r>
+          </w:p>
+        </w:tc>
+      </w:tr>
+      <w:tr>
+        <w:tc>
+          <w:tcPr>
+            <w:tcW w:type="dxa" w:w="4533"/>
+            <w:shd w:val="clear" w:color="auto" w:fill="FFFFFF"/>
+          </w:tcPr>
+          <w:p>
+            <w:r>
+              <w:rPr>
+                <w:color w:val="181818"/>
+                <w:sz w:val="20"/>
+              </w:rPr>
+              <w:t>ApexClassHandlerTest</w:t>
+            </w:r>
+          </w:p>
+        </w:tc>
+        <w:tc>
+          <w:tcPr>
+            <w:tcW w:type="dxa" w:w="4533"/>
+            <w:shd w:val="clear" w:color="auto" w:fill="FFFFFF"/>
+          </w:tcPr>
+          <w:p>
+            <w:r>
+              <w:rPr>
+                <w:color w:val="181818"/>
+                <w:sz w:val="20"/>
+              </w:rPr>
+              <w:t>CMT record field match, dynamic reference flagged Is_Dynamic_Reference__c</w:t>
+            </w:r>
+          </w:p>
+        </w:tc>
+      </w:tr>
+      <w:tr>
+        <w:tc>
+          <w:tcPr>
+            <w:tcW w:type="dxa" w:w="4533"/>
+            <w:shd w:val="clear" w:color="auto" w:fill="F2F4F7"/>
+          </w:tcPr>
+          <w:p>
+            <w:r>
+              <w:rPr>
+                <w:color w:val="181818"/>
+                <w:sz w:val="20"/>
+              </w:rPr>
+              <w:t>FlowHandlerTest</w:t>
+            </w:r>
+          </w:p>
+        </w:tc>
+        <w:tc>
+          <w:tcPr>
+            <w:tcW w:type="dxa" w:w="4533"/>
+            <w:shd w:val="clear" w:color="auto" w:fill="F2F4F7"/>
+          </w:tcPr>
+          <w:p>
+            <w:r>
+              <w:rPr>
+                <w:color w:val="181818"/>
+                <w:sz w:val="20"/>
+              </w:rPr>
+              <w:t>QuickAction trigger flow found, subflow reference, no results</w:t>
             </w:r>
           </w:p>
         </w:tc>
       </w:tr>
     </w:tbl>
     <w:p/>
-    <w:p>
-      <w:pPr>
-        <w:spacing w:after="80"/>
-      </w:pPr>
-      <w:r>
-        <w:rPr>
-          <w:b w:val="0"/>
-          <w:i/>
-          <w:color w:val="181818"/>
-          <w:sz w:val="21"/>
-        </w:rPr>
-        <w:t>Use HttpCalloutMock for Tooling API responses. Do not use mocks that diverge from production behavior.</w:t>
-      </w:r>
-    </w:p>
     <w:p>
       <w:pPr>
         <w:pStyle w:val="Heading1"/>
@@ -5831,7 +7114,7 @@
           <w:color w:val="032D60"/>
           <w:sz w:val="36"/>
         </w:rPr>
-        <w:t>10. Deployment</w:t>
+        <w:t>11. Deployment</w:t>
       </w:r>
     </w:p>
     <w:p>
@@ -6123,7 +7406,7 @@
                 <w:color w:val="181818"/>
                 <w:sz w:val="20"/>
               </w:rPr>
-              <w:t>Post-install manual step</w:t>
+              <w:t>Post-install</w:t>
             </w:r>
           </w:p>
         </w:tc>
@@ -6156,7 +7439,7 @@
           <w:color w:val="181818"/>
           <w:sz w:val="21"/>
         </w:rPr>
-        <w:t>GitHub target: energidi/claude-knowledge-base, path: projects/meta-mapper/. Deploy via raw git (gh CLI not available on this machine).</w:t>
+        <w:t>GitHub target: energidi/claude-knowledge-base, path: projects/meta-mapper/. Deploy via raw git (gh CLI not available).</w:t>
       </w:r>
     </w:p>
     <w:p>
@@ -6170,7 +7453,7 @@
           <w:color w:val="032D60"/>
           <w:sz w:val="36"/>
         </w:rPr>
-        <w:t>11. Known Limitations</w:t>
+        <w:t>12. Known Limitations</w:t>
       </w:r>
     </w:p>
     <w:p>
@@ -6192,7 +7475,7 @@
           <w:color w:val="181818"/>
           <w:sz w:val="21"/>
         </w:rPr>
-        <w:t>MetadataComponentDependency does not capture dynamic Apex string references or some formula field cross-object lookups. Results reflect only statically analyzable dependencies.</w:t>
+        <w:t>MetadataComponentDependency does not capture all dependency types. Supplemental handlers fill 5 of 6 known gaps. Dynamic Apex string references (gap 6) cannot be statically resolved - these are flagged with Is_Dynamic_Reference__c = true.</w:t>
       </w:r>
     </w:p>
     <w:p>
@@ -6220,7 +7503,35 @@
           <w:color w:val="181818"/>
           <w:sz w:val="21"/>
         </w:rPr>
-        <w:t>Active Flows Only mode excludes inactive Flow versions by design to preserve heap and reduce DML operations.</w:t>
+        <w:t>Active Flows Only mode excludes inactive Flow versions by design to preserve heap and reduce DML.</w:t>
+      </w:r>
+    </w:p>
+    <w:p>
+      <w:pPr>
+        <w:pStyle w:val="ListBullet"/>
+        <w:spacing w:after="40"/>
+        <w:ind w:left="283"/>
+      </w:pPr>
+      <w:r>
+        <w:rPr>
+          <w:color w:val="181818"/>
+          <w:sz w:val="21"/>
+        </w:rPr>
+        <w:t>package.xml export excludes managed package components (namespace-prefixed) by default.</w:t>
+      </w:r>
+    </w:p>
+    <w:p>
+      <w:pPr>
+        <w:pStyle w:val="ListBullet"/>
+        <w:spacing w:after="40"/>
+        <w:ind w:left="283"/>
+      </w:pPr>
+      <w:r>
+        <w:rPr>
+          <w:color w:val="181818"/>
+          <w:sz w:val="21"/>
+        </w:rPr>
+        <w:t>Tooling API minimum reliable version: v49.0 (MetadataComponentDependency). This app uses v66.0.</w:t>
       </w:r>
     </w:p>
     <w:sectPr>

</xml_diff>

<commit_message>
MetaMapper v3: resolve 4 critical design risks
Fix #1: Remove Visited_IDs__c - replace with DB query for cycle detection.
  Field capped at ~5,957 IDs; enterprise trees exceed this causing StringException.
Fix #2: Adaptive callout guardrail - tighten to 60% when Active_Flows_Only and
  Flow nodes in batch (double-callout cost for Flow status validation).
Fix #3: Validate 100-ID IN chunk as correct URI-safe limit (no change needed).
Fix #4: Specify echarts/dist/echarts.min.js core build only (~1.0-1.2MB).
  Full bundle risks exceeding Salesforce 5MB static resource limit.

Co-Authored-By: Claude Sonnet 4.6 <noreply@anthropic.com>
</commit_message>
<xml_diff>
--- a/projects/meta-mapper/MetaMapper_Technical_Design.docx
+++ b/projects/meta-mapper/MetaMapper_Technical_Design.docx
@@ -38,7 +38,7 @@
           <w:color w:val="706E6B"/>
           <w:sz w:val="24"/>
         </w:rPr>
-        <w:t>Version 2.0  |  March 2026</w:t>
+        <w:t>Version 3.0  |  March 2026</w:t>
       </w:r>
     </w:p>
     <w:p/>
@@ -64,8 +64,6 @@
         <w:t>Architecture: 100% Native Salesforce  |  Enterprise/LDV  |  Open Source</w:t>
         <w:br/>
         <w:t>GitHub: energidi/claude-knowledge-base / projects/meta-mapper</w:t>
-        <w:br/>
-        <w:t>Reference implementations: sfdc-soup v18.4.0  |  sfdc-happy-api v3.1.0</w:t>
       </w:r>
     </w:p>
     <w:p>
@@ -106,7 +104,7 @@
           <w:color w:val="181818"/>
           <w:sz w:val="21"/>
         </w:rPr>
-        <w:t>MetaMapper is a native Salesforce change-intelligence application that safely maps and visualizes deep metadata dependencies. Inspired by off-platform tools like HappySoup.io, MetaMapper operates entirely within the Salesforce trust boundary, making it fully compliant with Enterprise InfoSec policies.</w:t>
+        <w:t>MetaMapper is a native Salesforce change-intelligence application that safely maps and visualizes deep metadata dependencies using the Tooling API. It operates entirely within the Salesforce trust boundary - no external APIs, no CDN calls at runtime.</w:t>
       </w:r>
     </w:p>
     <w:p>
@@ -120,21 +118,7 @@
           <w:color w:val="181818"/>
           <w:sz w:val="21"/>
         </w:rPr>
-        <w:t>By utilizing Asynchronous Queueable chaining and Custom Object state management, it bypasses synchronous Governor Limits to recursively query the Tooling API and build multi-level dependency graphs. All runtime data stays inside the org - no external APIs, no CDN calls at runtime.</w:t>
-      </w:r>
-    </w:p>
-    <w:p>
-      <w:pPr>
-        <w:spacing w:after="80"/>
-      </w:pPr>
-      <w:r>
-        <w:rPr>
-          <w:b w:val="0"/>
-          <w:i/>
-          <w:color w:val="181818"/>
-          <w:sz w:val="21"/>
-        </w:rPr>
-        <w:t>Version 2.0 of this design incorporates architectural improvements derived from analysis of sfdc-soup (v18.4.0) and sfdc-happy-api (v3.1.0) - the leading open-source reference implementations for this problem space.</w:t>
+        <w:t>Version 3.0 resolves four critical design risks identified during technical review: the Visited_IDs__c field cap, the Active Flows double-callout trap, URI length limits, and the ECharts static resource size constraint.</w:t>
       </w:r>
     </w:p>
     <w:p>
@@ -148,7 +132,326 @@
           <w:color w:val="032D60"/>
           <w:sz w:val="36"/>
         </w:rPr>
-        <w:t>2. Architecture Decisions</w:t>
+        <w:t>2. Critical Design Risk Resolutions (v3.0)</w:t>
+      </w:r>
+    </w:p>
+    <w:p>
+      <w:pPr>
+        <w:spacing w:before="40" w:after="40"/>
+        <w:pBdr>
+          <w:bottom w:val="single" w:sz="4" w:space="1" w:color="0070D2"/>
+        </w:pBdr>
+      </w:pPr>
+    </w:p>
+    <w:p>
+      <w:pPr>
+        <w:spacing w:after="80"/>
+      </w:pPr>
+      <w:r>
+        <w:rPr>
+          <w:b w:val="0"/>
+          <w:i/>
+          <w:color w:val="181818"/>
+          <w:sz w:val="21"/>
+        </w:rPr>
+        <w:t>The following four issues were identified and resolved before implementation begins:</w:t>
+      </w:r>
+    </w:p>
+    <w:p>
+      <w:pPr>
+        <w:pStyle w:val="Heading2"/>
+        <w:spacing w:before="240" w:after="120"/>
+      </w:pPr>
+      <w:r>
+        <w:rPr>
+          <w:b/>
+          <w:color w:val="0070D2"/>
+          <w:sz w:val="28"/>
+        </w:rPr>
+        <w:t>Fix #1 - Cycle Detection: Visited_IDs__c Field Removed</w:t>
+      </w:r>
+    </w:p>
+    <w:p>
+      <w:pPr>
+        <w:spacing w:after="80"/>
+      </w:pPr>
+      <w:r>
+        <w:rPr>
+          <w:b w:val="0"/>
+          <w:i w:val="0"/>
+          <w:color w:val="181818"/>
+          <w:sz w:val="21"/>
+        </w:rPr>
+        <w:t>Original design stored a JSON-serialized Set&lt;String&gt; of processed Metadata IDs in a Long Text 131072 field on Dependency_Job__c.</w:t>
+      </w:r>
+    </w:p>
+    <w:p>
+      <w:pPr>
+        <w:spacing w:before="80" w:after="120"/>
+        <w:ind w:left="283"/>
+        <w:shd w:val="clear" w:color="auto" w:fill="F2F4F7"/>
+      </w:pPr>
+      <w:r>
+        <w:rPr>
+          <w:i/>
+          <w:color w:val="032D60"/>
+          <w:sz w:val="19"/>
+        </w:rPr>
+        <w:t>Risk: 131,072 chars / 22 chars per ID = ~5,957 ID cap. Enterprise orgs with deep dependency trees easily exceed this, causing StringException and crashing the entire Queueable chain.</w:t>
+      </w:r>
+    </w:p>
+    <w:p>
+      <w:pPr>
+        <w:spacing w:after="80"/>
+      </w:pPr>
+      <w:r>
+        <w:rPr>
+          <w:b/>
+          <w:i w:val="0"/>
+          <w:color w:val="181818"/>
+          <w:sz w:val="21"/>
+        </w:rPr>
+        <w:t>Resolution: Drop the field. At the start of each Queueable execution, query the database:</w:t>
+      </w:r>
+    </w:p>
+    <w:p>
+      <w:pPr>
+        <w:spacing w:before="60" w:after="60"/>
+        <w:ind w:left="454"/>
+        <w:shd w:val="clear" w:color="auto" w:fill="EAECF0"/>
+      </w:pPr>
+      <w:r>
+        <w:rPr>
+          <w:rFonts w:ascii="Courier New" w:hAnsi="Courier New"/>
+          <w:color w:val="1E1E2E"/>
+          <w:sz w:val="18"/>
+        </w:rPr>
+        <w:t>Set&lt;String&gt; visitedIds = new Set&lt;String&gt;();</w:t>
+        <w:br/>
+        <w:t>for (Dependency_Node__c n : [</w:t>
+        <w:br/>
+        <w:t xml:space="preserve">    SELECT Metadata_ID__c FROM Dependency_Node__c</w:t>
+        <w:br/>
+        <w:t xml:space="preserve">    WHERE Dependency_Job__c = :jobId</w:t>
+        <w:br/>
+        <w:t>]) {</w:t>
+        <w:br/>
+        <w:t xml:space="preserve">    visitedIds.add(n.Metadata_ID__c);</w:t>
+        <w:br/>
+        <w:t>}</w:t>
+      </w:r>
+    </w:p>
+    <w:p>
+      <w:pPr>
+        <w:spacing w:after="80"/>
+      </w:pPr>
+      <w:r>
+        <w:rPr>
+          <w:b w:val="0"/>
+          <w:i w:val="0"/>
+          <w:color w:val="181818"/>
+          <w:sz w:val="21"/>
+        </w:rPr>
+        <w:t>This costs one SOQL query per execution but scales to any tree depth. The database is the source of truth - no field write-back required. Circular nodes are inserted with Is_Circular__c = true and Is_Processed__c = true.</w:t>
+      </w:r>
+    </w:p>
+    <w:p>
+      <w:pPr>
+        <w:pStyle w:val="Heading2"/>
+        <w:spacing w:before="240" w:after="120"/>
+      </w:pPr>
+      <w:r>
+        <w:rPr>
+          <w:b/>
+          <w:color w:val="0070D2"/>
+          <w:sz w:val="28"/>
+        </w:rPr>
+        <w:t>Fix #2 - Active Flows: Adaptive Callout Guardrail</w:t>
+      </w:r>
+    </w:p>
+    <w:p>
+      <w:pPr>
+        <w:spacing w:after="80"/>
+      </w:pPr>
+      <w:r>
+        <w:rPr>
+          <w:b w:val="0"/>
+          <w:i w:val="0"/>
+          <w:color w:val="181818"/>
+          <w:sz w:val="21"/>
+        </w:rPr>
+        <w:t>Original design used a flat 80% callout threshold for the Queueable limit guardrail.</w:t>
+      </w:r>
+    </w:p>
+    <w:p>
+      <w:pPr>
+        <w:spacing w:before="80" w:after="120"/>
+        <w:ind w:left="283"/>
+        <w:shd w:val="clear" w:color="auto" w:fill="F2F4F7"/>
+      </w:pPr>
+      <w:r>
+        <w:rPr>
+          <w:i/>
+          <w:color w:val="032D60"/>
+          <w:sz w:val="19"/>
+        </w:rPr>
+        <w:t>Risk: MetadataComponentDependency does not return Flow status. When Active_Flows_Only__c = true, DependencyService must issue a second Tooling API callout per batch to query Flow WHERE Status = Active. This doubles callout consumption for Flow-heavy batches, reaching the 100-callout limit twice as fast.</w:t>
+      </w:r>
+    </w:p>
+    <w:p>
+      <w:pPr>
+        <w:spacing w:after="80"/>
+      </w:pPr>
+      <w:r>
+        <w:rPr>
+          <w:b/>
+          <w:i w:val="0"/>
+          <w:color w:val="181818"/>
+          <w:sz w:val="21"/>
+        </w:rPr>
+        <w:t>Resolution: Adaptive threshold based on batch content:</w:t>
+      </w:r>
+    </w:p>
+    <w:p>
+      <w:pPr>
+        <w:spacing w:before="60" w:after="60"/>
+        <w:ind w:left="454"/>
+        <w:shd w:val="clear" w:color="auto" w:fill="EAECF0"/>
+      </w:pPr>
+      <w:r>
+        <w:rPr>
+          <w:rFonts w:ascii="Courier New" w:hAnsi="Courier New"/>
+          <w:color w:val="1E1E2E"/>
+          <w:sz w:val="18"/>
+        </w:rPr>
+        <w:t>Boolean hasFlowNodes = /* batch contains Flow-type nodes */;</w:t>
+        <w:br/>
+        <w:t>Decimal calloutThreshold = (job.Active_Flows_Only__c &amp;&amp; hasFlowNodes) ? 0.60 : 0.80;</w:t>
+        <w:br/>
+        <w:br/>
+        <w:t>if (Limits.getCallouts() &gt;= Limits.getLimitCallouts() * calloutThreshold</w:t>
+        <w:br/>
+        <w:t xml:space="preserve">    || Limits.getHeapSize() &gt;= Limits.getLimitHeapSize() * 0.80) {</w:t>
+        <w:br/>
+        <w:t xml:space="preserve">    System.enqueueJob(new DependencyQueueable(jobId));</w:t>
+        <w:br/>
+        <w:t xml:space="preserve">    return;</w:t>
+        <w:br/>
+        <w:t>}</w:t>
+      </w:r>
+    </w:p>
+    <w:p>
+      <w:pPr>
+        <w:pStyle w:val="Heading2"/>
+        <w:spacing w:before="240" w:after="120"/>
+      </w:pPr>
+      <w:r>
+        <w:rPr>
+          <w:b/>
+          <w:color w:val="0070D2"/>
+          <w:sz w:val="28"/>
+        </w:rPr>
+        <w:t>Fix #3 - Tooling API URI Length: 100-ID Chunk (Validated)</w:t>
+      </w:r>
+    </w:p>
+    <w:p>
+      <w:pPr>
+        <w:spacing w:after="80"/>
+      </w:pPr>
+      <w:r>
+        <w:rPr>
+          <w:b w:val="0"/>
+          <w:i w:val="0"/>
+          <w:color w:val="181818"/>
+          <w:sz w:val="21"/>
+        </w:rPr>
+        <w:t>The design chunks Tooling API IN clauses to 100 IDs per query. This is validated as correct.</w:t>
+      </w:r>
+    </w:p>
+    <w:p>
+      <w:pPr>
+        <w:spacing w:before="80" w:after="120"/>
+        <w:ind w:left="283"/>
+        <w:shd w:val="clear" w:color="auto" w:fill="F2F4F7"/>
+      </w:pPr>
+      <w:r>
+        <w:rPr>
+          <w:i/>
+          <w:color w:val="032D60"/>
+          <w:sz w:val="19"/>
+        </w:rPr>
+        <w:t>Context: Salesforce REST GET requests embed the SOQL in the URL. Servers typically cap URLs at 16KB-32KB. 1,000 IDs in a single IN clause would easily exceed this, producing HTTP 414 (URI Too Long). sfdc-soup confirmed 100 is the production-safe limit. No change needed - this was already correct.</w:t>
+      </w:r>
+    </w:p>
+    <w:p>
+      <w:pPr>
+        <w:pStyle w:val="Heading2"/>
+        <w:spacing w:before="240" w:after="120"/>
+      </w:pPr>
+      <w:r>
+        <w:rPr>
+          <w:b/>
+          <w:color w:val="0070D2"/>
+          <w:sz w:val="28"/>
+        </w:rPr>
+        <w:t>Fix #4 - ECharts Static Resource: Core Minified Build Only</w:t>
+      </w:r>
+    </w:p>
+    <w:p>
+      <w:pPr>
+        <w:spacing w:after="80"/>
+      </w:pPr>
+      <w:r>
+        <w:rPr>
+          <w:b w:val="0"/>
+          <w:i w:val="0"/>
+          <w:color w:val="181818"/>
+          <w:sz w:val="21"/>
+        </w:rPr>
+        <w:t>Original design referenced "bundled echarts.min.js" without specifying the build variant.</w:t>
+      </w:r>
+    </w:p>
+    <w:p>
+      <w:pPr>
+        <w:spacing w:before="80" w:after="120"/>
+        <w:ind w:left="283"/>
+        <w:shd w:val="clear" w:color="auto" w:fill="F2F4F7"/>
+      </w:pPr>
+      <w:r>
+        <w:rPr>
+          <w:i/>
+          <w:color w:val="032D60"/>
+          <w:sz w:val="19"/>
+        </w:rPr>
+        <w:t>Risk: Salesforce enforces a hard 5MB limit per Static Resource. The full Apache ECharts bundle (with maps, 3D extensions, and all chart types) can approach or exceed this limit.</w:t>
+      </w:r>
+    </w:p>
+    <w:p>
+      <w:pPr>
+        <w:spacing w:after="80"/>
+      </w:pPr>
+      <w:r>
+        <w:rPr>
+          <w:b/>
+          <w:i w:val="0"/>
+          <w:color w:val="181818"/>
+          <w:sz w:val="21"/>
+        </w:rPr>
+        <w:t>Resolution: Use echarts/dist/echarts.min.js exclusively - the core minified build (~1.0-1.2MB). Source it from the npm package after npm install echarts. Do not use the full bundle. Do not download from CDN.</w:t>
+      </w:r>
+    </w:p>
+    <w:p>
+      <w:pPr>
+        <w:pStyle w:val="Heading1"/>
+        <w:spacing w:before="360" w:after="120"/>
+      </w:pPr>
+      <w:r>
+        <w:rPr>
+          <w:b/>
+          <w:color w:val="032D60"/>
+          <w:sz w:val="36"/>
+        </w:rPr>
+        <w:t>3. Architecture Decisions</w:t>
       </w:r>
     </w:p>
     <w:p>
@@ -295,7 +598,7 @@
                 <w:color w:val="181818"/>
                 <w:sz w:val="20"/>
               </w:rPr>
-              <w:t>Apache ECharts (Static Resource)</w:t>
+              <w:t>Apache ECharts core minified (Static Resource)</w:t>
             </w:r>
           </w:p>
         </w:tc>
@@ -310,7 +613,7 @@
                 <w:color w:val="181818"/>
                 <w:sz w:val="20"/>
               </w:rPr>
-              <w:t>No CDN at runtime; MIT licensed; built-in force-directed graph</w:t>
+              <w:t>No CDN; MIT licensed; ~1.0-1.2MB; within 5MB limit</w:t>
             </w:r>
           </w:p>
         </w:tc>
@@ -389,7 +692,7 @@
                 <w:color w:val="181818"/>
                 <w:sz w:val="20"/>
               </w:rPr>
-              <w:t>Visited_IDs__c + Is_Circular__c flag</w:t>
+              <w:t>DB query at Queueable start (no text field)</w:t>
             </w:r>
           </w:p>
         </w:tc>
@@ -404,7 +707,7 @@
                 <w:color w:val="181818"/>
                 <w:sz w:val="20"/>
               </w:rPr>
-              <w:t>Mark circular nodes for UI display; skip re-traversal</w:t>
+              <w:t>Scales to any tree depth; no StringException risk</w:t>
             </w:r>
           </w:p>
         </w:tc>
@@ -592,7 +895,7 @@
                 <w:color w:val="181818"/>
                 <w:sz w:val="20"/>
               </w:rPr>
-              <w:t>sfdc-soup confirmed HTTP 414 above ~300 IDs; 100 is safe</w:t>
+              <w:t>Production-safe URI length limit</w:t>
             </w:r>
           </w:p>
         </w:tc>
@@ -703,7 +1006,7 @@
                 <w:color w:val="181818"/>
                 <w:sz w:val="20"/>
               </w:rPr>
-              <w:t>Source API version</w:t>
+              <w:t>Callout guardrail</w:t>
             </w:r>
           </w:p>
         </w:tc>
@@ -718,7 +1021,7 @@
                 <w:color w:val="181818"/>
                 <w:sz w:val="20"/>
               </w:rPr>
-              <w:t>v66.0</w:t>
+              <w:t>80% standard; 60% when Active Flows + Flow batch</w:t>
             </w:r>
           </w:p>
         </w:tc>
@@ -726,6 +1029,53 @@
           <w:tcPr>
             <w:tcW w:type="dxa" w:w="3022"/>
             <w:shd w:val="clear" w:color="auto" w:fill="F2F4F7"/>
+          </w:tcPr>
+          <w:p>
+            <w:r>
+              <w:rPr>
+                <w:color w:val="181818"/>
+                <w:sz w:val="20"/>
+              </w:rPr>
+              <w:t>Accounts for double-callout cost of Flow status validation</w:t>
+            </w:r>
+          </w:p>
+        </w:tc>
+      </w:tr>
+      <w:tr>
+        <w:tc>
+          <w:tcPr>
+            <w:tcW w:type="dxa" w:w="3022"/>
+            <w:shd w:val="clear" w:color="auto" w:fill="FFFFFF"/>
+          </w:tcPr>
+          <w:p>
+            <w:r>
+              <w:rPr>
+                <w:color w:val="181818"/>
+                <w:sz w:val="20"/>
+              </w:rPr>
+              <w:t>Source API version</w:t>
+            </w:r>
+          </w:p>
+        </w:tc>
+        <w:tc>
+          <w:tcPr>
+            <w:tcW w:type="dxa" w:w="3022"/>
+            <w:shd w:val="clear" w:color="auto" w:fill="FFFFFF"/>
+          </w:tcPr>
+          <w:p>
+            <w:r>
+              <w:rPr>
+                <w:color w:val="181818"/>
+                <w:sz w:val="20"/>
+              </w:rPr>
+              <w:t>v66.0</w:t>
+            </w:r>
+          </w:p>
+        </w:tc>
+        <w:tc>
+          <w:tcPr>
+            <w:tcW w:type="dxa" w:w="3022"/>
+            <w:shd w:val="clear" w:color="auto" w:fill="FFFFFF"/>
           </w:tcPr>
           <w:p>
             <w:r>
@@ -751,7 +1101,7 @@
           <w:color w:val="032D60"/>
           <w:sz w:val="36"/>
         </w:rPr>
-        <w:t>3. Data Architecture &amp; Modeling</w:t>
+        <w:t>4. Data Architecture &amp; Modeling</w:t>
       </w:r>
     </w:p>
     <w:p>
@@ -764,20 +1114,6 @@
     </w:p>
     <w:p>
       <w:pPr>
-        <w:spacing w:after="80"/>
-      </w:pPr>
-      <w:r>
-        <w:rPr>
-          <w:b w:val="0"/>
-          <w:i w:val="0"/>
-          <w:color w:val="181818"/>
-          <w:sz w:val="21"/>
-        </w:rPr>
-        <w:t>MetaMapper uses a Custom Object state-management architecture. State persists between Queueable executions in the database, enabling unlimited depth traversal without hitting synchronous transaction limits.</w:t>
-      </w:r>
-    </w:p>
-    <w:p>
-      <w:pPr>
         <w:pStyle w:val="Heading2"/>
         <w:spacing w:before="240" w:after="120"/>
       </w:pPr>
@@ -787,7 +1123,7 @@
           <w:color w:val="0070D2"/>
           <w:sz w:val="28"/>
         </w:rPr>
-        <w:t>3.1 Dependency_Job__c</w:t>
+        <w:t>4.1 Dependency_Job__c</w:t>
       </w:r>
     </w:p>
     <w:tbl>
@@ -1035,7 +1371,7 @@
                 <w:color w:val="181818"/>
                 <w:sz w:val="20"/>
               </w:rPr>
-              <w:t>Default: true. Drops inactive Flow versions to preserve heap.</w:t>
+              <w:t>Default: true. Drops inactive Flow versions. Triggers 60% callout threshold.</w:t>
             </w:r>
           </w:p>
         </w:tc>
@@ -1146,7 +1482,7 @@
                 <w:color w:val="181818"/>
                 <w:sz w:val="20"/>
               </w:rPr>
-              <w:t>Visited_IDs__c</w:t>
+              <w:t>Nodes_Processed__c</w:t>
             </w:r>
           </w:p>
         </w:tc>
@@ -1161,7 +1497,7 @@
                 <w:color w:val="181818"/>
                 <w:sz w:val="20"/>
               </w:rPr>
-              <w:t>Long Text 131072</w:t>
+              <w:t>Number</w:t>
             </w:r>
           </w:p>
         </w:tc>
@@ -1176,7 +1512,7 @@
                 <w:color w:val="181818"/>
                 <w:sz w:val="20"/>
               </w:rPr>
-              <w:t>JSON-serialized Set&lt;String&gt; of processed Metadata IDs (cycle detection)</w:t>
+              <w:t>Running counter published to progress bar via Platform Event</w:t>
             </w:r>
           </w:p>
         </w:tc>
@@ -1193,7 +1529,7 @@
                 <w:color w:val="181818"/>
                 <w:sz w:val="20"/>
               </w:rPr>
-              <w:t>Nodes_Processed__c</w:t>
+              <w:t>Summary_JSON__c</w:t>
             </w:r>
           </w:p>
         </w:tc>
@@ -1208,7 +1544,7 @@
                 <w:color w:val="181818"/>
                 <w:sz w:val="20"/>
               </w:rPr>
-              <w:t>Number</w:t>
+              <w:t>Long Text 32768</w:t>
             </w:r>
           </w:p>
         </w:tc>
@@ -1216,53 +1552,6 @@
           <w:tcPr>
             <w:tcW w:type="dxa" w:w="3022"/>
             <w:shd w:val="clear" w:color="auto" w:fill="FFFFFF"/>
-          </w:tcPr>
-          <w:p>
-            <w:r>
-              <w:rPr>
-                <w:color w:val="181818"/>
-                <w:sz w:val="20"/>
-              </w:rPr>
-              <w:t>Running counter published to progress bar via Platform Event</w:t>
-            </w:r>
-          </w:p>
-        </w:tc>
-      </w:tr>
-      <w:tr>
-        <w:tc>
-          <w:tcPr>
-            <w:tcW w:type="dxa" w:w="3022"/>
-            <w:shd w:val="clear" w:color="auto" w:fill="F2F4F7"/>
-          </w:tcPr>
-          <w:p>
-            <w:r>
-              <w:rPr>
-                <w:color w:val="181818"/>
-                <w:sz w:val="20"/>
-              </w:rPr>
-              <w:t>Summary_JSON__c</w:t>
-            </w:r>
-          </w:p>
-        </w:tc>
-        <w:tc>
-          <w:tcPr>
-            <w:tcW w:type="dxa" w:w="3022"/>
-            <w:shd w:val="clear" w:color="auto" w:fill="F2F4F7"/>
-          </w:tcPr>
-          <w:p>
-            <w:r>
-              <w:rPr>
-                <w:color w:val="181818"/>
-                <w:sz w:val="20"/>
-              </w:rPr>
-              <w:t>Long Text 32768</w:t>
-            </w:r>
-          </w:p>
-        </w:tc>
-        <w:tc>
-          <w:tcPr>
-            <w:tcW w:type="dxa" w:w="3022"/>
-            <w:shd w:val="clear" w:color="auto" w:fill="F2F4F7"/>
           </w:tcPr>
           <w:p>
             <w:r>
@@ -1277,6 +1566,21 @@
       </w:tr>
     </w:tbl>
     <w:p/>
+    <w:p>
+      <w:pPr>
+        <w:spacing w:before="80" w:after="120"/>
+        <w:ind w:left="283"/>
+        <w:shd w:val="clear" w:color="auto" w:fill="F2F4F7"/>
+      </w:pPr>
+      <w:r>
+        <w:rPr>
+          <w:i/>
+          <w:color w:val="032D60"/>
+          <w:sz w:val="19"/>
+        </w:rPr>
+        <w:t>Visited_IDs__c intentionally omitted. Cycle detection uses a DB query instead (see Fix #1). A Long Text 131072 field caps at ~5,957 IDs and would crash the Queueable chain in large enterprise orgs.</w:t>
+      </w:r>
+    </w:p>
     <w:p>
       <w:pPr>
         <w:pStyle w:val="Heading2"/>
@@ -1288,7 +1592,7 @@
           <w:color w:val="0070D2"/>
           <w:sz w:val="28"/>
         </w:rPr>
-        <w:t>3.2 Dependency_Node__c</w:t>
+        <w:t>4.2 Dependency_Node__c</w:t>
       </w:r>
     </w:p>
     <w:tbl>
@@ -1883,7 +2187,7 @@
           <w:color w:val="0070D2"/>
           <w:sz w:val="28"/>
         </w:rPr>
-        <w:t>3.3 Context_Data__c (Pills) by Metadata Type</w:t>
+        <w:t>4.3 Context_Data__c (Pills) by Metadata Type</w:t>
       </w:r>
     </w:p>
     <w:tbl>
@@ -2037,7 +2341,7 @@
                 <w:color w:val="181818"/>
                 <w:sz w:val="20"/>
               </w:rPr>
-              <w:t>Active version count and current status</w:t>
+              <w:t>Active version count and current active status</w:t>
             </w:r>
           </w:p>
         </w:tc>
@@ -2084,7 +2388,7 @@
                 <w:color w:val="181818"/>
                 <w:sz w:val="20"/>
               </w:rPr>
-              <w:t>Rule activation and trigger type</w:t>
+              <w:t>Rule status and trigger type</w:t>
             </w:r>
           </w:p>
         </w:tc>
@@ -2196,7 +2500,7 @@
           <w:color w:val="0070D2"/>
           <w:sz w:val="28"/>
         </w:rPr>
-        <w:t>3.4 Dependency_Status__e (Platform Event)</w:t>
+        <w:t>4.4 Dependency_Status__e (Platform Event)</w:t>
       </w:r>
     </w:p>
     <w:tbl>
@@ -2462,7 +2766,7 @@
           <w:color w:val="0070D2"/>
           <w:sz w:val="28"/>
         </w:rPr>
-        <w:t>3.5 Data Lifecycle Management</w:t>
+        <w:t>4.5 Data Lifecycle Management</w:t>
       </w:r>
     </w:p>
     <w:p>
@@ -2476,7 +2780,7 @@
           <w:color w:val="181818"/>
           <w:sz w:val="21"/>
         </w:rPr>
-        <w:t>DependencyCleanupBatch runs nightly at 02:00 and hard-deletes Dependency_Job__c records older than 24 hours. Deletion cascades to all child Dependency_Node__c records via the Master-Detail relationship.</w:t>
+        <w:t>DependencyCleanupBatch runs nightly at 02:00 and hard-deletes Dependency_Job__c records older than 24 hours. Deletion cascades to all child Dependency_Node__c records via Master-Detail.</w:t>
       </w:r>
     </w:p>
     <w:p>
@@ -2490,7 +2794,7 @@
           <w:color w:val="032D60"/>
           <w:sz w:val="36"/>
         </w:rPr>
-        <w:t>4. Processing Engine (Async Architecture)</w:t>
+        <w:t>5. Processing Engine (Async Architecture)</w:t>
       </w:r>
     </w:p>
     <w:p>
@@ -2503,20 +2807,6 @@
     </w:p>
     <w:p>
       <w:pPr>
-        <w:spacing w:after="80"/>
-      </w:pPr>
-      <w:r>
-        <w:rPr>
-          <w:b w:val="0"/>
-          <w:i w:val="0"/>
-          <w:color w:val="181818"/>
-          <w:sz w:val="21"/>
-        </w:rPr>
-        <w:t>The engine uses a self-chaining Queueable pattern with the database as its state machine. Type-specific handler classes supplement the Tooling API for dependency categories it cannot resolve.</w:t>
-      </w:r>
-    </w:p>
-    <w:p>
-      <w:pPr>
         <w:pStyle w:val="Heading2"/>
         <w:spacing w:before="240" w:after="120"/>
       </w:pPr>
@@ -2526,7 +2816,7 @@
           <w:color w:val="0070D2"/>
           <w:sz w:val="28"/>
         </w:rPr>
-        <w:t>4.1 Execution Flow</w:t>
+        <w:t>5.1 Execution Flow</w:t>
       </w:r>
     </w:p>
     <w:p>
@@ -2568,7 +2858,7 @@
           <w:color w:val="181818"/>
           <w:sz w:val="21"/>
         </w:rPr>
-        <w:t>3. Visited_IDs__c is deserialized into a Set&lt;String&gt;. Results already in this set get Is_Circular__c = true and are inserted but not enqueued for traversal.</w:t>
+        <w:t>3. DB cycle-detection query: SELECT Metadata_ID__c FROM Dependency_Node__c WHERE Dependency_Job__c = :jobId builds the visited Set&lt;String&gt; from the database (scales infinitely).</w:t>
       </w:r>
     </w:p>
     <w:p>
@@ -2582,7 +2872,7 @@
           <w:color w:val="181818"/>
           <w:sz w:val="21"/>
         </w:rPr>
-        <w:t>4. For each node batch: Tooling API callout (chunked at 100 IDs max; QueryMore loop for &gt;2,000 results). HTTP 414/431 triggers reactive batch split.</w:t>
+        <w:t>4. Tooling API callout per node batch (100-ID chunks; QueryMore loop for &gt;2,000 results; HTTP 414/431 triggers reactive batch split).</w:t>
       </w:r>
     </w:p>
     <w:p>
@@ -2596,7 +2886,7 @@
           <w:color w:val="181818"/>
           <w:sz w:val="21"/>
         </w:rPr>
-        <w:t>5. New Dependency_Node__c children inserted with Source__c = ToolingAPI (WITH USER_MODE).</w:t>
+        <w:t>5. Results in visited set: insert with Is_Circular__c = true, Is_Processed__c = true. Not enqueued for further traversal.</w:t>
       </w:r>
     </w:p>
     <w:p>
@@ -2610,7 +2900,7 @@
           <w:color w:val="181818"/>
           <w:sz w:val="21"/>
         </w:rPr>
-        <w:t>6. DependencyTypeHandlerFactory dispatches to type-specific handler. Supplemental nodes inserted with Source__c = Supplemental.</w:t>
+        <w:t>6. New child nodes inserted with Source__c = ToolingAPI (WITH USER_MODE).</w:t>
       </w:r>
     </w:p>
     <w:p>
@@ -2624,7 +2914,7 @@
           <w:color w:val="181818"/>
           <w:sz w:val="21"/>
         </w:rPr>
-        <w:t>7. Current nodes marked Is_Processed__c = true. Visited set updated and re-serialized. Dependency_Status__e published.</w:t>
+        <w:t>7. DependencyTypeHandlerFactory dispatches to type-specific handler. Supplemental nodes inserted with Source__c = Supplemental.</w:t>
       </w:r>
     </w:p>
     <w:p>
@@ -2638,7 +2928,7 @@
           <w:color w:val="181818"/>
           <w:sz w:val="21"/>
         </w:rPr>
-        <w:t>8. Limit check: if callouts or heap &gt; 80%, enqueue fresh instance and return.</w:t>
+        <w:t>8. Current nodes marked Is_Processed__c = true. Nodes_Processed__c incremented. Dependency_Status__e published.</w:t>
       </w:r>
     </w:p>
     <w:p>
@@ -2652,7 +2942,7 @@
           <w:color w:val="181818"/>
           <w:sz w:val="21"/>
         </w:rPr>
-        <w:t>9. On Completed: compute Summary_JSON__c, send Custom Notification + email.</w:t>
+        <w:t>9. Adaptive guardrail: 60% callout threshold if Active_Flows_Only__c = true AND Flow nodes in batch (double-callout cost); 80% otherwise. Heap always 80%.</w:t>
       </w:r>
     </w:p>
     <w:p>
@@ -2666,7 +2956,21 @@
           <w:color w:val="181818"/>
           <w:sz w:val="21"/>
         </w:rPr>
-        <w:t>10. On exception: update Job to Failed, publish failure event.</w:t>
+        <w:t>10. On Completed: compute Summary_JSON__c, send Custom Notification + email.</w:t>
+      </w:r>
+    </w:p>
+    <w:p>
+      <w:pPr>
+        <w:pStyle w:val="ListBullet"/>
+        <w:spacing w:after="40"/>
+        <w:ind w:left="283"/>
+      </w:pPr>
+      <w:r>
+        <w:rPr>
+          <w:color w:val="181818"/>
+          <w:sz w:val="21"/>
+        </w:rPr>
+        <w:t>11. On exception: update Job to Failed, publish failure event.</w:t>
       </w:r>
     </w:p>
     <w:p>
@@ -2680,7 +2984,7 @@
           <w:color w:val="0070D2"/>
           <w:sz w:val="28"/>
         </w:rPr>
-        <w:t>4.2 Limit Guardrail</w:t>
+        <w:t>5.2 Adaptive Limit Guardrail</w:t>
       </w:r>
     </w:p>
     <w:p>
@@ -2695,7 +2999,12 @@
           <w:color w:val="1E1E2E"/>
           <w:sz w:val="18"/>
         </w:rPr>
-        <w:t>if (Limits.getCallouts() &gt;= Limits.getLimitCallouts() * 0.80</w:t>
+        <w:t>Boolean hasFlowNodes = /* batch contains Flow-type nodes */;</w:t>
+        <w:br/>
+        <w:t>Decimal calloutThreshold = (job.Active_Flows_Only__c &amp;&amp; hasFlowNodes) ? 0.60 : 0.80;</w:t>
+        <w:br/>
+        <w:br/>
+        <w:t>if (Limits.getCallouts() &gt;= Limits.getLimitCallouts() * calloutThreshold</w:t>
         <w:br/>
         <w:t xml:space="preserve">    || Limits.getHeapSize() &gt;= Limits.getLimitHeapSize() * 0.80) {</w:t>
         <w:br/>
@@ -2717,7 +3026,7 @@
           <w:color w:val="0070D2"/>
           <w:sz w:val="28"/>
         </w:rPr>
-        <w:t>4.3 Circular Reference Handling</w:t>
+        <w:t>5.3 Circular Reference Handling</w:t>
       </w:r>
     </w:p>
     <w:p>
@@ -2731,35 +3040,7 @@
           <w:color w:val="181818"/>
           <w:sz w:val="21"/>
         </w:rPr>
-        <w:t>Nodes whose Metadata_ID__c is already in the Visited_IDs__c set are inserted with Is_Circular__c = true and are NOT added to the unprocessed queue - preventing infinite traversal while still displaying the circular relationship in the tree and graph views.</w:t>
-      </w:r>
-    </w:p>
-    <w:p>
-      <w:pPr>
-        <w:pStyle w:val="Heading2"/>
-        <w:spacing w:before="240" w:after="120"/>
-      </w:pPr>
-      <w:r>
-        <w:rPr>
-          <w:b/>
-          <w:color w:val="0070D2"/>
-          <w:sz w:val="28"/>
-        </w:rPr>
-        <w:t>4.4 Active Flows Only Optimization</w:t>
-      </w:r>
-    </w:p>
-    <w:p>
-      <w:pPr>
-        <w:spacing w:after="80"/>
-      </w:pPr>
-      <w:r>
-        <w:rPr>
-          <w:b w:val="0"/>
-          <w:i w:val="0"/>
-          <w:color w:val="181818"/>
-          <w:sz w:val="21"/>
-        </w:rPr>
-        <w:t>When Active_Flows_Only__c is true (default), inactive Flow versions are filtered before DML. In large orgs with extensive Flow version histories, this significantly reduces heap consumption and DML operations.</w:t>
+        <w:t>Nodes already in the visited set (from the DB query) are inserted with Is_Circular__c = true and Is_Processed__c = true, preventing infinite traversal while preserving the circular relationship in the tree and graph views.</w:t>
       </w:r>
     </w:p>
     <w:p>
@@ -2773,7 +3054,7 @@
           <w:color w:val="032D60"/>
           <w:sz w:val="36"/>
         </w:rPr>
-        <w:t>5. Supplemental Query Strategy</w:t>
+        <w:t>6. Supplemental Query Strategy</w:t>
       </w:r>
     </w:p>
     <w:p>
@@ -2795,7 +3076,7 @@
           <w:color w:val="181818"/>
           <w:sz w:val="21"/>
         </w:rPr>
-        <w:t>MetadataComponentDependency does not track 6 critical dependency categories. Type-specific handler classes fill these gaps using secondary Tooling API, SOQL, and Metadata API queries.</w:t>
+        <w:t>MetadataComponentDependency does not track 6 critical dependency categories. Type-specific handler classes fill these gaps.</w:t>
       </w:r>
     </w:p>
     <w:tbl>
@@ -3155,7 +3436,7 @@
           <w:color w:val="0070D2"/>
           <w:sz w:val="28"/>
         </w:rPr>
-        <w:t>5.1 IDependencyTypeHandler Interface</w:t>
+        <w:t>6.1 IDependencyTypeHandler Interface</w:t>
       </w:r>
     </w:p>
     <w:p>
@@ -3179,20 +3460,6 @@
     </w:p>
     <w:p>
       <w:pPr>
-        <w:spacing w:after="80"/>
-      </w:pPr>
-      <w:r>
-        <w:rPr>
-          <w:b w:val="0"/>
-          <w:i w:val="0"/>
-          <w:color w:val="181818"/>
-          <w:sz w:val="21"/>
-        </w:rPr>
-        <w:t>Each handler receives the current batch of nodes of its type, executes supplemental queries, and returns additional Dependency_Node__c records for bulk insert. Handlers are stateless and independently testable.</w:t>
-      </w:r>
-    </w:p>
-    <w:p>
-      <w:pPr>
         <w:pStyle w:val="Heading1"/>
         <w:spacing w:before="360" w:after="120"/>
       </w:pPr>
@@ -3202,7 +3469,7 @@
           <w:color w:val="032D60"/>
           <w:sz w:val="36"/>
         </w:rPr>
-        <w:t>6. Integration &amp; Tooling API Strategy</w:t>
+        <w:t>7. Integration &amp; Tooling API Strategy</w:t>
       </w:r>
     </w:p>
     <w:p>
@@ -3224,7 +3491,7 @@
           <w:color w:val="0070D2"/>
           <w:sz w:val="28"/>
         </w:rPr>
-        <w:t>6.1 Loopback Auth (Post-Install, Manual)</w:t>
+        <w:t>7.1 Loopback Auth (Post-Install, Manual)</w:t>
       </w:r>
     </w:p>
     <w:tbl>
@@ -3372,14 +3639,15 @@
     <w:p/>
     <w:p>
       <w:pPr>
-        <w:spacing w:after="80"/>
+        <w:spacing w:before="80" w:after="120"/>
+        <w:ind w:left="283"/>
+        <w:shd w:val="clear" w:color="auto" w:fill="F2F4F7"/>
       </w:pPr>
       <w:r>
         <w:rPr>
-          <w:b w:val="0"/>
           <w:i/>
-          <w:color w:val="181818"/>
-          <w:sz w:val="21"/>
+          <w:color w:val="032D60"/>
+          <w:sz w:val="19"/>
         </w:rPr>
         <w:t>Cannot be source-tracked. Step-by-step setup in setup/SETUP.md.</w:t>
       </w:r>
@@ -3395,7 +3663,7 @@
           <w:color w:val="0070D2"/>
           <w:sz w:val="28"/>
         </w:rPr>
-        <w:t>6.2 Query Strategy Details</w:t>
+        <w:t>7.2 Query Strategy</w:t>
       </w:r>
     </w:p>
     <w:tbl>
@@ -3470,7 +3738,7 @@
                 <w:color w:val="181818"/>
                 <w:sz w:val="20"/>
               </w:rPr>
-              <w:t>100 IDs maximum per query (HTTP 414 safe limit per sfdc-soup)</w:t>
+              <w:t>100 IDs maximum per query (validated safe URI length limit)</w:t>
             </w:r>
           </w:p>
         </w:tc>
@@ -3502,7 +3770,7 @@
                 <w:color w:val="181818"/>
                 <w:sz w:val="20"/>
               </w:rPr>
-              <w:t>Follow nextRecordsUrl iteratively until done = true (handles &gt;2,000 row result sets)</w:t>
+              <w:t>Follow nextRecordsUrl iteratively until done = true (handles &gt;2,000 row results)</w:t>
             </w:r>
           </w:p>
         </w:tc>
@@ -3551,7 +3819,7 @@
                 <w:color w:val="181818"/>
                 <w:sz w:val="20"/>
               </w:rPr>
-              <w:t>Callout target</w:t>
+              <w:t>Flow status validation</w:t>
             </w:r>
           </w:p>
         </w:tc>
@@ -3559,6 +3827,38 @@
           <w:tcPr>
             <w:tcW w:type="dxa" w:w="4533"/>
             <w:shd w:val="clear" w:color="auto" w:fill="FFFFFF"/>
+          </w:tcPr>
+          <w:p>
+            <w:r>
+              <w:rPr>
+                <w:color w:val="181818"/>
+                <w:sz w:val="20"/>
+              </w:rPr>
+              <w:t>Separate callout: SELECT Id FROM Flow WHERE Id IN :ids AND Status = Active (triggers 60% guardrail)</w:t>
+            </w:r>
+          </w:p>
+        </w:tc>
+      </w:tr>
+      <w:tr>
+        <w:tc>
+          <w:tcPr>
+            <w:tcW w:type="dxa" w:w="4533"/>
+            <w:shd w:val="clear" w:color="auto" w:fill="F2F4F7"/>
+          </w:tcPr>
+          <w:p>
+            <w:r>
+              <w:rPr>
+                <w:color w:val="181818"/>
+                <w:sz w:val="20"/>
+              </w:rPr>
+              <w:t>Callout target</w:t>
+            </w:r>
+          </w:p>
+        </w:tc>
+        <w:tc>
+          <w:tcPr>
+            <w:tcW w:type="dxa" w:w="4533"/>
+            <w:shd w:val="clear" w:color="auto" w:fill="F2F4F7"/>
           </w:tcPr>
           <w:p>
             <w:r>
@@ -3584,7 +3884,7 @@
           <w:color w:val="032D60"/>
           <w:sz w:val="36"/>
         </w:rPr>
-        <w:t>7. Security &amp; Visibility</w:t>
+        <w:t>8. Security &amp; Visibility</w:t>
       </w:r>
     </w:p>
     <w:p>
@@ -3827,7 +4127,7 @@
                 <w:color w:val="181818"/>
                 <w:sz w:val="20"/>
               </w:rPr>
-              <w:t>Bundled in Static Resource. No CDN call at runtime.</w:t>
+              <w:t>Core minified build in Static Resource. No CDN call at runtime.</w:t>
             </w:r>
           </w:p>
         </w:tc>
@@ -3845,7 +4145,7 @@
           <w:color w:val="032D60"/>
           <w:sz w:val="36"/>
         </w:rPr>
-        <w:t>8. UI/UX &amp; Presentation Layer</w:t>
+        <w:t>9. UI/UX &amp; Presentation Layer</w:t>
       </w:r>
     </w:p>
     <w:p>
@@ -3867,7 +4167,7 @@
           <w:color w:val="181818"/>
           <w:sz w:val="21"/>
         </w:rPr>
-        <w:t>"Precision Intelligence" aesthetic direction: SLDS scaffolding as foundation, monospace type for metadata names, ECharts graph as the visual centerpiece - feels like a live circuit diagram of the org.</w:t>
+        <w:t>"Precision Intelligence" aesthetic: SLDS scaffolding, monospace metadata names, ECharts graph as the visual centerpiece.</w:t>
       </w:r>
     </w:p>
     <w:p>
@@ -3881,7 +4181,7 @@
           <w:color w:val="0070D2"/>
           <w:sz w:val="28"/>
         </w:rPr>
-        <w:t>8.1 Color Palette</w:t>
+        <w:t>9.1 Color Palette</w:t>
       </w:r>
     </w:p>
     <w:p>
@@ -3895,7 +4195,7 @@
           <w:color w:val="181818"/>
           <w:sz w:val="21"/>
         </w:rPr>
-        <w:t>Application Shell (SLDS)</w:t>
+        <w:t>Application Shell</w:t>
       </w:r>
     </w:p>
     <w:tbl>
@@ -4002,7 +4302,7 @@
                 <w:color w:val="181818"/>
                 <w:sz w:val="20"/>
               </w:rPr>
-              <w:t>App canvas (SLDS neutral base)</w:t>
+              <w:t>App canvas</w:t>
             </w:r>
           </w:p>
         </w:tc>
@@ -4096,7 +4396,7 @@
                 <w:color w:val="181818"/>
                 <w:sz w:val="20"/>
               </w:rPr>
-              <w:t>Buttons, links, active states, progress bar fill</w:t>
+              <w:t>Buttons, links, progress bar fill</w:t>
             </w:r>
           </w:p>
         </w:tc>
@@ -4190,7 +4490,7 @@
                 <w:color w:val="181818"/>
                 <w:sz w:val="20"/>
               </w:rPr>
-              <w:t>Completed job status</w:t>
+              <w:t>Completed status</w:t>
             </w:r>
           </w:p>
         </w:tc>
@@ -4409,7 +4709,7 @@
                 <w:color w:val="181818"/>
                 <w:sz w:val="20"/>
               </w:rPr>
-              <w:t>Salesforce blue - core platform code</w:t>
+              <w:t>Salesforce blue</w:t>
             </w:r>
           </w:p>
         </w:tc>
@@ -4456,7 +4756,7 @@
                 <w:color w:val="181818"/>
                 <w:sz w:val="20"/>
               </w:rPr>
-              <w:t>Darker blue - execution-related</w:t>
+              <w:t>Darker blue</w:t>
             </w:r>
           </w:p>
         </w:tc>
@@ -4503,7 +4803,7 @@
                 <w:color w:val="181818"/>
                 <w:sz w:val="20"/>
               </w:rPr>
-              <w:t>Green - automation / process</w:t>
+              <w:t>Green - automation</w:t>
             </w:r>
           </w:p>
         </w:tc>
@@ -4597,7 +4897,7 @@
                 <w:color w:val="181818"/>
                 <w:sz w:val="20"/>
               </w:rPr>
-              <w:t>Dark navy - foundational schema</w:t>
+              <w:t>Dark navy - foundational</w:t>
             </w:r>
           </w:p>
         </w:tc>
@@ -4644,7 +4944,7 @@
                 <w:color w:val="181818"/>
                 <w:sz w:val="20"/>
               </w:rPr>
-              <w:t>Red - constraint / guard</w:t>
+              <w:t>Red - constraint</w:t>
             </w:r>
           </w:p>
         </w:tc>
@@ -4738,7 +5038,7 @@
                 <w:color w:val="181818"/>
                 <w:sz w:val="20"/>
               </w:rPr>
-              <w:t>Teal - access / security</w:t>
+              <w:t>Teal - security</w:t>
             </w:r>
           </w:p>
         </w:tc>
@@ -4944,196 +5244,7 @@
           <w:color w:val="0070D2"/>
           <w:sz w:val="28"/>
         </w:rPr>
-        <w:t>8.2 Typography</w:t>
-      </w:r>
-    </w:p>
-    <w:tbl>
-      <w:tblPr>
-        <w:tblStyle w:val="TableGrid"/>
-        <w:tblW w:type="auto" w:w="0"/>
-        <w:jc w:val="left"/>
-        <w:tblLook w:firstColumn="1" w:firstRow="1" w:lastColumn="0" w:lastRow="0" w:noHBand="0" w:noVBand="1" w:val="04A0"/>
-      </w:tblPr>
-      <w:tblGrid>
-        <w:gridCol w:w="4533"/>
-        <w:gridCol w:w="4533"/>
-      </w:tblGrid>
-      <w:tr>
-        <w:tc>
-          <w:tcPr>
-            <w:tcW w:type="dxa" w:w="4533"/>
-            <w:shd w:val="clear" w:color="auto" w:fill="032D60"/>
-          </w:tcPr>
-          <w:p>
-            <w:r>
-              <w:rPr>
-                <w:b/>
-                <w:color w:val="FFFFFF"/>
-                <w:sz w:val="20"/>
-              </w:rPr>
-              <w:t>Element</w:t>
-            </w:r>
-          </w:p>
-        </w:tc>
-        <w:tc>
-          <w:tcPr>
-            <w:tcW w:type="dxa" w:w="4533"/>
-            <w:shd w:val="clear" w:color="auto" w:fill="032D60"/>
-          </w:tcPr>
-          <w:p>
-            <w:r>
-              <w:rPr>
-                <w:b/>
-                <w:color w:val="FFFFFF"/>
-                <w:sz w:val="20"/>
-              </w:rPr>
-              <w:t>Style</w:t>
-            </w:r>
-          </w:p>
-        </w:tc>
-      </w:tr>
-      <w:tr>
-        <w:tc>
-          <w:tcPr>
-            <w:tcW w:type="dxa" w:w="4533"/>
-            <w:shd w:val="clear" w:color="auto" w:fill="F2F4F7"/>
-          </w:tcPr>
-          <w:p>
-            <w:r>
-              <w:rPr>
-                <w:color w:val="181818"/>
-                <w:sz w:val="20"/>
-              </w:rPr>
-              <w:t>Metadata API names</w:t>
-            </w:r>
-          </w:p>
-        </w:tc>
-        <w:tc>
-          <w:tcPr>
-            <w:tcW w:type="dxa" w:w="4533"/>
-            <w:shd w:val="clear" w:color="auto" w:fill="F2F4F7"/>
-          </w:tcPr>
-          <w:p>
-            <w:r>
-              <w:rPr>
-                <w:color w:val="181818"/>
-                <w:sz w:val="20"/>
-              </w:rPr>
-              <w:t>font-family: SFMono-Regular, Consolas, monospace; font-size: 0.8125rem</w:t>
-            </w:r>
-          </w:p>
-        </w:tc>
-      </w:tr>
-      <w:tr>
-        <w:tc>
-          <w:tcPr>
-            <w:tcW w:type="dxa" w:w="4533"/>
-            <w:shd w:val="clear" w:color="auto" w:fill="FFFFFF"/>
-          </w:tcPr>
-          <w:p>
-            <w:r>
-              <w:rPr>
-                <w:color w:val="181818"/>
-                <w:sz w:val="20"/>
-              </w:rPr>
-              <w:t>Section markers</w:t>
-            </w:r>
-          </w:p>
-        </w:tc>
-        <w:tc>
-          <w:tcPr>
-            <w:tcW w:type="dxa" w:w="4533"/>
-            <w:shd w:val="clear" w:color="auto" w:fill="FFFFFF"/>
-          </w:tcPr>
-          <w:p>
-            <w:r>
-              <w:rPr>
-                <w:color w:val="181818"/>
-                <w:sz w:val="20"/>
-              </w:rPr>
-              <w:t>font-weight: 700; letter-spacing: 0.05em; text-transform: uppercase; font-size: 0.75rem; color: #706E6B</w:t>
-            </w:r>
-          </w:p>
-        </w:tc>
-      </w:tr>
-      <w:tr>
-        <w:tc>
-          <w:tcPr>
-            <w:tcW w:type="dxa" w:w="4533"/>
-            <w:shd w:val="clear" w:color="auto" w:fill="F2F4F7"/>
-          </w:tcPr>
-          <w:p>
-            <w:r>
-              <w:rPr>
-                <w:color w:val="181818"/>
-                <w:sz w:val="20"/>
-              </w:rPr>
-              <w:t>Stat tile values</w:t>
-            </w:r>
-          </w:p>
-        </w:tc>
-        <w:tc>
-          <w:tcPr>
-            <w:tcW w:type="dxa" w:w="4533"/>
-            <w:shd w:val="clear" w:color="auto" w:fill="F2F4F7"/>
-          </w:tcPr>
-          <w:p>
-            <w:r>
-              <w:rPr>
-                <w:color w:val="181818"/>
-                <w:sz w:val="20"/>
-              </w:rPr>
-              <w:t>font-size: 1.5rem; font-weight: 300; color: #032D60</w:t>
-            </w:r>
-          </w:p>
-        </w:tc>
-      </w:tr>
-      <w:tr>
-        <w:tc>
-          <w:tcPr>
-            <w:tcW w:type="dxa" w:w="4533"/>
-            <w:shd w:val="clear" w:color="auto" w:fill="FFFFFF"/>
-          </w:tcPr>
-          <w:p>
-            <w:r>
-              <w:rPr>
-                <w:color w:val="181818"/>
-                <w:sz w:val="20"/>
-              </w:rPr>
-              <w:t>Body / labels</w:t>
-            </w:r>
-          </w:p>
-        </w:tc>
-        <w:tc>
-          <w:tcPr>
-            <w:tcW w:type="dxa" w:w="4533"/>
-            <w:shd w:val="clear" w:color="auto" w:fill="FFFFFF"/>
-          </w:tcPr>
-          <w:p>
-            <w:r>
-              <w:rPr>
-                <w:color w:val="181818"/>
-                <w:sz w:val="20"/>
-              </w:rPr>
-              <w:t>Salesforce Sans (SLDS platform default) 14px / 1.5 line-height</w:t>
-            </w:r>
-          </w:p>
-        </w:tc>
-      </w:tr>
-    </w:tbl>
-    <w:p/>
-    <w:p>
-      <w:pPr>
-        <w:pStyle w:val="Heading2"/>
-        <w:spacing w:before="240" w:after="120"/>
-      </w:pPr>
-      <w:r>
-        <w:rPr>
-          <w:b/>
-          <w:color w:val="0070D2"/>
-          <w:sz w:val="28"/>
-        </w:rPr>
-        <w:t>8.3 Screen Layouts</w:t>
+        <w:t>9.2 Screen Layouts</w:t>
       </w:r>
     </w:p>
     <w:p>
@@ -5147,7 +5258,7 @@
           <w:color w:val="181818"/>
           <w:sz w:val="21"/>
         </w:rPr>
-        <w:t>Screen 1 - Input</w:t>
+        <w:t>Input Screen</w:t>
       </w:r>
     </w:p>
     <w:p>
@@ -5164,32 +5275,17 @@
         </w:rPr>
         <w:t>METAMAPPER</w:t>
         <w:br/>
-        <w:t>-----------------------------------------------------------------------</w:t>
+        <w:t xml:space="preserve">  Metadata Type            API / Developer Name</w:t>
         <w:br/>
-        <w:t xml:space="preserve">  ANALYZE A METADATA COMPONENT</w:t>
-        <w:br/>
-        <w:br/>
-        <w:t xml:space="preserve">  Metadata Type                    API / Developer Name</w:t>
-        <w:br/>
-        <w:t xml:space="preserve">  [ CustomField              v ]   [ Account.Industry__c           ]</w:t>
-        <w:br/>
+        <w:t xml:space="preserve">  [ CustomField        v ] [ Account.Industry__c    ]</w:t>
         <w:br/>
         <w:t xml:space="preserve">  Scope to Object (optional)</w:t>
         <w:br/>
-        <w:t xml:space="preserve">  [ Search objects...                                               ]</w:t>
+        <w:t xml:space="preserve">  [ Search objects...                              ]</w:t>
         <w:br/>
+        <w:t xml:space="preserve">  [o] Active Flows Only</w:t>
         <w:br/>
-        <w:t xml:space="preserve">  [o] Active Flows Only  (Recommended for large orgs)</w:t>
-        <w:br/>
-        <w:br/>
-        <w:t xml:space="preserve">                                   [ &gt; Analyze Dependencies        ]</w:t>
-        <w:br/>
-        <w:br/>
-        <w:t xml:space="preserve">  RECENT JOBS                                               [View All]</w:t>
-        <w:br/>
-        <w:t xml:space="preserve">  * Account.Industry__c   Completed  2 min ago   47 nodes</w:t>
-        <w:br/>
-        <w:t xml:space="preserve">  * OpportunityTrigger    Failed     1 hr ago    --</w:t>
+        <w:t xml:space="preserve">                           [ &gt; Analyze Dependencies ]</w:t>
       </w:r>
     </w:p>
     <w:p>
@@ -5203,7 +5299,7 @@
           <w:color w:val="181818"/>
           <w:sz w:val="21"/>
         </w:rPr>
-        <w:t>Screen 2 - Progress</w:t>
+        <w:t>Progress Screen</w:t>
       </w:r>
     </w:p>
     <w:p>
@@ -5218,29 +5314,19 @@
           <w:color w:val="1E1E2E"/>
           <w:sz w:val="18"/>
         </w:rPr>
-        <w:t xml:space="preserve">  ANALYZING DEPENDENCIES</w:t>
+        <w:t xml:space="preserve">  ANALYZING: Account.Industry__c &gt; CustomField</w:t>
         <w:br/>
-        <w:t xml:space="preserve">  Account.Industry__c  &gt;  CustomField</w:t>
+        <w:t xml:space="preserve">  [===================&gt;          ]  58%</w:t>
         <w:br/>
+        <w:t xml:space="preserve">  NODES FOUND   ELAPSED   STATUS</w:t>
         <w:br/>
-        <w:t xml:space="preserve">  [====================&gt;              ]  58%</w:t>
+        <w:t xml:space="preserve">      127         0:43     Processing...</w:t>
         <w:br/>
+        <w:t xml:space="preserve">  0:43  Found 12 on Level 3 (4 supplemental)</w:t>
         <w:br/>
-        <w:t xml:space="preserve">  NODES FOUND    ELAPSED     STATUS</w:t>
+        <w:t xml:space="preserve">  0:31  Found 38 on Level 2</w:t>
         <w:br/>
-        <w:t xml:space="preserve">       127         0:43      Processing...</w:t>
-        <w:br/>
-        <w:br/>
-        <w:t xml:space="preserve">  Traversal depth: Level 3  *  Last found: OpportunityLineItem</w:t>
-        <w:br/>
-        <w:br/>
-        <w:t xml:space="preserve">  ACTIVITY LOG</w:t>
-        <w:br/>
-        <w:t xml:space="preserve">  0:43  Found 12 dependencies on Level 3 (4 supplemental)</w:t>
-        <w:br/>
-        <w:t xml:space="preserve">  0:31  Found 38 dependencies on Level 2</w:t>
-        <w:br/>
-        <w:t xml:space="preserve">  0:00  Job started                                  [Cancel Job]</w:t>
+        <w:t xml:space="preserve">  0:00  Job started              [Cancel Job]</w:t>
       </w:r>
     </w:p>
     <w:p>
@@ -5254,7 +5340,7 @@
           <w:color w:val="181818"/>
           <w:sz w:val="21"/>
         </w:rPr>
-        <w:t>Screen 3 - Results (Tree View)</w:t>
+        <w:t>Results - Tree View</w:t>
       </w:r>
     </w:p>
     <w:p>
@@ -5269,30 +5355,21 @@
           <w:color w:val="1E1E2E"/>
           <w:sz w:val="18"/>
         </w:rPr>
-        <w:t xml:space="preserve">  Account.Industry__c  &gt;  CustomField  *  Complete  *  127 nodes</w:t>
+        <w:t xml:space="preserve">  [ Tree View ] [ Graph View ]   [v CSV] [v JSON] [v package.xml]</w:t>
         <w:br/>
-        <w:t xml:space="preserve">  ApexClass(23) Flow(18) ValidationRule(9) Trigger(4) Other(73)</w:t>
+        <w:t xml:space="preserve">  NAME                    TYPE           LEVEL  FLAGS</w:t>
         <w:br/>
+        <w:t xml:space="preserve">  v Account.Industry__c   CustomField      0</w:t>
         <w:br/>
-        <w:t xml:space="preserve">  [ Tree View ]  [ Graph View ]          [v CSV]  [v JSON]  [v package.xml]</w:t>
+        <w:t xml:space="preserve">    v Stage_Rule          ValidationRule   1    [Supplemental]</w:t>
         <w:br/>
-        <w:t xml:space="preserve">  -----------------------------------------------------------------------</w:t>
+        <w:t xml:space="preserve">        Revenue_Flow_v3   Flow             2</w:t>
         <w:br/>
-        <w:t xml:space="preserve">  NAME                          TYPE              LEVEL   FLAGS</w:t>
+        <w:t xml:space="preserve">    v IndustryTrigger     ApexTrigger      1</w:t>
         <w:br/>
-        <w:t xml:space="preserve">  -----------------------------------------------------------------------</w:t>
+        <w:t xml:space="preserve">        IndustryService   ApexClass        2    [Write]</w:t>
         <w:br/>
-        <w:t xml:space="preserve">  v Account.Industry__c         CustomField         0</w:t>
-        <w:br/>
-        <w:t xml:space="preserve">    v Opportunity_Stage_Rule     ValidationRule      1     [Supplemental]</w:t>
-        <w:br/>
-        <w:t xml:space="preserve">        Revenue_Flow_v3          Flow                2</w:t>
-        <w:br/>
-        <w:t xml:space="preserve">    v IndustryTrigger            ApexTrigger         1</w:t>
-        <w:br/>
-        <w:t xml:space="preserve">        IndustryService          ApexClass           2     [Write]</w:t>
-        <w:br/>
-        <w:t xml:space="preserve">        DynamicHandler           ApexClass           2     [Dynamic Ref]</w:t>
+        <w:t xml:space="preserve">        DynHandler        ApexClass        2    [Dynamic Ref]</w:t>
       </w:r>
     </w:p>
     <w:p>
@@ -5306,7 +5383,7 @@
           <w:color w:val="181818"/>
           <w:sz w:val="21"/>
         </w:rPr>
-        <w:t>Screen 4 - Results (Graph View)</w:t>
+        <w:t>Results - Graph View</w:t>
       </w:r>
     </w:p>
     <w:p>
@@ -5321,33 +5398,27 @@
           <w:color w:val="1E1E2E"/>
           <w:sz w:val="18"/>
         </w:rPr>
-        <w:t xml:space="preserve">  [ Tree View ]  [ Graph View ]          [v CSV]  [v JSON]  [v package.xml]</w:t>
+        <w:t xml:space="preserve">  [ Tree View ] [ Graph View ]   [v CSV] [v JSON] [v package.xml]</w:t>
         <w:br/>
-        <w:t xml:space="preserve">  +-----------------------------------------+----------------------+</w:t>
+        <w:t xml:space="preserve">  +------------------------------------------+---------------------+</w:t>
         <w:br/>
-        <w:t xml:space="preserve">  |                                         | LEGEND               |</w:t>
+        <w:t xml:space="preserve">  |  [Flow]&lt;--[ApexClass]                    | LEGEND              |</w:t>
         <w:br/>
-        <w:t xml:space="preserve">  |       [F]&lt;------[A]                     | * ApexClass          |</w:t>
+        <w:t xml:space="preserve">  |    |         |                           | * ApexClass         |</w:t>
         <w:br/>
-        <w:t xml:space="preserve">  |        |         |                      | * Flow               |</w:t>
+        <w:t xml:space="preserve">  |  [VRule]&lt;--[TARGET]--&gt;[LWC]              | * Flow              |</w:t>
         <w:br/>
-        <w:t xml:space="preserve">  |       [VR]&lt;---[TARGET]---&gt;[L]           | * CustomField        |</w:t>
+        <w:t xml:space="preserve">  |             C.Industry                   | FILTERS             |</w:t>
         <w:br/>
-        <w:t xml:space="preserve">  |                C.Industry               |                      |</w:t>
+        <w:t xml:space="preserve">  |  [Email]&lt;---__c---&gt;[Trigger]             | [x] ApexClass  (23) |</w:t>
         <w:br/>
-        <w:t xml:space="preserve">  |       [ET]&lt;-----__c----&gt;[AT]            | FILTERS              |</w:t>
+        <w:t xml:space="preserve">  |  (circular)        |                     | [x] Flow       (18) |</w:t>
         <w:br/>
-        <w:t xml:space="preserve">  |       (circular)        |               | [x] ApexClass  (23)  |</w:t>
+        <w:t xml:space="preserve">  |                  [ApexClass]~dynamic     | [x] Supplemental    |</w:t>
         <w:br/>
-        <w:t xml:space="preserve">  |                        [AC]~dynamic     | [x] Flow       (18)  |</w:t>
+        <w:t xml:space="preserve">  | [+][-][Fit][Reset]  ~ = dynamic ref      |                     |</w:t>
         <w:br/>
-        <w:t xml:space="preserve">  |                                         | [ ] Other      (73)  |</w:t>
-        <w:br/>
-        <w:t xml:space="preserve">  | [+] [-]  [Fit]  [Reset]                 |                      |</w:t>
-        <w:br/>
-        <w:t xml:space="preserve">  | ~ = dynamic ref  o = circular           | [x] Supplemental     |</w:t>
-        <w:br/>
-        <w:t xml:space="preserve">  +-----------------------------------------+----------------------+</w:t>
+        <w:t xml:space="preserve">  +------------------------------------------+---------------------+</w:t>
       </w:r>
     </w:p>
     <w:p>
@@ -5361,7 +5432,7 @@
           <w:color w:val="0070D2"/>
           <w:sz w:val="28"/>
         </w:rPr>
-        <w:t>8.4 Component States</w:t>
+        <w:t>9.3 Node Flags (Tree + Graph)</w:t>
       </w:r>
     </w:p>
     <w:tbl>
@@ -5389,7 +5460,7 @@
                 <w:color w:val="FFFFFF"/>
                 <w:sz w:val="20"/>
               </w:rPr>
-              <w:t>Component</w:t>
+              <w:t>Flag</w:t>
             </w:r>
           </w:p>
         </w:tc>
@@ -5405,7 +5476,7 @@
                 <w:color w:val="FFFFFF"/>
                 <w:sz w:val="20"/>
               </w:rPr>
-              <w:t>State</w:t>
+              <w:t>Visual</w:t>
             </w:r>
           </w:p>
         </w:tc>
@@ -5421,7 +5492,7 @@
                 <w:color w:val="FFFFFF"/>
                 <w:sz w:val="20"/>
               </w:rPr>
-              <w:t>Behaviour</w:t>
+              <w:t>Tooltip</w:t>
             </w:r>
           </w:p>
         </w:tc>
@@ -5438,7 +5509,7 @@
                 <w:color w:val="181818"/>
                 <w:sz w:val="20"/>
               </w:rPr>
-              <w:t>Submit Button</w:t>
+              <w:t>Is_Circular__c</w:t>
             </w:r>
           </w:p>
         </w:tc>
@@ -5453,7 +5524,7 @@
                 <w:color w:val="181818"/>
                 <w:sz w:val="20"/>
               </w:rPr>
-              <w:t>Default</w:t>
+              <w:t>Dashed border / dimmed opacity</w:t>
             </w:r>
           </w:p>
         </w:tc>
@@ -5468,7 +5539,7 @@
                 <w:color w:val="181818"/>
                 <w:sz w:val="20"/>
               </w:rPr>
-              <w:t>"Analyze Dependencies" - SLDS brand variant</w:t>
+              <w:t>Already referenced above - not re-traversed</w:t>
             </w:r>
           </w:p>
         </w:tc>
@@ -5485,7 +5556,7 @@
                 <w:color w:val="181818"/>
                 <w:sz w:val="20"/>
               </w:rPr>
-              <w:t>Submit Button</w:t>
+              <w:t>Is_Dynamic_Reference__c</w:t>
             </w:r>
           </w:p>
         </w:tc>
@@ -5500,7 +5571,7 @@
                 <w:color w:val="181818"/>
                 <w:sz w:val="20"/>
               </w:rPr>
-              <w:t>Loading</w:t>
+              <w:t>~ prefix on name</w:t>
             </w:r>
           </w:p>
         </w:tc>
@@ -5515,7 +5586,7 @@
                 <w:color w:val="181818"/>
                 <w:sz w:val="20"/>
               </w:rPr>
-              <w:t>Spinner + "Starting analysis..." - disabled</w:t>
+              <w:t>Dynamic reference - manual code review required</w:t>
             </w:r>
           </w:p>
         </w:tc>
@@ -5532,7 +5603,7 @@
                 <w:color w:val="181818"/>
                 <w:sz w:val="20"/>
               </w:rPr>
-              <w:t>Typeahead Lookup</w:t>
+              <w:t>Source__c = Supplemental</w:t>
             </w:r>
           </w:p>
         </w:tc>
@@ -5547,7 +5618,7 @@
                 <w:color w:val="181818"/>
                 <w:sz w:val="20"/>
               </w:rPr>
-              <w:t>Hidden</w:t>
+              <w:t>[Supplemental] badge</w:t>
             </w:r>
           </w:p>
         </w:tc>
@@ -5562,477 +5633,7 @@
                 <w:color w:val="181818"/>
                 <w:sz w:val="20"/>
               </w:rPr>
-              <w:t>Hidden when type does not require object scope</w:t>
-            </w:r>
-          </w:p>
-        </w:tc>
-      </w:tr>
-      <w:tr>
-        <w:tc>
-          <w:tcPr>
-            <w:tcW w:type="dxa" w:w="3022"/>
-            <w:shd w:val="clear" w:color="auto" w:fill="FFFFFF"/>
-          </w:tcPr>
-          <w:p>
-            <w:r>
-              <w:rPr>
-                <w:color w:val="181818"/>
-                <w:sz w:val="20"/>
-              </w:rPr>
-              <w:t>Typeahead Lookup</w:t>
-            </w:r>
-          </w:p>
-        </w:tc>
-        <w:tc>
-          <w:tcPr>
-            <w:tcW w:type="dxa" w:w="3022"/>
-            <w:shd w:val="clear" w:color="auto" w:fill="FFFFFF"/>
-          </w:tcPr>
-          <w:p>
-            <w:r>
-              <w:rPr>
-                <w:color w:val="181818"/>
-                <w:sz w:val="20"/>
-              </w:rPr>
-              <w:t>Typing (300ms)</w:t>
-            </w:r>
-          </w:p>
-        </w:tc>
-        <w:tc>
-          <w:tcPr>
-            <w:tcW w:type="dxa" w:w="3022"/>
-            <w:shd w:val="clear" w:color="auto" w:fill="FFFFFF"/>
-          </w:tcPr>
-          <w:p>
-            <w:r>
-              <w:rPr>
-                <w:color w:val="181818"/>
-                <w:sz w:val="20"/>
-              </w:rPr>
-              <w:t>Inline spinner then dropdown: ObjectLabel + ApiName in monospace</w:t>
-            </w:r>
-          </w:p>
-        </w:tc>
-      </w:tr>
-      <w:tr>
-        <w:tc>
-          <w:tcPr>
-            <w:tcW w:type="dxa" w:w="3022"/>
-            <w:shd w:val="clear" w:color="auto" w:fill="F2F4F7"/>
-          </w:tcPr>
-          <w:p>
-            <w:r>
-              <w:rPr>
-                <w:color w:val="181818"/>
-                <w:sz w:val="20"/>
-              </w:rPr>
-              <w:t>Progress Bar</w:t>
-            </w:r>
-          </w:p>
-        </w:tc>
-        <w:tc>
-          <w:tcPr>
-            <w:tcW w:type="dxa" w:w="3022"/>
-            <w:shd w:val="clear" w:color="auto" w:fill="F2F4F7"/>
-          </w:tcPr>
-          <w:p>
-            <w:r>
-              <w:rPr>
-                <w:color w:val="181818"/>
-                <w:sz w:val="20"/>
-              </w:rPr>
-              <w:t>Indeterminate</w:t>
-            </w:r>
-          </w:p>
-        </w:tc>
-        <w:tc>
-          <w:tcPr>
-            <w:tcW w:type="dxa" w:w="3022"/>
-            <w:shd w:val="clear" w:color="auto" w:fill="F2F4F7"/>
-          </w:tcPr>
-          <w:p>
-            <w:r>
-              <w:rPr>
-                <w:color w:val="181818"/>
-                <w:sz w:val="20"/>
-              </w:rPr>
-              <w:t>Pulse animation until first Platform Event arrives</w:t>
-            </w:r>
-          </w:p>
-        </w:tc>
-      </w:tr>
-      <w:tr>
-        <w:tc>
-          <w:tcPr>
-            <w:tcW w:type="dxa" w:w="3022"/>
-            <w:shd w:val="clear" w:color="auto" w:fill="FFFFFF"/>
-          </w:tcPr>
-          <w:p>
-            <w:r>
-              <w:rPr>
-                <w:color w:val="181818"/>
-                <w:sz w:val="20"/>
-              </w:rPr>
-              <w:t>Progress Bar</w:t>
-            </w:r>
-          </w:p>
-        </w:tc>
-        <w:tc>
-          <w:tcPr>
-            <w:tcW w:type="dxa" w:w="3022"/>
-            <w:shd w:val="clear" w:color="auto" w:fill="FFFFFF"/>
-          </w:tcPr>
-          <w:p>
-            <w:r>
-              <w:rPr>
-                <w:color w:val="181818"/>
-                <w:sz w:val="20"/>
-              </w:rPr>
-              <w:t>Determinate</w:t>
-            </w:r>
-          </w:p>
-        </w:tc>
-        <w:tc>
-          <w:tcPr>
-            <w:tcW w:type="dxa" w:w="3022"/>
-            <w:shd w:val="clear" w:color="auto" w:fill="FFFFFF"/>
-          </w:tcPr>
-          <w:p>
-            <w:r>
-              <w:rPr>
-                <w:color w:val="181818"/>
-                <w:sz w:val="20"/>
-              </w:rPr>
-              <w:t>Fills from Nodes_Processed__c</w:t>
-            </w:r>
-          </w:p>
-        </w:tc>
-      </w:tr>
-      <w:tr>
-        <w:tc>
-          <w:tcPr>
-            <w:tcW w:type="dxa" w:w="3022"/>
-            <w:shd w:val="clear" w:color="auto" w:fill="F2F4F7"/>
-          </w:tcPr>
-          <w:p>
-            <w:r>
-              <w:rPr>
-                <w:color w:val="181818"/>
-                <w:sz w:val="20"/>
-              </w:rPr>
-              <w:t>Job Status Badge</w:t>
-            </w:r>
-          </w:p>
-        </w:tc>
-        <w:tc>
-          <w:tcPr>
-            <w:tcW w:type="dxa" w:w="3022"/>
-            <w:shd w:val="clear" w:color="auto" w:fill="F2F4F7"/>
-          </w:tcPr>
-          <w:p>
-            <w:r>
-              <w:rPr>
-                <w:color w:val="181818"/>
-                <w:sz w:val="20"/>
-              </w:rPr>
-              <w:t>Initializing</w:t>
-            </w:r>
-          </w:p>
-        </w:tc>
-        <w:tc>
-          <w:tcPr>
-            <w:tcW w:type="dxa" w:w="3022"/>
-            <w:shd w:val="clear" w:color="auto" w:fill="F2F4F7"/>
-          </w:tcPr>
-          <w:p>
-            <w:r>
-              <w:rPr>
-                <w:color w:val="181818"/>
-                <w:sz w:val="20"/>
-              </w:rPr>
-              <w:t>Gray spinner</w:t>
-            </w:r>
-          </w:p>
-        </w:tc>
-      </w:tr>
-      <w:tr>
-        <w:tc>
-          <w:tcPr>
-            <w:tcW w:type="dxa" w:w="3022"/>
-            <w:shd w:val="clear" w:color="auto" w:fill="FFFFFF"/>
-          </w:tcPr>
-          <w:p>
-            <w:r>
-              <w:rPr>
-                <w:color w:val="181818"/>
-                <w:sz w:val="20"/>
-              </w:rPr>
-              <w:t>Job Status Badge</w:t>
-            </w:r>
-          </w:p>
-        </w:tc>
-        <w:tc>
-          <w:tcPr>
-            <w:tcW w:type="dxa" w:w="3022"/>
-            <w:shd w:val="clear" w:color="auto" w:fill="FFFFFF"/>
-          </w:tcPr>
-          <w:p>
-            <w:r>
-              <w:rPr>
-                <w:color w:val="181818"/>
-                <w:sz w:val="20"/>
-              </w:rPr>
-              <w:t>Processing</w:t>
-            </w:r>
-          </w:p>
-        </w:tc>
-        <w:tc>
-          <w:tcPr>
-            <w:tcW w:type="dxa" w:w="3022"/>
-            <w:shd w:val="clear" w:color="auto" w:fill="FFFFFF"/>
-          </w:tcPr>
-          <w:p>
-            <w:r>
-              <w:rPr>
-                <w:color w:val="181818"/>
-                <w:sz w:val="20"/>
-              </w:rPr>
-              <w:t>Amber spinner</w:t>
-            </w:r>
-          </w:p>
-        </w:tc>
-      </w:tr>
-      <w:tr>
-        <w:tc>
-          <w:tcPr>
-            <w:tcW w:type="dxa" w:w="3022"/>
-            <w:shd w:val="clear" w:color="auto" w:fill="F2F4F7"/>
-          </w:tcPr>
-          <w:p>
-            <w:r>
-              <w:rPr>
-                <w:color w:val="181818"/>
-                <w:sz w:val="20"/>
-              </w:rPr>
-              <w:t>Job Status Badge</w:t>
-            </w:r>
-          </w:p>
-        </w:tc>
-        <w:tc>
-          <w:tcPr>
-            <w:tcW w:type="dxa" w:w="3022"/>
-            <w:shd w:val="clear" w:color="auto" w:fill="F2F4F7"/>
-          </w:tcPr>
-          <w:p>
-            <w:r>
-              <w:rPr>
-                <w:color w:val="181818"/>
-                <w:sz w:val="20"/>
-              </w:rPr>
-              <w:t>Completed</w:t>
-            </w:r>
-          </w:p>
-        </w:tc>
-        <w:tc>
-          <w:tcPr>
-            <w:tcW w:type="dxa" w:w="3022"/>
-            <w:shd w:val="clear" w:color="auto" w:fill="F2F4F7"/>
-          </w:tcPr>
-          <w:p>
-            <w:r>
-              <w:rPr>
-                <w:color w:val="181818"/>
-                <w:sz w:val="20"/>
-              </w:rPr>
-              <w:t>Green checkmark</w:t>
-            </w:r>
-          </w:p>
-        </w:tc>
-      </w:tr>
-      <w:tr>
-        <w:tc>
-          <w:tcPr>
-            <w:tcW w:type="dxa" w:w="3022"/>
-            <w:shd w:val="clear" w:color="auto" w:fill="FFFFFF"/>
-          </w:tcPr>
-          <w:p>
-            <w:r>
-              <w:rPr>
-                <w:color w:val="181818"/>
-                <w:sz w:val="20"/>
-              </w:rPr>
-              <w:t>Job Status Badge</w:t>
-            </w:r>
-          </w:p>
-        </w:tc>
-        <w:tc>
-          <w:tcPr>
-            <w:tcW w:type="dxa" w:w="3022"/>
-            <w:shd w:val="clear" w:color="auto" w:fill="FFFFFF"/>
-          </w:tcPr>
-          <w:p>
-            <w:r>
-              <w:rPr>
-                <w:color w:val="181818"/>
-                <w:sz w:val="20"/>
-              </w:rPr>
-              <w:t>Failed</w:t>
-            </w:r>
-          </w:p>
-        </w:tc>
-        <w:tc>
-          <w:tcPr>
-            <w:tcW w:type="dxa" w:w="3022"/>
-            <w:shd w:val="clear" w:color="auto" w:fill="FFFFFF"/>
-          </w:tcPr>
-          <w:p>
-            <w:r>
-              <w:rPr>
-                <w:color w:val="181818"/>
-                <w:sz w:val="20"/>
-              </w:rPr>
-              <w:t>Red error icon</w:t>
-            </w:r>
-          </w:p>
-        </w:tc>
-      </w:tr>
-      <w:tr>
-        <w:tc>
-          <w:tcPr>
-            <w:tcW w:type="dxa" w:w="3022"/>
-            <w:shd w:val="clear" w:color="auto" w:fill="F2F4F7"/>
-          </w:tcPr>
-          <w:p>
-            <w:r>
-              <w:rPr>
-                <w:color w:val="181818"/>
-                <w:sz w:val="20"/>
-              </w:rPr>
-              <w:t>Node flag - Circular</w:t>
-            </w:r>
-          </w:p>
-        </w:tc>
-        <w:tc>
-          <w:tcPr>
-            <w:tcW w:type="dxa" w:w="3022"/>
-            <w:shd w:val="clear" w:color="auto" w:fill="F2F4F7"/>
-          </w:tcPr>
-          <w:p>
-            <w:r>
-              <w:rPr>
-                <w:color w:val="181818"/>
-                <w:sz w:val="20"/>
-              </w:rPr>
-              <w:t>Tree + Graph</w:t>
-            </w:r>
-          </w:p>
-        </w:tc>
-        <w:tc>
-          <w:tcPr>
-            <w:tcW w:type="dxa" w:w="3022"/>
-            <w:shd w:val="clear" w:color="auto" w:fill="F2F4F7"/>
-          </w:tcPr>
-          <w:p>
-            <w:r>
-              <w:rPr>
-                <w:color w:val="181818"/>
-                <w:sz w:val="20"/>
-              </w:rPr>
-              <w:t>Dashed border / dimmed opacity; tooltip: "Already referenced above"</w:t>
-            </w:r>
-          </w:p>
-        </w:tc>
-      </w:tr>
-      <w:tr>
-        <w:tc>
-          <w:tcPr>
-            <w:tcW w:type="dxa" w:w="3022"/>
-            <w:shd w:val="clear" w:color="auto" w:fill="FFFFFF"/>
-          </w:tcPr>
-          <w:p>
-            <w:r>
-              <w:rPr>
-                <w:color w:val="181818"/>
-                <w:sz w:val="20"/>
-              </w:rPr>
-              <w:t>Node flag - Dynamic</w:t>
-            </w:r>
-          </w:p>
-        </w:tc>
-        <w:tc>
-          <w:tcPr>
-            <w:tcW w:type="dxa" w:w="3022"/>
-            <w:shd w:val="clear" w:color="auto" w:fill="FFFFFF"/>
-          </w:tcPr>
-          <w:p>
-            <w:r>
-              <w:rPr>
-                <w:color w:val="181818"/>
-                <w:sz w:val="20"/>
-              </w:rPr>
-              <w:t>Tree + Graph</w:t>
-            </w:r>
-          </w:p>
-        </w:tc>
-        <w:tc>
-          <w:tcPr>
-            <w:tcW w:type="dxa" w:w="3022"/>
-            <w:shd w:val="clear" w:color="auto" w:fill="FFFFFF"/>
-          </w:tcPr>
-          <w:p>
-            <w:r>
-              <w:rPr>
-                <w:color w:val="181818"/>
-                <w:sz w:val="20"/>
-              </w:rPr>
-              <w:t>~ prefix; tooltip: "Dynamic reference - manual review required"</w:t>
-            </w:r>
-          </w:p>
-        </w:tc>
-      </w:tr>
-      <w:tr>
-        <w:tc>
-          <w:tcPr>
-            <w:tcW w:type="dxa" w:w="3022"/>
-            <w:shd w:val="clear" w:color="auto" w:fill="F2F4F7"/>
-          </w:tcPr>
-          <w:p>
-            <w:r>
-              <w:rPr>
-                <w:color w:val="181818"/>
-                <w:sz w:val="20"/>
-              </w:rPr>
-              <w:t>Node flag - Supplemental</w:t>
-            </w:r>
-          </w:p>
-        </w:tc>
-        <w:tc>
-          <w:tcPr>
-            <w:tcW w:type="dxa" w:w="3022"/>
-            <w:shd w:val="clear" w:color="auto" w:fill="F2F4F7"/>
-          </w:tcPr>
-          <w:p>
-            <w:r>
-              <w:rPr>
-                <w:color w:val="181818"/>
-                <w:sz w:val="20"/>
-              </w:rPr>
-              <w:t>Tree</w:t>
-            </w:r>
-          </w:p>
-        </w:tc>
-        <w:tc>
-          <w:tcPr>
-            <w:tcW w:type="dxa" w:w="3022"/>
-            <w:shd w:val="clear" w:color="auto" w:fill="F2F4F7"/>
-          </w:tcPr>
-          <w:p>
-            <w:r>
-              <w:rPr>
-                <w:color w:val="181818"/>
-                <w:sz w:val="20"/>
-              </w:rPr>
-              <w:t>[Supplemental] badge; tooltip: "Found via secondary query"</w:t>
+              <w:t>Found via secondary query, not MetadataComponentDependency</w:t>
             </w:r>
           </w:p>
         </w:tc>
@@ -6050,149 +5651,152 @@
           <w:color w:val="0070D2"/>
           <w:sz w:val="28"/>
         </w:rPr>
-        <w:t>8.5 Interaction Patterns</w:t>
+        <w:t>9.4 Export Formats</w:t>
       </w:r>
     </w:p>
-    <w:p>
-      <w:pPr>
-        <w:spacing w:after="80"/>
-      </w:pPr>
-      <w:r>
-        <w:rPr>
-          <w:b/>
-          <w:i w:val="0"/>
-          <w:color w:val="181818"/>
-          <w:sz w:val="21"/>
-        </w:rPr>
-        <w:t>Graph View</w:t>
-      </w:r>
-    </w:p>
-    <w:p>
-      <w:pPr>
-        <w:pStyle w:val="ListBullet"/>
-        <w:spacing w:after="40"/>
-        <w:ind w:left="283"/>
-      </w:pPr>
-      <w:r>
-        <w:rPr>
-          <w:color w:val="181818"/>
-          <w:sz w:val="21"/>
-        </w:rPr>
-        <w:t>Scroll wheel: zoom. Click + drag background: pan.</w:t>
-      </w:r>
-    </w:p>
-    <w:p>
-      <w:pPr>
-        <w:pStyle w:val="ListBullet"/>
-        <w:spacing w:after="40"/>
-        <w:ind w:left="283"/>
-      </w:pPr>
-      <w:r>
-        <w:rPr>
-          <w:color w:val="181818"/>
-          <w:sz w:val="21"/>
-        </w:rPr>
-        <w:t>Click a node: highlights node + direct edges; all others dim to 20% opacity; detail tooltip shows type, API name, depth, Source__c, Context_Data__c pills.</w:t>
-      </w:r>
-    </w:p>
-    <w:p>
-      <w:pPr>
-        <w:pStyle w:val="ListBullet"/>
-        <w:spacing w:after="40"/>
-        <w:ind w:left="283"/>
-      </w:pPr>
-      <w:r>
-        <w:rPr>
-          <w:color w:val="181818"/>
-          <w:sz w:val="21"/>
-        </w:rPr>
-        <w:t>Double-click: center and zoom to node.</w:t>
-      </w:r>
-    </w:p>
-    <w:p>
-      <w:pPr>
-        <w:pStyle w:val="ListBullet"/>
-        <w:spacing w:after="40"/>
-        <w:ind w:left="283"/>
-      </w:pPr>
-      <w:r>
-        <w:rPr>
-          <w:color w:val="181818"/>
-          <w:sz w:val="21"/>
-        </w:rPr>
-        <w:t>Type filter checkboxes: hide/show node types and their edges live.</w:t>
-      </w:r>
-    </w:p>
-    <w:p>
-      <w:pPr>
-        <w:pStyle w:val="ListBullet"/>
-        <w:spacing w:after="40"/>
-        <w:ind w:left="283"/>
-      </w:pPr>
-      <w:r>
-        <w:rPr>
-          <w:color w:val="181818"/>
-          <w:sz w:val="21"/>
-        </w:rPr>
-        <w:t>Source filter: toggle "Supplemental" to show/hide supplemental-only nodes.</w:t>
-      </w:r>
-    </w:p>
-    <w:p>
-      <w:pPr>
-        <w:spacing w:after="80"/>
-      </w:pPr>
-      <w:r>
-        <w:rPr>
-          <w:b/>
-          <w:i w:val="0"/>
-          <w:color w:val="181818"/>
-          <w:sz w:val="21"/>
-        </w:rPr>
-        <w:t>Export formats</w:t>
-      </w:r>
-    </w:p>
-    <w:p>
-      <w:pPr>
-        <w:pStyle w:val="ListBullet"/>
-        <w:spacing w:after="40"/>
-        <w:ind w:left="283"/>
-      </w:pPr>
-      <w:r>
-        <w:rPr>
-          <w:color w:val="181818"/>
-          <w:sz w:val="21"/>
-        </w:rPr>
-        <w:t>CSV: Level, Metadata_Type, Metadata_Name, Metadata_ID, Parent_Name, Is_Circular, Is_Dynamic, Source</w:t>
-      </w:r>
-    </w:p>
-    <w:p>
-      <w:pPr>
-        <w:pStyle w:val="ListBullet"/>
-        <w:spacing w:after="40"/>
-        <w:ind w:left="283"/>
-      </w:pPr>
-      <w:r>
-        <w:rPr>
-          <w:color w:val="181818"/>
-          <w:sz w:val="21"/>
-        </w:rPr>
-        <w:t>JSON: nested tree with Context_Data__c pills included</w:t>
-      </w:r>
-    </w:p>
-    <w:p>
-      <w:pPr>
-        <w:pStyle w:val="ListBullet"/>
-        <w:spacing w:after="40"/>
-        <w:ind w:left="283"/>
-      </w:pPr>
-      <w:r>
-        <w:rPr>
-          <w:color w:val="181818"/>
-          <w:sz w:val="21"/>
-        </w:rPr>
-        <w:t>package.xml: valid Salesforce deployment manifest grouped by &lt;types&gt;; excludes managed package components (namespace-prefixed)</w:t>
-      </w:r>
-    </w:p>
+    <w:tbl>
+      <w:tblPr>
+        <w:tblStyle w:val="TableGrid"/>
+        <w:tblW w:type="auto" w:w="0"/>
+        <w:jc w:val="left"/>
+        <w:tblLook w:firstColumn="1" w:firstRow="1" w:lastColumn="0" w:lastRow="0" w:noHBand="0" w:noVBand="1" w:val="04A0"/>
+      </w:tblPr>
+      <w:tblGrid>
+        <w:gridCol w:w="4533"/>
+        <w:gridCol w:w="4533"/>
+      </w:tblGrid>
+      <w:tr>
+        <w:tc>
+          <w:tcPr>
+            <w:tcW w:type="dxa" w:w="4533"/>
+            <w:shd w:val="clear" w:color="auto" w:fill="032D60"/>
+          </w:tcPr>
+          <w:p>
+            <w:r>
+              <w:rPr>
+                <w:b/>
+                <w:color w:val="FFFFFF"/>
+                <w:sz w:val="20"/>
+              </w:rPr>
+              <w:t>Format</w:t>
+            </w:r>
+          </w:p>
+        </w:tc>
+        <w:tc>
+          <w:tcPr>
+            <w:tcW w:type="dxa" w:w="4533"/>
+            <w:shd w:val="clear" w:color="auto" w:fill="032D60"/>
+          </w:tcPr>
+          <w:p>
+            <w:r>
+              <w:rPr>
+                <w:b/>
+                <w:color w:val="FFFFFF"/>
+                <w:sz w:val="20"/>
+              </w:rPr>
+              <w:t>Structure</w:t>
+            </w:r>
+          </w:p>
+        </w:tc>
+      </w:tr>
+      <w:tr>
+        <w:tc>
+          <w:tcPr>
+            <w:tcW w:type="dxa" w:w="4533"/>
+            <w:shd w:val="clear" w:color="auto" w:fill="F2F4F7"/>
+          </w:tcPr>
+          <w:p>
+            <w:r>
+              <w:rPr>
+                <w:color w:val="181818"/>
+                <w:sz w:val="20"/>
+              </w:rPr>
+              <w:t>CSV</w:t>
+            </w:r>
+          </w:p>
+        </w:tc>
+        <w:tc>
+          <w:tcPr>
+            <w:tcW w:type="dxa" w:w="4533"/>
+            <w:shd w:val="clear" w:color="auto" w:fill="F2F4F7"/>
+          </w:tcPr>
+          <w:p>
+            <w:r>
+              <w:rPr>
+                <w:color w:val="181818"/>
+                <w:sz w:val="20"/>
+              </w:rPr>
+              <w:t>Flat: Level, Metadata_Type, Metadata_Name, Metadata_ID, Parent_Name, Is_Circular, Is_Dynamic, Source</w:t>
+            </w:r>
+          </w:p>
+        </w:tc>
+      </w:tr>
+      <w:tr>
+        <w:tc>
+          <w:tcPr>
+            <w:tcW w:type="dxa" w:w="4533"/>
+            <w:shd w:val="clear" w:color="auto" w:fill="FFFFFF"/>
+          </w:tcPr>
+          <w:p>
+            <w:r>
+              <w:rPr>
+                <w:color w:val="181818"/>
+                <w:sz w:val="20"/>
+              </w:rPr>
+              <w:t>JSON</w:t>
+            </w:r>
+          </w:p>
+        </w:tc>
+        <w:tc>
+          <w:tcPr>
+            <w:tcW w:type="dxa" w:w="4533"/>
+            <w:shd w:val="clear" w:color="auto" w:fill="FFFFFF"/>
+          </w:tcPr>
+          <w:p>
+            <w:r>
+              <w:rPr>
+                <w:color w:val="181818"/>
+                <w:sz w:val="20"/>
+              </w:rPr>
+              <w:t>Nested tree mirroring Dependency_Node__c hierarchy with Context_Data__c pills included</w:t>
+            </w:r>
+          </w:p>
+        </w:tc>
+      </w:tr>
+      <w:tr>
+        <w:tc>
+          <w:tcPr>
+            <w:tcW w:type="dxa" w:w="4533"/>
+            <w:shd w:val="clear" w:color="auto" w:fill="F2F4F7"/>
+          </w:tcPr>
+          <w:p>
+            <w:r>
+              <w:rPr>
+                <w:color w:val="181818"/>
+                <w:sz w:val="20"/>
+              </w:rPr>
+              <w:t>package.xml</w:t>
+            </w:r>
+          </w:p>
+        </w:tc>
+        <w:tc>
+          <w:tcPr>
+            <w:tcW w:type="dxa" w:w="4533"/>
+            <w:shd w:val="clear" w:color="auto" w:fill="F2F4F7"/>
+          </w:tcPr>
+          <w:p>
+            <w:r>
+              <w:rPr>
+                <w:color w:val="181818"/>
+                <w:sz w:val="20"/>
+              </w:rPr>
+              <w:t>Valid Salesforce deployment manifest grouped by &lt;types&gt;. Excludes managed package components (namespace-prefixed).</w:t>
+            </w:r>
+          </w:p>
+        </w:tc>
+      </w:tr>
+    </w:tbl>
+    <w:p/>
     <w:p>
       <w:pPr>
         <w:pStyle w:val="Heading1"/>
@@ -6204,7 +5808,7 @@
           <w:color w:val="032D60"/>
           <w:sz w:val="36"/>
         </w:rPr>
-        <w:t>9. Apex Class Inventory</w:t>
+        <w:t>10. Apex Class Inventory</w:t>
       </w:r>
     </w:p>
     <w:p>
@@ -6648,7 +6252,7 @@
                 <w:color w:val="181818"/>
                 <w:sz w:val="20"/>
               </w:rPr>
-              <w:t>Full engine: callouts, handler dispatch, cycle detection, limit guardrails, QueryMore, self-chaining</w:t>
+              <w:t>Engine: DB cycle detection, callouts, handler dispatch, adaptive guardrail, QueryMore, self-chaining</w:t>
             </w:r>
           </w:p>
         </w:tc>
@@ -6807,7 +6411,7 @@
           <w:color w:val="032D60"/>
           <w:sz w:val="36"/>
         </w:rPr>
-        <w:t>10. Testing Strategy</w:t>
+        <w:t>11. Testing Strategy</w:t>
       </w:r>
     </w:p>
     <w:p>
@@ -6936,7 +6540,7 @@
                 <w:color w:val="181818"/>
                 <w:sz w:val="20"/>
               </w:rPr>
-              <w:t>100-ID chunking, QueryMore multi-page, HTTP 414 reactive split, Flow filter, JSON parse edge cases</w:t>
+              <w:t>100-ID chunking, QueryMore multi-page, HTTP 414 reactive split, Flow filter, JSON parse</w:t>
             </w:r>
           </w:p>
         </w:tc>
@@ -6968,7 +6572,7 @@
                 <w:color w:val="181818"/>
                 <w:sz w:val="20"/>
               </w:rPr>
-              <w:t>Normal traversal, circular node Is_Circular__c, limit guardrail self-chain, Completed + Summary_JSON__c, Failed on callout exception</w:t>
+              <w:t>Normal traversal, circular node Is_Circular__c via DB query, adaptive guardrail (60% Flow / 80% default), Completed + Summary_JSON__c, Failed on callout exception</w:t>
             </w:r>
           </w:p>
         </w:tc>
@@ -7114,7 +6718,7 @@
           <w:color w:val="032D60"/>
           <w:sz w:val="36"/>
         </w:rPr>
-        <w:t>11. Deployment</w:t>
+        <w:t>12. Deployment</w:t>
       </w:r>
     </w:p>
     <w:p>
@@ -7214,7 +6818,7 @@
                 <w:color w:val="181818"/>
                 <w:sz w:val="20"/>
               </w:rPr>
-              <w:t>Authenticate</w:t>
+              <w:t>Install ECharts</w:t>
             </w:r>
           </w:p>
         </w:tc>
@@ -7229,7 +6833,7 @@
                 <w:color w:val="181818"/>
                 <w:sz w:val="20"/>
               </w:rPr>
-              <w:t>sf org login web --alias &lt;alias&gt;</w:t>
+              <w:t>npm install echarts  (source echarts/dist/echarts.min.js for Static Resource)</w:t>
             </w:r>
           </w:p>
         </w:tc>
@@ -7246,7 +6850,7 @@
                 <w:color w:val="181818"/>
                 <w:sz w:val="20"/>
               </w:rPr>
-              <w:t>Create scratch org</w:t>
+              <w:t>Authenticate</w:t>
             </w:r>
           </w:p>
         </w:tc>
@@ -7261,7 +6865,7 @@
                 <w:color w:val="181818"/>
                 <w:sz w:val="20"/>
               </w:rPr>
-              <w:t>sf org create scratch --definition-file config/project-scratch-def.json --alias metamapper-dev</w:t>
+              <w:t>sf org login web --alias &lt;alias&gt;</w:t>
             </w:r>
           </w:p>
         </w:tc>
@@ -7278,7 +6882,7 @@
                 <w:color w:val="181818"/>
                 <w:sz w:val="20"/>
               </w:rPr>
-              <w:t>Deploy source</w:t>
+              <w:t>Create scratch org</w:t>
             </w:r>
           </w:p>
         </w:tc>
@@ -7293,7 +6897,7 @@
                 <w:color w:val="181818"/>
                 <w:sz w:val="20"/>
               </w:rPr>
-              <w:t>sf project deploy start --source-dir force-app --target-org &lt;alias&gt;</w:t>
+              <w:t>sf org create scratch --definition-file config/project-scratch-def.json --alias metamapper-dev</w:t>
             </w:r>
           </w:p>
         </w:tc>
@@ -7310,7 +6914,7 @@
                 <w:color w:val="181818"/>
                 <w:sz w:val="20"/>
               </w:rPr>
-              <w:t>Run tests</w:t>
+              <w:t>Deploy source</w:t>
             </w:r>
           </w:p>
         </w:tc>
@@ -7325,7 +6929,7 @@
                 <w:color w:val="181818"/>
                 <w:sz w:val="20"/>
               </w:rPr>
-              <w:t>sf apex run test --target-org &lt;alias&gt; --result-format human --code-coverage --wait 10</w:t>
+              <w:t>sf project deploy start --source-dir force-app --target-org &lt;alias&gt;</w:t>
             </w:r>
           </w:p>
         </w:tc>
@@ -7342,7 +6946,7 @@
                 <w:color w:val="181818"/>
                 <w:sz w:val="20"/>
               </w:rPr>
-              <w:t>Lint</w:t>
+              <w:t>Run tests</w:t>
             </w:r>
           </w:p>
         </w:tc>
@@ -7357,7 +6961,7 @@
                 <w:color w:val="181818"/>
                 <w:sz w:val="20"/>
               </w:rPr>
-              <w:t>npm run lint</w:t>
+              <w:t>sf apex run test --target-org &lt;alias&gt; --result-format human --code-coverage --wait 10</w:t>
             </w:r>
           </w:p>
         </w:tc>
@@ -7374,7 +6978,7 @@
                 <w:color w:val="181818"/>
                 <w:sz w:val="20"/>
               </w:rPr>
-              <w:t>Format</w:t>
+              <w:t>Lint</w:t>
             </w:r>
           </w:p>
         </w:tc>
@@ -7389,7 +6993,7 @@
                 <w:color w:val="181818"/>
                 <w:sz w:val="20"/>
               </w:rPr>
-              <w:t>npm run prettier</w:t>
+              <w:t>npm run lint</w:t>
             </w:r>
           </w:p>
         </w:tc>
@@ -7406,7 +7010,7 @@
                 <w:color w:val="181818"/>
                 <w:sz w:val="20"/>
               </w:rPr>
-              <w:t>Post-install</w:t>
+              <w:t>Format</w:t>
             </w:r>
           </w:p>
         </w:tc>
@@ -7414,6 +7018,38 @@
           <w:tcPr>
             <w:tcW w:type="dxa" w:w="4533"/>
             <w:shd w:val="clear" w:color="auto" w:fill="FFFFFF"/>
+          </w:tcPr>
+          <w:p>
+            <w:r>
+              <w:rPr>
+                <w:color w:val="181818"/>
+                <w:sz w:val="20"/>
+              </w:rPr>
+              <w:t>npm run prettier</w:t>
+            </w:r>
+          </w:p>
+        </w:tc>
+      </w:tr>
+      <w:tr>
+        <w:tc>
+          <w:tcPr>
+            <w:tcW w:type="dxa" w:w="4533"/>
+            <w:shd w:val="clear" w:color="auto" w:fill="F2F4F7"/>
+          </w:tcPr>
+          <w:p>
+            <w:r>
+              <w:rPr>
+                <w:color w:val="181818"/>
+                <w:sz w:val="20"/>
+              </w:rPr>
+              <w:t>Post-install</w:t>
+            </w:r>
+          </w:p>
+        </w:tc>
+        <w:tc>
+          <w:tcPr>
+            <w:tcW w:type="dxa" w:w="4533"/>
+            <w:shd w:val="clear" w:color="auto" w:fill="F2F4F7"/>
           </w:tcPr>
           <w:p>
             <w:r>
@@ -7428,20 +7064,6 @@
       </w:tr>
     </w:tbl>
     <w:p/>
-    <w:p>
-      <w:pPr>
-        <w:spacing w:after="80"/>
-      </w:pPr>
-      <w:r>
-        <w:rPr>
-          <w:b w:val="0"/>
-          <w:i/>
-          <w:color w:val="181818"/>
-          <w:sz w:val="21"/>
-        </w:rPr>
-        <w:t>GitHub target: energidi/claude-knowledge-base, path: projects/meta-mapper/. Deploy via raw git (gh CLI not available).</w:t>
-      </w:r>
-    </w:p>
     <w:p>
       <w:pPr>
         <w:pStyle w:val="Heading1"/>
@@ -7453,7 +7075,7 @@
           <w:color w:val="032D60"/>
           <w:sz w:val="36"/>
         </w:rPr>
-        <w:t>12. Known Limitations</w:t>
+        <w:t>13. Known Limitations</w:t>
       </w:r>
     </w:p>
     <w:p>
@@ -7475,7 +7097,7 @@
           <w:color w:val="181818"/>
           <w:sz w:val="21"/>
         </w:rPr>
-        <w:t>MetadataComponentDependency does not capture all dependency types. Supplemental handlers fill 5 of 6 known gaps. Dynamic Apex string references (gap 6) cannot be statically resolved - these are flagged with Is_Dynamic_Reference__c = true.</w:t>
+        <w:t>MetadataComponentDependency does not capture all dependency types. Supplemental handlers fill 5 of 6 known gaps. Dynamic Apex string references cannot be statically resolved - flagged with Is_Dynamic_Reference__c = true.</w:t>
       </w:r>
     </w:p>
     <w:p>
@@ -7503,7 +7125,7 @@
           <w:color w:val="181818"/>
           <w:sz w:val="21"/>
         </w:rPr>
-        <w:t>Active Flows Only mode excludes inactive Flow versions by design to preserve heap and reduce DML.</w:t>
+        <w:t>Active Flows Only mode excludes inactive Flow versions by design and triggers the 60% adaptive callout guardrail.</w:t>
       </w:r>
     </w:p>
     <w:p>
@@ -7531,7 +7153,7 @@
           <w:color w:val="181818"/>
           <w:sz w:val="21"/>
         </w:rPr>
-        <w:t>Tooling API minimum reliable version: v49.0 (MetadataComponentDependency). This app uses v66.0.</w:t>
+        <w:t>ECharts Static Resource must use echarts/dist/echarts.min.js (core minified, ~1.0-1.2MB). Full bundle exceeds Salesforce 5MB static resource limit.</w:t>
       </w:r>
     </w:p>
     <w:sectPr>

</xml_diff>

<commit_message>
MetaMapper v4: resolve all enterprise review issues
- Cycle detection: two-tier (DB dedup + Path__c ancestry). Shared/diamond
  dependencies no longer falsely flagged as circular.
- Cancellation: Status__c += Cancelled; cancelJob() @AuraEnabled; Queueable
  checks on entry and exits cooperatively.
- Callout guardrail: remaining-budget model with per-op headroom (QueryMore,
  Flow validation, retry splits). Replaces brittle percentage thresholds.
- IN chunking: character-budget driven (~100 IDs initial; split at >8KB URI).
- USER_MODE: controller boundary only. Engine uses SYSTEM_MODE.
- Retention: configurable via MetaMapper_Settings__mdt (default 72h).
- Scope fix: dynamic Apex refs labeled as permanent blind spot, not a gap.
- Test plan: 5 new scenarios (diamond graph, cancel, USER_MODE failure,
  partial resume, export dedup).

Co-Authored-By: Claude Sonnet 4.6 <noreply@anthropic.com>
</commit_message>
<xml_diff>
--- a/projects/meta-mapper/MetaMapper_Technical_Design.docx
+++ b/projects/meta-mapper/MetaMapper_Technical_Design.docx
@@ -38,7 +38,7 @@
           <w:color w:val="706E6B"/>
           <w:sz w:val="24"/>
         </w:rPr>
-        <w:t>Version 3.0  |  March 2026</w:t>
+        <w:t>Version 4.0  |  March 2026</w:t>
       </w:r>
     </w:p>
     <w:p/>
@@ -82,7 +82,7 @@
           <w:color w:val="032D60"/>
           <w:sz w:val="36"/>
         </w:rPr>
-        <w:t>1. Executive Summary &amp; Project Background</w:t>
+        <w:t>1. Executive Summary</w:t>
       </w:r>
     </w:p>
     <w:p>
@@ -104,7 +104,7 @@
           <w:color w:val="181818"/>
           <w:sz w:val="21"/>
         </w:rPr>
-        <w:t>MetaMapper is a native Salesforce change-intelligence application that safely maps and visualizes deep metadata dependencies using the Tooling API. It operates entirely within the Salesforce trust boundary - no external APIs, no CDN calls at runtime.</w:t>
+        <w:t>MetaMapper is a native Salesforce change-intelligence application that maps and visualizes deep metadata dependencies. It operates entirely within the Salesforce trust boundary - no external APIs, no CDN calls at runtime.</w:t>
       </w:r>
     </w:p>
     <w:p>
@@ -118,7 +118,7 @@
           <w:color w:val="181818"/>
           <w:sz w:val="21"/>
         </w:rPr>
-        <w:t>Version 3.0 resolves four critical design risks identified during technical review: the Visited_IDs__c field cap, the Active Flows double-callout trap, URI length limits, and the ECharts static resource size constraint.</w:t>
+        <w:t>Version 4.0 resolves all critical design risks identified in enterprise review: false-positive cycle detection, missing cancellation semantics, optimistic callout budgeting, over-broad USER_MODE, aggressive retention policy, and test coverage gaps.</w:t>
       </w:r>
     </w:p>
     <w:p>
@@ -132,7 +132,7 @@
           <w:color w:val="032D60"/>
           <w:sz w:val="36"/>
         </w:rPr>
-        <w:t>2. Critical Design Risk Resolutions (v3.0)</w:t>
+        <w:t>2. Design Risk Resolutions (v4.0)</w:t>
       </w:r>
     </w:p>
     <w:p>
@@ -145,6 +145,20 @@
     </w:p>
     <w:p>
       <w:pPr>
+        <w:pStyle w:val="Heading2"/>
+        <w:spacing w:before="240" w:after="120"/>
+      </w:pPr>
+      <w:r>
+        <w:rPr>
+          <w:b/>
+          <w:color w:val="0070D2"/>
+          <w:sz w:val="28"/>
+        </w:rPr>
+        <w:t>2.1 Cycle Detection - False Positives Fixed</w:t>
+      </w:r>
+    </w:p>
+    <w:p>
+      <w:pPr>
         <w:spacing w:after="80"/>
       </w:pPr>
       <w:r>
@@ -154,50 +168,7 @@
           <w:color w:val="181818"/>
           <w:sz w:val="21"/>
         </w:rPr>
-        <w:t>The following four issues were identified and resolved before implementation begins:</w:t>
-      </w:r>
-    </w:p>
-    <w:p>
-      <w:pPr>
-        <w:pStyle w:val="Heading2"/>
-        <w:spacing w:before="240" w:after="120"/>
-      </w:pPr>
-      <w:r>
-        <w:rPr>
-          <w:b/>
-          <w:color w:val="0070D2"/>
-          <w:sz w:val="28"/>
-        </w:rPr>
-        <w:t>Fix #1 - Cycle Detection: Visited_IDs__c Field Removed</w:t>
-      </w:r>
-    </w:p>
-    <w:p>
-      <w:pPr>
-        <w:spacing w:after="80"/>
-      </w:pPr>
-      <w:r>
-        <w:rPr>
-          <w:b w:val="0"/>
-          <w:i w:val="0"/>
-          <w:color w:val="181818"/>
-          <w:sz w:val="21"/>
-        </w:rPr>
-        <w:t>Original design stored a JSON-serialized Set&lt;String&gt; of processed Metadata IDs in a Long Text 131072 field on Dependency_Job__c.</w:t>
-      </w:r>
-    </w:p>
-    <w:p>
-      <w:pPr>
-        <w:spacing w:before="80" w:after="120"/>
-        <w:ind w:left="283"/>
-        <w:shd w:val="clear" w:color="auto" w:fill="F2F4F7"/>
-      </w:pPr>
-      <w:r>
-        <w:rPr>
-          <w:i/>
-          <w:color w:val="032D60"/>
-          <w:sz w:val="19"/>
-        </w:rPr>
-        <w:t>Risk: 131,072 chars / 22 chars per ID = ~5,957 ID cap. Enterprise orgs with deep dependency trees easily exceed this, causing StringException and crashing the entire Queueable chain.</w:t>
+        <w:t>Previous design: global visitedIds set marks ANY repeated node as circular. This incorrectly flags shared/diamond dependencies (node B reachable via A-&gt;B and C-&gt;B) - a valid and common pattern in real dependency graphs.</w:t>
       </w:r>
     </w:p>
     <w:p>
@@ -211,7 +182,226 @@
           <w:color w:val="181818"/>
           <w:sz w:val="21"/>
         </w:rPr>
-        <w:t>Resolution: Drop the field. At the start of each Queueable execution, query the database:</w:t>
+        <w:t>Fix: Two-tier separation</w:t>
+      </w:r>
+    </w:p>
+    <w:tbl>
+      <w:tblPr>
+        <w:tblStyle w:val="TableGrid"/>
+        <w:tblW w:type="auto" w:w="0"/>
+        <w:jc w:val="left"/>
+        <w:tblLook w:firstColumn="1" w:firstRow="1" w:lastColumn="0" w:lastRow="0" w:noHBand="0" w:noVBand="1" w:val="04A0"/>
+      </w:tblPr>
+      <w:tblGrid>
+        <w:gridCol w:w="2266"/>
+        <w:gridCol w:w="2266"/>
+        <w:gridCol w:w="2266"/>
+        <w:gridCol w:w="2266"/>
+      </w:tblGrid>
+      <w:tr>
+        <w:tc>
+          <w:tcPr>
+            <w:tcW w:type="dxa" w:w="2266"/>
+            <w:shd w:val="clear" w:color="auto" w:fill="032D60"/>
+          </w:tcPr>
+          <w:p>
+            <w:r>
+              <w:rPr>
+                <w:b/>
+                <w:color w:val="FFFFFF"/>
+                <w:sz w:val="20"/>
+              </w:rPr>
+              <w:t>Tier</w:t>
+            </w:r>
+          </w:p>
+        </w:tc>
+        <w:tc>
+          <w:tcPr>
+            <w:tcW w:type="dxa" w:w="2266"/>
+            <w:shd w:val="clear" w:color="auto" w:fill="032D60"/>
+          </w:tcPr>
+          <w:p>
+            <w:r>
+              <w:rPr>
+                <w:b/>
+                <w:color w:val="FFFFFF"/>
+                <w:sz w:val="20"/>
+              </w:rPr>
+              <w:t>Purpose</w:t>
+            </w:r>
+          </w:p>
+        </w:tc>
+        <w:tc>
+          <w:tcPr>
+            <w:tcW w:type="dxa" w:w="2266"/>
+            <w:shd w:val="clear" w:color="auto" w:fill="032D60"/>
+          </w:tcPr>
+          <w:p>
+            <w:r>
+              <w:rPr>
+                <w:b/>
+                <w:color w:val="FFFFFF"/>
+                <w:sz w:val="20"/>
+              </w:rPr>
+              <w:t>Mechanism</w:t>
+            </w:r>
+          </w:p>
+        </w:tc>
+        <w:tc>
+          <w:tcPr>
+            <w:tcW w:type="dxa" w:w="2266"/>
+            <w:shd w:val="clear" w:color="auto" w:fill="032D60"/>
+          </w:tcPr>
+          <w:p>
+            <w:r>
+              <w:rPr>
+                <w:b/>
+                <w:color w:val="FFFFFF"/>
+                <w:sz w:val="20"/>
+              </w:rPr>
+              <w:t>Marks Circular?</w:t>
+            </w:r>
+          </w:p>
+        </w:tc>
+      </w:tr>
+      <w:tr>
+        <w:tc>
+          <w:tcPr>
+            <w:tcW w:type="dxa" w:w="2266"/>
+            <w:shd w:val="clear" w:color="auto" w:fill="F2F4F7"/>
+          </w:tcPr>
+          <w:p>
+            <w:r>
+              <w:rPr>
+                <w:color w:val="181818"/>
+                <w:sz w:val="20"/>
+              </w:rPr>
+              <w:t>Deduplication</w:t>
+            </w:r>
+          </w:p>
+        </w:tc>
+        <w:tc>
+          <w:tcPr>
+            <w:tcW w:type="dxa" w:w="2266"/>
+            <w:shd w:val="clear" w:color="auto" w:fill="F2F4F7"/>
+          </w:tcPr>
+          <w:p>
+            <w:r>
+              <w:rPr>
+                <w:color w:val="181818"/>
+                <w:sz w:val="20"/>
+              </w:rPr>
+              <w:t>Avoid re-processing already-inserted nodes</w:t>
+            </w:r>
+          </w:p>
+        </w:tc>
+        <w:tc>
+          <w:tcPr>
+            <w:tcW w:type="dxa" w:w="2266"/>
+            <w:shd w:val="clear" w:color="auto" w:fill="F2F4F7"/>
+          </w:tcPr>
+          <w:p>
+            <w:r>
+              <w:rPr>
+                <w:color w:val="181818"/>
+                <w:sz w:val="20"/>
+              </w:rPr>
+              <w:t>DB query: SELECT Metadata_ID__c FROM Dependency_Node__c WHERE Dependency_Job__c = :jobId</w:t>
+            </w:r>
+          </w:p>
+        </w:tc>
+        <w:tc>
+          <w:tcPr>
+            <w:tcW w:type="dxa" w:w="2266"/>
+            <w:shd w:val="clear" w:color="auto" w:fill="F2F4F7"/>
+          </w:tcPr>
+          <w:p>
+            <w:r>
+              <w:rPr>
+                <w:color w:val="181818"/>
+                <w:sz w:val="20"/>
+              </w:rPr>
+              <w:t>NO - skip insertion only</w:t>
+            </w:r>
+          </w:p>
+        </w:tc>
+      </w:tr>
+      <w:tr>
+        <w:tc>
+          <w:tcPr>
+            <w:tcW w:type="dxa" w:w="2266"/>
+            <w:shd w:val="clear" w:color="auto" w:fill="FFFFFF"/>
+          </w:tcPr>
+          <w:p>
+            <w:r>
+              <w:rPr>
+                <w:color w:val="181818"/>
+                <w:sz w:val="20"/>
+              </w:rPr>
+              <w:t>True cycle detection</w:t>
+            </w:r>
+          </w:p>
+        </w:tc>
+        <w:tc>
+          <w:tcPr>
+            <w:tcW w:type="dxa" w:w="2266"/>
+            <w:shd w:val="clear" w:color="auto" w:fill="FFFFFF"/>
+          </w:tcPr>
+          <w:p>
+            <w:r>
+              <w:rPr>
+                <w:color w:val="181818"/>
+                <w:sz w:val="20"/>
+              </w:rPr>
+              <w:t>Detect A-&gt;B-&gt;A ancestry cycles</w:t>
+            </w:r>
+          </w:p>
+        </w:tc>
+        <w:tc>
+          <w:tcPr>
+            <w:tcW w:type="dxa" w:w="2266"/>
+            <w:shd w:val="clear" w:color="auto" w:fill="FFFFFF"/>
+          </w:tcPr>
+          <w:p>
+            <w:r>
+              <w:rPr>
+                <w:color w:val="181818"/>
+                <w:sz w:val="20"/>
+              </w:rPr>
+              <w:t>Path__c field: pipe-delimited ancestor chain on each node</w:t>
+            </w:r>
+          </w:p>
+        </w:tc>
+        <w:tc>
+          <w:tcPr>
+            <w:tcW w:type="dxa" w:w="2266"/>
+            <w:shd w:val="clear" w:color="auto" w:fill="FFFFFF"/>
+          </w:tcPr>
+          <w:p>
+            <w:r>
+              <w:rPr>
+                <w:color w:val="181818"/>
+                <w:sz w:val="20"/>
+              </w:rPr>
+              <w:t>YES - only when Metadata_ID__c appears in its own ancestor path</w:t>
+            </w:r>
+          </w:p>
+        </w:tc>
+      </w:tr>
+    </w:tbl>
+    <w:p/>
+    <w:p>
+      <w:pPr>
+        <w:spacing w:after="80"/>
+      </w:pPr>
+      <w:r>
+        <w:rPr>
+          <w:b w:val="0"/>
+          <w:i w:val="0"/>
+          <w:color w:val="181818"/>
+          <w:sz w:val="21"/>
+        </w:rPr>
+        <w:t>Path__c field on Dependency_Node__c stores the ancestor chain. When inserting a child:</w:t>
       </w:r>
     </w:p>
     <w:p>
@@ -226,19 +416,40 @@
           <w:color w:val="1E1E2E"/>
           <w:sz w:val="18"/>
         </w:rPr>
-        <w:t>Set&lt;String&gt; visitedIds = new Set&lt;String&gt;();</w:t>
+        <w:t>child.Path__c = parent.Path__c + '|' + parent.Metadata_ID__c;</w:t>
         <w:br/>
-        <w:t>for (Dependency_Node__c n : [</w:t>
+        <w:t>Boolean isCycle = parent.Path__c != null</w:t>
         <w:br/>
-        <w:t xml:space="preserve">    SELECT Metadata_ID__c FROM Dependency_Node__c</w:t>
-        <w:br/>
-        <w:t xml:space="preserve">    WHERE Dependency_Job__c = :jobId</w:t>
-        <w:br/>
-        <w:t>]) {</w:t>
-        <w:br/>
-        <w:t xml:space="preserve">    visitedIds.add(n.Metadata_ID__c);</w:t>
-        <w:br/>
-        <w:t>}</w:t>
+        <w:t xml:space="preserve">    &amp;&amp; parent.Path__c.contains(childMetadataId);</w:t>
+      </w:r>
+    </w:p>
+    <w:p>
+      <w:pPr>
+        <w:spacing w:before="60" w:after="120"/>
+        <w:ind w:left="283"/>
+        <w:shd w:val="clear" w:color="auto" w:fill="EFF4FB"/>
+      </w:pPr>
+      <w:r>
+        <w:rPr>
+          <w:i/>
+          <w:color w:val="032D60"/>
+          <w:sz w:val="19"/>
+        </w:rPr>
+        <w:t>Path__c capacity: depth-1,500 path = ~28,500 chars, within Long Text 32768. Deeper trees are not realistic.</w:t>
+      </w:r>
+    </w:p>
+    <w:p>
+      <w:pPr>
+        <w:pStyle w:val="Heading2"/>
+        <w:spacing w:before="240" w:after="120"/>
+      </w:pPr>
+      <w:r>
+        <w:rPr>
+          <w:b/>
+          <w:color w:val="0070D2"/>
+          <w:sz w:val="28"/>
+        </w:rPr>
+        <w:t>2.2 Cancellation - Cooperative Stop Defined</w:t>
       </w:r>
     </w:p>
     <w:p>
@@ -252,7 +463,77 @@
           <w:color w:val="181818"/>
           <w:sz w:val="21"/>
         </w:rPr>
-        <w:t>This costs one SOQL query per execution but scales to any tree depth. The database is the source of truth - no field write-back required. Circular nodes are inserted with Is_Circular__c = true and Is_Processed__c = true.</w:t>
+        <w:t>Previous design: Cancel Job button shown in UI with no backend implementation.</w:t>
+      </w:r>
+    </w:p>
+    <w:p>
+      <w:pPr>
+        <w:spacing w:after="80"/>
+      </w:pPr>
+      <w:r>
+        <w:rPr>
+          <w:b/>
+          <w:i w:val="0"/>
+          <w:color w:val="181818"/>
+          <w:sz w:val="21"/>
+        </w:rPr>
+        <w:t>Fix:</w:t>
+      </w:r>
+    </w:p>
+    <w:p>
+      <w:pPr>
+        <w:pStyle w:val="ListBullet"/>
+        <w:spacing w:after="40"/>
+        <w:ind w:left="283"/>
+      </w:pPr>
+      <w:r>
+        <w:rPr>
+          <w:color w:val="181818"/>
+          <w:sz w:val="21"/>
+        </w:rPr>
+        <w:t>Status__c picklist gains a Cancelled value.</w:t>
+      </w:r>
+    </w:p>
+    <w:p>
+      <w:pPr>
+        <w:pStyle w:val="ListBullet"/>
+        <w:spacing w:after="40"/>
+        <w:ind w:left="283"/>
+      </w:pPr>
+      <w:r>
+        <w:rPr>
+          <w:color w:val="181818"/>
+          <w:sz w:val="21"/>
+        </w:rPr>
+        <w:t>cancelJob(String jobId) @AuraEnabled method in DependencyJobController sets Status__c = Cancelled (WITH USER_MODE).</w:t>
+      </w:r>
+    </w:p>
+    <w:p>
+      <w:pPr>
+        <w:pStyle w:val="ListBullet"/>
+        <w:spacing w:after="40"/>
+        <w:ind w:left="283"/>
+      </w:pPr>
+      <w:r>
+        <w:rPr>
+          <w:color w:val="181818"/>
+          <w:sz w:val="21"/>
+        </w:rPr>
+        <w:t>DependencyQueueable.execute() checks Status__c as its FIRST operation. If Cancelled, exit immediately without enqueuing a successor.</w:t>
+      </w:r>
+    </w:p>
+    <w:p>
+      <w:pPr>
+        <w:pStyle w:val="ListBullet"/>
+        <w:spacing w:after="40"/>
+        <w:ind w:left="283"/>
+      </w:pPr>
+      <w:r>
+        <w:rPr>
+          <w:color w:val="181818"/>
+          <w:sz w:val="21"/>
+        </w:rPr>
+        <w:t>Queueables already in the flex queue will check on entry and terminate cooperatively. Salesforce provides no force-kill mechanism.</w:t>
       </w:r>
     </w:p>
     <w:p>
@@ -266,7 +547,7 @@
           <w:color w:val="0070D2"/>
           <w:sz w:val="28"/>
         </w:rPr>
-        <w:t>Fix #2 - Active Flows: Adaptive Callout Guardrail</w:t>
+        <w:t>2.3 Callout Guardrail - Remaining-Budget Model</w:t>
       </w:r>
     </w:p>
     <w:p>
@@ -280,22 +561,7 @@
           <w:color w:val="181818"/>
           <w:sz w:val="21"/>
         </w:rPr>
-        <w:t>Original design used a flat 80% callout threshold for the Queueable limit guardrail.</w:t>
-      </w:r>
-    </w:p>
-    <w:p>
-      <w:pPr>
-        <w:spacing w:before="80" w:after="120"/>
-        <w:ind w:left="283"/>
-        <w:shd w:val="clear" w:color="auto" w:fill="F2F4F7"/>
-      </w:pPr>
-      <w:r>
-        <w:rPr>
-          <w:i/>
-          <w:color w:val="032D60"/>
-          <w:sz w:val="19"/>
-        </w:rPr>
-        <w:t>Risk: MetadataComponentDependency does not return Flow status. When Active_Flows_Only__c = true, DependencyService must issue a second Tooling API callout per batch to query Flow WHERE Status = Active. This doubles callout consumption for Flow-heavy batches, reaching the 100-callout limit twice as fast.</w:t>
+        <w:t>Previous design: fixed 60%/80% percentage thresholds. These do not account for QueryMore, Flow validation callouts, or retry splits that may still be needed in the current transaction.</w:t>
       </w:r>
     </w:p>
     <w:p>
@@ -309,7 +575,7 @@
           <w:color w:val="181818"/>
           <w:sz w:val="21"/>
         </w:rPr>
-        <w:t>Resolution: Adaptive threshold based on batch content:</w:t>
+        <w:t>Fix: explicit remaining-callout budget with per-operation headroom:</w:t>
       </w:r>
     </w:p>
     <w:p>
@@ -324,14 +590,17 @@
           <w:color w:val="1E1E2E"/>
           <w:sz w:val="18"/>
         </w:rPr>
-        <w:t>Boolean hasFlowNodes = /* batch contains Flow-type nodes */;</w:t>
+        <w:t>Integer remaining = Limits.getLimitCallouts() - Limits.getCallouts();</w:t>
         <w:br/>
-        <w:t>Decimal calloutThreshold = (job.Active_Flows_Only__c &amp;&amp; hasFlowNodes) ? 0.60 : 0.80;</w:t>
+        <w:t>Integer headroom = 2                          // base buffer</w:t>
         <w:br/>
+        <w:t xml:space="preserve">    + (queryMorePossible ? 1 : 0)             // nextRecordsUrl follow-up</w:t>
         <w:br/>
-        <w:t>if (Limits.getCallouts() &gt;= Limits.getLimitCallouts() * calloutThreshold</w:t>
+        <w:t xml:space="preserve">    + (needsFlowValidation ? 1 : 0)           // Flow status callout</w:t>
         <w:br/>
-        <w:t xml:space="preserve">    || Limits.getHeapSize() &gt;= Limits.getLimitHeapSize() * 0.80) {</w:t>
+        <w:t xml:space="preserve">    + 2;                                       // 414/431 retry splits</w:t>
+        <w:br/>
+        <w:t>if (remaining &lt; headroom || Limits.getHeapSize() &gt;= Limits.getLimitHeapSize() * 0.80) {</w:t>
         <w:br/>
         <w:t xml:space="preserve">    System.enqueueJob(new DependencyQueueable(jobId));</w:t>
         <w:br/>
@@ -351,7 +620,7 @@
           <w:color w:val="0070D2"/>
           <w:sz w:val="28"/>
         </w:rPr>
-        <w:t>Fix #3 - Tooling API URI Length: 100-ID Chunk (Validated)</w:t>
+        <w:t>2.4 IN Clause Chunking - Character-Budget Driven</w:t>
       </w:r>
     </w:p>
     <w:p>
@@ -365,22 +634,42 @@
           <w:color w:val="181818"/>
           <w:sz w:val="21"/>
         </w:rPr>
-        <w:t>The design chunks Tooling API IN clauses to 100 IDs per query. This is validated as correct.</w:t>
+        <w:t>Previous design: hard-coded 100 IDs as universal safe limit. URI length also depends on the SOQL string, encoding, and exact ID values.</w:t>
       </w:r>
     </w:p>
     <w:p>
       <w:pPr>
-        <w:spacing w:before="80" w:after="120"/>
-        <w:ind w:left="283"/>
-        <w:shd w:val="clear" w:color="auto" w:fill="F2F4F7"/>
+        <w:spacing w:after="80"/>
       </w:pPr>
       <w:r>
         <w:rPr>
-          <w:i/>
-          <w:color w:val="032D60"/>
-          <w:sz w:val="19"/>
+          <w:b/>
+          <w:i w:val="0"/>
+          <w:color w:val="181818"/>
+          <w:sz w:val="21"/>
         </w:rPr>
-        <w:t>Context: Salesforce REST GET requests embed the SOQL in the URL. Servers typically cap URLs at 16KB-32KB. 1,000 IDs in a single IN clause would easily exceed this, producing HTTP 414 (URI Too Long). sfdc-soup confirmed 100 is the production-safe limit. No change needed - this was already correct.</w:t>
+        <w:t>Fix: estimate URL length before sending; split by character budget, not fixed count. Use 100 IDs as the initial batch estimate, then check:</w:t>
+      </w:r>
+    </w:p>
+    <w:p>
+      <w:pPr>
+        <w:spacing w:before="60" w:after="60"/>
+        <w:ind w:left="454"/>
+        <w:shd w:val="clear" w:color="auto" w:fill="EAECF0"/>
+      </w:pPr>
+      <w:r>
+        <w:rPr>
+          <w:rFonts w:ascii="Courier New" w:hAnsi="Courier New"/>
+          <w:color w:val="1E1E2E"/>
+          <w:sz w:val="18"/>
+        </w:rPr>
+        <w:t>String soql = buildQueryString(idBatch);</w:t>
+        <w:br/>
+        <w:t>if (soql.length() &gt; 8000) {  // 8KB URI budget</w:t>
+        <w:br/>
+        <w:t xml:space="preserve">    // Split batch in half and process each separately</w:t>
+        <w:br/>
+        <w:t>}</w:t>
       </w:r>
     </w:p>
     <w:p>
@@ -394,7 +683,7 @@
           <w:color w:val="0070D2"/>
           <w:sz w:val="28"/>
         </w:rPr>
-        <w:t>Fix #4 - ECharts Static Resource: Core Minified Build Only</w:t>
+        <w:t>2.5 USER_MODE - Applied at Controller Boundary Only</w:t>
       </w:r>
     </w:p>
     <w:p>
@@ -408,22 +697,7 @@
           <w:color w:val="181818"/>
           <w:sz w:val="21"/>
         </w:rPr>
-        <w:t>Original design referenced "bundled echarts.min.js" without specifying the build variant.</w:t>
-      </w:r>
-    </w:p>
-    <w:p>
-      <w:pPr>
-        <w:spacing w:before="80" w:after="120"/>
-        <w:ind w:left="283"/>
-        <w:shd w:val="clear" w:color="auto" w:fill="F2F4F7"/>
-      </w:pPr>
-      <w:r>
-        <w:rPr>
-          <w:i/>
-          <w:color w:val="032D60"/>
-          <w:sz w:val="19"/>
-        </w:rPr>
-        <w:t>Risk: Salesforce enforces a hard 5MB limit per Static Resource. The full Apache ECharts bundle (with maps, 3D extensions, and all chart types) can approach or exceed this limit.</w:t>
+        <w:t>Previous design: USER_MODE applied to all Apex DML/SOQL including engine internals.</w:t>
       </w:r>
     </w:p>
     <w:p>
@@ -437,7 +711,487 @@
           <w:color w:val="181818"/>
           <w:sz w:val="21"/>
         </w:rPr>
-        <w:t>Resolution: Use echarts/dist/echarts.min.js exclusively - the core minified build (~1.0-1.2MB). Source it from the npm package after npm install echarts. Do not use the full bundle. Do not download from CDN.</w:t>
+        <w:t>Fix:</w:t>
+      </w:r>
+    </w:p>
+    <w:tbl>
+      <w:tblPr>
+        <w:tblStyle w:val="TableGrid"/>
+        <w:tblW w:type="auto" w:w="0"/>
+        <w:jc w:val="left"/>
+        <w:tblLook w:firstColumn="1" w:firstRow="1" w:lastColumn="0" w:lastRow="0" w:noHBand="0" w:noVBand="1" w:val="04A0"/>
+      </w:tblPr>
+      <w:tblGrid>
+        <w:gridCol w:w="3022"/>
+        <w:gridCol w:w="3022"/>
+        <w:gridCol w:w="3022"/>
+      </w:tblGrid>
+      <w:tr>
+        <w:tc>
+          <w:tcPr>
+            <w:tcW w:type="dxa" w:w="3022"/>
+            <w:shd w:val="clear" w:color="auto" w:fill="032D60"/>
+          </w:tcPr>
+          <w:p>
+            <w:r>
+              <w:rPr>
+                <w:b/>
+                <w:color w:val="FFFFFF"/>
+                <w:sz w:val="20"/>
+              </w:rPr>
+              <w:t>Layer</w:t>
+            </w:r>
+          </w:p>
+        </w:tc>
+        <w:tc>
+          <w:tcPr>
+            <w:tcW w:type="dxa" w:w="3022"/>
+            <w:shd w:val="clear" w:color="auto" w:fill="032D60"/>
+          </w:tcPr>
+          <w:p>
+            <w:r>
+              <w:rPr>
+                <w:b/>
+                <w:color w:val="FFFFFF"/>
+                <w:sz w:val="20"/>
+              </w:rPr>
+              <w:t>Mode</w:t>
+            </w:r>
+          </w:p>
+        </w:tc>
+        <w:tc>
+          <w:tcPr>
+            <w:tcW w:type="dxa" w:w="3022"/>
+            <w:shd w:val="clear" w:color="auto" w:fill="032D60"/>
+          </w:tcPr>
+          <w:p>
+            <w:r>
+              <w:rPr>
+                <w:b/>
+                <w:color w:val="FFFFFF"/>
+                <w:sz w:val="20"/>
+              </w:rPr>
+              <w:t>Reason</w:t>
+            </w:r>
+          </w:p>
+        </w:tc>
+      </w:tr>
+      <w:tr>
+        <w:tc>
+          <w:tcPr>
+            <w:tcW w:type="dxa" w:w="3022"/>
+            <w:shd w:val="clear" w:color="auto" w:fill="F2F4F7"/>
+          </w:tcPr>
+          <w:p>
+            <w:r>
+              <w:rPr>
+                <w:color w:val="181818"/>
+                <w:sz w:val="20"/>
+              </w:rPr>
+              <w:t>@AuraEnabled controller methods</w:t>
+            </w:r>
+          </w:p>
+        </w:tc>
+        <w:tc>
+          <w:tcPr>
+            <w:tcW w:type="dxa" w:w="3022"/>
+            <w:shd w:val="clear" w:color="auto" w:fill="F2F4F7"/>
+          </w:tcPr>
+          <w:p>
+            <w:r>
+              <w:rPr>
+                <w:color w:val="181818"/>
+                <w:sz w:val="20"/>
+              </w:rPr>
+              <w:t>WITH USER_MODE</w:t>
+            </w:r>
+          </w:p>
+        </w:tc>
+        <w:tc>
+          <w:tcPr>
+            <w:tcW w:type="dxa" w:w="3022"/>
+            <w:shd w:val="clear" w:color="auto" w:fill="F2F4F7"/>
+          </w:tcPr>
+          <w:p>
+            <w:r>
+              <w:rPr>
+                <w:color w:val="181818"/>
+                <w:sz w:val="20"/>
+              </w:rPr>
+              <w:t>Enforces FLS/CRUD for user-facing data access</w:t>
+            </w:r>
+          </w:p>
+        </w:tc>
+      </w:tr>
+      <w:tr>
+        <w:tc>
+          <w:tcPr>
+            <w:tcW w:type="dxa" w:w="3022"/>
+            <w:shd w:val="clear" w:color="auto" w:fill="FFFFFF"/>
+          </w:tcPr>
+          <w:p>
+            <w:r>
+              <w:rPr>
+                <w:color w:val="181818"/>
+                <w:sz w:val="20"/>
+              </w:rPr>
+              <w:t>DependencyQueueable engine</w:t>
+            </w:r>
+          </w:p>
+        </w:tc>
+        <w:tc>
+          <w:tcPr>
+            <w:tcW w:type="dxa" w:w="3022"/>
+            <w:shd w:val="clear" w:color="auto" w:fill="FFFFFF"/>
+          </w:tcPr>
+          <w:p>
+            <w:r>
+              <w:rPr>
+                <w:color w:val="181818"/>
+                <w:sz w:val="20"/>
+              </w:rPr>
+              <w:t>SYSTEM_MODE (default)</w:t>
+            </w:r>
+          </w:p>
+        </w:tc>
+        <w:tc>
+          <w:tcPr>
+            <w:tcW w:type="dxa" w:w="3022"/>
+            <w:shd w:val="clear" w:color="auto" w:fill="FFFFFF"/>
+          </w:tcPr>
+          <w:p>
+            <w:r>
+              <w:rPr>
+                <w:color w:val="181818"/>
+                <w:sz w:val="20"/>
+              </w:rPr>
+              <w:t>Reliable internal orchestration; permission failures here are implementation bugs, not security requirements</w:t>
+            </w:r>
+          </w:p>
+        </w:tc>
+      </w:tr>
+      <w:tr>
+        <w:tc>
+          <w:tcPr>
+            <w:tcW w:type="dxa" w:w="3022"/>
+            <w:shd w:val="clear" w:color="auto" w:fill="F2F4F7"/>
+          </w:tcPr>
+          <w:p>
+            <w:r>
+              <w:rPr>
+                <w:color w:val="181818"/>
+                <w:sz w:val="20"/>
+              </w:rPr>
+              <w:t>DependencyCleanupBatch</w:t>
+            </w:r>
+          </w:p>
+        </w:tc>
+        <w:tc>
+          <w:tcPr>
+            <w:tcW w:type="dxa" w:w="3022"/>
+            <w:shd w:val="clear" w:color="auto" w:fill="F2F4F7"/>
+          </w:tcPr>
+          <w:p>
+            <w:r>
+              <w:rPr>
+                <w:color w:val="181818"/>
+                <w:sz w:val="20"/>
+              </w:rPr>
+              <w:t>SYSTEM_MODE (default)</w:t>
+            </w:r>
+          </w:p>
+        </w:tc>
+        <w:tc>
+          <w:tcPr>
+            <w:tcW w:type="dxa" w:w="3022"/>
+            <w:shd w:val="clear" w:color="auto" w:fill="F2F4F7"/>
+          </w:tcPr>
+          <w:p>
+            <w:r>
+              <w:rPr>
+                <w:color w:val="181818"/>
+                <w:sz w:val="20"/>
+              </w:rPr>
+              <w:t>Admin-scheduled maintenance; must succeed regardless of running-user permissions</w:t>
+            </w:r>
+          </w:p>
+        </w:tc>
+      </w:tr>
+      <w:tr>
+        <w:tc>
+          <w:tcPr>
+            <w:tcW w:type="dxa" w:w="3022"/>
+            <w:shd w:val="clear" w:color="auto" w:fill="FFFFFF"/>
+          </w:tcPr>
+          <w:p>
+            <w:r>
+              <w:rPr>
+                <w:color w:val="181818"/>
+                <w:sz w:val="20"/>
+              </w:rPr>
+              <w:t>DependencyNotificationService</w:t>
+            </w:r>
+          </w:p>
+        </w:tc>
+        <w:tc>
+          <w:tcPr>
+            <w:tcW w:type="dxa" w:w="3022"/>
+            <w:shd w:val="clear" w:color="auto" w:fill="FFFFFF"/>
+          </w:tcPr>
+          <w:p>
+            <w:r>
+              <w:rPr>
+                <w:color w:val="181818"/>
+                <w:sz w:val="20"/>
+              </w:rPr>
+              <w:t>SYSTEM_MODE (default)</w:t>
+            </w:r>
+          </w:p>
+        </w:tc>
+        <w:tc>
+          <w:tcPr>
+            <w:tcW w:type="dxa" w:w="3022"/>
+            <w:shd w:val="clear" w:color="auto" w:fill="FFFFFF"/>
+          </w:tcPr>
+          <w:p>
+            <w:r>
+              <w:rPr>
+                <w:color w:val="181818"/>
+                <w:sz w:val="20"/>
+              </w:rPr>
+              <w:t>Internal async operation</w:t>
+            </w:r>
+          </w:p>
+        </w:tc>
+      </w:tr>
+    </w:tbl>
+    <w:p/>
+    <w:p>
+      <w:pPr>
+        <w:pStyle w:val="Heading2"/>
+        <w:spacing w:before="240" w:after="120"/>
+      </w:pPr>
+      <w:r>
+        <w:rPr>
+          <w:b/>
+          <w:color w:val="0070D2"/>
+          <w:sz w:val="28"/>
+        </w:rPr>
+        <w:t>2.6 Retention Policy - Configurable via Custom Metadata</w:t>
+      </w:r>
+    </w:p>
+    <w:p>
+      <w:pPr>
+        <w:spacing w:after="80"/>
+      </w:pPr>
+      <w:r>
+        <w:rPr>
+          <w:b w:val="0"/>
+          <w:i w:val="0"/>
+          <w:color w:val="181818"/>
+          <w:sz w:val="21"/>
+        </w:rPr>
+        <w:t>Previous design: hard-coded 24-hour hard delete. Inappropriate for a diagnostic tool where admins need to inspect failed runs.</w:t>
+      </w:r>
+    </w:p>
+    <w:p>
+      <w:pPr>
+        <w:spacing w:after="80"/>
+      </w:pPr>
+      <w:r>
+        <w:rPr>
+          <w:b/>
+          <w:i w:val="0"/>
+          <w:color w:val="181818"/>
+          <w:sz w:val="21"/>
+        </w:rPr>
+        <w:t>Fix: MetaMapper_Settings__mdt Custom Metadata (single record Default):</w:t>
+      </w:r>
+    </w:p>
+    <w:tbl>
+      <w:tblPr>
+        <w:tblStyle w:val="TableGrid"/>
+        <w:tblW w:type="auto" w:w="0"/>
+        <w:jc w:val="left"/>
+        <w:tblLook w:firstColumn="1" w:firstRow="1" w:lastColumn="0" w:lastRow="0" w:noHBand="0" w:noVBand="1" w:val="04A0"/>
+      </w:tblPr>
+      <w:tblGrid>
+        <w:gridCol w:w="2266"/>
+        <w:gridCol w:w="2266"/>
+        <w:gridCol w:w="2266"/>
+        <w:gridCol w:w="2266"/>
+      </w:tblGrid>
+      <w:tr>
+        <w:tc>
+          <w:tcPr>
+            <w:tcW w:type="dxa" w:w="2266"/>
+            <w:shd w:val="clear" w:color="auto" w:fill="032D60"/>
+          </w:tcPr>
+          <w:p>
+            <w:r>
+              <w:rPr>
+                <w:b/>
+                <w:color w:val="FFFFFF"/>
+                <w:sz w:val="20"/>
+              </w:rPr>
+              <w:t>Field</w:t>
+            </w:r>
+          </w:p>
+        </w:tc>
+        <w:tc>
+          <w:tcPr>
+            <w:tcW w:type="dxa" w:w="2266"/>
+            <w:shd w:val="clear" w:color="auto" w:fill="032D60"/>
+          </w:tcPr>
+          <w:p>
+            <w:r>
+              <w:rPr>
+                <w:b/>
+                <w:color w:val="FFFFFF"/>
+                <w:sz w:val="20"/>
+              </w:rPr>
+              <w:t>Type</w:t>
+            </w:r>
+          </w:p>
+        </w:tc>
+        <w:tc>
+          <w:tcPr>
+            <w:tcW w:type="dxa" w:w="2266"/>
+            <w:shd w:val="clear" w:color="auto" w:fill="032D60"/>
+          </w:tcPr>
+          <w:p>
+            <w:r>
+              <w:rPr>
+                <w:b/>
+                <w:color w:val="FFFFFF"/>
+                <w:sz w:val="20"/>
+              </w:rPr>
+              <w:t>Default</w:t>
+            </w:r>
+          </w:p>
+        </w:tc>
+        <w:tc>
+          <w:tcPr>
+            <w:tcW w:type="dxa" w:w="2266"/>
+            <w:shd w:val="clear" w:color="auto" w:fill="032D60"/>
+          </w:tcPr>
+          <w:p>
+            <w:r>
+              <w:rPr>
+                <w:b/>
+                <w:color w:val="FFFFFF"/>
+                <w:sz w:val="20"/>
+              </w:rPr>
+              <w:t>Notes</w:t>
+            </w:r>
+          </w:p>
+        </w:tc>
+      </w:tr>
+      <w:tr>
+        <w:tc>
+          <w:tcPr>
+            <w:tcW w:type="dxa" w:w="2266"/>
+            <w:shd w:val="clear" w:color="auto" w:fill="F2F4F7"/>
+          </w:tcPr>
+          <w:p>
+            <w:r>
+              <w:rPr>
+                <w:color w:val="181818"/>
+                <w:sz w:val="20"/>
+              </w:rPr>
+              <w:t>Retention_Hours__c</w:t>
+            </w:r>
+          </w:p>
+        </w:tc>
+        <w:tc>
+          <w:tcPr>
+            <w:tcW w:type="dxa" w:w="2266"/>
+            <w:shd w:val="clear" w:color="auto" w:fill="F2F4F7"/>
+          </w:tcPr>
+          <w:p>
+            <w:r>
+              <w:rPr>
+                <w:color w:val="181818"/>
+                <w:sz w:val="20"/>
+              </w:rPr>
+              <w:t>Number</w:t>
+            </w:r>
+          </w:p>
+        </w:tc>
+        <w:tc>
+          <w:tcPr>
+            <w:tcW w:type="dxa" w:w="2266"/>
+            <w:shd w:val="clear" w:color="auto" w:fill="F2F4F7"/>
+          </w:tcPr>
+          <w:p>
+            <w:r>
+              <w:rPr>
+                <w:color w:val="181818"/>
+                <w:sz w:val="20"/>
+              </w:rPr>
+              <w:t>72</w:t>
+            </w:r>
+          </w:p>
+        </w:tc>
+        <w:tc>
+          <w:tcPr>
+            <w:tcW w:type="dxa" w:w="2266"/>
+            <w:shd w:val="clear" w:color="auto" w:fill="F2F4F7"/>
+          </w:tcPr>
+          <w:p>
+            <w:r>
+              <w:rPr>
+                <w:color w:val="181818"/>
+                <w:sz w:val="20"/>
+              </w:rPr>
+              <w:t>Hours before job deletion. DependencyCleanupBatch reads at runtime.</w:t>
+            </w:r>
+          </w:p>
+        </w:tc>
+      </w:tr>
+    </w:tbl>
+    <w:p/>
+    <w:p>
+      <w:pPr>
+        <w:spacing w:before="60" w:after="120"/>
+        <w:ind w:left="283"/>
+        <w:shd w:val="clear" w:color="auto" w:fill="EFF4FB"/>
+      </w:pPr>
+      <w:r>
+        <w:rPr>
+          <w:i/>
+          <w:color w:val="032D60"/>
+          <w:sz w:val="19"/>
+        </w:rPr>
+        <w:t>Recommended minimum: 72 hours for enterprise diagnostic use. Hard-delete with cascade via Master-Detail is retained for storage management.</w:t>
+      </w:r>
+    </w:p>
+    <w:p>
+      <w:pPr>
+        <w:pStyle w:val="Heading2"/>
+        <w:spacing w:before="240" w:after="120"/>
+      </w:pPr>
+      <w:r>
+        <w:rPr>
+          <w:b/>
+          <w:color w:val="0070D2"/>
+          <w:sz w:val="28"/>
+        </w:rPr>
+        <w:t>2.7 Scope Consistency - Dynamic Refs Are a Permanent Blind Spot</w:t>
+      </w:r>
+    </w:p>
+    <w:p>
+      <w:pPr>
+        <w:spacing w:after="80"/>
+      </w:pPr>
+      <w:r>
+        <w:rPr>
+          <w:b w:val="0"/>
+          <w:i w:val="0"/>
+          <w:color w:val="181818"/>
+          <w:sz w:val="21"/>
+        </w:rPr>
+        <w:t>Supplemental handlers fill 5 known static gaps in MetadataComponentDependency coverage. Dynamic Apex string references are NOT a gap that can be closed by any supplemental query - they are an inherent Salesforce platform limitation. They are flagged with Is_Dynamic_Reference__c = true and documented as a permanent blind spot, not a pending enhancement.</w:t>
       </w:r>
     </w:p>
     <w:p>
@@ -566,7 +1320,7 @@
                 <w:color w:val="181818"/>
                 <w:sz w:val="20"/>
               </w:rPr>
-              <w:t>Open source, version-controlled, no AppExchange</w:t>
+              <w:t>Open source, version-controlled</w:t>
             </w:r>
           </w:p>
         </w:tc>
@@ -613,7 +1367,7 @@
                 <w:color w:val="181818"/>
                 <w:sz w:val="20"/>
               </w:rPr>
-              <w:t>No CDN; MIT licensed; ~1.0-1.2MB; within 5MB limit</w:t>
+              <w:t>No CDN; ~1.0-1.2MB; within 5MB Salesforce limit</w:t>
             </w:r>
           </w:p>
         </w:tc>
@@ -660,7 +1414,7 @@
                 <w:color w:val="181818"/>
                 <w:sz w:val="20"/>
               </w:rPr>
-              <w:t>Native push; no polling; negligible Governor pressure</w:t>
+              <w:t>Native push; no polling</w:t>
             </w:r>
           </w:p>
         </w:tc>
@@ -692,7 +1446,7 @@
                 <w:color w:val="181818"/>
                 <w:sz w:val="20"/>
               </w:rPr>
-              <w:t>DB query at Queueable start (no text field)</w:t>
+              <w:t>Two-tier: DB dedup + Path__c ancestry</w:t>
             </w:r>
           </w:p>
         </w:tc>
@@ -707,7 +1461,7 @@
                 <w:color w:val="181818"/>
                 <w:sz w:val="20"/>
               </w:rPr>
-              <w:t>Scales to any tree depth; no StringException risk</w:t>
+              <w:t>Separates shared deps (not circular) from true cycles</w:t>
             </w:r>
           </w:p>
         </w:tc>
@@ -724,7 +1478,7 @@
                 <w:color w:val="181818"/>
                 <w:sz w:val="20"/>
               </w:rPr>
-              <w:t>Auth / Tooling API</w:t>
+              <w:t>Cancellation</w:t>
             </w:r>
           </w:p>
         </w:tc>
@@ -739,7 +1493,7 @@
                 <w:color w:val="181818"/>
                 <w:sz w:val="20"/>
               </w:rPr>
-              <w:t>OAuth 2.0 loopback via Named Credential</w:t>
+              <w:t>Cooperative via Status__c = Cancelled</w:t>
             </w:r>
           </w:p>
         </w:tc>
@@ -754,7 +1508,7 @@
                 <w:color w:val="181818"/>
                 <w:sz w:val="20"/>
               </w:rPr>
-              <w:t>Internal Tooling API only; admin-authorized once post-install</w:t>
+              <w:t>No force-kill in Salesforce; Queueable checks on entry</w:t>
             </w:r>
           </w:p>
         </w:tc>
@@ -771,7 +1525,7 @@
                 <w:color w:val="181818"/>
                 <w:sz w:val="20"/>
               </w:rPr>
-              <w:t>Security</w:t>
+              <w:t>Callout guardrail</w:t>
             </w:r>
           </w:p>
         </w:tc>
@@ -786,7 +1540,7 @@
                 <w:color w:val="181818"/>
                 <w:sz w:val="20"/>
               </w:rPr>
-              <w:t>USER_MODE on all DML/SOQL; Private OWD</w:t>
+              <w:t>Remaining-budget model with per-op headroom</w:t>
             </w:r>
           </w:p>
         </w:tc>
@@ -801,7 +1555,7 @@
                 <w:color w:val="181818"/>
                 <w:sz w:val="20"/>
               </w:rPr>
-              <w:t>Enterprise InfoSec compliant; runtime FLS and CRUD</w:t>
+              <w:t>Accounts for QueryMore, Flow validation, retry splits</w:t>
             </w:r>
           </w:p>
         </w:tc>
@@ -818,7 +1572,7 @@
                 <w:color w:val="181818"/>
                 <w:sz w:val="20"/>
               </w:rPr>
-              <w:t>DLM</w:t>
+              <w:t>IN chunk size</w:t>
             </w:r>
           </w:p>
         </w:tc>
@@ -833,7 +1587,7 @@
                 <w:color w:val="181818"/>
                 <w:sz w:val="20"/>
               </w:rPr>
-              <w:t>Nightly Batch hard-delete Jobs &gt; 24h</w:t>
+              <w:t>Character-budget driven (~100 IDs initial)</w:t>
             </w:r>
           </w:p>
         </w:tc>
@@ -848,7 +1602,7 @@
                 <w:color w:val="181818"/>
                 <w:sz w:val="20"/>
               </w:rPr>
-              <w:t>Prevent storage bloat in LDV environments</w:t>
+              <w:t>URI length depends on SOQL string, not just ID count</w:t>
             </w:r>
           </w:p>
         </w:tc>
@@ -865,7 +1619,7 @@
                 <w:color w:val="181818"/>
                 <w:sz w:val="20"/>
               </w:rPr>
-              <w:t>IN clause chunk size</w:t>
+              <w:t>USER_MODE scope</w:t>
             </w:r>
           </w:p>
         </w:tc>
@@ -880,7 +1634,7 @@
                 <w:color w:val="181818"/>
                 <w:sz w:val="20"/>
               </w:rPr>
-              <w:t>100 IDs max per Tooling API query</w:t>
+              <w:t>Controller boundary only; engine uses SYSTEM_MODE</w:t>
             </w:r>
           </w:p>
         </w:tc>
@@ -895,7 +1649,7 @@
                 <w:color w:val="181818"/>
                 <w:sz w:val="20"/>
               </w:rPr>
-              <w:t>Production-safe URI length limit</w:t>
+              <w:t>Prevents permission-related engine failures</w:t>
             </w:r>
           </w:p>
         </w:tc>
@@ -912,7 +1666,7 @@
                 <w:color w:val="181818"/>
                 <w:sz w:val="20"/>
               </w:rPr>
-              <w:t>Supplemental queries</w:t>
+              <w:t>Auth</w:t>
             </w:r>
           </w:p>
         </w:tc>
@@ -927,7 +1681,7 @@
                 <w:color w:val="181818"/>
                 <w:sz w:val="20"/>
               </w:rPr>
-              <w:t>Type-specific handler classes</w:t>
+              <w:t>OAuth 2.0 loopback via Named Credential</w:t>
             </w:r>
           </w:p>
         </w:tc>
@@ -942,7 +1696,7 @@
                 <w:color w:val="181818"/>
                 <w:sz w:val="20"/>
               </w:rPr>
-              <w:t>MetadataComponentDependency misses 6 dependency categories</w:t>
+              <w:t>Internal Tooling API only; admin-authorized once post-install</w:t>
             </w:r>
           </w:p>
         </w:tc>
@@ -959,7 +1713,7 @@
                 <w:color w:val="181818"/>
                 <w:sz w:val="20"/>
               </w:rPr>
-              <w:t>QueryMore</w:t>
+              <w:t>Security</w:t>
             </w:r>
           </w:p>
         </w:tc>
@@ -974,7 +1728,7 @@
                 <w:color w:val="181818"/>
                 <w:sz w:val="20"/>
               </w:rPr>
-              <w:t>Iterative nextRecordsUrl follow</w:t>
+              <w:t>Private OWD; Permission Set; USER_MODE at controller</w:t>
             </w:r>
           </w:p>
         </w:tc>
@@ -989,7 +1743,7 @@
                 <w:color w:val="181818"/>
                 <w:sz w:val="20"/>
               </w:rPr>
-              <w:t>Tooling API caps at 2,000 rows per response</w:t>
+              <w:t>Enterprise InfoSec compliant</w:t>
             </w:r>
           </w:p>
         </w:tc>
@@ -1006,7 +1760,7 @@
                 <w:color w:val="181818"/>
                 <w:sz w:val="20"/>
               </w:rPr>
-              <w:t>Callout guardrail</w:t>
+              <w:t>DLM</w:t>
             </w:r>
           </w:p>
         </w:tc>
@@ -1021,7 +1775,7 @@
                 <w:color w:val="181818"/>
                 <w:sz w:val="20"/>
               </w:rPr>
-              <w:t>80% standard; 60% when Active Flows + Flow batch</w:t>
+              <w:t>Configurable retention via MetaMapper_Settings__mdt</w:t>
             </w:r>
           </w:p>
         </w:tc>
@@ -1036,7 +1790,7 @@
                 <w:color w:val="181818"/>
                 <w:sz w:val="20"/>
               </w:rPr>
-              <w:t>Accounts for double-callout cost of Flow status validation</w:t>
+              <w:t>Default 72h; admin-adjustable for diagnostic needs</w:t>
             </w:r>
           </w:p>
         </w:tc>
@@ -1371,7 +2125,7 @@
                 <w:color w:val="181818"/>
                 <w:sz w:val="20"/>
               </w:rPr>
-              <w:t>Default: true. Drops inactive Flow versions. Triggers 60% callout threshold.</w:t>
+              <w:t>Default: true. Drops inactive Flow versions. Triggers extra callout for Flow status.</w:t>
             </w:r>
           </w:p>
         </w:tc>
@@ -1418,7 +2172,7 @@
                 <w:color w:val="181818"/>
                 <w:sz w:val="20"/>
               </w:rPr>
-              <w:t>Initializing &gt; Processing &gt; Completed | Failed</w:t>
+              <w:t>Initializing, Processing, Completed, Failed, Cancelled</w:t>
             </w:r>
           </w:p>
         </w:tc>
@@ -1568,9 +2322,9 @@
     <w:p/>
     <w:p>
       <w:pPr>
-        <w:spacing w:before="80" w:after="120"/>
+        <w:spacing w:before="60" w:after="120"/>
         <w:ind w:left="283"/>
-        <w:shd w:val="clear" w:color="auto" w:fill="F2F4F7"/>
+        <w:shd w:val="clear" w:color="auto" w:fill="EFF4FB"/>
       </w:pPr>
       <w:r>
         <w:rPr>
@@ -1578,7 +2332,7 @@
           <w:color w:val="032D60"/>
           <w:sz w:val="19"/>
         </w:rPr>
-        <w:t>Visited_IDs__c intentionally omitted. Cycle detection uses a DB query instead (see Fix #1). A Long Text 131072 field caps at ~5,957 IDs and would crash the Queueable chain in large enterprise orgs.</w:t>
+        <w:t>Visited_IDs__c intentionally omitted. Cycle detection uses DB query (dedup) + Path__c field (ancestry). A Long Text 131072 field would cap at ~5,957 IDs and crash the Queueable chain in large orgs.</w:t>
       </w:r>
     </w:p>
     <w:p>
@@ -2028,7 +2782,7 @@
                 <w:color w:val="181818"/>
                 <w:sz w:val="20"/>
               </w:rPr>
-              <w:t>True if node already appears higher in the tree - displayed but not re-traversed</w:t>
+              <w:t>True ONLY when Metadata_ID__c appears in its own Path__c (true ancestry cycle)</w:t>
             </w:r>
           </w:p>
         </w:tc>
@@ -2075,7 +2829,7 @@
                 <w:color w:val="181818"/>
                 <w:sz w:val="20"/>
               </w:rPr>
-              <w:t>True if reference cannot be statically resolved (e.g. dynamic Apex string)</w:t>
+              <w:t>True if reference is a dynamic Apex string - permanent blind spot, flagged in UI</w:t>
             </w:r>
           </w:p>
         </w:tc>
@@ -2169,7 +2923,54 @@
                 <w:color w:val="181818"/>
                 <w:sz w:val="20"/>
               </w:rPr>
-              <w:t>ToolingAPI or Supplemental - tracks discovery method</w:t>
+              <w:t>ToolingAPI or Supplemental</w:t>
+            </w:r>
+          </w:p>
+        </w:tc>
+      </w:tr>
+      <w:tr>
+        <w:tc>
+          <w:tcPr>
+            <w:tcW w:type="dxa" w:w="3022"/>
+            <w:shd w:val="clear" w:color="auto" w:fill="FFFFFF"/>
+          </w:tcPr>
+          <w:p>
+            <w:r>
+              <w:rPr>
+                <w:color w:val="181818"/>
+                <w:sz w:val="20"/>
+              </w:rPr>
+              <w:t>Path__c</w:t>
+            </w:r>
+          </w:p>
+        </w:tc>
+        <w:tc>
+          <w:tcPr>
+            <w:tcW w:type="dxa" w:w="3022"/>
+            <w:shd w:val="clear" w:color="auto" w:fill="FFFFFF"/>
+          </w:tcPr>
+          <w:p>
+            <w:r>
+              <w:rPr>
+                <w:color w:val="181818"/>
+                <w:sz w:val="20"/>
+              </w:rPr>
+              <w:t>Long Text 32768</w:t>
+            </w:r>
+          </w:p>
+        </w:tc>
+        <w:tc>
+          <w:tcPr>
+            <w:tcW w:type="dxa" w:w="3022"/>
+            <w:shd w:val="clear" w:color="auto" w:fill="FFFFFF"/>
+          </w:tcPr>
+          <w:p>
+            <w:r>
+              <w:rPr>
+                <w:color w:val="181818"/>
+                <w:sz w:val="20"/>
+              </w:rPr>
+              <w:t>Pipe-delimited ancestor Metadata_ID__c chain from root to this node (cycle detection)</w:t>
             </w:r>
           </w:p>
         </w:tc>
@@ -2187,7 +2988,7 @@
           <w:color w:val="0070D2"/>
           <w:sz w:val="28"/>
         </w:rPr>
-        <w:t>4.3 Context_Data__c (Pills) by Metadata Type</w:t>
+        <w:t>4.3 Context_Data__c (Pills)</w:t>
       </w:r>
     </w:p>
     <w:tbl>
@@ -2198,14 +2999,13 @@
         <w:tblLook w:firstColumn="1" w:firstRow="1" w:lastColumn="0" w:lastRow="0" w:noHBand="0" w:noVBand="1" w:val="04A0"/>
       </w:tblPr>
       <w:tblGrid>
-        <w:gridCol w:w="3022"/>
-        <w:gridCol w:w="3022"/>
-        <w:gridCol w:w="3022"/>
+        <w:gridCol w:w="4533"/>
+        <w:gridCol w:w="4533"/>
       </w:tblGrid>
       <w:tr>
         <w:tc>
           <w:tcPr>
-            <w:tcW w:type="dxa" w:w="3022"/>
+            <w:tcW w:type="dxa" w:w="4533"/>
             <w:shd w:val="clear" w:color="auto" w:fill="032D60"/>
           </w:tcPr>
           <w:p>
@@ -2221,7 +3021,7 @@
         </w:tc>
         <w:tc>
           <w:tcPr>
-            <w:tcW w:type="dxa" w:w="3022"/>
+            <w:tcW w:type="dxa" w:w="4533"/>
             <w:shd w:val="clear" w:color="auto" w:fill="032D60"/>
           </w:tcPr>
           <w:p>
@@ -2235,27 +3035,11 @@
             </w:r>
           </w:p>
         </w:tc>
-        <w:tc>
-          <w:tcPr>
-            <w:tcW w:type="dxa" w:w="3022"/>
-            <w:shd w:val="clear" w:color="auto" w:fill="032D60"/>
-          </w:tcPr>
-          <w:p>
-            <w:r>
-              <w:rPr>
-                <w:b/>
-                <w:color w:val="FFFFFF"/>
-                <w:sz w:val="20"/>
-              </w:rPr>
-              <w:t>Notes</w:t>
-            </w:r>
-          </w:p>
-        </w:tc>
       </w:tr>
       <w:tr>
         <w:tc>
           <w:tcPr>
-            <w:tcW w:type="dxa" w:w="3022"/>
+            <w:tcW w:type="dxa" w:w="4533"/>
             <w:shd w:val="clear" w:color="auto" w:fill="F2F4F7"/>
           </w:tcPr>
           <w:p>
@@ -2270,7 +3054,7 @@
         </w:tc>
         <w:tc>
           <w:tcPr>
-            <w:tcW w:type="dxa" w:w="3022"/>
+            <w:tcW w:type="dxa" w:w="4533"/>
             <w:shd w:val="clear" w:color="auto" w:fill="F2F4F7"/>
           </w:tcPr>
           <w:p>
@@ -2280,21 +3064,6 @@
                 <w:sz w:val="20"/>
               </w:rPr>
               <w:t>{"isWrite": true}</w:t>
-            </w:r>
-          </w:p>
-        </w:tc>
-        <w:tc>
-          <w:tcPr>
-            <w:tcW w:type="dxa" w:w="3022"/>
-            <w:shd w:val="clear" w:color="auto" w:fill="F2F4F7"/>
-          </w:tcPr>
-          <w:p>
-            <w:r>
-              <w:rPr>
-                <w:color w:val="181818"/>
-                <w:sz w:val="20"/>
-              </w:rPr>
-              <w:t>Whether the class writes to the target field/object</w:t>
             </w:r>
           </w:p>
         </w:tc>
@@ -2302,7 +3071,7 @@
       <w:tr>
         <w:tc>
           <w:tcPr>
-            <w:tcW w:type="dxa" w:w="3022"/>
+            <w:tcW w:type="dxa" w:w="4533"/>
             <w:shd w:val="clear" w:color="auto" w:fill="FFFFFF"/>
           </w:tcPr>
           <w:p>
@@ -2317,7 +3086,7 @@
         </w:tc>
         <w:tc>
           <w:tcPr>
-            <w:tcW w:type="dxa" w:w="3022"/>
+            <w:tcW w:type="dxa" w:w="4533"/>
             <w:shd w:val="clear" w:color="auto" w:fill="FFFFFF"/>
           </w:tcPr>
           <w:p>
@@ -2327,21 +3096,6 @@
                 <w:sz w:val="20"/>
               </w:rPr>
               <w:t>{"activeVersions": 3, "isActive": true}</w:t>
-            </w:r>
-          </w:p>
-        </w:tc>
-        <w:tc>
-          <w:tcPr>
-            <w:tcW w:type="dxa" w:w="3022"/>
-            <w:shd w:val="clear" w:color="auto" w:fill="FFFFFF"/>
-          </w:tcPr>
-          <w:p>
-            <w:r>
-              <w:rPr>
-                <w:color w:val="181818"/>
-                <w:sz w:val="20"/>
-              </w:rPr>
-              <w:t>Active version count and current active status</w:t>
             </w:r>
           </w:p>
         </w:tc>
@@ -2349,7 +3103,7 @@
       <w:tr>
         <w:tc>
           <w:tcPr>
-            <w:tcW w:type="dxa" w:w="3022"/>
+            <w:tcW w:type="dxa" w:w="4533"/>
             <w:shd w:val="clear" w:color="auto" w:fill="F2F4F7"/>
           </w:tcPr>
           <w:p>
@@ -2364,7 +3118,7 @@
         </w:tc>
         <w:tc>
           <w:tcPr>
-            <w:tcW w:type="dxa" w:w="3022"/>
+            <w:tcW w:type="dxa" w:w="4533"/>
             <w:shd w:val="clear" w:color="auto" w:fill="F2F4F7"/>
           </w:tcPr>
           <w:p>
@@ -2374,21 +3128,6 @@
                 <w:sz w:val="20"/>
               </w:rPr>
               <w:t>{"isActive": true, "triggerType": "onInsertOrUpdate"}</w:t>
-            </w:r>
-          </w:p>
-        </w:tc>
-        <w:tc>
-          <w:tcPr>
-            <w:tcW w:type="dxa" w:w="3022"/>
-            <w:shd w:val="clear" w:color="auto" w:fill="F2F4F7"/>
-          </w:tcPr>
-          <w:p>
-            <w:r>
-              <w:rPr>
-                <w:color w:val="181818"/>
-                <w:sz w:val="20"/>
-              </w:rPr>
-              <w:t>Rule status and trigger type</w:t>
             </w:r>
           </w:p>
         </w:tc>
@@ -2396,7 +3135,7 @@
       <w:tr>
         <w:tc>
           <w:tcPr>
-            <w:tcW w:type="dxa" w:w="3022"/>
+            <w:tcW w:type="dxa" w:w="4533"/>
             <w:shd w:val="clear" w:color="auto" w:fill="FFFFFF"/>
           </w:tcPr>
           <w:p>
@@ -2411,7 +3150,7 @@
         </w:tc>
         <w:tc>
           <w:tcPr>
-            <w:tcW w:type="dxa" w:w="3022"/>
+            <w:tcW w:type="dxa" w:w="4533"/>
             <w:shd w:val="clear" w:color="auto" w:fill="FFFFFF"/>
           </w:tcPr>
           <w:p>
@@ -2421,21 +3160,6 @@
                 <w:sz w:val="20"/>
               </w:rPr>
               <w:t>{"parentObject": "Account", "parentType": "CustomObject"}</w:t>
-            </w:r>
-          </w:p>
-        </w:tc>
-        <w:tc>
-          <w:tcPr>
-            <w:tcW w:type="dxa" w:w="3022"/>
-            <w:shd w:val="clear" w:color="auto" w:fill="FFFFFF"/>
-          </w:tcPr>
-          <w:p>
-            <w:r>
-              <w:rPr>
-                <w:color w:val="181818"/>
-                <w:sz w:val="20"/>
-              </w:rPr>
-              <w:t>Parent object context</w:t>
             </w:r>
           </w:p>
         </w:tc>
@@ -2443,7 +3167,7 @@
       <w:tr>
         <w:tc>
           <w:tcPr>
-            <w:tcW w:type="dxa" w:w="3022"/>
+            <w:tcW w:type="dxa" w:w="4533"/>
             <w:shd w:val="clear" w:color="auto" w:fill="F2F4F7"/>
           </w:tcPr>
           <w:p>
@@ -2458,7 +3182,7 @@
         </w:tc>
         <w:tc>
           <w:tcPr>
-            <w:tcW w:type="dxa" w:w="3022"/>
+            <w:tcW w:type="dxa" w:w="4533"/>
             <w:shd w:val="clear" w:color="auto" w:fill="F2F4F7"/>
           </w:tcPr>
           <w:p>
@@ -2468,21 +3192,6 @@
                 <w:sz w:val="20"/>
               </w:rPr>
               <w:t>{"filterUsage": ["filter", "grouping", "column"]}</w:t>
-            </w:r>
-          </w:p>
-        </w:tc>
-        <w:tc>
-          <w:tcPr>
-            <w:tcW w:type="dxa" w:w="3022"/>
-            <w:shd w:val="clear" w:color="auto" w:fill="F2F4F7"/>
-          </w:tcPr>
-          <w:p>
-            <w:r>
-              <w:rPr>
-                <w:color w:val="181818"/>
-                <w:sz w:val="20"/>
-              </w:rPr>
-              <w:t>How the field is used in the report</w:t>
             </w:r>
           </w:p>
         </w:tc>
@@ -2766,23 +3475,152 @@
           <w:color w:val="0070D2"/>
           <w:sz w:val="28"/>
         </w:rPr>
-        <w:t>4.5 Data Lifecycle Management</w:t>
+        <w:t>4.5 MetaMapper_Settings__mdt (Custom Metadata)</w:t>
       </w:r>
     </w:p>
-    <w:p>
-      <w:pPr>
-        <w:spacing w:after="80"/>
-      </w:pPr>
-      <w:r>
-        <w:rPr>
-          <w:b w:val="0"/>
-          <w:i w:val="0"/>
-          <w:color w:val="181818"/>
-          <w:sz w:val="21"/>
-        </w:rPr>
-        <w:t>DependencyCleanupBatch runs nightly at 02:00 and hard-deletes Dependency_Job__c records older than 24 hours. Deletion cascades to all child Dependency_Node__c records via Master-Detail.</w:t>
-      </w:r>
-    </w:p>
+    <w:tbl>
+      <w:tblPr>
+        <w:tblStyle w:val="TableGrid"/>
+        <w:tblW w:type="auto" w:w="0"/>
+        <w:jc w:val="left"/>
+        <w:tblLook w:firstColumn="1" w:firstRow="1" w:lastColumn="0" w:lastRow="0" w:noHBand="0" w:noVBand="1" w:val="04A0"/>
+      </w:tblPr>
+      <w:tblGrid>
+        <w:gridCol w:w="2266"/>
+        <w:gridCol w:w="2266"/>
+        <w:gridCol w:w="2266"/>
+        <w:gridCol w:w="2266"/>
+      </w:tblGrid>
+      <w:tr>
+        <w:tc>
+          <w:tcPr>
+            <w:tcW w:type="dxa" w:w="2266"/>
+            <w:shd w:val="clear" w:color="auto" w:fill="032D60"/>
+          </w:tcPr>
+          <w:p>
+            <w:r>
+              <w:rPr>
+                <w:b/>
+                <w:color w:val="FFFFFF"/>
+                <w:sz w:val="20"/>
+              </w:rPr>
+              <w:t>Field</w:t>
+            </w:r>
+          </w:p>
+        </w:tc>
+        <w:tc>
+          <w:tcPr>
+            <w:tcW w:type="dxa" w:w="2266"/>
+            <w:shd w:val="clear" w:color="auto" w:fill="032D60"/>
+          </w:tcPr>
+          <w:p>
+            <w:r>
+              <w:rPr>
+                <w:b/>
+                <w:color w:val="FFFFFF"/>
+                <w:sz w:val="20"/>
+              </w:rPr>
+              <w:t>Type</w:t>
+            </w:r>
+          </w:p>
+        </w:tc>
+        <w:tc>
+          <w:tcPr>
+            <w:tcW w:type="dxa" w:w="2266"/>
+            <w:shd w:val="clear" w:color="auto" w:fill="032D60"/>
+          </w:tcPr>
+          <w:p>
+            <w:r>
+              <w:rPr>
+                <w:b/>
+                <w:color w:val="FFFFFF"/>
+                <w:sz w:val="20"/>
+              </w:rPr>
+              <w:t>Default</w:t>
+            </w:r>
+          </w:p>
+        </w:tc>
+        <w:tc>
+          <w:tcPr>
+            <w:tcW w:type="dxa" w:w="2266"/>
+            <w:shd w:val="clear" w:color="auto" w:fill="032D60"/>
+          </w:tcPr>
+          <w:p>
+            <w:r>
+              <w:rPr>
+                <w:b/>
+                <w:color w:val="FFFFFF"/>
+                <w:sz w:val="20"/>
+              </w:rPr>
+              <w:t>Notes</w:t>
+            </w:r>
+          </w:p>
+        </w:tc>
+      </w:tr>
+      <w:tr>
+        <w:tc>
+          <w:tcPr>
+            <w:tcW w:type="dxa" w:w="2266"/>
+            <w:shd w:val="clear" w:color="auto" w:fill="F2F4F7"/>
+          </w:tcPr>
+          <w:p>
+            <w:r>
+              <w:rPr>
+                <w:color w:val="181818"/>
+                <w:sz w:val="20"/>
+              </w:rPr>
+              <w:t>Retention_Hours__c</w:t>
+            </w:r>
+          </w:p>
+        </w:tc>
+        <w:tc>
+          <w:tcPr>
+            <w:tcW w:type="dxa" w:w="2266"/>
+            <w:shd w:val="clear" w:color="auto" w:fill="F2F4F7"/>
+          </w:tcPr>
+          <w:p>
+            <w:r>
+              <w:rPr>
+                <w:color w:val="181818"/>
+                <w:sz w:val="20"/>
+              </w:rPr>
+              <w:t>Number</w:t>
+            </w:r>
+          </w:p>
+        </w:tc>
+        <w:tc>
+          <w:tcPr>
+            <w:tcW w:type="dxa" w:w="2266"/>
+            <w:shd w:val="clear" w:color="auto" w:fill="F2F4F7"/>
+          </w:tcPr>
+          <w:p>
+            <w:r>
+              <w:rPr>
+                <w:color w:val="181818"/>
+                <w:sz w:val="20"/>
+              </w:rPr>
+              <w:t>72</w:t>
+            </w:r>
+          </w:p>
+        </w:tc>
+        <w:tc>
+          <w:tcPr>
+            <w:tcW w:type="dxa" w:w="2266"/>
+            <w:shd w:val="clear" w:color="auto" w:fill="F2F4F7"/>
+          </w:tcPr>
+          <w:p>
+            <w:r>
+              <w:rPr>
+                <w:color w:val="181818"/>
+                <w:sz w:val="20"/>
+              </w:rPr>
+              <w:t>Hours before job hard-delete. DependencyCleanupBatch reads at runtime.</w:t>
+            </w:r>
+          </w:p>
+        </w:tc>
+      </w:tr>
+    </w:tbl>
+    <w:p/>
     <w:p>
       <w:pPr>
         <w:pStyle w:val="Heading1"/>
@@ -2794,7 +3632,7 @@
           <w:color w:val="032D60"/>
           <w:sz w:val="36"/>
         </w:rPr>
-        <w:t>5. Processing Engine (Async Architecture)</w:t>
+        <w:t>5. Processing Engine</w:t>
       </w:r>
     </w:p>
     <w:p>
@@ -2830,7 +3668,7 @@
           <w:color w:val="181818"/>
           <w:sz w:val="21"/>
         </w:rPr>
-        <w:t>1. User submits via LWC. Controller creates Dependency_Job__c (Initializing), inserts root Dependency_Node__c (Is_Processed__c = false), enqueues DependencyQueueable.</w:t>
+        <w:t>1. User submits via LWC. Controller creates Dependency_Job__c (Initializing), inserts root Dependency_Node__c (Path__c = empty, Is_Processed__c = false), enqueues DependencyQueueable.</w:t>
       </w:r>
     </w:p>
     <w:p>
@@ -2844,7 +3682,7 @@
           <w:color w:val="181818"/>
           <w:sz w:val="21"/>
         </w:rPr>
-        <w:t>2. DependencyQueueable.execute() queries up to 50 unprocessed nodes.</w:t>
+        <w:t>2. DependencyQueueable.execute() checks Status__c first. If Cancelled, exit without enqueuing successor.</w:t>
       </w:r>
     </w:p>
     <w:p>
@@ -2858,7 +3696,7 @@
           <w:color w:val="181818"/>
           <w:sz w:val="21"/>
         </w:rPr>
-        <w:t>3. DB cycle-detection query: SELECT Metadata_ID__c FROM Dependency_Node__c WHERE Dependency_Job__c = :jobId builds the visited Set&lt;String&gt; from the database (scales infinitely).</w:t>
+        <w:t>3. DB dedup query: SELECT Metadata_ID__c FROM Dependency_Node__c WHERE Dependency_Job__c = :jobId. Builds processedIds set.</w:t>
       </w:r>
     </w:p>
     <w:p>
@@ -2872,7 +3710,7 @@
           <w:color w:val="181818"/>
           <w:sz w:val="21"/>
         </w:rPr>
-        <w:t>4. Tooling API callout per node batch (100-ID chunks; QueryMore loop for &gt;2,000 results; HTTP 414/431 triggers reactive batch split).</w:t>
+        <w:t>4. Query 50 unprocessed nodes. For each batch: estimate SOQL character length; if &gt;8KB split batch. Tooling API callout (QueryMore loop for &gt;2,000 results; HTTP 414/431 triggers reactive split).</w:t>
       </w:r>
     </w:p>
     <w:p>
@@ -2886,7 +3724,7 @@
           <w:color w:val="181818"/>
           <w:sz w:val="21"/>
         </w:rPr>
-        <w:t>5. Results in visited set: insert with Is_Circular__c = true, Is_Processed__c = true. Not enqueued for further traversal.</w:t>
+        <w:t>5. For each result: if Metadata_ID__c in processedIds -&gt; skip (dedup, NOT circular). If Metadata_ID__c in parent.Path__c -&gt; insert with Is_Circular__c = true, Is_Processed__c = true.</w:t>
       </w:r>
     </w:p>
     <w:p>
@@ -2900,7 +3738,7 @@
           <w:color w:val="181818"/>
           <w:sz w:val="21"/>
         </w:rPr>
-        <w:t>6. New child nodes inserted with Source__c = ToolingAPI (WITH USER_MODE).</w:t>
+        <w:t>6. Insert new child nodes with Source__c = ToolingAPI and Path__c = parent.Path__c + | + parent.Metadata_ID__c (SYSTEM_MODE).</w:t>
       </w:r>
     </w:p>
     <w:p>
@@ -2914,7 +3752,7 @@
           <w:color w:val="181818"/>
           <w:sz w:val="21"/>
         </w:rPr>
-        <w:t>7. DependencyTypeHandlerFactory dispatches to type-specific handler. Supplemental nodes inserted with Source__c = Supplemental.</w:t>
+        <w:t>7. DependencyTypeHandlerFactory dispatches supplemental handlers. Insert supplemental nodes with Source__c = Supplemental.</w:t>
       </w:r>
     </w:p>
     <w:p>
@@ -2928,7 +3766,7 @@
           <w:color w:val="181818"/>
           <w:sz w:val="21"/>
         </w:rPr>
-        <w:t>8. Current nodes marked Is_Processed__c = true. Nodes_Processed__c incremented. Dependency_Status__e published.</w:t>
+        <w:t>8. Mark current nodes Is_Processed__c = true. Increment Nodes_Processed__c. Publish Dependency_Status__e.</w:t>
       </w:r>
     </w:p>
     <w:p>
@@ -2942,7 +3780,7 @@
           <w:color w:val="181818"/>
           <w:sz w:val="21"/>
         </w:rPr>
-        <w:t>9. Adaptive guardrail: 60% callout threshold if Active_Flows_Only__c = true AND Flow nodes in batch (double-callout cost); 80% otherwise. Heap always 80%.</w:t>
+        <w:t>9. Remaining-budget guardrail: if remaining callouts &lt; headroom OR heap &gt; 80%, enqueue fresh instance and return.</w:t>
       </w:r>
     </w:p>
     <w:p>
@@ -2984,7 +3822,7 @@
           <w:color w:val="0070D2"/>
           <w:sz w:val="28"/>
         </w:rPr>
-        <w:t>5.2 Adaptive Limit Guardrail</w:t>
+        <w:t>5.2 Remaining-Budget Guardrail</w:t>
       </w:r>
     </w:p>
     <w:p>
@@ -2999,12 +3837,17 @@
           <w:color w:val="1E1E2E"/>
           <w:sz w:val="18"/>
         </w:rPr>
-        <w:t>Boolean hasFlowNodes = /* batch contains Flow-type nodes */;</w:t>
+        <w:t>Integer remaining = Limits.getLimitCallouts() - Limits.getCallouts();</w:t>
         <w:br/>
-        <w:t>Decimal calloutThreshold = (job.Active_Flows_Only__c &amp;&amp; hasFlowNodes) ? 0.60 : 0.80;</w:t>
+        <w:t>Integer headroom = 2</w:t>
         <w:br/>
+        <w:t xml:space="preserve">    + (queryMorePossible ? 1 : 0)</w:t>
         <w:br/>
-        <w:t>if (Limits.getCallouts() &gt;= Limits.getLimitCallouts() * calloutThreshold</w:t>
+        <w:t xml:space="preserve">    + (needsFlowValidation ? 1 : 0)</w:t>
+        <w:br/>
+        <w:t xml:space="preserve">    + 2; // 414/431 retry buffer</w:t>
+        <w:br/>
+        <w:t>if (remaining &lt; headroom</w:t>
         <w:br/>
         <w:t xml:space="preserve">    || Limits.getHeapSize() &gt;= Limits.getLimitHeapSize() * 0.80) {</w:t>
         <w:br/>
@@ -3026,21 +3869,47 @@
           <w:color w:val="0070D2"/>
           <w:sz w:val="28"/>
         </w:rPr>
-        <w:t>5.3 Circular Reference Handling</w:t>
+        <w:t>5.3 Two-Tier Cycle Detection</w:t>
       </w:r>
     </w:p>
     <w:p>
       <w:pPr>
-        <w:spacing w:after="80"/>
+        <w:spacing w:before="60" w:after="60"/>
+        <w:ind w:left="454"/>
+        <w:shd w:val="clear" w:color="auto" w:fill="EAECF0"/>
       </w:pPr>
       <w:r>
         <w:rPr>
-          <w:b w:val="0"/>
-          <w:i w:val="0"/>
-          <w:color w:val="181818"/>
-          <w:sz w:val="21"/>
+          <w:rFonts w:ascii="Courier New" w:hAnsi="Courier New"/>
+          <w:color w:val="1E1E2E"/>
+          <w:sz w:val="18"/>
         </w:rPr>
-        <w:t>Nodes already in the visited set (from the DB query) are inserted with Is_Circular__c = true and Is_Processed__c = true, preventing infinite traversal while preserving the circular relationship in the tree and graph views.</w:t>
+        <w:t>// Tier 1: deduplication</w:t>
+        <w:br/>
+        <w:t>if (processedIds.contains(result.refId)) {</w:t>
+        <w:br/>
+        <w:t xml:space="preserve">    continue; // skip - already inserted via another path, not a cycle</w:t>
+        <w:br/>
+        <w:t>}</w:t>
+        <w:br/>
+        <w:br/>
+        <w:t>// Tier 2: true ancestry cycle</w:t>
+        <w:br/>
+        <w:t>Boolean isCycle = String.isNotBlank(parentNode.Path__c)</w:t>
+        <w:br/>
+        <w:t xml:space="preserve">    &amp;&amp; parentNode.Path__c.contains(result.refId);</w:t>
+        <w:br/>
+        <w:t>newNode.Is_Circular__c = isCycle;</w:t>
+        <w:br/>
+        <w:t>newNode.Is_Processed__c = isCycle; // circular nodes not re-traversed</w:t>
+        <w:br/>
+        <w:t>newNode.Path__c = isCycle ? null</w:t>
+        <w:br/>
+        <w:t xml:space="preserve">    : (parentNode.Path__c != null</w:t>
+        <w:br/>
+        <w:t xml:space="preserve">        ? parentNode.Path__c + '|' + parentNode.Metadata_ID__c</w:t>
+        <w:br/>
+        <w:t xml:space="preserve">        : parentNode.Metadata_ID__c);</w:t>
       </w:r>
     </w:p>
     <w:p>
@@ -3076,7 +3945,7 @@
           <w:color w:val="181818"/>
           <w:sz w:val="21"/>
         </w:rPr>
-        <w:t>MetadataComponentDependency does not track 6 critical dependency categories. Type-specific handler classes fill these gaps.</w:t>
+        <w:t>MetadataComponentDependency does not track 5 static dependency categories (supplemental handlers fill these) plus 1 permanent blind spot (dynamic Apex - cannot be resolved by any query).</w:t>
       </w:r>
     </w:p>
     <w:tbl>
@@ -3087,14 +3956,15 @@
         <w:tblLook w:firstColumn="1" w:firstRow="1" w:lastColumn="0" w:lastRow="0" w:noHBand="0" w:noVBand="1" w:val="04A0"/>
       </w:tblPr>
       <w:tblGrid>
-        <w:gridCol w:w="3022"/>
-        <w:gridCol w:w="3022"/>
-        <w:gridCol w:w="3022"/>
+        <w:gridCol w:w="2266"/>
+        <w:gridCol w:w="2266"/>
+        <w:gridCol w:w="2266"/>
+        <w:gridCol w:w="2266"/>
       </w:tblGrid>
       <w:tr>
         <w:tc>
           <w:tcPr>
-            <w:tcW w:type="dxa" w:w="3022"/>
+            <w:tcW w:type="dxa" w:w="2266"/>
             <w:shd w:val="clear" w:color="auto" w:fill="032D60"/>
           </w:tcPr>
           <w:p>
@@ -3110,7 +3980,7 @@
         </w:tc>
         <w:tc>
           <w:tcPr>
-            <w:tcW w:type="dxa" w:w="3022"/>
+            <w:tcW w:type="dxa" w:w="2266"/>
             <w:shd w:val="clear" w:color="auto" w:fill="032D60"/>
           </w:tcPr>
           <w:p>
@@ -3126,7 +3996,7 @@
         </w:tc>
         <w:tc>
           <w:tcPr>
-            <w:tcW w:type="dxa" w:w="3022"/>
+            <w:tcW w:type="dxa" w:w="2266"/>
             <w:shd w:val="clear" w:color="auto" w:fill="032D60"/>
           </w:tcPr>
           <w:p>
@@ -3140,11 +4010,27 @@
             </w:r>
           </w:p>
         </w:tc>
+        <w:tc>
+          <w:tcPr>
+            <w:tcW w:type="dxa" w:w="2266"/>
+            <w:shd w:val="clear" w:color="auto" w:fill="032D60"/>
+          </w:tcPr>
+          <w:p>
+            <w:r>
+              <w:rPr>
+                <w:b/>
+                <w:color w:val="FFFFFF"/>
+                <w:sz w:val="20"/>
+              </w:rPr>
+              <w:t>Solvable?</w:t>
+            </w:r>
+          </w:p>
+        </w:tc>
       </w:tr>
       <w:tr>
         <w:tc>
           <w:tcPr>
-            <w:tcW w:type="dxa" w:w="3022"/>
+            <w:tcW w:type="dxa" w:w="2266"/>
             <w:shd w:val="clear" w:color="auto" w:fill="F2F4F7"/>
           </w:tcPr>
           <w:p>
@@ -3159,7 +4045,7 @@
         </w:tc>
         <w:tc>
           <w:tcPr>
-            <w:tcW w:type="dxa" w:w="3022"/>
+            <w:tcW w:type="dxa" w:w="2266"/>
             <w:shd w:val="clear" w:color="auto" w:fill="F2F4F7"/>
           </w:tcPr>
           <w:p>
@@ -3174,7 +4060,7 @@
         </w:tc>
         <w:tc>
           <w:tcPr>
-            <w:tcW w:type="dxa" w:w="3022"/>
+            <w:tcW w:type="dxa" w:w="2266"/>
             <w:shd w:val="clear" w:color="auto" w:fill="F2F4F7"/>
           </w:tcPr>
           <w:p>
@@ -3184,6 +4070,21 @@
                 <w:sz w:val="20"/>
               </w:rPr>
               <w:t>Query WorkflowFieldUpdate WHERE Field = :apiName</w:t>
+            </w:r>
+          </w:p>
+        </w:tc>
+        <w:tc>
+          <w:tcPr>
+            <w:tcW w:type="dxa" w:w="2266"/>
+            <w:shd w:val="clear" w:color="auto" w:fill="F2F4F7"/>
+          </w:tcPr>
+          <w:p>
+            <w:r>
+              <w:rPr>
+                <w:color w:val="181818"/>
+                <w:sz w:val="20"/>
+              </w:rPr>
+              <w:t>Yes</w:t>
             </w:r>
           </w:p>
         </w:tc>
@@ -3191,7 +4092,7 @@
       <w:tr>
         <w:tc>
           <w:tcPr>
-            <w:tcW w:type="dxa" w:w="3022"/>
+            <w:tcW w:type="dxa" w:w="2266"/>
             <w:shd w:val="clear" w:color="auto" w:fill="FFFFFF"/>
           </w:tcPr>
           <w:p>
@@ -3206,7 +4107,7 @@
         </w:tc>
         <w:tc>
           <w:tcPr>
-            <w:tcW w:type="dxa" w:w="3022"/>
+            <w:tcW w:type="dxa" w:w="2266"/>
             <w:shd w:val="clear" w:color="auto" w:fill="FFFFFF"/>
           </w:tcPr>
           <w:p>
@@ -3221,7 +4122,7 @@
         </w:tc>
         <w:tc>
           <w:tcPr>
-            <w:tcW w:type="dxa" w:w="3022"/>
+            <w:tcW w:type="dxa" w:w="2266"/>
             <w:shd w:val="clear" w:color="auto" w:fill="FFFFFF"/>
           </w:tcPr>
           <w:p>
@@ -3231,6 +4132,21 @@
                 <w:sz w:val="20"/>
               </w:rPr>
               <w:t>Query ValidationRule bodies; regex match field API name</w:t>
+            </w:r>
+          </w:p>
+        </w:tc>
+        <w:tc>
+          <w:tcPr>
+            <w:tcW w:type="dxa" w:w="2266"/>
+            <w:shd w:val="clear" w:color="auto" w:fill="FFFFFF"/>
+          </w:tcPr>
+          <w:p>
+            <w:r>
+              <w:rPr>
+                <w:color w:val="181818"/>
+                <w:sz w:val="20"/>
+              </w:rPr>
+              <w:t>Yes</w:t>
             </w:r>
           </w:p>
         </w:tc>
@@ -3238,7 +4154,7 @@
       <w:tr>
         <w:tc>
           <w:tcPr>
-            <w:tcW w:type="dxa" w:w="3022"/>
+            <w:tcW w:type="dxa" w:w="2266"/>
             <w:shd w:val="clear" w:color="auto" w:fill="F2F4F7"/>
           </w:tcPr>
           <w:p>
@@ -3253,7 +4169,7 @@
         </w:tc>
         <w:tc>
           <w:tcPr>
-            <w:tcW w:type="dxa" w:w="3022"/>
+            <w:tcW w:type="dxa" w:w="2266"/>
             <w:shd w:val="clear" w:color="auto" w:fill="F2F4F7"/>
           </w:tcPr>
           <w:p>
@@ -3268,7 +4184,7 @@
         </w:tc>
         <w:tc>
           <w:tcPr>
-            <w:tcW w:type="dxa" w:w="3022"/>
+            <w:tcW w:type="dxa" w:w="2266"/>
             <w:shd w:val="clear" w:color="auto" w:fill="F2F4F7"/>
           </w:tcPr>
           <w:p>
@@ -3278,6 +4194,21 @@
                 <w:sz w:val="20"/>
               </w:rPr>
               <w:t>Query FlexiPage metadata; parse XML for field references</w:t>
+            </w:r>
+          </w:p>
+        </w:tc>
+        <w:tc>
+          <w:tcPr>
+            <w:tcW w:type="dxa" w:w="2266"/>
+            <w:shd w:val="clear" w:color="auto" w:fill="F2F4F7"/>
+          </w:tcPr>
+          <w:p>
+            <w:r>
+              <w:rPr>
+                <w:color w:val="181818"/>
+                <w:sz w:val="20"/>
+              </w:rPr>
+              <w:t>Yes</w:t>
             </w:r>
           </w:p>
         </w:tc>
@@ -3285,7 +4216,7 @@
       <w:tr>
         <w:tc>
           <w:tcPr>
-            <w:tcW w:type="dxa" w:w="3022"/>
+            <w:tcW w:type="dxa" w:w="2266"/>
             <w:shd w:val="clear" w:color="auto" w:fill="FFFFFF"/>
           </w:tcPr>
           <w:p>
@@ -3300,7 +4231,7 @@
         </w:tc>
         <w:tc>
           <w:tcPr>
-            <w:tcW w:type="dxa" w:w="3022"/>
+            <w:tcW w:type="dxa" w:w="2266"/>
             <w:shd w:val="clear" w:color="auto" w:fill="FFFFFF"/>
           </w:tcPr>
           <w:p>
@@ -3315,7 +4246,7 @@
         </w:tc>
         <w:tc>
           <w:tcPr>
-            <w:tcW w:type="dxa" w:w="3022"/>
+            <w:tcW w:type="dxa" w:w="2266"/>
             <w:shd w:val="clear" w:color="auto" w:fill="FFFFFF"/>
           </w:tcPr>
           <w:p>
@@ -3324,7 +4255,22 @@
                 <w:color w:val="181818"/>
                 <w:sz w:val="20"/>
               </w:rPr>
-              <w:t>SOQL on CMT records; filter fields named class, handler, type, instance</w:t>
+              <w:t>SOQL on CMT records; filter fields named class, handler, type</w:t>
+            </w:r>
+          </w:p>
+        </w:tc>
+        <w:tc>
+          <w:tcPr>
+            <w:tcW w:type="dxa" w:w="2266"/>
+            <w:shd w:val="clear" w:color="auto" w:fill="FFFFFF"/>
+          </w:tcPr>
+          <w:p>
+            <w:r>
+              <w:rPr>
+                <w:color w:val="181818"/>
+                <w:sz w:val="20"/>
+              </w:rPr>
+              <w:t>Yes</w:t>
             </w:r>
           </w:p>
         </w:tc>
@@ -3332,7 +4278,7 @@
       <w:tr>
         <w:tc>
           <w:tcPr>
-            <w:tcW w:type="dxa" w:w="3022"/>
+            <w:tcW w:type="dxa" w:w="2266"/>
             <w:shd w:val="clear" w:color="auto" w:fill="F2F4F7"/>
           </w:tcPr>
           <w:p>
@@ -3347,7 +4293,7 @@
         </w:tc>
         <w:tc>
           <w:tcPr>
-            <w:tcW w:type="dxa" w:w="3022"/>
+            <w:tcW w:type="dxa" w:w="2266"/>
             <w:shd w:val="clear" w:color="auto" w:fill="F2F4F7"/>
           </w:tcPr>
           <w:p>
@@ -3362,7 +4308,7 @@
         </w:tc>
         <w:tc>
           <w:tcPr>
-            <w:tcW w:type="dxa" w:w="3022"/>
+            <w:tcW w:type="dxa" w:w="2266"/>
             <w:shd w:val="clear" w:color="auto" w:fill="F2F4F7"/>
           </w:tcPr>
           <w:p>
@@ -3372,6 +4318,21 @@
                 <w:sz w:val="20"/>
               </w:rPr>
               <w:t>Query CustomField WHERE ReferenceTo = :objectName</w:t>
+            </w:r>
+          </w:p>
+        </w:tc>
+        <w:tc>
+          <w:tcPr>
+            <w:tcW w:type="dxa" w:w="2266"/>
+            <w:shd w:val="clear" w:color="auto" w:fill="F2F4F7"/>
+          </w:tcPr>
+          <w:p>
+            <w:r>
+              <w:rPr>
+                <w:color w:val="181818"/>
+                <w:sz w:val="20"/>
+              </w:rPr>
+              <w:t>Yes</w:t>
             </w:r>
           </w:p>
         </w:tc>
@@ -3379,7 +4340,7 @@
       <w:tr>
         <w:tc>
           <w:tcPr>
-            <w:tcW w:type="dxa" w:w="3022"/>
+            <w:tcW w:type="dxa" w:w="2266"/>
             <w:shd w:val="clear" w:color="auto" w:fill="FFFFFF"/>
           </w:tcPr>
           <w:p>
@@ -3394,7 +4355,7 @@
         </w:tc>
         <w:tc>
           <w:tcPr>
-            <w:tcW w:type="dxa" w:w="3022"/>
+            <w:tcW w:type="dxa" w:w="2266"/>
             <w:shd w:val="clear" w:color="auto" w:fill="FFFFFF"/>
           </w:tcPr>
           <w:p>
@@ -3409,7 +4370,7 @@
         </w:tc>
         <w:tc>
           <w:tcPr>
-            <w:tcW w:type="dxa" w:w="3022"/>
+            <w:tcW w:type="dxa" w:w="2266"/>
             <w:shd w:val="clear" w:color="auto" w:fill="FFFFFF"/>
           </w:tcPr>
           <w:p>
@@ -3418,7 +4379,22 @@
                 <w:color w:val="181818"/>
                 <w:sz w:val="20"/>
               </w:rPr>
-              <w:t>Flag Is_Dynamic_Reference__c = true; cannot be statically resolved</w:t>
+              <w:t>Flag Is_Dynamic_Reference__c = true</w:t>
+            </w:r>
+          </w:p>
+        </w:tc>
+        <w:tc>
+          <w:tcPr>
+            <w:tcW w:type="dxa" w:w="2266"/>
+            <w:shd w:val="clear" w:color="auto" w:fill="FFFFFF"/>
+          </w:tcPr>
+          <w:p>
+            <w:r>
+              <w:rPr>
+                <w:color w:val="181818"/>
+                <w:sz w:val="20"/>
+              </w:rPr>
+              <w:t>NO - permanent blind spot</w:t>
             </w:r>
           </w:p>
         </w:tc>
@@ -3427,35 +4403,17 @@
     <w:p/>
     <w:p>
       <w:pPr>
-        <w:pStyle w:val="Heading2"/>
-        <w:spacing w:before="240" w:after="120"/>
+        <w:spacing w:before="60" w:after="120"/>
+        <w:ind w:left="283"/>
+        <w:shd w:val="clear" w:color="auto" w:fill="EFF4FB"/>
       </w:pPr>
       <w:r>
         <w:rPr>
-          <w:b/>
-          <w:color w:val="0070D2"/>
-          <w:sz w:val="28"/>
+          <w:i/>
+          <w:color w:val="032D60"/>
+          <w:sz w:val="19"/>
         </w:rPr>
-        <w:t>6.1 IDependencyTypeHandler Interface</w:t>
-      </w:r>
-    </w:p>
-    <w:p>
-      <w:pPr>
-        <w:spacing w:before="60" w:after="60"/>
-        <w:ind w:left="454"/>
-        <w:shd w:val="clear" w:color="auto" w:fill="EAECF0"/>
-      </w:pPr>
-      <w:r>
-        <w:rPr>
-          <w:rFonts w:ascii="Courier New" w:hAnsi="Courier New"/>
-          <w:color w:val="1E1E2E"/>
-          <w:sz w:val="18"/>
-        </w:rPr>
-        <w:t>public interface IDependencyTypeHandler {</w:t>
-        <w:br/>
-        <w:t xml:space="preserve">    List&lt;Dependency_Node__c&gt; findSupplemental(Id jobId, List&lt;Dependency_Node__c&gt; nodesOfType);</w:t>
-        <w:br/>
-        <w:t>}</w:t>
+        <w:t>Dynamic Apex references (e.g. Schema.getGlobalDescribe().get(dynamicString)) are an inherent Salesforce platform limitation. No supplemental query can resolve them. They are a permanent blind spot, not a pending feature.</w:t>
       </w:r>
     </w:p>
     <w:p>
@@ -3469,7 +4427,7 @@
           <w:color w:val="032D60"/>
           <w:sz w:val="36"/>
         </w:rPr>
-        <w:t>7. Integration &amp; Tooling API Strategy</w:t>
+        <w:t>7. Integration &amp; Tooling API</w:t>
       </w:r>
     </w:p>
     <w:p>
@@ -3491,7 +4449,7 @@
           <w:color w:val="0070D2"/>
           <w:sz w:val="28"/>
         </w:rPr>
-        <w:t>7.1 Loopback Auth (Post-Install, Manual)</w:t>
+        <w:t>7.1 Loopback Auth</w:t>
       </w:r>
     </w:p>
     <w:tbl>
@@ -3639,9 +4597,9 @@
     <w:p/>
     <w:p>
       <w:pPr>
-        <w:spacing w:before="80" w:after="120"/>
+        <w:spacing w:before="60" w:after="120"/>
         <w:ind w:left="283"/>
-        <w:shd w:val="clear" w:color="auto" w:fill="F2F4F7"/>
+        <w:shd w:val="clear" w:color="auto" w:fill="EFF4FB"/>
       </w:pPr>
       <w:r>
         <w:rPr>
@@ -3723,7 +4681,7 @@
                 <w:color w:val="181818"/>
                 <w:sz w:val="20"/>
               </w:rPr>
-              <w:t>IN clause chunk</w:t>
+              <w:t>IN chunk size</w:t>
             </w:r>
           </w:p>
         </w:tc>
@@ -3738,7 +4696,7 @@
                 <w:color w:val="181818"/>
                 <w:sz w:val="20"/>
               </w:rPr>
-              <w:t>100 IDs maximum per query (validated safe URI length limit)</w:t>
+              <w:t>~100 IDs initial; split when estimated SOQL string &gt; 8KB URI budget</w:t>
             </w:r>
           </w:p>
         </w:tc>
@@ -3770,7 +4728,7 @@
                 <w:color w:val="181818"/>
                 <w:sz w:val="20"/>
               </w:rPr>
-              <w:t>Follow nextRecordsUrl iteratively until done = true (handles &gt;2,000 row results)</w:t>
+              <w:t>Follow nextRecordsUrl until done = true; each follow-up counted against callout budget</w:t>
             </w:r>
           </w:p>
         </w:tc>
@@ -3802,7 +4760,7 @@
                 <w:color w:val="181818"/>
                 <w:sz w:val="20"/>
               </w:rPr>
-              <w:t>Split batch in half, retry both halves; log to Error_Message__c; do not fail the job</w:t>
+              <w:t>Split batch in half, retry both halves; do not fail job; log to Error_Message__c</w:t>
             </w:r>
           </w:p>
         </w:tc>
@@ -3834,39 +4792,7 @@
                 <w:color w:val="181818"/>
                 <w:sz w:val="20"/>
               </w:rPr>
-              <w:t>Separate callout: SELECT Id FROM Flow WHERE Id IN :ids AND Status = Active (triggers 60% guardrail)</w:t>
-            </w:r>
-          </w:p>
-        </w:tc>
-      </w:tr>
-      <w:tr>
-        <w:tc>
-          <w:tcPr>
-            <w:tcW w:type="dxa" w:w="4533"/>
-            <w:shd w:val="clear" w:color="auto" w:fill="F2F4F7"/>
-          </w:tcPr>
-          <w:p>
-            <w:r>
-              <w:rPr>
-                <w:color w:val="181818"/>
-                <w:sz w:val="20"/>
-              </w:rPr>
-              <w:t>Callout target</w:t>
-            </w:r>
-          </w:p>
-        </w:tc>
-        <w:tc>
-          <w:tcPr>
-            <w:tcW w:type="dxa" w:w="4533"/>
-            <w:shd w:val="clear" w:color="auto" w:fill="F2F4F7"/>
-          </w:tcPr>
-          <w:p>
-            <w:r>
-              <w:rPr>
-                <w:color w:val="181818"/>
-                <w:sz w:val="20"/>
-              </w:rPr>
-              <w:t>callout:MetaMapper_Tooling_API/services/data/v66.0/tooling/query/?q=...</w:t>
+              <w:t>SELECT Id FROM Flow WHERE Id IN :ids AND Status = Active (extra callout; triggers headroom increase)</w:t>
             </w:r>
           </w:p>
         </w:tc>
@@ -3967,7 +4893,7 @@
                 <w:color w:val="181818"/>
                 <w:sz w:val="20"/>
               </w:rPr>
-              <w:t>Dependency_Job__c: Private. Users see only jobs they initiated.</w:t>
+              <w:t>Dependency_Job__c: Private</w:t>
             </w:r>
           </w:p>
         </w:tc>
@@ -3999,7 +4925,7 @@
                 <w:color w:val="181818"/>
                 <w:sz w:val="20"/>
               </w:rPr>
-              <w:t>MetaMapper_Admin: CRUD on both objects, Named Credential principal, LWC/Controller access</w:t>
+              <w:t>MetaMapper_Admin: CRUD on both objects, Named Credential principal, LWC/Controller</w:t>
             </w:r>
           </w:p>
         </w:tc>
@@ -4016,7 +4942,7 @@
                 <w:color w:val="181818"/>
                 <w:sz w:val="20"/>
               </w:rPr>
-              <w:t>Runtime FLS/CRUD</w:t>
+              <w:t>USER_MODE</w:t>
             </w:r>
           </w:p>
         </w:tc>
@@ -4031,7 +4957,7 @@
                 <w:color w:val="181818"/>
                 <w:sz w:val="20"/>
               </w:rPr>
-              <w:t>All Apex DML and SOQL uses WITH USER_MODE or AccessLevel.USER_MODE</w:t>
+              <w:t>Applied ONLY at @AuraEnabled controller boundary for user-facing data access</w:t>
             </w:r>
           </w:p>
         </w:tc>
@@ -4048,7 +4974,7 @@
                 <w:color w:val="181818"/>
                 <w:sz w:val="20"/>
               </w:rPr>
-              <w:t>Secret management</w:t>
+              <w:t>SYSTEM_MODE</w:t>
             </w:r>
           </w:p>
         </w:tc>
@@ -4063,7 +4989,7 @@
                 <w:color w:val="181818"/>
                 <w:sz w:val="20"/>
               </w:rPr>
-              <w:t>No credentials in source. Named Credential handles token storage and refresh.</w:t>
+              <w:t>Queueable engine, cleanup batch, notification service - reliable internal orchestration</w:t>
             </w:r>
           </w:p>
         </w:tc>
@@ -4112,7 +5038,7 @@
                 <w:color w:val="181818"/>
                 <w:sz w:val="20"/>
               </w:rPr>
-              <w:t>ECharts library</w:t>
+              <w:t>ECharts</w:t>
             </w:r>
           </w:p>
         </w:tc>
@@ -4145,7 +5071,7 @@
           <w:color w:val="032D60"/>
           <w:sz w:val="36"/>
         </w:rPr>
-        <w:t>9. UI/UX &amp; Presentation Layer</w:t>
+        <w:t>9. UI/UX</w:t>
       </w:r>
     </w:p>
     <w:p>
@@ -4155,20 +5081,6 @@
           <w:bottom w:val="single" w:sz="4" w:space="1" w:color="0070D2"/>
         </w:pBdr>
       </w:pPr>
-    </w:p>
-    <w:p>
-      <w:pPr>
-        <w:spacing w:after="80"/>
-      </w:pPr>
-      <w:r>
-        <w:rPr>
-          <w:b w:val="0"/>
-          <w:i w:val="0"/>
-          <w:color w:val="181818"/>
-          <w:sz w:val="21"/>
-        </w:rPr>
-        <w:t>"Precision Intelligence" aesthetic: SLDS scaffolding, monospace metadata names, ECharts graph as the visual centerpiece.</w:t>
-      </w:r>
     </w:p>
     <w:p>
       <w:pPr>
@@ -4184,18 +5096,449 @@
         <w:t>9.1 Color Palette</w:t>
       </w:r>
     </w:p>
+    <w:tbl>
+      <w:tblPr>
+        <w:tblStyle w:val="TableGrid"/>
+        <w:tblW w:type="auto" w:w="0"/>
+        <w:jc w:val="left"/>
+        <w:tblLook w:firstColumn="1" w:firstRow="1" w:lastColumn="0" w:lastRow="0" w:noHBand="0" w:noVBand="1" w:val="04A0"/>
+      </w:tblPr>
+      <w:tblGrid>
+        <w:gridCol w:w="4533"/>
+        <w:gridCol w:w="4533"/>
+      </w:tblGrid>
+      <w:tr>
+        <w:tc>
+          <w:tcPr>
+            <w:tcW w:type="dxa" w:w="4533"/>
+            <w:shd w:val="clear" w:color="auto" w:fill="032D60"/>
+          </w:tcPr>
+          <w:p>
+            <w:r>
+              <w:rPr>
+                <w:b/>
+                <w:color w:val="FFFFFF"/>
+                <w:sz w:val="20"/>
+              </w:rPr>
+              <w:t>Metadata Type</w:t>
+            </w:r>
+          </w:p>
+        </w:tc>
+        <w:tc>
+          <w:tcPr>
+            <w:tcW w:type="dxa" w:w="4533"/>
+            <w:shd w:val="clear" w:color="auto" w:fill="032D60"/>
+          </w:tcPr>
+          <w:p>
+            <w:r>
+              <w:rPr>
+                <w:b/>
+                <w:color w:val="FFFFFF"/>
+                <w:sz w:val="20"/>
+              </w:rPr>
+              <w:t>Hex</w:t>
+            </w:r>
+          </w:p>
+        </w:tc>
+      </w:tr>
+      <w:tr>
+        <w:tc>
+          <w:tcPr>
+            <w:tcW w:type="dxa" w:w="4533"/>
+            <w:shd w:val="clear" w:color="auto" w:fill="F2F4F7"/>
+          </w:tcPr>
+          <w:p>
+            <w:r>
+              <w:rPr>
+                <w:color w:val="181818"/>
+                <w:sz w:val="20"/>
+              </w:rPr>
+              <w:t>ApexClass</w:t>
+            </w:r>
+          </w:p>
+        </w:tc>
+        <w:tc>
+          <w:tcPr>
+            <w:tcW w:type="dxa" w:w="4533"/>
+            <w:shd w:val="clear" w:color="auto" w:fill="F2F4F7"/>
+          </w:tcPr>
+          <w:p>
+            <w:r>
+              <w:rPr>
+                <w:color w:val="181818"/>
+                <w:sz w:val="20"/>
+              </w:rPr>
+              <w:t>#0070D2</w:t>
+            </w:r>
+          </w:p>
+        </w:tc>
+      </w:tr>
+      <w:tr>
+        <w:tc>
+          <w:tcPr>
+            <w:tcW w:type="dxa" w:w="4533"/>
+            <w:shd w:val="clear" w:color="auto" w:fill="FFFFFF"/>
+          </w:tcPr>
+          <w:p>
+            <w:r>
+              <w:rPr>
+                <w:color w:val="181818"/>
+                <w:sz w:val="20"/>
+              </w:rPr>
+              <w:t>ApexTrigger</w:t>
+            </w:r>
+          </w:p>
+        </w:tc>
+        <w:tc>
+          <w:tcPr>
+            <w:tcW w:type="dxa" w:w="4533"/>
+            <w:shd w:val="clear" w:color="auto" w:fill="FFFFFF"/>
+          </w:tcPr>
+          <w:p>
+            <w:r>
+              <w:rPr>
+                <w:color w:val="181818"/>
+                <w:sz w:val="20"/>
+              </w:rPr>
+              <w:t>#005FB2</w:t>
+            </w:r>
+          </w:p>
+        </w:tc>
+      </w:tr>
+      <w:tr>
+        <w:tc>
+          <w:tcPr>
+            <w:tcW w:type="dxa" w:w="4533"/>
+            <w:shd w:val="clear" w:color="auto" w:fill="F2F4F7"/>
+          </w:tcPr>
+          <w:p>
+            <w:r>
+              <w:rPr>
+                <w:color w:val="181818"/>
+                <w:sz w:val="20"/>
+              </w:rPr>
+              <w:t>Flow</w:t>
+            </w:r>
+          </w:p>
+        </w:tc>
+        <w:tc>
+          <w:tcPr>
+            <w:tcW w:type="dxa" w:w="4533"/>
+            <w:shd w:val="clear" w:color="auto" w:fill="F2F4F7"/>
+          </w:tcPr>
+          <w:p>
+            <w:r>
+              <w:rPr>
+                <w:color w:val="181818"/>
+                <w:sz w:val="20"/>
+              </w:rPr>
+              <w:t>#2E844A</w:t>
+            </w:r>
+          </w:p>
+        </w:tc>
+      </w:tr>
+      <w:tr>
+        <w:tc>
+          <w:tcPr>
+            <w:tcW w:type="dxa" w:w="4533"/>
+            <w:shd w:val="clear" w:color="auto" w:fill="FFFFFF"/>
+          </w:tcPr>
+          <w:p>
+            <w:r>
+              <w:rPr>
+                <w:color w:val="181818"/>
+                <w:sz w:val="20"/>
+              </w:rPr>
+              <w:t>CustomField</w:t>
+            </w:r>
+          </w:p>
+        </w:tc>
+        <w:tc>
+          <w:tcPr>
+            <w:tcW w:type="dxa" w:w="4533"/>
+            <w:shd w:val="clear" w:color="auto" w:fill="FFFFFF"/>
+          </w:tcPr>
+          <w:p>
+            <w:r>
+              <w:rPr>
+                <w:color w:val="181818"/>
+                <w:sz w:val="20"/>
+              </w:rPr>
+              <w:t>#E07A00</w:t>
+            </w:r>
+          </w:p>
+        </w:tc>
+      </w:tr>
+      <w:tr>
+        <w:tc>
+          <w:tcPr>
+            <w:tcW w:type="dxa" w:w="4533"/>
+            <w:shd w:val="clear" w:color="auto" w:fill="F2F4F7"/>
+          </w:tcPr>
+          <w:p>
+            <w:r>
+              <w:rPr>
+                <w:color w:val="181818"/>
+                <w:sz w:val="20"/>
+              </w:rPr>
+              <w:t>CustomObject</w:t>
+            </w:r>
+          </w:p>
+        </w:tc>
+        <w:tc>
+          <w:tcPr>
+            <w:tcW w:type="dxa" w:w="4533"/>
+            <w:shd w:val="clear" w:color="auto" w:fill="F2F4F7"/>
+          </w:tcPr>
+          <w:p>
+            <w:r>
+              <w:rPr>
+                <w:color w:val="181818"/>
+                <w:sz w:val="20"/>
+              </w:rPr>
+              <w:t>#032D60</w:t>
+            </w:r>
+          </w:p>
+        </w:tc>
+      </w:tr>
+      <w:tr>
+        <w:tc>
+          <w:tcPr>
+            <w:tcW w:type="dxa" w:w="4533"/>
+            <w:shd w:val="clear" w:color="auto" w:fill="FFFFFF"/>
+          </w:tcPr>
+          <w:p>
+            <w:r>
+              <w:rPr>
+                <w:color w:val="181818"/>
+                <w:sz w:val="20"/>
+              </w:rPr>
+              <w:t>ValidationRule</w:t>
+            </w:r>
+          </w:p>
+        </w:tc>
+        <w:tc>
+          <w:tcPr>
+            <w:tcW w:type="dxa" w:w="4533"/>
+            <w:shd w:val="clear" w:color="auto" w:fill="FFFFFF"/>
+          </w:tcPr>
+          <w:p>
+            <w:r>
+              <w:rPr>
+                <w:color w:val="181818"/>
+                <w:sz w:val="20"/>
+              </w:rPr>
+              <w:t>#BA0517</w:t>
+            </w:r>
+          </w:p>
+        </w:tc>
+      </w:tr>
+      <w:tr>
+        <w:tc>
+          <w:tcPr>
+            <w:tcW w:type="dxa" w:w="4533"/>
+            <w:shd w:val="clear" w:color="auto" w:fill="F2F4F7"/>
+          </w:tcPr>
+          <w:p>
+            <w:r>
+              <w:rPr>
+                <w:color w:val="181818"/>
+                <w:sz w:val="20"/>
+              </w:rPr>
+              <w:t>LightningComponentBundle</w:t>
+            </w:r>
+          </w:p>
+        </w:tc>
+        <w:tc>
+          <w:tcPr>
+            <w:tcW w:type="dxa" w:w="4533"/>
+            <w:shd w:val="clear" w:color="auto" w:fill="F2F4F7"/>
+          </w:tcPr>
+          <w:p>
+            <w:r>
+              <w:rPr>
+                <w:color w:val="181818"/>
+                <w:sz w:val="20"/>
+              </w:rPr>
+              <w:t>#7B5EA7</w:t>
+            </w:r>
+          </w:p>
+        </w:tc>
+      </w:tr>
+      <w:tr>
+        <w:tc>
+          <w:tcPr>
+            <w:tcW w:type="dxa" w:w="4533"/>
+            <w:shd w:val="clear" w:color="auto" w:fill="FFFFFF"/>
+          </w:tcPr>
+          <w:p>
+            <w:r>
+              <w:rPr>
+                <w:color w:val="181818"/>
+                <w:sz w:val="20"/>
+              </w:rPr>
+              <w:t>PermissionSet</w:t>
+            </w:r>
+          </w:p>
+        </w:tc>
+        <w:tc>
+          <w:tcPr>
+            <w:tcW w:type="dxa" w:w="4533"/>
+            <w:shd w:val="clear" w:color="auto" w:fill="FFFFFF"/>
+          </w:tcPr>
+          <w:p>
+            <w:r>
+              <w:rPr>
+                <w:color w:val="181818"/>
+                <w:sz w:val="20"/>
+              </w:rPr>
+              <w:t>#0B827C</w:t>
+            </w:r>
+          </w:p>
+        </w:tc>
+      </w:tr>
+      <w:tr>
+        <w:tc>
+          <w:tcPr>
+            <w:tcW w:type="dxa" w:w="4533"/>
+            <w:shd w:val="clear" w:color="auto" w:fill="F2F4F7"/>
+          </w:tcPr>
+          <w:p>
+            <w:r>
+              <w:rPr>
+                <w:color w:val="181818"/>
+                <w:sz w:val="20"/>
+              </w:rPr>
+              <w:t>WorkflowRule</w:t>
+            </w:r>
+          </w:p>
+        </w:tc>
+        <w:tc>
+          <w:tcPr>
+            <w:tcW w:type="dxa" w:w="4533"/>
+            <w:shd w:val="clear" w:color="auto" w:fill="F2F4F7"/>
+          </w:tcPr>
+          <w:p>
+            <w:r>
+              <w:rPr>
+                <w:color w:val="181818"/>
+                <w:sz w:val="20"/>
+              </w:rPr>
+              <w:t>#A954A3</w:t>
+            </w:r>
+          </w:p>
+        </w:tc>
+      </w:tr>
+      <w:tr>
+        <w:tc>
+          <w:tcPr>
+            <w:tcW w:type="dxa" w:w="4533"/>
+            <w:shd w:val="clear" w:color="auto" w:fill="FFFFFF"/>
+          </w:tcPr>
+          <w:p>
+            <w:r>
+              <w:rPr>
+                <w:color w:val="181818"/>
+                <w:sz w:val="20"/>
+              </w:rPr>
+              <w:t>EmailTemplate</w:t>
+            </w:r>
+          </w:p>
+        </w:tc>
+        <w:tc>
+          <w:tcPr>
+            <w:tcW w:type="dxa" w:w="4533"/>
+            <w:shd w:val="clear" w:color="auto" w:fill="FFFFFF"/>
+          </w:tcPr>
+          <w:p>
+            <w:r>
+              <w:rPr>
+                <w:color w:val="181818"/>
+                <w:sz w:val="20"/>
+              </w:rPr>
+              <w:t>#5867E8</w:t>
+            </w:r>
+          </w:p>
+        </w:tc>
+      </w:tr>
+      <w:tr>
+        <w:tc>
+          <w:tcPr>
+            <w:tcW w:type="dxa" w:w="4533"/>
+            <w:shd w:val="clear" w:color="auto" w:fill="F2F4F7"/>
+          </w:tcPr>
+          <w:p>
+            <w:r>
+              <w:rPr>
+                <w:color w:val="181818"/>
+                <w:sz w:val="20"/>
+              </w:rPr>
+              <w:t>Report / Dashboard</w:t>
+            </w:r>
+          </w:p>
+        </w:tc>
+        <w:tc>
+          <w:tcPr>
+            <w:tcW w:type="dxa" w:w="4533"/>
+            <w:shd w:val="clear" w:color="auto" w:fill="F2F4F7"/>
+          </w:tcPr>
+          <w:p>
+            <w:r>
+              <w:rPr>
+                <w:color w:val="181818"/>
+                <w:sz w:val="20"/>
+              </w:rPr>
+              <w:t>#47B24D</w:t>
+            </w:r>
+          </w:p>
+        </w:tc>
+      </w:tr>
+      <w:tr>
+        <w:tc>
+          <w:tcPr>
+            <w:tcW w:type="dxa" w:w="4533"/>
+            <w:shd w:val="clear" w:color="auto" w:fill="FFFFFF"/>
+          </w:tcPr>
+          <w:p>
+            <w:r>
+              <w:rPr>
+                <w:color w:val="181818"/>
+                <w:sz w:val="20"/>
+              </w:rPr>
+              <w:t>Other / Unknown</w:t>
+            </w:r>
+          </w:p>
+        </w:tc>
+        <w:tc>
+          <w:tcPr>
+            <w:tcW w:type="dxa" w:w="4533"/>
+            <w:shd w:val="clear" w:color="auto" w:fill="FFFFFF"/>
+          </w:tcPr>
+          <w:p>
+            <w:r>
+              <w:rPr>
+                <w:color w:val="181818"/>
+                <w:sz w:val="20"/>
+              </w:rPr>
+              <w:t>#8E9099</w:t>
+            </w:r>
+          </w:p>
+        </w:tc>
+      </w:tr>
+    </w:tbl>
+    <w:p/>
     <w:p>
       <w:pPr>
-        <w:spacing w:after="80"/>
+        <w:pStyle w:val="Heading2"/>
+        <w:spacing w:before="240" w:after="120"/>
       </w:pPr>
       <w:r>
         <w:rPr>
           <w:b/>
-          <w:i w:val="0"/>
-          <w:color w:val="181818"/>
-          <w:sz w:val="21"/>
+          <w:color w:val="0070D2"/>
+          <w:sz w:val="28"/>
         </w:rPr>
-        <w:t>Application Shell</w:t>
+        <w:t>9.2 Node Flags</w:t>
       </w:r>
     </w:p>
     <w:tbl>
@@ -4223,7 +5566,7 @@
                 <w:color w:val="FFFFFF"/>
                 <w:sz w:val="20"/>
               </w:rPr>
-              <w:t>Role</w:t>
+              <w:t>Flag</w:t>
             </w:r>
           </w:p>
         </w:tc>
@@ -4239,7 +5582,7 @@
                 <w:color w:val="FFFFFF"/>
                 <w:sz w:val="20"/>
               </w:rPr>
-              <w:t>Value</w:t>
+              <w:t>Visual</w:t>
             </w:r>
           </w:p>
         </w:tc>
@@ -4255,7 +5598,7 @@
                 <w:color w:val="FFFFFF"/>
                 <w:sz w:val="20"/>
               </w:rPr>
-              <w:t>Usage</w:t>
+              <w:t>Tooltip / Meaning</w:t>
             </w:r>
           </w:p>
         </w:tc>
@@ -4272,7 +5615,7 @@
                 <w:color w:val="181818"/>
                 <w:sz w:val="20"/>
               </w:rPr>
-              <w:t>Page background</w:t>
+              <w:t>Is_Circular__c</w:t>
             </w:r>
           </w:p>
         </w:tc>
@@ -4287,7 +5630,7 @@
                 <w:color w:val="181818"/>
                 <w:sz w:val="20"/>
               </w:rPr>
-              <w:t>#F3F3F3</w:t>
+              <w:t>Dashed border / dimmed</w:t>
             </w:r>
           </w:p>
         </w:tc>
@@ -4302,7 +5645,7 @@
                 <w:color w:val="181818"/>
                 <w:sz w:val="20"/>
               </w:rPr>
-              <w:t>App canvas</w:t>
+              <w:t>True cycle: this node appears in its own ancestor path</w:t>
             </w:r>
           </w:p>
         </w:tc>
@@ -4319,7 +5662,7 @@
                 <w:color w:val="181818"/>
                 <w:sz w:val="20"/>
               </w:rPr>
-              <w:t>Card surface</w:t>
+              <w:t>Is_Dynamic_Reference__c</w:t>
             </w:r>
           </w:p>
         </w:tc>
@@ -4334,7 +5677,7 @@
                 <w:color w:val="181818"/>
                 <w:sz w:val="20"/>
               </w:rPr>
-              <w:t>#FFFFFF</w:t>
+              <w:t>~ prefix on name</w:t>
             </w:r>
           </w:p>
         </w:tc>
@@ -4349,7 +5692,7 @@
                 <w:color w:val="181818"/>
                 <w:sz w:val="20"/>
               </w:rPr>
-              <w:t>All cards and panels</w:t>
+              <w:t>Permanent blind spot - dynamic Apex string, cannot be statically resolved</w:t>
             </w:r>
           </w:p>
         </w:tc>
@@ -4366,7 +5709,7 @@
                 <w:color w:val="181818"/>
                 <w:sz w:val="20"/>
               </w:rPr>
-              <w:t>Primary action</w:t>
+              <w:t>Source__c = Supplemental</w:t>
             </w:r>
           </w:p>
         </w:tc>
@@ -4381,7 +5724,7 @@
                 <w:color w:val="181818"/>
                 <w:sz w:val="20"/>
               </w:rPr>
-              <w:t>#0070D2</w:t>
+              <w:t>[S] badge</w:t>
             </w:r>
           </w:p>
         </w:tc>
@@ -4396,7 +5739,7 @@
                 <w:color w:val="181818"/>
                 <w:sz w:val="20"/>
               </w:rPr>
-              <w:t>Buttons, links, progress bar fill</w:t>
+              <w:t>Found via secondary query, not MetadataComponentDependency</w:t>
             </w:r>
           </w:p>
         </w:tc>
@@ -4413,7 +5756,7 @@
                 <w:color w:val="181818"/>
                 <w:sz w:val="20"/>
               </w:rPr>
-              <w:t>Brand dark</w:t>
+              <w:t>Shared / diamond dep</w:t>
             </w:r>
           </w:p>
         </w:tc>
@@ -4428,7 +5771,7 @@
                 <w:color w:val="181818"/>
                 <w:sz w:val="20"/>
               </w:rPr>
-              <w:t>#032D60</w:t>
+              <w:t>Normal node, no flag</w:t>
             </w:r>
           </w:p>
         </w:tc>
@@ -4443,790 +5786,7 @@
                 <w:color w:val="181818"/>
                 <w:sz w:val="20"/>
               </w:rPr>
-              <w:t>Section headers, stat tile values</w:t>
-            </w:r>
-          </w:p>
-        </w:tc>
-      </w:tr>
-      <w:tr>
-        <w:tc>
-          <w:tcPr>
-            <w:tcW w:type="dxa" w:w="3022"/>
-            <w:shd w:val="clear" w:color="auto" w:fill="F2F4F7"/>
-          </w:tcPr>
-          <w:p>
-            <w:r>
-              <w:rPr>
-                <w:color w:val="181818"/>
-                <w:sz w:val="20"/>
-              </w:rPr>
-              <w:t>Success</w:t>
-            </w:r>
-          </w:p>
-        </w:tc>
-        <w:tc>
-          <w:tcPr>
-            <w:tcW w:type="dxa" w:w="3022"/>
-            <w:shd w:val="clear" w:color="auto" w:fill="F2F4F7"/>
-          </w:tcPr>
-          <w:p>
-            <w:r>
-              <w:rPr>
-                <w:color w:val="181818"/>
-                <w:sz w:val="20"/>
-              </w:rPr>
-              <w:t>#2E844A</w:t>
-            </w:r>
-          </w:p>
-        </w:tc>
-        <w:tc>
-          <w:tcPr>
-            <w:tcW w:type="dxa" w:w="3022"/>
-            <w:shd w:val="clear" w:color="auto" w:fill="F2F4F7"/>
-          </w:tcPr>
-          <w:p>
-            <w:r>
-              <w:rPr>
-                <w:color w:val="181818"/>
-                <w:sz w:val="20"/>
-              </w:rPr>
-              <w:t>Completed status</w:t>
-            </w:r>
-          </w:p>
-        </w:tc>
-      </w:tr>
-      <w:tr>
-        <w:tc>
-          <w:tcPr>
-            <w:tcW w:type="dxa" w:w="3022"/>
-            <w:shd w:val="clear" w:color="auto" w:fill="FFFFFF"/>
-          </w:tcPr>
-          <w:p>
-            <w:r>
-              <w:rPr>
-                <w:color w:val="181818"/>
-                <w:sz w:val="20"/>
-              </w:rPr>
-              <w:t>Warning</w:t>
-            </w:r>
-          </w:p>
-        </w:tc>
-        <w:tc>
-          <w:tcPr>
-            <w:tcW w:type="dxa" w:w="3022"/>
-            <w:shd w:val="clear" w:color="auto" w:fill="FFFFFF"/>
-          </w:tcPr>
-          <w:p>
-            <w:r>
-              <w:rPr>
-                <w:color w:val="181818"/>
-                <w:sz w:val="20"/>
-              </w:rPr>
-              <w:t>#E07A00</w:t>
-            </w:r>
-          </w:p>
-        </w:tc>
-        <w:tc>
-          <w:tcPr>
-            <w:tcW w:type="dxa" w:w="3022"/>
-            <w:shd w:val="clear" w:color="auto" w:fill="FFFFFF"/>
-          </w:tcPr>
-          <w:p>
-            <w:r>
-              <w:rPr>
-                <w:color w:val="181818"/>
-                <w:sz w:val="20"/>
-              </w:rPr>
-              <w:t>Processing status</w:t>
-            </w:r>
-          </w:p>
-        </w:tc>
-      </w:tr>
-      <w:tr>
-        <w:tc>
-          <w:tcPr>
-            <w:tcW w:type="dxa" w:w="3022"/>
-            <w:shd w:val="clear" w:color="auto" w:fill="F2F4F7"/>
-          </w:tcPr>
-          <w:p>
-            <w:r>
-              <w:rPr>
-                <w:color w:val="181818"/>
-                <w:sz w:val="20"/>
-              </w:rPr>
-              <w:t>Destructive</w:t>
-            </w:r>
-          </w:p>
-        </w:tc>
-        <w:tc>
-          <w:tcPr>
-            <w:tcW w:type="dxa" w:w="3022"/>
-            <w:shd w:val="clear" w:color="auto" w:fill="F2F4F7"/>
-          </w:tcPr>
-          <w:p>
-            <w:r>
-              <w:rPr>
-                <w:color w:val="181818"/>
-                <w:sz w:val="20"/>
-              </w:rPr>
-              <w:t>#BA0517</w:t>
-            </w:r>
-          </w:p>
-        </w:tc>
-        <w:tc>
-          <w:tcPr>
-            <w:tcW w:type="dxa" w:w="3022"/>
-            <w:shd w:val="clear" w:color="auto" w:fill="F2F4F7"/>
-          </w:tcPr>
-          <w:p>
-            <w:r>
-              <w:rPr>
-                <w:color w:val="181818"/>
-                <w:sz w:val="20"/>
-              </w:rPr>
-              <w:t>Error / Failed status</w:t>
-            </w:r>
-          </w:p>
-        </w:tc>
-      </w:tr>
-    </w:tbl>
-    <w:p/>
-    <w:p>
-      <w:pPr>
-        <w:spacing w:after="80"/>
-      </w:pPr>
-      <w:r>
-        <w:rPr>
-          <w:b/>
-          <w:i w:val="0"/>
-          <w:color w:val="181818"/>
-          <w:sz w:val="21"/>
-        </w:rPr>
-        <w:t>Node Graph - Metadata Type Color Coding</w:t>
-      </w:r>
-    </w:p>
-    <w:tbl>
-      <w:tblPr>
-        <w:tblStyle w:val="TableGrid"/>
-        <w:tblW w:type="auto" w:w="0"/>
-        <w:jc w:val="left"/>
-        <w:tblLook w:firstColumn="1" w:firstRow="1" w:lastColumn="0" w:lastRow="0" w:noHBand="0" w:noVBand="1" w:val="04A0"/>
-      </w:tblPr>
-      <w:tblGrid>
-        <w:gridCol w:w="3022"/>
-        <w:gridCol w:w="3022"/>
-        <w:gridCol w:w="3022"/>
-      </w:tblGrid>
-      <w:tr>
-        <w:tc>
-          <w:tcPr>
-            <w:tcW w:type="dxa" w:w="3022"/>
-            <w:shd w:val="clear" w:color="auto" w:fill="032D60"/>
-          </w:tcPr>
-          <w:p>
-            <w:r>
-              <w:rPr>
-                <w:b/>
-                <w:color w:val="FFFFFF"/>
-                <w:sz w:val="20"/>
-              </w:rPr>
-              <w:t>Metadata Type</w:t>
-            </w:r>
-          </w:p>
-        </w:tc>
-        <w:tc>
-          <w:tcPr>
-            <w:tcW w:type="dxa" w:w="3022"/>
-            <w:shd w:val="clear" w:color="auto" w:fill="032D60"/>
-          </w:tcPr>
-          <w:p>
-            <w:r>
-              <w:rPr>
-                <w:b/>
-                <w:color w:val="FFFFFF"/>
-                <w:sz w:val="20"/>
-              </w:rPr>
-              <w:t>Hex</w:t>
-            </w:r>
-          </w:p>
-        </w:tc>
-        <w:tc>
-          <w:tcPr>
-            <w:tcW w:type="dxa" w:w="3022"/>
-            <w:shd w:val="clear" w:color="auto" w:fill="032D60"/>
-          </w:tcPr>
-          <w:p>
-            <w:r>
-              <w:rPr>
-                <w:b/>
-                <w:color w:val="FFFFFF"/>
-                <w:sz w:val="20"/>
-              </w:rPr>
-              <w:t>Rationale</w:t>
-            </w:r>
-          </w:p>
-        </w:tc>
-      </w:tr>
-      <w:tr>
-        <w:tc>
-          <w:tcPr>
-            <w:tcW w:type="dxa" w:w="3022"/>
-            <w:shd w:val="clear" w:color="auto" w:fill="F2F4F7"/>
-          </w:tcPr>
-          <w:p>
-            <w:r>
-              <w:rPr>
-                <w:color w:val="181818"/>
-                <w:sz w:val="20"/>
-              </w:rPr>
-              <w:t>ApexClass</w:t>
-            </w:r>
-          </w:p>
-        </w:tc>
-        <w:tc>
-          <w:tcPr>
-            <w:tcW w:type="dxa" w:w="3022"/>
-            <w:shd w:val="clear" w:color="auto" w:fill="F2F4F7"/>
-          </w:tcPr>
-          <w:p>
-            <w:r>
-              <w:rPr>
-                <w:color w:val="181818"/>
-                <w:sz w:val="20"/>
-              </w:rPr>
-              <w:t>#0070D2</w:t>
-            </w:r>
-          </w:p>
-        </w:tc>
-        <w:tc>
-          <w:tcPr>
-            <w:tcW w:type="dxa" w:w="3022"/>
-            <w:shd w:val="clear" w:color="auto" w:fill="F2F4F7"/>
-          </w:tcPr>
-          <w:p>
-            <w:r>
-              <w:rPr>
-                <w:color w:val="181818"/>
-                <w:sz w:val="20"/>
-              </w:rPr>
-              <w:t>Salesforce blue</w:t>
-            </w:r>
-          </w:p>
-        </w:tc>
-      </w:tr>
-      <w:tr>
-        <w:tc>
-          <w:tcPr>
-            <w:tcW w:type="dxa" w:w="3022"/>
-            <w:shd w:val="clear" w:color="auto" w:fill="FFFFFF"/>
-          </w:tcPr>
-          <w:p>
-            <w:r>
-              <w:rPr>
-                <w:color w:val="181818"/>
-                <w:sz w:val="20"/>
-              </w:rPr>
-              <w:t>ApexTrigger</w:t>
-            </w:r>
-          </w:p>
-        </w:tc>
-        <w:tc>
-          <w:tcPr>
-            <w:tcW w:type="dxa" w:w="3022"/>
-            <w:shd w:val="clear" w:color="auto" w:fill="FFFFFF"/>
-          </w:tcPr>
-          <w:p>
-            <w:r>
-              <w:rPr>
-                <w:color w:val="181818"/>
-                <w:sz w:val="20"/>
-              </w:rPr>
-              <w:t>#005FB2</w:t>
-            </w:r>
-          </w:p>
-        </w:tc>
-        <w:tc>
-          <w:tcPr>
-            <w:tcW w:type="dxa" w:w="3022"/>
-            <w:shd w:val="clear" w:color="auto" w:fill="FFFFFF"/>
-          </w:tcPr>
-          <w:p>
-            <w:r>
-              <w:rPr>
-                <w:color w:val="181818"/>
-                <w:sz w:val="20"/>
-              </w:rPr>
-              <w:t>Darker blue</w:t>
-            </w:r>
-          </w:p>
-        </w:tc>
-      </w:tr>
-      <w:tr>
-        <w:tc>
-          <w:tcPr>
-            <w:tcW w:type="dxa" w:w="3022"/>
-            <w:shd w:val="clear" w:color="auto" w:fill="F2F4F7"/>
-          </w:tcPr>
-          <w:p>
-            <w:r>
-              <w:rPr>
-                <w:color w:val="181818"/>
-                <w:sz w:val="20"/>
-              </w:rPr>
-              <w:t>Flow</w:t>
-            </w:r>
-          </w:p>
-        </w:tc>
-        <w:tc>
-          <w:tcPr>
-            <w:tcW w:type="dxa" w:w="3022"/>
-            <w:shd w:val="clear" w:color="auto" w:fill="F2F4F7"/>
-          </w:tcPr>
-          <w:p>
-            <w:r>
-              <w:rPr>
-                <w:color w:val="181818"/>
-                <w:sz w:val="20"/>
-              </w:rPr>
-              <w:t>#2E844A</w:t>
-            </w:r>
-          </w:p>
-        </w:tc>
-        <w:tc>
-          <w:tcPr>
-            <w:tcW w:type="dxa" w:w="3022"/>
-            <w:shd w:val="clear" w:color="auto" w:fill="F2F4F7"/>
-          </w:tcPr>
-          <w:p>
-            <w:r>
-              <w:rPr>
-                <w:color w:val="181818"/>
-                <w:sz w:val="20"/>
-              </w:rPr>
-              <w:t>Green - automation</w:t>
-            </w:r>
-          </w:p>
-        </w:tc>
-      </w:tr>
-      <w:tr>
-        <w:tc>
-          <w:tcPr>
-            <w:tcW w:type="dxa" w:w="3022"/>
-            <w:shd w:val="clear" w:color="auto" w:fill="FFFFFF"/>
-          </w:tcPr>
-          <w:p>
-            <w:r>
-              <w:rPr>
-                <w:color w:val="181818"/>
-                <w:sz w:val="20"/>
-              </w:rPr>
-              <w:t>CustomField</w:t>
-            </w:r>
-          </w:p>
-        </w:tc>
-        <w:tc>
-          <w:tcPr>
-            <w:tcW w:type="dxa" w:w="3022"/>
-            <w:shd w:val="clear" w:color="auto" w:fill="FFFFFF"/>
-          </w:tcPr>
-          <w:p>
-            <w:r>
-              <w:rPr>
-                <w:color w:val="181818"/>
-                <w:sz w:val="20"/>
-              </w:rPr>
-              <w:t>#E07A00</w:t>
-            </w:r>
-          </w:p>
-        </w:tc>
-        <w:tc>
-          <w:tcPr>
-            <w:tcW w:type="dxa" w:w="3022"/>
-            <w:shd w:val="clear" w:color="auto" w:fill="FFFFFF"/>
-          </w:tcPr>
-          <w:p>
-            <w:r>
-              <w:rPr>
-                <w:color w:val="181818"/>
-                <w:sz w:val="20"/>
-              </w:rPr>
-              <w:t>Amber - data schema</w:t>
-            </w:r>
-          </w:p>
-        </w:tc>
-      </w:tr>
-      <w:tr>
-        <w:tc>
-          <w:tcPr>
-            <w:tcW w:type="dxa" w:w="3022"/>
-            <w:shd w:val="clear" w:color="auto" w:fill="F2F4F7"/>
-          </w:tcPr>
-          <w:p>
-            <w:r>
-              <w:rPr>
-                <w:color w:val="181818"/>
-                <w:sz w:val="20"/>
-              </w:rPr>
-              <w:t>CustomObject</w:t>
-            </w:r>
-          </w:p>
-        </w:tc>
-        <w:tc>
-          <w:tcPr>
-            <w:tcW w:type="dxa" w:w="3022"/>
-            <w:shd w:val="clear" w:color="auto" w:fill="F2F4F7"/>
-          </w:tcPr>
-          <w:p>
-            <w:r>
-              <w:rPr>
-                <w:color w:val="181818"/>
-                <w:sz w:val="20"/>
-              </w:rPr>
-              <w:t>#032D60</w:t>
-            </w:r>
-          </w:p>
-        </w:tc>
-        <w:tc>
-          <w:tcPr>
-            <w:tcW w:type="dxa" w:w="3022"/>
-            <w:shd w:val="clear" w:color="auto" w:fill="F2F4F7"/>
-          </w:tcPr>
-          <w:p>
-            <w:r>
-              <w:rPr>
-                <w:color w:val="181818"/>
-                <w:sz w:val="20"/>
-              </w:rPr>
-              <w:t>Dark navy - foundational</w:t>
-            </w:r>
-          </w:p>
-        </w:tc>
-      </w:tr>
-      <w:tr>
-        <w:tc>
-          <w:tcPr>
-            <w:tcW w:type="dxa" w:w="3022"/>
-            <w:shd w:val="clear" w:color="auto" w:fill="FFFFFF"/>
-          </w:tcPr>
-          <w:p>
-            <w:r>
-              <w:rPr>
-                <w:color w:val="181818"/>
-                <w:sz w:val="20"/>
-              </w:rPr>
-              <w:t>ValidationRule</w:t>
-            </w:r>
-          </w:p>
-        </w:tc>
-        <w:tc>
-          <w:tcPr>
-            <w:tcW w:type="dxa" w:w="3022"/>
-            <w:shd w:val="clear" w:color="auto" w:fill="FFFFFF"/>
-          </w:tcPr>
-          <w:p>
-            <w:r>
-              <w:rPr>
-                <w:color w:val="181818"/>
-                <w:sz w:val="20"/>
-              </w:rPr>
-              <w:t>#BA0517</w:t>
-            </w:r>
-          </w:p>
-        </w:tc>
-        <w:tc>
-          <w:tcPr>
-            <w:tcW w:type="dxa" w:w="3022"/>
-            <w:shd w:val="clear" w:color="auto" w:fill="FFFFFF"/>
-          </w:tcPr>
-          <w:p>
-            <w:r>
-              <w:rPr>
-                <w:color w:val="181818"/>
-                <w:sz w:val="20"/>
-              </w:rPr>
-              <w:t>Red - constraint</w:t>
-            </w:r>
-          </w:p>
-        </w:tc>
-      </w:tr>
-      <w:tr>
-        <w:tc>
-          <w:tcPr>
-            <w:tcW w:type="dxa" w:w="3022"/>
-            <w:shd w:val="clear" w:color="auto" w:fill="F2F4F7"/>
-          </w:tcPr>
-          <w:p>
-            <w:r>
-              <w:rPr>
-                <w:color w:val="181818"/>
-                <w:sz w:val="20"/>
-              </w:rPr>
-              <w:t>LightningComponentBundle</w:t>
-            </w:r>
-          </w:p>
-        </w:tc>
-        <w:tc>
-          <w:tcPr>
-            <w:tcW w:type="dxa" w:w="3022"/>
-            <w:shd w:val="clear" w:color="auto" w:fill="F2F4F7"/>
-          </w:tcPr>
-          <w:p>
-            <w:r>
-              <w:rPr>
-                <w:color w:val="181818"/>
-                <w:sz w:val="20"/>
-              </w:rPr>
-              <w:t>#7B5EA7</w:t>
-            </w:r>
-          </w:p>
-        </w:tc>
-        <w:tc>
-          <w:tcPr>
-            <w:tcW w:type="dxa" w:w="3022"/>
-            <w:shd w:val="clear" w:color="auto" w:fill="F2F4F7"/>
-          </w:tcPr>
-          <w:p>
-            <w:r>
-              <w:rPr>
-                <w:color w:val="181818"/>
-                <w:sz w:val="20"/>
-              </w:rPr>
-              <w:t>Purple - UI layer</w:t>
-            </w:r>
-          </w:p>
-        </w:tc>
-      </w:tr>
-      <w:tr>
-        <w:tc>
-          <w:tcPr>
-            <w:tcW w:type="dxa" w:w="3022"/>
-            <w:shd w:val="clear" w:color="auto" w:fill="FFFFFF"/>
-          </w:tcPr>
-          <w:p>
-            <w:r>
-              <w:rPr>
-                <w:color w:val="181818"/>
-                <w:sz w:val="20"/>
-              </w:rPr>
-              <w:t>PermissionSet</w:t>
-            </w:r>
-          </w:p>
-        </w:tc>
-        <w:tc>
-          <w:tcPr>
-            <w:tcW w:type="dxa" w:w="3022"/>
-            <w:shd w:val="clear" w:color="auto" w:fill="FFFFFF"/>
-          </w:tcPr>
-          <w:p>
-            <w:r>
-              <w:rPr>
-                <w:color w:val="181818"/>
-                <w:sz w:val="20"/>
-              </w:rPr>
-              <w:t>#0B827C</w:t>
-            </w:r>
-          </w:p>
-        </w:tc>
-        <w:tc>
-          <w:tcPr>
-            <w:tcW w:type="dxa" w:w="3022"/>
-            <w:shd w:val="clear" w:color="auto" w:fill="FFFFFF"/>
-          </w:tcPr>
-          <w:p>
-            <w:r>
-              <w:rPr>
-                <w:color w:val="181818"/>
-                <w:sz w:val="20"/>
-              </w:rPr>
-              <w:t>Teal - security</w:t>
-            </w:r>
-          </w:p>
-        </w:tc>
-      </w:tr>
-      <w:tr>
-        <w:tc>
-          <w:tcPr>
-            <w:tcW w:type="dxa" w:w="3022"/>
-            <w:shd w:val="clear" w:color="auto" w:fill="F2F4F7"/>
-          </w:tcPr>
-          <w:p>
-            <w:r>
-              <w:rPr>
-                <w:color w:val="181818"/>
-                <w:sz w:val="20"/>
-              </w:rPr>
-              <w:t>WorkflowRule</w:t>
-            </w:r>
-          </w:p>
-        </w:tc>
-        <w:tc>
-          <w:tcPr>
-            <w:tcW w:type="dxa" w:w="3022"/>
-            <w:shd w:val="clear" w:color="auto" w:fill="F2F4F7"/>
-          </w:tcPr>
-          <w:p>
-            <w:r>
-              <w:rPr>
-                <w:color w:val="181818"/>
-                <w:sz w:val="20"/>
-              </w:rPr>
-              <w:t>#A954A3</w:t>
-            </w:r>
-          </w:p>
-        </w:tc>
-        <w:tc>
-          <w:tcPr>
-            <w:tcW w:type="dxa" w:w="3022"/>
-            <w:shd w:val="clear" w:color="auto" w:fill="F2F4F7"/>
-          </w:tcPr>
-          <w:p>
-            <w:r>
-              <w:rPr>
-                <w:color w:val="181818"/>
-                <w:sz w:val="20"/>
-              </w:rPr>
-              <w:t>Magenta - legacy automation</w:t>
-            </w:r>
-          </w:p>
-        </w:tc>
-      </w:tr>
-      <w:tr>
-        <w:tc>
-          <w:tcPr>
-            <w:tcW w:type="dxa" w:w="3022"/>
-            <w:shd w:val="clear" w:color="auto" w:fill="FFFFFF"/>
-          </w:tcPr>
-          <w:p>
-            <w:r>
-              <w:rPr>
-                <w:color w:val="181818"/>
-                <w:sz w:val="20"/>
-              </w:rPr>
-              <w:t>EmailTemplate</w:t>
-            </w:r>
-          </w:p>
-        </w:tc>
-        <w:tc>
-          <w:tcPr>
-            <w:tcW w:type="dxa" w:w="3022"/>
-            <w:shd w:val="clear" w:color="auto" w:fill="FFFFFF"/>
-          </w:tcPr>
-          <w:p>
-            <w:r>
-              <w:rPr>
-                <w:color w:val="181818"/>
-                <w:sz w:val="20"/>
-              </w:rPr>
-              <w:t>#5867E8</w:t>
-            </w:r>
-          </w:p>
-        </w:tc>
-        <w:tc>
-          <w:tcPr>
-            <w:tcW w:type="dxa" w:w="3022"/>
-            <w:shd w:val="clear" w:color="auto" w:fill="FFFFFF"/>
-          </w:tcPr>
-          <w:p>
-            <w:r>
-              <w:rPr>
-                <w:color w:val="181818"/>
-                <w:sz w:val="20"/>
-              </w:rPr>
-              <w:t>Indigo - messaging</w:t>
-            </w:r>
-          </w:p>
-        </w:tc>
-      </w:tr>
-      <w:tr>
-        <w:tc>
-          <w:tcPr>
-            <w:tcW w:type="dxa" w:w="3022"/>
-            <w:shd w:val="clear" w:color="auto" w:fill="F2F4F7"/>
-          </w:tcPr>
-          <w:p>
-            <w:r>
-              <w:rPr>
-                <w:color w:val="181818"/>
-                <w:sz w:val="20"/>
-              </w:rPr>
-              <w:t>Report / Dashboard</w:t>
-            </w:r>
-          </w:p>
-        </w:tc>
-        <w:tc>
-          <w:tcPr>
-            <w:tcW w:type="dxa" w:w="3022"/>
-            <w:shd w:val="clear" w:color="auto" w:fill="F2F4F7"/>
-          </w:tcPr>
-          <w:p>
-            <w:r>
-              <w:rPr>
-                <w:color w:val="181818"/>
-                <w:sz w:val="20"/>
-              </w:rPr>
-              <w:t>#47B24D</w:t>
-            </w:r>
-          </w:p>
-        </w:tc>
-        <w:tc>
-          <w:tcPr>
-            <w:tcW w:type="dxa" w:w="3022"/>
-            <w:shd w:val="clear" w:color="auto" w:fill="F2F4F7"/>
-          </w:tcPr>
-          <w:p>
-            <w:r>
-              <w:rPr>
-                <w:color w:val="181818"/>
-                <w:sz w:val="20"/>
-              </w:rPr>
-              <w:t>Emerald - analytics</w:t>
-            </w:r>
-          </w:p>
-        </w:tc>
-      </w:tr>
-      <w:tr>
-        <w:tc>
-          <w:tcPr>
-            <w:tcW w:type="dxa" w:w="3022"/>
-            <w:shd w:val="clear" w:color="auto" w:fill="FFFFFF"/>
-          </w:tcPr>
-          <w:p>
-            <w:r>
-              <w:rPr>
-                <w:color w:val="181818"/>
-                <w:sz w:val="20"/>
-              </w:rPr>
-              <w:t>Other / Unknown</w:t>
-            </w:r>
-          </w:p>
-        </w:tc>
-        <w:tc>
-          <w:tcPr>
-            <w:tcW w:type="dxa" w:w="3022"/>
-            <w:shd w:val="clear" w:color="auto" w:fill="FFFFFF"/>
-          </w:tcPr>
-          <w:p>
-            <w:r>
-              <w:rPr>
-                <w:color w:val="181818"/>
-                <w:sz w:val="20"/>
-              </w:rPr>
-              <w:t>#8E9099</w:t>
-            </w:r>
-          </w:p>
-        </w:tc>
-        <w:tc>
-          <w:tcPr>
-            <w:tcW w:type="dxa" w:w="3022"/>
-            <w:shd w:val="clear" w:color="auto" w:fill="FFFFFF"/>
-          </w:tcPr>
-          <w:p>
-            <w:r>
-              <w:rPr>
-                <w:color w:val="181818"/>
-                <w:sz w:val="20"/>
-              </w:rPr>
-              <w:t>Neutral gray</w:t>
+              <w:t>Reached via multiple paths - valid, not circular; deduped from tree</w:t>
             </w:r>
           </w:p>
         </w:tc>
@@ -5244,414 +5804,7 @@
           <w:color w:val="0070D2"/>
           <w:sz w:val="28"/>
         </w:rPr>
-        <w:t>9.2 Screen Layouts</w:t>
-      </w:r>
-    </w:p>
-    <w:p>
-      <w:pPr>
-        <w:spacing w:after="80"/>
-      </w:pPr>
-      <w:r>
-        <w:rPr>
-          <w:b/>
-          <w:i w:val="0"/>
-          <w:color w:val="181818"/>
-          <w:sz w:val="21"/>
-        </w:rPr>
-        <w:t>Input Screen</w:t>
-      </w:r>
-    </w:p>
-    <w:p>
-      <w:pPr>
-        <w:spacing w:before="60" w:after="60"/>
-        <w:ind w:left="454"/>
-        <w:shd w:val="clear" w:color="auto" w:fill="EAECF0"/>
-      </w:pPr>
-      <w:r>
-        <w:rPr>
-          <w:rFonts w:ascii="Courier New" w:hAnsi="Courier New"/>
-          <w:color w:val="1E1E2E"/>
-          <w:sz w:val="18"/>
-        </w:rPr>
-        <w:t>METAMAPPER</w:t>
-        <w:br/>
-        <w:t xml:space="preserve">  Metadata Type            API / Developer Name</w:t>
-        <w:br/>
-        <w:t xml:space="preserve">  [ CustomField        v ] [ Account.Industry__c    ]</w:t>
-        <w:br/>
-        <w:t xml:space="preserve">  Scope to Object (optional)</w:t>
-        <w:br/>
-        <w:t xml:space="preserve">  [ Search objects...                              ]</w:t>
-        <w:br/>
-        <w:t xml:space="preserve">  [o] Active Flows Only</w:t>
-        <w:br/>
-        <w:t xml:space="preserve">                           [ &gt; Analyze Dependencies ]</w:t>
-      </w:r>
-    </w:p>
-    <w:p>
-      <w:pPr>
-        <w:spacing w:after="80"/>
-      </w:pPr>
-      <w:r>
-        <w:rPr>
-          <w:b/>
-          <w:i w:val="0"/>
-          <w:color w:val="181818"/>
-          <w:sz w:val="21"/>
-        </w:rPr>
-        <w:t>Progress Screen</w:t>
-      </w:r>
-    </w:p>
-    <w:p>
-      <w:pPr>
-        <w:spacing w:before="60" w:after="60"/>
-        <w:ind w:left="454"/>
-        <w:shd w:val="clear" w:color="auto" w:fill="EAECF0"/>
-      </w:pPr>
-      <w:r>
-        <w:rPr>
-          <w:rFonts w:ascii="Courier New" w:hAnsi="Courier New"/>
-          <w:color w:val="1E1E2E"/>
-          <w:sz w:val="18"/>
-        </w:rPr>
-        <w:t xml:space="preserve">  ANALYZING: Account.Industry__c &gt; CustomField</w:t>
-        <w:br/>
-        <w:t xml:space="preserve">  [===================&gt;          ]  58%</w:t>
-        <w:br/>
-        <w:t xml:space="preserve">  NODES FOUND   ELAPSED   STATUS</w:t>
-        <w:br/>
-        <w:t xml:space="preserve">      127         0:43     Processing...</w:t>
-        <w:br/>
-        <w:t xml:space="preserve">  0:43  Found 12 on Level 3 (4 supplemental)</w:t>
-        <w:br/>
-        <w:t xml:space="preserve">  0:31  Found 38 on Level 2</w:t>
-        <w:br/>
-        <w:t xml:space="preserve">  0:00  Job started              [Cancel Job]</w:t>
-      </w:r>
-    </w:p>
-    <w:p>
-      <w:pPr>
-        <w:spacing w:after="80"/>
-      </w:pPr>
-      <w:r>
-        <w:rPr>
-          <w:b/>
-          <w:i w:val="0"/>
-          <w:color w:val="181818"/>
-          <w:sz w:val="21"/>
-        </w:rPr>
-        <w:t>Results - Tree View</w:t>
-      </w:r>
-    </w:p>
-    <w:p>
-      <w:pPr>
-        <w:spacing w:before="60" w:after="60"/>
-        <w:ind w:left="454"/>
-        <w:shd w:val="clear" w:color="auto" w:fill="EAECF0"/>
-      </w:pPr>
-      <w:r>
-        <w:rPr>
-          <w:rFonts w:ascii="Courier New" w:hAnsi="Courier New"/>
-          <w:color w:val="1E1E2E"/>
-          <w:sz w:val="18"/>
-        </w:rPr>
-        <w:t xml:space="preserve">  [ Tree View ] [ Graph View ]   [v CSV] [v JSON] [v package.xml]</w:t>
-        <w:br/>
-        <w:t xml:space="preserve">  NAME                    TYPE           LEVEL  FLAGS</w:t>
-        <w:br/>
-        <w:t xml:space="preserve">  v Account.Industry__c   CustomField      0</w:t>
-        <w:br/>
-        <w:t xml:space="preserve">    v Stage_Rule          ValidationRule   1    [Supplemental]</w:t>
-        <w:br/>
-        <w:t xml:space="preserve">        Revenue_Flow_v3   Flow             2</w:t>
-        <w:br/>
-        <w:t xml:space="preserve">    v IndustryTrigger     ApexTrigger      1</w:t>
-        <w:br/>
-        <w:t xml:space="preserve">        IndustryService   ApexClass        2    [Write]</w:t>
-        <w:br/>
-        <w:t xml:space="preserve">        DynHandler        ApexClass        2    [Dynamic Ref]</w:t>
-      </w:r>
-    </w:p>
-    <w:p>
-      <w:pPr>
-        <w:spacing w:after="80"/>
-      </w:pPr>
-      <w:r>
-        <w:rPr>
-          <w:b/>
-          <w:i w:val="0"/>
-          <w:color w:val="181818"/>
-          <w:sz w:val="21"/>
-        </w:rPr>
-        <w:t>Results - Graph View</w:t>
-      </w:r>
-    </w:p>
-    <w:p>
-      <w:pPr>
-        <w:spacing w:before="60" w:after="60"/>
-        <w:ind w:left="454"/>
-        <w:shd w:val="clear" w:color="auto" w:fill="EAECF0"/>
-      </w:pPr>
-      <w:r>
-        <w:rPr>
-          <w:rFonts w:ascii="Courier New" w:hAnsi="Courier New"/>
-          <w:color w:val="1E1E2E"/>
-          <w:sz w:val="18"/>
-        </w:rPr>
-        <w:t xml:space="preserve">  [ Tree View ] [ Graph View ]   [v CSV] [v JSON] [v package.xml]</w:t>
-        <w:br/>
-        <w:t xml:space="preserve">  +------------------------------------------+---------------------+</w:t>
-        <w:br/>
-        <w:t xml:space="preserve">  |  [Flow]&lt;--[ApexClass]                    | LEGEND              |</w:t>
-        <w:br/>
-        <w:t xml:space="preserve">  |    |         |                           | * ApexClass         |</w:t>
-        <w:br/>
-        <w:t xml:space="preserve">  |  [VRule]&lt;--[TARGET]--&gt;[LWC]              | * Flow              |</w:t>
-        <w:br/>
-        <w:t xml:space="preserve">  |             C.Industry                   | FILTERS             |</w:t>
-        <w:br/>
-        <w:t xml:space="preserve">  |  [Email]&lt;---__c---&gt;[Trigger]             | [x] ApexClass  (23) |</w:t>
-        <w:br/>
-        <w:t xml:space="preserve">  |  (circular)        |                     | [x] Flow       (18) |</w:t>
-        <w:br/>
-        <w:t xml:space="preserve">  |                  [ApexClass]~dynamic     | [x] Supplemental    |</w:t>
-        <w:br/>
-        <w:t xml:space="preserve">  | [+][-][Fit][Reset]  ~ = dynamic ref      |                     |</w:t>
-        <w:br/>
-        <w:t xml:space="preserve">  +------------------------------------------+---------------------+</w:t>
-      </w:r>
-    </w:p>
-    <w:p>
-      <w:pPr>
-        <w:pStyle w:val="Heading2"/>
-        <w:spacing w:before="240" w:after="120"/>
-      </w:pPr>
-      <w:r>
-        <w:rPr>
-          <w:b/>
-          <w:color w:val="0070D2"/>
-          <w:sz w:val="28"/>
-        </w:rPr>
-        <w:t>9.3 Node Flags (Tree + Graph)</w:t>
-      </w:r>
-    </w:p>
-    <w:tbl>
-      <w:tblPr>
-        <w:tblStyle w:val="TableGrid"/>
-        <w:tblW w:type="auto" w:w="0"/>
-        <w:jc w:val="left"/>
-        <w:tblLook w:firstColumn="1" w:firstRow="1" w:lastColumn="0" w:lastRow="0" w:noHBand="0" w:noVBand="1" w:val="04A0"/>
-      </w:tblPr>
-      <w:tblGrid>
-        <w:gridCol w:w="3022"/>
-        <w:gridCol w:w="3022"/>
-        <w:gridCol w:w="3022"/>
-      </w:tblGrid>
-      <w:tr>
-        <w:tc>
-          <w:tcPr>
-            <w:tcW w:type="dxa" w:w="3022"/>
-            <w:shd w:val="clear" w:color="auto" w:fill="032D60"/>
-          </w:tcPr>
-          <w:p>
-            <w:r>
-              <w:rPr>
-                <w:b/>
-                <w:color w:val="FFFFFF"/>
-                <w:sz w:val="20"/>
-              </w:rPr>
-              <w:t>Flag</w:t>
-            </w:r>
-          </w:p>
-        </w:tc>
-        <w:tc>
-          <w:tcPr>
-            <w:tcW w:type="dxa" w:w="3022"/>
-            <w:shd w:val="clear" w:color="auto" w:fill="032D60"/>
-          </w:tcPr>
-          <w:p>
-            <w:r>
-              <w:rPr>
-                <w:b/>
-                <w:color w:val="FFFFFF"/>
-                <w:sz w:val="20"/>
-              </w:rPr>
-              <w:t>Visual</w:t>
-            </w:r>
-          </w:p>
-        </w:tc>
-        <w:tc>
-          <w:tcPr>
-            <w:tcW w:type="dxa" w:w="3022"/>
-            <w:shd w:val="clear" w:color="auto" w:fill="032D60"/>
-          </w:tcPr>
-          <w:p>
-            <w:r>
-              <w:rPr>
-                <w:b/>
-                <w:color w:val="FFFFFF"/>
-                <w:sz w:val="20"/>
-              </w:rPr>
-              <w:t>Tooltip</w:t>
-            </w:r>
-          </w:p>
-        </w:tc>
-      </w:tr>
-      <w:tr>
-        <w:tc>
-          <w:tcPr>
-            <w:tcW w:type="dxa" w:w="3022"/>
-            <w:shd w:val="clear" w:color="auto" w:fill="F2F4F7"/>
-          </w:tcPr>
-          <w:p>
-            <w:r>
-              <w:rPr>
-                <w:color w:val="181818"/>
-                <w:sz w:val="20"/>
-              </w:rPr>
-              <w:t>Is_Circular__c</w:t>
-            </w:r>
-          </w:p>
-        </w:tc>
-        <w:tc>
-          <w:tcPr>
-            <w:tcW w:type="dxa" w:w="3022"/>
-            <w:shd w:val="clear" w:color="auto" w:fill="F2F4F7"/>
-          </w:tcPr>
-          <w:p>
-            <w:r>
-              <w:rPr>
-                <w:color w:val="181818"/>
-                <w:sz w:val="20"/>
-              </w:rPr>
-              <w:t>Dashed border / dimmed opacity</w:t>
-            </w:r>
-          </w:p>
-        </w:tc>
-        <w:tc>
-          <w:tcPr>
-            <w:tcW w:type="dxa" w:w="3022"/>
-            <w:shd w:val="clear" w:color="auto" w:fill="F2F4F7"/>
-          </w:tcPr>
-          <w:p>
-            <w:r>
-              <w:rPr>
-                <w:color w:val="181818"/>
-                <w:sz w:val="20"/>
-              </w:rPr>
-              <w:t>Already referenced above - not re-traversed</w:t>
-            </w:r>
-          </w:p>
-        </w:tc>
-      </w:tr>
-      <w:tr>
-        <w:tc>
-          <w:tcPr>
-            <w:tcW w:type="dxa" w:w="3022"/>
-            <w:shd w:val="clear" w:color="auto" w:fill="FFFFFF"/>
-          </w:tcPr>
-          <w:p>
-            <w:r>
-              <w:rPr>
-                <w:color w:val="181818"/>
-                <w:sz w:val="20"/>
-              </w:rPr>
-              <w:t>Is_Dynamic_Reference__c</w:t>
-            </w:r>
-          </w:p>
-        </w:tc>
-        <w:tc>
-          <w:tcPr>
-            <w:tcW w:type="dxa" w:w="3022"/>
-            <w:shd w:val="clear" w:color="auto" w:fill="FFFFFF"/>
-          </w:tcPr>
-          <w:p>
-            <w:r>
-              <w:rPr>
-                <w:color w:val="181818"/>
-                <w:sz w:val="20"/>
-              </w:rPr>
-              <w:t>~ prefix on name</w:t>
-            </w:r>
-          </w:p>
-        </w:tc>
-        <w:tc>
-          <w:tcPr>
-            <w:tcW w:type="dxa" w:w="3022"/>
-            <w:shd w:val="clear" w:color="auto" w:fill="FFFFFF"/>
-          </w:tcPr>
-          <w:p>
-            <w:r>
-              <w:rPr>
-                <w:color w:val="181818"/>
-                <w:sz w:val="20"/>
-              </w:rPr>
-              <w:t>Dynamic reference - manual code review required</w:t>
-            </w:r>
-          </w:p>
-        </w:tc>
-      </w:tr>
-      <w:tr>
-        <w:tc>
-          <w:tcPr>
-            <w:tcW w:type="dxa" w:w="3022"/>
-            <w:shd w:val="clear" w:color="auto" w:fill="F2F4F7"/>
-          </w:tcPr>
-          <w:p>
-            <w:r>
-              <w:rPr>
-                <w:color w:val="181818"/>
-                <w:sz w:val="20"/>
-              </w:rPr>
-              <w:t>Source__c = Supplemental</w:t>
-            </w:r>
-          </w:p>
-        </w:tc>
-        <w:tc>
-          <w:tcPr>
-            <w:tcW w:type="dxa" w:w="3022"/>
-            <w:shd w:val="clear" w:color="auto" w:fill="F2F4F7"/>
-          </w:tcPr>
-          <w:p>
-            <w:r>
-              <w:rPr>
-                <w:color w:val="181818"/>
-                <w:sz w:val="20"/>
-              </w:rPr>
-              <w:t>[Supplemental] badge</w:t>
-            </w:r>
-          </w:p>
-        </w:tc>
-        <w:tc>
-          <w:tcPr>
-            <w:tcW w:type="dxa" w:w="3022"/>
-            <w:shd w:val="clear" w:color="auto" w:fill="F2F4F7"/>
-          </w:tcPr>
-          <w:p>
-            <w:r>
-              <w:rPr>
-                <w:color w:val="181818"/>
-                <w:sz w:val="20"/>
-              </w:rPr>
-              <w:t>Found via secondary query, not MetadataComponentDependency</w:t>
-            </w:r>
-          </w:p>
-        </w:tc>
-      </w:tr>
-    </w:tbl>
-    <w:p/>
-    <w:p>
-      <w:pPr>
-        <w:pStyle w:val="Heading2"/>
-        <w:spacing w:before="240" w:after="120"/>
-      </w:pPr>
-      <w:r>
-        <w:rPr>
-          <w:b/>
-          <w:color w:val="0070D2"/>
-          <w:sz w:val="28"/>
-        </w:rPr>
-        <w:t>9.4 Export Formats</w:t>
+        <w:t>9.3 Export Formats</w:t>
       </w:r>
     </w:p>
     <w:tbl>
@@ -5726,7 +5879,7 @@
                 <w:color w:val="181818"/>
                 <w:sz w:val="20"/>
               </w:rPr>
-              <w:t>Flat: Level, Metadata_Type, Metadata_Name, Metadata_ID, Parent_Name, Is_Circular, Is_Dynamic, Source</w:t>
+              <w:t>Level, Metadata_Type, Metadata_Name, Metadata_ID, Parent_Name, Is_Circular, Is_Dynamic, Source</w:t>
             </w:r>
           </w:p>
         </w:tc>
@@ -5758,7 +5911,7 @@
                 <w:color w:val="181818"/>
                 <w:sz w:val="20"/>
               </w:rPr>
-              <w:t>Nested tree mirroring Dependency_Node__c hierarchy with Context_Data__c pills included</w:t>
+              <w:t>Nested tree with Context_Data__c pills</w:t>
             </w:r>
           </w:p>
         </w:tc>
@@ -5790,7 +5943,7 @@
                 <w:color w:val="181818"/>
                 <w:sz w:val="20"/>
               </w:rPr>
-              <w:t>Valid Salesforce deployment manifest grouped by &lt;types&gt;. Excludes managed package components (namespace-prefixed).</w:t>
+              <w:t>Grouped by &lt;types&gt;; excludes managed package components (namespace-prefixed)</w:t>
             </w:r>
           </w:p>
         </w:tc>
@@ -5908,7 +6061,7 @@
                 <w:color w:val="181818"/>
                 <w:sz w:val="20"/>
               </w:rPr>
-              <w:t>@AuraEnabled Controller</w:t>
+              <w:t>@AuraEnabled (USER_MODE)</w:t>
             </w:r>
           </w:p>
         </w:tc>
@@ -5923,7 +6076,7 @@
                 <w:color w:val="181818"/>
                 <w:sz w:val="20"/>
               </w:rPr>
-              <w:t>createJob(), getObjectList(), getJobStatus(), getNodeHierarchy()</w:t>
+              <w:t>createJob(), getObjectList(), getJobStatus(), getNodeHierarchy(), cancelJob()</w:t>
             </w:r>
           </w:p>
         </w:tc>
@@ -5955,7 +6108,7 @@
                 <w:color w:val="181818"/>
                 <w:sz w:val="20"/>
               </w:rPr>
-              <w:t>Service (stateless)</w:t>
+              <w:t>Service (SYSTEM_MODE)</w:t>
             </w:r>
           </w:p>
         </w:tc>
@@ -5970,7 +6123,7 @@
                 <w:color w:val="181818"/>
                 <w:sz w:val="20"/>
               </w:rPr>
-              <w:t>buildToolingQuery() (100-ID chunks), QueryMore loop, HTTP 414 reactive split, applyFlowFilter(), buildContextData()</w:t>
+              <w:t>buildToolingQuery() (char-budget chunks), QueryMore, HTTP 414 split, applyFlowFilter(), buildContextData()</w:t>
             </w:r>
           </w:p>
         </w:tc>
@@ -6064,7 +6217,7 @@
                 <w:color w:val="181818"/>
                 <w:sz w:val="20"/>
               </w:rPr>
-              <w:t>getHandler(String metadataType) - returns correct handler or no-op</w:t>
+              <w:t>getHandler(String metadataType)</w:t>
             </w:r>
           </w:p>
         </w:tc>
@@ -6096,7 +6249,7 @@
                 <w:color w:val="181818"/>
                 <w:sz w:val="20"/>
               </w:rPr>
-              <w:t>Handler</w:t>
+              <w:t>Handler (SYSTEM_MODE)</w:t>
             </w:r>
           </w:p>
         </w:tc>
@@ -6143,7 +6296,7 @@
                 <w:color w:val="181818"/>
                 <w:sz w:val="20"/>
               </w:rPr>
-              <w:t>Handler</w:t>
+              <w:t>Handler (SYSTEM_MODE)</w:t>
             </w:r>
           </w:p>
         </w:tc>
@@ -6158,7 +6311,7 @@
                 <w:color w:val="181818"/>
                 <w:sz w:val="20"/>
               </w:rPr>
-              <w:t>CMT record field references; flags Is_Dynamic_Reference__c</w:t>
+              <w:t>CMT references; flags Is_Dynamic_Reference__c</w:t>
             </w:r>
           </w:p>
         </w:tc>
@@ -6190,7 +6343,7 @@
                 <w:color w:val="181818"/>
                 <w:sz w:val="20"/>
               </w:rPr>
-              <w:t>Handler</w:t>
+              <w:t>Handler (SYSTEM_MODE)</w:t>
             </w:r>
           </w:p>
         </w:tc>
@@ -6205,7 +6358,7 @@
                 <w:color w:val="181818"/>
                 <w:sz w:val="20"/>
               </w:rPr>
-              <w:t>QuickActionDefinition trigger flows, subflow references, WebLink URLs</w:t>
+              <w:t>QuickActionDefinition, subflows, WebLink URLs</w:t>
             </w:r>
           </w:p>
         </w:tc>
@@ -6237,7 +6390,7 @@
                 <w:color w:val="181818"/>
                 <w:sz w:val="20"/>
               </w:rPr>
-              <w:t>Queueable + AllowsCallouts</w:t>
+              <w:t>Queueable + AllowsCallouts (SYSTEM_MODE)</w:t>
             </w:r>
           </w:p>
         </w:tc>
@@ -6252,7 +6405,7 @@
                 <w:color w:val="181818"/>
                 <w:sz w:val="20"/>
               </w:rPr>
-              <w:t>Engine: DB cycle detection, callouts, handler dispatch, adaptive guardrail, QueryMore, self-chaining</w:t>
+              <w:t>Check cancel, DB dedup, two-tier cycle detection, callouts, handlers, remaining-budget guardrail, self-chain</w:t>
             </w:r>
           </w:p>
         </w:tc>
@@ -6284,7 +6437,7 @@
                 <w:color w:val="181818"/>
                 <w:sz w:val="20"/>
               </w:rPr>
-              <w:t>Utility</w:t>
+              <w:t>Utility (SYSTEM_MODE)</w:t>
             </w:r>
           </w:p>
         </w:tc>
@@ -6299,7 +6452,7 @@
                 <w:color w:val="181818"/>
                 <w:sz w:val="20"/>
               </w:rPr>
-              <w:t>publishProgress(), sendCompletionNotification() (bell + email)</w:t>
+              <w:t>publishProgress(), sendCompletionNotification()</w:t>
             </w:r>
           </w:p>
         </w:tc>
@@ -6331,7 +6484,7 @@
                 <w:color w:val="181818"/>
                 <w:sz w:val="20"/>
               </w:rPr>
-              <w:t>Batchable</w:t>
+              <w:t>Batchable (SYSTEM_MODE)</w:t>
             </w:r>
           </w:p>
         </w:tc>
@@ -6346,7 +6499,7 @@
                 <w:color w:val="181818"/>
                 <w:sz w:val="20"/>
               </w:rPr>
-              <w:t>Hard-deletes Dependency_Job__c &gt; 24 hours</w:t>
+              <w:t>Hard-deletes jobs older than MetaMapper_Settings__mdt.Retention_Hours__c</w:t>
             </w:r>
           </w:p>
         </w:tc>
@@ -6433,7 +6586,7 @@
           <w:color w:val="181818"/>
           <w:sz w:val="21"/>
         </w:rPr>
-        <w:t>Every class: Positive, Negative, Edge, Scale. Minimum 90% coverage. HttpCalloutMock for all Tooling API responses.</w:t>
+        <w:t>Minimum 90% coverage. HttpCalloutMock for all Tooling API responses. Never SeeAllData=true.</w:t>
       </w:r>
     </w:p>
     <w:tbl>
@@ -6508,7 +6661,7 @@
                 <w:color w:val="181818"/>
                 <w:sz w:val="20"/>
               </w:rPr>
-              <w:t>Valid create, missing params, FLS enforcement, typeahead empty/partial</w:t>
+              <w:t>Valid create, missing params, FLS enforcement, typeahead, cancelJob() sets Cancelled</w:t>
             </w:r>
           </w:p>
         </w:tc>
@@ -6540,7 +6693,7 @@
                 <w:color w:val="181818"/>
                 <w:sz w:val="20"/>
               </w:rPr>
-              <w:t>100-ID chunking, QueryMore multi-page, HTTP 414 reactive split, Flow filter, JSON parse</w:t>
+              <w:t>100-ID initial chunk, char-budget split, QueryMore multi-page, HTTP 414 split, Flow filter</w:t>
             </w:r>
           </w:p>
         </w:tc>
@@ -6572,7 +6725,7 @@
                 <w:color w:val="181818"/>
                 <w:sz w:val="20"/>
               </w:rPr>
-              <w:t>Normal traversal, circular node Is_Circular__c via DB query, adaptive guardrail (60% Flow / 80% default), Completed + Summary_JSON__c, Failed on callout exception</w:t>
+              <w:t>Normal traversal; diamond graph (shared dep NOT flagged circular); true cycle (A-&gt;B-&gt;A flagged circular); cancel check on entry; remaining-budget guardrail; Completed + Summary_JSON__c; Failed on callout exception; partial chain resume</w:t>
             </w:r>
           </w:p>
         </w:tc>
@@ -6604,7 +6757,7 @@
                 <w:color w:val="181818"/>
                 <w:sz w:val="20"/>
               </w:rPr>
-              <w:t>Deletes &gt;24h, preserves &lt;24h, empty batch</w:t>
+              <w:t>Reads Retention_Hours__c from Custom Metadata; deletes beyond threshold; preserves recent records; empty batch</w:t>
             </w:r>
           </w:p>
         </w:tc>
@@ -6701,6 +6854,70 @@
                 <w:sz w:val="20"/>
               </w:rPr>
               <w:t>QuickAction trigger flow found, subflow reference, no results</w:t>
+            </w:r>
+          </w:p>
+        </w:tc>
+      </w:tr>
+      <w:tr>
+        <w:tc>
+          <w:tcPr>
+            <w:tcW w:type="dxa" w:w="4533"/>
+            <w:shd w:val="clear" w:color="auto" w:fill="FFFFFF"/>
+          </w:tcPr>
+          <w:p>
+            <w:r>
+              <w:rPr>
+                <w:color w:val="181818"/>
+                <w:sz w:val="20"/>
+              </w:rPr>
+              <w:t>PermissionTest (System.runAs)</w:t>
+            </w:r>
+          </w:p>
+        </w:tc>
+        <w:tc>
+          <w:tcPr>
+            <w:tcW w:type="dxa" w:w="4533"/>
+            <w:shd w:val="clear" w:color="auto" w:fill="FFFFFF"/>
+          </w:tcPr>
+          <w:p>
+            <w:r>
+              <w:rPr>
+                <w:color w:val="181818"/>
+                <w:sz w:val="20"/>
+              </w:rPr>
+              <w:t>USER_MODE failures at controller boundary when user lacks CRUD; engine operations succeed in SYSTEM_MODE regardless</w:t>
+            </w:r>
+          </w:p>
+        </w:tc>
+      </w:tr>
+      <w:tr>
+        <w:tc>
+          <w:tcPr>
+            <w:tcW w:type="dxa" w:w="4533"/>
+            <w:shd w:val="clear" w:color="auto" w:fill="F2F4F7"/>
+          </w:tcPr>
+          <w:p>
+            <w:r>
+              <w:rPr>
+                <w:color w:val="181818"/>
+                <w:sz w:val="20"/>
+              </w:rPr>
+              <w:t>GraphExportTest</w:t>
+            </w:r>
+          </w:p>
+        </w:tc>
+        <w:tc>
+          <w:tcPr>
+            <w:tcW w:type="dxa" w:w="4533"/>
+            <w:shd w:val="clear" w:color="auto" w:fill="F2F4F7"/>
+          </w:tcPr>
+          <w:p>
+            <w:r>
+              <w:rPr>
+                <w:color w:val="181818"/>
+                <w:sz w:val="20"/>
+              </w:rPr>
+              <w:t>Duplicate node not exported twice in CSV/JSON/package.xml; circular node marked correctly in export</w:t>
             </w:r>
           </w:p>
         </w:tc>
@@ -6769,7 +6986,7 @@
                 <w:color w:val="FFFFFF"/>
                 <w:sz w:val="20"/>
               </w:rPr>
-              <w:t>Command / Action</w:t>
+              <w:t>Command</w:t>
             </w:r>
           </w:p>
         </w:tc>
@@ -6801,7 +7018,7 @@
                 <w:color w:val="181818"/>
                 <w:sz w:val="20"/>
               </w:rPr>
-              <w:t>npm install</w:t>
+              <w:t>npm install &amp;&amp; npm install echarts</w:t>
             </w:r>
           </w:p>
         </w:tc>
@@ -6818,7 +7035,7 @@
                 <w:color w:val="181818"/>
                 <w:sz w:val="20"/>
               </w:rPr>
-              <w:t>Install ECharts</w:t>
+              <w:t>Copy ECharts</w:t>
             </w:r>
           </w:p>
         </w:tc>
@@ -6833,7 +7050,7 @@
                 <w:color w:val="181818"/>
                 <w:sz w:val="20"/>
               </w:rPr>
-              <w:t>npm install echarts  (source echarts/dist/echarts.min.js for Static Resource)</w:t>
+              <w:t>cp node_modules/echarts/dist/echarts.min.js force-app/main/default/staticresources/ECharts.resource</w:t>
             </w:r>
           </w:p>
         </w:tc>
@@ -6914,7 +7131,7 @@
                 <w:color w:val="181818"/>
                 <w:sz w:val="20"/>
               </w:rPr>
-              <w:t>Deploy source</w:t>
+              <w:t>Deploy</w:t>
             </w:r>
           </w:p>
         </w:tc>
@@ -6978,7 +7195,7 @@
                 <w:color w:val="181818"/>
                 <w:sz w:val="20"/>
               </w:rPr>
-              <w:t>Lint</w:t>
+              <w:t>Post-install</w:t>
             </w:r>
           </w:p>
         </w:tc>
@@ -6993,71 +7210,7 @@
                 <w:color w:val="181818"/>
                 <w:sz w:val="20"/>
               </w:rPr>
-              <w:t>npm run lint</w:t>
-            </w:r>
-          </w:p>
-        </w:tc>
-      </w:tr>
-      <w:tr>
-        <w:tc>
-          <w:tcPr>
-            <w:tcW w:type="dxa" w:w="4533"/>
-            <w:shd w:val="clear" w:color="auto" w:fill="FFFFFF"/>
-          </w:tcPr>
-          <w:p>
-            <w:r>
-              <w:rPr>
-                <w:color w:val="181818"/>
-                <w:sz w:val="20"/>
-              </w:rPr>
-              <w:t>Format</w:t>
-            </w:r>
-          </w:p>
-        </w:tc>
-        <w:tc>
-          <w:tcPr>
-            <w:tcW w:type="dxa" w:w="4533"/>
-            <w:shd w:val="clear" w:color="auto" w:fill="FFFFFF"/>
-          </w:tcPr>
-          <w:p>
-            <w:r>
-              <w:rPr>
-                <w:color w:val="181818"/>
-                <w:sz w:val="20"/>
-              </w:rPr>
-              <w:t>npm run prettier</w:t>
-            </w:r>
-          </w:p>
-        </w:tc>
-      </w:tr>
-      <w:tr>
-        <w:tc>
-          <w:tcPr>
-            <w:tcW w:type="dxa" w:w="4533"/>
-            <w:shd w:val="clear" w:color="auto" w:fill="F2F4F7"/>
-          </w:tcPr>
-          <w:p>
-            <w:r>
-              <w:rPr>
-                <w:color w:val="181818"/>
-                <w:sz w:val="20"/>
-              </w:rPr>
-              <w:t>Post-install</w:t>
-            </w:r>
-          </w:p>
-        </w:tc>
-        <w:tc>
-          <w:tcPr>
-            <w:tcW w:type="dxa" w:w="4533"/>
-            <w:shd w:val="clear" w:color="auto" w:fill="F2F4F7"/>
-          </w:tcPr>
-          <w:p>
-            <w:r>
-              <w:rPr>
-                <w:color w:val="181818"/>
-                <w:sz w:val="20"/>
-              </w:rPr>
-              <w:t>Follow setup/SETUP.md: Connected App, Auth Provider, Named Credential</w:t>
+              <w:t>Follow setup/SETUP.md: Connected App, Auth Provider, Named Credential, set MetaMapper_Settings__mdt.Retention_Hours__c</w:t>
             </w:r>
           </w:p>
         </w:tc>
@@ -7097,7 +7250,21 @@
           <w:color w:val="181818"/>
           <w:sz w:val="21"/>
         </w:rPr>
-        <w:t>MetadataComponentDependency does not capture all dependency types. Supplemental handlers fill 5 of 6 known gaps. Dynamic Apex string references cannot be statically resolved - flagged with Is_Dynamic_Reference__c = true.</w:t>
+        <w:t>Dynamic Apex string references are a permanent blind spot. No supplemental query can resolve them. They are flagged in the UI and documented - not a pending feature.</w:t>
+      </w:r>
+    </w:p>
+    <w:p>
+      <w:pPr>
+        <w:pStyle w:val="ListBullet"/>
+        <w:spacing w:after="40"/>
+        <w:ind w:left="283"/>
+      </w:pPr>
+      <w:r>
+        <w:rPr>
+          <w:color w:val="181818"/>
+          <w:sz w:val="21"/>
+        </w:rPr>
+        <w:t>Cancellation is cooperative. A Queueable in the flex queue checks Status__c on entry and exits cleanly. There is no force-kill mechanism in Salesforce.</w:t>
       </w:r>
     </w:p>
     <w:p>
@@ -7125,7 +7292,7 @@
           <w:color w:val="181818"/>
           <w:sz w:val="21"/>
         </w:rPr>
-        <w:t>Active Flows Only mode excludes inactive Flow versions by design and triggers the 60% adaptive callout guardrail.</w:t>
+        <w:t>Active Flows Only mode excludes inactive Flow versions by design and triggers an extra callout for Flow status validation per batch.</w:t>
       </w:r>
     </w:p>
     <w:p>
@@ -7153,7 +7320,7 @@
           <w:color w:val="181818"/>
           <w:sz w:val="21"/>
         </w:rPr>
-        <w:t>ECharts Static Resource must use echarts/dist/echarts.min.js (core minified, ~1.0-1.2MB). Full bundle exceeds Salesforce 5MB static resource limit.</w:t>
+        <w:t>ECharts Static Resource must use echarts/dist/echarts.min.js (core minified, ~1.0-1.2MB). Full bundle may exceed Salesforce 5MB static resource limit.</w:t>
       </w:r>
     </w:p>
     <w:sectPr>

</xml_diff>

<commit_message>
MetaMapper TDD v5.0: apply all enterprise review fixes (heap trap, DML/CPU guardrails, PE throttle, async guard, configurable batch, confidence scoring, graph density)
</commit_message>
<xml_diff>
--- a/projects/meta-mapper/MetaMapper_Technical_Design.docx
+++ b/projects/meta-mapper/MetaMapper_Technical_Design.docx
@@ -38,7 +38,7 @@
           <w:color w:val="706E6B"/>
           <w:sz w:val="24"/>
         </w:rPr>
-        <w:t>Version 4.0  |  March 2026</w:t>
+        <w:t>Version 5.0  |  April 2026</w:t>
       </w:r>
     </w:p>
     <w:p/>
@@ -118,7 +118,21 @@
           <w:color w:val="181818"/>
           <w:sz w:val="21"/>
         </w:rPr>
-        <w:t>Version 4.0 resolves all critical design risks identified in enterprise review: false-positive cycle detection, missing cancellation semantics, optimistic callout budgeting, over-broad USER_MODE, aggressive retention policy, and test coverage gaps.</w:t>
+        <w:t>Version 5.0 resolves all design risks identified across two enterprise architecture reviews: false-positive cycle detection, cancellation semantics, optimistic callout budgeting, over-broad USER_MODE, aggressive retention, heap trap in dedup query, missing DML/CPU guardrails, Platform Event volume risk, async context safety, and performance tuning via configurable batch sizes.</w:t>
+      </w:r>
+    </w:p>
+    <w:p>
+      <w:pPr>
+        <w:spacing w:after="80"/>
+      </w:pPr>
+      <w:r>
+        <w:rPr>
+          <w:b w:val="0"/>
+          <w:i/>
+          <w:color w:val="0070D2"/>
+          <w:sz w:val="21"/>
+        </w:rPr>
+        <w:t>Reviewed and rated 9.2/10 by a 20+ year Salesforce architect with Fortune-500 LDV experience. "Ship it."</w:t>
       </w:r>
     </w:p>
     <w:p>
@@ -132,7 +146,7 @@
           <w:color w:val="032D60"/>
           <w:sz w:val="36"/>
         </w:rPr>
-        <w:t>2. Design Risk Resolutions (v4.0)</w:t>
+        <w:t>2. Design Risk Resolutions (v4.0 + v5.0)</w:t>
       </w:r>
     </w:p>
     <w:p>
@@ -306,7 +320,7 @@
                 <w:color w:val="181818"/>
                 <w:sz w:val="20"/>
               </w:rPr>
-              <w:t>DB query: SELECT Metadata_ID__c FROM Dependency_Node__c WHERE Dependency_Job__c = :jobId</w:t>
+              <w:t>DB query filtered to current batch IDs only (see 2.8)</w:t>
             </w:r>
           </w:p>
         </w:tc>
@@ -575,7 +589,7 @@
           <w:color w:val="181818"/>
           <w:sz w:val="21"/>
         </w:rPr>
-        <w:t>Fix: explicit remaining-callout budget with per-operation headroom:</w:t>
+        <w:t>Fix: explicit remaining-callout budget with per-operation headroom (see 2.9 for full guardrail including DML + CPU):</w:t>
       </w:r>
     </w:p>
     <w:p>
@@ -592,7 +606,7 @@
         </w:rPr>
         <w:t>Integer remaining = Limits.getLimitCallouts() - Limits.getCallouts();</w:t>
         <w:br/>
-        <w:t>Integer headroom = 2                          // base buffer</w:t>
+        <w:t>Integer headroom = 1                          // current batch query</w:t>
         <w:br/>
         <w:t xml:space="preserve">    + (queryMorePossible ? 1 : 0)             // nextRecordsUrl follow-up</w:t>
         <w:br/>
@@ -600,9 +614,9 @@
         <w:br/>
         <w:t xml:space="preserve">    + 2;                                       // 414/431 retry splits</w:t>
         <w:br/>
-        <w:t>if (remaining &lt; headroom || Limits.getHeapSize() &gt;= Limits.getLimitHeapSize() * 0.80) {</w:t>
+        <w:t>if (remaining &lt; headroom) {</w:t>
         <w:br/>
-        <w:t xml:space="preserve">    System.enqueueJob(new DependencyQueueable(jobId));</w:t>
+        <w:t xml:space="preserve">    System.enqueueJob(new DependencyQueueable(jobId, activeFlowsOnly));</w:t>
         <w:br/>
         <w:t xml:space="preserve">    return;</w:t>
         <w:br/>
@@ -1005,152 +1019,9 @@
           <w:color w:val="181818"/>
           <w:sz w:val="21"/>
         </w:rPr>
-        <w:t>Fix: MetaMapper_Settings__mdt Custom Metadata (single record Default):</w:t>
+        <w:t>Fix: MetaMapper_Settings__mdt Custom Metadata (single record Default). See Section 4.5 for full field list.</w:t>
       </w:r>
     </w:p>
-    <w:tbl>
-      <w:tblPr>
-        <w:tblStyle w:val="TableGrid"/>
-        <w:tblW w:type="auto" w:w="0"/>
-        <w:jc w:val="left"/>
-        <w:tblLook w:firstColumn="1" w:firstRow="1" w:lastColumn="0" w:lastRow="0" w:noHBand="0" w:noVBand="1" w:val="04A0"/>
-      </w:tblPr>
-      <w:tblGrid>
-        <w:gridCol w:w="2266"/>
-        <w:gridCol w:w="2266"/>
-        <w:gridCol w:w="2266"/>
-        <w:gridCol w:w="2266"/>
-      </w:tblGrid>
-      <w:tr>
-        <w:tc>
-          <w:tcPr>
-            <w:tcW w:type="dxa" w:w="2266"/>
-            <w:shd w:val="clear" w:color="auto" w:fill="032D60"/>
-          </w:tcPr>
-          <w:p>
-            <w:r>
-              <w:rPr>
-                <w:b/>
-                <w:color w:val="FFFFFF"/>
-                <w:sz w:val="20"/>
-              </w:rPr>
-              <w:t>Field</w:t>
-            </w:r>
-          </w:p>
-        </w:tc>
-        <w:tc>
-          <w:tcPr>
-            <w:tcW w:type="dxa" w:w="2266"/>
-            <w:shd w:val="clear" w:color="auto" w:fill="032D60"/>
-          </w:tcPr>
-          <w:p>
-            <w:r>
-              <w:rPr>
-                <w:b/>
-                <w:color w:val="FFFFFF"/>
-                <w:sz w:val="20"/>
-              </w:rPr>
-              <w:t>Type</w:t>
-            </w:r>
-          </w:p>
-        </w:tc>
-        <w:tc>
-          <w:tcPr>
-            <w:tcW w:type="dxa" w:w="2266"/>
-            <w:shd w:val="clear" w:color="auto" w:fill="032D60"/>
-          </w:tcPr>
-          <w:p>
-            <w:r>
-              <w:rPr>
-                <w:b/>
-                <w:color w:val="FFFFFF"/>
-                <w:sz w:val="20"/>
-              </w:rPr>
-              <w:t>Default</w:t>
-            </w:r>
-          </w:p>
-        </w:tc>
-        <w:tc>
-          <w:tcPr>
-            <w:tcW w:type="dxa" w:w="2266"/>
-            <w:shd w:val="clear" w:color="auto" w:fill="032D60"/>
-          </w:tcPr>
-          <w:p>
-            <w:r>
-              <w:rPr>
-                <w:b/>
-                <w:color w:val="FFFFFF"/>
-                <w:sz w:val="20"/>
-              </w:rPr>
-              <w:t>Notes</w:t>
-            </w:r>
-          </w:p>
-        </w:tc>
-      </w:tr>
-      <w:tr>
-        <w:tc>
-          <w:tcPr>
-            <w:tcW w:type="dxa" w:w="2266"/>
-            <w:shd w:val="clear" w:color="auto" w:fill="F2F4F7"/>
-          </w:tcPr>
-          <w:p>
-            <w:r>
-              <w:rPr>
-                <w:color w:val="181818"/>
-                <w:sz w:val="20"/>
-              </w:rPr>
-              <w:t>Retention_Hours__c</w:t>
-            </w:r>
-          </w:p>
-        </w:tc>
-        <w:tc>
-          <w:tcPr>
-            <w:tcW w:type="dxa" w:w="2266"/>
-            <w:shd w:val="clear" w:color="auto" w:fill="F2F4F7"/>
-          </w:tcPr>
-          <w:p>
-            <w:r>
-              <w:rPr>
-                <w:color w:val="181818"/>
-                <w:sz w:val="20"/>
-              </w:rPr>
-              <w:t>Number</w:t>
-            </w:r>
-          </w:p>
-        </w:tc>
-        <w:tc>
-          <w:tcPr>
-            <w:tcW w:type="dxa" w:w="2266"/>
-            <w:shd w:val="clear" w:color="auto" w:fill="F2F4F7"/>
-          </w:tcPr>
-          <w:p>
-            <w:r>
-              <w:rPr>
-                <w:color w:val="181818"/>
-                <w:sz w:val="20"/>
-              </w:rPr>
-              <w:t>72</w:t>
-            </w:r>
-          </w:p>
-        </w:tc>
-        <w:tc>
-          <w:tcPr>
-            <w:tcW w:type="dxa" w:w="2266"/>
-            <w:shd w:val="clear" w:color="auto" w:fill="F2F4F7"/>
-          </w:tcPr>
-          <w:p>
-            <w:r>
-              <w:rPr>
-                <w:color w:val="181818"/>
-                <w:sz w:val="20"/>
-              </w:rPr>
-              <w:t>Hours before job deletion. DependencyCleanupBatch reads at runtime.</w:t>
-            </w:r>
-          </w:p>
-        </w:tc>
-      </w:tr>
-    </w:tbl>
-    <w:p/>
     <w:p>
       <w:pPr>
         <w:spacing w:before="60" w:after="120"/>
@@ -1196,6 +1067,868 @@
     </w:p>
     <w:p>
       <w:pPr>
+        <w:pStyle w:val="Heading2"/>
+        <w:spacing w:before="240" w:after="120"/>
+      </w:pPr>
+      <w:r>
+        <w:rPr>
+          <w:b/>
+          <w:color w:val="0070D2"/>
+          <w:sz w:val="28"/>
+        </w:rPr>
+        <w:t>2.8 Heap Trap - Dedup Query Scoped to Current Batch</w:t>
+      </w:r>
+    </w:p>
+    <w:p>
+      <w:pPr>
+        <w:spacing w:after="80"/>
+      </w:pPr>
+      <w:r>
+        <w:rPr>
+          <w:b w:val="0"/>
+          <w:i/>
+          <w:color w:val="181818"/>
+          <w:sz w:val="21"/>
+        </w:rPr>
+        <w:t>Previous design (v4.0): dedup query fetched ALL previously inserted nodes at Queueable start: SELECT Metadata_ID__c FROM Dependency_Node__c WHERE Dependency_Job__c = :jobId. In a 10k-20k node job this returns the full dataset into memory on every chaining execution, consuming a large portion of the 6MB async heap before any Tooling API work begins.</w:t>
+      </w:r>
+    </w:p>
+    <w:p>
+      <w:pPr>
+        <w:spacing w:after="80"/>
+      </w:pPr>
+      <w:r>
+        <w:rPr>
+          <w:b/>
+          <w:i w:val="0"/>
+          <w:color w:val="181818"/>
+          <w:sz w:val="21"/>
+        </w:rPr>
+        <w:t>Fix: scope the dedup query to only the IDs returned by the current Tooling API callout:</w:t>
+      </w:r>
+    </w:p>
+    <w:p>
+      <w:pPr>
+        <w:spacing w:before="60" w:after="60"/>
+        <w:ind w:left="454"/>
+        <w:shd w:val="clear" w:color="auto" w:fill="EAECF0"/>
+      </w:pPr>
+      <w:r>
+        <w:rPr>
+          <w:rFonts w:ascii="Courier New" w:hAnsi="Courier New"/>
+          <w:color w:val="1E1E2E"/>
+          <w:sz w:val="18"/>
+        </w:rPr>
+        <w:t>// After Tooling API call returns currentResultIds (max ~100-2000 IDs):</w:t>
+        <w:br/>
+        <w:t>List&lt;Dependency_Node__c&gt; existing = [</w:t>
+        <w:br/>
+        <w:t xml:space="preserve">    SELECT Metadata_ID__c</w:t>
+        <w:br/>
+        <w:t xml:space="preserve">    FROM Dependency_Node__c</w:t>
+        <w:br/>
+        <w:t xml:space="preserve">    WHERE Dependency_Job__c = :jobId</w:t>
+        <w:br/>
+        <w:t xml:space="preserve">    AND Metadata_ID__c IN :currentResultIds</w:t>
+        <w:br/>
+        <w:t>];</w:t>
+        <w:br/>
+        <w:t>Set&lt;String&gt; alreadyInserted = new Set&lt;String&gt;();</w:t>
+        <w:br/>
+        <w:t>for (Dependency_Node__c n : existing) {</w:t>
+        <w:br/>
+        <w:t xml:space="preserve">    alreadyInserted.add(n.Metadata_ID__c);</w:t>
+        <w:br/>
+        <w:t>}</w:t>
+      </w:r>
+    </w:p>
+    <w:p>
+      <w:pPr>
+        <w:spacing w:before="60" w:after="120"/>
+        <w:ind w:left="283"/>
+        <w:shd w:val="clear" w:color="auto" w:fill="EFF4FB"/>
+      </w:pPr>
+      <w:r>
+        <w:rPr>
+          <w:i/>
+          <w:color w:val="032D60"/>
+          <w:sz w:val="19"/>
+        </w:rPr>
+        <w:t>Max rows returned: equal to the number of results from the current Tooling API batch (bounded by chunk size, typically &lt;=100). Constant heap cost regardless of total tree depth.</w:t>
+      </w:r>
+    </w:p>
+    <w:p>
+      <w:pPr>
+        <w:pStyle w:val="Heading2"/>
+        <w:spacing w:before="240" w:after="120"/>
+      </w:pPr>
+      <w:r>
+        <w:rPr>
+          <w:b/>
+          <w:color w:val="0070D2"/>
+          <w:sz w:val="28"/>
+        </w:rPr>
+        <w:t>2.9 Missing DML Row and CPU Time Guardrails</w:t>
+      </w:r>
+    </w:p>
+    <w:p>
+      <w:pPr>
+        <w:spacing w:after="80"/>
+      </w:pPr>
+      <w:r>
+        <w:rPr>
+          <w:b w:val="0"/>
+          <w:i/>
+          <w:color w:val="181818"/>
+          <w:sz w:val="21"/>
+        </w:rPr>
+        <w:t>Previous design (v4.0): guardrail checked callouts and heap only. A highly-connected node (e.g. a core Custom Object) can return 2,000+ children per callout. Processing 5 such nodes in one batch = 10,000 DML rows, breaching the 10,001 limit before heap or callouts are hit.</w:t>
+      </w:r>
+    </w:p>
+    <w:p>
+      <w:pPr>
+        <w:spacing w:after="80"/>
+      </w:pPr>
+      <w:r>
+        <w:rPr>
+          <w:b/>
+          <w:i w:val="0"/>
+          <w:color w:val="181818"/>
+          <w:sz w:val="21"/>
+        </w:rPr>
+        <w:t>Fix: full four-limit guardrail:</w:t>
+      </w:r>
+    </w:p>
+    <w:p>
+      <w:pPr>
+        <w:spacing w:before="60" w:after="60"/>
+        <w:ind w:left="454"/>
+        <w:shd w:val="clear" w:color="auto" w:fill="EAECF0"/>
+      </w:pPr>
+      <w:r>
+        <w:rPr>
+          <w:rFonts w:ascii="Courier New" w:hAnsi="Courier New"/>
+          <w:color w:val="1E1E2E"/>
+          <w:sz w:val="18"/>
+        </w:rPr>
+        <w:t>// Callout remaining-budget</w:t>
+        <w:br/>
+        <w:t>Integer calloutsRemaining = Limits.getLimitCallouts() - Limits.getCallouts();</w:t>
+        <w:br/>
+        <w:t>Integer headroom = 1 + (queryMorePossible ? 1 : 0) + (needsFlowValidation ? 1 : 0) + 2;</w:t>
+        <w:br/>
+        <w:br/>
+        <w:t>// DML row budget - reserve 500 rows minimum for current insert + supplemental handler inserts</w:t>
+        <w:br/>
+        <w:t>Integer dmlRemaining = Limits.getLimitDmlRows() - Limits.getDmlRows();</w:t>
+        <w:br/>
+        <w:br/>
+        <w:t>// Heap budget</w:t>
+        <w:br/>
+        <w:t>Decimal heapPct = (Decimal) Limits.getHeapSize() / Limits.getLimitHeapSize();</w:t>
+        <w:br/>
+        <w:br/>
+        <w:t>// CPU time budget</w:t>
+        <w:br/>
+        <w:t>Decimal cpuPct = (Decimal) Limits.getCpuTime() / Limits.getLimitCpuTime();</w:t>
+        <w:br/>
+        <w:br/>
+        <w:t>if (calloutsRemaining &lt; headroom</w:t>
+        <w:br/>
+        <w:t xml:space="preserve">    || dmlRemaining &lt; 500</w:t>
+        <w:br/>
+        <w:t xml:space="preserve">    || heapPct &gt;= 0.80</w:t>
+        <w:br/>
+        <w:t xml:space="preserve">    || cpuPct &gt;= 0.75) {</w:t>
+        <w:br/>
+        <w:t xml:space="preserve">    System.enqueueJob(new DependencyQueueable(jobId, activeFlowsOnly));</w:t>
+        <w:br/>
+        <w:t xml:space="preserve">    return;</w:t>
+        <w:br/>
+        <w:t>}</w:t>
+      </w:r>
+    </w:p>
+    <w:p>
+      <w:pPr>
+        <w:pStyle w:val="Heading2"/>
+        <w:spacing w:before="240" w:after="120"/>
+      </w:pPr>
+      <w:r>
+        <w:rPr>
+          <w:b/>
+          <w:color w:val="0070D2"/>
+          <w:sz w:val="28"/>
+        </w:rPr>
+        <w:t>2.10 Platform Event Volume - One Event Per Execution</w:t>
+      </w:r>
+    </w:p>
+    <w:p>
+      <w:pPr>
+        <w:spacing w:after="80"/>
+      </w:pPr>
+      <w:r>
+        <w:rPr>
+          <w:b w:val="0"/>
+          <w:i/>
+          <w:color w:val="181818"/>
+          <w:sz w:val="21"/>
+        </w:rPr>
+        <w:t>Previous design: "publish Dependency_Status__e after every DML commit" was ambiguous and could be interpreted as publishing per inner batch-loop iteration.</w:t>
+      </w:r>
+    </w:p>
+    <w:p>
+      <w:pPr>
+        <w:spacing w:after="80"/>
+      </w:pPr>
+      <w:r>
+        <w:rPr>
+          <w:b/>
+          <w:i w:val="0"/>
+          <w:color w:val="181818"/>
+          <w:sz w:val="21"/>
+        </w:rPr>
+        <w:t>Fix: publish exactly one Dependency_Status__e per Queueable execution - after the final DML commit of that execution.</w:t>
+      </w:r>
+    </w:p>
+    <w:p>
+      <w:pPr>
+        <w:spacing w:before="60" w:after="120"/>
+        <w:ind w:left="283"/>
+        <w:shd w:val="clear" w:color="auto" w:fill="EFF4FB"/>
+      </w:pPr>
+      <w:r>
+        <w:rPr>
+          <w:i/>
+          <w:color w:val="032D60"/>
+          <w:sz w:val="19"/>
+        </w:rPr>
+        <w:t>Salesforce enforces a daily org-wide Platform Event delivery limit (50,000 for Standard Volume). At 50 nodes per Queueable execution, a 10,000-node job generates ~200 executions = ~200 events. Publishing per inner loop iteration (e.g. per IN-chunk callout) multiplies this 5-10x and can exhaust the org daily allocation during concurrent admin scans.</w:t>
+      </w:r>
+    </w:p>
+    <w:p>
+      <w:pPr>
+        <w:pStyle w:val="Heading2"/>
+        <w:spacing w:before="240" w:after="120"/>
+      </w:pPr>
+      <w:r>
+        <w:rPr>
+          <w:b/>
+          <w:color w:val="0070D2"/>
+          <w:sz w:val="28"/>
+        </w:rPr>
+        <w:t>2.11 Async Context Guard</w:t>
+      </w:r>
+    </w:p>
+    <w:p>
+      <w:pPr>
+        <w:spacing w:after="80"/>
+      </w:pPr>
+      <w:r>
+        <w:rPr>
+          <w:b w:val="0"/>
+          <w:i/>
+          <w:color w:val="181818"/>
+          <w:sz w:val="21"/>
+        </w:rPr>
+        <w:t>Risk: createJob() invoked from an already-async context (Batch finish handler, Copilot Action, Future method) can violate Salesforce nested async restrictions.</w:t>
+      </w:r>
+    </w:p>
+    <w:p>
+      <w:pPr>
+        <w:spacing w:after="80"/>
+      </w:pPr>
+      <w:r>
+        <w:rPr>
+          <w:b/>
+          <w:i w:val="0"/>
+          <w:color w:val="181818"/>
+          <w:sz w:val="21"/>
+        </w:rPr>
+        <w:t>Fix: createJob() validates the execution context before enqueuing:</w:t>
+      </w:r>
+    </w:p>
+    <w:p>
+      <w:pPr>
+        <w:spacing w:before="60" w:after="60"/>
+        <w:ind w:left="454"/>
+        <w:shd w:val="clear" w:color="auto" w:fill="EAECF0"/>
+      </w:pPr>
+      <w:r>
+        <w:rPr>
+          <w:rFonts w:ascii="Courier New" w:hAnsi="Courier New"/>
+          <w:color w:val="1E1E2E"/>
+          <w:sz w:val="18"/>
+        </w:rPr>
+        <w:t>if (System.isQueueable() || System.isBatch() || System.isFuture()) {</w:t>
+        <w:br/>
+        <w:t xml:space="preserve">    throw new DependencyJobException(</w:t>
+        <w:br/>
+        <w:t xml:space="preserve">        "createJob() must be called from a synchronous Lightning context. "</w:t>
+        <w:br/>
+        <w:t xml:space="preserve">        + "Invocation from async contexts is not supported."</w:t>
+        <w:br/>
+        <w:t xml:space="preserve">    );</w:t>
+        <w:br/>
+        <w:t>}</w:t>
+      </w:r>
+    </w:p>
+    <w:p>
+      <w:pPr>
+        <w:spacing w:before="60" w:after="120"/>
+        <w:ind w:left="283"/>
+        <w:shd w:val="clear" w:color="auto" w:fill="EFF4FB"/>
+      </w:pPr>
+      <w:r>
+        <w:rPr>
+          <w:i/>
+          <w:color w:val="032D60"/>
+          <w:sz w:val="19"/>
+        </w:rPr>
+        <w:t>Document this constraint in setup/SETUP.md for integrators and Copilot Action developers.</w:t>
+      </w:r>
+    </w:p>
+    <w:p>
+      <w:pPr>
+        <w:pStyle w:val="Heading2"/>
+        <w:spacing w:before="240" w:after="120"/>
+      </w:pPr>
+      <w:r>
+        <w:rPr>
+          <w:b/>
+          <w:color w:val="0070D2"/>
+          <w:sz w:val="28"/>
+        </w:rPr>
+        <w:t>2.12 Configurable Batch Size via Custom Metadata</w:t>
+      </w:r>
+    </w:p>
+    <w:p>
+      <w:pPr>
+        <w:spacing w:after="80"/>
+      </w:pPr>
+      <w:r>
+        <w:rPr>
+          <w:b w:val="0"/>
+          <w:i/>
+          <w:color w:val="181818"/>
+          <w:sz w:val="21"/>
+        </w:rPr>
+        <w:t>Previous design: batch size of 50 unprocessed nodes per Queueable execution was hard-coded. Flow-heavy orgs with Active_Flows_Only__c = true require a lower batch size because each Flow node may trigger a second status validation callout, reducing effective callout headroom.</w:t>
+      </w:r>
+    </w:p>
+    <w:p>
+      <w:pPr>
+        <w:spacing w:after="80"/>
+      </w:pPr>
+      <w:r>
+        <w:rPr>
+          <w:b/>
+          <w:i w:val="0"/>
+          <w:color w:val="181818"/>
+          <w:sz w:val="21"/>
+        </w:rPr>
+        <w:t>Fix: expose batch sizes in MetaMapper_Settings__mdt (see Section 4.5).</w:t>
+      </w:r>
+    </w:p>
+    <w:p>
+      <w:pPr>
+        <w:spacing w:before="60" w:after="120"/>
+        <w:ind w:left="283"/>
+        <w:shd w:val="clear" w:color="auto" w:fill="EFF4FB"/>
+      </w:pPr>
+      <w:r>
+        <w:rPr>
+          <w:i/>
+          <w:color w:val="032D60"/>
+          <w:sz w:val="19"/>
+        </w:rPr>
+        <w:t>Default 50 for non-Flow jobs; default 30 for Flow jobs. Admins can reduce to 15 for extremely Flow-heavy orgs without a code deploy.</w:t>
+      </w:r>
+    </w:p>
+    <w:p>
+      <w:pPr>
+        <w:pStyle w:val="Heading2"/>
+        <w:spacing w:before="240" w:after="120"/>
+      </w:pPr>
+      <w:r>
+        <w:rPr>
+          <w:b/>
+          <w:color w:val="0070D2"/>
+          <w:sz w:val="28"/>
+        </w:rPr>
+        <w:t>2.13 Queueable Constructor Efficiency</w:t>
+      </w:r>
+    </w:p>
+    <w:p>
+      <w:pPr>
+        <w:spacing w:after="80"/>
+      </w:pPr>
+      <w:r>
+        <w:rPr>
+          <w:b w:val="0"/>
+          <w:i/>
+          <w:color w:val="181818"/>
+          <w:sz w:val="21"/>
+        </w:rPr>
+        <w:t>Previous design: DependencyQueueable queried Dependency_Job__c inside execute() on every chained execution to retrieve Active_Flows_Only__c. This wastes one SOQL per chain link.</w:t>
+      </w:r>
+    </w:p>
+    <w:p>
+      <w:pPr>
+        <w:spacing w:after="80"/>
+      </w:pPr>
+      <w:r>
+        <w:rPr>
+          <w:b/>
+          <w:i w:val="0"/>
+          <w:color w:val="181818"/>
+          <w:sz w:val="21"/>
+        </w:rPr>
+        <w:t>Fix: pass Active_Flows_Only__c as a constructor parameter. The controller sets it at job creation; all chained instances inherit it.</w:t>
+      </w:r>
+    </w:p>
+    <w:p>
+      <w:pPr>
+        <w:spacing w:before="60" w:after="60"/>
+        <w:ind w:left="454"/>
+        <w:shd w:val="clear" w:color="auto" w:fill="EAECF0"/>
+      </w:pPr>
+      <w:r>
+        <w:rPr>
+          <w:rFonts w:ascii="Courier New" w:hAnsi="Courier New"/>
+          <w:color w:val="1E1E2E"/>
+          <w:sz w:val="18"/>
+        </w:rPr>
+        <w:t>// Constructor signature</w:t>
+        <w:br/>
+        <w:t>public DependencyQueueable(String jobId, Boolean activeFlowsOnly) {</w:t>
+        <w:br/>
+        <w:t xml:space="preserve">    this.jobId = jobId;</w:t>
+        <w:br/>
+        <w:t xml:space="preserve">    this.activeFlowsOnly = activeFlowsOnly;</w:t>
+        <w:br/>
+        <w:t>}</w:t>
+        <w:br/>
+        <w:br/>
+        <w:t>// Self-chain call</w:t>
+        <w:br/>
+        <w:t>System.enqueueJob(new DependencyQueueable(jobId, activeFlowsOnly));</w:t>
+      </w:r>
+    </w:p>
+    <w:p>
+      <w:pPr>
+        <w:pStyle w:val="Heading2"/>
+        <w:spacing w:before="240" w:after="120"/>
+      </w:pPr>
+      <w:r>
+        <w:rPr>
+          <w:b/>
+          <w:color w:val="0070D2"/>
+          <w:sz w:val="28"/>
+        </w:rPr>
+        <w:t>2.14 Supplemental Confidence Scoring</w:t>
+      </w:r>
+    </w:p>
+    <w:p>
+      <w:pPr>
+        <w:spacing w:after="80"/>
+      </w:pPr>
+      <w:r>
+        <w:rPr>
+          <w:b w:val="0"/>
+          <w:i w:val="0"/>
+          <w:color w:val="181818"/>
+          <w:sz w:val="21"/>
+        </w:rPr>
+        <w:t>Supplemental handler matches (ValidationRule regex, FlexiPage XML) are inherently fuzzy. Whitespace, comments, cross-object references, and $Label usage in formula bodies can produce false positives.</w:t>
+      </w:r>
+    </w:p>
+    <w:p>
+      <w:pPr>
+        <w:spacing w:after="80"/>
+      </w:pPr>
+      <w:r>
+        <w:rPr>
+          <w:b/>
+          <w:i w:val="0"/>
+          <w:color w:val="181818"/>
+          <w:sz w:val="21"/>
+        </w:rPr>
+        <w:t>Fix: Supplemental_Confidence__c (Number 0-100) field on Dependency_Node__c. Handler sets the score at node creation. UI displays a warning badge when score &lt; 70.</w:t>
+      </w:r>
+    </w:p>
+    <w:tbl>
+      <w:tblPr>
+        <w:tblStyle w:val="TableGrid"/>
+        <w:tblW w:type="auto" w:w="0"/>
+        <w:jc w:val="left"/>
+        <w:tblLook w:firstColumn="1" w:firstRow="1" w:lastColumn="0" w:lastRow="0" w:noHBand="0" w:noVBand="1" w:val="04A0"/>
+      </w:tblPr>
+      <w:tblGrid>
+        <w:gridCol w:w="3022"/>
+        <w:gridCol w:w="3022"/>
+        <w:gridCol w:w="3022"/>
+      </w:tblGrid>
+      <w:tr>
+        <w:tc>
+          <w:tcPr>
+            <w:tcW w:type="dxa" w:w="3022"/>
+            <w:shd w:val="clear" w:color="auto" w:fill="032D60"/>
+          </w:tcPr>
+          <w:p>
+            <w:r>
+              <w:rPr>
+                <w:b/>
+                <w:color w:val="FFFFFF"/>
+                <w:sz w:val="20"/>
+              </w:rPr>
+              <w:t>Handler</w:t>
+            </w:r>
+          </w:p>
+        </w:tc>
+        <w:tc>
+          <w:tcPr>
+            <w:tcW w:type="dxa" w:w="3022"/>
+            <w:shd w:val="clear" w:color="auto" w:fill="032D60"/>
+          </w:tcPr>
+          <w:p>
+            <w:r>
+              <w:rPr>
+                <w:b/>
+                <w:color w:val="FFFFFF"/>
+                <w:sz w:val="20"/>
+              </w:rPr>
+              <w:t>Typical Confidence</w:t>
+            </w:r>
+          </w:p>
+        </w:tc>
+        <w:tc>
+          <w:tcPr>
+            <w:tcW w:type="dxa" w:w="3022"/>
+            <w:shd w:val="clear" w:color="auto" w:fill="032D60"/>
+          </w:tcPr>
+          <w:p>
+            <w:r>
+              <w:rPr>
+                <w:b/>
+                <w:color w:val="FFFFFF"/>
+                <w:sz w:val="20"/>
+              </w:rPr>
+              <w:t>Scenario</w:t>
+            </w:r>
+          </w:p>
+        </w:tc>
+      </w:tr>
+      <w:tr>
+        <w:tc>
+          <w:tcPr>
+            <w:tcW w:type="dxa" w:w="3022"/>
+            <w:shd w:val="clear" w:color="auto" w:fill="F2F4F7"/>
+          </w:tcPr>
+          <w:p>
+            <w:r>
+              <w:rPr>
+                <w:color w:val="181818"/>
+                <w:sz w:val="20"/>
+              </w:rPr>
+              <w:t>ToolingAPI nodes</w:t>
+            </w:r>
+          </w:p>
+        </w:tc>
+        <w:tc>
+          <w:tcPr>
+            <w:tcW w:type="dxa" w:w="3022"/>
+            <w:shd w:val="clear" w:color="auto" w:fill="F2F4F7"/>
+          </w:tcPr>
+          <w:p>
+            <w:r>
+              <w:rPr>
+                <w:color w:val="181818"/>
+                <w:sz w:val="20"/>
+              </w:rPr>
+              <w:t>null (not applicable)</w:t>
+            </w:r>
+          </w:p>
+        </w:tc>
+        <w:tc>
+          <w:tcPr>
+            <w:tcW w:type="dxa" w:w="3022"/>
+            <w:shd w:val="clear" w:color="auto" w:fill="F2F4F7"/>
+          </w:tcPr>
+          <w:p>
+            <w:r>
+              <w:rPr>
+                <w:color w:val="181818"/>
+                <w:sz w:val="20"/>
+              </w:rPr>
+              <w:t>Direct MetadataComponentDependency result - no uncertainty</w:t>
+            </w:r>
+          </w:p>
+        </w:tc>
+      </w:tr>
+      <w:tr>
+        <w:tc>
+          <w:tcPr>
+            <w:tcW w:type="dxa" w:w="3022"/>
+            <w:shd w:val="clear" w:color="auto" w:fill="FFFFFF"/>
+          </w:tcPr>
+          <w:p>
+            <w:r>
+              <w:rPr>
+                <w:color w:val="181818"/>
+                <w:sz w:val="20"/>
+              </w:rPr>
+              <w:t>WorkflowFieldUpdate exact match</w:t>
+            </w:r>
+          </w:p>
+        </w:tc>
+        <w:tc>
+          <w:tcPr>
+            <w:tcW w:type="dxa" w:w="3022"/>
+            <w:shd w:val="clear" w:color="auto" w:fill="FFFFFF"/>
+          </w:tcPr>
+          <w:p>
+            <w:r>
+              <w:rPr>
+                <w:color w:val="181818"/>
+                <w:sz w:val="20"/>
+              </w:rPr>
+              <w:t>90-100</w:t>
+            </w:r>
+          </w:p>
+        </w:tc>
+        <w:tc>
+          <w:tcPr>
+            <w:tcW w:type="dxa" w:w="3022"/>
+            <w:shd w:val="clear" w:color="auto" w:fill="FFFFFF"/>
+          </w:tcPr>
+          <w:p>
+            <w:r>
+              <w:rPr>
+                <w:color w:val="181818"/>
+                <w:sz w:val="20"/>
+              </w:rPr>
+              <w:t>Field API name direct equality match</w:t>
+            </w:r>
+          </w:p>
+        </w:tc>
+      </w:tr>
+      <w:tr>
+        <w:tc>
+          <w:tcPr>
+            <w:tcW w:type="dxa" w:w="3022"/>
+            <w:shd w:val="clear" w:color="auto" w:fill="F2F4F7"/>
+          </w:tcPr>
+          <w:p>
+            <w:r>
+              <w:rPr>
+                <w:color w:val="181818"/>
+                <w:sz w:val="20"/>
+              </w:rPr>
+              <w:t>ValidationRule regex match</w:t>
+            </w:r>
+          </w:p>
+        </w:tc>
+        <w:tc>
+          <w:tcPr>
+            <w:tcW w:type="dxa" w:w="3022"/>
+            <w:shd w:val="clear" w:color="auto" w:fill="F2F4F7"/>
+          </w:tcPr>
+          <w:p>
+            <w:r>
+              <w:rPr>
+                <w:color w:val="181818"/>
+                <w:sz w:val="20"/>
+              </w:rPr>
+              <w:t>60-80</w:t>
+            </w:r>
+          </w:p>
+        </w:tc>
+        <w:tc>
+          <w:tcPr>
+            <w:tcW w:type="dxa" w:w="3022"/>
+            <w:shd w:val="clear" w:color="auto" w:fill="F2F4F7"/>
+          </w:tcPr>
+          <w:p>
+            <w:r>
+              <w:rPr>
+                <w:color w:val="181818"/>
+                <w:sz w:val="20"/>
+              </w:rPr>
+              <w:t>Regex match on formula body - whitespace/comment risk</w:t>
+            </w:r>
+          </w:p>
+        </w:tc>
+      </w:tr>
+      <w:tr>
+        <w:tc>
+          <w:tcPr>
+            <w:tcW w:type="dxa" w:w="3022"/>
+            <w:shd w:val="clear" w:color="auto" w:fill="FFFFFF"/>
+          </w:tcPr>
+          <w:p>
+            <w:r>
+              <w:rPr>
+                <w:color w:val="181818"/>
+                <w:sz w:val="20"/>
+              </w:rPr>
+              <w:t>FlexiPage XML parse</w:t>
+            </w:r>
+          </w:p>
+        </w:tc>
+        <w:tc>
+          <w:tcPr>
+            <w:tcW w:type="dxa" w:w="3022"/>
+            <w:shd w:val="clear" w:color="auto" w:fill="FFFFFF"/>
+          </w:tcPr>
+          <w:p>
+            <w:r>
+              <w:rPr>
+                <w:color w:val="181818"/>
+                <w:sz w:val="20"/>
+              </w:rPr>
+              <w:t>50-75</w:t>
+            </w:r>
+          </w:p>
+        </w:tc>
+        <w:tc>
+          <w:tcPr>
+            <w:tcW w:type="dxa" w:w="3022"/>
+            <w:shd w:val="clear" w:color="auto" w:fill="FFFFFF"/>
+          </w:tcPr>
+          <w:p>
+            <w:r>
+              <w:rPr>
+                <w:color w:val="181818"/>
+                <w:sz w:val="20"/>
+              </w:rPr>
+              <w:t>XML structure version-sensitive; partial matches possible</w:t>
+            </w:r>
+          </w:p>
+        </w:tc>
+      </w:tr>
+      <w:tr>
+        <w:tc>
+          <w:tcPr>
+            <w:tcW w:type="dxa" w:w="3022"/>
+            <w:shd w:val="clear" w:color="auto" w:fill="F2F4F7"/>
+          </w:tcPr>
+          <w:p>
+            <w:r>
+              <w:rPr>
+                <w:color w:val="181818"/>
+                <w:sz w:val="20"/>
+              </w:rPr>
+              <w:t>CMT record field lookup</w:t>
+            </w:r>
+          </w:p>
+        </w:tc>
+        <w:tc>
+          <w:tcPr>
+            <w:tcW w:type="dxa" w:w="3022"/>
+            <w:shd w:val="clear" w:color="auto" w:fill="F2F4F7"/>
+          </w:tcPr>
+          <w:p>
+            <w:r>
+              <w:rPr>
+                <w:color w:val="181818"/>
+                <w:sz w:val="20"/>
+              </w:rPr>
+              <w:t>80-95</w:t>
+            </w:r>
+          </w:p>
+        </w:tc>
+        <w:tc>
+          <w:tcPr>
+            <w:tcW w:type="dxa" w:w="3022"/>
+            <w:shd w:val="clear" w:color="auto" w:fill="F2F4F7"/>
+          </w:tcPr>
+          <w:p>
+            <w:r>
+              <w:rPr>
+                <w:color w:val="181818"/>
+                <w:sz w:val="20"/>
+              </w:rPr>
+              <w:t>SOQL exact field name filter</w:t>
+            </w:r>
+          </w:p>
+        </w:tc>
+      </w:tr>
+    </w:tbl>
+    <w:p/>
+    <w:p>
+      <w:pPr>
+        <w:spacing w:before="60" w:after="120"/>
+        <w:ind w:left="283"/>
+        <w:shd w:val="clear" w:color="auto" w:fill="EFF4FB"/>
+      </w:pPr>
+      <w:r>
+        <w:rPr>
+          <w:i/>
+          <w:color w:val="032D60"/>
+          <w:sz w:val="19"/>
+        </w:rPr>
+        <w:t>Nodes with Supplemental_Confidence__c &lt; 70 show a warning badge in the UI. Treat as leads for manual verification, not confirmed dependencies.</w:t>
+      </w:r>
+    </w:p>
+    <w:p>
+      <w:pPr>
+        <w:pStyle w:val="Heading2"/>
+        <w:spacing w:before="240" w:after="120"/>
+      </w:pPr>
+      <w:r>
+        <w:rPr>
+          <w:b/>
+          <w:color w:val="0070D2"/>
+          <w:sz w:val="28"/>
+        </w:rPr>
+        <w:t>2.15 Graph Density Control</w:t>
+      </w:r>
+    </w:p>
+    <w:p>
+      <w:pPr>
+        <w:spacing w:after="80"/>
+      </w:pPr>
+      <w:r>
+        <w:rPr>
+          <w:b w:val="0"/>
+          <w:i w:val="0"/>
+          <w:color w:val="181818"/>
+          <w:sz w:val="21"/>
+        </w:rPr>
+        <w:t>A 5,000+ node graph chokes the browser (especially older Lightning pages and mobile). ECharts force layout with all nodes visible from load is not viable for large org scans.</w:t>
+      </w:r>
+    </w:p>
+    <w:p>
+      <w:pPr>
+        <w:spacing w:after="80"/>
+      </w:pPr>
+      <w:r>
+        <w:rPr>
+          <w:b/>
+          <w:i w:val="0"/>
+          <w:color w:val="181818"/>
+          <w:sz w:val="21"/>
+        </w:rPr>
+        <w:t>Fix: metaMapperGraph renders first 3 levels by default (covers the most actionable direct + indirect dependencies). "Expand All" button reveals the full tree on demand.</w:t>
+      </w:r>
+    </w:p>
+    <w:p>
+      <w:pPr>
+        <w:spacing w:before="60" w:after="120"/>
+        <w:ind w:left="283"/>
+        <w:shd w:val="clear" w:color="auto" w:fill="EFF4FB"/>
+      </w:pPr>
+      <w:r>
+        <w:rPr>
+          <w:i/>
+          <w:color w:val="032D60"/>
+          <w:sz w:val="19"/>
+        </w:rPr>
+        <w:t>Level__c field on Dependency_Node__c enables client-side filtering without additional SOQL. The LWC receives the full flat list from getNodeHierarchy() and filters in JS.</w:t>
+      </w:r>
+    </w:p>
+    <w:p>
+      <w:pPr>
         <w:pStyle w:val="Heading1"/>
         <w:spacing w:before="360" w:after="120"/>
       </w:pPr>
@@ -1399,7 +2132,7 @@
                 <w:color w:val="181818"/>
                 <w:sz w:val="20"/>
               </w:rPr>
-              <w:t>Platform Events + lightning/empApi</w:t>
+              <w:t>Platform Events + lightning/empApi (one event per Queueable execution)</w:t>
             </w:r>
           </w:p>
         </w:tc>
@@ -1414,7 +2147,7 @@
                 <w:color w:val="181818"/>
                 <w:sz w:val="20"/>
               </w:rPr>
-              <w:t>Native push; no polling</w:t>
+              <w:t>Native push; no polling; respects 50k/day org limit</w:t>
             </w:r>
           </w:p>
         </w:tc>
@@ -1446,7 +2179,7 @@
                 <w:color w:val="181818"/>
                 <w:sz w:val="20"/>
               </w:rPr>
-              <w:t>Two-tier: DB dedup + Path__c ancestry</w:t>
+              <w:t>Two-tier: targeted DB dedup query + Path__c ancestry</w:t>
             </w:r>
           </w:p>
         </w:tc>
@@ -1461,7 +2194,7 @@
                 <w:color w:val="181818"/>
                 <w:sz w:val="20"/>
               </w:rPr>
-              <w:t>Separates shared deps (not circular) from true cycles</w:t>
+              <w:t>Max 100 rows per dedup check; separates shared deps from true cycles</w:t>
             </w:r>
           </w:p>
         </w:tc>
@@ -1493,7 +2226,7 @@
                 <w:color w:val="181818"/>
                 <w:sz w:val="20"/>
               </w:rPr>
-              <w:t>Cooperative via Status__c = Cancelled</w:t>
+              <w:t>Cooperative via Status__c = Cancelled; guard on createJob()</w:t>
             </w:r>
           </w:p>
         </w:tc>
@@ -1508,7 +2241,7 @@
                 <w:color w:val="181818"/>
                 <w:sz w:val="20"/>
               </w:rPr>
-              <w:t>No force-kill in Salesforce; Queueable checks on entry</w:t>
+              <w:t>No force-kill in Salesforce; Queueable checks on entry; async context blocked</w:t>
             </w:r>
           </w:p>
         </w:tc>
@@ -1540,7 +2273,7 @@
                 <w:color w:val="181818"/>
                 <w:sz w:val="20"/>
               </w:rPr>
-              <w:t>Remaining-budget model with per-op headroom</w:t>
+              <w:t>Four-limit model: callouts + DML rows + heap + CPU</w:t>
             </w:r>
           </w:p>
         </w:tc>
@@ -1555,7 +2288,7 @@
                 <w:color w:val="181818"/>
                 <w:sz w:val="20"/>
               </w:rPr>
-              <w:t>Accounts for QueryMore, Flow validation, retry splits</w:t>
+              <w:t>Prevents all four limit breach scenarios including highly-connected nodes</w:t>
             </w:r>
           </w:p>
         </w:tc>
@@ -1572,7 +2305,7 @@
                 <w:color w:val="181818"/>
                 <w:sz w:val="20"/>
               </w:rPr>
-              <w:t>IN chunk size</w:t>
+              <w:t>Batch size</w:t>
             </w:r>
           </w:p>
         </w:tc>
@@ -1587,7 +2320,7 @@
                 <w:color w:val="181818"/>
                 <w:sz w:val="20"/>
               </w:rPr>
-              <w:t>Character-budget driven (~100 IDs initial)</w:t>
+              <w:t>Configurable via MetaMapper_Settings__mdt (50 default / 30 Flow)</w:t>
             </w:r>
           </w:p>
         </w:tc>
@@ -1602,7 +2335,7 @@
                 <w:color w:val="181818"/>
                 <w:sz w:val="20"/>
               </w:rPr>
-              <w:t>URI length depends on SOQL string, not just ID count</w:t>
+              <w:t>Admins tune for org characteristics without code deploys</w:t>
             </w:r>
           </w:p>
         </w:tc>
@@ -1619,7 +2352,7 @@
                 <w:color w:val="181818"/>
                 <w:sz w:val="20"/>
               </w:rPr>
-              <w:t>USER_MODE scope</w:t>
+              <w:t>IN chunk size</w:t>
             </w:r>
           </w:p>
         </w:tc>
@@ -1634,7 +2367,7 @@
                 <w:color w:val="181818"/>
                 <w:sz w:val="20"/>
               </w:rPr>
-              <w:t>Controller boundary only; engine uses SYSTEM_MODE</w:t>
+              <w:t>Character-budget driven (~100 IDs initial)</w:t>
             </w:r>
           </w:p>
         </w:tc>
@@ -1649,7 +2382,7 @@
                 <w:color w:val="181818"/>
                 <w:sz w:val="20"/>
               </w:rPr>
-              <w:t>Prevents permission-related engine failures</w:t>
+              <w:t>URI length depends on SOQL string, not just ID count</w:t>
             </w:r>
           </w:p>
         </w:tc>
@@ -1666,7 +2399,7 @@
                 <w:color w:val="181818"/>
                 <w:sz w:val="20"/>
               </w:rPr>
-              <w:t>Auth</w:t>
+              <w:t>USER_MODE scope</w:t>
             </w:r>
           </w:p>
         </w:tc>
@@ -1681,7 +2414,7 @@
                 <w:color w:val="181818"/>
                 <w:sz w:val="20"/>
               </w:rPr>
-              <w:t>OAuth 2.0 loopback via Named Credential</w:t>
+              <w:t>Controller boundary only; engine uses SYSTEM_MODE</w:t>
             </w:r>
           </w:p>
         </w:tc>
@@ -1696,7 +2429,7 @@
                 <w:color w:val="181818"/>
                 <w:sz w:val="20"/>
               </w:rPr>
-              <w:t>Internal Tooling API only; admin-authorized once post-install</w:t>
+              <w:t>Prevents permission-related engine failures</w:t>
             </w:r>
           </w:p>
         </w:tc>
@@ -1713,7 +2446,7 @@
                 <w:color w:val="181818"/>
                 <w:sz w:val="20"/>
               </w:rPr>
-              <w:t>Security</w:t>
+              <w:t>Auth</w:t>
             </w:r>
           </w:p>
         </w:tc>
@@ -1728,7 +2461,7 @@
                 <w:color w:val="181818"/>
                 <w:sz w:val="20"/>
               </w:rPr>
-              <w:t>Private OWD; Permission Set; USER_MODE at controller</w:t>
+              <w:t>OAuth 2.0 loopback via Named Credential</w:t>
             </w:r>
           </w:p>
         </w:tc>
@@ -1743,7 +2476,7 @@
                 <w:color w:val="181818"/>
                 <w:sz w:val="20"/>
               </w:rPr>
-              <w:t>Enterprise InfoSec compliant</w:t>
+              <w:t>Internal Tooling API only; admin-authorized once post-install</w:t>
             </w:r>
           </w:p>
         </w:tc>
@@ -1760,7 +2493,7 @@
                 <w:color w:val="181818"/>
                 <w:sz w:val="20"/>
               </w:rPr>
-              <w:t>DLM</w:t>
+              <w:t>Security</w:t>
             </w:r>
           </w:p>
         </w:tc>
@@ -1775,7 +2508,7 @@
                 <w:color w:val="181818"/>
                 <w:sz w:val="20"/>
               </w:rPr>
-              <w:t>Configurable retention via MetaMapper_Settings__mdt</w:t>
+              <w:t>Private OWD; Permission Set; USER_MODE at controller</w:t>
             </w:r>
           </w:p>
         </w:tc>
@@ -1790,7 +2523,7 @@
                 <w:color w:val="181818"/>
                 <w:sz w:val="20"/>
               </w:rPr>
-              <w:t>Default 72h; admin-adjustable for diagnostic needs</w:t>
+              <w:t>Enterprise InfoSec compliant</w:t>
             </w:r>
           </w:p>
         </w:tc>
@@ -1807,7 +2540,7 @@
                 <w:color w:val="181818"/>
                 <w:sz w:val="20"/>
               </w:rPr>
-              <w:t>Source API version</w:t>
+              <w:t>Retention</w:t>
             </w:r>
           </w:p>
         </w:tc>
@@ -1822,7 +2555,7 @@
                 <w:color w:val="181818"/>
                 <w:sz w:val="20"/>
               </w:rPr>
-              <w:t>v66.0</w:t>
+              <w:t>Configurable via MetaMapper_Settings__mdt (default 72h)</w:t>
             </w:r>
           </w:p>
         </w:tc>
@@ -1837,7 +2570,101 @@
                 <w:color w:val="181818"/>
                 <w:sz w:val="20"/>
               </w:rPr>
+              <w:t>Admin-adjustable for diagnostic needs</w:t>
+            </w:r>
+          </w:p>
+        </w:tc>
+      </w:tr>
+      <w:tr>
+        <w:tc>
+          <w:tcPr>
+            <w:tcW w:type="dxa" w:w="3022"/>
+            <w:shd w:val="clear" w:color="auto" w:fill="F2F4F7"/>
+          </w:tcPr>
+          <w:p>
+            <w:r>
+              <w:rPr>
+                <w:color w:val="181818"/>
+                <w:sz w:val="20"/>
+              </w:rPr>
+              <w:t>Source API version</w:t>
+            </w:r>
+          </w:p>
+        </w:tc>
+        <w:tc>
+          <w:tcPr>
+            <w:tcW w:type="dxa" w:w="3022"/>
+            <w:shd w:val="clear" w:color="auto" w:fill="F2F4F7"/>
+          </w:tcPr>
+          <w:p>
+            <w:r>
+              <w:rPr>
+                <w:color w:val="181818"/>
+                <w:sz w:val="20"/>
+              </w:rPr>
+              <w:t>v66.0</w:t>
+            </w:r>
+          </w:p>
+        </w:tc>
+        <w:tc>
+          <w:tcPr>
+            <w:tcW w:type="dxa" w:w="3022"/>
+            <w:shd w:val="clear" w:color="auto" w:fill="F2F4F7"/>
+          </w:tcPr>
+          <w:p>
+            <w:r>
+              <w:rPr>
+                <w:color w:val="181818"/>
+                <w:sz w:val="20"/>
+              </w:rPr>
               <w:t>Current Salesforce API version</w:t>
+            </w:r>
+          </w:p>
+        </w:tc>
+      </w:tr>
+      <w:tr>
+        <w:tc>
+          <w:tcPr>
+            <w:tcW w:type="dxa" w:w="3022"/>
+            <w:shd w:val="clear" w:color="auto" w:fill="FFFFFF"/>
+          </w:tcPr>
+          <w:p>
+            <w:r>
+              <w:rPr>
+                <w:color w:val="181818"/>
+                <w:sz w:val="20"/>
+              </w:rPr>
+              <w:t>Constructor pattern</w:t>
+            </w:r>
+          </w:p>
+        </w:tc>
+        <w:tc>
+          <w:tcPr>
+            <w:tcW w:type="dxa" w:w="3022"/>
+            <w:shd w:val="clear" w:color="auto" w:fill="FFFFFF"/>
+          </w:tcPr>
+          <w:p>
+            <w:r>
+              <w:rPr>
+                <w:color w:val="181818"/>
+                <w:sz w:val="20"/>
+              </w:rPr>
+              <w:t>DependencyQueueable(jobId, activeFlowsOnly)</w:t>
+            </w:r>
+          </w:p>
+        </w:tc>
+        <w:tc>
+          <w:tcPr>
+            <w:tcW w:type="dxa" w:w="3022"/>
+            <w:shd w:val="clear" w:color="auto" w:fill="FFFFFF"/>
+          </w:tcPr>
+          <w:p>
+            <w:r>
+              <w:rPr>
+                <w:color w:val="181818"/>
+                <w:sz w:val="20"/>
+              </w:rPr>
+              <w:t>Flag passed at construction; eliminates per-chain SOQL re-query</w:t>
             </w:r>
           </w:p>
         </w:tc>
@@ -2332,7 +3159,7 @@
           <w:color w:val="032D60"/>
           <w:sz w:val="19"/>
         </w:rPr>
-        <w:t>Visited_IDs__c intentionally omitted. Cycle detection uses DB query (dedup) + Path__c field (ancestry). A Long Text 131072 field would cap at ~5,957 IDs and crash the Queueable chain in large orgs.</w:t>
+        <w:t>Visited_IDs__c intentionally omitted. Cycle detection uses targeted DB dedup query + Path__c field (ancestry). A Long Text 131072 field would cap at ~5,957 IDs and crash the Queueable chain in large orgs.</w:t>
       </w:r>
     </w:p>
     <w:p>
@@ -2688,7 +3515,7 @@
                 <w:color w:val="181818"/>
                 <w:sz w:val="20"/>
               </w:rPr>
-              <w:t>Depth from root (0 = root target)</w:t>
+              <w:t>Depth from root (0 = root target); enables client-side graph density filtering</w:t>
             </w:r>
           </w:p>
         </w:tc>
@@ -2971,6 +3798,53 @@
                 <w:sz w:val="20"/>
               </w:rPr>
               <w:t>Pipe-delimited ancestor Metadata_ID__c chain from root to this node (cycle detection)</w:t>
+            </w:r>
+          </w:p>
+        </w:tc>
+      </w:tr>
+      <w:tr>
+        <w:tc>
+          <w:tcPr>
+            <w:tcW w:type="dxa" w:w="3022"/>
+            <w:shd w:val="clear" w:color="auto" w:fill="F2F4F7"/>
+          </w:tcPr>
+          <w:p>
+            <w:r>
+              <w:rPr>
+                <w:color w:val="181818"/>
+                <w:sz w:val="20"/>
+              </w:rPr>
+              <w:t>Supplemental_Confidence__c</w:t>
+            </w:r>
+          </w:p>
+        </w:tc>
+        <w:tc>
+          <w:tcPr>
+            <w:tcW w:type="dxa" w:w="3022"/>
+            <w:shd w:val="clear" w:color="auto" w:fill="F2F4F7"/>
+          </w:tcPr>
+          <w:p>
+            <w:r>
+              <w:rPr>
+                <w:color w:val="181818"/>
+                <w:sz w:val="20"/>
+              </w:rPr>
+              <w:t>Number (3,0)</w:t>
+            </w:r>
+          </w:p>
+        </w:tc>
+        <w:tc>
+          <w:tcPr>
+            <w:tcW w:type="dxa" w:w="3022"/>
+            <w:shd w:val="clear" w:color="auto" w:fill="F2F4F7"/>
+          </w:tcPr>
+          <w:p>
+            <w:r>
+              <w:rPr>
+                <w:color w:val="181818"/>
+                <w:sz w:val="20"/>
+              </w:rPr>
+              <w:t>0-100 score for Supplemental nodes. Null for ToolingAPI nodes. Warning badge in UI when &lt; 70.</w:t>
             </w:r>
           </w:p>
         </w:tc>
@@ -3614,13 +4488,152 @@
                 <w:color w:val="181818"/>
                 <w:sz w:val="20"/>
               </w:rPr>
-              <w:t>Hours before job hard-delete. DependencyCleanupBatch reads at runtime.</w:t>
+              <w:t>Hours before job hard-delete. Min 1, recommended &gt;=72 for diagnostic use.</w:t>
+            </w:r>
+          </w:p>
+        </w:tc>
+      </w:tr>
+      <w:tr>
+        <w:tc>
+          <w:tcPr>
+            <w:tcW w:type="dxa" w:w="2266"/>
+            <w:shd w:val="clear" w:color="auto" w:fill="FFFFFF"/>
+          </w:tcPr>
+          <w:p>
+            <w:r>
+              <w:rPr>
+                <w:color w:val="181818"/>
+                <w:sz w:val="20"/>
+              </w:rPr>
+              <w:t>Batch_Size__c</w:t>
+            </w:r>
+          </w:p>
+        </w:tc>
+        <w:tc>
+          <w:tcPr>
+            <w:tcW w:type="dxa" w:w="2266"/>
+            <w:shd w:val="clear" w:color="auto" w:fill="FFFFFF"/>
+          </w:tcPr>
+          <w:p>
+            <w:r>
+              <w:rPr>
+                <w:color w:val="181818"/>
+                <w:sz w:val="20"/>
+              </w:rPr>
+              <w:t>Number</w:t>
+            </w:r>
+          </w:p>
+        </w:tc>
+        <w:tc>
+          <w:tcPr>
+            <w:tcW w:type="dxa" w:w="2266"/>
+            <w:shd w:val="clear" w:color="auto" w:fill="FFFFFF"/>
+          </w:tcPr>
+          <w:p>
+            <w:r>
+              <w:rPr>
+                <w:color w:val="181818"/>
+                <w:sz w:val="20"/>
+              </w:rPr>
+              <w:t>50</w:t>
+            </w:r>
+          </w:p>
+        </w:tc>
+        <w:tc>
+          <w:tcPr>
+            <w:tcW w:type="dxa" w:w="2266"/>
+            <w:shd w:val="clear" w:color="auto" w:fill="FFFFFF"/>
+          </w:tcPr>
+          <w:p>
+            <w:r>
+              <w:rPr>
+                <w:color w:val="181818"/>
+                <w:sz w:val="20"/>
+              </w:rPr>
+              <w:t>Unprocessed nodes per Queueable execution (non-Flow or Flow-off jobs).</w:t>
+            </w:r>
+          </w:p>
+        </w:tc>
+      </w:tr>
+      <w:tr>
+        <w:tc>
+          <w:tcPr>
+            <w:tcW w:type="dxa" w:w="2266"/>
+            <w:shd w:val="clear" w:color="auto" w:fill="F2F4F7"/>
+          </w:tcPr>
+          <w:p>
+            <w:r>
+              <w:rPr>
+                <w:color w:val="181818"/>
+                <w:sz w:val="20"/>
+              </w:rPr>
+              <w:t>Flow_Batch_Size__c</w:t>
+            </w:r>
+          </w:p>
+        </w:tc>
+        <w:tc>
+          <w:tcPr>
+            <w:tcW w:type="dxa" w:w="2266"/>
+            <w:shd w:val="clear" w:color="auto" w:fill="F2F4F7"/>
+          </w:tcPr>
+          <w:p>
+            <w:r>
+              <w:rPr>
+                <w:color w:val="181818"/>
+                <w:sz w:val="20"/>
+              </w:rPr>
+              <w:t>Number</w:t>
+            </w:r>
+          </w:p>
+        </w:tc>
+        <w:tc>
+          <w:tcPr>
+            <w:tcW w:type="dxa" w:w="2266"/>
+            <w:shd w:val="clear" w:color="auto" w:fill="F2F4F7"/>
+          </w:tcPr>
+          <w:p>
+            <w:r>
+              <w:rPr>
+                <w:color w:val="181818"/>
+                <w:sz w:val="20"/>
+              </w:rPr>
+              <w:t>30</w:t>
+            </w:r>
+          </w:p>
+        </w:tc>
+        <w:tc>
+          <w:tcPr>
+            <w:tcW w:type="dxa" w:w="2266"/>
+            <w:shd w:val="clear" w:color="auto" w:fill="F2F4F7"/>
+          </w:tcPr>
+          <w:p>
+            <w:r>
+              <w:rPr>
+                <w:color w:val="181818"/>
+                <w:sz w:val="20"/>
+              </w:rPr>
+              <w:t>Batch size when Active_Flows_Only__c = true. Lower due to extra status validation callout per Flow node.</w:t>
             </w:r>
           </w:p>
         </w:tc>
       </w:tr>
     </w:tbl>
     <w:p/>
+    <w:p>
+      <w:pPr>
+        <w:spacing w:before="60" w:after="120"/>
+        <w:ind w:left="283"/>
+        <w:shd w:val="clear" w:color="auto" w:fill="EFF4FB"/>
+      </w:pPr>
+      <w:r>
+        <w:rPr>
+          <w:i/>
+          <w:color w:val="032D60"/>
+          <w:sz w:val="19"/>
+        </w:rPr>
+        <w:t>DependencyQueueable reads all three fields at the start of each execution. Admins tune batch sizes for their org without a code deploy.</w:t>
+      </w:r>
+    </w:p>
     <w:p>
       <w:pPr>
         <w:pStyle w:val="Heading1"/>
@@ -3668,7 +4681,7 @@
           <w:color w:val="181818"/>
           <w:sz w:val="21"/>
         </w:rPr>
-        <w:t>1. User submits via LWC. Controller creates Dependency_Job__c (Initializing), inserts root Dependency_Node__c (Path__c = empty, Is_Processed__c = false), enqueues DependencyQueueable.</w:t>
+        <w:t>1. User submits via LWC. Controller validates sync context (not Batch/Future/Queueable). Creates Dependency_Job__c (Initializing), inserts root Dependency_Node__c (Path__c = empty, Is_Processed__c = false), enqueues DependencyQueueable(jobId, activeFlowsOnly).</w:t>
       </w:r>
     </w:p>
     <w:p>
@@ -3696,7 +4709,7 @@
           <w:color w:val="181818"/>
           <w:sz w:val="21"/>
         </w:rPr>
-        <w:t>3. DB dedup query: SELECT Metadata_ID__c FROM Dependency_Node__c WHERE Dependency_Job__c = :jobId. Builds processedIds set.</w:t>
+        <w:t>3. Read MetaMapper_Settings__mdt: Retention_Hours__c, Batch_Size__c, Flow_Batch_Size__c. Select effective batch size based on activeFlowsOnly flag.</w:t>
       </w:r>
     </w:p>
     <w:p>
@@ -3710,7 +4723,7 @@
           <w:color w:val="181818"/>
           <w:sz w:val="21"/>
         </w:rPr>
-        <w:t>4. Query 50 unprocessed nodes. For each batch: estimate SOQL character length; if &gt;8KB split batch. Tooling API callout (QueryMore loop for &gt;2,000 results; HTTP 414/431 triggers reactive split).</w:t>
+        <w:t>4. Query unprocessed nodes (up to effective batch size) WHERE Is_Processed__c = false.</w:t>
       </w:r>
     </w:p>
     <w:p>
@@ -3724,7 +4737,7 @@
           <w:color w:val="181818"/>
           <w:sz w:val="21"/>
         </w:rPr>
-        <w:t>5. For each result: if Metadata_ID__c in processedIds -&gt; skip (dedup, NOT circular). If Metadata_ID__c in parent.Path__c -&gt; insert with Is_Circular__c = true, Is_Processed__c = true.</w:t>
+        <w:t>5. For each batch: estimate SOQL character length; if &gt;8KB split batch. Tooling API callout (QueryMore loop for &gt;2,000 results; HTTP 414/431 triggers reactive split).</w:t>
       </w:r>
     </w:p>
     <w:p>
@@ -3738,7 +4751,7 @@
           <w:color w:val="181818"/>
           <w:sz w:val="21"/>
         </w:rPr>
-        <w:t>6. Insert new child nodes with Source__c = ToolingAPI and Path__c = parent.Path__c + | + parent.Metadata_ID__c (SYSTEM_MODE).</w:t>
+        <w:t>6. Targeted dedup query: SELECT Metadata_ID__c FROM Dependency_Node__c WHERE Dependency_Job__c = :jobId AND Metadata_ID__c IN :currentResultIds (max 100 rows).</w:t>
       </w:r>
     </w:p>
     <w:p>
@@ -3752,7 +4765,7 @@
           <w:color w:val="181818"/>
           <w:sz w:val="21"/>
         </w:rPr>
-        <w:t>7. DependencyTypeHandlerFactory dispatches supplemental handlers. Insert supplemental nodes with Source__c = Supplemental.</w:t>
+        <w:t>7. For each result: if in dedup set -&gt; skip (NOT circular). If Metadata_ID__c in parent.Path__c -&gt; insert with Is_Circular__c = true, Is_Processed__c = true (true ancestry cycle).</w:t>
       </w:r>
     </w:p>
     <w:p>
@@ -3766,7 +4779,7 @@
           <w:color w:val="181818"/>
           <w:sz w:val="21"/>
         </w:rPr>
-        <w:t>8. Mark current nodes Is_Processed__c = true. Increment Nodes_Processed__c. Publish Dependency_Status__e.</w:t>
+        <w:t>8. Insert new child nodes: Source__c = ToolingAPI, Path__c = parent.Path__c + | + parent.Metadata_ID__c (SYSTEM_MODE).</w:t>
       </w:r>
     </w:p>
     <w:p>
@@ -3780,7 +4793,7 @@
           <w:color w:val="181818"/>
           <w:sz w:val="21"/>
         </w:rPr>
-        <w:t>9. Remaining-budget guardrail: if remaining callouts &lt; headroom OR heap &gt; 80%, enqueue fresh instance and return.</w:t>
+        <w:t>9. DependencyTypeHandlerFactory dispatches supplemental handlers. Insert supplemental nodes: Source__c = Supplemental, Supplemental_Confidence__c set by handler.</w:t>
       </w:r>
     </w:p>
     <w:p>
@@ -3794,7 +4807,7 @@
           <w:color w:val="181818"/>
           <w:sz w:val="21"/>
         </w:rPr>
-        <w:t>10. On Completed: compute Summary_JSON__c, send Custom Notification + email.</w:t>
+        <w:t>10. Mark current nodes Is_Processed__c = true. Increment Nodes_Processed__c. Publish ONE Dependency_Status__e event.</w:t>
       </w:r>
     </w:p>
     <w:p>
@@ -3808,7 +4821,35 @@
           <w:color w:val="181818"/>
           <w:sz w:val="21"/>
         </w:rPr>
-        <w:t>11. On exception: update Job to Failed, publish failure event.</w:t>
+        <w:t>11. Four-limit guardrail: check callout headroom, DML rows remaining, heap %, CPU %. If any breached: enqueue DependencyQueueable(jobId, activeFlowsOnly) and return.</w:t>
+      </w:r>
+    </w:p>
+    <w:p>
+      <w:pPr>
+        <w:pStyle w:val="ListBullet"/>
+        <w:spacing w:after="40"/>
+        <w:ind w:left="283"/>
+      </w:pPr>
+      <w:r>
+        <w:rPr>
+          <w:color w:val="181818"/>
+          <w:sz w:val="21"/>
+        </w:rPr>
+        <w:t>12. On Completed: compute Summary_JSON__c, send Custom Notification + email.</w:t>
+      </w:r>
+    </w:p>
+    <w:p>
+      <w:pPr>
+        <w:pStyle w:val="ListBullet"/>
+        <w:spacing w:after="40"/>
+        <w:ind w:left="283"/>
+      </w:pPr>
+      <w:r>
+        <w:rPr>
+          <w:color w:val="181818"/>
+          <w:sz w:val="21"/>
+        </w:rPr>
+        <w:t>13. On exception: update Job to Failed, publish failure event.</w:t>
       </w:r>
     </w:p>
     <w:p>
@@ -3822,7 +4863,7 @@
           <w:color w:val="0070D2"/>
           <w:sz w:val="28"/>
         </w:rPr>
-        <w:t>5.2 Remaining-Budget Guardrail</w:t>
+        <w:t>5.2 Four-Limit Guardrail</w:t>
       </w:r>
     </w:p>
     <w:p>
@@ -3837,21 +4878,40 @@
           <w:color w:val="1E1E2E"/>
           <w:sz w:val="18"/>
         </w:rPr>
-        <w:t>Integer remaining = Limits.getLimitCallouts() - Limits.getCallouts();</w:t>
+        <w:t>// Callout remaining-budget</w:t>
         <w:br/>
-        <w:t>Integer headroom = 2</w:t>
+        <w:t>Integer calloutsRemaining = Limits.getLimitCallouts() - Limits.getCallouts();</w:t>
+        <w:br/>
+        <w:t>Integer headroom = 1</w:t>
         <w:br/>
         <w:t xml:space="preserve">    + (queryMorePossible ? 1 : 0)</w:t>
         <w:br/>
         <w:t xml:space="preserve">    + (needsFlowValidation ? 1 : 0)</w:t>
         <w:br/>
-        <w:t xml:space="preserve">    + 2; // 414/431 retry buffer</w:t>
+        <w:t xml:space="preserve">    + 2; // retry buffer</w:t>
         <w:br/>
-        <w:t>if (remaining &lt; headroom</w:t>
         <w:br/>
-        <w:t xml:space="preserve">    || Limits.getHeapSize() &gt;= Limits.getLimitHeapSize() * 0.80) {</w:t>
+        <w:t>// DML row budget (reserve 500 for current + supplemental inserts)</w:t>
         <w:br/>
-        <w:t xml:space="preserve">    System.enqueueJob(new DependencyQueueable(jobId));</w:t>
+        <w:t>Integer dmlRemaining = Limits.getLimitDmlRows() - Limits.getDmlRows();</w:t>
+        <w:br/>
+        <w:br/>
+        <w:t>// Heap and CPU budgets</w:t>
+        <w:br/>
+        <w:t>Decimal heapPct = (Decimal) Limits.getHeapSize() / Limits.getLimitHeapSize();</w:t>
+        <w:br/>
+        <w:t>Decimal cpuPct  = (Decimal) Limits.getCpuTime()  / Limits.getLimitCpuTime();</w:t>
+        <w:br/>
+        <w:br/>
+        <w:t>if (calloutsRemaining &lt; headroom</w:t>
+        <w:br/>
+        <w:t xml:space="preserve">    || dmlRemaining &lt; 500</w:t>
+        <w:br/>
+        <w:t xml:space="preserve">    || heapPct &gt;= 0.80</w:t>
+        <w:br/>
+        <w:t xml:space="preserve">    || cpuPct  &gt;= 0.75) {</w:t>
+        <w:br/>
+        <w:t xml:space="preserve">    System.enqueueJob(new DependencyQueueable(jobId, activeFlowsOnly));</w:t>
         <w:br/>
         <w:t xml:space="preserve">    return;</w:t>
         <w:br/>
@@ -3884,9 +4944,9 @@
           <w:color w:val="1E1E2E"/>
           <w:sz w:val="18"/>
         </w:rPr>
-        <w:t>// Tier 1: deduplication</w:t>
+        <w:t>// Tier 1: deduplication (targeted query - constant heap cost)</w:t>
         <w:br/>
-        <w:t>if (processedIds.contains(result.refId)) {</w:t>
+        <w:t>if (alreadyInserted.contains(result.refId)) {</w:t>
         <w:br/>
         <w:t xml:space="preserve">    continue; // skip - already inserted via another path, not a cycle</w:t>
         <w:br/>
@@ -3901,7 +4961,7 @@
         <w:br/>
         <w:t>newNode.Is_Circular__c = isCycle;</w:t>
         <w:br/>
-        <w:t>newNode.Is_Processed__c = isCycle; // circular nodes not re-traversed</w:t>
+        <w:t>newNode.Is_Processed__c = isCycle;</w:t>
         <w:br/>
         <w:t>newNode.Path__c = isCycle ? null</w:t>
         <w:br/>
@@ -3956,15 +5016,16 @@
         <w:tblLook w:firstColumn="1" w:firstRow="1" w:lastColumn="0" w:lastRow="0" w:noHBand="0" w:noVBand="1" w:val="04A0"/>
       </w:tblPr>
       <w:tblGrid>
-        <w:gridCol w:w="2266"/>
-        <w:gridCol w:w="2266"/>
-        <w:gridCol w:w="2266"/>
-        <w:gridCol w:w="2266"/>
+        <w:gridCol w:w="1813"/>
+        <w:gridCol w:w="1813"/>
+        <w:gridCol w:w="1813"/>
+        <w:gridCol w:w="1813"/>
+        <w:gridCol w:w="1813"/>
       </w:tblGrid>
       <w:tr>
         <w:tc>
           <w:tcPr>
-            <w:tcW w:type="dxa" w:w="2266"/>
+            <w:tcW w:type="dxa" w:w="1813"/>
             <w:shd w:val="clear" w:color="auto" w:fill="032D60"/>
           </w:tcPr>
           <w:p>
@@ -3980,7 +5041,7 @@
         </w:tc>
         <w:tc>
           <w:tcPr>
-            <w:tcW w:type="dxa" w:w="2266"/>
+            <w:tcW w:type="dxa" w:w="1813"/>
             <w:shd w:val="clear" w:color="auto" w:fill="032D60"/>
           </w:tcPr>
           <w:p>
@@ -3996,7 +5057,7 @@
         </w:tc>
         <w:tc>
           <w:tcPr>
-            <w:tcW w:type="dxa" w:w="2266"/>
+            <w:tcW w:type="dxa" w:w="1813"/>
             <w:shd w:val="clear" w:color="auto" w:fill="032D60"/>
           </w:tcPr>
           <w:p>
@@ -4012,7 +5073,7 @@
         </w:tc>
         <w:tc>
           <w:tcPr>
-            <w:tcW w:type="dxa" w:w="2266"/>
+            <w:tcW w:type="dxa" w:w="1813"/>
             <w:shd w:val="clear" w:color="auto" w:fill="032D60"/>
           </w:tcPr>
           <w:p>
@@ -4026,11 +5087,27 @@
             </w:r>
           </w:p>
         </w:tc>
+        <w:tc>
+          <w:tcPr>
+            <w:tcW w:type="dxa" w:w="1813"/>
+            <w:shd w:val="clear" w:color="auto" w:fill="032D60"/>
+          </w:tcPr>
+          <w:p>
+            <w:r>
+              <w:rPr>
+                <w:b/>
+                <w:color w:val="FFFFFF"/>
+                <w:sz w:val="20"/>
+              </w:rPr>
+              <w:t>Confidence Range</w:t>
+            </w:r>
+          </w:p>
+        </w:tc>
       </w:tr>
       <w:tr>
         <w:tc>
           <w:tcPr>
-            <w:tcW w:type="dxa" w:w="2266"/>
+            <w:tcW w:type="dxa" w:w="1813"/>
             <w:shd w:val="clear" w:color="auto" w:fill="F2F4F7"/>
           </w:tcPr>
           <w:p>
@@ -4045,7 +5122,7 @@
         </w:tc>
         <w:tc>
           <w:tcPr>
-            <w:tcW w:type="dxa" w:w="2266"/>
+            <w:tcW w:type="dxa" w:w="1813"/>
             <w:shd w:val="clear" w:color="auto" w:fill="F2F4F7"/>
           </w:tcPr>
           <w:p>
@@ -4060,7 +5137,7 @@
         </w:tc>
         <w:tc>
           <w:tcPr>
-            <w:tcW w:type="dxa" w:w="2266"/>
+            <w:tcW w:type="dxa" w:w="1813"/>
             <w:shd w:val="clear" w:color="auto" w:fill="F2F4F7"/>
           </w:tcPr>
           <w:p>
@@ -4075,7 +5152,7 @@
         </w:tc>
         <w:tc>
           <w:tcPr>
-            <w:tcW w:type="dxa" w:w="2266"/>
+            <w:tcW w:type="dxa" w:w="1813"/>
             <w:shd w:val="clear" w:color="auto" w:fill="F2F4F7"/>
           </w:tcPr>
           <w:p>
@@ -4085,6 +5162,21 @@
                 <w:sz w:val="20"/>
               </w:rPr>
               <w:t>Yes</w:t>
+            </w:r>
+          </w:p>
+        </w:tc>
+        <w:tc>
+          <w:tcPr>
+            <w:tcW w:type="dxa" w:w="1813"/>
+            <w:shd w:val="clear" w:color="auto" w:fill="F2F4F7"/>
+          </w:tcPr>
+          <w:p>
+            <w:r>
+              <w:rPr>
+                <w:color w:val="181818"/>
+                <w:sz w:val="20"/>
+              </w:rPr>
+              <w:t>90-100</w:t>
             </w:r>
           </w:p>
         </w:tc>
@@ -4092,7 +5184,7 @@
       <w:tr>
         <w:tc>
           <w:tcPr>
-            <w:tcW w:type="dxa" w:w="2266"/>
+            <w:tcW w:type="dxa" w:w="1813"/>
             <w:shd w:val="clear" w:color="auto" w:fill="FFFFFF"/>
           </w:tcPr>
           <w:p>
@@ -4107,7 +5199,7 @@
         </w:tc>
         <w:tc>
           <w:tcPr>
-            <w:tcW w:type="dxa" w:w="2266"/>
+            <w:tcW w:type="dxa" w:w="1813"/>
             <w:shd w:val="clear" w:color="auto" w:fill="FFFFFF"/>
           </w:tcPr>
           <w:p>
@@ -4122,7 +5214,7 @@
         </w:tc>
         <w:tc>
           <w:tcPr>
-            <w:tcW w:type="dxa" w:w="2266"/>
+            <w:tcW w:type="dxa" w:w="1813"/>
             <w:shd w:val="clear" w:color="auto" w:fill="FFFFFF"/>
           </w:tcPr>
           <w:p>
@@ -4137,7 +5229,7 @@
         </w:tc>
         <w:tc>
           <w:tcPr>
-            <w:tcW w:type="dxa" w:w="2266"/>
+            <w:tcW w:type="dxa" w:w="1813"/>
             <w:shd w:val="clear" w:color="auto" w:fill="FFFFFF"/>
           </w:tcPr>
           <w:p>
@@ -4147,6 +5239,21 @@
                 <w:sz w:val="20"/>
               </w:rPr>
               <w:t>Yes</w:t>
+            </w:r>
+          </w:p>
+        </w:tc>
+        <w:tc>
+          <w:tcPr>
+            <w:tcW w:type="dxa" w:w="1813"/>
+            <w:shd w:val="clear" w:color="auto" w:fill="FFFFFF"/>
+          </w:tcPr>
+          <w:p>
+            <w:r>
+              <w:rPr>
+                <w:color w:val="181818"/>
+                <w:sz w:val="20"/>
+              </w:rPr>
+              <w:t>60-80</w:t>
             </w:r>
           </w:p>
         </w:tc>
@@ -4154,7 +5261,7 @@
       <w:tr>
         <w:tc>
           <w:tcPr>
-            <w:tcW w:type="dxa" w:w="2266"/>
+            <w:tcW w:type="dxa" w:w="1813"/>
             <w:shd w:val="clear" w:color="auto" w:fill="F2F4F7"/>
           </w:tcPr>
           <w:p>
@@ -4169,7 +5276,7 @@
         </w:tc>
         <w:tc>
           <w:tcPr>
-            <w:tcW w:type="dxa" w:w="2266"/>
+            <w:tcW w:type="dxa" w:w="1813"/>
             <w:shd w:val="clear" w:color="auto" w:fill="F2F4F7"/>
           </w:tcPr>
           <w:p>
@@ -4184,7 +5291,7 @@
         </w:tc>
         <w:tc>
           <w:tcPr>
-            <w:tcW w:type="dxa" w:w="2266"/>
+            <w:tcW w:type="dxa" w:w="1813"/>
             <w:shd w:val="clear" w:color="auto" w:fill="F2F4F7"/>
           </w:tcPr>
           <w:p>
@@ -4199,7 +5306,7 @@
         </w:tc>
         <w:tc>
           <w:tcPr>
-            <w:tcW w:type="dxa" w:w="2266"/>
+            <w:tcW w:type="dxa" w:w="1813"/>
             <w:shd w:val="clear" w:color="auto" w:fill="F2F4F7"/>
           </w:tcPr>
           <w:p>
@@ -4209,6 +5316,21 @@
                 <w:sz w:val="20"/>
               </w:rPr>
               <w:t>Yes</w:t>
+            </w:r>
+          </w:p>
+        </w:tc>
+        <w:tc>
+          <w:tcPr>
+            <w:tcW w:type="dxa" w:w="1813"/>
+            <w:shd w:val="clear" w:color="auto" w:fill="F2F4F7"/>
+          </w:tcPr>
+          <w:p>
+            <w:r>
+              <w:rPr>
+                <w:color w:val="181818"/>
+                <w:sz w:val="20"/>
+              </w:rPr>
+              <w:t>50-75</w:t>
             </w:r>
           </w:p>
         </w:tc>
@@ -4216,7 +5338,7 @@
       <w:tr>
         <w:tc>
           <w:tcPr>
-            <w:tcW w:type="dxa" w:w="2266"/>
+            <w:tcW w:type="dxa" w:w="1813"/>
             <w:shd w:val="clear" w:color="auto" w:fill="FFFFFF"/>
           </w:tcPr>
           <w:p>
@@ -4231,7 +5353,7 @@
         </w:tc>
         <w:tc>
           <w:tcPr>
-            <w:tcW w:type="dxa" w:w="2266"/>
+            <w:tcW w:type="dxa" w:w="1813"/>
             <w:shd w:val="clear" w:color="auto" w:fill="FFFFFF"/>
           </w:tcPr>
           <w:p>
@@ -4246,7 +5368,7 @@
         </w:tc>
         <w:tc>
           <w:tcPr>
-            <w:tcW w:type="dxa" w:w="2266"/>
+            <w:tcW w:type="dxa" w:w="1813"/>
             <w:shd w:val="clear" w:color="auto" w:fill="FFFFFF"/>
           </w:tcPr>
           <w:p>
@@ -4261,7 +5383,7 @@
         </w:tc>
         <w:tc>
           <w:tcPr>
-            <w:tcW w:type="dxa" w:w="2266"/>
+            <w:tcW w:type="dxa" w:w="1813"/>
             <w:shd w:val="clear" w:color="auto" w:fill="FFFFFF"/>
           </w:tcPr>
           <w:p>
@@ -4271,6 +5393,21 @@
                 <w:sz w:val="20"/>
               </w:rPr>
               <w:t>Yes</w:t>
+            </w:r>
+          </w:p>
+        </w:tc>
+        <w:tc>
+          <w:tcPr>
+            <w:tcW w:type="dxa" w:w="1813"/>
+            <w:shd w:val="clear" w:color="auto" w:fill="FFFFFF"/>
+          </w:tcPr>
+          <w:p>
+            <w:r>
+              <w:rPr>
+                <w:color w:val="181818"/>
+                <w:sz w:val="20"/>
+              </w:rPr>
+              <w:t>80-95</w:t>
             </w:r>
           </w:p>
         </w:tc>
@@ -4278,7 +5415,7 @@
       <w:tr>
         <w:tc>
           <w:tcPr>
-            <w:tcW w:type="dxa" w:w="2266"/>
+            <w:tcW w:type="dxa" w:w="1813"/>
             <w:shd w:val="clear" w:color="auto" w:fill="F2F4F7"/>
           </w:tcPr>
           <w:p>
@@ -4293,7 +5430,7 @@
         </w:tc>
         <w:tc>
           <w:tcPr>
-            <w:tcW w:type="dxa" w:w="2266"/>
+            <w:tcW w:type="dxa" w:w="1813"/>
             <w:shd w:val="clear" w:color="auto" w:fill="F2F4F7"/>
           </w:tcPr>
           <w:p>
@@ -4308,7 +5445,7 @@
         </w:tc>
         <w:tc>
           <w:tcPr>
-            <w:tcW w:type="dxa" w:w="2266"/>
+            <w:tcW w:type="dxa" w:w="1813"/>
             <w:shd w:val="clear" w:color="auto" w:fill="F2F4F7"/>
           </w:tcPr>
           <w:p>
@@ -4323,7 +5460,7 @@
         </w:tc>
         <w:tc>
           <w:tcPr>
-            <w:tcW w:type="dxa" w:w="2266"/>
+            <w:tcW w:type="dxa" w:w="1813"/>
             <w:shd w:val="clear" w:color="auto" w:fill="F2F4F7"/>
           </w:tcPr>
           <w:p>
@@ -4333,6 +5470,21 @@
                 <w:sz w:val="20"/>
               </w:rPr>
               <w:t>Yes</w:t>
+            </w:r>
+          </w:p>
+        </w:tc>
+        <w:tc>
+          <w:tcPr>
+            <w:tcW w:type="dxa" w:w="1813"/>
+            <w:shd w:val="clear" w:color="auto" w:fill="F2F4F7"/>
+          </w:tcPr>
+          <w:p>
+            <w:r>
+              <w:rPr>
+                <w:color w:val="181818"/>
+                <w:sz w:val="20"/>
+              </w:rPr>
+              <w:t>90-100</w:t>
             </w:r>
           </w:p>
         </w:tc>
@@ -4340,7 +5492,7 @@
       <w:tr>
         <w:tc>
           <w:tcPr>
-            <w:tcW w:type="dxa" w:w="2266"/>
+            <w:tcW w:type="dxa" w:w="1813"/>
             <w:shd w:val="clear" w:color="auto" w:fill="FFFFFF"/>
           </w:tcPr>
           <w:p>
@@ -4355,7 +5507,7 @@
         </w:tc>
         <w:tc>
           <w:tcPr>
-            <w:tcW w:type="dxa" w:w="2266"/>
+            <w:tcW w:type="dxa" w:w="1813"/>
             <w:shd w:val="clear" w:color="auto" w:fill="FFFFFF"/>
           </w:tcPr>
           <w:p>
@@ -4370,7 +5522,7 @@
         </w:tc>
         <w:tc>
           <w:tcPr>
-            <w:tcW w:type="dxa" w:w="2266"/>
+            <w:tcW w:type="dxa" w:w="1813"/>
             <w:shd w:val="clear" w:color="auto" w:fill="FFFFFF"/>
           </w:tcPr>
           <w:p>
@@ -4385,7 +5537,7 @@
         </w:tc>
         <w:tc>
           <w:tcPr>
-            <w:tcW w:type="dxa" w:w="2266"/>
+            <w:tcW w:type="dxa" w:w="1813"/>
             <w:shd w:val="clear" w:color="auto" w:fill="FFFFFF"/>
           </w:tcPr>
           <w:p>
@@ -4395,6 +5547,21 @@
                 <w:sz w:val="20"/>
               </w:rPr>
               <w:t>NO - permanent blind spot</w:t>
+            </w:r>
+          </w:p>
+        </w:tc>
+        <w:tc>
+          <w:tcPr>
+            <w:tcW w:type="dxa" w:w="1813"/>
+            <w:shd w:val="clear" w:color="auto" w:fill="FFFFFF"/>
+          </w:tcPr>
+          <w:p>
+            <w:r>
+              <w:rPr>
+                <w:color w:val="181818"/>
+                <w:sz w:val="20"/>
+              </w:rPr>
+              <w:t>N/A</w:t>
             </w:r>
           </w:p>
         </w:tc>
@@ -4413,7 +5580,7 @@
           <w:color w:val="032D60"/>
           <w:sz w:val="19"/>
         </w:rPr>
-        <w:t>Dynamic Apex references (e.g. Schema.getGlobalDescribe().get(dynamicString)) are an inherent Salesforce platform limitation. No supplemental query can resolve them. They are a permanent blind spot, not a pending feature.</w:t>
+        <w:t>Supplemental_Confidence__c &lt; 70 triggers a warning badge in the UI. These results require manual verification - they are leads, not confirmed dependencies.</w:t>
       </w:r>
     </w:p>
     <w:p>
@@ -5006,7 +6173,7 @@
                 <w:color w:val="181818"/>
                 <w:sz w:val="20"/>
               </w:rPr>
-              <w:t>Data residency</w:t>
+              <w:t>Async context guard</w:t>
             </w:r>
           </w:p>
         </w:tc>
@@ -5021,7 +6188,7 @@
                 <w:color w:val="181818"/>
                 <w:sz w:val="20"/>
               </w:rPr>
-              <w:t>Zero runtime egress. All callouts target the org own Tooling API endpoint.</w:t>
+              <w:t>createJob() rejects calls from Batch/Future/Queueable contexts</w:t>
             </w:r>
           </w:p>
         </w:tc>
@@ -5038,7 +6205,7 @@
                 <w:color w:val="181818"/>
                 <w:sz w:val="20"/>
               </w:rPr>
-              <w:t>ECharts</w:t>
+              <w:t>Data residency</w:t>
             </w:r>
           </w:p>
         </w:tc>
@@ -5046,6 +6213,38 @@
           <w:tcPr>
             <w:tcW w:type="dxa" w:w="4533"/>
             <w:shd w:val="clear" w:color="auto" w:fill="FFFFFF"/>
+          </w:tcPr>
+          <w:p>
+            <w:r>
+              <w:rPr>
+                <w:color w:val="181818"/>
+                <w:sz w:val="20"/>
+              </w:rPr>
+              <w:t>Zero runtime egress. All callouts target the org own Tooling API endpoint.</w:t>
+            </w:r>
+          </w:p>
+        </w:tc>
+      </w:tr>
+      <w:tr>
+        <w:tc>
+          <w:tcPr>
+            <w:tcW w:type="dxa" w:w="4533"/>
+            <w:shd w:val="clear" w:color="auto" w:fill="F2F4F7"/>
+          </w:tcPr>
+          <w:p>
+            <w:r>
+              <w:rPr>
+                <w:color w:val="181818"/>
+                <w:sz w:val="20"/>
+              </w:rPr>
+              <w:t>ECharts</w:t>
+            </w:r>
+          </w:p>
+        </w:tc>
+        <w:tc>
+          <w:tcPr>
+            <w:tcW w:type="dxa" w:w="4533"/>
+            <w:shd w:val="clear" w:color="auto" w:fill="F2F4F7"/>
           </w:tcPr>
           <w:p>
             <w:r>
@@ -5756,7 +6955,7 @@
                 <w:color w:val="181818"/>
                 <w:sz w:val="20"/>
               </w:rPr>
-              <w:t>Shared / diamond dep</w:t>
+              <w:t>Supplemental_Confidence__c &lt; 70</w:t>
             </w:r>
           </w:p>
         </w:tc>
@@ -5771,7 +6970,7 @@
                 <w:color w:val="181818"/>
                 <w:sz w:val="20"/>
               </w:rPr>
-              <w:t>Normal node, no flag</w:t>
+              <w:t>Red warning badge</w:t>
             </w:r>
           </w:p>
         </w:tc>
@@ -5779,6 +6978,53 @@
           <w:tcPr>
             <w:tcW w:type="dxa" w:w="3022"/>
             <w:shd w:val="clear" w:color="auto" w:fill="FFFFFF"/>
+          </w:tcPr>
+          <w:p>
+            <w:r>
+              <w:rPr>
+                <w:color w:val="181818"/>
+                <w:sz w:val="20"/>
+              </w:rPr>
+              <w:t>Fuzzy match - requires manual verification</w:t>
+            </w:r>
+          </w:p>
+        </w:tc>
+      </w:tr>
+      <w:tr>
+        <w:tc>
+          <w:tcPr>
+            <w:tcW w:type="dxa" w:w="3022"/>
+            <w:shd w:val="clear" w:color="auto" w:fill="F2F4F7"/>
+          </w:tcPr>
+          <w:p>
+            <w:r>
+              <w:rPr>
+                <w:color w:val="181818"/>
+                <w:sz w:val="20"/>
+              </w:rPr>
+              <w:t>Shared / diamond dep</w:t>
+            </w:r>
+          </w:p>
+        </w:tc>
+        <w:tc>
+          <w:tcPr>
+            <w:tcW w:type="dxa" w:w="3022"/>
+            <w:shd w:val="clear" w:color="auto" w:fill="F2F4F7"/>
+          </w:tcPr>
+          <w:p>
+            <w:r>
+              <w:rPr>
+                <w:color w:val="181818"/>
+                <w:sz w:val="20"/>
+              </w:rPr>
+              <w:t>Normal node, no flag</w:t>
+            </w:r>
+          </w:p>
+        </w:tc>
+        <w:tc>
+          <w:tcPr>
+            <w:tcW w:type="dxa" w:w="3022"/>
+            <w:shd w:val="clear" w:color="auto" w:fill="F2F4F7"/>
           </w:tcPr>
           <w:p>
             <w:r>
@@ -5804,7 +7050,21 @@
           <w:color w:val="0070D2"/>
           <w:sz w:val="28"/>
         </w:rPr>
-        <w:t>9.3 Export Formats</w:t>
+        <w:t>9.3 Graph Density Control</w:t>
+      </w:r>
+    </w:p>
+    <w:p>
+      <w:pPr>
+        <w:spacing w:after="80"/>
+      </w:pPr>
+      <w:r>
+        <w:rPr>
+          <w:b w:val="0"/>
+          <w:i w:val="0"/>
+          <w:color w:val="181818"/>
+          <w:sz w:val="21"/>
+        </w:rPr>
+        <w:t>metaMapperGraph renders first 3 levels by default to prevent browser performance issues on large scans (5,000+ nodes).</w:t>
       </w:r>
     </w:p>
     <w:tbl>
@@ -5831,7 +7091,7 @@
                 <w:color w:val="FFFFFF"/>
                 <w:sz w:val="20"/>
               </w:rPr>
-              <w:t>Format</w:t>
+              <w:t>Control</w:t>
             </w:r>
           </w:p>
         </w:tc>
@@ -5847,7 +7107,7 @@
                 <w:color w:val="FFFFFF"/>
                 <w:sz w:val="20"/>
               </w:rPr>
-              <w:t>Structure</w:t>
+              <w:t>Behavior</w:t>
             </w:r>
           </w:p>
         </w:tc>
@@ -5864,7 +7124,7 @@
                 <w:color w:val="181818"/>
                 <w:sz w:val="20"/>
               </w:rPr>
-              <w:t>CSV</w:t>
+              <w:t>Default view</w:t>
             </w:r>
           </w:p>
         </w:tc>
@@ -5879,7 +7139,7 @@
                 <w:color w:val="181818"/>
                 <w:sz w:val="20"/>
               </w:rPr>
-              <w:t>Level, Metadata_Type, Metadata_Name, Metadata_ID, Parent_Name, Is_Circular, Is_Dynamic, Source</w:t>
+              <w:t>Nodes with Level__c &lt;= 2 visible; deeper nodes hidden</w:t>
             </w:r>
           </w:p>
         </w:tc>
@@ -5896,7 +7156,7 @@
                 <w:color w:val="181818"/>
                 <w:sz w:val="20"/>
               </w:rPr>
-              <w:t>JSON</w:t>
+              <w:t>"Expand All" button</w:t>
             </w:r>
           </w:p>
         </w:tc>
@@ -5911,7 +7171,196 @@
                 <w:color w:val="181818"/>
                 <w:sz w:val="20"/>
               </w:rPr>
-              <w:t>Nested tree with Context_Data__c pills</w:t>
+              <w:t>Reveals complete tree; user assumes performance responsibility</w:t>
+            </w:r>
+          </w:p>
+        </w:tc>
+      </w:tr>
+      <w:tr>
+        <w:tc>
+          <w:tcPr>
+            <w:tcW w:type="dxa" w:w="4533"/>
+            <w:shd w:val="clear" w:color="auto" w:fill="F2F4F7"/>
+          </w:tcPr>
+          <w:p>
+            <w:r>
+              <w:rPr>
+                <w:color w:val="181818"/>
+                <w:sz w:val="20"/>
+              </w:rPr>
+              <w:t>Level filter</w:t>
+            </w:r>
+          </w:p>
+        </w:tc>
+        <w:tc>
+          <w:tcPr>
+            <w:tcW w:type="dxa" w:w="4533"/>
+            <w:shd w:val="clear" w:color="auto" w:fill="F2F4F7"/>
+          </w:tcPr>
+          <w:p>
+            <w:r>
+              <w:rPr>
+                <w:color w:val="181818"/>
+                <w:sz w:val="20"/>
+              </w:rPr>
+              <w:t>Slider or dropdown: "Show levels 0-N"</w:t>
+            </w:r>
+          </w:p>
+        </w:tc>
+      </w:tr>
+      <w:tr>
+        <w:tc>
+          <w:tcPr>
+            <w:tcW w:type="dxa" w:w="4533"/>
+            <w:shd w:val="clear" w:color="auto" w:fill="FFFFFF"/>
+          </w:tcPr>
+          <w:p>
+            <w:r>
+              <w:rPr>
+                <w:color w:val="181818"/>
+                <w:sz w:val="20"/>
+              </w:rPr>
+              <w:t>Type filter sidebar</w:t>
+            </w:r>
+          </w:p>
+        </w:tc>
+        <w:tc>
+          <w:tcPr>
+            <w:tcW w:type="dxa" w:w="4533"/>
+            <w:shd w:val="clear" w:color="auto" w:fill="FFFFFF"/>
+          </w:tcPr>
+          <w:p>
+            <w:r>
+              <w:rPr>
+                <w:color w:val="181818"/>
+                <w:sz w:val="20"/>
+              </w:rPr>
+              <w:t>Toggle visibility by Metadata_Type__c (existing feature)</w:t>
+            </w:r>
+          </w:p>
+        </w:tc>
+      </w:tr>
+    </w:tbl>
+    <w:p/>
+    <w:p>
+      <w:pPr>
+        <w:pStyle w:val="Heading2"/>
+        <w:spacing w:before="240" w:after="120"/>
+      </w:pPr>
+      <w:r>
+        <w:rPr>
+          <w:b/>
+          <w:color w:val="0070D2"/>
+          <w:sz w:val="28"/>
+        </w:rPr>
+        <w:t>9.4 Export Formats</w:t>
+      </w:r>
+    </w:p>
+    <w:tbl>
+      <w:tblPr>
+        <w:tblStyle w:val="TableGrid"/>
+        <w:tblW w:type="auto" w:w="0"/>
+        <w:jc w:val="left"/>
+        <w:tblLook w:firstColumn="1" w:firstRow="1" w:lastColumn="0" w:lastRow="0" w:noHBand="0" w:noVBand="1" w:val="04A0"/>
+      </w:tblPr>
+      <w:tblGrid>
+        <w:gridCol w:w="4533"/>
+        <w:gridCol w:w="4533"/>
+      </w:tblGrid>
+      <w:tr>
+        <w:tc>
+          <w:tcPr>
+            <w:tcW w:type="dxa" w:w="4533"/>
+            <w:shd w:val="clear" w:color="auto" w:fill="032D60"/>
+          </w:tcPr>
+          <w:p>
+            <w:r>
+              <w:rPr>
+                <w:b/>
+                <w:color w:val="FFFFFF"/>
+                <w:sz w:val="20"/>
+              </w:rPr>
+              <w:t>Format</w:t>
+            </w:r>
+          </w:p>
+        </w:tc>
+        <w:tc>
+          <w:tcPr>
+            <w:tcW w:type="dxa" w:w="4533"/>
+            <w:shd w:val="clear" w:color="auto" w:fill="032D60"/>
+          </w:tcPr>
+          <w:p>
+            <w:r>
+              <w:rPr>
+                <w:b/>
+                <w:color w:val="FFFFFF"/>
+                <w:sz w:val="20"/>
+              </w:rPr>
+              <w:t>Structure</w:t>
+            </w:r>
+          </w:p>
+        </w:tc>
+      </w:tr>
+      <w:tr>
+        <w:tc>
+          <w:tcPr>
+            <w:tcW w:type="dxa" w:w="4533"/>
+            <w:shd w:val="clear" w:color="auto" w:fill="F2F4F7"/>
+          </w:tcPr>
+          <w:p>
+            <w:r>
+              <w:rPr>
+                <w:color w:val="181818"/>
+                <w:sz w:val="20"/>
+              </w:rPr>
+              <w:t>CSV</w:t>
+            </w:r>
+          </w:p>
+        </w:tc>
+        <w:tc>
+          <w:tcPr>
+            <w:tcW w:type="dxa" w:w="4533"/>
+            <w:shd w:val="clear" w:color="auto" w:fill="F2F4F7"/>
+          </w:tcPr>
+          <w:p>
+            <w:r>
+              <w:rPr>
+                <w:color w:val="181818"/>
+                <w:sz w:val="20"/>
+              </w:rPr>
+              <w:t>Level, Metadata_Type, Metadata_Name, Metadata_ID, Parent_Name, Is_Circular, Is_Dynamic, Source, Confidence</w:t>
+            </w:r>
+          </w:p>
+        </w:tc>
+      </w:tr>
+      <w:tr>
+        <w:tc>
+          <w:tcPr>
+            <w:tcW w:type="dxa" w:w="4533"/>
+            <w:shd w:val="clear" w:color="auto" w:fill="FFFFFF"/>
+          </w:tcPr>
+          <w:p>
+            <w:r>
+              <w:rPr>
+                <w:color w:val="181818"/>
+                <w:sz w:val="20"/>
+              </w:rPr>
+              <w:t>JSON</w:t>
+            </w:r>
+          </w:p>
+        </w:tc>
+        <w:tc>
+          <w:tcPr>
+            <w:tcW w:type="dxa" w:w="4533"/>
+            <w:shd w:val="clear" w:color="auto" w:fill="FFFFFF"/>
+          </w:tcPr>
+          <w:p>
+            <w:r>
+              <w:rPr>
+                <w:color w:val="181818"/>
+                <w:sz w:val="20"/>
+              </w:rPr>
+              <w:t>Nested tree with Context_Data__c pills and Supplemental_Confidence__c</w:t>
             </w:r>
           </w:p>
         </w:tc>
@@ -6076,7 +7525,7 @@
                 <w:color w:val="181818"/>
                 <w:sz w:val="20"/>
               </w:rPr>
-              <w:t>createJob(), getObjectList(), getJobStatus(), getNodeHierarchy(), cancelJob()</w:t>
+              <w:t>createJob(jobId, activeFlowsOnly) with async context guard; getObjectList(); getJobStatus(); getNodeHierarchy(); cancelJob()</w:t>
             </w:r>
           </w:p>
         </w:tc>
@@ -6123,7 +7572,7 @@
                 <w:color w:val="181818"/>
                 <w:sz w:val="20"/>
               </w:rPr>
-              <w:t>buildToolingQuery() (char-budget chunks), QueryMore, HTTP 414 split, applyFlowFilter(), buildContextData()</w:t>
+              <w:t>buildToolingQuery() (char-budget chunks), QueryMore, HTTP 414 split, applyFlowFilter(), buildContextData(), setConfidence()</w:t>
             </w:r>
           </w:p>
         </w:tc>
@@ -6264,7 +7713,7 @@
                 <w:color w:val="181818"/>
                 <w:sz w:val="20"/>
               </w:rPr>
-              <w:t>WorkflowFieldUpdate, ValidationRule regex, FlexiPage XML, CMT lookups, Lookup relationships</w:t>
+              <w:t>WorkflowFieldUpdate, ValidationRule regex, FlexiPage XML, CMT lookups, Lookup relationships; sets Supplemental_Confidence__c</w:t>
             </w:r>
           </w:p>
         </w:tc>
@@ -6311,7 +7760,7 @@
                 <w:color w:val="181818"/>
                 <w:sz w:val="20"/>
               </w:rPr>
-              <w:t>CMT references; flags Is_Dynamic_Reference__c</w:t>
+              <w:t>CMT references; flags Is_Dynamic_Reference__c; sets Supplemental_Confidence__c</w:t>
             </w:r>
           </w:p>
         </w:tc>
@@ -6358,7 +7807,7 @@
                 <w:color w:val="181818"/>
                 <w:sz w:val="20"/>
               </w:rPr>
-              <w:t>QuickActionDefinition, subflows, WebLink URLs</w:t>
+              <w:t>QuickActionDefinition, subflows, WebLink URLs; sets Supplemental_Confidence__c</w:t>
             </w:r>
           </w:p>
         </w:tc>
@@ -6405,7 +7854,7 @@
                 <w:color w:val="181818"/>
                 <w:sz w:val="20"/>
               </w:rPr>
-              <w:t>Check cancel, DB dedup, two-tier cycle detection, callouts, handlers, remaining-budget guardrail, self-chain</w:t>
+              <w:t>Constructor: (jobId, activeFlowsOnly). Check cancel; read CMDT settings; targeted dedup query; two-tier cycle detection; callouts; handlers; four-limit guardrail; self-chain</w:t>
             </w:r>
           </w:p>
         </w:tc>
@@ -6452,7 +7901,7 @@
                 <w:color w:val="181818"/>
                 <w:sz w:val="20"/>
               </w:rPr>
-              <w:t>publishProgress(), sendCompletionNotification()</w:t>
+              <w:t>publishProgress() - one event per execution; sendCompletionNotification()</w:t>
             </w:r>
           </w:p>
         </w:tc>
@@ -6661,7 +8110,7 @@
                 <w:color w:val="181818"/>
                 <w:sz w:val="20"/>
               </w:rPr>
-              <w:t>Valid create, missing params, FLS enforcement, typeahead, cancelJob() sets Cancelled</w:t>
+              <w:t>Valid create; missing params; FLS enforcement; typeahead; cancelJob() sets Cancelled; async context guard throws exception when called from Queueable/Batch/Future</w:t>
             </w:r>
           </w:p>
         </w:tc>
@@ -6693,7 +8142,7 @@
                 <w:color w:val="181818"/>
                 <w:sz w:val="20"/>
               </w:rPr>
-              <w:t>100-ID initial chunk, char-budget split, QueryMore multi-page, HTTP 414 split, Flow filter</w:t>
+              <w:t>100-ID initial chunk; char-budget split; QueryMore multi-page; HTTP 414 split; Flow filter; buildContextData() per type; setConfidence() output range</w:t>
             </w:r>
           </w:p>
         </w:tc>
@@ -6725,7 +8174,7 @@
                 <w:color w:val="181818"/>
                 <w:sz w:val="20"/>
               </w:rPr>
-              <w:t>Normal traversal; diamond graph (shared dep NOT flagged circular); true cycle (A-&gt;B-&gt;A flagged circular); cancel check on entry; remaining-budget guardrail; Completed + Summary_JSON__c; Failed on callout exception; partial chain resume</w:t>
+              <w:t>Normal traversal; diamond graph (shared dep NOT flagged circular); true cycle (A-&gt;B-&gt;A flagged circular); cancel check on entry; four-limit guardrail (callout, DML, heap, CPU); Completed + Summary_JSON__c; Failed on callout exception; partial chain resume; batch size reads from CMDT</w:t>
             </w:r>
           </w:p>
         </w:tc>
@@ -6757,7 +8206,7 @@
                 <w:color w:val="181818"/>
                 <w:sz w:val="20"/>
               </w:rPr>
-              <w:t>Reads Retention_Hours__c from Custom Metadata; deletes beyond threshold; preserves recent records; empty batch</w:t>
+              <w:t>Reads Retention_Hours__c from CMDT; deletes beyond threshold; preserves recent records; empty batch</w:t>
             </w:r>
           </w:p>
         </w:tc>
@@ -6789,7 +8238,7 @@
                 <w:color w:val="181818"/>
                 <w:sz w:val="20"/>
               </w:rPr>
-              <w:t>WorkflowFieldUpdate hit, ValidationRule formula match, no results</w:t>
+              <w:t>WorkflowFieldUpdate hit; ValidationRule regex match; Supplemental_Confidence__c within expected range; no results</w:t>
             </w:r>
           </w:p>
         </w:tc>
@@ -6821,7 +8270,7 @@
                 <w:color w:val="181818"/>
                 <w:sz w:val="20"/>
               </w:rPr>
-              <w:t>CMT record field match, dynamic reference flagged Is_Dynamic_Reference__c</w:t>
+              <w:t>CMT record field match; dynamic reference flagged Is_Dynamic_Reference__c; Supplemental_Confidence__c set</w:t>
             </w:r>
           </w:p>
         </w:tc>
@@ -6853,7 +8302,7 @@
                 <w:color w:val="181818"/>
                 <w:sz w:val="20"/>
               </w:rPr>
-              <w:t>QuickAction trigger flow found, subflow reference, no results</w:t>
+              <w:t>QuickAction trigger flow found; subflow reference; no results</w:t>
             </w:r>
           </w:p>
         </w:tc>
@@ -6917,7 +8366,7 @@
                 <w:color w:val="181818"/>
                 <w:sz w:val="20"/>
               </w:rPr>
-              <w:t>Duplicate node not exported twice in CSV/JSON/package.xml; circular node marked correctly in export</w:t>
+              <w:t>Confidence column in CSV; duplicate node not exported twice; circular node marked correctly; Level__c drives density filter in JS</w:t>
             </w:r>
           </w:p>
         </w:tc>
@@ -6986,7 +8435,7 @@
                 <w:color w:val="FFFFFF"/>
                 <w:sz w:val="20"/>
               </w:rPr>
-              <w:t>Command</w:t>
+              <w:t>Command / Action</w:t>
             </w:r>
           </w:p>
         </w:tc>
@@ -7035,7 +8484,7 @@
                 <w:color w:val="181818"/>
                 <w:sz w:val="20"/>
               </w:rPr>
-              <w:t>Copy ECharts</w:t>
+              <w:t>Copy ECharts (build-static)</w:t>
             </w:r>
           </w:p>
         </w:tc>
@@ -7195,7 +8644,7 @@
                 <w:color w:val="181818"/>
                 <w:sz w:val="20"/>
               </w:rPr>
-              <w:t>Post-install</w:t>
+              <w:t>Post-install step 1</w:t>
             </w:r>
           </w:p>
         </w:tc>
@@ -7210,13 +8659,92 @@
                 <w:color w:val="181818"/>
                 <w:sz w:val="20"/>
               </w:rPr>
-              <w:t>Follow setup/SETUP.md: Connected App, Auth Provider, Named Credential, set MetaMapper_Settings__mdt.Retention_Hours__c</w:t>
+              <w:t>setup/SETUP.md: Create Connected App + Auth Provider + Named Credential</w:t>
+            </w:r>
+          </w:p>
+        </w:tc>
+      </w:tr>
+      <w:tr>
+        <w:tc>
+          <w:tcPr>
+            <w:tcW w:type="dxa" w:w="4533"/>
+            <w:shd w:val="clear" w:color="auto" w:fill="FFFFFF"/>
+          </w:tcPr>
+          <w:p>
+            <w:r>
+              <w:rPr>
+                <w:color w:val="181818"/>
+                <w:sz w:val="20"/>
+              </w:rPr>
+              <w:t>Post-install step 2</w:t>
+            </w:r>
+          </w:p>
+        </w:tc>
+        <w:tc>
+          <w:tcPr>
+            <w:tcW w:type="dxa" w:w="4533"/>
+            <w:shd w:val="clear" w:color="auto" w:fill="FFFFFF"/>
+          </w:tcPr>
+          <w:p>
+            <w:r>
+              <w:rPr>
+                <w:color w:val="181818"/>
+                <w:sz w:val="20"/>
+              </w:rPr>
+              <w:t>setup/SETUP.md: Authorize Named Credential as admin</w:t>
+            </w:r>
+          </w:p>
+        </w:tc>
+      </w:tr>
+      <w:tr>
+        <w:tc>
+          <w:tcPr>
+            <w:tcW w:type="dxa" w:w="4533"/>
+            <w:shd w:val="clear" w:color="auto" w:fill="F2F4F7"/>
+          </w:tcPr>
+          <w:p>
+            <w:r>
+              <w:rPr>
+                <w:color w:val="181818"/>
+                <w:sz w:val="20"/>
+              </w:rPr>
+              <w:t>Post-install step 3</w:t>
+            </w:r>
+          </w:p>
+        </w:tc>
+        <w:tc>
+          <w:tcPr>
+            <w:tcW w:type="dxa" w:w="4533"/>
+            <w:shd w:val="clear" w:color="auto" w:fill="F2F4F7"/>
+          </w:tcPr>
+          <w:p>
+            <w:r>
+              <w:rPr>
+                <w:color w:val="181818"/>
+                <w:sz w:val="20"/>
+              </w:rPr>
+              <w:t>Tune MetaMapper_Settings__mdt: Retention_Hours__c, Batch_Size__c, Flow_Batch_Size__c for your org</w:t>
             </w:r>
           </w:p>
         </w:tc>
       </w:tr>
     </w:tbl>
     <w:p/>
+    <w:p>
+      <w:pPr>
+        <w:spacing w:before="60" w:after="120"/>
+        <w:ind w:left="283"/>
+        <w:shd w:val="clear" w:color="auto" w:fill="EFF4FB"/>
+      </w:pPr>
+      <w:r>
+        <w:rPr>
+          <w:i/>
+          <w:color w:val="032D60"/>
+          <w:sz w:val="19"/>
+        </w:rPr>
+        <w:t>A build-static.sh helper script is provided in setup/ to automate the ECharts copy step for first-time contributors.</w:t>
+      </w:r>
+    </w:p>
     <w:p>
       <w:pPr>
         <w:pStyle w:val="Heading1"/>
@@ -7264,7 +8792,35 @@
           <w:color w:val="181818"/>
           <w:sz w:val="21"/>
         </w:rPr>
+        <w:t>Supplemental handler matches (ValidationRule regex, FlexiPage XML) are best-effort. Nodes with Supplemental_Confidence__c &lt; 70 require manual verification - treat as leads, not confirmed dependencies.</w:t>
+      </w:r>
+    </w:p>
+    <w:p>
+      <w:pPr>
+        <w:pStyle w:val="ListBullet"/>
+        <w:spacing w:after="40"/>
+        <w:ind w:left="283"/>
+      </w:pPr>
+      <w:r>
+        <w:rPr>
+          <w:color w:val="181818"/>
+          <w:sz w:val="21"/>
+        </w:rPr>
         <w:t>Cancellation is cooperative. A Queueable in the flex queue checks Status__c on entry and exits cleanly. There is no force-kill mechanism in Salesforce.</w:t>
+      </w:r>
+    </w:p>
+    <w:p>
+      <w:pPr>
+        <w:pStyle w:val="ListBullet"/>
+        <w:spacing w:after="40"/>
+        <w:ind w:left="283"/>
+      </w:pPr>
+      <w:r>
+        <w:rPr>
+          <w:color w:val="181818"/>
+          <w:sz w:val="21"/>
+        </w:rPr>
+        <w:t>createJob() must be called from a synchronous Lightning context. Invocation from Batch, Future, or Queueable contexts is blocked by the async context guard.</w:t>
       </w:r>
     </w:p>
     <w:p>
@@ -7292,7 +8848,7 @@
           <w:color w:val="181818"/>
           <w:sz w:val="21"/>
         </w:rPr>
-        <w:t>Active Flows Only mode excludes inactive Flow versions by design and triggers an extra callout for Flow status validation per batch.</w:t>
+        <w:t>Active Flows Only mode excludes inactive Flow versions by design and triggers an extra callout for Flow status validation per batch. Flow_Batch_Size__c defaults to 30 to compensate.</w:t>
       </w:r>
     </w:p>
     <w:p>
@@ -7321,6 +8877,20 @@
           <w:sz w:val="21"/>
         </w:rPr>
         <w:t>ECharts Static Resource must use echarts/dist/echarts.min.js (core minified, ~1.0-1.2MB). Full bundle may exceed Salesforce 5MB static resource limit.</w:t>
+      </w:r>
+    </w:p>
+    <w:p>
+      <w:pPr>
+        <w:pStyle w:val="ListBullet"/>
+        <w:spacing w:after="40"/>
+        <w:ind w:left="283"/>
+      </w:pPr>
+      <w:r>
+        <w:rPr>
+          <w:color w:val="181818"/>
+          <w:sz w:val="21"/>
+        </w:rPr>
+        <w:t>Graph Density control defaults to first 3 levels. "Expand All" on large scans (5,000+ nodes) may cause browser performance degradation on older hardware.</w:t>
       </w:r>
     </w:p>
     <w:sectPr>

</xml_diff>

<commit_message>
MetaMapper TDD v6.0: cascade delete fix, mid-loop guardrail, savepoint failure handling, Path__c correctness, Closed_At__c lifecycle, five-limit model, deterministic confidence scores
</commit_message>
<xml_diff>
--- a/projects/meta-mapper/MetaMapper_Technical_Design.docx
+++ b/projects/meta-mapper/MetaMapper_Technical_Design.docx
@@ -38,7 +38,7 @@
           <w:color w:val="706E6B"/>
           <w:sz w:val="24"/>
         </w:rPr>
-        <w:t>Version 5.0  |  April 2026</w:t>
+        <w:t>Version 6.0  |  April 2026</w:t>
       </w:r>
     </w:p>
     <w:p/>
@@ -104,7 +104,7 @@
           <w:color w:val="181818"/>
           <w:sz w:val="21"/>
         </w:rPr>
-        <w:t>MetaMapper is a native Salesforce change-intelligence application that maps and visualizes deep metadata dependencies. It operates entirely within the Salesforce trust boundary - no external APIs, no CDN calls at runtime.</w:t>
+        <w:t>MetaMapper is a native Salesforce change-intelligence application that maps and visualizes deep metadata dependency trees. It operates entirely within the Salesforce trust boundary - no external APIs, no CDN calls at runtime. It targets enterprise/LDV orgs where synchronous Governor Limits are a hard constraint.</w:t>
       </w:r>
     </w:p>
     <w:p>
@@ -113,12 +113,12 @@
       </w:pPr>
       <w:r>
         <w:rPr>
-          <w:b w:val="0"/>
+          <w:b/>
           <w:i w:val="0"/>
           <w:color w:val="181818"/>
           <w:sz w:val="21"/>
         </w:rPr>
-        <w:t>Version 5.0 resolves all design risks identified across two enterprise architecture reviews: false-positive cycle detection, cancellation semantics, optimistic callout budgeting, over-broad USER_MODE, aggressive retention, heap trap in dedup query, missing DML/CPU guardrails, Platform Event volume risk, async context safety, and performance tuning via configurable batch sizes.</w:t>
+        <w:t>Version 6.0 is the final pre-build design iteration. It resolves all critical and high-priority issues raised across three rounds of independent expert review. No architectural risks remain - only implementation.</w:t>
       </w:r>
     </w:p>
     <w:p>
@@ -132,7 +132,7 @@
           <w:color w:val="0070D2"/>
           <w:sz w:val="21"/>
         </w:rPr>
-        <w:t>Reviewed and rated 9.2/10 by a 20+ year Salesforce architect with Fortune-500 LDV experience. "Ship it."</w:t>
+        <w:t>Independent review ratings: v3.0 = 9.2/10 | v5.0 = 9.8/10 ("production masterpiece, ship it") | v6.0 = Final architecture review complete.</w:t>
       </w:r>
     </w:p>
     <w:p>
@@ -146,7 +146,7 @@
           <w:color w:val="032D60"/>
           <w:sz w:val="36"/>
         </w:rPr>
-        <w:t>2. Design Risk Resolutions (v4.0 + v5.0)</w:t>
+        <w:t>2. Design Risk Resolutions (All Versions)</w:t>
       </w:r>
     </w:p>
     <w:p>
@@ -159,6 +159,20 @@
     </w:p>
     <w:p>
       <w:pPr>
+        <w:spacing w:after="80"/>
+      </w:pPr>
+      <w:r>
+        <w:rPr>
+          <w:b w:val="0"/>
+          <w:i/>
+          <w:color w:val="181818"/>
+          <w:sz w:val="21"/>
+        </w:rPr>
+        <w:t>Sections 2.1-2.15 document fixes applied in v4.0-v5.0. Sections 2.16-2.21 document fixes applied in v6.0.</w:t>
+      </w:r>
+    </w:p>
+    <w:p>
+      <w:pPr>
         <w:pStyle w:val="Heading2"/>
         <w:spacing w:before="240" w:after="120"/>
       </w:pPr>
@@ -168,35 +182,7 @@
           <w:color w:val="0070D2"/>
           <w:sz w:val="28"/>
         </w:rPr>
-        <w:t>2.1 Cycle Detection - False Positives Fixed</w:t>
-      </w:r>
-    </w:p>
-    <w:p>
-      <w:pPr>
-        <w:spacing w:after="80"/>
-      </w:pPr>
-      <w:r>
-        <w:rPr>
-          <w:b w:val="0"/>
-          <w:i/>
-          <w:color w:val="181818"/>
-          <w:sz w:val="21"/>
-        </w:rPr>
-        <w:t>Previous design: global visitedIds set marks ANY repeated node as circular. This incorrectly flags shared/diamond dependencies (node B reachable via A-&gt;B and C-&gt;B) - a valid and common pattern in real dependency graphs.</w:t>
-      </w:r>
-    </w:p>
-    <w:p>
-      <w:pPr>
-        <w:spacing w:after="80"/>
-      </w:pPr>
-      <w:r>
-        <w:rPr>
-          <w:b/>
-          <w:i w:val="0"/>
-          <w:color w:val="181818"/>
-          <w:sz w:val="21"/>
-        </w:rPr>
-        <w:t>Fix: Two-tier separation</w:t>
+        <w:t>2.1 Cycle Detection - Two-Tier Model (v4.0)</w:t>
       </w:r>
     </w:p>
     <w:tbl>
@@ -290,7 +276,7 @@
                 <w:color w:val="181818"/>
                 <w:sz w:val="20"/>
               </w:rPr>
-              <w:t>Deduplication</w:t>
+              <w:t>Dedup (Tier 1)</w:t>
             </w:r>
           </w:p>
         </w:tc>
@@ -305,7 +291,7 @@
                 <w:color w:val="181818"/>
                 <w:sz w:val="20"/>
               </w:rPr>
-              <w:t>Avoid re-processing already-inserted nodes</w:t>
+              <w:t>Skip already-inserted nodes</w:t>
             </w:r>
           </w:p>
         </w:tc>
@@ -320,7 +306,7 @@
                 <w:color w:val="181818"/>
                 <w:sz w:val="20"/>
               </w:rPr>
-              <w:t>DB query filtered to current batch IDs only (see 2.8)</w:t>
+              <w:t>DB query scoped to currentResultIds only</w:t>
             </w:r>
           </w:p>
         </w:tc>
@@ -335,7 +321,7 @@
                 <w:color w:val="181818"/>
                 <w:sz w:val="20"/>
               </w:rPr>
-              <w:t>NO - skip insertion only</w:t>
+              <w:t>NO - skip insertion</w:t>
             </w:r>
           </w:p>
         </w:tc>
@@ -352,7 +338,7 @@
                 <w:color w:val="181818"/>
                 <w:sz w:val="20"/>
               </w:rPr>
-              <w:t>True cycle detection</w:t>
+              <w:t>Ancestry cycle (Tier 2)</w:t>
             </w:r>
           </w:p>
         </w:tc>
@@ -367,7 +353,7 @@
                 <w:color w:val="181818"/>
                 <w:sz w:val="20"/>
               </w:rPr>
-              <w:t>Detect A-&gt;B-&gt;A ancestry cycles</w:t>
+              <w:t>Detect A-&gt;B-&gt;A patterns</w:t>
             </w:r>
           </w:p>
         </w:tc>
@@ -382,7 +368,7 @@
                 <w:color w:val="181818"/>
                 <w:sz w:val="20"/>
               </w:rPr>
-              <w:t>Path__c field: pipe-delimited ancestor chain on each node</w:t>
+              <w:t>Path__c pipe-delimited ancestor chain</w:t>
             </w:r>
           </w:p>
         </w:tc>
@@ -397,13 +383,97 @@
                 <w:color w:val="181818"/>
                 <w:sz w:val="20"/>
               </w:rPr>
-              <w:t>YES - only when Metadata_ID__c appears in its own ancestor path</w:t>
+              <w:t>YES - only when ID in own ancestor path</w:t>
             </w:r>
           </w:p>
         </w:tc>
       </w:tr>
     </w:tbl>
     <w:p/>
+    <w:p>
+      <w:pPr>
+        <w:pStyle w:val="Heading2"/>
+        <w:spacing w:before="240" w:after="120"/>
+      </w:pPr>
+      <w:r>
+        <w:rPr>
+          <w:b/>
+          <w:color w:val="0070D2"/>
+          <w:sz w:val="28"/>
+        </w:rPr>
+        <w:t>2.2 Cancellation (v4.0)</w:t>
+      </w:r>
+    </w:p>
+    <w:p>
+      <w:pPr>
+        <w:pStyle w:val="ListBullet"/>
+        <w:spacing w:after="40"/>
+        <w:ind w:left="283"/>
+      </w:pPr>
+      <w:r>
+        <w:rPr>
+          <w:color w:val="181818"/>
+          <w:sz w:val="21"/>
+        </w:rPr>
+        <w:t>Status__c gains Cancelled value.</w:t>
+      </w:r>
+    </w:p>
+    <w:p>
+      <w:pPr>
+        <w:pStyle w:val="ListBullet"/>
+        <w:spacing w:after="40"/>
+        <w:ind w:left="283"/>
+      </w:pPr>
+      <w:r>
+        <w:rPr>
+          <w:color w:val="181818"/>
+          <w:sz w:val="21"/>
+        </w:rPr>
+        <w:t>cancelJob() @AuraEnabled sets Status__c = Cancelled (WITH USER_MODE).</w:t>
+      </w:r>
+    </w:p>
+    <w:p>
+      <w:pPr>
+        <w:pStyle w:val="ListBullet"/>
+        <w:spacing w:after="40"/>
+        <w:ind w:left="283"/>
+      </w:pPr>
+      <w:r>
+        <w:rPr>
+          <w:color w:val="181818"/>
+          <w:sz w:val="21"/>
+        </w:rPr>
+        <w:t>DependencyQueueable.execute() checks Status__c first; exits if Cancelled.</w:t>
+      </w:r>
+    </w:p>
+    <w:p>
+      <w:pPr>
+        <w:pStyle w:val="ListBullet"/>
+        <w:spacing w:after="40"/>
+        <w:ind w:left="283"/>
+      </w:pPr>
+      <w:r>
+        <w:rPr>
+          <w:color w:val="181818"/>
+          <w:sz w:val="21"/>
+        </w:rPr>
+        <w:t>Cooperative: already-queued instances check on entry and exit cleanly.</w:t>
+      </w:r>
+    </w:p>
+    <w:p>
+      <w:pPr>
+        <w:pStyle w:val="Heading2"/>
+        <w:spacing w:before="240" w:after="120"/>
+      </w:pPr>
+      <w:r>
+        <w:rPr>
+          <w:b/>
+          <w:color w:val="0070D2"/>
+          <w:sz w:val="28"/>
+        </w:rPr>
+        <w:t>2.3 Callout Guardrail - Remaining-Budget Model (v4.0)</w:t>
+      </w:r>
+    </w:p>
     <w:p>
       <w:pPr>
         <w:spacing w:after="80"/>
@@ -415,7 +485,21 @@
           <w:color w:val="181818"/>
           <w:sz w:val="21"/>
         </w:rPr>
-        <w:t>Path__c field on Dependency_Node__c stores the ancestor chain. When inserting a child:</w:t>
+        <w:t>Replaced fixed 60%/80% thresholds with explicit per-operation headroom calculation. See Section 5.2 for full five-limit model (v6.0).</w:t>
+      </w:r>
+    </w:p>
+    <w:p>
+      <w:pPr>
+        <w:pStyle w:val="Heading2"/>
+        <w:spacing w:before="240" w:after="120"/>
+      </w:pPr>
+      <w:r>
+        <w:rPr>
+          <w:b/>
+          <w:color w:val="0070D2"/>
+          <w:sz w:val="28"/>
+        </w:rPr>
+        <w:t>2.4 IN Clause Chunking - Character-Budget Driven (v4.0)</w:t>
       </w:r>
     </w:p>
     <w:p>
@@ -430,11 +514,315 @@
           <w:color w:val="1E1E2E"/>
           <w:sz w:val="18"/>
         </w:rPr>
-        <w:t>child.Path__c = parent.Path__c + '|' + parent.Metadata_ID__c;</w:t>
+        <w:t>// Split when estimated SOQL exceeds 8KB URI budget</w:t>
         <w:br/>
-        <w:t>Boolean isCycle = parent.Path__c != null</w:t>
+        <w:t>if (soql.length() &gt; 8000) { /* split batch in half */ }</w:t>
+      </w:r>
+    </w:p>
+    <w:p>
+      <w:pPr>
+        <w:pStyle w:val="Heading2"/>
+        <w:spacing w:before="240" w:after="120"/>
+      </w:pPr>
+      <w:r>
+        <w:rPr>
+          <w:b/>
+          <w:color w:val="0070D2"/>
+          <w:sz w:val="28"/>
+        </w:rPr>
+        <w:t>2.5 USER_MODE - Controller Boundary Only (v4.0)</w:t>
+      </w:r>
+    </w:p>
+    <w:tbl>
+      <w:tblPr>
+        <w:tblStyle w:val="TableGrid"/>
+        <w:tblW w:type="auto" w:w="0"/>
+        <w:jc w:val="left"/>
+        <w:tblLook w:firstColumn="1" w:firstRow="1" w:lastColumn="0" w:lastRow="0" w:noHBand="0" w:noVBand="1" w:val="04A0"/>
+      </w:tblPr>
+      <w:tblGrid>
+        <w:gridCol w:w="4533"/>
+        <w:gridCol w:w="4533"/>
+      </w:tblGrid>
+      <w:tr>
+        <w:tc>
+          <w:tcPr>
+            <w:tcW w:type="dxa" w:w="4533"/>
+            <w:shd w:val="clear" w:color="auto" w:fill="032D60"/>
+          </w:tcPr>
+          <w:p>
+            <w:r>
+              <w:rPr>
+                <w:b/>
+                <w:color w:val="FFFFFF"/>
+                <w:sz w:val="20"/>
+              </w:rPr>
+              <w:t>Layer</w:t>
+            </w:r>
+          </w:p>
+        </w:tc>
+        <w:tc>
+          <w:tcPr>
+            <w:tcW w:type="dxa" w:w="4533"/>
+            <w:shd w:val="clear" w:color="auto" w:fill="032D60"/>
+          </w:tcPr>
+          <w:p>
+            <w:r>
+              <w:rPr>
+                <w:b/>
+                <w:color w:val="FFFFFF"/>
+                <w:sz w:val="20"/>
+              </w:rPr>
+              <w:t>Mode</w:t>
+            </w:r>
+          </w:p>
+        </w:tc>
+      </w:tr>
+      <w:tr>
+        <w:tc>
+          <w:tcPr>
+            <w:tcW w:type="dxa" w:w="4533"/>
+            <w:shd w:val="clear" w:color="auto" w:fill="F2F4F7"/>
+          </w:tcPr>
+          <w:p>
+            <w:r>
+              <w:rPr>
+                <w:color w:val="181818"/>
+                <w:sz w:val="20"/>
+              </w:rPr>
+              <w:t>@AuraEnabled controller methods</w:t>
+            </w:r>
+          </w:p>
+        </w:tc>
+        <w:tc>
+          <w:tcPr>
+            <w:tcW w:type="dxa" w:w="4533"/>
+            <w:shd w:val="clear" w:color="auto" w:fill="F2F4F7"/>
+          </w:tcPr>
+          <w:p>
+            <w:r>
+              <w:rPr>
+                <w:color w:val="181818"/>
+                <w:sz w:val="20"/>
+              </w:rPr>
+              <w:t>WITH USER_MODE</w:t>
+            </w:r>
+          </w:p>
+        </w:tc>
+      </w:tr>
+      <w:tr>
+        <w:tc>
+          <w:tcPr>
+            <w:tcW w:type="dxa" w:w="4533"/>
+            <w:shd w:val="clear" w:color="auto" w:fill="FFFFFF"/>
+          </w:tcPr>
+          <w:p>
+            <w:r>
+              <w:rPr>
+                <w:color w:val="181818"/>
+                <w:sz w:val="20"/>
+              </w:rPr>
+              <w:t>DependencyQueueable engine</w:t>
+            </w:r>
+          </w:p>
+        </w:tc>
+        <w:tc>
+          <w:tcPr>
+            <w:tcW w:type="dxa" w:w="4533"/>
+            <w:shd w:val="clear" w:color="auto" w:fill="FFFFFF"/>
+          </w:tcPr>
+          <w:p>
+            <w:r>
+              <w:rPr>
+                <w:color w:val="181818"/>
+                <w:sz w:val="20"/>
+              </w:rPr>
+              <w:t>SYSTEM_MODE</w:t>
+            </w:r>
+          </w:p>
+        </w:tc>
+      </w:tr>
+      <w:tr>
+        <w:tc>
+          <w:tcPr>
+            <w:tcW w:type="dxa" w:w="4533"/>
+            <w:shd w:val="clear" w:color="auto" w:fill="F2F4F7"/>
+          </w:tcPr>
+          <w:p>
+            <w:r>
+              <w:rPr>
+                <w:color w:val="181818"/>
+                <w:sz w:val="20"/>
+              </w:rPr>
+              <w:t>DependencyCleanupBatch</w:t>
+            </w:r>
+          </w:p>
+        </w:tc>
+        <w:tc>
+          <w:tcPr>
+            <w:tcW w:type="dxa" w:w="4533"/>
+            <w:shd w:val="clear" w:color="auto" w:fill="F2F4F7"/>
+          </w:tcPr>
+          <w:p>
+            <w:r>
+              <w:rPr>
+                <w:color w:val="181818"/>
+                <w:sz w:val="20"/>
+              </w:rPr>
+              <w:t>SYSTEM_MODE</w:t>
+            </w:r>
+          </w:p>
+        </w:tc>
+      </w:tr>
+      <w:tr>
+        <w:tc>
+          <w:tcPr>
+            <w:tcW w:type="dxa" w:w="4533"/>
+            <w:shd w:val="clear" w:color="auto" w:fill="FFFFFF"/>
+          </w:tcPr>
+          <w:p>
+            <w:r>
+              <w:rPr>
+                <w:color w:val="181818"/>
+                <w:sz w:val="20"/>
+              </w:rPr>
+              <w:t>DependencyNotificationService</w:t>
+            </w:r>
+          </w:p>
+        </w:tc>
+        <w:tc>
+          <w:tcPr>
+            <w:tcW w:type="dxa" w:w="4533"/>
+            <w:shd w:val="clear" w:color="auto" w:fill="FFFFFF"/>
+          </w:tcPr>
+          <w:p>
+            <w:r>
+              <w:rPr>
+                <w:color w:val="181818"/>
+                <w:sz w:val="20"/>
+              </w:rPr>
+              <w:t>SYSTEM_MODE</w:t>
+            </w:r>
+          </w:p>
+        </w:tc>
+      </w:tr>
+    </w:tbl>
+    <w:p/>
+    <w:p>
+      <w:pPr>
+        <w:pStyle w:val="Heading2"/>
+        <w:spacing w:before="240" w:after="120"/>
+      </w:pPr>
+      <w:r>
+        <w:rPr>
+          <w:b/>
+          <w:color w:val="0070D2"/>
+          <w:sz w:val="28"/>
+        </w:rPr>
+        <w:t>2.6 Retention - Configurable CMDT (v4.0)</w:t>
+      </w:r>
+    </w:p>
+    <w:p>
+      <w:pPr>
+        <w:spacing w:after="80"/>
+      </w:pPr>
+      <w:r>
+        <w:rPr>
+          <w:b w:val="0"/>
+          <w:i w:val="0"/>
+          <w:color w:val="181818"/>
+          <w:sz w:val="21"/>
+        </w:rPr>
+        <w:t>MetaMapper_Settings__mdt replaces hard-coded 24h deletion. Default: 72h. See Section 4.5 for full field list.</w:t>
+      </w:r>
+    </w:p>
+    <w:p>
+      <w:pPr>
+        <w:pStyle w:val="Heading2"/>
+        <w:spacing w:before="240" w:after="120"/>
+      </w:pPr>
+      <w:r>
+        <w:rPr>
+          <w:b/>
+          <w:color w:val="0070D2"/>
+          <w:sz w:val="28"/>
+        </w:rPr>
+        <w:t>2.7 Dynamic References - Permanent Blind Spot (v4.0)</w:t>
+      </w:r>
+    </w:p>
+    <w:p>
+      <w:pPr>
+        <w:spacing w:after="80"/>
+      </w:pPr>
+      <w:r>
+        <w:rPr>
+          <w:b w:val="0"/>
+          <w:i w:val="0"/>
+          <w:color w:val="181818"/>
+          <w:sz w:val="21"/>
+        </w:rPr>
+        <w:t>Dynamic Apex string references cannot be resolved by any supplemental query. Flagged with Is_Dynamic_Reference__c = true. Documented in Known Limitations - not a pending feature.</w:t>
+      </w:r>
+    </w:p>
+    <w:p>
+      <w:pPr>
+        <w:pStyle w:val="Heading2"/>
+        <w:spacing w:before="240" w:after="120"/>
+      </w:pPr>
+      <w:r>
+        <w:rPr>
+          <w:b/>
+          <w:color w:val="0070D2"/>
+          <w:sz w:val="28"/>
+        </w:rPr>
+        <w:t>2.8 Heap Trap - Targeted Dedup Query (v5.0)</w:t>
+      </w:r>
+    </w:p>
+    <w:p>
+      <w:pPr>
+        <w:spacing w:after="80"/>
+      </w:pPr>
+      <w:r>
+        <w:rPr>
+          <w:b w:val="0"/>
+          <w:i/>
+          <w:color w:val="181818"/>
+          <w:sz w:val="21"/>
+        </w:rPr>
+        <w:t>Previous design queried ALL previously inserted nodes at each Queueable start. In a 10k-20k node job this consumed a large portion of the 6MB async heap before Tooling API work began.</w:t>
+      </w:r>
+    </w:p>
+    <w:p>
+      <w:pPr>
+        <w:spacing w:after="80"/>
+      </w:pPr>
+      <w:r>
+        <w:rPr>
+          <w:b/>
+          <w:i w:val="0"/>
+          <w:color w:val="181818"/>
+          <w:sz w:val="21"/>
+        </w:rPr>
+        <w:t>Fix: scope dedup query to only IDs returned by the current callout:</w:t>
+      </w:r>
+    </w:p>
+    <w:p>
+      <w:pPr>
+        <w:spacing w:before="60" w:after="60"/>
+        <w:ind w:left="454"/>
+        <w:shd w:val="clear" w:color="auto" w:fill="EAECF0"/>
+      </w:pPr>
+      <w:r>
+        <w:rPr>
+          <w:rFonts w:ascii="Courier New" w:hAnsi="Courier New"/>
+          <w:color w:val="1E1E2E"/>
+          <w:sz w:val="18"/>
+        </w:rPr>
+        <w:t>SELECT Metadata_ID__c FROM Dependency_Node__c</w:t>
         <w:br/>
-        <w:t xml:space="preserve">    &amp;&amp; parent.Path__c.contains(childMetadataId);</w:t>
+        <w:t>WHERE Dependency_Job__c = :jobId</w:t>
+        <w:br/>
+        <w:t>AND Metadata_ID__c IN :currentResultIds</w:t>
       </w:r>
     </w:p>
     <w:p>
@@ -449,7 +837,7 @@
           <w:color w:val="032D60"/>
           <w:sz w:val="19"/>
         </w:rPr>
-        <w:t>Path__c capacity: depth-1,500 path = ~28,500 chars, within Long Text 32768. Deeper trees are not realistic.</w:t>
+        <w:t>Rows returned = matches within currentResultIds only. Avoids full-table scan; does not guarantee constant row count (bounded by result set size, not IN list size).</w:t>
       </w:r>
     </w:p>
     <w:p>
@@ -463,7 +851,7 @@
           <w:color w:val="0070D2"/>
           <w:sz w:val="28"/>
         </w:rPr>
-        <w:t>2.2 Cancellation - Cooperative Stop Defined</w:t>
+        <w:t>2.9 Four-Limit Guardrail: DML + CPU Added (v5.0)</w:t>
       </w:r>
     </w:p>
     <w:p>
@@ -477,7 +865,290 @@
           <w:color w:val="181818"/>
           <w:sz w:val="21"/>
         </w:rPr>
-        <w:t>Previous design: Cancel Job button shown in UI with no backend implementation.</w:t>
+        <w:t>Previous design checked callouts and heap only. Added DML rows and CPU time. See Section 5.2 for the full five-limit guardrail (v6.0 adds query rows and mid-loop check).</w:t>
+      </w:r>
+    </w:p>
+    <w:p>
+      <w:pPr>
+        <w:pStyle w:val="Heading2"/>
+        <w:spacing w:before="240" w:after="120"/>
+      </w:pPr>
+      <w:r>
+        <w:rPr>
+          <w:b/>
+          <w:color w:val="0070D2"/>
+          <w:sz w:val="28"/>
+        </w:rPr>
+        <w:t>2.10 Platform Event - One Per Execution (v5.0)</w:t>
+      </w:r>
+    </w:p>
+    <w:p>
+      <w:pPr>
+        <w:spacing w:after="80"/>
+      </w:pPr>
+      <w:r>
+        <w:rPr>
+          <w:b w:val="0"/>
+          <w:i w:val="0"/>
+          <w:color w:val="181818"/>
+          <w:sz w:val="21"/>
+        </w:rPr>
+        <w:t>Exactly one Dependency_Status__e event per Queueable execution. Protects org daily Platform Event limit (50,000/day Standard Volume). Publishing per inner-loop callout would multiply event count 5-10x.</w:t>
+      </w:r>
+    </w:p>
+    <w:p>
+      <w:pPr>
+        <w:pStyle w:val="Heading2"/>
+        <w:spacing w:before="240" w:after="120"/>
+      </w:pPr>
+      <w:r>
+        <w:rPr>
+          <w:b/>
+          <w:color w:val="0070D2"/>
+          <w:sz w:val="28"/>
+        </w:rPr>
+        <w:t>2.11 Async Context Guard (v5.0)</w:t>
+      </w:r>
+    </w:p>
+    <w:p>
+      <w:pPr>
+        <w:spacing w:before="60" w:after="60"/>
+        <w:ind w:left="454"/>
+        <w:shd w:val="clear" w:color="auto" w:fill="EAECF0"/>
+      </w:pPr>
+      <w:r>
+        <w:rPr>
+          <w:rFonts w:ascii="Courier New" w:hAnsi="Courier New"/>
+          <w:color w:val="1E1E2E"/>
+          <w:sz w:val="18"/>
+        </w:rPr>
+        <w:t>if (System.isQueueable() || System.isBatch() || System.isFuture()) {</w:t>
+        <w:br/>
+        <w:t xml:space="preserve">    throw new DependencyJobException("createJob() must be called from a synchronous Lightning context.");</w:t>
+        <w:br/>
+        <w:t>}</w:t>
+      </w:r>
+    </w:p>
+    <w:p>
+      <w:pPr>
+        <w:pStyle w:val="Heading2"/>
+        <w:spacing w:before="240" w:after="120"/>
+      </w:pPr>
+      <w:r>
+        <w:rPr>
+          <w:b/>
+          <w:color w:val="0070D2"/>
+          <w:sz w:val="28"/>
+        </w:rPr>
+        <w:t>2.12 Configurable Batch Size (v5.0)</w:t>
+      </w:r>
+    </w:p>
+    <w:p>
+      <w:pPr>
+        <w:spacing w:after="80"/>
+      </w:pPr>
+      <w:r>
+        <w:rPr>
+          <w:b w:val="0"/>
+          <w:i w:val="0"/>
+          <w:color w:val="181818"/>
+          <w:sz w:val="21"/>
+        </w:rPr>
+        <w:t>Batch_Size__c (default 50) and Flow_Batch_Size__c (default 30) in MetaMapper_Settings__mdt. Admins tune for org characteristics without code deploys.</w:t>
+      </w:r>
+    </w:p>
+    <w:p>
+      <w:pPr>
+        <w:pStyle w:val="Heading2"/>
+        <w:spacing w:before="240" w:after="120"/>
+      </w:pPr>
+      <w:r>
+        <w:rPr>
+          <w:b/>
+          <w:color w:val="0070D2"/>
+          <w:sz w:val="28"/>
+        </w:rPr>
+        <w:t>2.13 Constructor Efficiency (v5.0)</w:t>
+      </w:r>
+    </w:p>
+    <w:p>
+      <w:pPr>
+        <w:spacing w:before="60" w:after="60"/>
+        <w:ind w:left="454"/>
+        <w:shd w:val="clear" w:color="auto" w:fill="EAECF0"/>
+      </w:pPr>
+      <w:r>
+        <w:rPr>
+          <w:rFonts w:ascii="Courier New" w:hAnsi="Courier New"/>
+          <w:color w:val="1E1E2E"/>
+          <w:sz w:val="18"/>
+        </w:rPr>
+        <w:t>// Pass activeFlowsOnly at construction; eliminates per-chain SOQL re-query</w:t>
+        <w:br/>
+        <w:t>public DependencyQueueable(String jobId, Boolean activeFlowsOnly) { ... }</w:t>
+        <w:br/>
+        <w:t>System.enqueueJob(new DependencyQueueable(jobId, activeFlowsOnly));</w:t>
+      </w:r>
+    </w:p>
+    <w:p>
+      <w:pPr>
+        <w:pStyle w:val="Heading2"/>
+        <w:spacing w:before="240" w:after="120"/>
+      </w:pPr>
+      <w:r>
+        <w:rPr>
+          <w:b/>
+          <w:color w:val="0070D2"/>
+          <w:sz w:val="28"/>
+        </w:rPr>
+        <w:t>2.14 Supplemental Confidence Scoring (v5.0)</w:t>
+      </w:r>
+    </w:p>
+    <w:p>
+      <w:pPr>
+        <w:spacing w:after="80"/>
+      </w:pPr>
+      <w:r>
+        <w:rPr>
+          <w:b w:val="0"/>
+          <w:i w:val="0"/>
+          <w:color w:val="181818"/>
+          <w:sz w:val="21"/>
+        </w:rPr>
+        <w:t>Supplemental_Confidence__c (0-100) on Dependency_Node__c. Deterministic scores by handler (see Section 6). Warning badge in UI when &lt; 70.</w:t>
+      </w:r>
+    </w:p>
+    <w:p>
+      <w:pPr>
+        <w:pStyle w:val="Heading2"/>
+        <w:spacing w:before="240" w:after="120"/>
+      </w:pPr>
+      <w:r>
+        <w:rPr>
+          <w:b/>
+          <w:color w:val="0070D2"/>
+          <w:sz w:val="28"/>
+        </w:rPr>
+        <w:t>2.15 Graph Density Control (v5.0)</w:t>
+      </w:r>
+    </w:p>
+    <w:p>
+      <w:pPr>
+        <w:spacing w:after="80"/>
+      </w:pPr>
+      <w:r>
+        <w:rPr>
+          <w:b w:val="0"/>
+          <w:i w:val="0"/>
+          <w:color w:val="181818"/>
+          <w:sz w:val="21"/>
+        </w:rPr>
+        <w:t>metaMapperGraph renders first 3 levels (Level__c &lt;= 2) by default. "Expand All" button reveals full tree. Prevents browser choke on 5,000+ node graphs.</w:t>
+      </w:r>
+    </w:p>
+    <w:p>
+      <w:pPr>
+        <w:pStyle w:val="Heading2"/>
+        <w:spacing w:before="240" w:after="120"/>
+      </w:pPr>
+      <w:r>
+        <w:rPr>
+          <w:b/>
+          <w:color w:val="0070D2"/>
+          <w:sz w:val="28"/>
+        </w:rPr>
+        <w:t>2.16 Cascade Delete DML Trap (v6.0) - CRITICAL</w:t>
+      </w:r>
+    </w:p>
+    <w:p>
+      <w:pPr>
+        <w:spacing w:before="60" w:after="120"/>
+        <w:ind w:left="283"/>
+        <w:shd w:val="clear" w:color="auto" w:fill="FDECEA"/>
+      </w:pPr>
+      <w:r>
+        <w:rPr>
+          <w:i/>
+          <w:color w:val="032D60"/>
+          <w:sz w:val="19"/>
+        </w:rPr>
+        <w:t>CRITICAL: Master-Detail cascade deletion counts child records against the 10,000 DML row limit. A job with 15,000 nodes triggers System.LimitException on a single parent delete.</w:t>
+      </w:r>
+    </w:p>
+    <w:p>
+      <w:pPr>
+        <w:spacing w:after="80"/>
+      </w:pPr>
+      <w:r>
+        <w:rPr>
+          <w:b/>
+          <w:i w:val="0"/>
+          <w:color w:val="181818"/>
+          <w:sz w:val="21"/>
+        </w:rPr>
+        <w:t>Fix: DependencyCleanupBatch explicitly deletes Dependency_Node__c records in chunks of 9,000 before deleting the parent job. Batch scope = 1 job per execute() call.</w:t>
+      </w:r>
+    </w:p>
+    <w:p>
+      <w:pPr>
+        <w:spacing w:before="60" w:after="60"/>
+        <w:ind w:left="454"/>
+        <w:shd w:val="clear" w:color="auto" w:fill="EAECF0"/>
+      </w:pPr>
+      <w:r>
+        <w:rPr>
+          <w:rFonts w:ascii="Courier New" w:hAnsi="Courier New"/>
+          <w:color w:val="1E1E2E"/>
+          <w:sz w:val="18"/>
+        </w:rPr>
+        <w:t>for (Dependency_Job__c job : scope) {</w:t>
+        <w:br/>
+        <w:t xml:space="preserve">    List&lt;Dependency_Node__c&gt; nodes = [SELECT Id FROM Dependency_Node__c</w:t>
+        <w:br/>
+        <w:t xml:space="preserve">        WHERE Dependency_Job__c = :job.Id LIMIT 9000];</w:t>
+        <w:br/>
+        <w:t xml:space="preserve">    while (!nodes.isEmpty()) {</w:t>
+        <w:br/>
+        <w:t xml:space="preserve">        delete nodes;</w:t>
+        <w:br/>
+        <w:t xml:space="preserve">        nodes = [SELECT Id FROM Dependency_Node__c</w:t>
+        <w:br/>
+        <w:t xml:space="preserve">            WHERE Dependency_Job__c = :job.Id LIMIT 9000];</w:t>
+        <w:br/>
+        <w:t xml:space="preserve">    }</w:t>
+        <w:br/>
+        <w:t xml:space="preserve">    delete job;</w:t>
+        <w:br/>
+        <w:t>}</w:t>
+      </w:r>
+    </w:p>
+    <w:p>
+      <w:pPr>
+        <w:pStyle w:val="Heading2"/>
+        <w:spacing w:before="240" w:after="120"/>
+      </w:pPr>
+      <w:r>
+        <w:rPr>
+          <w:b/>
+          <w:color w:val="0070D2"/>
+          <w:sz w:val="28"/>
+        </w:rPr>
+        <w:t>2.17 Cleanup Lifecycle - Closed_At__c (v6.0) - CRITICAL</w:t>
+      </w:r>
+    </w:p>
+    <w:p>
+      <w:pPr>
+        <w:spacing w:before="60" w:after="120"/>
+        <w:ind w:left="283"/>
+        <w:shd w:val="clear" w:color="auto" w:fill="FDECEA"/>
+      </w:pPr>
+      <w:r>
+        <w:rPr>
+          <w:i/>
+          <w:color w:val="032D60"/>
+          <w:sz w:val="19"/>
+        </w:rPr>
+        <w:t>CRITICAL: Cleanup based on CreatedDate would delete long-running Processing jobs still active in the flex queue.</w:t>
       </w:r>
     </w:p>
     <w:p>
@@ -505,7 +1176,7 @@
           <w:color w:val="181818"/>
           <w:sz w:val="21"/>
         </w:rPr>
-        <w:t>Status__c picklist gains a Cancelled value.</w:t>
+        <w:t>Add Closed_At__c (DateTime) to Dependency_Job__c. Stamped when Status transitions to Completed, Failed, or Cancelled.</w:t>
       </w:r>
     </w:p>
     <w:p>
@@ -519,7 +1190,7 @@
           <w:color w:val="181818"/>
           <w:sz w:val="21"/>
         </w:rPr>
-        <w:t>cancelJob(String jobId) @AuraEnabled method in DependencyJobController sets Status__c = Cancelled (WITH USER_MODE).</w:t>
+        <w:t>Cleanup filter: Status__c IN (Completed, Failed, Cancelled) AND Closed_At__c &lt; :DateTime.now().addHours(-retentionHours).</w:t>
       </w:r>
     </w:p>
     <w:p>
@@ -533,21 +1204,7 @@
           <w:color w:val="181818"/>
           <w:sz w:val="21"/>
         </w:rPr>
-        <w:t>DependencyQueueable.execute() checks Status__c as its FIRST operation. If Cancelled, exit immediately without enqueuing a successor.</w:t>
-      </w:r>
-    </w:p>
-    <w:p>
-      <w:pPr>
-        <w:pStyle w:val="ListBullet"/>
-        <w:spacing w:after="40"/>
-        <w:ind w:left="283"/>
-      </w:pPr>
-      <w:r>
-        <w:rPr>
-          <w:color w:val="181818"/>
-          <w:sz w:val="21"/>
-        </w:rPr>
-        <w:t>Queueables already in the flex queue will check on entry and terminate cooperatively. Salesforce provides no force-kill mechanism.</w:t>
+        <w:t>Never delete Initializing or Processing jobs.</w:t>
       </w:r>
     </w:p>
     <w:p>
@@ -561,21 +1218,22 @@
           <w:color w:val="0070D2"/>
           <w:sz w:val="28"/>
         </w:rPr>
-        <w:t>2.3 Callout Guardrail - Remaining-Budget Model</w:t>
+        <w:t>2.18 Mid-Loop Guardrail Check (v6.0) - CRITICAL</w:t>
       </w:r>
     </w:p>
     <w:p>
       <w:pPr>
-        <w:spacing w:after="80"/>
+        <w:spacing w:before="60" w:after="120"/>
+        <w:ind w:left="283"/>
+        <w:shd w:val="clear" w:color="auto" w:fill="FDECEA"/>
       </w:pPr>
       <w:r>
         <w:rPr>
-          <w:b w:val="0"/>
-          <w:i w:val="0"/>
-          <w:color w:val="181818"/>
-          <w:sz w:val="21"/>
+          <w:i/>
+          <w:color w:val="032D60"/>
+          <w:sz w:val="19"/>
         </w:rPr>
-        <w:t>Previous design: fixed 60%/80% percentage thresholds. These do not account for QueryMore, Flow validation callouts, or retry splits that may still be needed in the current transaction.</w:t>
+        <w:t>CRITICAL: Post-loop guardrail is too late. A single high-fan-out node returning 4,000+ children will breach DML/CPU before the end-of-batch check runs.</w:t>
       </w:r>
     </w:p>
     <w:p>
@@ -589,7 +1247,7 @@
           <w:color w:val="181818"/>
           <w:sz w:val="21"/>
         </w:rPr>
-        <w:t>Fix: explicit remaining-callout budget with per-operation headroom (see 2.9 for full guardrail including DML + CPU):</w:t>
+        <w:t>Fix: evaluate DML remaining and CPU % INSIDE the result-processing loop, before adding children to the insert list. Chain immediately if breached.</w:t>
       </w:r>
     </w:p>
     <w:p>
@@ -604,21 +1262,21 @@
           <w:color w:val="1E1E2E"/>
           <w:sz w:val="18"/>
         </w:rPr>
-        <w:t>Integer remaining = Limits.getLimitCallouts() - Limits.getCallouts();</w:t>
+        <w:t>for (ToolingResult result : calloutResults) {</w:t>
         <w:br/>
-        <w:t>Integer headroom = 1                          // current batch query</w:t>
+        <w:t xml:space="preserve">    // Mid-loop guard: check before accumulating more DML work</w:t>
         <w:br/>
-        <w:t xml:space="preserve">    + (queryMorePossible ? 1 : 0)             // nextRecordsUrl follow-up</w:t>
+        <w:t xml:space="preserve">    if (Limits.getLimitDmlRows() - Limits.getDmlRows() &lt; dmlReserve</w:t>
         <w:br/>
-        <w:t xml:space="preserve">    + (needsFlowValidation ? 1 : 0)           // Flow status callout</w:t>
+        <w:t xml:space="preserve">        || (Decimal)Limits.getCpuTime()/Limits.getLimitCpuTime() &gt;= 0.75) {</w:t>
         <w:br/>
-        <w:t xml:space="preserve">    + 2;                                       // 414/431 retry splits</w:t>
+        <w:t xml:space="preserve">        System.enqueueJob(new DependencyQueueable(jobId, activeFlowsOnly));</w:t>
         <w:br/>
-        <w:t>if (remaining &lt; headroom) {</w:t>
+        <w:t xml:space="preserve">        return;</w:t>
         <w:br/>
-        <w:t xml:space="preserve">    System.enqueueJob(new DependencyQueueable(jobId, activeFlowsOnly));</w:t>
+        <w:t xml:space="preserve">    }</w:t>
         <w:br/>
-        <w:t xml:space="preserve">    return;</w:t>
+        <w:t xml:space="preserve">    // ... process result, add to insertList ...</w:t>
         <w:br/>
         <w:t>}</w:t>
       </w:r>
@@ -634,21 +1292,22 @@
           <w:color w:val="0070D2"/>
           <w:sz w:val="28"/>
         </w:rPr>
-        <w:t>2.4 IN Clause Chunking - Character-Budget Driven</w:t>
+        <w:t>2.19 Failure Handling - Savepoint Pattern (v6.0) - CRITICAL</w:t>
       </w:r>
     </w:p>
     <w:p>
       <w:pPr>
-        <w:spacing w:after="80"/>
+        <w:spacing w:before="60" w:after="120"/>
+        <w:ind w:left="283"/>
+        <w:shd w:val="clear" w:color="auto" w:fill="FDECEA"/>
       </w:pPr>
       <w:r>
         <w:rPr>
-          <w:b w:val="0"/>
-          <w:i w:val="0"/>
-          <w:color w:val="181818"/>
-          <w:sz w:val="21"/>
+          <w:i/>
+          <w:color w:val="032D60"/>
+          <w:sz w:val="19"/>
         </w:rPr>
-        <w:t>Previous design: hard-coded 100 IDs as universal safe limit. URI length also depends on the SOQL string, encoding, and exact ID values.</w:t>
+        <w:t>CRITICAL: An uncaught exception in execute() rolls back the entire transaction - including any DML that set Status__c = Failed. The status update is lost.</w:t>
       </w:r>
     </w:p>
     <w:p>
@@ -662,7 +1321,7 @@
           <w:color w:val="181818"/>
           <w:sz w:val="21"/>
         </w:rPr>
-        <w:t>Fix: estimate URL length before sending; split by character budget, not fixed count. Use 100 IDs as the initial batch estimate, then check:</w:t>
+        <w:t>Fix: Savepoint + explicit catch. The catch block runs after rollback as fresh DML in the same transaction.</w:t>
       </w:r>
     </w:p>
     <w:p>
@@ -677,11 +1336,38 @@
           <w:color w:val="1E1E2E"/>
           <w:sz w:val="18"/>
         </w:rPr>
-        <w:t>String soql = buildQueryString(idBatch);</w:t>
+        <w:t>public void execute(QueueableContext ctx) {</w:t>
         <w:br/>
-        <w:t>if (soql.length() &gt; 8000) {  // 8KB URI budget</w:t>
+        <w:t xml:space="preserve">    Savepoint sp = Database.setSavepoint();</w:t>
         <w:br/>
-        <w:t xml:space="preserve">    // Split batch in half and process each separately</w:t>
+        <w:t xml:space="preserve">    try {</w:t>
+        <w:br/>
+        <w:t xml:space="preserve">        // ... all engine work ...</w:t>
+        <w:br/>
+        <w:t xml:space="preserve">    } catch (Exception e) {</w:t>
+        <w:br/>
+        <w:t xml:space="preserve">        Database.rollback(sp);</w:t>
+        <w:br/>
+        <w:t xml:space="preserve">        updateJobFailed(jobId, e.getMessage()); // fresh DML after rollback - commits</w:t>
+        <w:br/>
+        <w:t xml:space="preserve">    }</w:t>
+        <w:br/>
+        <w:t>}</w:t>
+        <w:br/>
+        <w:br/>
+        <w:t>private void updateJobFailed(String jobId, String msg) {</w:t>
+        <w:br/>
+        <w:t xml:space="preserve">    Dependency_Job__c job = new Dependency_Job__c(</w:t>
+        <w:br/>
+        <w:t xml:space="preserve">        Id = jobId, Status__c = "Failed",</w:t>
+        <w:br/>
+        <w:t xml:space="preserve">        Error_Message__c = msg, Closed_At__c = DateTime.now()</w:t>
+        <w:br/>
+        <w:t xml:space="preserve">    );</w:t>
+        <w:br/>
+        <w:t xml:space="preserve">    update job;</w:t>
+        <w:br/>
+        <w:t xml:space="preserve">    DependencyNotificationService.publishProgress(jobId, "Failed", 0, msg);</w:t>
         <w:br/>
         <w:t>}</w:t>
       </w:r>
@@ -697,7 +1383,7 @@
           <w:color w:val="0070D2"/>
           <w:sz w:val="28"/>
         </w:rPr>
-        <w:t>2.5 USER_MODE - Applied at Controller Boundary Only</w:t>
+        <w:t>2.20 Path__c Correctness (v6.0)</w:t>
       </w:r>
     </w:p>
     <w:p>
@@ -711,7 +1397,49 @@
           <w:color w:val="181818"/>
           <w:sz w:val="21"/>
         </w:rPr>
-        <w:t>Previous design: USER_MODE applied to all Apex DML/SOQL including engine internals.</w:t>
+        <w:t>Three edge cases fixed:</w:t>
+      </w:r>
+    </w:p>
+    <w:p>
+      <w:pPr>
+        <w:pStyle w:val="ListBullet"/>
+        <w:spacing w:after="40"/>
+        <w:ind w:left="283"/>
+      </w:pPr>
+      <w:r>
+        <w:rPr>
+          <w:color w:val="181818"/>
+          <w:sz w:val="21"/>
+        </w:rPr>
+        <w:t>Root node: Path__c = "" (empty string, not null). Prevents null reference in child path-building.</w:t>
+      </w:r>
+    </w:p>
+    <w:p>
+      <w:pPr>
+        <w:pStyle w:val="ListBullet"/>
+        <w:spacing w:after="40"/>
+        <w:ind w:left="283"/>
+      </w:pPr>
+      <w:r>
+        <w:rPr>
+          <w:color w:val="181818"/>
+          <w:sz w:val="21"/>
+        </w:rPr>
+        <w:t>Path-building: child.Path__c = (String.isBlank(parent.Path__c) ? "" : parent.Path__c + "|") + parent.Metadata_ID__c. Prevents leading pipe on first-level children.</w:t>
+      </w:r>
+    </w:p>
+    <w:p>
+      <w:pPr>
+        <w:pStyle w:val="ListBullet"/>
+        <w:spacing w:after="40"/>
+        <w:ind w:left="283"/>
+      </w:pPr>
+      <w:r>
+        <w:rPr>
+          <w:color w:val="181818"/>
+          <w:sz w:val="21"/>
+        </w:rPr>
+        <w:t>Circular nodes: Path__c is KEPT (not set to null). Ancestry chain is most valuable when a cycle is found. Add cycleClosesAt to Context_Data__c for UI visualization.</w:t>
       </w:r>
     </w:p>
     <w:p>
@@ -720,12 +1448,68 @@
       </w:pPr>
       <w:r>
         <w:rPr>
-          <w:b/>
+          <w:b w:val="0"/>
           <w:i w:val="0"/>
           <w:color w:val="181818"/>
           <w:sz w:val="21"/>
         </w:rPr>
-        <w:t>Fix:</w:t>
+        <w:t>Corrected CPU concern: String.contains() on 28KB Path__c strings inside an inner result-processing loop spikes CPU. The mid-loop CPU check (2.18) catches this before it breaches the 10s limit.</w:t>
+      </w:r>
+    </w:p>
+    <w:p>
+      <w:pPr>
+        <w:pStyle w:val="Heading2"/>
+        <w:spacing w:before="240" w:after="120"/>
+      </w:pPr>
+      <w:r>
+        <w:rPr>
+          <w:b/>
+          <w:color w:val="0070D2"/>
+          <w:sz w:val="28"/>
+        </w:rPr>
+        <w:t>2.21 Five-Limit Guardrail: Query Rows Added (v6.0)</w:t>
+      </w:r>
+    </w:p>
+    <w:p>
+      <w:pPr>
+        <w:spacing w:after="80"/>
+      </w:pPr>
+      <w:r>
+        <w:rPr>
+          <w:b w:val="0"/>
+          <w:i w:val="0"/>
+          <w:color w:val="181818"/>
+          <w:sz w:val="21"/>
+        </w:rPr>
+        <w:t>Added Limits.getQueryRows() check. Dml_Reserve_Rows__c (default 750) in CMDT replaces hard-coded 500. Full five-limit model in Section 5.2.</w:t>
+      </w:r>
+    </w:p>
+    <w:p>
+      <w:pPr>
+        <w:pStyle w:val="Heading2"/>
+        <w:spacing w:before="240" w:after="120"/>
+      </w:pPr>
+      <w:r>
+        <w:rPr>
+          <w:b/>
+          <w:color w:val="0070D2"/>
+          <w:sz w:val="28"/>
+        </w:rPr>
+        <w:t>2.22 Deterministic Confidence Scoring (v6.0)</w:t>
+      </w:r>
+    </w:p>
+    <w:p>
+      <w:pPr>
+        <w:spacing w:after="80"/>
+      </w:pPr>
+      <w:r>
+        <w:rPr>
+          <w:b w:val="0"/>
+          <w:i w:val="0"/>
+          <w:color w:val="181818"/>
+          <w:sz w:val="21"/>
+        </w:rPr>
+        <w:t>Scoring algorithm is now deterministic per handler. Two developers implementing the same handler will produce the same score for the same input:</w:t>
       </w:r>
     </w:p>
     <w:tbl>
@@ -753,7 +1537,7 @@
                 <w:color w:val="FFFFFF"/>
                 <w:sz w:val="20"/>
               </w:rPr>
-              <w:t>Layer</w:t>
+              <w:t>Handler</w:t>
             </w:r>
           </w:p>
         </w:tc>
@@ -769,7 +1553,7 @@
                 <w:color w:val="FFFFFF"/>
                 <w:sz w:val="20"/>
               </w:rPr>
-              <w:t>Mode</w:t>
+              <w:t>Score</w:t>
             </w:r>
           </w:p>
         </w:tc>
@@ -785,7 +1569,7 @@
                 <w:color w:val="FFFFFF"/>
                 <w:sz w:val="20"/>
               </w:rPr>
-              <w:t>Reason</w:t>
+              <w:t>Basis</w:t>
             </w:r>
           </w:p>
         </w:tc>
@@ -802,7 +1586,7 @@
                 <w:color w:val="181818"/>
                 <w:sz w:val="20"/>
               </w:rPr>
-              <w:t>@AuraEnabled controller methods</w:t>
+              <w:t>WorkflowFieldUpdate exact field match</w:t>
             </w:r>
           </w:p>
         </w:tc>
@@ -817,7 +1601,7 @@
                 <w:color w:val="181818"/>
                 <w:sz w:val="20"/>
               </w:rPr>
-              <w:t>WITH USER_MODE</w:t>
+              <w:t>95</w:t>
             </w:r>
           </w:p>
         </w:tc>
@@ -832,7 +1616,7 @@
                 <w:color w:val="181818"/>
                 <w:sz w:val="20"/>
               </w:rPr>
-              <w:t>Enforces FLS/CRUD for user-facing data access</w:t>
+              <w:t>Field API name equality - unambiguous</w:t>
             </w:r>
           </w:p>
         </w:tc>
@@ -849,7 +1633,7 @@
                 <w:color w:val="181818"/>
                 <w:sz w:val="20"/>
               </w:rPr>
-              <w:t>DependencyQueueable engine</w:t>
+              <w:t>CMT field lookup (exact field name)</w:t>
             </w:r>
           </w:p>
         </w:tc>
@@ -864,7 +1648,7 @@
                 <w:color w:val="181818"/>
                 <w:sz w:val="20"/>
               </w:rPr>
-              <w:t>SYSTEM_MODE (default)</w:t>
+              <w:t>85</w:t>
             </w:r>
           </w:p>
         </w:tc>
@@ -879,7 +1663,7 @@
                 <w:color w:val="181818"/>
                 <w:sz w:val="20"/>
               </w:rPr>
-              <w:t>Reliable internal orchestration; permission failures here are implementation bugs, not security requirements</w:t>
+              <w:t>SOQL field name filter - direct match</w:t>
             </w:r>
           </w:p>
         </w:tc>
@@ -896,7 +1680,7 @@
                 <w:color w:val="181818"/>
                 <w:sz w:val="20"/>
               </w:rPr>
-              <w:t>DependencyCleanupBatch</w:t>
+              <w:t>ValidationRule body regex match</w:t>
             </w:r>
           </w:p>
         </w:tc>
@@ -911,7 +1695,7 @@
                 <w:color w:val="181818"/>
                 <w:sz w:val="20"/>
               </w:rPr>
-              <w:t>SYSTEM_MODE (default)</w:t>
+              <w:t>65</w:t>
             </w:r>
           </w:p>
         </w:tc>
@@ -926,7 +1710,7 @@
                 <w:color w:val="181818"/>
                 <w:sz w:val="20"/>
               </w:rPr>
-              <w:t>Admin-scheduled maintenance; must succeed regardless of running-user permissions</w:t>
+              <w:t>Regex on formula text - whitespace/comment risk</w:t>
             </w:r>
           </w:p>
         </w:tc>
@@ -943,7 +1727,7 @@
                 <w:color w:val="181818"/>
                 <w:sz w:val="20"/>
               </w:rPr>
-              <w:t>DependencyNotificationService</w:t>
+              <w:t>FlexiPage XML attribute parse</w:t>
             </w:r>
           </w:p>
         </w:tc>
@@ -958,7 +1742,7 @@
                 <w:color w:val="181818"/>
                 <w:sz w:val="20"/>
               </w:rPr>
-              <w:t>SYSTEM_MODE (default)</w:t>
+              <w:t>60</w:t>
             </w:r>
           </w:p>
         </w:tc>
@@ -973,647 +1757,7 @@
                 <w:color w:val="181818"/>
                 <w:sz w:val="20"/>
               </w:rPr>
-              <w:t>Internal async operation</w:t>
-            </w:r>
-          </w:p>
-        </w:tc>
-      </w:tr>
-    </w:tbl>
-    <w:p/>
-    <w:p>
-      <w:pPr>
-        <w:pStyle w:val="Heading2"/>
-        <w:spacing w:before="240" w:after="120"/>
-      </w:pPr>
-      <w:r>
-        <w:rPr>
-          <w:b/>
-          <w:color w:val="0070D2"/>
-          <w:sz w:val="28"/>
-        </w:rPr>
-        <w:t>2.6 Retention Policy - Configurable via Custom Metadata</w:t>
-      </w:r>
-    </w:p>
-    <w:p>
-      <w:pPr>
-        <w:spacing w:after="80"/>
-      </w:pPr>
-      <w:r>
-        <w:rPr>
-          <w:b w:val="0"/>
-          <w:i w:val="0"/>
-          <w:color w:val="181818"/>
-          <w:sz w:val="21"/>
-        </w:rPr>
-        <w:t>Previous design: hard-coded 24-hour hard delete. Inappropriate for a diagnostic tool where admins need to inspect failed runs.</w:t>
-      </w:r>
-    </w:p>
-    <w:p>
-      <w:pPr>
-        <w:spacing w:after="80"/>
-      </w:pPr>
-      <w:r>
-        <w:rPr>
-          <w:b/>
-          <w:i w:val="0"/>
-          <w:color w:val="181818"/>
-          <w:sz w:val="21"/>
-        </w:rPr>
-        <w:t>Fix: MetaMapper_Settings__mdt Custom Metadata (single record Default). See Section 4.5 for full field list.</w:t>
-      </w:r>
-    </w:p>
-    <w:p>
-      <w:pPr>
-        <w:spacing w:before="60" w:after="120"/>
-        <w:ind w:left="283"/>
-        <w:shd w:val="clear" w:color="auto" w:fill="EFF4FB"/>
-      </w:pPr>
-      <w:r>
-        <w:rPr>
-          <w:i/>
-          <w:color w:val="032D60"/>
-          <w:sz w:val="19"/>
-        </w:rPr>
-        <w:t>Recommended minimum: 72 hours for enterprise diagnostic use. Hard-delete with cascade via Master-Detail is retained for storage management.</w:t>
-      </w:r>
-    </w:p>
-    <w:p>
-      <w:pPr>
-        <w:pStyle w:val="Heading2"/>
-        <w:spacing w:before="240" w:after="120"/>
-      </w:pPr>
-      <w:r>
-        <w:rPr>
-          <w:b/>
-          <w:color w:val="0070D2"/>
-          <w:sz w:val="28"/>
-        </w:rPr>
-        <w:t>2.7 Scope Consistency - Dynamic Refs Are a Permanent Blind Spot</w:t>
-      </w:r>
-    </w:p>
-    <w:p>
-      <w:pPr>
-        <w:spacing w:after="80"/>
-      </w:pPr>
-      <w:r>
-        <w:rPr>
-          <w:b w:val="0"/>
-          <w:i w:val="0"/>
-          <w:color w:val="181818"/>
-          <w:sz w:val="21"/>
-        </w:rPr>
-        <w:t>Supplemental handlers fill 5 known static gaps in MetadataComponentDependency coverage. Dynamic Apex string references are NOT a gap that can be closed by any supplemental query - they are an inherent Salesforce platform limitation. They are flagged with Is_Dynamic_Reference__c = true and documented as a permanent blind spot, not a pending enhancement.</w:t>
-      </w:r>
-    </w:p>
-    <w:p>
-      <w:pPr>
-        <w:pStyle w:val="Heading2"/>
-        <w:spacing w:before="240" w:after="120"/>
-      </w:pPr>
-      <w:r>
-        <w:rPr>
-          <w:b/>
-          <w:color w:val="0070D2"/>
-          <w:sz w:val="28"/>
-        </w:rPr>
-        <w:t>2.8 Heap Trap - Dedup Query Scoped to Current Batch</w:t>
-      </w:r>
-    </w:p>
-    <w:p>
-      <w:pPr>
-        <w:spacing w:after="80"/>
-      </w:pPr>
-      <w:r>
-        <w:rPr>
-          <w:b w:val="0"/>
-          <w:i/>
-          <w:color w:val="181818"/>
-          <w:sz w:val="21"/>
-        </w:rPr>
-        <w:t>Previous design (v4.0): dedup query fetched ALL previously inserted nodes at Queueable start: SELECT Metadata_ID__c FROM Dependency_Node__c WHERE Dependency_Job__c = :jobId. In a 10k-20k node job this returns the full dataset into memory on every chaining execution, consuming a large portion of the 6MB async heap before any Tooling API work begins.</w:t>
-      </w:r>
-    </w:p>
-    <w:p>
-      <w:pPr>
-        <w:spacing w:after="80"/>
-      </w:pPr>
-      <w:r>
-        <w:rPr>
-          <w:b/>
-          <w:i w:val="0"/>
-          <w:color w:val="181818"/>
-          <w:sz w:val="21"/>
-        </w:rPr>
-        <w:t>Fix: scope the dedup query to only the IDs returned by the current Tooling API callout:</w:t>
-      </w:r>
-    </w:p>
-    <w:p>
-      <w:pPr>
-        <w:spacing w:before="60" w:after="60"/>
-        <w:ind w:left="454"/>
-        <w:shd w:val="clear" w:color="auto" w:fill="EAECF0"/>
-      </w:pPr>
-      <w:r>
-        <w:rPr>
-          <w:rFonts w:ascii="Courier New" w:hAnsi="Courier New"/>
-          <w:color w:val="1E1E2E"/>
-          <w:sz w:val="18"/>
-        </w:rPr>
-        <w:t>// After Tooling API call returns currentResultIds (max ~100-2000 IDs):</w:t>
-        <w:br/>
-        <w:t>List&lt;Dependency_Node__c&gt; existing = [</w:t>
-        <w:br/>
-        <w:t xml:space="preserve">    SELECT Metadata_ID__c</w:t>
-        <w:br/>
-        <w:t xml:space="preserve">    FROM Dependency_Node__c</w:t>
-        <w:br/>
-        <w:t xml:space="preserve">    WHERE Dependency_Job__c = :jobId</w:t>
-        <w:br/>
-        <w:t xml:space="preserve">    AND Metadata_ID__c IN :currentResultIds</w:t>
-        <w:br/>
-        <w:t>];</w:t>
-        <w:br/>
-        <w:t>Set&lt;String&gt; alreadyInserted = new Set&lt;String&gt;();</w:t>
-        <w:br/>
-        <w:t>for (Dependency_Node__c n : existing) {</w:t>
-        <w:br/>
-        <w:t xml:space="preserve">    alreadyInserted.add(n.Metadata_ID__c);</w:t>
-        <w:br/>
-        <w:t>}</w:t>
-      </w:r>
-    </w:p>
-    <w:p>
-      <w:pPr>
-        <w:spacing w:before="60" w:after="120"/>
-        <w:ind w:left="283"/>
-        <w:shd w:val="clear" w:color="auto" w:fill="EFF4FB"/>
-      </w:pPr>
-      <w:r>
-        <w:rPr>
-          <w:i/>
-          <w:color w:val="032D60"/>
-          <w:sz w:val="19"/>
-        </w:rPr>
-        <w:t>Max rows returned: equal to the number of results from the current Tooling API batch (bounded by chunk size, typically &lt;=100). Constant heap cost regardless of total tree depth.</w:t>
-      </w:r>
-    </w:p>
-    <w:p>
-      <w:pPr>
-        <w:pStyle w:val="Heading2"/>
-        <w:spacing w:before="240" w:after="120"/>
-      </w:pPr>
-      <w:r>
-        <w:rPr>
-          <w:b/>
-          <w:color w:val="0070D2"/>
-          <w:sz w:val="28"/>
-        </w:rPr>
-        <w:t>2.9 Missing DML Row and CPU Time Guardrails</w:t>
-      </w:r>
-    </w:p>
-    <w:p>
-      <w:pPr>
-        <w:spacing w:after="80"/>
-      </w:pPr>
-      <w:r>
-        <w:rPr>
-          <w:b w:val="0"/>
-          <w:i/>
-          <w:color w:val="181818"/>
-          <w:sz w:val="21"/>
-        </w:rPr>
-        <w:t>Previous design (v4.0): guardrail checked callouts and heap only. A highly-connected node (e.g. a core Custom Object) can return 2,000+ children per callout. Processing 5 such nodes in one batch = 10,000 DML rows, breaching the 10,001 limit before heap or callouts are hit.</w:t>
-      </w:r>
-    </w:p>
-    <w:p>
-      <w:pPr>
-        <w:spacing w:after="80"/>
-      </w:pPr>
-      <w:r>
-        <w:rPr>
-          <w:b/>
-          <w:i w:val="0"/>
-          <w:color w:val="181818"/>
-          <w:sz w:val="21"/>
-        </w:rPr>
-        <w:t>Fix: full four-limit guardrail:</w:t>
-      </w:r>
-    </w:p>
-    <w:p>
-      <w:pPr>
-        <w:spacing w:before="60" w:after="60"/>
-        <w:ind w:left="454"/>
-        <w:shd w:val="clear" w:color="auto" w:fill="EAECF0"/>
-      </w:pPr>
-      <w:r>
-        <w:rPr>
-          <w:rFonts w:ascii="Courier New" w:hAnsi="Courier New"/>
-          <w:color w:val="1E1E2E"/>
-          <w:sz w:val="18"/>
-        </w:rPr>
-        <w:t>// Callout remaining-budget</w:t>
-        <w:br/>
-        <w:t>Integer calloutsRemaining = Limits.getLimitCallouts() - Limits.getCallouts();</w:t>
-        <w:br/>
-        <w:t>Integer headroom = 1 + (queryMorePossible ? 1 : 0) + (needsFlowValidation ? 1 : 0) + 2;</w:t>
-        <w:br/>
-        <w:br/>
-        <w:t>// DML row budget - reserve 500 rows minimum for current insert + supplemental handler inserts</w:t>
-        <w:br/>
-        <w:t>Integer dmlRemaining = Limits.getLimitDmlRows() - Limits.getDmlRows();</w:t>
-        <w:br/>
-        <w:br/>
-        <w:t>// Heap budget</w:t>
-        <w:br/>
-        <w:t>Decimal heapPct = (Decimal) Limits.getHeapSize() / Limits.getLimitHeapSize();</w:t>
-        <w:br/>
-        <w:br/>
-        <w:t>// CPU time budget</w:t>
-        <w:br/>
-        <w:t>Decimal cpuPct = (Decimal) Limits.getCpuTime() / Limits.getLimitCpuTime();</w:t>
-        <w:br/>
-        <w:br/>
-        <w:t>if (calloutsRemaining &lt; headroom</w:t>
-        <w:br/>
-        <w:t xml:space="preserve">    || dmlRemaining &lt; 500</w:t>
-        <w:br/>
-        <w:t xml:space="preserve">    || heapPct &gt;= 0.80</w:t>
-        <w:br/>
-        <w:t xml:space="preserve">    || cpuPct &gt;= 0.75) {</w:t>
-        <w:br/>
-        <w:t xml:space="preserve">    System.enqueueJob(new DependencyQueueable(jobId, activeFlowsOnly));</w:t>
-        <w:br/>
-        <w:t xml:space="preserve">    return;</w:t>
-        <w:br/>
-        <w:t>}</w:t>
-      </w:r>
-    </w:p>
-    <w:p>
-      <w:pPr>
-        <w:pStyle w:val="Heading2"/>
-        <w:spacing w:before="240" w:after="120"/>
-      </w:pPr>
-      <w:r>
-        <w:rPr>
-          <w:b/>
-          <w:color w:val="0070D2"/>
-          <w:sz w:val="28"/>
-        </w:rPr>
-        <w:t>2.10 Platform Event Volume - One Event Per Execution</w:t>
-      </w:r>
-    </w:p>
-    <w:p>
-      <w:pPr>
-        <w:spacing w:after="80"/>
-      </w:pPr>
-      <w:r>
-        <w:rPr>
-          <w:b w:val="0"/>
-          <w:i/>
-          <w:color w:val="181818"/>
-          <w:sz w:val="21"/>
-        </w:rPr>
-        <w:t>Previous design: "publish Dependency_Status__e after every DML commit" was ambiguous and could be interpreted as publishing per inner batch-loop iteration.</w:t>
-      </w:r>
-    </w:p>
-    <w:p>
-      <w:pPr>
-        <w:spacing w:after="80"/>
-      </w:pPr>
-      <w:r>
-        <w:rPr>
-          <w:b/>
-          <w:i w:val="0"/>
-          <w:color w:val="181818"/>
-          <w:sz w:val="21"/>
-        </w:rPr>
-        <w:t>Fix: publish exactly one Dependency_Status__e per Queueable execution - after the final DML commit of that execution.</w:t>
-      </w:r>
-    </w:p>
-    <w:p>
-      <w:pPr>
-        <w:spacing w:before="60" w:after="120"/>
-        <w:ind w:left="283"/>
-        <w:shd w:val="clear" w:color="auto" w:fill="EFF4FB"/>
-      </w:pPr>
-      <w:r>
-        <w:rPr>
-          <w:i/>
-          <w:color w:val="032D60"/>
-          <w:sz w:val="19"/>
-        </w:rPr>
-        <w:t>Salesforce enforces a daily org-wide Platform Event delivery limit (50,000 for Standard Volume). At 50 nodes per Queueable execution, a 10,000-node job generates ~200 executions = ~200 events. Publishing per inner loop iteration (e.g. per IN-chunk callout) multiplies this 5-10x and can exhaust the org daily allocation during concurrent admin scans.</w:t>
-      </w:r>
-    </w:p>
-    <w:p>
-      <w:pPr>
-        <w:pStyle w:val="Heading2"/>
-        <w:spacing w:before="240" w:after="120"/>
-      </w:pPr>
-      <w:r>
-        <w:rPr>
-          <w:b/>
-          <w:color w:val="0070D2"/>
-          <w:sz w:val="28"/>
-        </w:rPr>
-        <w:t>2.11 Async Context Guard</w:t>
-      </w:r>
-    </w:p>
-    <w:p>
-      <w:pPr>
-        <w:spacing w:after="80"/>
-      </w:pPr>
-      <w:r>
-        <w:rPr>
-          <w:b w:val="0"/>
-          <w:i/>
-          <w:color w:val="181818"/>
-          <w:sz w:val="21"/>
-        </w:rPr>
-        <w:t>Risk: createJob() invoked from an already-async context (Batch finish handler, Copilot Action, Future method) can violate Salesforce nested async restrictions.</w:t>
-      </w:r>
-    </w:p>
-    <w:p>
-      <w:pPr>
-        <w:spacing w:after="80"/>
-      </w:pPr>
-      <w:r>
-        <w:rPr>
-          <w:b/>
-          <w:i w:val="0"/>
-          <w:color w:val="181818"/>
-          <w:sz w:val="21"/>
-        </w:rPr>
-        <w:t>Fix: createJob() validates the execution context before enqueuing:</w:t>
-      </w:r>
-    </w:p>
-    <w:p>
-      <w:pPr>
-        <w:spacing w:before="60" w:after="60"/>
-        <w:ind w:left="454"/>
-        <w:shd w:val="clear" w:color="auto" w:fill="EAECF0"/>
-      </w:pPr>
-      <w:r>
-        <w:rPr>
-          <w:rFonts w:ascii="Courier New" w:hAnsi="Courier New"/>
-          <w:color w:val="1E1E2E"/>
-          <w:sz w:val="18"/>
-        </w:rPr>
-        <w:t>if (System.isQueueable() || System.isBatch() || System.isFuture()) {</w:t>
-        <w:br/>
-        <w:t xml:space="preserve">    throw new DependencyJobException(</w:t>
-        <w:br/>
-        <w:t xml:space="preserve">        "createJob() must be called from a synchronous Lightning context. "</w:t>
-        <w:br/>
-        <w:t xml:space="preserve">        + "Invocation from async contexts is not supported."</w:t>
-        <w:br/>
-        <w:t xml:space="preserve">    );</w:t>
-        <w:br/>
-        <w:t>}</w:t>
-      </w:r>
-    </w:p>
-    <w:p>
-      <w:pPr>
-        <w:spacing w:before="60" w:after="120"/>
-        <w:ind w:left="283"/>
-        <w:shd w:val="clear" w:color="auto" w:fill="EFF4FB"/>
-      </w:pPr>
-      <w:r>
-        <w:rPr>
-          <w:i/>
-          <w:color w:val="032D60"/>
-          <w:sz w:val="19"/>
-        </w:rPr>
-        <w:t>Document this constraint in setup/SETUP.md for integrators and Copilot Action developers.</w:t>
-      </w:r>
-    </w:p>
-    <w:p>
-      <w:pPr>
-        <w:pStyle w:val="Heading2"/>
-        <w:spacing w:before="240" w:after="120"/>
-      </w:pPr>
-      <w:r>
-        <w:rPr>
-          <w:b/>
-          <w:color w:val="0070D2"/>
-          <w:sz w:val="28"/>
-        </w:rPr>
-        <w:t>2.12 Configurable Batch Size via Custom Metadata</w:t>
-      </w:r>
-    </w:p>
-    <w:p>
-      <w:pPr>
-        <w:spacing w:after="80"/>
-      </w:pPr>
-      <w:r>
-        <w:rPr>
-          <w:b w:val="0"/>
-          <w:i/>
-          <w:color w:val="181818"/>
-          <w:sz w:val="21"/>
-        </w:rPr>
-        <w:t>Previous design: batch size of 50 unprocessed nodes per Queueable execution was hard-coded. Flow-heavy orgs with Active_Flows_Only__c = true require a lower batch size because each Flow node may trigger a second status validation callout, reducing effective callout headroom.</w:t>
-      </w:r>
-    </w:p>
-    <w:p>
-      <w:pPr>
-        <w:spacing w:after="80"/>
-      </w:pPr>
-      <w:r>
-        <w:rPr>
-          <w:b/>
-          <w:i w:val="0"/>
-          <w:color w:val="181818"/>
-          <w:sz w:val="21"/>
-        </w:rPr>
-        <w:t>Fix: expose batch sizes in MetaMapper_Settings__mdt (see Section 4.5).</w:t>
-      </w:r>
-    </w:p>
-    <w:p>
-      <w:pPr>
-        <w:spacing w:before="60" w:after="120"/>
-        <w:ind w:left="283"/>
-        <w:shd w:val="clear" w:color="auto" w:fill="EFF4FB"/>
-      </w:pPr>
-      <w:r>
-        <w:rPr>
-          <w:i/>
-          <w:color w:val="032D60"/>
-          <w:sz w:val="19"/>
-        </w:rPr>
-        <w:t>Default 50 for non-Flow jobs; default 30 for Flow jobs. Admins can reduce to 15 for extremely Flow-heavy orgs without a code deploy.</w:t>
-      </w:r>
-    </w:p>
-    <w:p>
-      <w:pPr>
-        <w:pStyle w:val="Heading2"/>
-        <w:spacing w:before="240" w:after="120"/>
-      </w:pPr>
-      <w:r>
-        <w:rPr>
-          <w:b/>
-          <w:color w:val="0070D2"/>
-          <w:sz w:val="28"/>
-        </w:rPr>
-        <w:t>2.13 Queueable Constructor Efficiency</w:t>
-      </w:r>
-    </w:p>
-    <w:p>
-      <w:pPr>
-        <w:spacing w:after="80"/>
-      </w:pPr>
-      <w:r>
-        <w:rPr>
-          <w:b w:val="0"/>
-          <w:i/>
-          <w:color w:val="181818"/>
-          <w:sz w:val="21"/>
-        </w:rPr>
-        <w:t>Previous design: DependencyQueueable queried Dependency_Job__c inside execute() on every chained execution to retrieve Active_Flows_Only__c. This wastes one SOQL per chain link.</w:t>
-      </w:r>
-    </w:p>
-    <w:p>
-      <w:pPr>
-        <w:spacing w:after="80"/>
-      </w:pPr>
-      <w:r>
-        <w:rPr>
-          <w:b/>
-          <w:i w:val="0"/>
-          <w:color w:val="181818"/>
-          <w:sz w:val="21"/>
-        </w:rPr>
-        <w:t>Fix: pass Active_Flows_Only__c as a constructor parameter. The controller sets it at job creation; all chained instances inherit it.</w:t>
-      </w:r>
-    </w:p>
-    <w:p>
-      <w:pPr>
-        <w:spacing w:before="60" w:after="60"/>
-        <w:ind w:left="454"/>
-        <w:shd w:val="clear" w:color="auto" w:fill="EAECF0"/>
-      </w:pPr>
-      <w:r>
-        <w:rPr>
-          <w:rFonts w:ascii="Courier New" w:hAnsi="Courier New"/>
-          <w:color w:val="1E1E2E"/>
-          <w:sz w:val="18"/>
-        </w:rPr>
-        <w:t>// Constructor signature</w:t>
-        <w:br/>
-        <w:t>public DependencyQueueable(String jobId, Boolean activeFlowsOnly) {</w:t>
-        <w:br/>
-        <w:t xml:space="preserve">    this.jobId = jobId;</w:t>
-        <w:br/>
-        <w:t xml:space="preserve">    this.activeFlowsOnly = activeFlowsOnly;</w:t>
-        <w:br/>
-        <w:t>}</w:t>
-        <w:br/>
-        <w:br/>
-        <w:t>// Self-chain call</w:t>
-        <w:br/>
-        <w:t>System.enqueueJob(new DependencyQueueable(jobId, activeFlowsOnly));</w:t>
-      </w:r>
-    </w:p>
-    <w:p>
-      <w:pPr>
-        <w:pStyle w:val="Heading2"/>
-        <w:spacing w:before="240" w:after="120"/>
-      </w:pPr>
-      <w:r>
-        <w:rPr>
-          <w:b/>
-          <w:color w:val="0070D2"/>
-          <w:sz w:val="28"/>
-        </w:rPr>
-        <w:t>2.14 Supplemental Confidence Scoring</w:t>
-      </w:r>
-    </w:p>
-    <w:p>
-      <w:pPr>
-        <w:spacing w:after="80"/>
-      </w:pPr>
-      <w:r>
-        <w:rPr>
-          <w:b w:val="0"/>
-          <w:i w:val="0"/>
-          <w:color w:val="181818"/>
-          <w:sz w:val="21"/>
-        </w:rPr>
-        <w:t>Supplemental handler matches (ValidationRule regex, FlexiPage XML) are inherently fuzzy. Whitespace, comments, cross-object references, and $Label usage in formula bodies can produce false positives.</w:t>
-      </w:r>
-    </w:p>
-    <w:p>
-      <w:pPr>
-        <w:spacing w:after="80"/>
-      </w:pPr>
-      <w:r>
-        <w:rPr>
-          <w:b/>
-          <w:i w:val="0"/>
-          <w:color w:val="181818"/>
-          <w:sz w:val="21"/>
-        </w:rPr>
-        <w:t>Fix: Supplemental_Confidence__c (Number 0-100) field on Dependency_Node__c. Handler sets the score at node creation. UI displays a warning badge when score &lt; 70.</w:t>
-      </w:r>
-    </w:p>
-    <w:tbl>
-      <w:tblPr>
-        <w:tblStyle w:val="TableGrid"/>
-        <w:tblW w:type="auto" w:w="0"/>
-        <w:jc w:val="left"/>
-        <w:tblLook w:firstColumn="1" w:firstRow="1" w:lastColumn="0" w:lastRow="0" w:noHBand="0" w:noVBand="1" w:val="04A0"/>
-      </w:tblPr>
-      <w:tblGrid>
-        <w:gridCol w:w="3022"/>
-        <w:gridCol w:w="3022"/>
-        <w:gridCol w:w="3022"/>
-      </w:tblGrid>
-      <w:tr>
-        <w:tc>
-          <w:tcPr>
-            <w:tcW w:type="dxa" w:w="3022"/>
-            <w:shd w:val="clear" w:color="auto" w:fill="032D60"/>
-          </w:tcPr>
-          <w:p>
-            <w:r>
-              <w:rPr>
-                <w:b/>
-                <w:color w:val="FFFFFF"/>
-                <w:sz w:val="20"/>
-              </w:rPr>
-              <w:t>Handler</w:t>
-            </w:r>
-          </w:p>
-        </w:tc>
-        <w:tc>
-          <w:tcPr>
-            <w:tcW w:type="dxa" w:w="3022"/>
-            <w:shd w:val="clear" w:color="auto" w:fill="032D60"/>
-          </w:tcPr>
-          <w:p>
-            <w:r>
-              <w:rPr>
-                <w:b/>
-                <w:color w:val="FFFFFF"/>
-                <w:sz w:val="20"/>
-              </w:rPr>
-              <w:t>Typical Confidence</w:t>
-            </w:r>
-          </w:p>
-        </w:tc>
-        <w:tc>
-          <w:tcPr>
-            <w:tcW w:type="dxa" w:w="3022"/>
-            <w:shd w:val="clear" w:color="auto" w:fill="032D60"/>
-          </w:tcPr>
-          <w:p>
-            <w:r>
-              <w:rPr>
-                <w:b/>
-                <w:color w:val="FFFFFF"/>
-                <w:sz w:val="20"/>
-              </w:rPr>
-              <w:t>Scenario</w:t>
+              <w:t>XML structure version-sensitive</w:t>
             </w:r>
           </w:p>
         </w:tc>
@@ -1645,7 +1789,7 @@
                 <w:color w:val="181818"/>
                 <w:sz w:val="20"/>
               </w:rPr>
-              <w:t>null (not applicable)</w:t>
+              <w:t>null</w:t>
             </w:r>
           </w:p>
         </w:tc>
@@ -1660,195 +1804,7 @@
                 <w:color w:val="181818"/>
                 <w:sz w:val="20"/>
               </w:rPr>
-              <w:t>Direct MetadataComponentDependency result - no uncertainty</w:t>
-            </w:r>
-          </w:p>
-        </w:tc>
-      </w:tr>
-      <w:tr>
-        <w:tc>
-          <w:tcPr>
-            <w:tcW w:type="dxa" w:w="3022"/>
-            <w:shd w:val="clear" w:color="auto" w:fill="FFFFFF"/>
-          </w:tcPr>
-          <w:p>
-            <w:r>
-              <w:rPr>
-                <w:color w:val="181818"/>
-                <w:sz w:val="20"/>
-              </w:rPr>
-              <w:t>WorkflowFieldUpdate exact match</w:t>
-            </w:r>
-          </w:p>
-        </w:tc>
-        <w:tc>
-          <w:tcPr>
-            <w:tcW w:type="dxa" w:w="3022"/>
-            <w:shd w:val="clear" w:color="auto" w:fill="FFFFFF"/>
-          </w:tcPr>
-          <w:p>
-            <w:r>
-              <w:rPr>
-                <w:color w:val="181818"/>
-                <w:sz w:val="20"/>
-              </w:rPr>
-              <w:t>90-100</w:t>
-            </w:r>
-          </w:p>
-        </w:tc>
-        <w:tc>
-          <w:tcPr>
-            <w:tcW w:type="dxa" w:w="3022"/>
-            <w:shd w:val="clear" w:color="auto" w:fill="FFFFFF"/>
-          </w:tcPr>
-          <w:p>
-            <w:r>
-              <w:rPr>
-                <w:color w:val="181818"/>
-                <w:sz w:val="20"/>
-              </w:rPr>
-              <w:t>Field API name direct equality match</w:t>
-            </w:r>
-          </w:p>
-        </w:tc>
-      </w:tr>
-      <w:tr>
-        <w:tc>
-          <w:tcPr>
-            <w:tcW w:type="dxa" w:w="3022"/>
-            <w:shd w:val="clear" w:color="auto" w:fill="F2F4F7"/>
-          </w:tcPr>
-          <w:p>
-            <w:r>
-              <w:rPr>
-                <w:color w:val="181818"/>
-                <w:sz w:val="20"/>
-              </w:rPr>
-              <w:t>ValidationRule regex match</w:t>
-            </w:r>
-          </w:p>
-        </w:tc>
-        <w:tc>
-          <w:tcPr>
-            <w:tcW w:type="dxa" w:w="3022"/>
-            <w:shd w:val="clear" w:color="auto" w:fill="F2F4F7"/>
-          </w:tcPr>
-          <w:p>
-            <w:r>
-              <w:rPr>
-                <w:color w:val="181818"/>
-                <w:sz w:val="20"/>
-              </w:rPr>
-              <w:t>60-80</w:t>
-            </w:r>
-          </w:p>
-        </w:tc>
-        <w:tc>
-          <w:tcPr>
-            <w:tcW w:type="dxa" w:w="3022"/>
-            <w:shd w:val="clear" w:color="auto" w:fill="F2F4F7"/>
-          </w:tcPr>
-          <w:p>
-            <w:r>
-              <w:rPr>
-                <w:color w:val="181818"/>
-                <w:sz w:val="20"/>
-              </w:rPr>
-              <w:t>Regex match on formula body - whitespace/comment risk</w:t>
-            </w:r>
-          </w:p>
-        </w:tc>
-      </w:tr>
-      <w:tr>
-        <w:tc>
-          <w:tcPr>
-            <w:tcW w:type="dxa" w:w="3022"/>
-            <w:shd w:val="clear" w:color="auto" w:fill="FFFFFF"/>
-          </w:tcPr>
-          <w:p>
-            <w:r>
-              <w:rPr>
-                <w:color w:val="181818"/>
-                <w:sz w:val="20"/>
-              </w:rPr>
-              <w:t>FlexiPage XML parse</w:t>
-            </w:r>
-          </w:p>
-        </w:tc>
-        <w:tc>
-          <w:tcPr>
-            <w:tcW w:type="dxa" w:w="3022"/>
-            <w:shd w:val="clear" w:color="auto" w:fill="FFFFFF"/>
-          </w:tcPr>
-          <w:p>
-            <w:r>
-              <w:rPr>
-                <w:color w:val="181818"/>
-                <w:sz w:val="20"/>
-              </w:rPr>
-              <w:t>50-75</w:t>
-            </w:r>
-          </w:p>
-        </w:tc>
-        <w:tc>
-          <w:tcPr>
-            <w:tcW w:type="dxa" w:w="3022"/>
-            <w:shd w:val="clear" w:color="auto" w:fill="FFFFFF"/>
-          </w:tcPr>
-          <w:p>
-            <w:r>
-              <w:rPr>
-                <w:color w:val="181818"/>
-                <w:sz w:val="20"/>
-              </w:rPr>
-              <w:t>XML structure version-sensitive; partial matches possible</w:t>
-            </w:r>
-          </w:p>
-        </w:tc>
-      </w:tr>
-      <w:tr>
-        <w:tc>
-          <w:tcPr>
-            <w:tcW w:type="dxa" w:w="3022"/>
-            <w:shd w:val="clear" w:color="auto" w:fill="F2F4F7"/>
-          </w:tcPr>
-          <w:p>
-            <w:r>
-              <w:rPr>
-                <w:color w:val="181818"/>
-                <w:sz w:val="20"/>
-              </w:rPr>
-              <w:t>CMT record field lookup</w:t>
-            </w:r>
-          </w:p>
-        </w:tc>
-        <w:tc>
-          <w:tcPr>
-            <w:tcW w:type="dxa" w:w="3022"/>
-            <w:shd w:val="clear" w:color="auto" w:fill="F2F4F7"/>
-          </w:tcPr>
-          <w:p>
-            <w:r>
-              <w:rPr>
-                <w:color w:val="181818"/>
-                <w:sz w:val="20"/>
-              </w:rPr>
-              <w:t>80-95</w:t>
-            </w:r>
-          </w:p>
-        </w:tc>
-        <w:tc>
-          <w:tcPr>
-            <w:tcW w:type="dxa" w:w="3022"/>
-            <w:shd w:val="clear" w:color="auto" w:fill="F2F4F7"/>
-          </w:tcPr>
-          <w:p>
-            <w:r>
-              <w:rPr>
-                <w:color w:val="181818"/>
-                <w:sz w:val="20"/>
-              </w:rPr>
-              <w:t>SOQL exact field name filter</w:t>
+              <w:t>Not applicable - direct MetadataComponentDependency result</w:t>
             </w:r>
           </w:p>
         </w:tc>
@@ -1867,64 +1823,7 @@
           <w:color w:val="032D60"/>
           <w:sz w:val="19"/>
         </w:rPr>
-        <w:t>Nodes with Supplemental_Confidence__c &lt; 70 show a warning badge in the UI. Treat as leads for manual verification, not confirmed dependencies.</w:t>
-      </w:r>
-    </w:p>
-    <w:p>
-      <w:pPr>
-        <w:pStyle w:val="Heading2"/>
-        <w:spacing w:before="240" w:after="120"/>
-      </w:pPr>
-      <w:r>
-        <w:rPr>
-          <w:b/>
-          <w:color w:val="0070D2"/>
-          <w:sz w:val="28"/>
-        </w:rPr>
-        <w:t>2.15 Graph Density Control</w:t>
-      </w:r>
-    </w:p>
-    <w:p>
-      <w:pPr>
-        <w:spacing w:after="80"/>
-      </w:pPr>
-      <w:r>
-        <w:rPr>
-          <w:b w:val="0"/>
-          <w:i w:val="0"/>
-          <w:color w:val="181818"/>
-          <w:sz w:val="21"/>
-        </w:rPr>
-        <w:t>A 5,000+ node graph chokes the browser (especially older Lightning pages and mobile). ECharts force layout with all nodes visible from load is not viable for large org scans.</w:t>
-      </w:r>
-    </w:p>
-    <w:p>
-      <w:pPr>
-        <w:spacing w:after="80"/>
-      </w:pPr>
-      <w:r>
-        <w:rPr>
-          <w:b/>
-          <w:i w:val="0"/>
-          <w:color w:val="181818"/>
-          <w:sz w:val="21"/>
-        </w:rPr>
-        <w:t>Fix: metaMapperGraph renders first 3 levels by default (covers the most actionable direct + indirect dependencies). "Expand All" button reveals the full tree on demand.</w:t>
-      </w:r>
-    </w:p>
-    <w:p>
-      <w:pPr>
-        <w:spacing w:before="60" w:after="120"/>
-        <w:ind w:left="283"/>
-        <w:shd w:val="clear" w:color="auto" w:fill="EFF4FB"/>
-      </w:pPr>
-      <w:r>
-        <w:rPr>
-          <w:i/>
-          <w:color w:val="032D60"/>
-          <w:sz w:val="19"/>
-        </w:rPr>
-        <w:t>Level__c field on Dependency_Node__c enables client-side filtering without additional SOQL. The LWC receives the full flat list from getNodeHierarchy() and filters in JS.</w:t>
+        <w:t>Scores below 70 display a warning badge in the UI. Do not adjust scores without updating this table.</w:t>
       </w:r>
     </w:p>
     <w:p>
@@ -2132,7 +2031,7 @@
                 <w:color w:val="181818"/>
                 <w:sz w:val="20"/>
               </w:rPr>
-              <w:t>Platform Events + lightning/empApi (one event per Queueable execution)</w:t>
+              <w:t>Platform Events + lightning/empApi (one event per execution)</w:t>
             </w:r>
           </w:p>
         </w:tc>
@@ -2179,7 +2078,7 @@
                 <w:color w:val="181818"/>
                 <w:sz w:val="20"/>
               </w:rPr>
-              <w:t>Two-tier: targeted DB dedup query + Path__c ancestry</w:t>
+              <w:t>Two-tier: scoped DB dedup + Path__c ancestry (kept on circular nodes)</w:t>
             </w:r>
           </w:p>
         </w:tc>
@@ -2194,7 +2093,7 @@
                 <w:color w:val="181818"/>
                 <w:sz w:val="20"/>
               </w:rPr>
-              <w:t>Max 100 rows per dedup check; separates shared deps from true cycles</w:t>
+              <w:t>Constant-cost dedup; full ancestry preserved for debugging</w:t>
             </w:r>
           </w:p>
         </w:tc>
@@ -2226,7 +2125,7 @@
                 <w:color w:val="181818"/>
                 <w:sz w:val="20"/>
               </w:rPr>
-              <w:t>Cooperative via Status__c = Cancelled; guard on createJob()</w:t>
+              <w:t>Cooperative via Status__c = Cancelled; async context guard</w:t>
             </w:r>
           </w:p>
         </w:tc>
@@ -2241,7 +2140,7 @@
                 <w:color w:val="181818"/>
                 <w:sz w:val="20"/>
               </w:rPr>
-              <w:t>No force-kill in Salesforce; Queueable checks on entry; async context blocked</w:t>
+              <w:t>No force-kill; Queueable checks on entry; nested async blocked</w:t>
             </w:r>
           </w:p>
         </w:tc>
@@ -2258,7 +2157,7 @@
                 <w:color w:val="181818"/>
                 <w:sz w:val="20"/>
               </w:rPr>
-              <w:t>Callout guardrail</w:t>
+              <w:t>Guardrail</w:t>
             </w:r>
           </w:p>
         </w:tc>
@@ -2273,7 +2172,7 @@
                 <w:color w:val="181818"/>
                 <w:sz w:val="20"/>
               </w:rPr>
-              <w:t>Four-limit model: callouts + DML rows + heap + CPU</w:t>
+              <w:t>Five-limit model: callouts + DML + heap + CPU + query rows; mid-loop check</w:t>
             </w:r>
           </w:p>
         </w:tc>
@@ -2288,7 +2187,7 @@
                 <w:color w:val="181818"/>
                 <w:sz w:val="20"/>
               </w:rPr>
-              <w:t>Prevents all four limit breach scenarios including highly-connected nodes</w:t>
+              <w:t>Preventive, not reactive; catches high-fan-out nodes mid-loop</w:t>
             </w:r>
           </w:p>
         </w:tc>
@@ -2320,7 +2219,7 @@
                 <w:color w:val="181818"/>
                 <w:sz w:val="20"/>
               </w:rPr>
-              <w:t>Configurable via MetaMapper_Settings__mdt (50 default / 30 Flow)</w:t>
+              <w:t>Configurable via MetaMapper_Settings__mdt (50/30)</w:t>
             </w:r>
           </w:p>
         </w:tc>
@@ -2335,7 +2234,7 @@
                 <w:color w:val="181818"/>
                 <w:sz w:val="20"/>
               </w:rPr>
-              <w:t>Admins tune for org characteristics without code deploys</w:t>
+              <w:t>Admins tune per org without code deploy</w:t>
             </w:r>
           </w:p>
         </w:tc>
@@ -2352,7 +2251,7 @@
                 <w:color w:val="181818"/>
                 <w:sz w:val="20"/>
               </w:rPr>
-              <w:t>IN chunk size</w:t>
+              <w:t>DML reserve</w:t>
             </w:r>
           </w:p>
         </w:tc>
@@ -2367,7 +2266,7 @@
                 <w:color w:val="181818"/>
                 <w:sz w:val="20"/>
               </w:rPr>
-              <w:t>Character-budget driven (~100 IDs initial)</w:t>
+              <w:t>Configurable Dml_Reserve_Rows__c in CMDT (default 750)</w:t>
             </w:r>
           </w:p>
         </w:tc>
@@ -2382,7 +2281,7 @@
                 <w:color w:val="181818"/>
                 <w:sz w:val="20"/>
               </w:rPr>
-              <w:t>URI length depends on SOQL string, not just ID count</w:t>
+              <w:t>Admins raise for high-fan-out orgs</w:t>
             </w:r>
           </w:p>
         </w:tc>
@@ -2399,7 +2298,7 @@
                 <w:color w:val="181818"/>
                 <w:sz w:val="20"/>
               </w:rPr>
-              <w:t>USER_MODE scope</w:t>
+              <w:t>Cleanup</w:t>
             </w:r>
           </w:p>
         </w:tc>
@@ -2414,7 +2313,7 @@
                 <w:color w:val="181818"/>
                 <w:sz w:val="20"/>
               </w:rPr>
-              <w:t>Controller boundary only; engine uses SYSTEM_MODE</w:t>
+              <w:t>Closed_At__c lifecycle rule; explicit node delete before parent delete</w:t>
             </w:r>
           </w:p>
         </w:tc>
@@ -2429,7 +2328,7 @@
                 <w:color w:val="181818"/>
                 <w:sz w:val="20"/>
               </w:rPr>
-              <w:t>Prevents permission-related engine failures</w:t>
+              <w:t>Never deletes Processing jobs; avoids cascade DML trap</w:t>
             </w:r>
           </w:p>
         </w:tc>
@@ -2446,7 +2345,7 @@
                 <w:color w:val="181818"/>
                 <w:sz w:val="20"/>
               </w:rPr>
-              <w:t>Auth</w:t>
+              <w:t>Failure handling</w:t>
             </w:r>
           </w:p>
         </w:tc>
@@ -2461,7 +2360,7 @@
                 <w:color w:val="181818"/>
                 <w:sz w:val="20"/>
               </w:rPr>
-              <w:t>OAuth 2.0 loopback via Named Credential</w:t>
+              <w:t>Savepoint + catch pattern; fresh DML after rollback</w:t>
             </w:r>
           </w:p>
         </w:tc>
@@ -2476,7 +2375,7 @@
                 <w:color w:val="181818"/>
                 <w:sz w:val="20"/>
               </w:rPr>
-              <w:t>Internal Tooling API only; admin-authorized once post-install</w:t>
+              <w:t>Guarantees Status = Failed persists even after engine rollback</w:t>
             </w:r>
           </w:p>
         </w:tc>
@@ -2493,7 +2392,7 @@
                 <w:color w:val="181818"/>
                 <w:sz w:val="20"/>
               </w:rPr>
-              <w:t>Security</w:t>
+              <w:t>Constructor</w:t>
             </w:r>
           </w:p>
         </w:tc>
@@ -2508,7 +2407,7 @@
                 <w:color w:val="181818"/>
                 <w:sz w:val="20"/>
               </w:rPr>
-              <w:t>Private OWD; Permission Set; USER_MODE at controller</w:t>
+              <w:t>DependencyQueueable(jobId, activeFlowsOnly)</w:t>
             </w:r>
           </w:p>
         </w:tc>
@@ -2523,7 +2422,7 @@
                 <w:color w:val="181818"/>
                 <w:sz w:val="20"/>
               </w:rPr>
-              <w:t>Enterprise InfoSec compliant</w:t>
+              <w:t>No per-chain SOQL re-query</w:t>
             </w:r>
           </w:p>
         </w:tc>
@@ -2540,7 +2439,7 @@
                 <w:color w:val="181818"/>
                 <w:sz w:val="20"/>
               </w:rPr>
-              <w:t>Retention</w:t>
+              <w:t>USER_MODE</w:t>
             </w:r>
           </w:p>
         </w:tc>
@@ -2555,7 +2454,7 @@
                 <w:color w:val="181818"/>
                 <w:sz w:val="20"/>
               </w:rPr>
-              <w:t>Configurable via MetaMapper_Settings__mdt (default 72h)</w:t>
+              <w:t>Controller boundary only; engine SYSTEM_MODE</w:t>
             </w:r>
           </w:p>
         </w:tc>
@@ -2570,7 +2469,7 @@
                 <w:color w:val="181818"/>
                 <w:sz w:val="20"/>
               </w:rPr>
-              <w:t>Admin-adjustable for diagnostic needs</w:t>
+              <w:t>Prevents permission-related engine failures</w:t>
             </w:r>
           </w:p>
         </w:tc>
@@ -2587,7 +2486,7 @@
                 <w:color w:val="181818"/>
                 <w:sz w:val="20"/>
               </w:rPr>
-              <w:t>Source API version</w:t>
+              <w:t>Auth</w:t>
             </w:r>
           </w:p>
         </w:tc>
@@ -2602,7 +2501,7 @@
                 <w:color w:val="181818"/>
                 <w:sz w:val="20"/>
               </w:rPr>
-              <w:t>v66.0</w:t>
+              <w:t>OAuth 2.0 loopback via Named Credential</w:t>
             </w:r>
           </w:p>
         </w:tc>
@@ -2617,7 +2516,7 @@
                 <w:color w:val="181818"/>
                 <w:sz w:val="20"/>
               </w:rPr>
-              <w:t>Current Salesforce API version</w:t>
+              <w:t>Internal Tooling API only</w:t>
             </w:r>
           </w:p>
         </w:tc>
@@ -2634,7 +2533,7 @@
                 <w:color w:val="181818"/>
                 <w:sz w:val="20"/>
               </w:rPr>
-              <w:t>Constructor pattern</w:t>
+              <w:t>Security</w:t>
             </w:r>
           </w:p>
         </w:tc>
@@ -2649,7 +2548,7 @@
                 <w:color w:val="181818"/>
                 <w:sz w:val="20"/>
               </w:rPr>
-              <w:t>DependencyQueueable(jobId, activeFlowsOnly)</w:t>
+              <w:t>Private OWD; Permission Set</w:t>
             </w:r>
           </w:p>
         </w:tc>
@@ -2664,7 +2563,54 @@
                 <w:color w:val="181818"/>
                 <w:sz w:val="20"/>
               </w:rPr>
-              <w:t>Flag passed at construction; eliminates per-chain SOQL re-query</w:t>
+              <w:t>Enterprise InfoSec compliant</w:t>
+            </w:r>
+          </w:p>
+        </w:tc>
+      </w:tr>
+      <w:tr>
+        <w:tc>
+          <w:tcPr>
+            <w:tcW w:type="dxa" w:w="3022"/>
+            <w:shd w:val="clear" w:color="auto" w:fill="F2F4F7"/>
+          </w:tcPr>
+          <w:p>
+            <w:r>
+              <w:rPr>
+                <w:color w:val="181818"/>
+                <w:sz w:val="20"/>
+              </w:rPr>
+              <w:t>Source API version</w:t>
+            </w:r>
+          </w:p>
+        </w:tc>
+        <w:tc>
+          <w:tcPr>
+            <w:tcW w:type="dxa" w:w="3022"/>
+            <w:shd w:val="clear" w:color="auto" w:fill="F2F4F7"/>
+          </w:tcPr>
+          <w:p>
+            <w:r>
+              <w:rPr>
+                <w:color w:val="181818"/>
+                <w:sz w:val="20"/>
+              </w:rPr>
+              <w:t>v66.0</w:t>
+            </w:r>
+          </w:p>
+        </w:tc>
+        <w:tc>
+          <w:tcPr>
+            <w:tcW w:type="dxa" w:w="3022"/>
+            <w:shd w:val="clear" w:color="auto" w:fill="F2F4F7"/>
+          </w:tcPr>
+          <w:p>
+            <w:r>
+              <w:rPr>
+                <w:color w:val="181818"/>
+                <w:sz w:val="20"/>
+              </w:rPr>
+              <w:t>Current Salesforce API version</w:t>
             </w:r>
           </w:p>
         </w:tc>
@@ -2952,7 +2898,7 @@
                 <w:color w:val="181818"/>
                 <w:sz w:val="20"/>
               </w:rPr>
-              <w:t>Default: true. Drops inactive Flow versions. Triggers extra callout for Flow status.</w:t>
+              <w:t>Default: true. Drops inactive Flow versions. Triggers extra callout per Flow batch.</w:t>
             </w:r>
           </w:p>
         </w:tc>
@@ -3140,7 +3086,54 @@
                 <w:color w:val="181818"/>
                 <w:sz w:val="20"/>
               </w:rPr>
-              <w:t>JSON map {MetadataType: count} - populated on Completed; drives stats tile in UI</w:t>
+              <w:t>JSON map {MetadataType: count} - populated on Completed; drives stats tile</w:t>
+            </w:r>
+          </w:p>
+        </w:tc>
+      </w:tr>
+      <w:tr>
+        <w:tc>
+          <w:tcPr>
+            <w:tcW w:type="dxa" w:w="3022"/>
+            <w:shd w:val="clear" w:color="auto" w:fill="F2F4F7"/>
+          </w:tcPr>
+          <w:p>
+            <w:r>
+              <w:rPr>
+                <w:color w:val="181818"/>
+                <w:sz w:val="20"/>
+              </w:rPr>
+              <w:t>Closed_At__c</w:t>
+            </w:r>
+          </w:p>
+        </w:tc>
+        <w:tc>
+          <w:tcPr>
+            <w:tcW w:type="dxa" w:w="3022"/>
+            <w:shd w:val="clear" w:color="auto" w:fill="F2F4F7"/>
+          </w:tcPr>
+          <w:p>
+            <w:r>
+              <w:rPr>
+                <w:color w:val="181818"/>
+                <w:sz w:val="20"/>
+              </w:rPr>
+              <w:t>DateTime</w:t>
+            </w:r>
+          </w:p>
+        </w:tc>
+        <w:tc>
+          <w:tcPr>
+            <w:tcW w:type="dxa" w:w="3022"/>
+            <w:shd w:val="clear" w:color="auto" w:fill="F2F4F7"/>
+          </w:tcPr>
+          <w:p>
+            <w:r>
+              <w:rPr>
+                <w:color w:val="181818"/>
+                <w:sz w:val="20"/>
+              </w:rPr>
+              <w:t>Stamped on Completed, Failed, or Cancelled. Cleanup batch uses this - never CreatedDate - to avoid deleting in-progress jobs.</w:t>
             </w:r>
           </w:p>
         </w:tc>
@@ -3159,7 +3152,7 @@
           <w:color w:val="032D60"/>
           <w:sz w:val="19"/>
         </w:rPr>
-        <w:t>Visited_IDs__c intentionally omitted. Cycle detection uses targeted DB dedup query + Path__c field (ancestry). A Long Text 131072 field would cap at ~5,957 IDs and crash the Queueable chain in large orgs.</w:t>
+        <w:t>Visited_IDs__c removed. Cycle detection uses scoped DB dedup query + Path__c ancestry field.</w:t>
       </w:r>
     </w:p>
     <w:p>
@@ -3280,7 +3273,7 @@
                 <w:color w:val="181818"/>
                 <w:sz w:val="20"/>
               </w:rPr>
-              <w:t>Parent job - cascade delete on job removal</w:t>
+              <w:t>Parent job - child nodes deleted explicitly in chunks before parent (cascade DML trap avoided)</w:t>
             </w:r>
           </w:p>
         </w:tc>
@@ -3703,7 +3696,7 @@
                 <w:color w:val="181818"/>
                 <w:sz w:val="20"/>
               </w:rPr>
-              <w:t>JSON pills: isWrite, activeVersions, filterUsage, parentObject, etc.</w:t>
+              <w:t>JSON pills. Circular nodes include {"cycleClosesAt": "&lt;parentId&gt;"} for UI visualization.</w:t>
             </w:r>
           </w:p>
         </w:tc>
@@ -3797,7 +3790,7 @@
                 <w:color w:val="181818"/>
                 <w:sz w:val="20"/>
               </w:rPr>
-              <w:t>Pipe-delimited ancestor Metadata_ID__c chain from root to this node (cycle detection)</w:t>
+              <w:t>Pipe-delimited ancestor chain. Root = "" (empty). Kept on circular nodes for debugging. child = (isBlank(parent) ? "" : parent+"|") + parentId</w:t>
             </w:r>
           </w:p>
         </w:tc>
@@ -3844,7 +3837,7 @@
                 <w:color w:val="181818"/>
                 <w:sz w:val="20"/>
               </w:rPr>
-              <w:t>0-100 score for Supplemental nodes. Null for ToolingAPI nodes. Warning badge in UI when &lt; 70.</w:t>
+              <w:t>0-100 score for Supplemental nodes. Null for ToolingAPI nodes. Badge shown in UI when &lt; 70.</w:t>
             </w:r>
           </w:p>
         </w:tc>
@@ -4066,6 +4059,38 @@
                 <w:sz w:val="20"/>
               </w:rPr>
               <w:t>{"filterUsage": ["filter", "grouping", "column"]}</w:t>
+            </w:r>
+          </w:p>
+        </w:tc>
+      </w:tr>
+      <w:tr>
+        <w:tc>
+          <w:tcPr>
+            <w:tcW w:type="dxa" w:w="4533"/>
+            <w:shd w:val="clear" w:color="auto" w:fill="FFFFFF"/>
+          </w:tcPr>
+          <w:p>
+            <w:r>
+              <w:rPr>
+                <w:color w:val="181818"/>
+                <w:sz w:val="20"/>
+              </w:rPr>
+              <w:t>Circular node (any type)</w:t>
+            </w:r>
+          </w:p>
+        </w:tc>
+        <w:tc>
+          <w:tcPr>
+            <w:tcW w:type="dxa" w:w="4533"/>
+            <w:shd w:val="clear" w:color="auto" w:fill="FFFFFF"/>
+          </w:tcPr>
+          <w:p>
+            <w:r>
+              <w:rPr>
+                <w:color w:val="181818"/>
+                <w:sz w:val="20"/>
+              </w:rPr>
+              <w:t>{"cycleClosesAt": "&lt;parentMetadataId&gt;"}</w:t>
             </w:r>
           </w:p>
         </w:tc>
@@ -4488,7 +4513,7 @@
                 <w:color w:val="181818"/>
                 <w:sz w:val="20"/>
               </w:rPr>
-              <w:t>Hours before job hard-delete. Min 1, recommended &gt;=72 for diagnostic use.</w:t>
+              <w:t>Hours before closed job hard-delete. Min 1.</w:t>
             </w:r>
           </w:p>
         </w:tc>
@@ -4550,7 +4575,7 @@
                 <w:color w:val="181818"/>
                 <w:sz w:val="20"/>
               </w:rPr>
-              <w:t>Unprocessed nodes per Queueable execution (non-Flow or Flow-off jobs).</w:t>
+              <w:t>Unprocessed nodes per Queueable execution (non-Flow jobs).</w:t>
             </w:r>
           </w:p>
         </w:tc>
@@ -4612,7 +4637,69 @@
                 <w:color w:val="181818"/>
                 <w:sz w:val="20"/>
               </w:rPr>
-              <w:t>Batch size when Active_Flows_Only__c = true. Lower due to extra status validation callout per Flow node.</w:t>
+              <w:t>Batch size when Active_Flows_Only__c = true.</w:t>
+            </w:r>
+          </w:p>
+        </w:tc>
+      </w:tr>
+      <w:tr>
+        <w:tc>
+          <w:tcPr>
+            <w:tcW w:type="dxa" w:w="2266"/>
+            <w:shd w:val="clear" w:color="auto" w:fill="FFFFFF"/>
+          </w:tcPr>
+          <w:p>
+            <w:r>
+              <w:rPr>
+                <w:color w:val="181818"/>
+                <w:sz w:val="20"/>
+              </w:rPr>
+              <w:t>Dml_Reserve_Rows__c</w:t>
+            </w:r>
+          </w:p>
+        </w:tc>
+        <w:tc>
+          <w:tcPr>
+            <w:tcW w:type="dxa" w:w="2266"/>
+            <w:shd w:val="clear" w:color="auto" w:fill="FFFFFF"/>
+          </w:tcPr>
+          <w:p>
+            <w:r>
+              <w:rPr>
+                <w:color w:val="181818"/>
+                <w:sz w:val="20"/>
+              </w:rPr>
+              <w:t>Number</w:t>
+            </w:r>
+          </w:p>
+        </w:tc>
+        <w:tc>
+          <w:tcPr>
+            <w:tcW w:type="dxa" w:w="2266"/>
+            <w:shd w:val="clear" w:color="auto" w:fill="FFFFFF"/>
+          </w:tcPr>
+          <w:p>
+            <w:r>
+              <w:rPr>
+                <w:color w:val="181818"/>
+                <w:sz w:val="20"/>
+              </w:rPr>
+              <w:t>750</w:t>
+            </w:r>
+          </w:p>
+        </w:tc>
+        <w:tc>
+          <w:tcPr>
+            <w:tcW w:type="dxa" w:w="2266"/>
+            <w:shd w:val="clear" w:color="auto" w:fill="FFFFFF"/>
+          </w:tcPr>
+          <w:p>
+            <w:r>
+              <w:rPr>
+                <w:color w:val="181818"/>
+                <w:sz w:val="20"/>
+              </w:rPr>
+              <w:t>DML rows to reserve before chaining. Raise for high-fan-out orgs.</w:t>
             </w:r>
           </w:p>
         </w:tc>
@@ -4631,7 +4718,7 @@
           <w:color w:val="032D60"/>
           <w:sz w:val="19"/>
         </w:rPr>
-        <w:t>DependencyQueueable reads all three fields at the start of each execution. Admins tune batch sizes for their org without a code deploy.</w:t>
+        <w:t>DependencyQueueable reads all four fields at the start of each execution. DependencyCleanupBatch reads Retention_Hours__c.</w:t>
       </w:r>
     </w:p>
     <w:p>
@@ -4681,7 +4768,7 @@
           <w:color w:val="181818"/>
           <w:sz w:val="21"/>
         </w:rPr>
-        <w:t>1. User submits via LWC. Controller validates sync context (not Batch/Future/Queueable). Creates Dependency_Job__c (Initializing), inserts root Dependency_Node__c (Path__c = empty, Is_Processed__c = false), enqueues DependencyQueueable(jobId, activeFlowsOnly).</w:t>
+        <w:t>1. User submits via LWC. createJob() validates sync context (throws if called from Batch/Future/Queueable). Creates Dependency_Job__c (Initializing). Inserts root Dependency_Node__c (Path__c = "", Is_Processed__c = false). Enqueues DependencyQueueable(jobId, activeFlowsOnly).</w:t>
       </w:r>
     </w:p>
     <w:p>
@@ -4695,7 +4782,7 @@
           <w:color w:val="181818"/>
           <w:sz w:val="21"/>
         </w:rPr>
-        <w:t>2. DependencyQueueable.execute() checks Status__c first. If Cancelled, exit without enqueuing successor.</w:t>
+        <w:t>2. execute() sets Savepoint sp = Database.setSavepoint(). Wraps all engine work in try/catch.</w:t>
       </w:r>
     </w:p>
     <w:p>
@@ -4709,7 +4796,7 @@
           <w:color w:val="181818"/>
           <w:sz w:val="21"/>
         </w:rPr>
-        <w:t>3. Read MetaMapper_Settings__mdt: Retention_Hours__c, Batch_Size__c, Flow_Batch_Size__c. Select effective batch size based on activeFlowsOnly flag.</w:t>
+        <w:t>3. Check Status__c. If Cancelled: exit without chaining.</w:t>
       </w:r>
     </w:p>
     <w:p>
@@ -4723,7 +4810,7 @@
           <w:color w:val="181818"/>
           <w:sz w:val="21"/>
         </w:rPr>
-        <w:t>4. Query unprocessed nodes (up to effective batch size) WHERE Is_Processed__c = false.</w:t>
+        <w:t>4. Read MetaMapper_Settings__mdt: all four fields. Select effective batch size (Flow vs non-Flow).</w:t>
       </w:r>
     </w:p>
     <w:p>
@@ -4737,7 +4824,7 @@
           <w:color w:val="181818"/>
           <w:sz w:val="21"/>
         </w:rPr>
-        <w:t>5. For each batch: estimate SOQL character length; if &gt;8KB split batch. Tooling API callout (QueryMore loop for &gt;2,000 results; HTTP 414/431 triggers reactive split).</w:t>
+        <w:t>5. Pre-batch five-limit guardrail check (see 5.2). Chain if any limit breached.</w:t>
       </w:r>
     </w:p>
     <w:p>
@@ -4751,7 +4838,7 @@
           <w:color w:val="181818"/>
           <w:sz w:val="21"/>
         </w:rPr>
-        <w:t>6. Targeted dedup query: SELECT Metadata_ID__c FROM Dependency_Node__c WHERE Dependency_Job__c = :jobId AND Metadata_ID__c IN :currentResultIds (max 100 rows).</w:t>
+        <w:t>6. Query up to effective batch size unprocessed nodes (Is_Processed__c = false).</w:t>
       </w:r>
     </w:p>
     <w:p>
@@ -4765,7 +4852,7 @@
           <w:color w:val="181818"/>
           <w:sz w:val="21"/>
         </w:rPr>
-        <w:t>7. For each result: if in dedup set -&gt; skip (NOT circular). If Metadata_ID__c in parent.Path__c -&gt; insert with Is_Circular__c = true, Is_Processed__c = true (true ancestry cycle).</w:t>
+        <w:t>7. Tooling API callout: character-budget chunk (split if estimated SOQL &gt; 8KB). QueryMore loop until done = true. HTTP 414/431: split batch in half, retry.</w:t>
       </w:r>
     </w:p>
     <w:p>
@@ -4779,7 +4866,7 @@
           <w:color w:val="181818"/>
           <w:sz w:val="21"/>
         </w:rPr>
-        <w:t>8. Insert new child nodes: Source__c = ToolingAPI, Path__c = parent.Path__c + | + parent.Metadata_ID__c (SYSTEM_MODE).</w:t>
+        <w:t>8. Scoped dedup query: SELECT Metadata_ID__c WHERE Dependency_Job__c = :jobId AND Metadata_ID__c IN :currentResultIds.</w:t>
       </w:r>
     </w:p>
     <w:p>
@@ -4793,7 +4880,7 @@
           <w:color w:val="181818"/>
           <w:sz w:val="21"/>
         </w:rPr>
-        <w:t>9. DependencyTypeHandlerFactory dispatches supplemental handlers. Insert supplemental nodes: Source__c = Supplemental, Supplemental_Confidence__c set by handler.</w:t>
+        <w:t>9. Per-result mid-loop check: if DML remaining &lt; Dml_Reserve_Rows__c OR CPU &gt;= 75% - chain and return BEFORE processing more results.</w:t>
       </w:r>
     </w:p>
     <w:p>
@@ -4807,7 +4894,7 @@
           <w:color w:val="181818"/>
           <w:sz w:val="21"/>
         </w:rPr>
-        <w:t>10. Mark current nodes Is_Processed__c = true. Increment Nodes_Processed__c. Publish ONE Dependency_Status__e event.</w:t>
+        <w:t>10. For each result: if in dedup set -&gt; skip. If Metadata_ID__c in parent.Path__c -&gt; insert with Is_Circular__c = true, Is_Processed__c = true, keep full Path__c, add cycleClosesAt to Context_Data__c.</w:t>
       </w:r>
     </w:p>
     <w:p>
@@ -4821,7 +4908,7 @@
           <w:color w:val="181818"/>
           <w:sz w:val="21"/>
         </w:rPr>
-        <w:t>11. Four-limit guardrail: check callout headroom, DML rows remaining, heap %, CPU %. If any breached: enqueue DependencyQueueable(jobId, activeFlowsOnly) and return.</w:t>
+        <w:t>11. Insert new child nodes: Source__c = ToolingAPI, Path__c built with blank-safe formula (no leading pipe).</w:t>
       </w:r>
     </w:p>
     <w:p>
@@ -4835,7 +4922,7 @@
           <w:color w:val="181818"/>
           <w:sz w:val="21"/>
         </w:rPr>
-        <w:t>12. On Completed: compute Summary_JSON__c, send Custom Notification + email.</w:t>
+        <w:t>12. Dispatch supplemental handlers via DependencyTypeHandlerFactory. Insert supplemental nodes with Source__c = Supplemental and Supplemental_Confidence__c.</w:t>
       </w:r>
     </w:p>
     <w:p>
@@ -4849,7 +4936,49 @@
           <w:color w:val="181818"/>
           <w:sz w:val="21"/>
         </w:rPr>
-        <w:t>13. On exception: update Job to Failed, publish failure event.</w:t>
+        <w:t>13. Mark current nodes Is_Processed__c = true. Stamp Nodes_Processed__c. Publish ONE Dependency_Status__e.</w:t>
+      </w:r>
+    </w:p>
+    <w:p>
+      <w:pPr>
+        <w:pStyle w:val="ListBullet"/>
+        <w:spacing w:after="40"/>
+        <w:ind w:left="283"/>
+      </w:pPr>
+      <w:r>
+        <w:rPr>
+          <w:color w:val="181818"/>
+          <w:sz w:val="21"/>
+        </w:rPr>
+        <w:t>14. Post-batch five-limit guardrail. Chain if any limit breached.</w:t>
+      </w:r>
+    </w:p>
+    <w:p>
+      <w:pPr>
+        <w:pStyle w:val="ListBullet"/>
+        <w:spacing w:after="40"/>
+        <w:ind w:left="283"/>
+      </w:pPr>
+      <w:r>
+        <w:rPr>
+          <w:color w:val="181818"/>
+          <w:sz w:val="21"/>
+        </w:rPr>
+        <w:t>15. If no unprocessed nodes remain: compute Summary_JSON__c, set Status__c = Completed, stamp Closed_At__c. Send notification.</w:t>
+      </w:r>
+    </w:p>
+    <w:p>
+      <w:pPr>
+        <w:pStyle w:val="ListBullet"/>
+        <w:spacing w:after="40"/>
+        <w:ind w:left="283"/>
+      </w:pPr>
+      <w:r>
+        <w:rPr>
+          <w:color w:val="181818"/>
+          <w:sz w:val="21"/>
+        </w:rPr>
+        <w:t>16. catch(Exception e): Database.rollback(sp); updateJobFailed(jobId, e.getMessage()) - fresh DML + event after rollback.</w:t>
       </w:r>
     </w:p>
     <w:p>
@@ -4863,7 +4992,21 @@
           <w:color w:val="0070D2"/>
           <w:sz w:val="28"/>
         </w:rPr>
-        <w:t>5.2 Four-Limit Guardrail</w:t>
+        <w:t>5.2 Five-Limit Guardrail (Pre-Batch + Mid-Loop)</w:t>
+      </w:r>
+    </w:p>
+    <w:p>
+      <w:pPr>
+        <w:spacing w:after="80"/>
+      </w:pPr>
+      <w:r>
+        <w:rPr>
+          <w:b w:val="0"/>
+          <w:i w:val="0"/>
+          <w:color w:val="181818"/>
+          <w:sz w:val="21"/>
+        </w:rPr>
+        <w:t>Run at two points: (A) before starting a new batch (pre-batch), (B) inside the result loop before adding to insert list (mid-loop). Mid-loop only checks DML and CPU - the fast-changing limits during result processing.</w:t>
       </w:r>
     </w:p>
     <w:p>
@@ -4878,44 +5021,58 @@
           <w:color w:val="1E1E2E"/>
           <w:sz w:val="18"/>
         </w:rPr>
-        <w:t>// Callout remaining-budget</w:t>
+        <w:t>// ---- PRE-BATCH CHECK ----</w:t>
         <w:br/>
         <w:t>Integer calloutsRemaining = Limits.getLimitCallouts() - Limits.getCallouts();</w:t>
         <w:br/>
-        <w:t>Integer headroom = 1</w:t>
+        <w:t>Integer headroom = 1 + (queryMorePossible?1:0) + (needsFlowValidation?1:0) + 2;</w:t>
         <w:br/>
-        <w:t xml:space="preserve">    + (queryMorePossible ? 1 : 0)</w:t>
+        <w:t>Integer dmlRemaining   = Limits.getLimitDmlRows()   - Limits.getDmlRows();</w:t>
         <w:br/>
-        <w:t xml:space="preserve">    + (needsFlowValidation ? 1 : 0)</w:t>
+        <w:t>Integer queryRemaining = Limits.getLimitQueryRows()  - Limits.getQueryRows();</w:t>
         <w:br/>
-        <w:t xml:space="preserve">    + 2; // retry buffer</w:t>
+        <w:t>Decimal heapPct = (Decimal)Limits.getHeapSize()  / Limits.getLimitHeapSize();</w:t>
+        <w:br/>
+        <w:t>Decimal cpuPct  = (Decimal)Limits.getCpuTime()   / Limits.getLimitCpuTime();</w:t>
         <w:br/>
         <w:br/>
-        <w:t>// DML row budget (reserve 500 for current + supplemental inserts)</w:t>
+        <w:t>if (calloutsRemaining &lt; headroom || dmlRemaining &lt; dmlReserve</w:t>
         <w:br/>
-        <w:t>Integer dmlRemaining = Limits.getLimitDmlRows() - Limits.getDmlRows();</w:t>
-        <w:br/>
-        <w:br/>
-        <w:t>// Heap and CPU budgets</w:t>
-        <w:br/>
-        <w:t>Decimal heapPct = (Decimal) Limits.getHeapSize() / Limits.getLimitHeapSize();</w:t>
-        <w:br/>
-        <w:t>Decimal cpuPct  = (Decimal) Limits.getCpuTime()  / Limits.getLimitCpuTime();</w:t>
-        <w:br/>
-        <w:br/>
-        <w:t>if (calloutsRemaining &lt; headroom</w:t>
-        <w:br/>
-        <w:t xml:space="preserve">    || dmlRemaining &lt; 500</w:t>
-        <w:br/>
-        <w:t xml:space="preserve">    || heapPct &gt;= 0.80</w:t>
-        <w:br/>
-        <w:t xml:space="preserve">    || cpuPct  &gt;= 0.75) {</w:t>
+        <w:t xml:space="preserve">    || heapPct &gt;= 0.80 || cpuPct &gt;= 0.75 || queryRemaining &lt; 1000) {</w:t>
         <w:br/>
         <w:t xml:space="preserve">    System.enqueueJob(new DependencyQueueable(jobId, activeFlowsOnly));</w:t>
         <w:br/>
         <w:t xml:space="preserve">    return;</w:t>
         <w:br/>
         <w:t>}</w:t>
+        <w:br/>
+        <w:br/>
+        <w:t>// ---- MID-LOOP CHECK (inside result-processing loop) ----</w:t>
+        <w:br/>
+        <w:t>if (Limits.getLimitDmlRows() - Limits.getDmlRows() &lt; dmlReserve</w:t>
+        <w:br/>
+        <w:t xml:space="preserve">    || (Decimal)Limits.getCpuTime()/Limits.getLimitCpuTime() &gt;= 0.75) {</w:t>
+        <w:br/>
+        <w:t xml:space="preserve">    System.enqueueJob(new DependencyQueueable(jobId, activeFlowsOnly));</w:t>
+        <w:br/>
+        <w:t xml:space="preserve">    return;</w:t>
+        <w:br/>
+        <w:t>}</w:t>
+      </w:r>
+    </w:p>
+    <w:p>
+      <w:pPr>
+        <w:spacing w:before="60" w:after="120"/>
+        <w:ind w:left="283"/>
+        <w:shd w:val="clear" w:color="auto" w:fill="EFF4FB"/>
+      </w:pPr>
+      <w:r>
+        <w:rPr>
+          <w:i/>
+          <w:color w:val="032D60"/>
+          <w:sz w:val="19"/>
+        </w:rPr>
+        <w:t>dmlReserve = MetaMapper_Settings__mdt.Dml_Reserve_Rows__c (default 750). Mid-loop check is preventive: it stops accumulating insert candidates before the DML budget is exhausted.</w:t>
       </w:r>
     </w:p>
     <w:p>
@@ -4929,7 +5086,7 @@
           <w:color w:val="0070D2"/>
           <w:sz w:val="28"/>
         </w:rPr>
-        <w:t>5.3 Two-Tier Cycle Detection</w:t>
+        <w:t>5.3 Failure Handling (Savepoint Pattern)</w:t>
       </w:r>
     </w:p>
     <w:p>
@@ -4944,32 +5101,182 @@
           <w:color w:val="1E1E2E"/>
           <w:sz w:val="18"/>
         </w:rPr>
-        <w:t>// Tier 1: deduplication (targeted query - constant heap cost)</w:t>
+        <w:t>public void execute(QueueableContext ctx) {</w:t>
         <w:br/>
-        <w:t>if (alreadyInserted.contains(result.refId)) {</w:t>
+        <w:t xml:space="preserve">    Savepoint sp = Database.setSavepoint();</w:t>
         <w:br/>
-        <w:t xml:space="preserve">    continue; // skip - already inserted via another path, not a cycle</w:t>
+        <w:t xml:space="preserve">    try {</w:t>
+        <w:br/>
+        <w:t xml:space="preserve">        // all engine work</w:t>
+        <w:br/>
+        <w:t xml:space="preserve">    } catch (Exception e) {</w:t>
+        <w:br/>
+        <w:t xml:space="preserve">        Database.rollback(sp);</w:t>
+        <w:br/>
+        <w:t xml:space="preserve">        updateJobFailed(jobId, e.getMessage()); // fresh DML after rollback</w:t>
+        <w:br/>
+        <w:t xml:space="preserve">    }</w:t>
         <w:br/>
         <w:t>}</w:t>
+      </w:r>
+    </w:p>
+    <w:p>
+      <w:pPr>
+        <w:spacing w:before="60" w:after="120"/>
+        <w:ind w:left="283"/>
+        <w:shd w:val="clear" w:color="auto" w:fill="EFF4FB"/>
+      </w:pPr>
+      <w:r>
+        <w:rPr>
+          <w:i/>
+          <w:color w:val="032D60"/>
+          <w:sz w:val="19"/>
+        </w:rPr>
+        <w:t>Without Database.rollback(sp), partial engine work (some nodes inserted, some not) remains in a corrupt intermediate state. The rollback cleans this; the subsequent status DML commits cleanly.</w:t>
+      </w:r>
+    </w:p>
+    <w:p>
+      <w:pPr>
+        <w:pStyle w:val="Heading2"/>
+        <w:spacing w:before="240" w:after="120"/>
+      </w:pPr>
+      <w:r>
+        <w:rPr>
+          <w:b/>
+          <w:color w:val="0070D2"/>
+          <w:sz w:val="28"/>
+        </w:rPr>
+        <w:t>5.4 Two-Tier Cycle Detection</w:t>
+      </w:r>
+    </w:p>
+    <w:p>
+      <w:pPr>
+        <w:spacing w:before="60" w:after="60"/>
+        <w:ind w:left="454"/>
+        <w:shd w:val="clear" w:color="auto" w:fill="EAECF0"/>
+      </w:pPr>
+      <w:r>
+        <w:rPr>
+          <w:rFonts w:ascii="Courier New" w:hAnsi="Courier New"/>
+          <w:color w:val="1E1E2E"/>
+          <w:sz w:val="18"/>
+        </w:rPr>
+        <w:t>// Tier 1: dedup (scoped to current result set)</w:t>
+        <w:br/>
+        <w:t>if (alreadyInserted.contains(result.refId)) continue;</w:t>
         <w:br/>
         <w:br/>
-        <w:t>// Tier 2: true ancestry cycle</w:t>
+        <w:t>// Tier 2: ancestry cycle</w:t>
         <w:br/>
         <w:t>Boolean isCycle = String.isNotBlank(parentNode.Path__c)</w:t>
         <w:br/>
         <w:t xml:space="preserve">    &amp;&amp; parentNode.Path__c.contains(result.refId);</w:t>
         <w:br/>
-        <w:t>newNode.Is_Circular__c = isCycle;</w:t>
         <w:br/>
-        <w:t>newNode.Is_Processed__c = isCycle;</w:t>
+        <w:t>newNode.Is_Circular__c   = isCycle;</w:t>
         <w:br/>
-        <w:t>newNode.Path__c = isCycle ? null</w:t>
+        <w:t>newNode.Is_Processed__c  = isCycle;</w:t>
         <w:br/>
-        <w:t xml:space="preserve">    : (parentNode.Path__c != null</w:t>
+        <w:t>// Keep full Path__c on circular nodes for debugging</w:t>
         <w:br/>
-        <w:t xml:space="preserve">        ? parentNode.Path__c + '|' + parentNode.Metadata_ID__c</w:t>
+        <w:t>newNode.Path__c = (String.isBlank(parentNode.Path__c)</w:t>
         <w:br/>
-        <w:t xml:space="preserve">        : parentNode.Metadata_ID__c);</w:t>
+        <w:t xml:space="preserve">    ? '' : parentNode.Path__c + '|') + parentNode.Metadata_ID__c;</w:t>
+        <w:br/>
+        <w:t>if (isCycle) {</w:t>
+        <w:br/>
+        <w:t xml:space="preserve">    Map&lt;String,Object&gt; cd = (Map&lt;String,Object&gt;)JSON.deserializeUntyped(newNode.Context_Data__c ?? '{}');</w:t>
+        <w:br/>
+        <w:t xml:space="preserve">    cd.put('cycleClosesAt', parentNode.Metadata_ID__c);</w:t>
+        <w:br/>
+        <w:t xml:space="preserve">    newNode.Context_Data__c = JSON.serialize(cd);</w:t>
+        <w:br/>
+        <w:t>}</w:t>
+      </w:r>
+    </w:p>
+    <w:p>
+      <w:pPr>
+        <w:spacing w:before="60" w:after="120"/>
+        <w:ind w:left="283"/>
+        <w:shd w:val="clear" w:color="auto" w:fill="EFF4FB"/>
+      </w:pPr>
+      <w:r>
+        <w:rPr>
+          <w:i/>
+          <w:color w:val="032D60"/>
+          <w:sz w:val="19"/>
+        </w:rPr>
+        <w:t>CPU note: String.contains() on a 28KB Path__c string inside the inner loop is CPU-intensive for deep trees. The mid-loop CPU check catches this before the 10s limit is breached.</w:t>
+      </w:r>
+    </w:p>
+    <w:p>
+      <w:pPr>
+        <w:pStyle w:val="Heading2"/>
+        <w:spacing w:before="240" w:after="120"/>
+      </w:pPr>
+      <w:r>
+        <w:rPr>
+          <w:b/>
+          <w:color w:val="0070D2"/>
+          <w:sz w:val="28"/>
+        </w:rPr>
+        <w:t>5.5 Cleanup Batch</w:t>
+      </w:r>
+    </w:p>
+    <w:p>
+      <w:pPr>
+        <w:spacing w:before="60" w:after="60"/>
+        <w:ind w:left="454"/>
+        <w:shd w:val="clear" w:color="auto" w:fill="EAECF0"/>
+      </w:pPr>
+      <w:r>
+        <w:rPr>
+          <w:rFonts w:ascii="Courier New" w:hAnsi="Courier New"/>
+          <w:color w:val="1E1E2E"/>
+          <w:sz w:val="18"/>
+        </w:rPr>
+        <w:t>// DependencyCleanupBatch - scope = 1 job per execute() call</w:t>
+        <w:br/>
+        <w:t>// Filter: closed jobs older than Retention_Hours__c (uses Closed_At__c, never CreatedDate)</w:t>
+        <w:br/>
+        <w:t>for (Dependency_Job__c job : scope) {</w:t>
+        <w:br/>
+        <w:t xml:space="preserve">    List&lt;Dependency_Node__c&gt; nodes = [</w:t>
+        <w:br/>
+        <w:t xml:space="preserve">        SELECT Id FROM Dependency_Node__c</w:t>
+        <w:br/>
+        <w:t xml:space="preserve">        WHERE Dependency_Job__c = :job.Id LIMIT 9000</w:t>
+        <w:br/>
+        <w:t xml:space="preserve">    ];</w:t>
+        <w:br/>
+        <w:t xml:space="preserve">    while (!nodes.isEmpty()) {</w:t>
+        <w:br/>
+        <w:t xml:space="preserve">        delete nodes;</w:t>
+        <w:br/>
+        <w:t xml:space="preserve">        nodes = [SELECT Id FROM Dependency_Node__c</w:t>
+        <w:br/>
+        <w:t xml:space="preserve">                 WHERE Dependency_Job__c = :job.Id LIMIT 9000];</w:t>
+        <w:br/>
+        <w:t xml:space="preserve">    }</w:t>
+        <w:br/>
+        <w:t xml:space="preserve">    delete job; // explicit, not cascade</w:t>
+        <w:br/>
+        <w:t>}</w:t>
+      </w:r>
+    </w:p>
+    <w:p>
+      <w:pPr>
+        <w:spacing w:before="60" w:after="120"/>
+        <w:ind w:left="283"/>
+        <w:shd w:val="clear" w:color="auto" w:fill="FDECEA"/>
+      </w:pPr>
+      <w:r>
+        <w:rPr>
+          <w:i/>
+          <w:color w:val="032D60"/>
+          <w:sz w:val="19"/>
+        </w:rPr>
+        <w:t>Batch scope MUST be 1. Implicit cascade of a 15k-node job in one execute() call exceeds the 10,001 DML row limit.</w:t>
       </w:r>
     </w:p>
     <w:p>
@@ -5005,7 +5312,7 @@
           <w:color w:val="181818"/>
           <w:sz w:val="21"/>
         </w:rPr>
-        <w:t>MetadataComponentDependency does not track 5 static dependency categories (supplemental handlers fill these) plus 1 permanent blind spot (dynamic Apex - cannot be resolved by any query).</w:t>
+        <w:t>MetadataComponentDependency does not track 5 static dependency categories. Supplemental handlers fill these. Confidence scores are deterministic and fixed per handler.</w:t>
       </w:r>
     </w:p>
     <w:tbl>
@@ -5016,16 +5323,15 @@
         <w:tblLook w:firstColumn="1" w:firstRow="1" w:lastColumn="0" w:lastRow="0" w:noHBand="0" w:noVBand="1" w:val="04A0"/>
       </w:tblPr>
       <w:tblGrid>
-        <w:gridCol w:w="1813"/>
-        <w:gridCol w:w="1813"/>
-        <w:gridCol w:w="1813"/>
-        <w:gridCol w:w="1813"/>
-        <w:gridCol w:w="1813"/>
+        <w:gridCol w:w="2266"/>
+        <w:gridCol w:w="2266"/>
+        <w:gridCol w:w="2266"/>
+        <w:gridCol w:w="2266"/>
       </w:tblGrid>
       <w:tr>
         <w:tc>
           <w:tcPr>
-            <w:tcW w:type="dxa" w:w="1813"/>
+            <w:tcW w:type="dxa" w:w="2266"/>
             <w:shd w:val="clear" w:color="auto" w:fill="032D60"/>
           </w:tcPr>
           <w:p>
@@ -5041,7 +5347,7 @@
         </w:tc>
         <w:tc>
           <w:tcPr>
-            <w:tcW w:type="dxa" w:w="1813"/>
+            <w:tcW w:type="dxa" w:w="2266"/>
             <w:shd w:val="clear" w:color="auto" w:fill="032D60"/>
           </w:tcPr>
           <w:p>
@@ -5057,7 +5363,7 @@
         </w:tc>
         <w:tc>
           <w:tcPr>
-            <w:tcW w:type="dxa" w:w="1813"/>
+            <w:tcW w:type="dxa" w:w="2266"/>
             <w:shd w:val="clear" w:color="auto" w:fill="032D60"/>
           </w:tcPr>
           <w:p>
@@ -5073,7 +5379,7 @@
         </w:tc>
         <w:tc>
           <w:tcPr>
-            <w:tcW w:type="dxa" w:w="1813"/>
+            <w:tcW w:type="dxa" w:w="2266"/>
             <w:shd w:val="clear" w:color="auto" w:fill="032D60"/>
           </w:tcPr>
           <w:p>
@@ -5083,23 +5389,7 @@
                 <w:color w:val="FFFFFF"/>
                 <w:sz w:val="20"/>
               </w:rPr>
-              <w:t>Solvable?</w:t>
-            </w:r>
-          </w:p>
-        </w:tc>
-        <w:tc>
-          <w:tcPr>
-            <w:tcW w:type="dxa" w:w="1813"/>
-            <w:shd w:val="clear" w:color="auto" w:fill="032D60"/>
-          </w:tcPr>
-          <w:p>
-            <w:r>
-              <w:rPr>
-                <w:b/>
-                <w:color w:val="FFFFFF"/>
-                <w:sz w:val="20"/>
-              </w:rPr>
-              <w:t>Confidence Range</w:t>
+              <w:t>Confidence</w:t>
             </w:r>
           </w:p>
         </w:tc>
@@ -5107,7 +5397,7 @@
       <w:tr>
         <w:tc>
           <w:tcPr>
-            <w:tcW w:type="dxa" w:w="1813"/>
+            <w:tcW w:type="dxa" w:w="2266"/>
             <w:shd w:val="clear" w:color="auto" w:fill="F2F4F7"/>
           </w:tcPr>
           <w:p>
@@ -5122,7 +5412,7 @@
         </w:tc>
         <w:tc>
           <w:tcPr>
-            <w:tcW w:type="dxa" w:w="1813"/>
+            <w:tcW w:type="dxa" w:w="2266"/>
             <w:shd w:val="clear" w:color="auto" w:fill="F2F4F7"/>
           </w:tcPr>
           <w:p>
@@ -5137,7 +5427,7 @@
         </w:tc>
         <w:tc>
           <w:tcPr>
-            <w:tcW w:type="dxa" w:w="1813"/>
+            <w:tcW w:type="dxa" w:w="2266"/>
             <w:shd w:val="clear" w:color="auto" w:fill="F2F4F7"/>
           </w:tcPr>
           <w:p>
@@ -5152,7 +5442,7 @@
         </w:tc>
         <w:tc>
           <w:tcPr>
-            <w:tcW w:type="dxa" w:w="1813"/>
+            <w:tcW w:type="dxa" w:w="2266"/>
             <w:shd w:val="clear" w:color="auto" w:fill="F2F4F7"/>
           </w:tcPr>
           <w:p>
@@ -5161,22 +5451,7 @@
                 <w:color w:val="181818"/>
                 <w:sz w:val="20"/>
               </w:rPr>
-              <w:t>Yes</w:t>
-            </w:r>
-          </w:p>
-        </w:tc>
-        <w:tc>
-          <w:tcPr>
-            <w:tcW w:type="dxa" w:w="1813"/>
-            <w:shd w:val="clear" w:color="auto" w:fill="F2F4F7"/>
-          </w:tcPr>
-          <w:p>
-            <w:r>
-              <w:rPr>
-                <w:color w:val="181818"/>
-                <w:sz w:val="20"/>
-              </w:rPr>
-              <w:t>90-100</w:t>
+              <w:t>95</w:t>
             </w:r>
           </w:p>
         </w:tc>
@@ -5184,7 +5459,7 @@
       <w:tr>
         <w:tc>
           <w:tcPr>
-            <w:tcW w:type="dxa" w:w="1813"/>
+            <w:tcW w:type="dxa" w:w="2266"/>
             <w:shd w:val="clear" w:color="auto" w:fill="FFFFFF"/>
           </w:tcPr>
           <w:p>
@@ -5199,7 +5474,7 @@
         </w:tc>
         <w:tc>
           <w:tcPr>
-            <w:tcW w:type="dxa" w:w="1813"/>
+            <w:tcW w:type="dxa" w:w="2266"/>
             <w:shd w:val="clear" w:color="auto" w:fill="FFFFFF"/>
           </w:tcPr>
           <w:p>
@@ -5214,7 +5489,7 @@
         </w:tc>
         <w:tc>
           <w:tcPr>
-            <w:tcW w:type="dxa" w:w="1813"/>
+            <w:tcW w:type="dxa" w:w="2266"/>
             <w:shd w:val="clear" w:color="auto" w:fill="FFFFFF"/>
           </w:tcPr>
           <w:p>
@@ -5229,7 +5504,7 @@
         </w:tc>
         <w:tc>
           <w:tcPr>
-            <w:tcW w:type="dxa" w:w="1813"/>
+            <w:tcW w:type="dxa" w:w="2266"/>
             <w:shd w:val="clear" w:color="auto" w:fill="FFFFFF"/>
           </w:tcPr>
           <w:p>
@@ -5238,22 +5513,7 @@
                 <w:color w:val="181818"/>
                 <w:sz w:val="20"/>
               </w:rPr>
-              <w:t>Yes</w:t>
-            </w:r>
-          </w:p>
-        </w:tc>
-        <w:tc>
-          <w:tcPr>
-            <w:tcW w:type="dxa" w:w="1813"/>
-            <w:shd w:val="clear" w:color="auto" w:fill="FFFFFF"/>
-          </w:tcPr>
-          <w:p>
-            <w:r>
-              <w:rPr>
-                <w:color w:val="181818"/>
-                <w:sz w:val="20"/>
-              </w:rPr>
-              <w:t>60-80</w:t>
+              <w:t>65</w:t>
             </w:r>
           </w:p>
         </w:tc>
@@ -5261,7 +5521,7 @@
       <w:tr>
         <w:tc>
           <w:tcPr>
-            <w:tcW w:type="dxa" w:w="1813"/>
+            <w:tcW w:type="dxa" w:w="2266"/>
             <w:shd w:val="clear" w:color="auto" w:fill="F2F4F7"/>
           </w:tcPr>
           <w:p>
@@ -5276,7 +5536,7 @@
         </w:tc>
         <w:tc>
           <w:tcPr>
-            <w:tcW w:type="dxa" w:w="1813"/>
+            <w:tcW w:type="dxa" w:w="2266"/>
             <w:shd w:val="clear" w:color="auto" w:fill="F2F4F7"/>
           </w:tcPr>
           <w:p>
@@ -5291,7 +5551,7 @@
         </w:tc>
         <w:tc>
           <w:tcPr>
-            <w:tcW w:type="dxa" w:w="1813"/>
+            <w:tcW w:type="dxa" w:w="2266"/>
             <w:shd w:val="clear" w:color="auto" w:fill="F2F4F7"/>
           </w:tcPr>
           <w:p>
@@ -5306,7 +5566,7 @@
         </w:tc>
         <w:tc>
           <w:tcPr>
-            <w:tcW w:type="dxa" w:w="1813"/>
+            <w:tcW w:type="dxa" w:w="2266"/>
             <w:shd w:val="clear" w:color="auto" w:fill="F2F4F7"/>
           </w:tcPr>
           <w:p>
@@ -5315,22 +5575,7 @@
                 <w:color w:val="181818"/>
                 <w:sz w:val="20"/>
               </w:rPr>
-              <w:t>Yes</w:t>
-            </w:r>
-          </w:p>
-        </w:tc>
-        <w:tc>
-          <w:tcPr>
-            <w:tcW w:type="dxa" w:w="1813"/>
-            <w:shd w:val="clear" w:color="auto" w:fill="F2F4F7"/>
-          </w:tcPr>
-          <w:p>
-            <w:r>
-              <w:rPr>
-                <w:color w:val="181818"/>
-                <w:sz w:val="20"/>
-              </w:rPr>
-              <w:t>50-75</w:t>
+              <w:t>60</w:t>
             </w:r>
           </w:p>
         </w:tc>
@@ -5338,7 +5583,7 @@
       <w:tr>
         <w:tc>
           <w:tcPr>
-            <w:tcW w:type="dxa" w:w="1813"/>
+            <w:tcW w:type="dxa" w:w="2266"/>
             <w:shd w:val="clear" w:color="auto" w:fill="FFFFFF"/>
           </w:tcPr>
           <w:p>
@@ -5353,7 +5598,7 @@
         </w:tc>
         <w:tc>
           <w:tcPr>
-            <w:tcW w:type="dxa" w:w="1813"/>
+            <w:tcW w:type="dxa" w:w="2266"/>
             <w:shd w:val="clear" w:color="auto" w:fill="FFFFFF"/>
           </w:tcPr>
           <w:p>
@@ -5368,7 +5613,7 @@
         </w:tc>
         <w:tc>
           <w:tcPr>
-            <w:tcW w:type="dxa" w:w="1813"/>
+            <w:tcW w:type="dxa" w:w="2266"/>
             <w:shd w:val="clear" w:color="auto" w:fill="FFFFFF"/>
           </w:tcPr>
           <w:p>
@@ -5383,7 +5628,7 @@
         </w:tc>
         <w:tc>
           <w:tcPr>
-            <w:tcW w:type="dxa" w:w="1813"/>
+            <w:tcW w:type="dxa" w:w="2266"/>
             <w:shd w:val="clear" w:color="auto" w:fill="FFFFFF"/>
           </w:tcPr>
           <w:p>
@@ -5392,22 +5637,7 @@
                 <w:color w:val="181818"/>
                 <w:sz w:val="20"/>
               </w:rPr>
-              <w:t>Yes</w:t>
-            </w:r>
-          </w:p>
-        </w:tc>
-        <w:tc>
-          <w:tcPr>
-            <w:tcW w:type="dxa" w:w="1813"/>
-            <w:shd w:val="clear" w:color="auto" w:fill="FFFFFF"/>
-          </w:tcPr>
-          <w:p>
-            <w:r>
-              <w:rPr>
-                <w:color w:val="181818"/>
-                <w:sz w:val="20"/>
-              </w:rPr>
-              <w:t>80-95</w:t>
+              <w:t>85</w:t>
             </w:r>
           </w:p>
         </w:tc>
@@ -5415,7 +5645,7 @@
       <w:tr>
         <w:tc>
           <w:tcPr>
-            <w:tcW w:type="dxa" w:w="1813"/>
+            <w:tcW w:type="dxa" w:w="2266"/>
             <w:shd w:val="clear" w:color="auto" w:fill="F2F4F7"/>
           </w:tcPr>
           <w:p>
@@ -5430,7 +5660,7 @@
         </w:tc>
         <w:tc>
           <w:tcPr>
-            <w:tcW w:type="dxa" w:w="1813"/>
+            <w:tcW w:type="dxa" w:w="2266"/>
             <w:shd w:val="clear" w:color="auto" w:fill="F2F4F7"/>
           </w:tcPr>
           <w:p>
@@ -5445,7 +5675,7 @@
         </w:tc>
         <w:tc>
           <w:tcPr>
-            <w:tcW w:type="dxa" w:w="1813"/>
+            <w:tcW w:type="dxa" w:w="2266"/>
             <w:shd w:val="clear" w:color="auto" w:fill="F2F4F7"/>
           </w:tcPr>
           <w:p>
@@ -5460,7 +5690,7 @@
         </w:tc>
         <w:tc>
           <w:tcPr>
-            <w:tcW w:type="dxa" w:w="1813"/>
+            <w:tcW w:type="dxa" w:w="2266"/>
             <w:shd w:val="clear" w:color="auto" w:fill="F2F4F7"/>
           </w:tcPr>
           <w:p>
@@ -5469,22 +5699,7 @@
                 <w:color w:val="181818"/>
                 <w:sz w:val="20"/>
               </w:rPr>
-              <w:t>Yes</w:t>
-            </w:r>
-          </w:p>
-        </w:tc>
-        <w:tc>
-          <w:tcPr>
-            <w:tcW w:type="dxa" w:w="1813"/>
-            <w:shd w:val="clear" w:color="auto" w:fill="F2F4F7"/>
-          </w:tcPr>
-          <w:p>
-            <w:r>
-              <w:rPr>
-                <w:color w:val="181818"/>
-                <w:sz w:val="20"/>
-              </w:rPr>
-              <w:t>90-100</w:t>
+              <w:t>95</w:t>
             </w:r>
           </w:p>
         </w:tc>
@@ -5492,7 +5707,7 @@
       <w:tr>
         <w:tc>
           <w:tcPr>
-            <w:tcW w:type="dxa" w:w="1813"/>
+            <w:tcW w:type="dxa" w:w="2266"/>
             <w:shd w:val="clear" w:color="auto" w:fill="FFFFFF"/>
           </w:tcPr>
           <w:p>
@@ -5507,7 +5722,7 @@
         </w:tc>
         <w:tc>
           <w:tcPr>
-            <w:tcW w:type="dxa" w:w="1813"/>
+            <w:tcW w:type="dxa" w:w="2266"/>
             <w:shd w:val="clear" w:color="auto" w:fill="FFFFFF"/>
           </w:tcPr>
           <w:p>
@@ -5522,7 +5737,7 @@
         </w:tc>
         <w:tc>
           <w:tcPr>
-            <w:tcW w:type="dxa" w:w="1813"/>
+            <w:tcW w:type="dxa" w:w="2266"/>
             <w:shd w:val="clear" w:color="auto" w:fill="FFFFFF"/>
           </w:tcPr>
           <w:p>
@@ -5531,28 +5746,13 @@
                 <w:color w:val="181818"/>
                 <w:sz w:val="20"/>
               </w:rPr>
-              <w:t>Flag Is_Dynamic_Reference__c = true</w:t>
-            </w:r>
-          </w:p>
-        </w:tc>
-        <w:tc>
-          <w:tcPr>
-            <w:tcW w:type="dxa" w:w="1813"/>
-            <w:shd w:val="clear" w:color="auto" w:fill="FFFFFF"/>
-          </w:tcPr>
-          <w:p>
-            <w:r>
-              <w:rPr>
-                <w:color w:val="181818"/>
-                <w:sz w:val="20"/>
-              </w:rPr>
-              <w:t>NO - permanent blind spot</w:t>
-            </w:r>
-          </w:p>
-        </w:tc>
-        <w:tc>
-          <w:tcPr>
-            <w:tcW w:type="dxa" w:w="1813"/>
+              <w:t>Flag Is_Dynamic_Reference__c = true - PERMANENT BLIND SPOT</w:t>
+            </w:r>
+          </w:p>
+        </w:tc>
+        <w:tc>
+          <w:tcPr>
+            <w:tcW w:type="dxa" w:w="2266"/>
             <w:shd w:val="clear" w:color="auto" w:fill="FFFFFF"/>
           </w:tcPr>
           <w:p>
@@ -5580,7 +5780,7 @@
           <w:color w:val="032D60"/>
           <w:sz w:val="19"/>
         </w:rPr>
-        <w:t>Supplemental_Confidence__c &lt; 70 triggers a warning badge in the UI. These results require manual verification - they are leads, not confirmed dependencies.</w:t>
+        <w:t>Scores below 70 trigger a warning badge in the UI. These results require manual verification - treat as leads, not confirmed dependencies. Scores must not be adjusted without updating this table.</w:t>
       </w:r>
     </w:p>
     <w:p>
@@ -5863,7 +6063,7 @@
                 <w:color w:val="181818"/>
                 <w:sz w:val="20"/>
               </w:rPr>
-              <w:t>~100 IDs initial; split when estimated SOQL string &gt; 8KB URI budget</w:t>
+              <w:t>~100 IDs initial; split when estimated SOQL &gt; 8KB URI budget</w:t>
             </w:r>
           </w:p>
         </w:tc>
@@ -5927,7 +6127,7 @@
                 <w:color w:val="181818"/>
                 <w:sz w:val="20"/>
               </w:rPr>
-              <w:t>Split batch in half, retry both halves; do not fail job; log to Error_Message__c</w:t>
+              <w:t>Split batch in half, retry both halves; log to Error_Message__c; do not fail job</w:t>
             </w:r>
           </w:p>
         </w:tc>
@@ -5959,7 +6159,7 @@
                 <w:color w:val="181818"/>
                 <w:sz w:val="20"/>
               </w:rPr>
-              <w:t>SELECT Id FROM Flow WHERE Id IN :ids AND Status = Active (extra callout; triggers headroom increase)</w:t>
+              <w:t>SELECT Id FROM Flow WHERE Id IN :ids AND Status = Active (extra callout; counted in headroom)</w:t>
             </w:r>
           </w:p>
         </w:tc>
@@ -6124,7 +6324,7 @@
                 <w:color w:val="181818"/>
                 <w:sz w:val="20"/>
               </w:rPr>
-              <w:t>Applied ONLY at @AuraEnabled controller boundary for user-facing data access</w:t>
+              <w:t>Applied ONLY at @AuraEnabled controller boundary</w:t>
             </w:r>
           </w:p>
         </w:tc>
@@ -6156,7 +6356,7 @@
                 <w:color w:val="181818"/>
                 <w:sz w:val="20"/>
               </w:rPr>
-              <w:t>Queueable engine, cleanup batch, notification service - reliable internal orchestration</w:t>
+              <w:t>Queueable engine, cleanup batch, notification service</w:t>
             </w:r>
           </w:p>
         </w:tc>
@@ -6797,7 +6997,7 @@
                 <w:color w:val="FFFFFF"/>
                 <w:sz w:val="20"/>
               </w:rPr>
-              <w:t>Tooltip / Meaning</w:t>
+              <w:t>Meaning</w:t>
             </w:r>
           </w:p>
         </w:tc>
@@ -6844,7 +7044,7 @@
                 <w:color w:val="181818"/>
                 <w:sz w:val="20"/>
               </w:rPr>
-              <w:t>True cycle: this node appears in its own ancestor path</w:t>
+              <w:t>True cycle: this node appears in its own ancestor path. Context_Data__c.cycleClosesAt shows where.</w:t>
             </w:r>
           </w:p>
         </w:tc>
@@ -7053,20 +7253,6 @@
         <w:t>9.3 Graph Density Control</w:t>
       </w:r>
     </w:p>
-    <w:p>
-      <w:pPr>
-        <w:spacing w:after="80"/>
-      </w:pPr>
-      <w:r>
-        <w:rPr>
-          <w:b w:val="0"/>
-          <w:i w:val="0"/>
-          <w:color w:val="181818"/>
-          <w:sz w:val="21"/>
-        </w:rPr>
-        <w:t>metaMapperGraph renders first 3 levels by default to prevent browser performance issues on large scans (5,000+ nodes).</w:t>
-      </w:r>
-    </w:p>
     <w:tbl>
       <w:tblPr>
         <w:tblStyle w:val="TableGrid"/>
@@ -7171,7 +7357,7 @@
                 <w:color w:val="181818"/>
                 <w:sz w:val="20"/>
               </w:rPr>
-              <w:t>Reveals complete tree; user assumes performance responsibility</w:t>
+              <w:t>Reveals complete tree on user request</w:t>
             </w:r>
           </w:p>
         </w:tc>
@@ -7203,7 +7389,7 @@
                 <w:color w:val="181818"/>
                 <w:sz w:val="20"/>
               </w:rPr>
-              <w:t>Slider or dropdown: "Show levels 0-N"</w:t>
+              <w:t>Slider or dropdown to set visible depth</w:t>
             </w:r>
           </w:p>
         </w:tc>
@@ -7235,7 +7421,7 @@
                 <w:color w:val="181818"/>
                 <w:sz w:val="20"/>
               </w:rPr>
-              <w:t>Toggle visibility by Metadata_Type__c (existing feature)</w:t>
+              <w:t>Toggle visibility by Metadata_Type__c</w:t>
             </w:r>
           </w:p>
         </w:tc>
@@ -7360,7 +7546,7 @@
                 <w:color w:val="181818"/>
                 <w:sz w:val="20"/>
               </w:rPr>
-              <w:t>Nested tree with Context_Data__c pills and Supplemental_Confidence__c</w:t>
+              <w:t>Nested tree with Context_Data__c pills (including cycleClosesAt on circular nodes)</w:t>
             </w:r>
           </w:p>
         </w:tc>
@@ -7525,7 +7711,7 @@
                 <w:color w:val="181818"/>
                 <w:sz w:val="20"/>
               </w:rPr>
-              <w:t>createJob(jobId, activeFlowsOnly) with async context guard; getObjectList(); getJobStatus(); getNodeHierarchy(); cancelJob()</w:t>
+              <w:t>createJob(jobId, activeFlowsOnly) with async context guard; cancelJob(); getObjectList(); getJobStatus(); getNodeHierarchy()</w:t>
             </w:r>
           </w:p>
         </w:tc>
@@ -7713,7 +7899,7 @@
                 <w:color w:val="181818"/>
                 <w:sz w:val="20"/>
               </w:rPr>
-              <w:t>WorkflowFieldUpdate, ValidationRule regex, FlexiPage XML, CMT lookups, Lookup relationships; sets Supplemental_Confidence__c</w:t>
+              <w:t>WorkflowFieldUpdate (95), ValidationRule regex (65), FlexiPage XML (60), CMT lookups (85), Lookup relationships (95)</w:t>
             </w:r>
           </w:p>
         </w:tc>
@@ -7760,7 +7946,7 @@
                 <w:color w:val="181818"/>
                 <w:sz w:val="20"/>
               </w:rPr>
-              <w:t>CMT references; flags Is_Dynamic_Reference__c; sets Supplemental_Confidence__c</w:t>
+              <w:t>CMT references (85); flags Is_Dynamic_Reference__c</w:t>
             </w:r>
           </w:p>
         </w:tc>
@@ -7807,7 +7993,7 @@
                 <w:color w:val="181818"/>
                 <w:sz w:val="20"/>
               </w:rPr>
-              <w:t>QuickActionDefinition, subflows, WebLink URLs; sets Supplemental_Confidence__c</w:t>
+              <w:t>QuickActionDefinition, subflows, WebLink URLs</w:t>
             </w:r>
           </w:p>
         </w:tc>
@@ -7854,7 +8040,7 @@
                 <w:color w:val="181818"/>
                 <w:sz w:val="20"/>
               </w:rPr>
-              <w:t>Constructor: (jobId, activeFlowsOnly). Check cancel; read CMDT settings; targeted dedup query; two-tier cycle detection; callouts; handlers; four-limit guardrail; self-chain</w:t>
+              <w:t>Savepoint/catch; cancel check; CMDT read; pre-batch + mid-loop five-limit guardrail; scoped dedup; two-tier cycle; callouts; handlers; one PE event per execution; self-chain</w:t>
             </w:r>
           </w:p>
         </w:tc>
@@ -7948,7 +8134,7 @@
                 <w:color w:val="181818"/>
                 <w:sz w:val="20"/>
               </w:rPr>
-              <w:t>Hard-deletes jobs older than MetaMapper_Settings__mdt.Retention_Hours__c</w:t>
+              <w:t>Scope = 1. Deletes nodes in 9k chunks then parent. Filter: Closed_At__c &lt; threshold AND Status IN closed values.</w:t>
             </w:r>
           </w:p>
         </w:tc>
@@ -8110,7 +8296,7 @@
                 <w:color w:val="181818"/>
                 <w:sz w:val="20"/>
               </w:rPr>
-              <w:t>Valid create; missing params; FLS enforcement; typeahead; cancelJob() sets Cancelled; async context guard throws exception when called from Queueable/Batch/Future</w:t>
+              <w:t>Valid create; missing params; FLS enforcement; typeahead; cancelJob() sets Cancelled + Closed_At__c; async context guard throws from Queueable/Batch/Future context</w:t>
             </w:r>
           </w:p>
         </w:tc>
@@ -8142,7 +8328,7 @@
                 <w:color w:val="181818"/>
                 <w:sz w:val="20"/>
               </w:rPr>
-              <w:t>100-ID initial chunk; char-budget split; QueryMore multi-page; HTTP 414 split; Flow filter; buildContextData() per type; setConfidence() output range</w:t>
+              <w:t>100-ID initial chunk; char-budget split; QueryMore multi-page; HTTP 414 split; Flow filter; buildContextData() per type; setConfidence() produces expected scores</w:t>
             </w:r>
           </w:p>
         </w:tc>
@@ -8174,7 +8360,7 @@
                 <w:color w:val="181818"/>
                 <w:sz w:val="20"/>
               </w:rPr>
-              <w:t>Normal traversal; diamond graph (shared dep NOT flagged circular); true cycle (A-&gt;B-&gt;A flagged circular); cancel check on entry; four-limit guardrail (callout, DML, heap, CPU); Completed + Summary_JSON__c; Failed on callout exception; partial chain resume; batch size reads from CMDT</w:t>
+              <w:t>Normal traversal; diamond graph (shared dep NOT flagged circular); true cycle (A-&gt;B-&gt;A flagged, Path__c kept); cancel check on entry; pre-batch + mid-loop guardrail (callout, DML, heap, CPU, query rows); savepoint rollback + Failed status persists; Completed + Summary_JSON__c + Closed_At__c; CMDT batch size used</w:t>
             </w:r>
           </w:p>
         </w:tc>
@@ -8206,7 +8392,7 @@
                 <w:color w:val="181818"/>
                 <w:sz w:val="20"/>
               </w:rPr>
-              <w:t>Reads Retention_Hours__c from CMDT; deletes beyond threshold; preserves recent records; empty batch</w:t>
+              <w:t>Reads Retention_Hours__c from CMDT; uses Closed_At__c not CreatedDate; does not delete Processing/Initializing jobs; deletes nodes in chunks before parent; empty batch no error; scope = 1</w:t>
             </w:r>
           </w:p>
         </w:tc>
@@ -8238,7 +8424,7 @@
                 <w:color w:val="181818"/>
                 <w:sz w:val="20"/>
               </w:rPr>
-              <w:t>WorkflowFieldUpdate hit; ValidationRule regex match; Supplemental_Confidence__c within expected range; no results</w:t>
+              <w:t>WorkflowFieldUpdate hit (confidence 95); ValidationRule regex match (confidence 65); FlexiPage XML parse (confidence 60); no results</w:t>
             </w:r>
           </w:p>
         </w:tc>
@@ -8270,7 +8456,7 @@
                 <w:color w:val="181818"/>
                 <w:sz w:val="20"/>
               </w:rPr>
-              <w:t>CMT record field match; dynamic reference flagged Is_Dynamic_Reference__c; Supplemental_Confidence__c set</w:t>
+              <w:t>CMT record field match (confidence 85); dynamic reference flagged Is_Dynamic_Reference__c</w:t>
             </w:r>
           </w:p>
         </w:tc>
@@ -8334,7 +8520,7 @@
                 <w:color w:val="181818"/>
                 <w:sz w:val="20"/>
               </w:rPr>
-              <w:t>USER_MODE failures at controller boundary when user lacks CRUD; engine operations succeed in SYSTEM_MODE regardless</w:t>
+              <w:t>USER_MODE failures at controller boundary when user lacks CRUD; engine SYSTEM_MODE operations succeed regardless</w:t>
             </w:r>
           </w:p>
         </w:tc>
@@ -8366,7 +8552,7 @@
                 <w:color w:val="181818"/>
                 <w:sz w:val="20"/>
               </w:rPr>
-              <w:t>Confidence column in CSV; duplicate node not exported twice; circular node marked correctly; Level__c drives density filter in JS</w:t>
+              <w:t>Confidence column in CSV; cycleClosesAt in JSON; circular node kept in export with Path__c; Level__c drives density filter in JS</w:t>
             </w:r>
           </w:p>
         </w:tc>
@@ -8499,7 +8685,7 @@
                 <w:color w:val="181818"/>
                 <w:sz w:val="20"/>
               </w:rPr>
-              <w:t>cp node_modules/echarts/dist/echarts.min.js force-app/main/default/staticresources/ECharts.resource</w:t>
+              <w:t>setup/build-static.sh  OR  cp node_modules/echarts/dist/echarts.min.js force-app/main/default/staticresources/ECharts.resource</w:t>
             </w:r>
           </w:p>
         </w:tc>
@@ -8723,28 +8909,13 @@
                 <w:color w:val="181818"/>
                 <w:sz w:val="20"/>
               </w:rPr>
-              <w:t>Tune MetaMapper_Settings__mdt: Retention_Hours__c, Batch_Size__c, Flow_Batch_Size__c for your org</w:t>
+              <w:t>Tune MetaMapper_Settings__mdt: Retention_Hours__c, Batch_Size__c, Flow_Batch_Size__c, Dml_Reserve_Rows__c</w:t>
             </w:r>
           </w:p>
         </w:tc>
       </w:tr>
     </w:tbl>
     <w:p/>
-    <w:p>
-      <w:pPr>
-        <w:spacing w:before="60" w:after="120"/>
-        <w:ind w:left="283"/>
-        <w:shd w:val="clear" w:color="auto" w:fill="EFF4FB"/>
-      </w:pPr>
-      <w:r>
-        <w:rPr>
-          <w:i/>
-          <w:color w:val="032D60"/>
-          <w:sz w:val="19"/>
-        </w:rPr>
-        <w:t>A build-static.sh helper script is provided in setup/ to automate the ECharts copy step for first-time contributors.</w:t>
-      </w:r>
-    </w:p>
     <w:p>
       <w:pPr>
         <w:pStyle w:val="Heading1"/>
@@ -8778,7 +8949,7 @@
           <w:color w:val="181818"/>
           <w:sz w:val="21"/>
         </w:rPr>
-        <w:t>Dynamic Apex string references are a permanent blind spot. No supplemental query can resolve them. They are flagged in the UI and documented - not a pending feature.</w:t>
+        <w:t>Dynamic Apex string references are a permanent blind spot. Flagged with Is_Dynamic_Reference__c = true. Cannot be resolved by any supplemental query.</w:t>
       </w:r>
     </w:p>
     <w:p>
@@ -8792,7 +8963,7 @@
           <w:color w:val="181818"/>
           <w:sz w:val="21"/>
         </w:rPr>
-        <w:t>Supplemental handler matches (ValidationRule regex, FlexiPage XML) are best-effort. Nodes with Supplemental_Confidence__c &lt; 70 require manual verification - treat as leads, not confirmed dependencies.</w:t>
+        <w:t>Supplemental handler matches are best-effort. Deterministic confidence scores (see Section 6). Nodes with score &lt; 70 show a warning badge and require manual verification.</w:t>
       </w:r>
     </w:p>
     <w:p>
@@ -8806,7 +8977,7 @@
           <w:color w:val="181818"/>
           <w:sz w:val="21"/>
         </w:rPr>
-        <w:t>Cancellation is cooperative. A Queueable in the flex queue checks Status__c on entry and exits cleanly. There is no force-kill mechanism in Salesforce.</w:t>
+        <w:t>DependencyCleanupBatch deletes child nodes in explicit 9k-row chunks to avoid the cascade DML trap. Implicit cascade is disabled by design.</w:t>
       </w:r>
     </w:p>
     <w:p>
@@ -8820,7 +8991,21 @@
           <w:color w:val="181818"/>
           <w:sz w:val="21"/>
         </w:rPr>
-        <w:t>createJob() must be called from a synchronous Lightning context. Invocation from Batch, Future, or Queueable contexts is blocked by the async context guard.</w:t>
+        <w:t>Cancellation is cooperative. Queueables already in the flex queue check Status__c on entry and exit cleanly. No force-kill mechanism exists in Salesforce.</w:t>
+      </w:r>
+    </w:p>
+    <w:p>
+      <w:pPr>
+        <w:pStyle w:val="ListBullet"/>
+        <w:spacing w:after="40"/>
+        <w:ind w:left="283"/>
+      </w:pPr>
+      <w:r>
+        <w:rPr>
+          <w:color w:val="181818"/>
+          <w:sz w:val="21"/>
+        </w:rPr>
+        <w:t>createJob() must be called from a synchronous Lightning context. Batch/Future/Queueable invocation is blocked by the async context guard.</w:t>
       </w:r>
     </w:p>
     <w:p>
@@ -8848,7 +9033,7 @@
           <w:color w:val="181818"/>
           <w:sz w:val="21"/>
         </w:rPr>
-        <w:t>Active Flows Only mode excludes inactive Flow versions by design and triggers an extra callout for Flow status validation per batch. Flow_Batch_Size__c defaults to 30 to compensate.</w:t>
+        <w:t>Active Flows Only mode excludes inactive Flow versions by design and triggers an extra callout per batch. Flow_Batch_Size__c defaults to 30 to compensate.</w:t>
       </w:r>
     </w:p>
     <w:p>
@@ -8891,6 +9076,20 @@
           <w:sz w:val="21"/>
         </w:rPr>
         <w:t>Graph Density control defaults to first 3 levels. "Expand All" on large scans (5,000+ nodes) may cause browser performance degradation on older hardware.</w:t>
+      </w:r>
+    </w:p>
+    <w:p>
+      <w:pPr>
+        <w:pStyle w:val="ListBullet"/>
+        <w:spacing w:after="40"/>
+        <w:ind w:left="283"/>
+      </w:pPr>
+      <w:r>
+        <w:rPr>
+          <w:color w:val="181818"/>
+          <w:sz w:val="21"/>
+        </w:rPr>
+        <w:t>Path__c String.contains() on deep trees (&gt;500 levels) is CPU-intensive inside the inner result loop. The mid-loop CPU guardrail (75%) catches this before the 10s limit is breached.</w:t>
       </w:r>
     </w:p>
     <w:sectPr>

</xml_diff>

<commit_message>
MetaMapper TDD v11.0 + CLAUDE.md v11 + global CLAUDE.md - spanning tree, cleanup chain, AISummaryQueueable, cursor expiry, heap 70%, delimiter-safe cycle, static settings, PE logging, tour version suffix, external review workflow, doc gen speed rules
</commit_message>
<xml_diff>
--- a/projects/meta-mapper/MetaMapper_Technical_Design.docx
+++ b/projects/meta-mapper/MetaMapper_Technical_Design.docx
@@ -38,7 +38,7 @@
           <w:color w:val="706E6B"/>
           <w:sz w:val="24"/>
         </w:rPr>
-        <w:t>Version 10.0 | April 2026</w:t>
+        <w:t>Version 11.0 | April 2026</w:t>
       </w:r>
     </w:p>
     <w:p/>
@@ -118,7 +118,7 @@
           <w:color w:val="181818"/>
           <w:sz w:val="21"/>
         </w:rPr>
-        <w:t>Version 10.0 is the final design iteration. Five rounds of architecture review and five rounds of UX expert review are incorporated. Grok UX rating on v9.0: 9.95/10 ("production masterpiece - ship it immediately").</w:t>
+        <w:t>Six rounds of architecture review and five rounds of UX expert review are incorporated across v4.0-v11.0. All critical risks have been resolved.</w:t>
       </w:r>
     </w:p>
     <w:p>
@@ -132,7 +132,7 @@
           <w:color w:val="0070D2"/>
           <w:sz w:val="21"/>
         </w:rPr>
-        <w:t>v10.0 polish: AI Summary Copilot fallback text, mobile panel close button, admin tour reset, graph search placeholder, export manifest tooltip, desktop-first framing, compact AI card, localStorage tour clarification.</w:t>
+        <w:t>v11.0 fixes: spanning tree model documented, concurrency guard selectivity, Node_Unique_Key__c widened to Text 80, Ancestor_Hashes__c renamed and algorithm clarified, two-class cleanup chain replacing inner while-loop, AISummaryQueueable offload, QueryMore cursor expiration handling, heap guardrail lowered to 70%, delimiter-safe cycle check, static settings cache, PE suppression logging, localStorage version suffix.</w:t>
       </w:r>
     </w:p>
     <w:p>
@@ -168,7 +168,7 @@
           <w:color w:val="181818"/>
           <w:sz w:val="21"/>
         </w:rPr>
-        <w:t>Sections 2.1-2.39 cover v4.0-v8.0 fixes. Sections 2.40-2.48 cover v9.0. Sections 2.49-2.55 cover v10.0 polish.</w:t>
+        <w:t>Sections 2.1-2.39 cover v4.0-v8.0 fixes. Sections 2.40-2.48 cover v9.0. Sections 2.49-2.55 cover v10.0. Sections 2.56-2.70 cover v11.0.</w:t>
       </w:r>
     </w:p>
     <w:p>
@@ -818,7 +818,7 @@
           <w:color w:val="181818"/>
           <w:sz w:val="21"/>
         </w:rPr>
-        <w:t>See v5.0-v6.0 history. Extended and superseded by v7.0-v10.0 below.</w:t>
+        <w:t>See v5.0-v6.0 history. Extended and superseded by v7.0-v11.0 below.</w:t>
       </w:r>
     </w:p>
     <w:p>
@@ -861,7 +861,7 @@
           <w:color w:val="181818"/>
           <w:sz w:val="21"/>
         </w:rPr>
-        <w:t>Fix: Node_Chunk_Size__c CMDT (default 2,000). Explicit node delete before parent. Scope = 1.</w:t>
+        <w:t>Fix: Node_Chunk_Size__c CMDT (default 2,000). Two-class chained cleanup in v11.0 (Section 2.58).</w:t>
       </w:r>
     </w:p>
     <w:p>
@@ -1815,7 +1815,7 @@
           <w:color w:val="0070D2"/>
           <w:sz w:val="28"/>
         </w:rPr>
-        <w:t>2.31 Ancestors_Hash__c Long Text Fix (v8.0) - P0</w:t>
+        <w:t>2.31 Ancestor_Hashes__c - Long Text 32768 + Algorithm Clarified (v8.0/v11.0)</w:t>
       </w:r>
     </w:p>
     <w:p>
@@ -1830,7 +1830,7 @@
           <w:color w:val="032D60"/>
           <w:sz w:val="19"/>
         </w:rPr>
-        <w:t>Text 255 overflows at depth &gt; 42 (255 / 6 = 42 hashes). Silent StringException on upsert.</w:t>
+        <w:t>Field was Text 255 in early design - overflows at depth &gt; 42 (255 / 6 = 42 hashes). Silent StringException on upsert. Also renamed from Ancestors_Hash__c (v11.0) - previous name implied a probabilistic bloom filter which is misleading.</w:t>
       </w:r>
     </w:p>
     <w:p>
@@ -1844,7 +1844,7 @@
           <w:color w:val="181818"/>
           <w:sz w:val="21"/>
         </w:rPr>
-        <w:t>Fix: Ancestors_Hash__c = Long Text 32768.</w:t>
+        <w:t>Fix: Ancestor_Hashes__c = Long Text 32768. Algorithm: concatenate 6-char base64url hash prefix per ancestor ID. Use contains(shortHash) as a fast shortcut; always confirm with full delimiter-safe Path__c check before marking circular.</w:t>
       </w:r>
     </w:p>
     <w:p>
@@ -1858,7 +1858,7 @@
           <w:color w:val="0070D2"/>
           <w:sz w:val="28"/>
         </w:rPr>
-        <w:t>2.32 Cleanup Chunk Size - Open-Source Safety (v8.0) - P0</w:t>
+        <w:t>2.32 Cleanup Chunk Size - Open-Source Safety (v8.0)</w:t>
       </w:r>
     </w:p>
     <w:p>
@@ -1901,7 +1901,22 @@
           <w:color w:val="0070D2"/>
           <w:sz w:val="28"/>
         </w:rPr>
-        <w:t>2.33 Concurrency Guard (v8.0)</w:t>
+        <w:t>2.33 Concurrency Guard - Selectivity Fix (v8.0/v11.0)</w:t>
+      </w:r>
+    </w:p>
+    <w:p>
+      <w:pPr>
+        <w:spacing w:before="60" w:after="120"/>
+        <w:ind w:left="283"/>
+        <w:shd w:val="clear" w:color="auto" w:fill="FDECEA"/>
+      </w:pPr>
+      <w:r>
+        <w:rPr>
+          <w:i/>
+          <w:color w:val="032D60"/>
+          <w:sz w:val="19"/>
+        </w:rPr>
+        <w:t>Original query lacked ApexClass.Name filter. On LDV orgs AsyncApexJob holds millions of rows - non-selective query risk. Also: SELECT COUNT() is not an atomic lock - acknowledged as advisory control.</w:t>
       </w:r>
     </w:p>
     <w:p>
@@ -1918,9 +1933,30 @@
         </w:rPr>
         <w:t>Integer active = [SELECT COUNT() FROM AsyncApexJob</w:t>
         <w:br/>
-        <w:t xml:space="preserve">    WHERE JobType='Queueable' AND Status IN ('Processing','Preparing')];</w:t>
+        <w:t xml:space="preserve">    WHERE JobType='Queueable'</w:t>
         <w:br/>
-        <w:t>if (active &gt;= settings.Max_Concurrent_Jobs__c) throw new DependencyJobException('Scan in progress.');</w:t>
+        <w:t xml:space="preserve">    AND ApexClass.Name = 'DependencyQueueable'</w:t>
+        <w:br/>
+        <w:t xml:space="preserve">    AND Status IN ('Processing','Preparing')];</w:t>
+        <w:br/>
+        <w:t>if (active &gt;= (Integer)settings.Max_Concurrent_Jobs__c)</w:t>
+        <w:br/>
+        <w:t xml:space="preserve">    throw new DependencyJobException('Another scan is in progress.');</w:t>
+      </w:r>
+    </w:p>
+    <w:p>
+      <w:pPr>
+        <w:spacing w:before="60" w:after="120"/>
+        <w:ind w:left="283"/>
+        <w:shd w:val="clear" w:color="auto" w:fill="EFF4FB"/>
+      </w:pPr>
+      <w:r>
+        <w:rPr>
+          <w:i/>
+          <w:color w:val="032D60"/>
+          <w:sz w:val="19"/>
+        </w:rPr>
+        <w:t>Advisory: two simultaneous createJob() calls can both pass the check before either job is enqueued. For an admin tool this race window is near-zero in practice. Route through DependencyJobSelector.countActiveQueueables().</w:t>
       </w:r>
     </w:p>
     <w:p>
@@ -1948,7 +1984,7 @@
           <w:color w:val="181818"/>
           <w:sz w:val="21"/>
         </w:rPr>
-        <w:t>OrgLimits check before publish. Auto-suppress + flip Disable_PE__c if &gt; 80% daily PE consumed.</w:t>
+        <w:t>OrgLimits check before publish. Auto-suppress + flip Disable_PE__c if &gt; 80% daily PE consumed. Append suppression notice to Error_Message__c for admin visibility (v11.0).</w:t>
       </w:r>
     </w:p>
     <w:p>
@@ -1962,7 +1998,7 @@
           <w:color w:val="0070D2"/>
           <w:sz w:val="28"/>
         </w:rPr>
-        <w:t>2.35 AI_Summary__c Field (v8.0)</w:t>
+        <w:t>2.35 AI_Summary__c Field + AISummaryQueueable (v8.0/v11.0)</w:t>
       </w:r>
     </w:p>
     <w:p>
@@ -1976,7 +2012,7 @@
           <w:color w:val="181818"/>
           <w:sz w:val="21"/>
         </w:rPr>
-        <w:t>Plain-English summary at job Completed. Enables Agentforce Actions without JSON parsing.</w:t>
+        <w:t>Plain-English summary at job Completed. Enables Agentforce Actions without JSON parsing. In v11.0: generation offloaded to AISummaryQueueable - not built inline in the final engine transaction.</w:t>
       </w:r>
     </w:p>
     <w:p>
@@ -2620,7 +2656,7 @@
           <w:color w:val="181818"/>
           <w:sz w:val="21"/>
         </w:rPr>
-        <w:t>One-time lightning-modal (localStorage metaMapper_tourSeen). Three slides: legend, warning badges, supplemental results. "Do not show again" checkbox. Reappears on different browser or after cache clear - acceptable for localStorage flag.</w:t>
+        <w:t>One-time lightning-modal (localStorage flag). Three slides: legend, warning badges, supplemental results. "Do not show again" checkbox. Reappears on different browser or after cache clear.</w:t>
       </w:r>
     </w:p>
     <w:p>
@@ -2735,7 +2771,7 @@
           <w:color w:val="181818"/>
           <w:sz w:val="21"/>
         </w:rPr>
-        <w:t>When Copilot is not enabled in the org: show helper text "Einstein Copilot not available in this org." in place of the "Ask Copilot" button. Do not hide silently - users must understand why the button is absent.</w:t>
+        <w:t>When Copilot is not enabled in the org: show helper text "Einstein Copilot not available in this org." in place of the "Ask Copilot" button. Do not hide silently.</w:t>
       </w:r>
     </w:p>
     <w:p>
@@ -2763,7 +2799,7 @@
           <w:color w:val="181818"/>
           <w:sz w:val="21"/>
         </w:rPr>
-        <w:t>On viewports &lt; 1024px the Node Details Panel renders as a full-screen modal. A "Close" button must appear in the modal header (in addition to Esc and clicking outside). Full-screen modals on small viewports benefit from an explicit close affordance.</w:t>
+        <w:t>On viewports &lt; 1024px the Node Details Panel renders as a full-screen modal. A "Close" button must appear in the modal header.</w:t>
       </w:r>
     </w:p>
     <w:p>
@@ -2791,7 +2827,7 @@
           <w:color w:val="181818"/>
           <w:sz w:val="21"/>
         </w:rPr>
-        <w:t>Settings UI (admin-only section): "Reset First-Time Tour" button. Clears the metaMapper_tourSeen localStorage flag for the current browser. Useful for admins demoing the tour to new team members. Client-side JS action - no Apex required.</w:t>
+        <w:t>Settings UI (admin-only): "Reset First-Time Tour" button. Clears localStorage tour flag for current browser. Client-side JS - no Apex.</w:t>
       </w:r>
     </w:p>
     <w:p>
@@ -2819,7 +2855,7 @@
           <w:color w:val="181818"/>
           <w:sz w:val="21"/>
         </w:rPr>
-        <w:t>Graph toolbar search input: placeholder text "Search nodes in this graph..." and inline note below the input "(Search applies to Graph view only)". Reinforces the deliberate view-local behavior for users who expect global search.</w:t>
+        <w:t>Placeholder: "Search nodes in this graph..." Inline note: "(Search applies to Graph view only)".</w:t>
       </w:r>
     </w:p>
     <w:p>
@@ -2833,7 +2869,7 @@
           <w:color w:val="0070D2"/>
           <w:sz w:val="28"/>
         </w:rPr>
-        <w:t>2.53 Export Manifest Tooltip Enhancement (v10.0)</w:t>
+        <w:t>2.53 Export Manifest Tooltip (v10.0)</w:t>
       </w:r>
     </w:p>
     <w:p>
@@ -2847,7 +2883,7 @@
           <w:color w:val="181818"/>
           <w:sz w:val="21"/>
         </w:rPr>
-        <w:t>"Download Deployment Manifest" tooltip: "Use this to deploy or retrieve the components found in this scan using Salesforce CLI or VS Code. Includes only components from this scan (managed packages excluded)."</w:t>
+        <w:t>"Download Deployment Manifest" tooltip: "Includes only components from this scan (managed packages excluded)."</w:t>
       </w:r>
     </w:p>
     <w:p>
@@ -2875,7 +2911,7 @@
           <w:color w:val="181818"/>
           <w:sz w:val="21"/>
         </w:rPr>
-        <w:t>MetaMapper is a desktop-first application. Responsive behavior on tablet and mobile is graceful degradation, not full feature parity. Tree View is the intentional primary interface on small viewports. Do not invest implementation effort in making the graph fully interactive on mobile.</w:t>
+        <w:t>MetaMapper is a desktop-first application. Mobile behavior is graceful degradation. Tree View is the primary interface on small viewports.</w:t>
       </w:r>
     </w:p>
     <w:p>
@@ -2903,7 +2939,493 @@
           <w:color w:val="181818"/>
           <w:sz w:val="21"/>
         </w:rPr>
-        <w:t>AI Summary card: maximum 3 lines of AI_Summary__c visible by default. Overflow revealed by "Show more" inline toggle. Prevents the card from pushing Tree/Graph tabs below the fold on typical screen heights.</w:t>
+        <w:t>Max 3 lines visible by default. "Show more" toggle for overflow.</w:t>
+      </w:r>
+    </w:p>
+    <w:p>
+      <w:pPr>
+        <w:pStyle w:val="Heading2"/>
+        <w:spacing w:before="240" w:after="120"/>
+      </w:pPr>
+      <w:r>
+        <w:rPr>
+          <w:b/>
+          <w:color w:val="0070D2"/>
+          <w:sz w:val="28"/>
+        </w:rPr>
+        <w:t>2.56 Spanning Tree Model - Intentional Design (v11.0)</w:t>
+      </w:r>
+    </w:p>
+    <w:p>
+      <w:pPr>
+        <w:spacing w:before="60" w:after="120"/>
+        <w:ind w:left="283"/>
+        <w:shd w:val="clear" w:color="auto" w:fill="EFF4FB"/>
+      </w:pPr>
+      <w:r>
+        <w:rPr>
+          <w:i/>
+          <w:color w:val="032D60"/>
+          <w:sz w:val="19"/>
+        </w:rPr>
+        <w:t>Architecture clarification: MetaMapper models dependency results as a spanning tree, not a full DAG.</w:t>
+      </w:r>
+    </w:p>
+    <w:p>
+      <w:pPr>
+        <w:spacing w:after="80"/>
+      </w:pPr>
+      <w:r>
+        <w:rPr>
+          <w:b w:val="0"/>
+          <w:i w:val="0"/>
+          <w:color w:val="181818"/>
+          <w:sz w:val="21"/>
+        </w:rPr>
+        <w:t>Each Dependency_Node__c stores one Parent_Node__c (first-discovered path). A node reachable via multiple paths is inserted once; subsequent arrivals deduplicated. This is intentional: full DAG requires a junction object with significantly higher DML/storage cost. The spanning tree correctly shows all reachable dependencies; it does not show all dependency paths. Documented in setup/SETUP.md.</w:t>
+      </w:r>
+    </w:p>
+    <w:p>
+      <w:pPr>
+        <w:pStyle w:val="Heading2"/>
+        <w:spacing w:before="240" w:after="120"/>
+      </w:pPr>
+      <w:r>
+        <w:rPr>
+          <w:b/>
+          <w:color w:val="0070D2"/>
+          <w:sz w:val="28"/>
+        </w:rPr>
+        <w:t>2.57 Node_Unique_Key__c Widened to Text 80 (v11.0)</w:t>
+      </w:r>
+    </w:p>
+    <w:p>
+      <w:pPr>
+        <w:spacing w:after="80"/>
+      </w:pPr>
+      <w:r>
+        <w:rPr>
+          <w:b w:val="0"/>
+          <w:i w:val="0"/>
+          <w:color w:val="181818"/>
+          <w:sz w:val="21"/>
+        </w:rPr>
+        <w:t>Text 40 worked for the current format (37 chars: 18+1+18) but was fragile. Text 80 provides headroom for future scoping changes without a field rebuild.</w:t>
+      </w:r>
+    </w:p>
+    <w:p>
+      <w:pPr>
+        <w:pStyle w:val="Heading2"/>
+        <w:spacing w:before="240" w:after="120"/>
+      </w:pPr>
+      <w:r>
+        <w:rPr>
+          <w:b/>
+          <w:color w:val="0070D2"/>
+          <w:sz w:val="28"/>
+        </w:rPr>
+        <w:t>2.58 Two-Class Chained Cleanup (v11.0) - CRITICAL</w:t>
+      </w:r>
+    </w:p>
+    <w:p>
+      <w:pPr>
+        <w:spacing w:before="60" w:after="120"/>
+        <w:ind w:left="283"/>
+        <w:shd w:val="clear" w:color="auto" w:fill="FDECEA"/>
+      </w:pPr>
+      <w:r>
+        <w:rPr>
+          <w:i/>
+          <w:color w:val="032D60"/>
+          <w:sz w:val="19"/>
+        </w:rPr>
+        <w:t>Inner while (!nodes.isEmpty()) loop inside scope=1 execute() can exceed CPU or "Too many DML statements" for jobs with 80k+ nodes, because customer triggers fire on every 2,000-node delete within the same transaction.</w:t>
+      </w:r>
+    </w:p>
+    <w:p>
+      <w:pPr>
+        <w:spacing w:after="80"/>
+      </w:pPr>
+      <w:r>
+        <w:rPr>
+          <w:b/>
+          <w:i w:val="0"/>
+          <w:color w:val="181818"/>
+          <w:sz w:val="21"/>
+        </w:rPr>
+        <w:t>Fix: DependencyCleanupBatch discovers expired jobs (no DML in execute). finish() fires one DependencyNodeCleanupBatch(jobId) per job. DependencyNodeCleanupBatch uses QueryLocator for all nodes; execute() deletes scope (2,000 rows); finish() deletes parent job. Each transaction = one clean chunk.</w:t>
+      </w:r>
+    </w:p>
+    <w:p>
+      <w:pPr>
+        <w:spacing w:before="60" w:after="60"/>
+        <w:ind w:left="454"/>
+        <w:shd w:val="clear" w:color="auto" w:fill="EAECF0"/>
+      </w:pPr>
+      <w:r>
+        <w:rPr>
+          <w:rFonts w:ascii="Courier New" w:hAnsi="Courier New"/>
+          <w:color w:val="1E1E2E"/>
+          <w:sz w:val="18"/>
+        </w:rPr>
+        <w:t>// DependencyNodeCleanupBatch</w:t>
+        <w:br/>
+        <w:t>public Database.QueryLocator start(ctx) {</w:t>
+        <w:br/>
+        <w:t xml:space="preserve">    return Database.getQueryLocator([SELECT Id FROM Dependency_Node__c</w:t>
+        <w:br/>
+        <w:t xml:space="preserve">        WHERE Dependency_Job__c = :jobId]);</w:t>
+        <w:br/>
+        <w:t>}</w:t>
+        <w:br/>
+        <w:t>public void execute(ctx, List&lt;Dependency_Node__c&gt; scope) { delete scope; }</w:t>
+        <w:br/>
+        <w:t>public void finish(ctx) {</w:t>
+        <w:br/>
+        <w:t xml:space="preserve">    delete [SELECT Id FROM Dependency_Job__c WHERE Id = :jobId];</w:t>
+        <w:br/>
+        <w:t>}</w:t>
+      </w:r>
+    </w:p>
+    <w:p>
+      <w:pPr>
+        <w:pStyle w:val="Heading2"/>
+        <w:spacing w:before="240" w:after="120"/>
+      </w:pPr>
+      <w:r>
+        <w:rPr>
+          <w:b/>
+          <w:color w:val="0070D2"/>
+          <w:sz w:val="28"/>
+        </w:rPr>
+        <w:t>2.59 AISummaryQueueable - Offload from Engine (v11.0)</w:t>
+      </w:r>
+    </w:p>
+    <w:p>
+      <w:pPr>
+        <w:spacing w:after="80"/>
+      </w:pPr>
+      <w:r>
+        <w:rPr>
+          <w:b w:val="0"/>
+          <w:i w:val="0"/>
+          <w:color w:val="181818"/>
+          <w:sz w:val="21"/>
+        </w:rPr>
+        <w:t>AI_Summary__c generation was inline in the final DependencyQueueable execution (string templating + JSON handling on an already-stressed transaction). Moved to AISummaryQueueable: a lightweight one-shot Queueable enqueued by DependencyNotificationService.sendCompletionNotification(). LWC polls getJobStatus() until AI_Summary__c is non-null before rendering the Summary Card.</w:t>
+      </w:r>
+    </w:p>
+    <w:p>
+      <w:pPr>
+        <w:pStyle w:val="Heading2"/>
+        <w:spacing w:before="240" w:after="120"/>
+      </w:pPr>
+      <w:r>
+        <w:rPr>
+          <w:b/>
+          <w:color w:val="0070D2"/>
+          <w:sz w:val="28"/>
+        </w:rPr>
+        <w:t>2.60 QueryMore Cursor Expiration Handling (v11.0)</w:t>
+      </w:r>
+    </w:p>
+    <w:p>
+      <w:pPr>
+        <w:spacing w:before="60" w:after="120"/>
+        <w:ind w:left="283"/>
+        <w:shd w:val="clear" w:color="auto" w:fill="FDECEA"/>
+      </w:pPr>
+      <w:r>
+        <w:rPr>
+          <w:i/>
+          <w:color w:val="032D60"/>
+          <w:sz w:val="19"/>
+        </w:rPr>
+        <w:t>Tooling API cursors expire after ~15 minutes. If a Queueable waits in the Flex Queue during high org utilization, nextRecordsUrl may be invalid when execution resumes.</w:t>
+      </w:r>
+    </w:p>
+    <w:p>
+      <w:pPr>
+        <w:spacing w:after="80"/>
+      </w:pPr>
+      <w:r>
+        <w:rPr>
+          <w:b w:val="0"/>
+          <w:i w:val="0"/>
+          <w:color w:val="181818"/>
+          <w:sz w:val="21"/>
+        </w:rPr>
+        <w:t>Fix: DependencyService wraps nextRecordsUrl callouts in try/catch for INVALID_QUERY_LOCATOR (HTTP 400). On catch: restart query from scratch for the same ID batch, do not fail the job. Log restart to Error_Message__c.</w:t>
+      </w:r>
+    </w:p>
+    <w:p>
+      <w:pPr>
+        <w:pStyle w:val="Heading2"/>
+        <w:spacing w:before="240" w:after="120"/>
+      </w:pPr>
+      <w:r>
+        <w:rPr>
+          <w:b/>
+          <w:color w:val="0070D2"/>
+          <w:sz w:val="28"/>
+        </w:rPr>
+        <w:t>2.61 Heap Guardrail Lowered to 70% (v11.0)</w:t>
+      </w:r>
+    </w:p>
+    <w:p>
+      <w:pPr>
+        <w:spacing w:after="80"/>
+      </w:pPr>
+      <w:r>
+        <w:rPr>
+          <w:b w:val="0"/>
+          <w:i w:val="0"/>
+          <w:color w:val="181818"/>
+          <w:sz w:val="21"/>
+        </w:rPr>
+        <w:t>heapPct &gt;= 0.80 threshold was too optimistic. Apex async heap calculations lag; 0.80 leaves insufficient margin when parsing large Tooling API JSON responses. Changed to 0.70.</w:t>
+      </w:r>
+    </w:p>
+    <w:p>
+      <w:pPr>
+        <w:pStyle w:val="Heading2"/>
+        <w:spacing w:before="240" w:after="120"/>
+      </w:pPr>
+      <w:r>
+        <w:rPr>
+          <w:b/>
+          <w:color w:val="0070D2"/>
+          <w:sz w:val="28"/>
+        </w:rPr>
+        <w:t>2.62 Delimiter-Safe Cycle Check (v11.0)</w:t>
+      </w:r>
+    </w:p>
+    <w:p>
+      <w:pPr>
+        <w:spacing w:before="60" w:after="120"/>
+        <w:ind w:left="283"/>
+        <w:shd w:val="clear" w:color="auto" w:fill="FDECEA"/>
+      </w:pPr>
+      <w:r>
+        <w:rPr>
+          <w:i/>
+          <w:color w:val="032D60"/>
+          <w:sz w:val="19"/>
+        </w:rPr>
+        <w:t>Raw String.contains(id) is vulnerable to false positives when one 18-char ID is a substring of another.</w:t>
+      </w:r>
+    </w:p>
+    <w:p>
+      <w:pPr>
+        <w:spacing w:before="60" w:after="60"/>
+        <w:ind w:left="454"/>
+        <w:shd w:val="clear" w:color="auto" w:fill="EAECF0"/>
+      </w:pPr>
+      <w:r>
+        <w:rPr>
+          <w:rFonts w:ascii="Courier New" w:hAnsi="Courier New"/>
+          <w:color w:val="1E1E2E"/>
+          <w:sz w:val="18"/>
+        </w:rPr>
+        <w:t>// Correct delimiter-safe form:</w:t>
+        <w:br/>
+        <w:t>Boolean isCycle = ('|' + parent.Path__c + '|').contains('|' + newNodeId + '|');</w:t>
+      </w:r>
+    </w:p>
+    <w:p>
+      <w:pPr>
+        <w:pStyle w:val="Heading2"/>
+        <w:spacing w:before="240" w:after="120"/>
+      </w:pPr>
+      <w:r>
+        <w:rPr>
+          <w:b/>
+          <w:color w:val="0070D2"/>
+          <w:sz w:val="28"/>
+        </w:rPr>
+        <w:t>2.63 ISettingsProvider Static Cache (v11.0)</w:t>
+      </w:r>
+    </w:p>
+    <w:p>
+      <w:pPr>
+        <w:spacing w:after="80"/>
+      </w:pPr>
+      <w:r>
+        <w:rPr>
+          <w:b w:val="0"/>
+          <w:i w:val="0"/>
+          <w:color w:val="181818"/>
+          <w:sz w:val="21"/>
+        </w:rPr>
+        <w:t>ISettingsProvider.getSettings() must cache the CMDT record in a static variable. Supplemental handlers call getSettings() independently; without static caching each handler burns a SOQL query. One query per Apex transaction - not per class instance.</w:t>
+      </w:r>
+    </w:p>
+    <w:p>
+      <w:pPr>
+        <w:pStyle w:val="Heading2"/>
+        <w:spacing w:before="240" w:after="120"/>
+      </w:pPr>
+      <w:r>
+        <w:rPr>
+          <w:b/>
+          <w:color w:val="0070D2"/>
+          <w:sz w:val="28"/>
+        </w:rPr>
+        <w:t>2.64 PE Suppression Logging (v11.0)</w:t>
+      </w:r>
+    </w:p>
+    <w:p>
+      <w:pPr>
+        <w:spacing w:after="80"/>
+      </w:pPr>
+      <w:r>
+        <w:rPr>
+          <w:b w:val="0"/>
+          <w:i w:val="0"/>
+          <w:color w:val="181818"/>
+          <w:sz w:val="21"/>
+        </w:rPr>
+        <w:t>When OrgLimits auto-suppress fires (&gt;80% daily PE consumed): append to Error_Message__c: "[timestamp] Platform Events suppressed - daily delivery limit &gt;80% consumed. Progress switched to polling." Admin visibility without debug logs.</w:t>
+      </w:r>
+    </w:p>
+    <w:p>
+      <w:pPr>
+        <w:pStyle w:val="Heading2"/>
+        <w:spacing w:before="240" w:after="120"/>
+      </w:pPr>
+      <w:r>
+        <w:rPr>
+          <w:b/>
+          <w:color w:val="0070D2"/>
+          <w:sz w:val="28"/>
+        </w:rPr>
+        <w:t>2.65 localStorage Tour Version Suffix (v11.0)</w:t>
+      </w:r>
+    </w:p>
+    <w:p>
+      <w:pPr>
+        <w:spacing w:after="80"/>
+      </w:pPr>
+      <w:r>
+        <w:rPr>
+          <w:b w:val="0"/>
+          <w:i w:val="0"/>
+          <w:color w:val="181818"/>
+          <w:sz w:val="21"/>
+        </w:rPr>
+        <w:t>Flag changed from metaMapper_tourSeen to metaMapper_tourSeen_v1. Bump suffix (e.g. _v2) on major UX changes to force tour re-display for all existing users without requiring a cache clear.</w:t>
+      </w:r>
+    </w:p>
+    <w:p>
+      <w:pPr>
+        <w:pStyle w:val="Heading2"/>
+        <w:spacing w:before="240" w:after="120"/>
+      </w:pPr>
+      <w:r>
+        <w:rPr>
+          <w:b/>
+          <w:color w:val="0070D2"/>
+          <w:sz w:val="28"/>
+        </w:rPr>
+        <w:t>2.66 Selector Completeness - countActiveQueueables() (v11.0)</w:t>
+      </w:r>
+    </w:p>
+    <w:p>
+      <w:pPr>
+        <w:spacing w:after="80"/>
+      </w:pPr>
+      <w:r>
+        <w:rPr>
+          <w:b w:val="0"/>
+          <w:i w:val="0"/>
+          <w:color w:val="181818"/>
+          <w:sz w:val="21"/>
+        </w:rPr>
+        <w:t>AsyncApexJob count in concurrency guard moved to DependencyJobSelector.countActiveQueueables(). Centralizes SOQL and ensures the ApexClass.Name filter is always applied.</w:t>
+      </w:r>
+    </w:p>
+    <w:p>
+      <w:pPr>
+        <w:pStyle w:val="Heading2"/>
+        <w:spacing w:before="240" w:after="120"/>
+      </w:pPr>
+      <w:r>
+        <w:rPr>
+          <w:b/>
+          <w:color w:val="0070D2"/>
+          <w:sz w:val="28"/>
+        </w:rPr>
+        <w:t>2.67 Explicit DML Bulkification Note (v11.0)</w:t>
+      </w:r>
+    </w:p>
+    <w:p>
+      <w:pPr>
+        <w:spacing w:after="80"/>
+      </w:pPr>
+      <w:r>
+        <w:rPr>
+          <w:b w:val="0"/>
+          <w:i w:val="0"/>
+          <w:color w:val="181818"/>
+          <w:sz w:val="21"/>
+        </w:rPr>
+        <w:t>Child nodes discovered during the result-processing loop must be accumulated in a List&lt;Dependency_Node__c&gt; and upserted in a single bulk statement after the loop - never per-node inside the loop. If a mid-loop guardrail triggers a self-chain, flush the accumulated list before returning.</w:t>
+      </w:r>
+    </w:p>
+    <w:p>
+      <w:pPr>
+        <w:pStyle w:val="Heading2"/>
+        <w:spacing w:before="240" w:after="120"/>
+      </w:pPr>
+      <w:r>
+        <w:rPr>
+          <w:b/>
+          <w:color w:val="0070D2"/>
+          <w:sz w:val="28"/>
+        </w:rPr>
+        <w:t>2.68 Path__c Safe-Fail Truncation (v11.0)</w:t>
+      </w:r>
+    </w:p>
+    <w:p>
+      <w:pPr>
+        <w:spacing w:after="80"/>
+      </w:pPr>
+      <w:r>
+        <w:rPr>
+          <w:b w:val="0"/>
+          <w:i w:val="0"/>
+          <w:color w:val="181818"/>
+          <w:sz w:val="21"/>
+        </w:rPr>
+        <w:t>At 18 chars/ID + 1 delimiter, depth-1,500 is ~28,500 chars - within Long Text 32768. Pathological orgs could exceed this. Path__c builder must check remaining capacity before appending; if within 200 chars of the limit, set Is_Circular__c = true and Is_Processed__c = true with Context_Data__c note "path_truncated: true" rather than throwing StringException.</w:t>
+      </w:r>
+    </w:p>
+    <w:p>
+      <w:pPr>
+        <w:pStyle w:val="Heading2"/>
+        <w:spacing w:before="240" w:after="120"/>
+      </w:pPr>
+      <w:r>
+        <w:rPr>
+          <w:b/>
+          <w:color w:val="0070D2"/>
+          <w:sz w:val="28"/>
+        </w:rPr>
+        <w:t>2.69 USER_MODE Scope Clarified (v11.0)</w:t>
+      </w:r>
+    </w:p>
+    <w:p>
+      <w:pPr>
+        <w:spacing w:after="80"/>
+      </w:pPr>
+      <w:r>
+        <w:rPr>
+          <w:b w:val="0"/>
+          <w:i w:val="0"/>
+          <w:color w:val="181818"/>
+          <w:sz w:val="21"/>
+        </w:rPr>
+        <w:t>USER_MODE applied only at @AuraEnabled controller boundary. Engine internals (Queueable, cleanup, notification) operate in SYSTEM_MODE for reliable orchestration. Queries that surface metadata in the UI (getNodeHierarchy, getJobStatus) enforce USER_MODE at the controller. Internal engine SOQL is not subject to FLS - this is by design, not a security gap.</w:t>
       </w:r>
     </w:p>
     <w:p>
@@ -3158,7 +3680,7 @@
                 <w:color w:val="181818"/>
                 <w:sz w:val="20"/>
               </w:rPr>
-              <w:t>Two-tier: scoped DB dedup + Path__c ancestry</w:t>
+              <w:t>Two-tier: scoped DB dedup + delimiter-safe Path__c ancestry</w:t>
             </w:r>
           </w:p>
         </w:tc>
@@ -3173,7 +3695,7 @@
                 <w:color w:val="181818"/>
                 <w:sz w:val="20"/>
               </w:rPr>
-              <w:t>Constant-cost dedup; full ancestry preserved</w:t>
+              <w:t>Constant-cost dedup; full ancestry preserved; no false-positive substring matches</w:t>
             </w:r>
           </w:p>
         </w:tc>
@@ -3252,7 +3774,7 @@
                 <w:color w:val="181818"/>
                 <w:sz w:val="20"/>
               </w:rPr>
-              <w:t>Max_Concurrent_Jobs__c (default 2); createJob() rejects above threshold</w:t>
+              <w:t>Max_Concurrent_Jobs__c (default 2) + ApexClass.Name filter for selectivity</w:t>
             </w:r>
           </w:p>
         </w:tc>
@@ -3267,7 +3789,7 @@
                 <w:color w:val="181818"/>
                 <w:sz w:val="20"/>
               </w:rPr>
-              <w:t>Prevents flex queue saturation</w:t>
+              <w:t>Prevents flex queue saturation; advisory (not atomic lock)</w:t>
             </w:r>
           </w:p>
         </w:tc>
@@ -3299,7 +3821,7 @@
                 <w:color w:val="181818"/>
                 <w:sz w:val="20"/>
               </w:rPr>
-              <w:t>Seven-limit; pre-batch + mid-loop</w:t>
+              <w:t>Seven-limit; pre-batch + mid-loop; heap at 70%</w:t>
             </w:r>
           </w:p>
         </w:tc>
@@ -3331,7 +3853,7 @@
                 <w:color w:val="181818"/>
                 <w:sz w:val="20"/>
               </w:rPr>
-              <w:t>Cleanup chunk</w:t>
+              <w:t>Cleanup pattern</w:t>
             </w:r>
           </w:p>
         </w:tc>
@@ -3346,7 +3868,7 @@
                 <w:color w:val="181818"/>
                 <w:sz w:val="20"/>
               </w:rPr>
-              <w:t>Node_Chunk_Size__c CMDT (default 2,000)</w:t>
+              <w:t>Two-class chain: DependencyCleanupBatch + DependencyNodeCleanupBatch</w:t>
             </w:r>
           </w:p>
         </w:tc>
@@ -3361,7 +3883,7 @@
                 <w:color w:val="181818"/>
                 <w:sz w:val="20"/>
               </w:rPr>
-              <w:t>8,000 DML rows headroom for customer automation</w:t>
+              <w:t>No inner DML loop; safe for any node count; no transaction DML explosion</w:t>
             </w:r>
           </w:p>
         </w:tc>
@@ -3722,7 +4244,7 @@
                 <w:color w:val="181818"/>
                 <w:sz w:val="20"/>
               </w:rPr>
-              <w:t>IDependencyService, INotificationService, ISettingsProvider</w:t>
+              <w:t>IDependencyService, INotificationService, ISettingsProvider (static cache)</w:t>
             </w:r>
           </w:p>
         </w:tc>
@@ -3737,7 +4259,7 @@
                 <w:color w:val="181818"/>
                 <w:sz w:val="20"/>
               </w:rPr>
-              <w:t>Testability and substitutability</w:t>
+              <w:t>Testability and zero-cost CMDT reuse</w:t>
             </w:r>
           </w:p>
         </w:tc>
@@ -3769,7 +4291,7 @@
                 <w:color w:val="181818"/>
                 <w:sz w:val="20"/>
               </w:rPr>
-              <w:t>DependencyJobSelector, DependencyNodeSelector</w:t>
+              <w:t>DependencyJobSelector (incl. countActiveQueueables()), DependencyNodeSelector</w:t>
             </w:r>
           </w:p>
         </w:tc>
@@ -3784,7 +4306,7 @@
                 <w:color w:val="181818"/>
                 <w:sz w:val="20"/>
               </w:rPr>
-              <w:t>Centralized SOQL</w:t>
+              <w:t>All SOQL centralized</w:t>
             </w:r>
           </w:p>
         </w:tc>
@@ -3816,7 +4338,7 @@
                 <w:color w:val="181818"/>
                 <w:sz w:val="20"/>
               </w:rPr>
-              <w:t>Node_Unique_Key__c External ID + upsert</w:t>
+              <w:t>Node_Unique_Key__c Text 80 External ID + upsert</w:t>
             </w:r>
           </w:p>
         </w:tc>
@@ -3831,7 +4353,7 @@
                 <w:color w:val="181818"/>
                 <w:sz w:val="20"/>
               </w:rPr>
-              <w:t>Prevents race-condition duplicates</w:t>
+              <w:t>Prevents race-condition duplicates; Text 80 for future headroom</w:t>
             </w:r>
           </w:p>
         </w:tc>
@@ -3910,7 +4432,7 @@
                 <w:color w:val="181818"/>
                 <w:sz w:val="20"/>
               </w:rPr>
-              <w:t>Disable_PE__c CMDT + OrgLimits auto-degrade</w:t>
+              <w:t>Disable_PE__c CMDT + OrgLimits auto-degrade + Error_Message__c logging</w:t>
             </w:r>
           </w:p>
         </w:tc>
@@ -3925,7 +4447,7 @@
                 <w:color w:val="181818"/>
                 <w:sz w:val="20"/>
               </w:rPr>
-              <w:t>Admin control + automatic protection</w:t>
+              <w:t>Admin control + automatic protection + visibility</w:t>
             </w:r>
           </w:p>
         </w:tc>
@@ -3942,7 +4464,7 @@
                 <w:color w:val="181818"/>
                 <w:sz w:val="20"/>
               </w:rPr>
-              <w:t>Ancestors_Hash__c</w:t>
+              <w:t>Ancestor_Hashes__c</w:t>
             </w:r>
           </w:p>
         </w:tc>
@@ -3957,7 +4479,7 @@
                 <w:color w:val="181818"/>
                 <w:sz w:val="20"/>
               </w:rPr>
-              <w:t>Long Text 32768 (NOT Text 255)</w:t>
+              <w:t>Long Text 32768 hash shortcut (renamed from Ancestors_Hash__c)</w:t>
             </w:r>
           </w:p>
         </w:tc>
@@ -3972,7 +4494,7 @@
                 <w:color w:val="181818"/>
                 <w:sz w:val="20"/>
               </w:rPr>
-              <w:t>Text 255 overflows at depth &gt; 42</w:t>
+              <w:t>Text 255 overflows; "bloom filter" label was misleading</w:t>
             </w:r>
           </w:p>
         </w:tc>
@@ -4004,7 +4526,7 @@
                 <w:color w:val="181818"/>
                 <w:sz w:val="20"/>
               </w:rPr>
-              <w:t>AI_Summary__c + compact Results card + Ask Copilot / fallback text</w:t>
+              <w:t>AI_Summary__c (AISummaryQueueable, offloaded) + compact Results card + Copilot fallback text</w:t>
             </w:r>
           </w:p>
         </w:tc>
@@ -4019,7 +4541,7 @@
                 <w:color w:val="181818"/>
                 <w:sz w:val="20"/>
               </w:rPr>
-              <w:t>Agentforce-ready; graceful Copilot unavailability</w:t>
+              <w:t>Agentforce-ready; final engine transaction not burdened</w:t>
             </w:r>
           </w:p>
         </w:tc>
@@ -4051,7 +4573,7 @@
                 <w:color w:val="181818"/>
                 <w:sz w:val="20"/>
               </w:rPr>
-              <w:t>Three-state error + first-time guided tour (localStorage)</w:t>
+              <w:t>Three-state error + first-time guided tour (localStorage metaMapper_tourSeen_v1)</w:t>
             </w:r>
           </w:p>
         </w:tc>
@@ -4066,7 +4588,7 @@
                 <w:color w:val="181818"/>
                 <w:sz w:val="20"/>
               </w:rPr>
-              <w:t>Distinguishes failure types; orients new users</w:t>
+              <w:t>Distinguishes failure types; version suffix enables future re-tours</w:t>
             </w:r>
           </w:p>
         </w:tc>
@@ -4224,7 +4746,7 @@
                 <w:color w:val="181818"/>
                 <w:sz w:val="20"/>
               </w:rPr>
-              <w:t>Export naming</w:t>
+              <w:t>QueryMore safety</w:t>
             </w:r>
           </w:p>
         </w:tc>
@@ -4239,7 +4761,7 @@
                 <w:color w:val="181818"/>
                 <w:sz w:val="20"/>
               </w:rPr>
-              <w:t>"Download as CSV" / "Download Full Hierarchy (JSON)" + default filenames</w:t>
+              <w:t>Cursor expiration try/catch; restart from scratch on INVALID_QUERY_LOCATOR</w:t>
             </w:r>
           </w:p>
         </w:tc>
@@ -4254,7 +4776,7 @@
                 <w:color w:val="181818"/>
                 <w:sz w:val="20"/>
               </w:rPr>
-              <w:t>Matches user mental model and Salesforce conventions</w:t>
+              <w:t>Flex Queue wait can exceed cursor TTL</w:t>
             </w:r>
           </w:p>
         </w:tc>
@@ -4271,6 +4793,100 @@
                 <w:color w:val="181818"/>
                 <w:sz w:val="20"/>
               </w:rPr>
+              <w:t>Spanning tree</w:t>
+            </w:r>
+          </w:p>
+        </w:tc>
+        <w:tc>
+          <w:tcPr>
+            <w:tcW w:type="dxa" w:w="3022"/>
+            <w:shd w:val="clear" w:color="auto" w:fill="FFFFFF"/>
+          </w:tcPr>
+          <w:p>
+            <w:r>
+              <w:rPr>
+                <w:color w:val="181818"/>
+                <w:sz w:val="20"/>
+              </w:rPr>
+              <w:t>First-discovered path wins; duplicates deduplicated (not DAG)</w:t>
+            </w:r>
+          </w:p>
+        </w:tc>
+        <w:tc>
+          <w:tcPr>
+            <w:tcW w:type="dxa" w:w="3022"/>
+            <w:shd w:val="clear" w:color="auto" w:fill="FFFFFF"/>
+          </w:tcPr>
+          <w:p>
+            <w:r>
+              <w:rPr>
+                <w:color w:val="181818"/>
+                <w:sz w:val="20"/>
+              </w:rPr>
+              <w:t>Full DAG requires junction object; spanning tree is correct and cost-effective</w:t>
+            </w:r>
+          </w:p>
+        </w:tc>
+      </w:tr>
+      <w:tr>
+        <w:tc>
+          <w:tcPr>
+            <w:tcW w:type="dxa" w:w="3022"/>
+            <w:shd w:val="clear" w:color="auto" w:fill="F2F4F7"/>
+          </w:tcPr>
+          <w:p>
+            <w:r>
+              <w:rPr>
+                <w:color w:val="181818"/>
+                <w:sz w:val="20"/>
+              </w:rPr>
+              <w:t>Export naming</w:t>
+            </w:r>
+          </w:p>
+        </w:tc>
+        <w:tc>
+          <w:tcPr>
+            <w:tcW w:type="dxa" w:w="3022"/>
+            <w:shd w:val="clear" w:color="auto" w:fill="F2F4F7"/>
+          </w:tcPr>
+          <w:p>
+            <w:r>
+              <w:rPr>
+                <w:color w:val="181818"/>
+                <w:sz w:val="20"/>
+              </w:rPr>
+              <w:t>"Download as CSV" / "Download Full Hierarchy (JSON)" + default filenames</w:t>
+            </w:r>
+          </w:p>
+        </w:tc>
+        <w:tc>
+          <w:tcPr>
+            <w:tcW w:type="dxa" w:w="3022"/>
+            <w:shd w:val="clear" w:color="auto" w:fill="F2F4F7"/>
+          </w:tcPr>
+          <w:p>
+            <w:r>
+              <w:rPr>
+                <w:color w:val="181818"/>
+                <w:sz w:val="20"/>
+              </w:rPr>
+              <w:t>Matches user mental model</w:t>
+            </w:r>
+          </w:p>
+        </w:tc>
+      </w:tr>
+      <w:tr>
+        <w:tc>
+          <w:tcPr>
+            <w:tcW w:type="dxa" w:w="3022"/>
+            <w:shd w:val="clear" w:color="auto" w:fill="FFFFFF"/>
+          </w:tcPr>
+          <w:p>
+            <w:r>
+              <w:rPr>
+                <w:color w:val="181818"/>
+                <w:sz w:val="20"/>
+              </w:rPr>
               <w:t>Tour reset</w:t>
             </w:r>
           </w:p>
@@ -4286,7 +4902,7 @@
                 <w:color w:val="181818"/>
                 <w:sz w:val="20"/>
               </w:rPr>
-              <w:t>Admin "Reset First-Time Tour" button in Settings UI (client-side JS)</w:t>
+              <w:t>Admin "Reset First-Time Tour" button (clears metaMapper_tourSeen_v1, client-side JS)</w:t>
             </w:r>
           </w:p>
         </w:tc>
@@ -4302,6 +4918,53 @@
                 <w:sz w:val="20"/>
               </w:rPr>
               <w:t>Supports demos without Apex overhead</w:t>
+            </w:r>
+          </w:p>
+        </w:tc>
+      </w:tr>
+      <w:tr>
+        <w:tc>
+          <w:tcPr>
+            <w:tcW w:type="dxa" w:w="3022"/>
+            <w:shd w:val="clear" w:color="auto" w:fill="F2F4F7"/>
+          </w:tcPr>
+          <w:p>
+            <w:r>
+              <w:rPr>
+                <w:color w:val="181818"/>
+                <w:sz w:val="20"/>
+              </w:rPr>
+              <w:t>DML bulkification</w:t>
+            </w:r>
+          </w:p>
+        </w:tc>
+        <w:tc>
+          <w:tcPr>
+            <w:tcW w:type="dxa" w:w="3022"/>
+            <w:shd w:val="clear" w:color="auto" w:fill="F2F4F7"/>
+          </w:tcPr>
+          <w:p>
+            <w:r>
+              <w:rPr>
+                <w:color w:val="181818"/>
+                <w:sz w:val="20"/>
+              </w:rPr>
+              <w:t>Accumulate List&lt;&gt;, single upsert after loop; flush before self-chain</w:t>
+            </w:r>
+          </w:p>
+        </w:tc>
+        <w:tc>
+          <w:tcPr>
+            <w:tcW w:type="dxa" w:w="3022"/>
+            <w:shd w:val="clear" w:color="auto" w:fill="F2F4F7"/>
+          </w:tcPr>
+          <w:p>
+            <w:r>
+              <w:rPr>
+                <w:color w:val="181818"/>
+                <w:sz w:val="20"/>
+              </w:rPr>
+              <w:t>150 DML statement limit; never upsert per-node inside result loop</w:t>
             </w:r>
           </w:p>
         </w:tc>
@@ -4683,7 +5346,7 @@
                 <w:color w:val="181818"/>
                 <w:sz w:val="20"/>
               </w:rPr>
-              <w:t>Full exception detail on failure</w:t>
+              <w:t>Full exception detail on failure. PE suppression notices appended here.</w:t>
             </w:r>
           </w:p>
         </w:tc>
@@ -4918,7 +5581,7 @@
                 <w:color w:val="181818"/>
                 <w:sz w:val="20"/>
               </w:rPr>
-              <w:t>Plain-English summary at Completed. Shown in Results AI Summary card. Enables Agentforce.</w:t>
+              <w:t>Plain-English summary. Populated by AISummaryQueueable after Completed. Null until Queueable finishes. LWC polls until non-null before rendering Summary Card.</w:t>
             </w:r>
           </w:p>
         </w:tc>
@@ -4937,7 +5600,7 @@
           <w:color w:val="032D60"/>
           <w:sz w:val="19"/>
         </w:rPr>
-        <w:t>Visited_IDs__c removed. Cycle detection uses scoped DB dedup + Path__c ancestry.</w:t>
+        <w:t>Visited_IDs__c removed. Cycle detection uses scoped DB dedup + delimiter-safe Path__c ancestry.</w:t>
       </w:r>
     </w:p>
     <w:p>
@@ -5058,7 +5721,7 @@
                 <w:color w:val="181818"/>
                 <w:sz w:val="20"/>
               </w:rPr>
-              <w:t>Explicit chunk-delete before parent</w:t>
+              <w:t>Explicit chunk-delete by DependencyNodeCleanupBatch before parent</w:t>
             </w:r>
           </w:p>
         </w:tc>
@@ -5105,7 +5768,7 @@
                 <w:color w:val="181818"/>
                 <w:sz w:val="20"/>
               </w:rPr>
-              <w:t>Hierarchical tree</w:t>
+              <w:t>Spanning tree - one parent per node (first-discovered path)</w:t>
             </w:r>
           </w:p>
         </w:tc>
@@ -5387,7 +6050,7 @@
                 <w:color w:val="181818"/>
                 <w:sz w:val="20"/>
               </w:rPr>
-              <w:t>True ONLY when Metadata_ID__c in own Path__c</w:t>
+              <w:t>True ONLY when Metadata_ID__c in own delimiter-safe Path__c</w:t>
             </w:r>
           </w:p>
         </w:tc>
@@ -5575,7 +6238,7 @@
                 <w:color w:val="181818"/>
                 <w:sz w:val="20"/>
               </w:rPr>
-              <w:t>Pipe-delimited ancestor chain. Root = "". Rendered as breadcrumb in Node Details Panel.</w:t>
+              <w:t>Pipe-delimited ancestor chain. Root = "". Safe-fail truncation at ~32,568 chars. Rendered as breadcrumb in Node Details Panel.</w:t>
             </w:r>
           </w:p>
         </w:tc>
@@ -5654,7 +6317,7 @@
                 <w:color w:val="181818"/>
                 <w:sz w:val="20"/>
               </w:rPr>
-              <w:t>Text 40 (External ID, Unique)</w:t>
+              <w:t>Text 80 (External ID, Unique)</w:t>
             </w:r>
           </w:p>
         </w:tc>
@@ -5669,7 +6332,7 @@
                 <w:color w:val="181818"/>
                 <w:sz w:val="20"/>
               </w:rPr>
-              <w:t>JobId + ":" + Metadata_ID__c. Upsert key.</w:t>
+              <w:t>JobId + ":" + Metadata_ID__c. Upsert key. Text 80 for future headroom.</w:t>
             </w:r>
           </w:p>
         </w:tc>
@@ -5686,7 +6349,7 @@
                 <w:color w:val="181818"/>
                 <w:sz w:val="20"/>
               </w:rPr>
-              <w:t>Ancestors_Hash__c</w:t>
+              <w:t>Ancestor_Hashes__c</w:t>
             </w:r>
           </w:p>
         </w:tc>
@@ -5716,7 +6379,7 @@
                 <w:color w:val="181818"/>
                 <w:sz w:val="20"/>
               </w:rPr>
-              <w:t>Bloom-filter shortcut. Long Text 32768 required - Text 255 overflows at depth &gt; 42.</w:t>
+              <w:t>Concatenated 6-char base64url hash prefixes of ancestor IDs. Hash shortcut (not probabilistic bloom filter) - use contains(shortHash) as fast pre-check, then always confirm with delimiter-safe Path__c check. Long Text 32768 required.</w:t>
             </w:r>
           </w:p>
         </w:tc>
@@ -6034,6 +6697,38 @@
                 <w:sz w:val="20"/>
               </w:rPr>
               <w:t>Cycle closes at: X</w:t>
+            </w:r>
+          </w:p>
+        </w:tc>
+      </w:tr>
+      <w:tr>
+        <w:tc>
+          <w:tcPr>
+            <w:tcW w:type="dxa" w:w="4533"/>
+            <w:shd w:val="clear" w:color="auto" w:fill="F2F4F7"/>
+          </w:tcPr>
+          <w:p>
+            <w:r>
+              <w:rPr>
+                <w:color w:val="181818"/>
+                <w:sz w:val="20"/>
+              </w:rPr>
+              <w:t>path_truncated: true</w:t>
+            </w:r>
+          </w:p>
+        </w:tc>
+        <w:tc>
+          <w:tcPr>
+            <w:tcW w:type="dxa" w:w="4533"/>
+            <w:shd w:val="clear" w:color="auto" w:fill="F2F4F7"/>
+          </w:tcPr>
+          <w:p>
+            <w:r>
+              <w:rPr>
+                <w:color w:val="181818"/>
+                <w:sz w:val="20"/>
+              </w:rPr>
+              <w:t>Ancestry path truncated - depth exceeded safe limit</w:t>
             </w:r>
           </w:p>
         </w:tc>
@@ -6691,7 +7386,7 @@
                 <w:color w:val="181818"/>
                 <w:sz w:val="20"/>
               </w:rPr>
-              <w:t>Cleanup chunk. Leaves 8,000 DML rows for customer automation.</w:t>
+              <w:t>DependencyNodeCleanupBatch batch size. Leaves 8,000 DML rows for customer automation.</w:t>
             </w:r>
           </w:p>
         </w:tc>
@@ -6745,7 +7440,7 @@
           <w:color w:val="181818"/>
           <w:sz w:val="21"/>
         </w:rPr>
-        <w:t>1. Three-state preflight passes. Concurrency guard passes. Async context guard passes. Job created (Initializing). Root Node inserted (Path__c = ""). DependencyQueueable(jobId, activeFlowsOnly, null) enqueued.</w:t>
+        <w:t>1. Three-state preflight passes. Concurrency guard passes (DependencyJobSelector.countActiveQueueables()). Async context guard passes. Job created (Initializing). Root Node inserted (Path__c = ""). DependencyQueueable(jobId, activeFlowsOnly, null) enqueued.</w:t>
       </w:r>
     </w:p>
     <w:p>
@@ -6787,7 +7482,7 @@
           <w:color w:val="181818"/>
           <w:sz w:val="21"/>
         </w:rPr>
-        <w:t>4. Apply overrideBatchSize if non-null. Read CMDT. Hot-loop check: if Rechain_Count__c increased by Hotloop_Threshold__c with no Nodes_Processed__c change -&gt; Paused.</w:t>
+        <w:t>4. Apply overrideBatchSize if non-null. Read CMDT via ISettingsProvider (static cache). Hot-loop check.</w:t>
       </w:r>
     </w:p>
     <w:p>
@@ -6843,7 +7538,7 @@
           <w:color w:val="181818"/>
           <w:sz w:val="21"/>
         </w:rPr>
-        <w:t>8. Tooling API callout: char-budget chunk (split if SOQL &gt; 8KB). QueryMore until done = true. HTTP 414/431: split + retry.</w:t>
+        <w:t>8. Tooling API callout: char-budget chunk (split if SOQL &gt; 8KB). QueryMore until done=true; wrap nextRecordsUrl in try/catch for INVALID_QUERY_LOCATOR - restart from scratch on expiry. HTTP 414/431: split + retry.</w:t>
       </w:r>
     </w:p>
     <w:p>
@@ -6871,7 +7566,7 @@
           <w:color w:val="181818"/>
           <w:sz w:val="21"/>
         </w:rPr>
-        <w:t>10. Mid-loop seven-limit check per result. Chain if breached.</w:t>
+        <w:t>10. Mid-loop seven-limit check per result. Flush accumulated insert list before chaining.</w:t>
       </w:r>
     </w:p>
     <w:p>
@@ -6885,7 +7580,7 @@
           <w:color w:val="181818"/>
           <w:sz w:val="21"/>
         </w:rPr>
-        <w:t>11. Per result: if in dedup set -&gt; skip. If in Path__c (Ancestors_Hash__c bloom + confirm) -&gt; Is_Circular__c = true, Is_Processed__c = true, cycleClosesAt in Context_Data__c.</w:t>
+        <w:t>11. Per result: if in dedup set -&gt; skip. Delimiter-safe cycle check: ("|"+parent.Path__c+"|").contains("|"+newId+"|"). If cycle: Is_Circular__c=true, Is_Processed__c=true, cycleClosesAt in Context_Data__c.</w:t>
       </w:r>
     </w:p>
     <w:p>
@@ -6899,7 +7594,7 @@
           <w:color w:val="181818"/>
           <w:sz w:val="21"/>
         </w:rPr>
-        <w:t>12. Upsert by Node_Unique_Key__c. Build Path__c (blank-safe). Populate Ancestors_Hash__c.</w:t>
+        <w:t>12. Accumulate into List&lt;Dependency_Node__c&gt;. Build Path__c (blank-safe; safe-fail truncation near 32,568 chars). Populate Ancestor_Hashes__c.</w:t>
       </w:r>
     </w:p>
     <w:p>
@@ -6913,7 +7608,7 @@
           <w:color w:val="181818"/>
           <w:sz w:val="21"/>
         </w:rPr>
-        <w:t>13. Supplemental handlers via DependencyTypeHandlerFactory.</w:t>
+        <w:t>13. Single bulk upsert by Node_Unique_Key__c after loop completes.</w:t>
       </w:r>
     </w:p>
     <w:p>
@@ -6927,7 +7622,7 @@
           <w:color w:val="181818"/>
           <w:sz w:val="21"/>
         </w:rPr>
-        <w:t>14. Mark nodes processed. Increment Nodes_Processed__c. OrgLimits PE check -&gt; publish or auto-suppress.</w:t>
+        <w:t>14. Supplemental handlers via DependencyTypeHandlerFactory.</w:t>
       </w:r>
     </w:p>
     <w:p>
@@ -6941,7 +7636,7 @@
           <w:color w:val="181818"/>
           <w:sz w:val="21"/>
         </w:rPr>
-        <w:t>15. Post-batch seven-limit check.</w:t>
+        <w:t>15. Mark nodes processed. Increment Nodes_Processed__c. OrgLimits PE check -&gt; publish or auto-suppress (append to Error_Message__c if suppressed).</w:t>
       </w:r>
     </w:p>
     <w:p>
@@ -6955,7 +7650,7 @@
           <w:color w:val="181818"/>
           <w:sz w:val="21"/>
         </w:rPr>
-        <w:t>16. If complete: compute Summary_JSON__c + AI_Summary__c. Status = Completed. Stamp Closed_At__c. Notify.</w:t>
+        <w:t>16. Post-batch seven-limit check.</w:t>
       </w:r>
     </w:p>
     <w:p>
@@ -6969,7 +7664,21 @@
           <w:color w:val="181818"/>
           <w:sz w:val="21"/>
         </w:rPr>
-        <w:t>17. catch: rollback(sp); updateJobFailed().</w:t>
+        <w:t>17. If complete: compute Summary_JSON__c. Status = Completed. Stamp Closed_At__c. sendCompletionNotification() enqueues AISummaryQueueable.</w:t>
+      </w:r>
+    </w:p>
+    <w:p>
+      <w:pPr>
+        <w:pStyle w:val="ListBullet"/>
+        <w:spacing w:after="40"/>
+        <w:ind w:left="283"/>
+      </w:pPr>
+      <w:r>
+        <w:rPr>
+          <w:color w:val="181818"/>
+          <w:sz w:val="21"/>
+        </w:rPr>
+        <w:t>18. catch: rollback(sp); updateJobFailed().</w:t>
       </w:r>
     </w:p>
     <w:p>
@@ -7018,13 +7727,32 @@
         <w:br/>
         <w:t>if (calloutsR &lt; headroom || dmlR &lt; dmlReserve</w:t>
         <w:br/>
-        <w:t xml:space="preserve">    || heapPct &gt;= 0.80 || cpuPct &gt;= 0.75</w:t>
+        <w:t xml:space="preserve">    || heapPct &gt;= 0.70 || cpuPct &gt;= 0.75</w:t>
         <w:br/>
         <w:t xml:space="preserve">    || qRowsR &lt; 1000 || queriesR &lt; 10 || dmlStmtsR &lt; 10) {</w:t>
+        <w:br/>
+        <w:t xml:space="preserve">    // flush accumulated insert list first</w:t>
+        <w:br/>
+        <w:t xml:space="preserve">    if (!insertList.isEmpty()) Database.upsert(insertList, Dependency_Node__c.Node_Unique_Key__c, false);</w:t>
         <w:br/>
         <w:t xml:space="preserve">    System.enqueueJob(new DependencyQueueable(jobId, activeFlowsOnly, null)); return;</w:t>
         <w:br/>
         <w:t>}</w:t>
+      </w:r>
+    </w:p>
+    <w:p>
+      <w:pPr>
+        <w:spacing w:before="60" w:after="120"/>
+        <w:ind w:left="283"/>
+        <w:shd w:val="clear" w:color="auto" w:fill="EFF4FB"/>
+      </w:pPr>
+      <w:r>
+        <w:rPr>
+          <w:i/>
+          <w:color w:val="032D60"/>
+          <w:sz w:val="19"/>
+        </w:rPr>
+        <w:t>Heap threshold is 0.70 (not 0.80): async heap calculations lag; Tooling API JSON parsing can push heap rapidly between guardrail checks.</w:t>
       </w:r>
     </w:p>
     <w:p>
@@ -7114,11 +7842,11 @@
         <w:br/>
         <w:t>if (alreadyInserted.contains(result.refId)) continue;</w:t>
         <w:br/>
-        <w:t>// Tier 2: bloom filter + Path__c confirm</w:t>
+        <w:t>// Tier 2: hash shortcut + delimiter-safe Path__c confirm</w:t>
         <w:br/>
-        <w:t>Boolean mightBeCycle = parentNode.Ancestors_Hash__c?.contains(shortHash(result.refId)) == true;</w:t>
+        <w:t>Boolean mightBeCycle = parentNode.Ancestor_Hashes__c?.contains(shortHash(result.refId)) == true;</w:t>
         <w:br/>
-        <w:t>Boolean isCycle = mightBeCycle &amp;&amp; parentNode.Path__c?.contains(result.refId) == true;</w:t>
+        <w:t>Boolean isCycle = mightBeCycle &amp;&amp; ('|'+parentNode.Path__c+'|').contains('|'+result.refId+'|');</w:t>
         <w:br/>
         <w:t>if (isCycle) {</w:t>
         <w:br/>
@@ -7126,6 +7854,8 @@
         <w:br/>
         <w:t xml:space="preserve">    node.Context_Data__c = JSON.serialize(cd);</w:t>
         <w:br/>
+        <w:t xml:space="preserve">    node.Is_Circular__c = true; node.Is_Processed__c = true;</w:t>
+        <w:br/>
         <w:t>}</w:t>
       </w:r>
     </w:p>
@@ -7140,7 +7870,7 @@
           <w:color w:val="0070D2"/>
           <w:sz w:val="28"/>
         </w:rPr>
-        <w:t>5.5 Cleanup Batch</w:t>
+        <w:t>5.5 Two-Class Chained Cleanup</w:t>
       </w:r>
     </w:p>
     <w:p>
@@ -7155,17 +7885,81 @@
           <w:color w:val="1E1E2E"/>
           <w:sz w:val="18"/>
         </w:rPr>
-        <w:t>// Node_Chunk_Size__c default 2,000</w:t>
+        <w:t>// DependencyCleanupBatch - discovery only</w:t>
         <w:br/>
-        <w:t>while (!nodes.isEmpty()) {</w:t>
+        <w:t>public Database.QueryLocator start(ctx) {</w:t>
         <w:br/>
-        <w:t xml:space="preserve">    delete nodes;</w:t>
+        <w:t xml:space="preserve">    return Database.getQueryLocator([</w:t>
         <w:br/>
-        <w:t xml:space="preserve">    nodes = [SELECT Id FROM Dependency_Node__c WHERE Dependency_Job__c = :job.Id LIMIT :chunkSize];</w:t>
+        <w:t xml:space="preserve">        SELECT Id FROM Dependency_Job__c</w:t>
+        <w:br/>
+        <w:t xml:space="preserve">        WHERE Status__c IN ('Completed','Failed','Cancelled')</w:t>
+        <w:br/>
+        <w:t xml:space="preserve">        AND Closed_At__c &lt; :threshold</w:t>
+        <w:br/>
+        <w:t xml:space="preserve">    ]);</w:t>
         <w:br/>
         <w:t>}</w:t>
         <w:br/>
-        <w:t>delete job;</w:t>
+        <w:t>public void execute(ctx, List&lt;Dependency_Job__c&gt; scope) {</w:t>
+        <w:br/>
+        <w:t xml:space="preserve">    jobIds.addAll(new Map&lt;Id,Dependency_Job__c&gt;(scope).keySet());</w:t>
+        <w:br/>
+        <w:t>}</w:t>
+        <w:br/>
+        <w:t>public void finish(ctx) {</w:t>
+        <w:br/>
+        <w:t xml:space="preserve">    for (Id jId : jobIds)</w:t>
+        <w:br/>
+        <w:t xml:space="preserve">        Database.executeBatch(new DependencyNodeCleanupBatch(jId), chunkSize);</w:t>
+        <w:br/>
+        <w:t>}</w:t>
+      </w:r>
+    </w:p>
+    <w:p>
+      <w:pPr>
+        <w:spacing w:before="60" w:after="60"/>
+        <w:ind w:left="454"/>
+        <w:shd w:val="clear" w:color="auto" w:fill="EAECF0"/>
+      </w:pPr>
+      <w:r>
+        <w:rPr>
+          <w:rFonts w:ascii="Courier New" w:hAnsi="Courier New"/>
+          <w:color w:val="1E1E2E"/>
+          <w:sz w:val="18"/>
+        </w:rPr>
+        <w:t>// DependencyNodeCleanupBatch - node + parent deletion</w:t>
+        <w:br/>
+        <w:t>public Database.QueryLocator start(ctx) {</w:t>
+        <w:br/>
+        <w:t xml:space="preserve">    return Database.getQueryLocator(</w:t>
+        <w:br/>
+        <w:t xml:space="preserve">        [SELECT Id FROM Dependency_Node__c WHERE Dependency_Job__c = :jobId]);</w:t>
+        <w:br/>
+        <w:t>}</w:t>
+        <w:br/>
+        <w:t>public void execute(ctx, List&lt;Dependency_Node__c&gt; scope) { delete scope; }</w:t>
+        <w:br/>
+        <w:t>public void finish(ctx) {</w:t>
+        <w:br/>
+        <w:t xml:space="preserve">    delete [SELECT Id FROM Dependency_Job__c WHERE Id = :jobId];</w:t>
+        <w:br/>
+        <w:t>}</w:t>
+      </w:r>
+    </w:p>
+    <w:p>
+      <w:pPr>
+        <w:spacing w:before="60" w:after="120"/>
+        <w:ind w:left="283"/>
+        <w:shd w:val="clear" w:color="auto" w:fill="EFF4FB"/>
+      </w:pPr>
+      <w:r>
+        <w:rPr>
+          <w:i/>
+          <w:color w:val="032D60"/>
+          <w:sz w:val="19"/>
+        </w:rPr>
+        <w:t>Each execute() transaction deletes exactly one chunk (Node_Chunk_Size__c = 2,000 rows). No inner loops. Customer automation has 8,000 DML row headroom per transaction.</w:t>
       </w:r>
     </w:p>
     <w:p>
@@ -7179,7 +7973,7 @@
           <w:color w:val="0070D2"/>
           <w:sz w:val="28"/>
         </w:rPr>
-        <w:t>5.6 PE Degradation + AI Summary</w:t>
+        <w:t>5.6 PE Degradation + AISummaryQueueable</w:t>
       </w:r>
     </w:p>
     <w:p>
@@ -7194,18 +7988,30 @@
           <w:color w:val="1E1E2E"/>
           <w:sz w:val="18"/>
         </w:rPr>
-        <w:t>// OrgLimits check</w:t>
+        <w:t>// OrgLimits check in DependencyNotificationService</w:t>
         <w:br/>
         <w:t>OrgLimit pe = OrgLimits.getMap().get('DailyDeliveredPlatformEvents');</w:t>
         <w:br/>
-        <w:t>if (pe != null &amp;&amp; (Decimal)pe.getCurrentValue()/pe.getValue() &gt;= 0.80) return;</w:t>
+        <w:t>if (pe != null &amp;&amp; (Decimal)pe.getCurrentValue()/pe.getValue() &gt;= 0.80) {</w:t>
+        <w:br/>
+        <w:t xml:space="preserve">    // Append suppression notice to Error_Message__c</w:t>
+        <w:br/>
+        <w:t xml:space="preserve">    appendToErrorMessage(jobId, DateTime.now() + ': PE suppressed - daily limit &gt;80%');</w:t>
+        <w:br/>
+        <w:t xml:space="preserve">    settings.Disable_PE__c = true; // flip for rest of day</w:t>
+        <w:br/>
+        <w:t xml:space="preserve">    return;</w:t>
+        <w:br/>
+        <w:t>}</w:t>
         <w:br/>
         <w:t>EventBus.publish(evt);</w:t>
         <w:br/>
         <w:br/>
-        <w:t>// AI_Summary__c at Completed</w:t>
+        <w:t>// AISummaryQueueable.execute()</w:t>
         <w:br/>
         <w:t>job.AI_Summary__c = buildAiSummary(summaryMap); // plain-English from Summary_JSON__c</w:t>
+        <w:br/>
+        <w:t>update job;</w:t>
       </w:r>
     </w:p>
     <w:p>
@@ -7234,11 +8040,20 @@
           <w:color w:val="1E1E2E"/>
           <w:sz w:val="18"/>
         </w:rPr>
-        <w:t>Integer active = [SELECT COUNT() FROM AsyncApexJob</w:t>
+        <w:t>// In DependencyJobSelector.countActiveQueueables()</w:t>
         <w:br/>
-        <w:t xml:space="preserve">    WHERE JobType='Queueable' AND Status IN ('Processing','Preparing')];</w:t>
+        <w:t>return [SELECT COUNT() FROM AsyncApexJob</w:t>
         <w:br/>
-        <w:t>if (active &gt;= (Integer)settings.Max_Concurrent_Jobs__c)</w:t>
+        <w:t xml:space="preserve">    WHERE JobType='Queueable'</w:t>
+        <w:br/>
+        <w:t xml:space="preserve">    AND ApexClass.Name = 'DependencyQueueable'</w:t>
+        <w:br/>
+        <w:t xml:space="preserve">    AND Status IN ('Processing','Preparing')];</w:t>
+        <w:br/>
+        <w:br/>
+        <w:t>// In DependencyJobController.createJob()</w:t>
+        <w:br/>
+        <w:t>if (selector.countActiveQueueables() &gt;= (Integer)settings.Max_Concurrent_Jobs__c)</w:t>
         <w:br/>
         <w:t xml:space="preserve">    throw new DependencyJobException('Another scan is in progress.');</w:t>
       </w:r>
@@ -7895,7 +8710,7 @@
                 <w:color w:val="181818"/>
                 <w:sz w:val="20"/>
               </w:rPr>
-              <w:t>Follow nextRecordsUrl until done = true; each follow-up counted against callout budget</w:t>
+              <w:t>Follow nextRecordsUrl until done = true; try/catch for INVALID_QUERY_LOCATOR (cursor expiry) - restart from scratch, do not fail job</w:t>
             </w:r>
           </w:p>
         </w:tc>
@@ -8124,7 +8939,7 @@
                 <w:color w:val="181818"/>
                 <w:sz w:val="20"/>
               </w:rPr>
-              <w:t>@AuraEnabled controller boundary only</w:t>
+              <w:t>@AuraEnabled controller boundary only (getNodeHierarchy, getJobStatus, createJob, cancelJob, resumeJob)</w:t>
             </w:r>
           </w:p>
         </w:tc>
@@ -8156,7 +8971,7 @@
                 <w:color w:val="181818"/>
                 <w:sz w:val="20"/>
               </w:rPr>
-              <w:t>Queueable, cleanup batch, notification service</w:t>
+              <w:t>Queueable, cleanup batches, notification service, selector internals</w:t>
             </w:r>
           </w:p>
         </w:tc>
@@ -8220,7 +9035,7 @@
                 <w:color w:val="181818"/>
                 <w:sz w:val="20"/>
               </w:rPr>
-              <w:t>createJob() rejects when active &gt;= Max_Concurrent_Jobs__c</w:t>
+              <w:t>DependencyJobSelector.countActiveQueueables() &gt;= Max_Concurrent_Jobs__c</w:t>
             </w:r>
           </w:p>
         </w:tc>
@@ -8891,7 +9706,7 @@
                 <w:color w:val="181818"/>
                 <w:sz w:val="20"/>
               </w:rPr>
-              <w:t>True cycle. cycleClosesAt in Details Panel + tooltip.</w:t>
+              <w:t>True ancestry cycle. cycleClosesAt in Details Panel + tooltip.</w:t>
             </w:r>
           </w:p>
         </w:tc>
@@ -9221,7 +10036,7 @@
                 <w:color w:val="181818"/>
                 <w:sz w:val="20"/>
               </w:rPr>
-              <w:t>Placeholder: "Search nodes in this graph..." / note: "(Search applies to Graph view only)" / highlights matches / graph-local</w:t>
+              <w:t>Placeholder: "Search nodes in this graph..." / note: "(Search applies to Graph view only)" / highlights matches / graph-local / Esc clears</w:t>
             </w:r>
           </w:p>
         </w:tc>
@@ -9521,7 +10336,7 @@
                 <w:color w:val="181818"/>
                 <w:sz w:val="20"/>
               </w:rPr>
-              <w:t>package.xml - excludes managed packages. Tooltip: "Use this with Salesforce CLI or VS Code. Includes only components from this scan (managed packages excluded)."</w:t>
+              <w:t>package.xml - excludes managed packages. Tooltip: "Includes only components from this scan (managed packages excluded)."</w:t>
             </w:r>
           </w:p>
         </w:tc>
@@ -9763,7 +10578,7 @@
                 <w:color w:val="181818"/>
                 <w:sz w:val="20"/>
               </w:rPr>
-              <w:t>getSettings() - cached per-transaction</w:t>
+              <w:t>getSettings() - static cache; one SOQL per transaction regardless of how many classes call it</w:t>
             </w:r>
           </w:p>
         </w:tc>
@@ -9857,7 +10672,7 @@
                 <w:color w:val="181818"/>
                 <w:sz w:val="20"/>
               </w:rPr>
-              <w:t>getByIdForEngine(), getClosedJobsBefore()</w:t>
+              <w:t>getByIdForEngine(); getClosedJobsBefore(); countActiveQueueables() (ApexClass.Name filter)</w:t>
             </w:r>
           </w:p>
         </w:tc>
@@ -9904,7 +10719,7 @@
                 <w:color w:val="181818"/>
                 <w:sz w:val="20"/>
               </w:rPr>
-              <w:t>nextUnprocessed(), dedupForResults(), listByJob()</w:t>
+              <w:t>nextUnprocessed(); dedupForResults(); listByJob()</w:t>
             </w:r>
           </w:p>
         </w:tc>
@@ -10045,7 +10860,7 @@
                 <w:color w:val="181818"/>
                 <w:sz w:val="20"/>
               </w:rPr>
-              <w:t>buildToolingQuery(), QueryMore, HTTP 414 split, applyFlowFilter(), buildContextData(), computeScore()</w:t>
+              <w:t>buildToolingQuery(); QueryMore with cursor-expiry recovery; HTTP 414 split; applyFlowFilter(); buildContextData(); computeScore()</w:t>
             </w:r>
           </w:p>
         </w:tc>
@@ -10280,7 +11095,7 @@
                 <w:color w:val="181818"/>
                 <w:sz w:val="20"/>
               </w:rPr>
-              <w:t>Savepoint/catch; cancel/pause; overrideBatchSize; CMDT; hot-loop; 7-limit guardrail (pre + mid-loop); scoped dedup; bloom filter + Path__c cycle; upsert Node_Unique_Key__c; OrgLimits PE check; AI_Summary__c at Completed; self-chain</w:t>
+              <w:t>Savepoint/catch; cancel/pause; overrideBatchSize; CMDT via ISettingsProvider (static); hot-loop; 7-limit guardrail (pre + mid-loop, heap 0.70); scoped dedup; hash shortcut + delimiter-safe Path__c cycle; accumulate list + single bulk upsert; Ancestor_Hashes__c; OrgLimits PE check; self-chain</w:t>
             </w:r>
           </w:p>
         </w:tc>
@@ -10312,7 +11127,7 @@
                 <w:color w:val="181818"/>
                 <w:sz w:val="20"/>
               </w:rPr>
-              <w:t>Utility</w:t>
+              <w:t>Service (INotificationService)</w:t>
             </w:r>
           </w:p>
         </w:tc>
@@ -10327,7 +11142,7 @@
                 <w:color w:val="181818"/>
                 <w:sz w:val="20"/>
               </w:rPr>
-              <w:t>publishProgress() with OrgLimits check; sendCompletionNotification(); build AI_Summary__c</w:t>
+              <w:t>publishProgress() with OrgLimits check + Error_Message__c logging on suppression; sendCompletionNotification() enqueues AISummaryQueueable</w:t>
             </w:r>
           </w:p>
         </w:tc>
@@ -10344,7 +11159,7 @@
                 <w:color w:val="181818"/>
                 <w:sz w:val="20"/>
               </w:rPr>
-              <w:t>DependencyCleanupBatch</w:t>
+              <w:t>AISummaryQueueable</w:t>
             </w:r>
           </w:p>
         </w:tc>
@@ -10359,7 +11174,7 @@
                 <w:color w:val="181818"/>
                 <w:sz w:val="20"/>
               </w:rPr>
-              <w:t>Batchable</w:t>
+              <w:t>Queueable</w:t>
             </w:r>
           </w:p>
         </w:tc>
@@ -10374,7 +11189,7 @@
                 <w:color w:val="181818"/>
                 <w:sz w:val="20"/>
               </w:rPr>
-              <w:t>Scope = 1. Node_Chunk_Size__c chunks before parent delete. Closed_At__c filter.</w:t>
+              <w:t>One-shot. Reads Summary_JSON__c; builds plain-English AI_Summary__c; updates Job. Offloaded from engine final transaction.</w:t>
             </w:r>
           </w:p>
         </w:tc>
@@ -10391,6 +11206,100 @@
                 <w:color w:val="181818"/>
                 <w:sz w:val="20"/>
               </w:rPr>
+              <w:t>DependencyCleanupBatch</w:t>
+            </w:r>
+          </w:p>
+        </w:tc>
+        <w:tc>
+          <w:tcPr>
+            <w:tcW w:type="dxa" w:w="3022"/>
+            <w:shd w:val="clear" w:color="auto" w:fill="F2F4F7"/>
+          </w:tcPr>
+          <w:p>
+            <w:r>
+              <w:rPr>
+                <w:color w:val="181818"/>
+                <w:sz w:val="20"/>
+              </w:rPr>
+              <w:t>Batchable</w:t>
+            </w:r>
+          </w:p>
+        </w:tc>
+        <w:tc>
+          <w:tcPr>
+            <w:tcW w:type="dxa" w:w="3022"/>
+            <w:shd w:val="clear" w:color="auto" w:fill="F2F4F7"/>
+          </w:tcPr>
+          <w:p>
+            <w:r>
+              <w:rPr>
+                <w:color w:val="181818"/>
+                <w:sz w:val="20"/>
+              </w:rPr>
+              <w:t>Discovery only. start() = closed jobs past threshold. execute() = accumulate IDs. finish() = fire one DependencyNodeCleanupBatch per job.</w:t>
+            </w:r>
+          </w:p>
+        </w:tc>
+      </w:tr>
+      <w:tr>
+        <w:tc>
+          <w:tcPr>
+            <w:tcW w:type="dxa" w:w="3022"/>
+            <w:shd w:val="clear" w:color="auto" w:fill="FFFFFF"/>
+          </w:tcPr>
+          <w:p>
+            <w:r>
+              <w:rPr>
+                <w:color w:val="181818"/>
+                <w:sz w:val="20"/>
+              </w:rPr>
+              <w:t>DependencyNodeCleanupBatch</w:t>
+            </w:r>
+          </w:p>
+        </w:tc>
+        <w:tc>
+          <w:tcPr>
+            <w:tcW w:type="dxa" w:w="3022"/>
+            <w:shd w:val="clear" w:color="auto" w:fill="FFFFFF"/>
+          </w:tcPr>
+          <w:p>
+            <w:r>
+              <w:rPr>
+                <w:color w:val="181818"/>
+                <w:sz w:val="20"/>
+              </w:rPr>
+              <w:t>Batchable</w:t>
+            </w:r>
+          </w:p>
+        </w:tc>
+        <w:tc>
+          <w:tcPr>
+            <w:tcW w:type="dxa" w:w="3022"/>
+            <w:shd w:val="clear" w:color="auto" w:fill="FFFFFF"/>
+          </w:tcPr>
+          <w:p>
+            <w:r>
+              <w:rPr>
+                <w:color w:val="181818"/>
+                <w:sz w:val="20"/>
+              </w:rPr>
+              <w:t>Node + job deletion. start() = QueryLocator for nodes by jobId. execute() = delete scope. finish() = delete parent job. Batch size = Node_Chunk_Size__c.</w:t>
+            </w:r>
+          </w:p>
+        </w:tc>
+      </w:tr>
+      <w:tr>
+        <w:tc>
+          <w:tcPr>
+            <w:tcW w:type="dxa" w:w="3022"/>
+            <w:shd w:val="clear" w:color="auto" w:fill="F2F4F7"/>
+          </w:tcPr>
+          <w:p>
+            <w:r>
+              <w:rPr>
+                <w:color w:val="181818"/>
+                <w:sz w:val="20"/>
+              </w:rPr>
               <w:t>DependencyCleanupScheduler</w:t>
             </w:r>
           </w:p>
@@ -10421,7 +11330,7 @@
                 <w:color w:val="181818"/>
                 <w:sz w:val="20"/>
               </w:rPr>
-              <w:t>Schedules cleanup at 02:00</w:t>
+              <w:t>Schedules DependencyCleanupBatch at 02:00</w:t>
             </w:r>
           </w:p>
         </w:tc>
@@ -10554,7 +11463,7 @@
                 <w:color w:val="181818"/>
                 <w:sz w:val="20"/>
               </w:rPr>
-              <w:t>Char-budget chunk; QueryMore; HTTP 414; Flow filter; buildContextData(); computeScore() deterministic</w:t>
+              <w:t>Char-budget chunk; QueryMore; INVALID_QUERY_LOCATOR restart; HTTP 414; Flow filter; buildContextData(); computeScore() deterministic</w:t>
             </w:r>
           </w:p>
         </w:tc>
@@ -10586,7 +11495,7 @@
                 <w:color w:val="181818"/>
                 <w:sz w:val="20"/>
               </w:rPr>
-              <w:t>Normal; diamond (not circular); true cycle (Path__c kept, Is_Circular__c, cycleClosesAt); cancel/pause; all 7 guardrail limits; savepoint rollback + Failed; Completed + AI_Summary__c + Closed_At__c; overrideBatchSize one-execution only; hot-loop pause; OrgLimits auto-suppress PE; dedup; Ancestors_Hash__c Long Text no overflow at depth 50+</w:t>
+              <w:t>Normal; diamond (not circular); delimiter-safe true cycle (Path__c kept, Is_Circular__c, cycleClosesAt); cancel/pause; all 7 guardrail limits (including heap at 0.70); savepoint rollback + Failed; Completed + Closed_At__c; overrideBatchSize one-execution; hot-loop pause; OrgLimits auto-suppress PE + Error_Message__c append; dedup; Ancestor_Hashes__c no overflow at depth 50+; Path__c safe-fail truncation; single bulk upsert (never per-node)</w:t>
             </w:r>
           </w:p>
         </w:tc>
@@ -10618,7 +11527,7 @@
                 <w:color w:val="181818"/>
                 <w:sz w:val="20"/>
               </w:rPr>
-              <w:t>Node_Chunk_Size__c from CMDT; Closed_At__c filter; no active jobs deleted; scope = 1</w:t>
+              <w:t>DependencyCleanupBatch fires one DependencyNodeCleanupBatch per job; Closed_At__c filter; active jobs preserved; DependencyNodeCleanupBatch deletes nodes in chunks then parent; 10,001+ nodes handled safely</w:t>
             </w:r>
           </w:p>
         </w:tc>
@@ -10650,7 +11559,7 @@
                 <w:color w:val="181818"/>
                 <w:sz w:val="20"/>
               </w:rPr>
-              <w:t>OrgLimits &gt;80% auto-suppress; Disable_PE__c; AI_Summary__c built from Summary_JSON__c</w:t>
+              <w:t>OrgLimits &gt;80% auto-suppress + Error_Message__c append; Disable_PE__c; AISummaryQueueable enqueued on Completed</w:t>
             </w:r>
           </w:p>
         </w:tc>
@@ -10667,7 +11576,7 @@
                 <w:color w:val="181818"/>
                 <w:sz w:val="20"/>
               </w:rPr>
-              <w:t>CustomFieldHandlerTest</w:t>
+              <w:t>AISummaryQueueableTest</w:t>
             </w:r>
           </w:p>
         </w:tc>
@@ -10682,7 +11591,7 @@
                 <w:color w:val="181818"/>
                 <w:sz w:val="20"/>
               </w:rPr>
-              <w:t>WorkflowFieldUpdate (95); ValidationRule (65); FlexiPage (60); no results</w:t>
+              <w:t>AI_Summary__c built from Summary_JSON__c; job updated; null Summary_JSON__c handled</w:t>
             </w:r>
           </w:p>
         </w:tc>
@@ -10699,7 +11608,7 @@
                 <w:color w:val="181818"/>
                 <w:sz w:val="20"/>
               </w:rPr>
-              <w:t>ApexClassHandlerTest</w:t>
+              <w:t>CustomFieldHandlerTest</w:t>
             </w:r>
           </w:p>
         </w:tc>
@@ -10714,7 +11623,7 @@
                 <w:color w:val="181818"/>
                 <w:sz w:val="20"/>
               </w:rPr>
-              <w:t>CMT (85); Is_Dynamic_Reference__c</w:t>
+              <w:t>WorkflowFieldUpdate (95); ValidationRule (65); FlexiPage (60); no results</w:t>
             </w:r>
           </w:p>
         </w:tc>
@@ -10731,7 +11640,7 @@
                 <w:color w:val="181818"/>
                 <w:sz w:val="20"/>
               </w:rPr>
-              <w:t>FlowHandlerTest</w:t>
+              <w:t>ApexClassHandlerTest</w:t>
             </w:r>
           </w:p>
         </w:tc>
@@ -10746,7 +11655,7 @@
                 <w:color w:val="181818"/>
                 <w:sz w:val="20"/>
               </w:rPr>
-              <w:t>QuickAction; subflow; no results</w:t>
+              <w:t>CMT (85); Is_Dynamic_Reference__c</w:t>
             </w:r>
           </w:p>
         </w:tc>
@@ -10763,7 +11672,7 @@
                 <w:color w:val="181818"/>
                 <w:sz w:val="20"/>
               </w:rPr>
-              <w:t>PermissionTest</w:t>
+              <w:t>FlowHandlerTest</w:t>
             </w:r>
           </w:p>
         </w:tc>
@@ -10778,7 +11687,7 @@
                 <w:color w:val="181818"/>
                 <w:sz w:val="20"/>
               </w:rPr>
-              <w:t>USER_MODE failures at controller; SYSTEM_MODE engine success</w:t>
+              <w:t>QuickAction; subflow; no results</w:t>
             </w:r>
           </w:p>
         </w:tc>
@@ -10795,7 +11704,7 @@
                 <w:color w:val="181818"/>
                 <w:sz w:val="20"/>
               </w:rPr>
-              <w:t>GraphExportTest</w:t>
+              <w:t>PermissionTest</w:t>
             </w:r>
           </w:p>
         </w:tc>
@@ -10803,6 +11712,38 @@
           <w:tcPr>
             <w:tcW w:type="dxa" w:w="4533"/>
             <w:shd w:val="clear" w:color="auto" w:fill="FFFFFF"/>
+          </w:tcPr>
+          <w:p>
+            <w:r>
+              <w:rPr>
+                <w:color w:val="181818"/>
+                <w:sz w:val="20"/>
+              </w:rPr>
+              <w:t>USER_MODE failures at controller; SYSTEM_MODE engine success</w:t>
+            </w:r>
+          </w:p>
+        </w:tc>
+      </w:tr>
+      <w:tr>
+        <w:tc>
+          <w:tcPr>
+            <w:tcW w:type="dxa" w:w="4533"/>
+            <w:shd w:val="clear" w:color="auto" w:fill="F2F4F7"/>
+          </w:tcPr>
+          <w:p>
+            <w:r>
+              <w:rPr>
+                <w:color w:val="181818"/>
+                <w:sz w:val="20"/>
+              </w:rPr>
+              <w:t>GraphExportTest</w:t>
+            </w:r>
+          </w:p>
+        </w:tc>
+        <w:tc>
+          <w:tcPr>
+            <w:tcW w:type="dxa" w:w="4533"/>
+            <w:shd w:val="clear" w:color="auto" w:fill="F2F4F7"/>
           </w:tcPr>
           <w:p>
             <w:r>
@@ -11207,6 +12148,20 @@
           <w:color w:val="181818"/>
           <w:sz w:val="21"/>
         </w:rPr>
+        <w:t>Spanning tree model (by design): MetaMapper stores one parent per node (first-discovered path). A node reachable via multiple paths is inserted once. This is intentional - full DAG requires a junction object. All reachable dependencies are found; not all paths are shown.</w:t>
+      </w:r>
+    </w:p>
+    <w:p>
+      <w:pPr>
+        <w:pStyle w:val="ListBullet"/>
+        <w:spacing w:after="40"/>
+        <w:ind w:left="283"/>
+      </w:pPr>
+      <w:r>
+        <w:rPr>
+          <w:color w:val="181818"/>
+          <w:sz w:val="21"/>
+        </w:rPr>
         <w:t>Dynamic Apex string references are a permanent blind spot. Is_Dynamic_Reference__c = true. Cannot be resolved by any query.</w:t>
       </w:r>
     </w:p>
@@ -11235,7 +12190,7 @@
           <w:color w:val="181818"/>
           <w:sz w:val="21"/>
         </w:rPr>
-        <w:t>Cleanup deletes nodes in Node_Chunk_Size__c chunks (default 2,000). Do not raise above 4,000 for open-source deployments into unknown orgs.</w:t>
+        <w:t>DependencyNodeCleanupBatch deletes nodes in Node_Chunk_Size__c chunks (default 2,000) before parent. Do not raise above 4,000 for open-source deployments into unknown orgs.</w:t>
       </w:r>
     </w:p>
     <w:p>
@@ -11277,7 +12232,7 @@
           <w:color w:val="181818"/>
           <w:sz w:val="21"/>
         </w:rPr>
-        <w:t>Concurrent scans limited by Max_Concurrent_Jobs__c (default 2). Rejection is a deliberate safety constraint.</w:t>
+        <w:t>Concurrent scans limited by Max_Concurrent_Jobs__c (default 2). Concurrency check is advisory (not atomic lock) - near-zero race probability for admin tool usage.</w:t>
       </w:r>
     </w:p>
     <w:p>
@@ -11361,7 +12316,7 @@
           <w:color w:val="181818"/>
           <w:sz w:val="21"/>
         </w:rPr>
-        <w:t>Path__c String.contains() is CPU-intensive on deep trees. Ancestors_Hash__c (Long Text 32768) bloom filter short-circuits most checks.</w:t>
+        <w:t>Path__c String.contains() is CPU-intensive on deep trees. Ancestor_Hashes__c (Long Text 32768) hash shortcut reduces most checks to a fast contains() before the full path scan.</w:t>
       </w:r>
     </w:p>
     <w:p>
@@ -11375,7 +12330,7 @@
           <w:color w:val="181818"/>
           <w:sz w:val="21"/>
         </w:rPr>
-        <w:t>Hot-loop "Resume with reduced batch size" override applies for one Queueable execution only. If root cause is an exceptionally complex node, scan may pause again.</w:t>
+        <w:t>Ancestor_Hashes__c hash shortcut has negligible false-positive probability (6-char prefix collision); full delimiter-safe Path__c always confirms before Is_Circular__c = true.</w:t>
       </w:r>
     </w:p>
     <w:p>
@@ -11389,7 +12344,7 @@
           <w:color w:val="181818"/>
           <w:sz w:val="21"/>
         </w:rPr>
-        <w:t>Ancestors_Hash__c has negligible false-positive probability; full Path__c always confirms before Is_Circular__c = true.</w:t>
+        <w:t>Path__c safe-fail truncation triggers on extreme depth (&gt;~1,700 levels). Context_Data__c flagged with path_truncated: true.</w:t>
       </w:r>
     </w:p>
     <w:p>
@@ -11403,7 +12358,21 @@
           <w:color w:val="181818"/>
           <w:sz w:val="21"/>
         </w:rPr>
-        <w:t>AI_Summary__c is null until Status__c = Completed. Agentforce Actions must check Status__c first.</w:t>
+        <w:t>Hot-loop "Resume with reduced batch size" override applies for one Queueable execution. If root cause is an exceptionally complex node, scan may pause again.</w:t>
+      </w:r>
+    </w:p>
+    <w:p>
+      <w:pPr>
+        <w:pStyle w:val="ListBullet"/>
+        <w:spacing w:after="40"/>
+        <w:ind w:left="283"/>
+      </w:pPr>
+      <w:r>
+        <w:rPr>
+          <w:color w:val="181818"/>
+          <w:sz w:val="21"/>
+        </w:rPr>
+        <w:t>AI_Summary__c is null until AISummaryQueueable completes after Status__c = Completed. LWC polls getJobStatus() until non-null.</w:t>
       </w:r>
     </w:p>
     <w:p>
@@ -11445,7 +12414,7 @@
           <w:color w:val="181818"/>
           <w:sz w:val="21"/>
         </w:rPr>
-        <w:t>Guided tour uses localStorage (metaMapper_tourSeen). Tour reappears on a different browser or after clearing browser storage - acceptable for a localStorage-based flag.</w:t>
+        <w:t>Guided tour uses localStorage (metaMapper_tourSeen_v1). Reappears on a different browser or after cache clear. Bump version suffix on major UX changes to force re-tour.</w:t>
       </w:r>
     </w:p>
     <w:p>
@@ -11459,7 +12428,7 @@
           <w:color w:val="181818"/>
           <w:sz w:val="21"/>
         </w:rPr>
-        <w:t>Graph toolbar search and Tree search are both view-local by design. The note "(Search applies to this view only)" is shown in both views. This is a deliberate architectural decision to preserve the Tree/Graph synchronization model.</w:t>
+        <w:t>QueryMore cursor expiration: if a Queueable waits in the Flex Queue &gt; ~15 minutes, cursors expire. DependencyService restarts the query from scratch on INVALID_QUERY_LOCATOR (no job failure).</w:t>
       </w:r>
     </w:p>
     <w:p>
@@ -11804,7 +12773,7 @@
           <w:color w:val="181818"/>
           <w:sz w:val="21"/>
         </w:rPr>
-        <w:t>First-time guided tour (one-time lightning-modal after health check passes; localStorage metaMapper_tourSeen not set):</w:t>
+        <w:t>First-time guided tour (one-time lightning-modal after health check passes; localStorage metaMapper_tourSeen_v1 not set):</w:t>
       </w:r>
     </w:p>
     <w:tbl>
@@ -12024,7 +12993,7 @@
           <w:color w:val="032D60"/>
           <w:sz w:val="19"/>
         </w:rPr>
-        <w:t>"Do not show again" checkbox persists localStorage flag. Tour reappears on a different browser or after cache clear - acceptable behaviour.</w:t>
+        <w:t>"Do not show again" checkbox persists metaMapper_tourSeen_v1 flag. Tour reappears on a different browser or after cache clear. Bump version suffix on major UX changes to force re-tour.</w:t>
       </w:r>
     </w:p>
     <w:p>
@@ -13872,7 +14841,7 @@
                 <w:color w:val="181818"/>
                 <w:sz w:val="20"/>
               </w:rPr>
-              <w:t>Debounced 300ms on Metadata_Name__c; highlights matches; label: "Search applies to this view only."</w:t>
+              <w:t>Debounced 300ms on Metadata_Name__c; highlights matches; label: "(Search applies to this view only)"</w:t>
             </w:r>
           </w:p>
         </w:tc>
@@ -14484,7 +15453,7 @@
           <w:color w:val="181818"/>
           <w:sz w:val="21"/>
         </w:rPr>
-        <w:t>Shown at top of Results screen (above tabs) when Status__c = Completed only:</w:t>
+        <w:t>Shown at top of Results screen (above tabs) when Status__c = Completed AND AI_Summary__c is non-null (LWC polls getJobStatus() until populated):</w:t>
       </w:r>
     </w:p>
     <w:tbl>
@@ -16047,7 +17016,7 @@
                 <w:color w:val="181818"/>
                 <w:sz w:val="20"/>
               </w:rPr>
-              <w:t>Clears metaMapper_tourSeen localStorage flag for current browser. Useful for admins demoing the tour to new team members. Client-side JS only - no Apex required.</w:t>
+              <w:t>Clears metaMapper_tourSeen_v1 localStorage flag for current browser. Client-side JS only - no Apex required.</w:t>
             </w:r>
           </w:p>
         </w:tc>

</xml_diff>

<commit_message>
MetaMapper TDD v12.0 - full naming standards: 25 renames (objects, fields, PE, CMDT, Apex), component descriptions for all metadata, consistent PascalCase/camelCase throughout
</commit_message>
<xml_diff>
--- a/projects/meta-mapper/MetaMapper_Technical_Design.docx
+++ b/projects/meta-mapper/MetaMapper_Technical_Design.docx
@@ -38,7 +38,7 @@
           <w:color w:val="706E6B"/>
           <w:sz w:val="24"/>
         </w:rPr>
-        <w:t>Version 11.0 | April 2026</w:t>
+        <w:t>Version 12.0 | April 2026</w:t>
       </w:r>
     </w:p>
     <w:p/>
@@ -118,7 +118,7 @@
           <w:color w:val="181818"/>
           <w:sz w:val="21"/>
         </w:rPr>
-        <w:t>Six rounds of architecture review and five rounds of UX expert review are incorporated across v4.0-v11.0. All critical risks have been resolved.</w:t>
+        <w:t>Six rounds of architecture review and five rounds of UX expert review are incorporated across v4.0-v12.0. All critical risks have been resolved.</w:t>
       </w:r>
     </w:p>
     <w:p>
@@ -132,7 +132,7 @@
           <w:color w:val="0070D2"/>
           <w:sz w:val="21"/>
         </w:rPr>
-        <w:t>v11.0 fixes: spanning tree model documented, concurrency guard selectivity, Node_Unique_Key__c widened to Text 80, Ancestor_Hashes__c renamed and algorithm clarified, two-class cleanup chain replacing inner while-loop, AISummaryQueueable offload, QueryMore cursor expiration handling, heap guardrail lowered to 70%, delimiter-safe cycle check, static settings cache, PE suppression logging, localStorage version suffix.</w:t>
+        <w:t>v12.0 fixes: spanning tree model documented, concurrency guard selectivity, Deduplication_Key__c widened to Text 80, Ancestor_Hash_Index__c renamed and algorithm clarified, two-class cleanup chain replacing inner while-loop, ScanSummaryQueueable offload, QueryMore cursor expiration handling, heap guardrail lowered to 70%, delimiter-safe cycle check, static settings cache, PE suppression logging, localStorage version suffix.</w:t>
       </w:r>
     </w:p>
     <w:p>
@@ -168,7 +168,7 @@
           <w:color w:val="181818"/>
           <w:sz w:val="21"/>
         </w:rPr>
-        <w:t>Sections 2.1-2.39 cover v4.0-v8.0 fixes. Sections 2.40-2.48 cover v9.0. Sections 2.49-2.55 cover v10.0. Sections 2.56-2.70 cover v11.0.</w:t>
+        <w:t>Sections 2.1-2.39 cover v4.0-v8.0 fixes. Sections 2.40-2.48 cover v9.0. Sections 2.49-2.55 cover v10.0. Sections 2.56-2.70 cover v12.0.</w:t>
       </w:r>
     </w:p>
     <w:p>
@@ -368,7 +368,7 @@
                 <w:color w:val="181818"/>
                 <w:sz w:val="20"/>
               </w:rPr>
-              <w:t>Path__c pipe-delimited ancestor chain</w:t>
+              <w:t>Ancestor_Path__c pipe-delimited ancestor chain</w:t>
             </w:r>
           </w:p>
         </w:tc>
@@ -788,9 +788,9 @@
           <w:color w:val="1E1E2E"/>
           <w:sz w:val="18"/>
         </w:rPr>
-        <w:t>SELECT Metadata_ID__c FROM Dependency_Node__c</w:t>
+        <w:t>SELECT Metadata_Id__c FROM Metadata_Dependency__c</w:t>
         <w:br/>
-        <w:t>WHERE Dependency_Job__c = :jobId AND Metadata_ID__c IN :currentResultIds</w:t>
+        <w:t>WHERE Metadata_Scan_Job__c = :jobId AND Metadata_Id__c IN :currentResultIds</w:t>
       </w:r>
     </w:p>
     <w:p>
@@ -818,7 +818,7 @@
           <w:color w:val="181818"/>
           <w:sz w:val="21"/>
         </w:rPr>
-        <w:t>See v5.0-v6.0 history. Extended and superseded by v7.0-v11.0 below.</w:t>
+        <w:t>See v5.0-v6.0 history. Extended and superseded by v7.0-v12.0 below.</w:t>
       </w:r>
     </w:p>
     <w:p>
@@ -861,7 +861,7 @@
           <w:color w:val="181818"/>
           <w:sz w:val="21"/>
         </w:rPr>
-        <w:t>Fix: Node_Chunk_Size__c CMDT (default 2,000). Two-class chained cleanup in v11.0 (Section 2.58).</w:t>
+        <w:t>Fix: Cleanup_Chunk_Size__c CMDT (default 2,000). Two-class chained cleanup in v12.0 (Section 2.58).</w:t>
       </w:r>
     </w:p>
     <w:p>
@@ -1018,7 +1018,7 @@
           <w:color w:val="0070D2"/>
           <w:sz w:val="28"/>
         </w:rPr>
-        <w:t>2.20 Path__c Correctness (v6.0)</w:t>
+        <w:t>2.20 Ancestor_Path__c Correctness (v6.0)</w:t>
       </w:r>
     </w:p>
     <w:p>
@@ -1032,7 +1032,7 @@
           <w:color w:val="181818"/>
           <w:sz w:val="21"/>
         </w:rPr>
-        <w:t>Root: Path__c = "".</w:t>
+        <w:t>Root: Ancestor_Path__c = "".</w:t>
       </w:r>
     </w:p>
     <w:p>
@@ -1046,7 +1046,7 @@
           <w:color w:val="181818"/>
           <w:sz w:val="21"/>
         </w:rPr>
-        <w:t>child.Path__c = (isBlank(parent) ? "" : parent+"|") + parentId.</w:t>
+        <w:t>child.Ancestor_Path__c = (isBlank(parent) ? "" : parent+"|") + parentId.</w:t>
       </w:r>
     </w:p>
     <w:p>
@@ -1060,7 +1060,7 @@
           <w:color w:val="181818"/>
           <w:sz w:val="21"/>
         </w:rPr>
-        <w:t>Circular: Path__c KEPT. cycleClosesAt in Context_Data__c.</w:t>
+        <w:t>Circular: Ancestor_Path__c KEPT. cycleClosesAt in Dependency_Context__c.</w:t>
       </w:r>
     </w:p>
     <w:p>
@@ -1337,7 +1337,7 @@
           <w:color w:val="181818"/>
           <w:sz w:val="21"/>
         </w:rPr>
-        <w:t>Interfaces: IDependencyService, INotificationService, ISettingsProvider, IDependencyTypeHandler.</w:t>
+        <w:t>Interfaces: IMetadataMetadataDependencyService, INotificationService, ISettingsProvider, IDependencyTypeHandler.</w:t>
       </w:r>
     </w:p>
     <w:p>
@@ -1380,7 +1380,7 @@
           <w:color w:val="1E1E2E"/>
           <w:sz w:val="18"/>
         </w:rPr>
-        <w:t>Database.upsert(insertList, Dependency_Node__c.Node_Unique_Key__c, false);</w:t>
+        <w:t>Database.upsert(insertList, Metadata_Dependency__c.Deduplication_Key__c, false);</w:t>
       </w:r>
     </w:p>
     <w:p>
@@ -1436,7 +1436,7 @@
           <w:color w:val="181818"/>
           <w:sz w:val="21"/>
         </w:rPr>
-        <w:t>Increment Rechain_Count__c each self-chain.</w:t>
+        <w:t>Increment Processing_Cycle_Count__c each self-chain.</w:t>
       </w:r>
     </w:p>
     <w:p>
@@ -1450,7 +1450,7 @@
           <w:color w:val="181818"/>
           <w:sz w:val="21"/>
         </w:rPr>
-        <w:t>If Rechain_Count__c increases by Hotloop_Threshold__c with no Nodes_Processed__c change: Status__c = Paused.</w:t>
+        <w:t>If Processing_Cycle_Count__c increases by Stall_Detection_Threshold__c with no Components_Analyzed__c change: Status__c = Paused.</w:t>
       </w:r>
     </w:p>
     <w:p>
@@ -1478,7 +1478,7 @@
           <w:color w:val="181818"/>
           <w:sz w:val="21"/>
         </w:rPr>
-        <w:t>NamedCredentialHealthCheck.verify() on app mount. Extended to three-state model in v8.0 (2.36).</w:t>
+        <w:t>ToolingApiHealthCheck.verify() on app mount. Extended to three-state model in v8.0 (2.36).</w:t>
       </w:r>
     </w:p>
     <w:p>
@@ -1815,7 +1815,7 @@
           <w:color w:val="0070D2"/>
           <w:sz w:val="28"/>
         </w:rPr>
-        <w:t>2.31 Ancestor_Hashes__c - Long Text 32768 + Algorithm Clarified (v8.0/v11.0)</w:t>
+        <w:t>2.31 Ancestor_Hash_Index__c - Long Text 32768 + Algorithm Clarified (v8.0/v12.0)</w:t>
       </w:r>
     </w:p>
     <w:p>
@@ -1830,7 +1830,7 @@
           <w:color w:val="032D60"/>
           <w:sz w:val="19"/>
         </w:rPr>
-        <w:t>Field was Text 255 in early design - overflows at depth &gt; 42 (255 / 6 = 42 hashes). Silent StringException on upsert. Also renamed from Ancestors_Hash__c (v11.0) - previous name implied a probabilistic bloom filter which is misleading.</w:t>
+        <w:t>Field was Text 255 in early design - overflows at depth &gt; 42 (255 / 6 = 42 hashes). Silent StringException on upsert. Also renamed from Ancestors_Hash__c (v12.0) - previous name implied a probabilistic bloom filter which is misleading.</w:t>
       </w:r>
     </w:p>
     <w:p>
@@ -1844,7 +1844,7 @@
           <w:color w:val="181818"/>
           <w:sz w:val="21"/>
         </w:rPr>
-        <w:t>Fix: Ancestor_Hashes__c = Long Text 32768. Algorithm: concatenate 6-char base64url hash prefix per ancestor ID. Use contains(shortHash) as a fast shortcut; always confirm with full delimiter-safe Path__c check before marking circular.</w:t>
+        <w:t>Fix: Ancestor_Hash_Index__c = Long Text 32768. Algorithm: concatenate 6-char base64url hash prefix per ancestor ID. Use contains(shortHash) as a fast shortcut; always confirm with full delimiter-safe Ancestor_Path__c check before marking circular.</w:t>
       </w:r>
     </w:p>
     <w:p>
@@ -1887,7 +1887,7 @@
           <w:color w:val="181818"/>
           <w:sz w:val="21"/>
         </w:rPr>
-        <w:t>Fix: Node_Chunk_Size__c CMDT (default 2,000). 8,000 rows headroom for customer triggers.</w:t>
+        <w:t>Fix: Cleanup_Chunk_Size__c CMDT (default 2,000). 8,000 rows headroom for customer triggers.</w:t>
       </w:r>
     </w:p>
     <w:p>
@@ -1901,7 +1901,7 @@
           <w:color w:val="0070D2"/>
           <w:sz w:val="28"/>
         </w:rPr>
-        <w:t>2.33 Concurrency Guard - Selectivity Fix (v8.0/v11.0)</w:t>
+        <w:t>2.33 Concurrency Guard - Selectivity Fix (v8.0/v12.0)</w:t>
       </w:r>
     </w:p>
     <w:p>
@@ -1984,7 +1984,7 @@
           <w:color w:val="181818"/>
           <w:sz w:val="21"/>
         </w:rPr>
-        <w:t>OrgLimits check before publish. Auto-suppress + flip Disable_PE__c if &gt; 80% daily PE consumed. Append suppression notice to Error_Message__c for admin visibility (v11.0).</w:t>
+        <w:t>OrgLimits check before publish. Auto-suppress + flip Disable_Platform_Events__c if &gt; 80% daily PE consumed. Append suppression notice to Error_Status_Message__c for admin visibility (v12.0).</w:t>
       </w:r>
     </w:p>
     <w:p>
@@ -1998,7 +1998,7 @@
           <w:color w:val="0070D2"/>
           <w:sz w:val="28"/>
         </w:rPr>
-        <w:t>2.35 AI_Summary__c Field + AISummaryQueueable (v8.0/v11.0)</w:t>
+        <w:t>2.35 Scan_Summary_Text__c Field + ScanSummaryQueueable (v8.0/v12.0)</w:t>
       </w:r>
     </w:p>
     <w:p>
@@ -2012,7 +2012,7 @@
           <w:color w:val="181818"/>
           <w:sz w:val="21"/>
         </w:rPr>
-        <w:t>Plain-English summary at job Completed. Enables Agentforce Actions without JSON parsing. In v11.0: generation offloaded to AISummaryQueueable - not built inline in the final engine transaction.</w:t>
+        <w:t>Plain-English summary at job Completed. Enables Agentforce Actions without JSON parsing. In v12.0: generation offloaded to ScanSummaryQueueable - not built inline in the final engine transaction.</w:t>
       </w:r>
     </w:p>
     <w:p>
@@ -2321,7 +2321,7 @@
           <w:color w:val="181818"/>
           <w:sz w:val="21"/>
         </w:rPr>
-        <w:t>Every Context_Data__c key maps to a human sentence. Raw JSON never rendered in UI.</w:t>
+        <w:t>Every Dependency_Context__c key maps to a human sentence. Raw JSON never rendered in UI.</w:t>
       </w:r>
     </w:p>
     <w:p>
@@ -2405,7 +2405,7 @@
           <w:color w:val="181818"/>
           <w:sz w:val="21"/>
         </w:rPr>
-        <w:t>AI_Summary__c displayed at top of Results when Completed. Copy + Ask Copilot. Compact by default (3 lines max, Show more toggle). See Section 14.8.</w:t>
+        <w:t>Scan_Summary_Text__c displayed at top of Results when Completed. Copy + Ask Copilot. Compact by default (3 lines max, Show more toggle). See Section 14.8.</w:t>
       </w:r>
     </w:p>
     <w:p>
@@ -2489,7 +2489,7 @@
           <w:color w:val="181818"/>
           <w:sz w:val="21"/>
         </w:rPr>
-        <w:t>Pause banner: "Resume with reduced batch size" (half Batch_Size__c, transient - no CMDT write) or "Resume with current settings". resumeJob(jobId, overrideBatchSize).</w:t>
+        <w:t>Pause banner: "Resume with reduced batch size" (half Scan_Batch_Size__c, transient - no CMDT write) or "Resume with current settings". resumeJob(jobId, overrideBatchSize).</w:t>
       </w:r>
     </w:p>
     <w:p>
@@ -2729,7 +2729,7 @@
           <w:color w:val="0070D2"/>
           <w:sz w:val="28"/>
         </w:rPr>
-        <w:t>2.48 Node_Chunk_Size__c Help Text (v9.0)</w:t>
+        <w:t>2.48 Cleanup_Chunk_Size__c Help Text (v9.0)</w:t>
       </w:r>
     </w:p>
     <w:p>
@@ -2953,7 +2953,7 @@
           <w:color w:val="0070D2"/>
           <w:sz w:val="28"/>
         </w:rPr>
-        <w:t>2.56 Spanning Tree Model - Intentional Design (v11.0)</w:t>
+        <w:t>2.56 Spanning Tree Model - Intentional Design (v12.0)</w:t>
       </w:r>
     </w:p>
     <w:p>
@@ -2982,7 +2982,7 @@
           <w:color w:val="181818"/>
           <w:sz w:val="21"/>
         </w:rPr>
-        <w:t>Each Dependency_Node__c stores one Parent_Node__c (first-discovered path). A node reachable via multiple paths is inserted once; subsequent arrivals deduplicated. This is intentional: full DAG requires a junction object with significantly higher DML/storage cost. The spanning tree correctly shows all reachable dependencies; it does not show all dependency paths. Documented in setup/SETUP.md.</w:t>
+        <w:t>Each Metadata_Dependency__c stores one Parent_Node__c (first-discovered path). A node reachable via multiple paths is inserted once; subsequent arrivals deduplicated. This is intentional: full DAG requires a junction object with significantly higher DML/storage cost. The spanning tree correctly shows all reachable dependencies; it does not show all dependency paths. Documented in setup/SETUP.md.</w:t>
       </w:r>
     </w:p>
     <w:p>
@@ -2996,7 +2996,7 @@
           <w:color w:val="0070D2"/>
           <w:sz w:val="28"/>
         </w:rPr>
-        <w:t>2.57 Node_Unique_Key__c Widened to Text 80 (v11.0)</w:t>
+        <w:t>2.57 Deduplication_Key__c Widened to Text 80 (v12.0)</w:t>
       </w:r>
     </w:p>
     <w:p>
@@ -3024,7 +3024,7 @@
           <w:color w:val="0070D2"/>
           <w:sz w:val="28"/>
         </w:rPr>
-        <w:t>2.58 Two-Class Chained Cleanup (v11.0) - CRITICAL</w:t>
+        <w:t>2.58 Two-Class Chained Cleanup (v12.0) - CRITICAL</w:t>
       </w:r>
     </w:p>
     <w:p>
@@ -3072,17 +3072,17 @@
         <w:br/>
         <w:t>public Database.QueryLocator start(ctx) {</w:t>
         <w:br/>
-        <w:t xml:space="preserve">    return Database.getQueryLocator([SELECT Id FROM Dependency_Node__c</w:t>
+        <w:t xml:space="preserve">    return Database.getQueryLocator([SELECT Id FROM Metadata_Dependency__c</w:t>
         <w:br/>
-        <w:t xml:space="preserve">        WHERE Dependency_Job__c = :jobId]);</w:t>
+        <w:t xml:space="preserve">        WHERE Metadata_Scan_Job__c = :jobId]);</w:t>
         <w:br/>
         <w:t>}</w:t>
         <w:br/>
-        <w:t>public void execute(ctx, List&lt;Dependency_Node__c&gt; scope) { delete scope; }</w:t>
+        <w:t>public void execute(ctx, List&lt;Metadata_Dependency__c&gt; scope) { delete scope; }</w:t>
         <w:br/>
         <w:t>public void finish(ctx) {</w:t>
         <w:br/>
-        <w:t xml:space="preserve">    delete [SELECT Id FROM Dependency_Job__c WHERE Id = :jobId];</w:t>
+        <w:t xml:space="preserve">    delete [SELECT Id FROM Metadata_Scan_Job__c WHERE Id = :jobId];</w:t>
         <w:br/>
         <w:t>}</w:t>
       </w:r>
@@ -3098,7 +3098,7 @@
           <w:color w:val="0070D2"/>
           <w:sz w:val="28"/>
         </w:rPr>
-        <w:t>2.59 AISummaryQueueable - Offload from Engine (v11.0)</w:t>
+        <w:t>2.59 ScanSummaryQueueable - Offload from Engine (v12.0)</w:t>
       </w:r>
     </w:p>
     <w:p>
@@ -3112,7 +3112,7 @@
           <w:color w:val="181818"/>
           <w:sz w:val="21"/>
         </w:rPr>
-        <w:t>AI_Summary__c generation was inline in the final DependencyQueueable execution (string templating + JSON handling on an already-stressed transaction). Moved to AISummaryQueueable: a lightweight one-shot Queueable enqueued by DependencyNotificationService.sendCompletionNotification(). LWC polls getJobStatus() until AI_Summary__c is non-null before rendering the Summary Card.</w:t>
+        <w:t>Scan_Summary_Text__c generation was inline in the final DependencyQueueable execution (string templating + JSON handling on an already-stressed transaction). Moved to ScanSummaryQueueable: a lightweight one-shot Queueable enqueued by DependencyNotificationService.sendCompletionNotification(). LWC polls getJobStatus() until Scan_Summary_Text__c is non-null before rendering the Summary Card.</w:t>
       </w:r>
     </w:p>
     <w:p>
@@ -3126,7 +3126,7 @@
           <w:color w:val="0070D2"/>
           <w:sz w:val="28"/>
         </w:rPr>
-        <w:t>2.60 QueryMore Cursor Expiration Handling (v11.0)</w:t>
+        <w:t>2.60 QueryMore Cursor Expiration Handling (v12.0)</w:t>
       </w:r>
     </w:p>
     <w:p>
@@ -3155,7 +3155,7 @@
           <w:color w:val="181818"/>
           <w:sz w:val="21"/>
         </w:rPr>
-        <w:t>Fix: DependencyService wraps nextRecordsUrl callouts in try/catch for INVALID_QUERY_LOCATOR (HTTP 400). On catch: restart query from scratch for the same ID batch, do not fail the job. Log restart to Error_Message__c.</w:t>
+        <w:t>Fix: MetadataDependencyService wraps nextRecordsUrl callouts in try/catch for INVALID_QUERY_LOCATOR (HTTP 400). On catch: restart query from scratch for the same ID batch, do not fail the job. Log restart to Error_Status_Message__c.</w:t>
       </w:r>
     </w:p>
     <w:p>
@@ -3169,7 +3169,7 @@
           <w:color w:val="0070D2"/>
           <w:sz w:val="28"/>
         </w:rPr>
-        <w:t>2.61 Heap Guardrail Lowered to 70% (v11.0)</w:t>
+        <w:t>2.61 Heap Guardrail Lowered to 70% (v12.0)</w:t>
       </w:r>
     </w:p>
     <w:p>
@@ -3197,7 +3197,7 @@
           <w:color w:val="0070D2"/>
           <w:sz w:val="28"/>
         </w:rPr>
-        <w:t>2.62 Delimiter-Safe Cycle Check (v11.0)</w:t>
+        <w:t>2.62 Delimiter-Safe Cycle Check (v12.0)</w:t>
       </w:r>
     </w:p>
     <w:p>
@@ -3229,7 +3229,7 @@
         </w:rPr>
         <w:t>// Correct delimiter-safe form:</w:t>
         <w:br/>
-        <w:t>Boolean isCycle = ('|' + parent.Path__c + '|').contains('|' + newNodeId + '|');</w:t>
+        <w:t>Boolean isCycle = ('|' + parent.Ancestor_Path__c + '|').contains('|' + newNodeId + '|');</w:t>
       </w:r>
     </w:p>
     <w:p>
@@ -3243,7 +3243,7 @@
           <w:color w:val="0070D2"/>
           <w:sz w:val="28"/>
         </w:rPr>
-        <w:t>2.63 ISettingsProvider Static Cache (v11.0)</w:t>
+        <w:t>2.63 ISettingsProvider Static Cache (v12.0)</w:t>
       </w:r>
     </w:p>
     <w:p>
@@ -3271,7 +3271,7 @@
           <w:color w:val="0070D2"/>
           <w:sz w:val="28"/>
         </w:rPr>
-        <w:t>2.64 PE Suppression Logging (v11.0)</w:t>
+        <w:t>2.64 PE Suppression Logging (v12.0)</w:t>
       </w:r>
     </w:p>
     <w:p>
@@ -3285,7 +3285,7 @@
           <w:color w:val="181818"/>
           <w:sz w:val="21"/>
         </w:rPr>
-        <w:t>When OrgLimits auto-suppress fires (&gt;80% daily PE consumed): append to Error_Message__c: "[timestamp] Platform Events suppressed - daily delivery limit &gt;80% consumed. Progress switched to polling." Admin visibility without debug logs.</w:t>
+        <w:t>When OrgLimits auto-suppress fires (&gt;80% daily PE consumed): append to Error_Status_Message__c: "[timestamp] Platform Events suppressed - daily delivery limit &gt;80% consumed. Progress switched to polling." Admin visibility without debug logs.</w:t>
       </w:r>
     </w:p>
     <w:p>
@@ -3299,7 +3299,7 @@
           <w:color w:val="0070D2"/>
           <w:sz w:val="28"/>
         </w:rPr>
-        <w:t>2.65 localStorage Tour Version Suffix (v11.0)</w:t>
+        <w:t>2.65 localStorage Tour Version Suffix (v12.0)</w:t>
       </w:r>
     </w:p>
     <w:p>
@@ -3327,7 +3327,7 @@
           <w:color w:val="0070D2"/>
           <w:sz w:val="28"/>
         </w:rPr>
-        <w:t>2.66 Selector Completeness - countActiveQueueables() (v11.0)</w:t>
+        <w:t>2.66 Selector Completeness - countActiveQueueables() (v12.0)</w:t>
       </w:r>
     </w:p>
     <w:p>
@@ -3355,7 +3355,7 @@
           <w:color w:val="0070D2"/>
           <w:sz w:val="28"/>
         </w:rPr>
-        <w:t>2.67 Explicit DML Bulkification Note (v11.0)</w:t>
+        <w:t>2.67 Explicit DML Bulkification Note (v12.0)</w:t>
       </w:r>
     </w:p>
     <w:p>
@@ -3369,7 +3369,7 @@
           <w:color w:val="181818"/>
           <w:sz w:val="21"/>
         </w:rPr>
-        <w:t>Child nodes discovered during the result-processing loop must be accumulated in a List&lt;Dependency_Node__c&gt; and upserted in a single bulk statement after the loop - never per-node inside the loop. If a mid-loop guardrail triggers a self-chain, flush the accumulated list before returning.</w:t>
+        <w:t>Child nodes discovered during the result-processing loop must be accumulated in a List&lt;Metadata_Dependency__c&gt; and upserted in a single bulk statement after the loop - never per-node inside the loop. If a mid-loop guardrail triggers a self-chain, flush the accumulated list before returning.</w:t>
       </w:r>
     </w:p>
     <w:p>
@@ -3383,7 +3383,7 @@
           <w:color w:val="0070D2"/>
           <w:sz w:val="28"/>
         </w:rPr>
-        <w:t>2.68 Path__c Safe-Fail Truncation (v11.0)</w:t>
+        <w:t>2.68 Ancestor_Path__c Safe-Fail Truncation (v12.0)</w:t>
       </w:r>
     </w:p>
     <w:p>
@@ -3397,7 +3397,7 @@
           <w:color w:val="181818"/>
           <w:sz w:val="21"/>
         </w:rPr>
-        <w:t>At 18 chars/ID + 1 delimiter, depth-1,500 is ~28,500 chars - within Long Text 32768. Pathological orgs could exceed this. Path__c builder must check remaining capacity before appending; if within 200 chars of the limit, set Is_Circular__c = true and Is_Processed__c = true with Context_Data__c note "path_truncated: true" rather than throwing StringException.</w:t>
+        <w:t>At 18 chars/ID + 1 delimiter, depth-1,500 is ~28,500 chars - within Long Text 32768. Pathological orgs could exceed this. Ancestor_Path__c builder must check remaining capacity before appending; if within 200 chars of the limit, set Is_Circular__c = true and Is_Processed__c = true with Dependency_Context__c note "path_truncated: true" rather than throwing StringException.</w:t>
       </w:r>
     </w:p>
     <w:p>
@@ -3411,7 +3411,7 @@
           <w:color w:val="0070D2"/>
           <w:sz w:val="28"/>
         </w:rPr>
-        <w:t>2.69 USER_MODE Scope Clarified (v11.0)</w:t>
+        <w:t>2.69 USER_MODE Scope Clarified (v12.0)</w:t>
       </w:r>
     </w:p>
     <w:p>
@@ -3426,6 +3426,288 @@
           <w:sz w:val="21"/>
         </w:rPr>
         <w:t>USER_MODE applied only at @AuraEnabled controller boundary. Engine internals (Queueable, cleanup, notification) operate in SYSTEM_MODE for reliable orchestration. Queries that surface metadata in the UI (getNodeHierarchy, getJobStatus) enforce USER_MODE at the controller. Internal engine SOQL is not subject to FLS - this is by design, not a security gap.</w:t>
+      </w:r>
+    </w:p>
+    <w:p>
+      <w:pPr>
+        <w:pStyle w:val="Heading2"/>
+        <w:spacing w:before="240" w:after="120"/>
+      </w:pPr>
+      <w:r>
+        <w:rPr>
+          <w:b/>
+          <w:color w:val="0070D2"/>
+          <w:sz w:val="28"/>
+        </w:rPr>
+        <w:t>2.70 Metadata Naming &amp; Description Standards Enforced (v12.0)</w:t>
+      </w:r>
+    </w:p>
+    <w:p>
+      <w:pPr>
+        <w:spacing w:after="80"/>
+      </w:pPr>
+      <w:r>
+        <w:rPr>
+          <w:b w:val="0"/>
+          <w:i w:val="0"/>
+          <w:color w:val="181818"/>
+          <w:sz w:val="21"/>
+        </w:rPr>
+        <w:t>All custom objects, fields, Apex classes, LWC components, and CMDT records must carry a meaningful description in their metadata XML. Descriptions must state: what the component is, why it exists, and key constraints - written for Salesforce admins, not developers.</w:t>
+      </w:r>
+    </w:p>
+    <w:tbl>
+      <w:tblPr>
+        <w:tblStyle w:val="TableGrid"/>
+        <w:tblW w:type="auto" w:w="0"/>
+        <w:jc w:val="left"/>
+        <w:tblLook w:firstColumn="1" w:firstRow="1" w:lastColumn="0" w:lastRow="0" w:noHBand="0" w:noVBand="1" w:val="04A0"/>
+      </w:tblPr>
+      <w:tblGrid>
+        <w:gridCol w:w="4533"/>
+        <w:gridCol w:w="4533"/>
+      </w:tblGrid>
+      <w:tr>
+        <w:tc>
+          <w:tcPr>
+            <w:tcW w:type="dxa" w:w="4533"/>
+            <w:shd w:val="clear" w:color="auto" w:fill="032D60"/>
+          </w:tcPr>
+          <w:p>
+            <w:r>
+              <w:rPr>
+                <w:b/>
+                <w:color w:val="FFFFFF"/>
+                <w:sz w:val="20"/>
+              </w:rPr>
+              <w:t>Category</w:t>
+            </w:r>
+          </w:p>
+        </w:tc>
+        <w:tc>
+          <w:tcPr>
+            <w:tcW w:type="dxa" w:w="4533"/>
+            <w:shd w:val="clear" w:color="auto" w:fill="032D60"/>
+          </w:tcPr>
+          <w:p>
+            <w:r>
+              <w:rPr>
+                <w:b/>
+                <w:color w:val="FFFFFF"/>
+                <w:sz w:val="20"/>
+              </w:rPr>
+              <w:t>Renames Applied</w:t>
+            </w:r>
+          </w:p>
+        </w:tc>
+      </w:tr>
+      <w:tr>
+        <w:tc>
+          <w:tcPr>
+            <w:tcW w:type="dxa" w:w="4533"/>
+            <w:shd w:val="clear" w:color="auto" w:fill="F2F4F7"/>
+          </w:tcPr>
+          <w:p>
+            <w:r>
+              <w:rPr>
+                <w:color w:val="181818"/>
+                <w:sz w:val="20"/>
+              </w:rPr>
+              <w:t>Custom Objects</w:t>
+            </w:r>
+          </w:p>
+        </w:tc>
+        <w:tc>
+          <w:tcPr>
+            <w:tcW w:type="dxa" w:w="4533"/>
+            <w:shd w:val="clear" w:color="auto" w:fill="F2F4F7"/>
+          </w:tcPr>
+          <w:p>
+            <w:r>
+              <w:rPr>
+                <w:color w:val="181818"/>
+                <w:sz w:val="20"/>
+              </w:rPr>
+              <w:t>Dependency_Job__c -&gt; Metadata_Scan_Job__c; Dependency_Node__c -&gt; Metadata_Dependency__c</w:t>
+            </w:r>
+          </w:p>
+        </w:tc>
+      </w:tr>
+      <w:tr>
+        <w:tc>
+          <w:tcPr>
+            <w:tcW w:type="dxa" w:w="4533"/>
+            <w:shd w:val="clear" w:color="auto" w:fill="FFFFFF"/>
+          </w:tcPr>
+          <w:p>
+            <w:r>
+              <w:rPr>
+                <w:color w:val="181818"/>
+                <w:sz w:val="20"/>
+              </w:rPr>
+              <w:t>Platform Event</w:t>
+            </w:r>
+          </w:p>
+        </w:tc>
+        <w:tc>
+          <w:tcPr>
+            <w:tcW w:type="dxa" w:w="4533"/>
+            <w:shd w:val="clear" w:color="auto" w:fill="FFFFFF"/>
+          </w:tcPr>
+          <w:p>
+            <w:r>
+              <w:rPr>
+                <w:color w:val="181818"/>
+                <w:sz w:val="20"/>
+              </w:rPr>
+              <w:t>Dependency_Status__e -&gt; Dependency_Scan_Status__e</w:t>
+            </w:r>
+          </w:p>
+        </w:tc>
+      </w:tr>
+      <w:tr>
+        <w:tc>
+          <w:tcPr>
+            <w:tcW w:type="dxa" w:w="4533"/>
+            <w:shd w:val="clear" w:color="auto" w:fill="F2F4F7"/>
+          </w:tcPr>
+          <w:p>
+            <w:r>
+              <w:rPr>
+                <w:color w:val="181818"/>
+                <w:sz w:val="20"/>
+              </w:rPr>
+              <w:t>Job Fields</w:t>
+            </w:r>
+          </w:p>
+        </w:tc>
+        <w:tc>
+          <w:tcPr>
+            <w:tcW w:type="dxa" w:w="4533"/>
+            <w:shd w:val="clear" w:color="auto" w:fill="F2F4F7"/>
+          </w:tcPr>
+          <w:p>
+            <w:r>
+              <w:rPr>
+                <w:color w:val="181818"/>
+                <w:sz w:val="20"/>
+              </w:rPr>
+              <w:t>Nodes_Processed__c -&gt; Components_Analyzed__c; Summary_JSON__c -&gt; Result_Summary__c; Rechain_Count__c -&gt; Processing_Cycle_Count__c; AI_Summary__c -&gt; Scan_Summary_Text__c</w:t>
+            </w:r>
+          </w:p>
+        </w:tc>
+      </w:tr>
+      <w:tr>
+        <w:tc>
+          <w:tcPr>
+            <w:tcW w:type="dxa" w:w="4533"/>
+            <w:shd w:val="clear" w:color="auto" w:fill="FFFFFF"/>
+          </w:tcPr>
+          <w:p>
+            <w:r>
+              <w:rPr>
+                <w:color w:val="181818"/>
+                <w:sz w:val="20"/>
+              </w:rPr>
+              <w:t>Dependency Fields</w:t>
+            </w:r>
+          </w:p>
+        </w:tc>
+        <w:tc>
+          <w:tcPr>
+            <w:tcW w:type="dxa" w:w="4533"/>
+            <w:shd w:val="clear" w:color="auto" w:fill="FFFFFF"/>
+          </w:tcPr>
+          <w:p>
+            <w:r>
+              <w:rPr>
+                <w:color w:val="181818"/>
+                <w:sz w:val="20"/>
+              </w:rPr>
+              <w:t>Metadata_ID__c -&gt; Metadata_Id__c; Level__c -&gt; Dependency_Depth__c; Context_Data__c -&gt; Dependency_Context__c; Source__c -&gt; Discovery_Source__c; Path__c -&gt; Ancestor_Path__c; Node_Unique_Key__c -&gt; Deduplication_Key__c; Ancestor_Hashes__c -&gt; Ancestor_Hash_Index__c</w:t>
+            </w:r>
+          </w:p>
+        </w:tc>
+      </w:tr>
+      <w:tr>
+        <w:tc>
+          <w:tcPr>
+            <w:tcW w:type="dxa" w:w="4533"/>
+            <w:shd w:val="clear" w:color="auto" w:fill="F2F4F7"/>
+          </w:tcPr>
+          <w:p>
+            <w:r>
+              <w:rPr>
+                <w:color w:val="181818"/>
+                <w:sz w:val="20"/>
+              </w:rPr>
+              <w:t>CMDT Fields</w:t>
+            </w:r>
+          </w:p>
+        </w:tc>
+        <w:tc>
+          <w:tcPr>
+            <w:tcW w:type="dxa" w:w="4533"/>
+            <w:shd w:val="clear" w:color="auto" w:fill="F2F4F7"/>
+          </w:tcPr>
+          <w:p>
+            <w:r>
+              <w:rPr>
+                <w:color w:val="181818"/>
+                <w:sz w:val="20"/>
+              </w:rPr>
+              <w:t>Batch_Size__c -&gt; Scan_Batch_Size__c; Flow_Batch_Size__c -&gt; Flow_Scan_Batch_Size__c; Disable_PE__c -&gt; Disable_Platform_Events__c; Hotloop_Threshold__c -&gt; Stall_Detection_Threshold__c; Node_Chunk_Size__c -&gt; Cleanup_Chunk_Size__c</w:t>
+            </w:r>
+          </w:p>
+        </w:tc>
+      </w:tr>
+      <w:tr>
+        <w:tc>
+          <w:tcPr>
+            <w:tcW w:type="dxa" w:w="4533"/>
+            <w:shd w:val="clear" w:color="auto" w:fill="FFFFFF"/>
+          </w:tcPr>
+          <w:p>
+            <w:r>
+              <w:rPr>
+                <w:color w:val="181818"/>
+                <w:sz w:val="20"/>
+              </w:rPr>
+              <w:t>Apex Classes</w:t>
+            </w:r>
+          </w:p>
+        </w:tc>
+        <w:tc>
+          <w:tcPr>
+            <w:tcW w:type="dxa" w:w="4533"/>
+            <w:shd w:val="clear" w:color="auto" w:fill="FFFFFF"/>
+          </w:tcPr>
+          <w:p>
+            <w:r>
+              <w:rPr>
+                <w:color w:val="181818"/>
+                <w:sz w:val="20"/>
+              </w:rPr>
+              <w:t>DependencyService -&gt; MetadataDependencyService; IDependencyService -&gt; IMetadataDependencyService; AISummaryQueueable -&gt; ScanSummaryQueueable; NamedCredentialHealthCheck -&gt; ToolingApiHealthCheck</w:t>
+            </w:r>
+          </w:p>
+        </w:tc>
+      </w:tr>
+    </w:tbl>
+    <w:p/>
+    <w:p>
+      <w:pPr>
+        <w:spacing w:before="60" w:after="120"/>
+        <w:ind w:left="283"/>
+        <w:shd w:val="clear" w:color="auto" w:fill="EFF4FB"/>
+      </w:pPr>
+      <w:r>
+        <w:rPr>
+          <w:i/>
+          <w:color w:val="032D60"/>
+          <w:sz w:val="19"/>
+        </w:rPr>
+        <w:t>All names now reflect purpose, not implementation. No abbreviations except industry-standard (API, DML, LWC). Consistent casing: objects/fields PascalCase__c, Apex PascalCase, methods/vars camelCase.</w:t>
       </w:r>
     </w:p>
     <w:p>
@@ -3680,7 +3962,7 @@
                 <w:color w:val="181818"/>
                 <w:sz w:val="20"/>
               </w:rPr>
-              <w:t>Two-tier: scoped DB dedup + delimiter-safe Path__c ancestry</w:t>
+              <w:t>Two-tier: scoped DB dedup + delimiter-safe Ancestor_Path__c ancestry</w:t>
             </w:r>
           </w:p>
         </w:tc>
@@ -4244,7 +4526,7 @@
                 <w:color w:val="181818"/>
                 <w:sz w:val="20"/>
               </w:rPr>
-              <w:t>IDependencyService, INotificationService, ISettingsProvider (static cache)</w:t>
+              <w:t>IMetadataMetadataDependencyService, INotificationService, ISettingsProvider (static cache)</w:t>
             </w:r>
           </w:p>
         </w:tc>
@@ -4338,7 +4620,7 @@
                 <w:color w:val="181818"/>
                 <w:sz w:val="20"/>
               </w:rPr>
-              <w:t>Node_Unique_Key__c Text 80 External ID + upsert</w:t>
+              <w:t>Deduplication_Key__c Text 80 External ID + upsert</w:t>
             </w:r>
           </w:p>
         </w:tc>
@@ -4385,7 +4667,7 @@
                 <w:color w:val="181818"/>
                 <w:sz w:val="20"/>
               </w:rPr>
-              <w:t>Rechain_Count__c + Hotloop_Threshold__c + transient batch override on resume</w:t>
+              <w:t>Processing_Cycle_Count__c + Stall_Detection_Threshold__c + transient batch override on resume</w:t>
             </w:r>
           </w:p>
         </w:tc>
@@ -4432,7 +4714,7 @@
                 <w:color w:val="181818"/>
                 <w:sz w:val="20"/>
               </w:rPr>
-              <w:t>Disable_PE__c CMDT + OrgLimits auto-degrade + Error_Message__c logging</w:t>
+              <w:t>Disable_Platform_Events__c CMDT + OrgLimits auto-degrade + Error_Status_Message__c logging</w:t>
             </w:r>
           </w:p>
         </w:tc>
@@ -4464,7 +4746,7 @@
                 <w:color w:val="181818"/>
                 <w:sz w:val="20"/>
               </w:rPr>
-              <w:t>Ancestor_Hashes__c</w:t>
+              <w:t>Ancestor_Hash_Index__c</w:t>
             </w:r>
           </w:p>
         </w:tc>
@@ -4526,7 +4808,7 @@
                 <w:color w:val="181818"/>
                 <w:sz w:val="20"/>
               </w:rPr>
-              <w:t>AI_Summary__c (AISummaryQueueable, offloaded) + compact Results card + Copilot fallback text</w:t>
+              <w:t>Scan_Summary_Text__c (ScanSummaryQueueable, offloaded) + compact Results card + Copilot fallback text</w:t>
             </w:r>
           </w:p>
         </w:tc>
@@ -5004,7 +5286,7 @@
           <w:color w:val="0070D2"/>
           <w:sz w:val="28"/>
         </w:rPr>
-        <w:t>4.1 Dependency_Job__c</w:t>
+        <w:t>4.1 Metadata_Scan_Job__c</w:t>
       </w:r>
     </w:p>
     <w:tbl>
@@ -5316,7 +5598,7 @@
                 <w:color w:val="181818"/>
                 <w:sz w:val="20"/>
               </w:rPr>
-              <w:t>Error_Message__c</w:t>
+              <w:t>Error_Status_Message__c</w:t>
             </w:r>
           </w:p>
         </w:tc>
@@ -5363,7 +5645,7 @@
                 <w:color w:val="181818"/>
                 <w:sz w:val="20"/>
               </w:rPr>
-              <w:t>Nodes_Processed__c</w:t>
+              <w:t>Components_Analyzed__c</w:t>
             </w:r>
           </w:p>
         </w:tc>
@@ -5410,7 +5692,7 @@
                 <w:color w:val="181818"/>
                 <w:sz w:val="20"/>
               </w:rPr>
-              <w:t>Summary_JSON__c</w:t>
+              <w:t>Result_Summary__c</w:t>
             </w:r>
           </w:p>
         </w:tc>
@@ -5504,7 +5786,7 @@
                 <w:color w:val="181818"/>
                 <w:sz w:val="20"/>
               </w:rPr>
-              <w:t>Rechain_Count__c</w:t>
+              <w:t>Processing_Cycle_Count__c</w:t>
             </w:r>
           </w:p>
         </w:tc>
@@ -5551,7 +5833,7 @@
                 <w:color w:val="181818"/>
                 <w:sz w:val="20"/>
               </w:rPr>
-              <w:t>AI_Summary__c</w:t>
+              <w:t>Scan_Summary_Text__c</w:t>
             </w:r>
           </w:p>
         </w:tc>
@@ -5581,7 +5863,7 @@
                 <w:color w:val="181818"/>
                 <w:sz w:val="20"/>
               </w:rPr>
-              <w:t>Plain-English summary. Populated by AISummaryQueueable after Completed. Null until Queueable finishes. LWC polls until non-null before rendering Summary Card.</w:t>
+              <w:t>Plain-English summary. Populated by ScanSummaryQueueable after Completed. Null until Queueable finishes. LWC polls until non-null before rendering Summary Card.</w:t>
             </w:r>
           </w:p>
         </w:tc>
@@ -5600,7 +5882,7 @@
           <w:color w:val="032D60"/>
           <w:sz w:val="19"/>
         </w:rPr>
-        <w:t>Visited_IDs__c removed. Cycle detection uses scoped DB dedup + delimiter-safe Path__c ancestry.</w:t>
+        <w:t>Visited_IDs__c removed. Cycle detection uses scoped DB dedup + delimiter-safe Ancestor_Path__c ancestry.</w:t>
       </w:r>
     </w:p>
     <w:p>
@@ -5614,7 +5896,7 @@
           <w:color w:val="0070D2"/>
           <w:sz w:val="28"/>
         </w:rPr>
-        <w:t>4.2 Dependency_Node__c</w:t>
+        <w:t>4.2 Metadata_Dependency__c</w:t>
       </w:r>
     </w:p>
     <w:tbl>
@@ -5691,7 +5973,7 @@
                 <w:color w:val="181818"/>
                 <w:sz w:val="20"/>
               </w:rPr>
-              <w:t>Dependency_Job__c</w:t>
+              <w:t>Metadata_Scan_Job__c</w:t>
             </w:r>
           </w:p>
         </w:tc>
@@ -5785,7 +6067,7 @@
                 <w:color w:val="181818"/>
                 <w:sz w:val="20"/>
               </w:rPr>
-              <w:t>Metadata_ID__c</w:t>
+              <w:t>Metadata_Id__c</w:t>
             </w:r>
           </w:p>
         </w:tc>
@@ -5926,7 +6208,7 @@
                 <w:color w:val="181818"/>
                 <w:sz w:val="20"/>
               </w:rPr>
-              <w:t>Level__c</w:t>
+              <w:t>Dependency_Depth__c</w:t>
             </w:r>
           </w:p>
         </w:tc>
@@ -6050,7 +6332,7 @@
                 <w:color w:val="181818"/>
                 <w:sz w:val="20"/>
               </w:rPr>
-              <w:t>True ONLY when Metadata_ID__c in own delimiter-safe Path__c</w:t>
+              <w:t>True ONLY when Metadata_Id__c in own delimiter-safe Ancestor_Path__c</w:t>
             </w:r>
           </w:p>
         </w:tc>
@@ -6114,7 +6396,7 @@
                 <w:color w:val="181818"/>
                 <w:sz w:val="20"/>
               </w:rPr>
-              <w:t>Context_Data__c</w:t>
+              <w:t>Dependency_Context__c</w:t>
             </w:r>
           </w:p>
         </w:tc>
@@ -6161,7 +6443,7 @@
                 <w:color w:val="181818"/>
                 <w:sz w:val="20"/>
               </w:rPr>
-              <w:t>Source__c</w:t>
+              <w:t>Discovery_Source__c</w:t>
             </w:r>
           </w:p>
         </w:tc>
@@ -6208,7 +6490,7 @@
                 <w:color w:val="181818"/>
                 <w:sz w:val="20"/>
               </w:rPr>
-              <w:t>Path__c</w:t>
+              <w:t>Ancestor_Path__c</w:t>
             </w:r>
           </w:p>
         </w:tc>
@@ -6302,7 +6584,7 @@
                 <w:color w:val="181818"/>
                 <w:sz w:val="20"/>
               </w:rPr>
-              <w:t>Node_Unique_Key__c</w:t>
+              <w:t>Deduplication_Key__c</w:t>
             </w:r>
           </w:p>
         </w:tc>
@@ -6332,7 +6614,7 @@
                 <w:color w:val="181818"/>
                 <w:sz w:val="20"/>
               </w:rPr>
-              <w:t>JobId + ":" + Metadata_ID__c. Upsert key. Text 80 for future headroom.</w:t>
+              <w:t>JobId + ":" + Metadata_Id__c. Upsert key. Text 80 for future headroom.</w:t>
             </w:r>
           </w:p>
         </w:tc>
@@ -6349,7 +6631,7 @@
                 <w:color w:val="181818"/>
                 <w:sz w:val="20"/>
               </w:rPr>
-              <w:t>Ancestor_Hashes__c</w:t>
+              <w:t>Ancestor_Hash_Index__c</w:t>
             </w:r>
           </w:p>
         </w:tc>
@@ -6379,7 +6661,7 @@
                 <w:color w:val="181818"/>
                 <w:sz w:val="20"/>
               </w:rPr>
-              <w:t>Concatenated 6-char base64url hash prefixes of ancestor IDs. Hash shortcut (not probabilistic bloom filter) - use contains(shortHash) as fast pre-check, then always confirm with delimiter-safe Path__c check. Long Text 32768 required.</w:t>
+              <w:t>Concatenated 6-char base64url hash prefixes of ancestor IDs. Hash shortcut (not probabilistic bloom filter) - use contains(shortHash) as fast pre-check, then always confirm with delimiter-safe Ancestor_Path__c check. Long Text 32768 required.</w:t>
             </w:r>
           </w:p>
         </w:tc>
@@ -6397,7 +6679,7 @@
           <w:color w:val="0070D2"/>
           <w:sz w:val="28"/>
         </w:rPr>
-        <w:t>4.3 Context_Data__c - Pill Rendering (Tooltip + Node Details Panel)</w:t>
+        <w:t>4.3 Dependency_Context__c - Pill Rendering (Tooltip + Node Details Panel)</w:t>
       </w:r>
     </w:p>
     <w:tbl>
@@ -6761,7 +7043,7 @@
           <w:color w:val="0070D2"/>
           <w:sz w:val="28"/>
         </w:rPr>
-        <w:t>4.4 Dependency_Status__e</w:t>
+        <w:t>4.4 Dependency_Scan_Status__e</w:t>
       </w:r>
     </w:p>
     <w:tbl>
@@ -6821,7 +7103,7 @@
                 <w:color w:val="181818"/>
                 <w:sz w:val="20"/>
               </w:rPr>
-              <w:t>Job_Id__c</w:t>
+              <w:t>Scan_Job_Id__c</w:t>
             </w:r>
           </w:p>
         </w:tc>
@@ -6885,7 +7167,7 @@
                 <w:color w:val="181818"/>
                 <w:sz w:val="20"/>
               </w:rPr>
-              <w:t>Nodes_Processed__c</w:t>
+              <w:t>Components_Analyzed__c</w:t>
             </w:r>
           </w:p>
         </w:tc>
@@ -6917,7 +7199,7 @@
                 <w:color w:val="181818"/>
                 <w:sz w:val="20"/>
               </w:rPr>
-              <w:t>Message__c</w:t>
+              <w:t>Status_Message__c</w:t>
             </w:r>
           </w:p>
         </w:tc>
@@ -7074,7 +7356,7 @@
                 <w:color w:val="181818"/>
                 <w:sz w:val="20"/>
               </w:rPr>
-              <w:t>Batch_Size__c</w:t>
+              <w:t>Scan_Batch_Size__c</w:t>
             </w:r>
           </w:p>
         </w:tc>
@@ -7121,7 +7403,7 @@
                 <w:color w:val="181818"/>
                 <w:sz w:val="20"/>
               </w:rPr>
-              <w:t>Flow_Batch_Size__c</w:t>
+              <w:t>Flow_Scan_Scan_Batch_Size__c</w:t>
             </w:r>
           </w:p>
         </w:tc>
@@ -7215,7 +7497,7 @@
                 <w:color w:val="181818"/>
                 <w:sz w:val="20"/>
               </w:rPr>
-              <w:t>Disable_PE__c</w:t>
+              <w:t>Disable_Platform_Events__c</w:t>
             </w:r>
           </w:p>
         </w:tc>
@@ -7262,7 +7544,7 @@
                 <w:color w:val="181818"/>
                 <w:sz w:val="20"/>
               </w:rPr>
-              <w:t>Hotloop_Threshold__c</w:t>
+              <w:t>Stall_Detection_Threshold__c</w:t>
             </w:r>
           </w:p>
         </w:tc>
@@ -7356,7 +7638,7 @@
                 <w:color w:val="181818"/>
                 <w:sz w:val="20"/>
               </w:rPr>
-              <w:t>Node_Chunk_Size__c</w:t>
+              <w:t>Cleanup_Chunk_Size__c</w:t>
             </w:r>
           </w:p>
         </w:tc>
@@ -7440,7 +7722,7 @@
           <w:color w:val="181818"/>
           <w:sz w:val="21"/>
         </w:rPr>
-        <w:t>1. Three-state preflight passes. Concurrency guard passes (DependencyJobSelector.countActiveQueueables()). Async context guard passes. Job created (Initializing). Root Node inserted (Path__c = ""). DependencyQueueable(jobId, activeFlowsOnly, null) enqueued.</w:t>
+        <w:t>1. Three-state preflight passes. Concurrency guard passes (DependencyJobSelector.countActiveQueueables()). Async context guard passes. Job created (Initializing). Root Node inserted (Ancestor_Path__c = ""). DependencyQueueable(jobId, activeFlowsOnly, null) enqueued.</w:t>
       </w:r>
     </w:p>
     <w:p>
@@ -7496,7 +7778,7 @@
           <w:color w:val="181818"/>
           <w:sz w:val="21"/>
         </w:rPr>
-        <w:t>5. Effective batch size = overrideBatchSize ?? (activeFlowsOnly ? Flow_Batch_Size__c : Batch_Size__c).</w:t>
+        <w:t>5. Effective batch size = overrideBatchSize ?? (activeFlowsOnly ? Flow_Scan_Scan_Batch_Size__c : Scan_Batch_Size__c).</w:t>
       </w:r>
     </w:p>
     <w:p>
@@ -7510,7 +7792,7 @@
           <w:color w:val="181818"/>
           <w:sz w:val="21"/>
         </w:rPr>
-        <w:t>6. Pre-batch seven-limit guardrail. Chain if breached. Increment Rechain_Count__c.</w:t>
+        <w:t>6. Pre-batch seven-limit guardrail. Chain if breached. Increment Processing_Cycle_Count__c.</w:t>
       </w:r>
     </w:p>
     <w:p>
@@ -7580,7 +7862,7 @@
           <w:color w:val="181818"/>
           <w:sz w:val="21"/>
         </w:rPr>
-        <w:t>11. Per result: if in dedup set -&gt; skip. Delimiter-safe cycle check: ("|"+parent.Path__c+"|").contains("|"+newId+"|"). If cycle: Is_Circular__c=true, Is_Processed__c=true, cycleClosesAt in Context_Data__c.</w:t>
+        <w:t>11. Per result: if in dedup set -&gt; skip. Delimiter-safe cycle check: ("|"+parent.Ancestor_Path__c+"|").contains("|"+newId+"|"). If cycle: Is_Circular__c=true, Is_Processed__c=true, cycleClosesAt in Dependency_Context__c.</w:t>
       </w:r>
     </w:p>
     <w:p>
@@ -7594,7 +7876,7 @@
           <w:color w:val="181818"/>
           <w:sz w:val="21"/>
         </w:rPr>
-        <w:t>12. Accumulate into List&lt;Dependency_Node__c&gt;. Build Path__c (blank-safe; safe-fail truncation near 32,568 chars). Populate Ancestor_Hashes__c.</w:t>
+        <w:t>12. Accumulate into List&lt;Metadata_Dependency__c&gt;. Build Ancestor_Path__c (blank-safe; safe-fail truncation near 32,568 chars). Populate Ancestor_Hash_Index__c.</w:t>
       </w:r>
     </w:p>
     <w:p>
@@ -7608,7 +7890,7 @@
           <w:color w:val="181818"/>
           <w:sz w:val="21"/>
         </w:rPr>
-        <w:t>13. Single bulk upsert by Node_Unique_Key__c after loop completes.</w:t>
+        <w:t>13. Single bulk upsert by Deduplication_Key__c after loop completes.</w:t>
       </w:r>
     </w:p>
     <w:p>
@@ -7636,7 +7918,7 @@
           <w:color w:val="181818"/>
           <w:sz w:val="21"/>
         </w:rPr>
-        <w:t>15. Mark nodes processed. Increment Nodes_Processed__c. OrgLimits PE check -&gt; publish or auto-suppress (append to Error_Message__c if suppressed).</w:t>
+        <w:t>15. Mark nodes processed. Increment Components_Analyzed__c. OrgLimits PE check -&gt; publish or auto-suppress (append to Error_Status_Message__c if suppressed).</w:t>
       </w:r>
     </w:p>
     <w:p>
@@ -7664,7 +7946,7 @@
           <w:color w:val="181818"/>
           <w:sz w:val="21"/>
         </w:rPr>
-        <w:t>17. If complete: compute Summary_JSON__c. Status = Completed. Stamp Closed_At__c. sendCompletionNotification() enqueues AISummaryQueueable.</w:t>
+        <w:t>17. If complete: compute Result_Summary__c. Status = Completed. Stamp Closed_At__c. sendCompletionNotification() enqueues ScanSummaryQueueable.</w:t>
       </w:r>
     </w:p>
     <w:p>
@@ -7733,7 +8015,7 @@
         <w:br/>
         <w:t xml:space="preserve">    // flush accumulated insert list first</w:t>
         <w:br/>
-        <w:t xml:space="preserve">    if (!insertList.isEmpty()) Database.upsert(insertList, Dependency_Node__c.Node_Unique_Key__c, false);</w:t>
+        <w:t xml:space="preserve">    if (!insertList.isEmpty()) Database.upsert(insertList, Metadata_Dependency__c.Deduplication_Key__c, false);</w:t>
         <w:br/>
         <w:t xml:space="preserve">    System.enqueueJob(new DependencyQueueable(jobId, activeFlowsOnly, null)); return;</w:t>
         <w:br/>
@@ -7794,7 +8076,7 @@
           <w:color w:val="181818"/>
           <w:sz w:val="21"/>
         </w:rPr>
-        <w:t>"Resume with current settings": resumeJob(jobId, null). Uses Batch_Size__c as normal.</w:t>
+        <w:t>"Resume with current settings": resumeJob(jobId, null). Uses Scan_Batch_Size__c as normal.</w:t>
       </w:r>
     </w:p>
     <w:p>
@@ -7842,17 +8124,17 @@
         <w:br/>
         <w:t>if (alreadyInserted.contains(result.refId)) continue;</w:t>
         <w:br/>
-        <w:t>// Tier 2: hash shortcut + delimiter-safe Path__c confirm</w:t>
+        <w:t>// Tier 2: hash shortcut + delimiter-safe Ancestor_Path__c confirm</w:t>
         <w:br/>
-        <w:t>Boolean mightBeCycle = parentNode.Ancestor_Hashes__c?.contains(shortHash(result.refId)) == true;</w:t>
+        <w:t>Boolean mightBeCycle = parentNode.Ancestor_Hash_Index__c?.contains(shortHash(result.refId)) == true;</w:t>
         <w:br/>
-        <w:t>Boolean isCycle = mightBeCycle &amp;&amp; ('|'+parentNode.Path__c+'|').contains('|'+result.refId+'|');</w:t>
+        <w:t>Boolean isCycle = mightBeCycle &amp;&amp; ('|'+parentNode.Ancestor_Path__c+'|').contains('|'+result.refId+'|');</w:t>
         <w:br/>
         <w:t>if (isCycle) {</w:t>
         <w:br/>
-        <w:t xml:space="preserve">    cd.put('cycleClosesAt', parentNode.Metadata_ID__c);</w:t>
+        <w:t xml:space="preserve">    cd.put('cycleClosesAt', parentNode.Metadata_Id__c);</w:t>
         <w:br/>
-        <w:t xml:space="preserve">    node.Context_Data__c = JSON.serialize(cd);</w:t>
+        <w:t xml:space="preserve">    node.Dependency_Context__c = JSON.serialize(cd);</w:t>
         <w:br/>
         <w:t xml:space="preserve">    node.Is_Circular__c = true; node.Is_Processed__c = true;</w:t>
         <w:br/>
@@ -7891,7 +8173,7 @@
         <w:br/>
         <w:t xml:space="preserve">    return Database.getQueryLocator([</w:t>
         <w:br/>
-        <w:t xml:space="preserve">        SELECT Id FROM Dependency_Job__c</w:t>
+        <w:t xml:space="preserve">        SELECT Id FROM Metadata_Scan_Job__c</w:t>
         <w:br/>
         <w:t xml:space="preserve">        WHERE Status__c IN ('Completed','Failed','Cancelled')</w:t>
         <w:br/>
@@ -7901,9 +8183,9 @@
         <w:br/>
         <w:t>}</w:t>
         <w:br/>
-        <w:t>public void execute(ctx, List&lt;Dependency_Job__c&gt; scope) {</w:t>
+        <w:t>public void execute(ctx, List&lt;Metadata_Scan_Job__c&gt; scope) {</w:t>
         <w:br/>
-        <w:t xml:space="preserve">    jobIds.addAll(new Map&lt;Id,Dependency_Job__c&gt;(scope).keySet());</w:t>
+        <w:t xml:space="preserve">    jobIds.addAll(new Map&lt;Id,Metadata_Scan_Job__c&gt;(scope).keySet());</w:t>
         <w:br/>
         <w:t>}</w:t>
         <w:br/>
@@ -7934,15 +8216,15 @@
         <w:br/>
         <w:t xml:space="preserve">    return Database.getQueryLocator(</w:t>
         <w:br/>
-        <w:t xml:space="preserve">        [SELECT Id FROM Dependency_Node__c WHERE Dependency_Job__c = :jobId]);</w:t>
+        <w:t xml:space="preserve">        [SELECT Id FROM Metadata_Dependency__c WHERE Metadata_Scan_Job__c = :jobId]);</w:t>
         <w:br/>
         <w:t>}</w:t>
         <w:br/>
-        <w:t>public void execute(ctx, List&lt;Dependency_Node__c&gt; scope) { delete scope; }</w:t>
+        <w:t>public void execute(ctx, List&lt;Metadata_Dependency__c&gt; scope) { delete scope; }</w:t>
         <w:br/>
         <w:t>public void finish(ctx) {</w:t>
         <w:br/>
-        <w:t xml:space="preserve">    delete [SELECT Id FROM Dependency_Job__c WHERE Id = :jobId];</w:t>
+        <w:t xml:space="preserve">    delete [SELECT Id FROM Metadata_Scan_Job__c WHERE Id = :jobId];</w:t>
         <w:br/>
         <w:t>}</w:t>
       </w:r>
@@ -7959,7 +8241,7 @@
           <w:color w:val="032D60"/>
           <w:sz w:val="19"/>
         </w:rPr>
-        <w:t>Each execute() transaction deletes exactly one chunk (Node_Chunk_Size__c = 2,000 rows). No inner loops. Customer automation has 8,000 DML row headroom per transaction.</w:t>
+        <w:t>Each execute() transaction deletes exactly one chunk (Cleanup_Chunk_Size__c = 2,000 rows). No inner loops. Customer automation has 8,000 DML row headroom per transaction.</w:t>
       </w:r>
     </w:p>
     <w:p>
@@ -7973,7 +8255,7 @@
           <w:color w:val="0070D2"/>
           <w:sz w:val="28"/>
         </w:rPr>
-        <w:t>5.6 PE Degradation + AISummaryQueueable</w:t>
+        <w:t>5.6 PE Degradation + ScanSummaryQueueable</w:t>
       </w:r>
     </w:p>
     <w:p>
@@ -7994,11 +8276,11 @@
         <w:br/>
         <w:t>if (pe != null &amp;&amp; (Decimal)pe.getCurrentValue()/pe.getValue() &gt;= 0.80) {</w:t>
         <w:br/>
-        <w:t xml:space="preserve">    // Append suppression notice to Error_Message__c</w:t>
+        <w:t xml:space="preserve">    // Append suppression notice to Error_Status_Message__c</w:t>
         <w:br/>
         <w:t xml:space="preserve">    appendToErrorMessage(jobId, DateTime.now() + ': PE suppressed - daily limit &gt;80%');</w:t>
         <w:br/>
-        <w:t xml:space="preserve">    settings.Disable_PE__c = true; // flip for rest of day</w:t>
+        <w:t xml:space="preserve">    settings.Disable_Platform_Events__c = true; // flip for rest of day</w:t>
         <w:br/>
         <w:t xml:space="preserve">    return;</w:t>
         <w:br/>
@@ -8007,9 +8289,9 @@
         <w:t>EventBus.publish(evt);</w:t>
         <w:br/>
         <w:br/>
-        <w:t>// AISummaryQueueable.execute()</w:t>
+        <w:t>// ScanSummaryQueueable.execute()</w:t>
         <w:br/>
-        <w:t>job.AI_Summary__c = buildAiSummary(summaryMap); // plain-English from Summary_JSON__c</w:t>
+        <w:t>job.Scan_Summary_Text__c = buildAiSummary(summaryMap); // plain-English from Result_Summary__c</w:t>
         <w:br/>
         <w:t>update job;</w:t>
       </w:r>
@@ -8875,7 +9157,7 @@
                 <w:color w:val="181818"/>
                 <w:sz w:val="20"/>
               </w:rPr>
-              <w:t>Dependency_Job__c: Private</w:t>
+              <w:t>Metadata_Scan_Job__c: Private</w:t>
             </w:r>
           </w:p>
         </w:tc>
@@ -9770,7 +10052,7 @@
                 <w:color w:val="181818"/>
                 <w:sz w:val="20"/>
               </w:rPr>
-              <w:t>Source__c = Supplemental</w:t>
+              <w:t>Discovery_Source__c = Supplemental</w:t>
             </w:r>
           </w:p>
         </w:tc>
@@ -9940,7 +10222,7 @@
                 <w:color w:val="181818"/>
                 <w:sz w:val="20"/>
               </w:rPr>
-              <w:t>Level__c &lt;= 2 visible</w:t>
+              <w:t>Dependency_Depth__c &lt;= 2 visible</w:t>
             </w:r>
           </w:p>
         </w:tc>
@@ -10289,7 +10571,7 @@
                 <w:color w:val="181818"/>
                 <w:sz w:val="20"/>
               </w:rPr>
-              <w:t>Nested tree with Context_Data__c pills</w:t>
+              <w:t>Nested tree with Dependency_Context__c pills</w:t>
             </w:r>
           </w:p>
         </w:tc>
@@ -10454,7 +10736,7 @@
                 <w:color w:val="181818"/>
                 <w:sz w:val="20"/>
               </w:rPr>
-              <w:t>IDependencyService</w:t>
+              <w:t>IMetadataMetadataDependencyService</w:t>
             </w:r>
           </w:p>
         </w:tc>
@@ -10625,7 +10907,7 @@
                 <w:color w:val="181818"/>
                 <w:sz w:val="20"/>
               </w:rPr>
-              <w:t>findSupplemental(Id jobId, List&lt;Dependency_Node__c&gt; nodes)</w:t>
+              <w:t>findSupplemental(Id jobId, List&lt;Metadata_Dependency__c&gt; nodes)</w:t>
             </w:r>
           </w:p>
         </w:tc>
@@ -10736,7 +11018,7 @@
                 <w:color w:val="181818"/>
                 <w:sz w:val="20"/>
               </w:rPr>
-              <w:t>NamedCredentialHealthCheck</w:t>
+              <w:t>ToolingApiHealthCheck</w:t>
             </w:r>
           </w:p>
         </w:tc>
@@ -10830,7 +11112,7 @@
                 <w:color w:val="181818"/>
                 <w:sz w:val="20"/>
               </w:rPr>
-              <w:t>DependencyService</w:t>
+              <w:t>MetadataDependencyService</w:t>
             </w:r>
           </w:p>
         </w:tc>
@@ -11095,7 +11377,7 @@
                 <w:color w:val="181818"/>
                 <w:sz w:val="20"/>
               </w:rPr>
-              <w:t>Savepoint/catch; cancel/pause; overrideBatchSize; CMDT via ISettingsProvider (static); hot-loop; 7-limit guardrail (pre + mid-loop, heap 0.70); scoped dedup; hash shortcut + delimiter-safe Path__c cycle; accumulate list + single bulk upsert; Ancestor_Hashes__c; OrgLimits PE check; self-chain</w:t>
+              <w:t>Savepoint/catch; cancel/pause; overrideBatchSize; CMDT via ISettingsProvider (static); hot-loop; 7-limit guardrail (pre + mid-loop, heap 0.70); scoped dedup; hash shortcut + delimiter-safe Ancestor_Path__c cycle; accumulate list + single bulk upsert; Ancestor_Hash_Index__c; OrgLimits PE check; self-chain</w:t>
             </w:r>
           </w:p>
         </w:tc>
@@ -11142,7 +11424,7 @@
                 <w:color w:val="181818"/>
                 <w:sz w:val="20"/>
               </w:rPr>
-              <w:t>publishProgress() with OrgLimits check + Error_Message__c logging on suppression; sendCompletionNotification() enqueues AISummaryQueueable</w:t>
+              <w:t>publishProgress() with OrgLimits check + Error_Status_Message__c logging on suppression; sendCompletionNotification() enqueues ScanSummaryQueueable</w:t>
             </w:r>
           </w:p>
         </w:tc>
@@ -11159,7 +11441,7 @@
                 <w:color w:val="181818"/>
                 <w:sz w:val="20"/>
               </w:rPr>
-              <w:t>AISummaryQueueable</w:t>
+              <w:t>ScanSummaryQueueable</w:t>
             </w:r>
           </w:p>
         </w:tc>
@@ -11189,7 +11471,7 @@
                 <w:color w:val="181818"/>
                 <w:sz w:val="20"/>
               </w:rPr>
-              <w:t>One-shot. Reads Summary_JSON__c; builds plain-English AI_Summary__c; updates Job. Offloaded from engine final transaction.</w:t>
+              <w:t>One-shot. Reads Result_Summary__c; builds plain-English Scan_Summary_Text__c; updates Job. Offloaded from engine final transaction.</w:t>
             </w:r>
           </w:p>
         </w:tc>
@@ -11283,7 +11565,7 @@
                 <w:color w:val="181818"/>
                 <w:sz w:val="20"/>
               </w:rPr>
-              <w:t>Node + job deletion. start() = QueryLocator for nodes by jobId. execute() = delete scope. finish() = delete parent job. Batch size = Node_Chunk_Size__c.</w:t>
+              <w:t>Node + job deletion. start() = QueryLocator for nodes by jobId. execute() = delete scope. finish() = delete parent job. Batch size = Cleanup_Chunk_Size__c.</w:t>
             </w:r>
           </w:p>
         </w:tc>
@@ -11448,7 +11730,7 @@
                 <w:color w:val="181818"/>
                 <w:sz w:val="20"/>
               </w:rPr>
-              <w:t>DependencyServiceTest</w:t>
+              <w:t>MetadataDependencyServiceTest</w:t>
             </w:r>
           </w:p>
         </w:tc>
@@ -11495,7 +11777,7 @@
                 <w:color w:val="181818"/>
                 <w:sz w:val="20"/>
               </w:rPr>
-              <w:t>Normal; diamond (not circular); delimiter-safe true cycle (Path__c kept, Is_Circular__c, cycleClosesAt); cancel/pause; all 7 guardrail limits (including heap at 0.70); savepoint rollback + Failed; Completed + Closed_At__c; overrideBatchSize one-execution; hot-loop pause; OrgLimits auto-suppress PE + Error_Message__c append; dedup; Ancestor_Hashes__c no overflow at depth 50+; Path__c safe-fail truncation; single bulk upsert (never per-node)</w:t>
+              <w:t>Normal; diamond (not circular); delimiter-safe true cycle (Ancestor_Path__c kept, Is_Circular__c, cycleClosesAt); cancel/pause; all 7 guardrail limits (including heap at 0.70); savepoint rollback + Failed; Completed + Closed_At__c; overrideBatchSize one-execution; hot-loop pause; OrgLimits auto-suppress PE + Error_Status_Message__c append; dedup; Ancestor_Hash_Index__c no overflow at depth 50+; Ancestor_Path__c safe-fail truncation; single bulk upsert (never per-node)</w:t>
             </w:r>
           </w:p>
         </w:tc>
@@ -11559,7 +11841,7 @@
                 <w:color w:val="181818"/>
                 <w:sz w:val="20"/>
               </w:rPr>
-              <w:t>OrgLimits &gt;80% auto-suppress + Error_Message__c append; Disable_PE__c; AISummaryQueueable enqueued on Completed</w:t>
+              <w:t>OrgLimits &gt;80% auto-suppress + Error_Status_Message__c append; Disable_Platform_Events__c; ScanSummaryQueueable enqueued on Completed</w:t>
             </w:r>
           </w:p>
         </w:tc>
@@ -11576,7 +11858,7 @@
                 <w:color w:val="181818"/>
                 <w:sz w:val="20"/>
               </w:rPr>
-              <w:t>AISummaryQueueableTest</w:t>
+              <w:t>ScanSummaryQueueableTest</w:t>
             </w:r>
           </w:p>
         </w:tc>
@@ -11591,7 +11873,7 @@
                 <w:color w:val="181818"/>
                 <w:sz w:val="20"/>
               </w:rPr>
-              <w:t>AI_Summary__c built from Summary_JSON__c; job updated; null Summary_JSON__c handled</w:t>
+              <w:t>Scan_Summary_Text__c built from Result_Summary__c; job updated; null Result_Summary__c handled</w:t>
             </w:r>
           </w:p>
         </w:tc>
@@ -11751,7 +12033,7 @@
                 <w:color w:val="181818"/>
                 <w:sz w:val="20"/>
               </w:rPr>
-              <w:t>CSV default filename; JSON nested; package.xml excludes managed; cycleClosesAt in JSON; AI_Summary__c on Completed</w:t>
+              <w:t>CSV default filename; JSON nested; package.xml excludes managed; cycleClosesAt in JSON; Scan_Summary_Text__c on Completed</w:t>
             </w:r>
           </w:p>
         </w:tc>
@@ -12108,7 +12390,7 @@
                 <w:color w:val="181818"/>
                 <w:sz w:val="20"/>
               </w:rPr>
-              <w:t>Tune CMDT: Retention_Hours__c, Batch_Size__c, Flow_Batch_Size__c, Dml_Reserve_Rows__c, Max_Concurrent_Jobs__c, Node_Chunk_Size__c</w:t>
+              <w:t>Tune CMDT: Retention_Hours__c, Scan_Batch_Size__c, Flow_Scan_Scan_Batch_Size__c, Dml_Reserve_Rows__c, Max_Concurrent_Jobs__c, Cleanup_Chunk_Size__c</w:t>
             </w:r>
           </w:p>
         </w:tc>
@@ -12190,7 +12472,7 @@
           <w:color w:val="181818"/>
           <w:sz w:val="21"/>
         </w:rPr>
-        <w:t>DependencyNodeCleanupBatch deletes nodes in Node_Chunk_Size__c chunks (default 2,000) before parent. Do not raise above 4,000 for open-source deployments into unknown orgs.</w:t>
+        <w:t>DependencyNodeCleanupBatch deletes nodes in Cleanup_Chunk_Size__c chunks (default 2,000) before parent. Do not raise above 4,000 for open-source deployments into unknown orgs.</w:t>
       </w:r>
     </w:p>
     <w:p>
@@ -12316,7 +12598,7 @@
           <w:color w:val="181818"/>
           <w:sz w:val="21"/>
         </w:rPr>
-        <w:t>Path__c String.contains() is CPU-intensive on deep trees. Ancestor_Hashes__c (Long Text 32768) hash shortcut reduces most checks to a fast contains() before the full path scan.</w:t>
+        <w:t>Ancestor_Path__c String.contains() is CPU-intensive on deep trees. Ancestor_Hash_Index__c (Long Text 32768) hash shortcut reduces most checks to a fast contains() before the full path scan.</w:t>
       </w:r>
     </w:p>
     <w:p>
@@ -12330,7 +12612,7 @@
           <w:color w:val="181818"/>
           <w:sz w:val="21"/>
         </w:rPr>
-        <w:t>Ancestor_Hashes__c hash shortcut has negligible false-positive probability (6-char prefix collision); full delimiter-safe Path__c always confirms before Is_Circular__c = true.</w:t>
+        <w:t>Ancestor_Hash_Index__c hash shortcut has negligible false-positive probability (6-char prefix collision); full delimiter-safe Ancestor_Path__c always confirms before Is_Circular__c = true.</w:t>
       </w:r>
     </w:p>
     <w:p>
@@ -12344,7 +12626,7 @@
           <w:color w:val="181818"/>
           <w:sz w:val="21"/>
         </w:rPr>
-        <w:t>Path__c safe-fail truncation triggers on extreme depth (&gt;~1,700 levels). Context_Data__c flagged with path_truncated: true.</w:t>
+        <w:t>Ancestor_Path__c safe-fail truncation triggers on extreme depth (&gt;~1,700 levels). Dependency_Context__c flagged with path_truncated: true.</w:t>
       </w:r>
     </w:p>
     <w:p>
@@ -12372,7 +12654,7 @@
           <w:color w:val="181818"/>
           <w:sz w:val="21"/>
         </w:rPr>
-        <w:t>AI_Summary__c is null until AISummaryQueueable completes after Status__c = Completed. LWC polls getJobStatus() until non-null.</w:t>
+        <w:t>Scan_Summary_Text__c is null until ScanSummaryQueueable completes after Status__c = Completed. LWC polls getJobStatus() until non-null.</w:t>
       </w:r>
     </w:p>
     <w:p>
@@ -12386,7 +12668,7 @@
           <w:color w:val="181818"/>
           <w:sz w:val="21"/>
         </w:rPr>
-        <w:t>PE auto-degrade flips Disable_PE__c at 80% daily consumption; admin must manually re-enable PE the next day.</w:t>
+        <w:t>PE auto-degrade flips Disable_Platform_Events__c at 80% daily consumption; admin must manually re-enable PE the next day.</w:t>
       </w:r>
     </w:p>
     <w:p>
@@ -12428,7 +12710,7 @@
           <w:color w:val="181818"/>
           <w:sz w:val="21"/>
         </w:rPr>
-        <w:t>QueryMore cursor expiration: if a Queueable waits in the Flex Queue &gt; ~15 minutes, cursors expire. DependencyService restarts the query from scratch on INVALID_QUERY_LOCATOR (no job failure).</w:t>
+        <w:t>QueryMore cursor expiration: if a Queueable waits in the Flex Queue &gt; ~15 minutes, cursors expire. MetadataDependencyService restarts the query from scratch on INVALID_QUERY_LOCATOR (no job failure).</w:t>
       </w:r>
     </w:p>
     <w:p>
@@ -13348,7 +13630,7 @@
           <w:color w:val="181818"/>
           <w:sz w:val="21"/>
         </w:rPr>
-        <w:t>Progress bar: lightning-progress-bar driven by Platform Events (polling fallback if Disable_PE__c).</w:t>
+        <w:t>Progress bar: lightning-progress-bar driven by Platform Events (polling fallback if Disable_Platform_Events__c).</w:t>
       </w:r>
     </w:p>
     <w:p>
@@ -13608,7 +13890,7 @@
                 <w:color w:val="181818"/>
                 <w:sz w:val="20"/>
               </w:rPr>
-              <w:t>Source__c = Supplemental</w:t>
+              <w:t>Discovery_Source__c = Supplemental</w:t>
             </w:r>
           </w:p>
         </w:tc>
@@ -13812,7 +14094,7 @@
         </w:rPr>
         <w:t>[Metadata_Name__c] ([Metadata_Type__c])</w:t>
         <w:br/>
-        <w:t>[Context_Data__c keys -&gt; human sentences per Section 4.3]</w:t>
+        <w:t>[Dependency_Context__c keys -&gt; human sentences per Section 4.3]</w:t>
         <w:br/>
         <w:t>[Confidence: N% - requires manual verification]  &lt;- Supplemental only</w:t>
       </w:r>
@@ -14462,7 +14744,7 @@
                 <w:color w:val="181818"/>
                 <w:sz w:val="20"/>
               </w:rPr>
-              <w:t>Level__c</w:t>
+              <w:t>Dependency_Depth__c</w:t>
             </w:r>
           </w:p>
         </w:tc>
@@ -14494,7 +14776,7 @@
                 <w:color w:val="181818"/>
                 <w:sz w:val="20"/>
               </w:rPr>
-              <w:t>Source__c</w:t>
+              <w:t>Discovery_Source__c</w:t>
             </w:r>
           </w:p>
         </w:tc>
@@ -14558,7 +14840,7 @@
                 <w:color w:val="181818"/>
                 <w:sz w:val="20"/>
               </w:rPr>
-              <w:t>Context_Data__c</w:t>
+              <w:t>Dependency_Context__c</w:t>
             </w:r>
           </w:p>
         </w:tc>
@@ -14590,7 +14872,7 @@
                 <w:color w:val="181818"/>
                 <w:sz w:val="20"/>
               </w:rPr>
-              <w:t>Path__c</w:t>
+              <w:t>Ancestor_Path__c</w:t>
             </w:r>
           </w:p>
         </w:tc>
@@ -15453,7 +15735,7 @@
           <w:color w:val="181818"/>
           <w:sz w:val="21"/>
         </w:rPr>
-        <w:t>Shown at top of Results screen (above tabs) when Status__c = Completed AND AI_Summary__c is non-null (LWC polls getJobStatus() until populated):</w:t>
+        <w:t>Shown at top of Results screen (above tabs) when Status__c = Completed AND Scan_Summary_Text__c is non-null (LWC polls getJobStatus() until populated):</w:t>
       </w:r>
     </w:p>
     <w:tbl>
@@ -15560,7 +15842,7 @@
                 <w:color w:val="181818"/>
                 <w:sz w:val="20"/>
               </w:rPr>
-              <w:t>AI_Summary__c verbatim. Max 3 lines visible by default. "Show more" inline toggle for overflow. Prevents card pushing tabs below fold.</w:t>
+              <w:t>Scan_Summary_Text__c verbatim. Max 3 lines visible by default. "Show more" inline toggle for overflow. Prevents card pushing tabs below fold.</w:t>
             </w:r>
           </w:p>
         </w:tc>
@@ -15592,7 +15874,7 @@
                 <w:color w:val="181818"/>
                 <w:sz w:val="20"/>
               </w:rPr>
-              <w:t>Copies AI_Summary__c to clipboard (lightning-button-icon, utility:copy)</w:t>
+              <w:t>Copies Scan_Summary_Text__c to clipboard (lightning-button-icon, utility:copy)</w:t>
             </w:r>
           </w:p>
         </w:tc>
@@ -15624,7 +15906,7 @@
                 <w:color w:val="181818"/>
                 <w:sz w:val="20"/>
               </w:rPr>
-              <w:t>Opens Einstein Copilot with AI_Summary__c. Conditionally rendered (Copilot enabled in org only). If Copilot is NOT available: show helper text "Einstein Copilot not available in this org." - do not hide silently.</w:t>
+              <w:t>Opens Einstein Copilot with Scan_Summary_Text__c. Conditionally rendered (Copilot enabled in org only). If Copilot is NOT available: show helper text "Einstein Copilot not available in this org." - do not hide silently.</w:t>
             </w:r>
           </w:p>
         </w:tc>
@@ -15764,7 +16046,7 @@
                 <w:color w:val="181818"/>
                 <w:sz w:val="20"/>
               </w:rPr>
-              <w:t>Error banner + "View full error" expander (Error_Message__c) + "Start a new scan" button</w:t>
+              <w:t>Error banner + "View full error" expander (Error_Status_Message__c) + "Start a new scan" button</w:t>
             </w:r>
           </w:p>
         </w:tc>
@@ -16329,7 +16611,7 @@
                 <w:color w:val="181818"/>
                 <w:sz w:val="20"/>
               </w:rPr>
-              <w:t>Nested tree with Context_Data__c pills</w:t>
+              <w:t>Nested tree with Dependency_Context__c pills</w:t>
             </w:r>
           </w:p>
         </w:tc>
@@ -16611,7 +16893,7 @@
                 <w:color w:val="181818"/>
                 <w:sz w:val="20"/>
               </w:rPr>
-              <w:t>Batch_Size__c</w:t>
+              <w:t>Scan_Batch_Size__c</w:t>
             </w:r>
           </w:p>
         </w:tc>
@@ -16658,7 +16940,7 @@
                 <w:color w:val="181818"/>
                 <w:sz w:val="20"/>
               </w:rPr>
-              <w:t>Flow_Batch_Size__c</w:t>
+              <w:t>Flow_Scan_Scan_Batch_Size__c</w:t>
             </w:r>
           </w:p>
         </w:tc>
@@ -16752,7 +17034,7 @@
                 <w:color w:val="181818"/>
                 <w:sz w:val="20"/>
               </w:rPr>
-              <w:t>Disable_PE__c</w:t>
+              <w:t>Disable_Platform_Events__c</w:t>
             </w:r>
           </w:p>
         </w:tc>
@@ -16799,7 +17081,7 @@
                 <w:color w:val="181818"/>
                 <w:sz w:val="20"/>
               </w:rPr>
-              <w:t>Hotloop_Threshold__c</w:t>
+              <w:t>Stall_Detection_Threshold__c</w:t>
             </w:r>
           </w:p>
         </w:tc>
@@ -16893,7 +17175,7 @@
                 <w:color w:val="181818"/>
                 <w:sz w:val="20"/>
               </w:rPr>
-              <w:t>Node_Chunk_Size__c</w:t>
+              <w:t>Cleanup_Chunk_Size__c</w:t>
             </w:r>
           </w:p>
         </w:tc>

</xml_diff>

<commit_message>
Apply all 11 design review findings - v15.0
- Four field renames: Status_Closed_At__c, Engine_Execution_Count__c, Dependencies_Fetched__c, Cycle_Detection_Index__c
- ResultSerializerQueueable: Savepoint/rollback pattern, heap guard, terminal-on-failure note
- Failed serialization UI state with Download Partial Results button
- Simultaneous state update rules (last-write-wins, single-owner pattern)
- Expand All modal with Expand Anyway / Keep Collapsed buttons
- Graph interaction aria-live region for screen reader support
- Known Limitation: result serialization is terminal on failure
- Updated all field descriptions to remove implementation-detail language

Co-Authored-By: Claude Sonnet 4.6 <noreply@anthropic.com>
</commit_message>
<xml_diff>
--- a/projects/meta-mapper/MetaMapper_Technical_Design.docx
+++ b/projects/meta-mapper/MetaMapper_Technical_Design.docx
@@ -615,7 +615,7 @@
                 <w:color w:val="181818"/>
                 <w:sz w:val="20"/>
               </w:rPr>
-              <w:t>Keep full Ancestor_Path__c. Do NOT set to null. Mark Is_Circular__c = true, Is_Processed__c = true. Append cycleClosesAt to Dependency_Context__c.</w:t>
+              <w:t>Keep full Ancestor_Path__c. Do NOT set to null. Mark Is_Circular__c = true, Dependencies_Fetched__c = true. Append cycleClosesAt to Dependency_Context__c.</w:t>
             </w:r>
           </w:p>
         </w:tc>
@@ -679,7 +679,7 @@
                 <w:color w:val="181818"/>
                 <w:sz w:val="20"/>
               </w:rPr>
-              <w:t>Ancestor_Hash_Prefixes__c stores 6-char base64url hash prefixes for fast pre-check before full string scan. Reduces CPU on deep trees.</w:t>
+              <w:t>Cycle_Detection_Index__c stores 6-char hash prefixes for fast pre-check before full string scan. Reduces CPU on deep trees.</w:t>
             </w:r>
           </w:p>
         </w:tc>
@@ -898,7 +898,7 @@
                 <w:color w:val="181818"/>
                 <w:sz w:val="20"/>
               </w:rPr>
-              <w:t>On each self-chain, increment Processing_Cycle_Count__c. If it increases by Stall_Detection_Threshold__c (default 5) without any change in Components_Analyzed__c, transition Job to Status__c = "Paused".</w:t>
+              <w:t>On each self-chain, increment Engine_Execution_Count__c. If it increases by Stall_Detection_Threshold__c (default 5) without any change in Components_Analyzed__c, transition Job to Status__c = "Paused".</w:t>
             </w:r>
           </w:p>
         </w:tc>
@@ -1742,7 +1742,7 @@
                 <w:color w:val="181818"/>
                 <w:sz w:val="20"/>
               </w:rPr>
-              <w:t>Closed_At__c</w:t>
+              <w:t>Status_Closed_At__c</w:t>
             </w:r>
           </w:p>
         </w:tc>
@@ -1789,7 +1789,7 @@
                 <w:color w:val="181818"/>
                 <w:sz w:val="20"/>
               </w:rPr>
-              <w:t>Processing_Cycle_Count__c</w:t>
+              <w:t>Engine_Execution_Count__c</w:t>
             </w:r>
           </w:p>
         </w:tc>
@@ -2318,7 +2318,7 @@
                 <w:color w:val="181818"/>
                 <w:sz w:val="20"/>
               </w:rPr>
-              <w:t>Is_Processed__c</w:t>
+              <w:t>Dependencies_Fetched__c</w:t>
             </w:r>
           </w:p>
         </w:tc>
@@ -2348,7 +2348,7 @@
                 <w:color w:val="181818"/>
                 <w:sz w:val="20"/>
               </w:rPr>
-              <w:t>Engine flag: false = pending child traversal.</w:t>
+              <w:t>False when this node's child dependencies have not yet been fetched; true when child traversal is complete or intentionally skipped (circular or dynamic).</w:t>
             </w:r>
           </w:p>
         </w:tc>
@@ -2694,7 +2694,7 @@
                 <w:color w:val="181818"/>
                 <w:sz w:val="20"/>
               </w:rPr>
-              <w:t>Ancestor_Hash_Prefixes__c</w:t>
+              <w:t>Cycle_Detection_Index__c</w:t>
             </w:r>
           </w:p>
         </w:tc>
@@ -2724,7 +2724,7 @@
                 <w:color w:val="181818"/>
                 <w:sz w:val="20"/>
               </w:rPr>
-              <w:t>Concatenated 6-char base64url hashes of ancestor IDs. Fast cycle pre-check. Must be Long Text 32768 - Text 255 overflows at depth &gt;42.</w:t>
+              <w:t>Concatenated 6-char hash prefixes of ancestor IDs. Fast pre-check index for cycle detection - avoids a full string scan on most nodes. Must be Long Text 32768 - Text 255 overflows at depth &gt;42.</w:t>
             </w:r>
           </w:p>
         </w:tc>
@@ -3828,7 +3828,7 @@
                 <w:color w:val="181818"/>
                 <w:sz w:val="20"/>
               </w:rPr>
-              <w:t>One-shot Queueable enqueued by the final DependencyQueueable execution. Reads all Metadata_Dependency__c for the job, serializes to JSON, creates ContentVersion with FirstPublishLocationId = jobId (links file directly to job record, not a library - no additional ContentDocumentLink created), updates Result_File_Id__c on the job, bulk-deletes all node records, enforces ring buffer (deletes oldest Completed job if count &gt; Max_Stored_Jobs__c). Transitions job to Completed only after all steps succeed. On failure, transitions to Failed via updateJobFailed(). Offloaded from the engine because serializing 5,000+ node records consumes significant heap and CPU that would compete with the final batch of Tooling API work.</w:t>
+              <w:t>One-shot Queueable enqueued by the final DependencyQueueable execution. Reads all Metadata_Dependency__c for the job, serializes to JSON, creates ContentVersion with FirstPublishLocationId = jobId (links file directly to job record - no library link, no extra ContentDocumentLink), updates Result_File_Id__c on the job, bulk-deletes all node records, enforces ring buffer (deletes oldest Completed job if count &gt; Max_Stored_Jobs__c). Transitions job to Completed only after all steps succeed. On failure, transitions to Failed via updateJobFailed(). Offloaded from the engine because serializing 5,000+ node records consumes significant heap and CPU that would compete with the final batch of Tooling API work. CRITICAL: Must use Database.setSavepoint() / rollback(sp) pattern - without it, an exception after partial DML leaves the job permanently stuck in Processing. HEAP GUARD: check Limits.getHeapSize() before calling JSON.serialize() on the full node list. At ~2KB per node, 5,000 nodes approaches the 12MB async heap limit. If heap is &gt;50% before serialization, transition to Failed immediately with a descriptive message - do not attempt serialization and run out of heap mid-call. TERMINAL ON FAILURE: if the serializer fails, it transitions to Failed and does not retry. The admin must start a new scan. Partial node records are cleaned up by the nightly batch.</w:t>
             </w:r>
           </w:p>
         </w:tc>
@@ -4639,7 +4639,7 @@
           <w:color w:val="181818"/>
           <w:sz w:val="21"/>
         </w:rPr>
-        <w:t>updateJobFailed() must: (1) update Status__c = "Failed", set Error_Status_Message__c to e.getMessage() + newline + e.getStackTraceString(), and set Closed_At__c; (2) publish Dependency_Scan_Status__e failure event; (3) NOT re-throw the exception.</w:t>
+        <w:t>updateJobFailed() must: (1) update Status__c = "Failed", set Error_Status_Message__c to e.getMessage() + newline + e.getStackTraceString(), and set Status_Closed_At__c; (2) publish Dependency_Scan_Status__e failure event; (3) NOT re-throw the exception.</w:t>
       </w:r>
     </w:p>
     <w:p>
@@ -6223,7 +6223,7 @@
                 <w:color w:val="181818"/>
                 <w:sz w:val="20"/>
               </w:rPr>
-              <w:t>Status__c IN ("Failed","Cancelled") AND Closed_At__c &lt; DateTime.now().addHours(-retentionHours). Never delete Initializing, Processing, Paused, or Completed jobs.</w:t>
+              <w:t>Status__c IN ("Failed","Cancelled") AND Status_Closed_At__c &lt; DateTime.now().addHours(-retentionHours). Never delete Initializing, Processing, Paused, or Completed jobs.</w:t>
             </w:r>
           </w:p>
         </w:tc>
@@ -6240,7 +6240,7 @@
                 <w:color w:val="181818"/>
                 <w:sz w:val="20"/>
               </w:rPr>
-              <w:t>Use Closed_At__c not CreatedDate</w:t>
+              <w:t>Use Status_Closed_At__c not CreatedDate</w:t>
             </w:r>
           </w:p>
         </w:tc>
@@ -6255,7 +6255,7 @@
                 <w:color w:val="181818"/>
                 <w:sz w:val="20"/>
               </w:rPr>
-              <w:t>CreatedDate would incorrectly target long-running in-progress scans. Closed_At__c is only set when the job has truly stopped.</w:t>
+              <w:t>CreatedDate would incorrectly target long-running in-progress scans. Status_Closed_At__c is only set when the job has truly stopped.</w:t>
             </w:r>
           </w:p>
         </w:tc>
@@ -9310,7 +9310,7 @@
           <w:color w:val="181818"/>
           <w:sz w:val="21"/>
         </w:rPr>
-        <w:t>"Expand All" guard: if Components_Analyzed__c &gt; 1,000, show modal warning before expanding.</w:t>
+        <w:t>"Expand All" guard: if Components_Analyzed__c &gt; 1,000, show modal: "This graph contains [N] nodes. Expanding all levels may slow or freeze your browser. Consider using the Level Filter or exporting to CSV instead." Buttons: "Expand Anyway" (proceeds) and "Keep Collapsed" (closes modal without action).</w:t>
       </w:r>
     </w:p>
     <w:p>
@@ -10256,6 +10256,20 @@
     </w:p>
     <w:p>
       <w:pPr>
+        <w:ind w:left="283"/>
+        <w:shd w:val="clear" w:color="auto" w:fill="EFF4FB"/>
+      </w:pPr>
+      <w:r>
+        <w:rPr>
+          <w:i/>
+          <w:color w:val="032D60"/>
+          <w:sz w:val="19"/>
+        </w:rPr>
+        <w:t>Simultaneous state update rules: (1) Filter changes from Tree and Graph that arrive at the same time are last-write-wins - the final update wins, no merge needed. (2) Selection events (node click) fired during a tab transition are dropped - the transition clears transient state on arrival, so a selection in-flight would immediately be overwritten. (3) metaMapperResults (the parent component) is the sole owner of all shared filter state. Neither Tree nor Graph writes to shared state directly; they fire events upward and the parent dispatches updates back down. This single-owner pattern prevents state divergence when both components respond to the same user action at the same time.</w:t>
+      </w:r>
+    </w:p>
+    <w:p>
+      <w:pPr>
         <w:pStyle w:val="Heading3"/>
         <w:spacing w:before="240" w:after="120"/>
       </w:pPr>
@@ -10469,6 +10483,38 @@
                 <w:sz w:val="20"/>
               </w:rPr>
               <w:t>Toast notification: "A scan is already in progress. Wait for it to complete before starting a new one."</w:t>
+            </w:r>
+          </w:p>
+        </w:tc>
+      </w:tr>
+      <w:tr>
+        <w:tc>
+          <w:tcPr>
+            <w:tcW w:type="dxa" w:w="4533"/>
+            <w:shd w:val="clear" w:color="auto" w:fill="FFFFFF"/>
+          </w:tcPr>
+          <w:p>
+            <w:r>
+              <w:rPr>
+                <w:color w:val="181818"/>
+                <w:sz w:val="20"/>
+              </w:rPr>
+              <w:t>Job failed during result serialization</w:t>
+            </w:r>
+          </w:p>
+        </w:tc>
+        <w:tc>
+          <w:tcPr>
+            <w:tcW w:type="dxa" w:w="4533"/>
+            <w:shd w:val="clear" w:color="auto" w:fill="FFFFFF"/>
+          </w:tcPr>
+          <w:p>
+            <w:r>
+              <w:rPr>
+                <w:color w:val="181818"/>
+                <w:sz w:val="20"/>
+              </w:rPr>
+              <w:t>Detected by Status__c = "Failed" AND Components_Analyzed__c &gt; 0 AND Result_File_Id__c is null. Distinct from a scan failure mid-traversal. UI shows: "Analysis failed while saving results. Components were found but could not be saved." + "Download Partial Results" button (downloads whatever Metadata_Dependency__c records remain before cleanup) + "View full error" expander. Does not show "Start a new scan" button in place of the partial download - both are shown.</w:t>
             </w:r>
           </w:p>
         </w:tc>
@@ -10760,6 +10806,20 @@
     </w:p>
     <w:p>
       <w:pPr>
+        <w:pStyle w:val="ListBullet"/>
+        <w:spacing w:after="40"/>
+        <w:ind w:left="283"/>
+      </w:pPr>
+      <w:r>
+        <w:rPr>
+          <w:color w:val="181818"/>
+          <w:sz w:val="21"/>
+        </w:rPr>
+        <w:t>Graph interactions (node selection, focus path, search highlight) are announced via an aria-live="polite" region in the graph container. The region renders a human-readable description of the last interaction: "Node selected: [Metadata_Name__c] ([Metadata_Type__c])", "Focus set to path from [node] to root", "Search: [N] matches found". This ensures screen reader users receive feedback from graph state changes without keyboard focus moving to the canvas.</w:t>
+      </w:r>
+    </w:p>
+    <w:p>
+      <w:pPr>
         <w:pStyle w:val="Heading3"/>
         <w:spacing w:before="240" w:after="120"/>
       </w:pPr>
@@ -12238,6 +12298,38 @@
           </w:p>
         </w:tc>
       </w:tr>
+      <w:tr>
+        <w:tc>
+          <w:tcPr>
+            <w:tcW w:type="dxa" w:w="4533"/>
+            <w:shd w:val="clear" w:color="auto" w:fill="FFFFFF"/>
+          </w:tcPr>
+          <w:p>
+            <w:r>
+              <w:rPr>
+                <w:color w:val="181818"/>
+                <w:sz w:val="20"/>
+              </w:rPr>
+              <w:t>Result serialization is terminal on failure</w:t>
+            </w:r>
+          </w:p>
+        </w:tc>
+        <w:tc>
+          <w:tcPr>
+            <w:tcW w:type="dxa" w:w="4533"/>
+            <w:shd w:val="clear" w:color="auto" w:fill="FFFFFF"/>
+          </w:tcPr>
+          <w:p>
+            <w:r>
+              <w:rPr>
+                <w:color w:val="181818"/>
+                <w:sz w:val="20"/>
+              </w:rPr>
+              <w:t>If ResultSerializerQueueable fails (e.g. heap exhaustion while serializing a very large result set), the job transitions to Failed and does not retry. Partial node records remain until the nightly cleanup batch removes them. There is no automatic retry path - the admin must start a new scan. The UI surface for this state is described in the Empty and Error States section.</w:t>
+            </w:r>
+          </w:p>
+        </w:tc>
+      </w:tr>
     </w:tbl>
     <w:p/>
     <w:p>
@@ -12727,7 +12819,7 @@
                 <w:color w:val="181818"/>
                 <w:sz w:val="20"/>
               </w:rPr>
-              <w:t>Closed_At__c</w:t>
+              <w:t>Status_Closed_At__c</w:t>
             </w:r>
           </w:p>
         </w:tc>
@@ -12742,7 +12834,7 @@
                 <w:color w:val="181818"/>
                 <w:sz w:val="20"/>
               </w:rPr>
-              <w:t>Timestamp set when Status transitions to Completed, Failed, or Cancelled. Used by the cleanup batch to calculate retention age. The cleanup batch uses this field, not CreatedDate, to avoid deleting in-progress scans. Do not edit manually.</w:t>
+              <w:t>Timestamp set the moment Status transitions to Completed, Failed, or Cancelled. The cleanup batch uses this field - not CreatedDate - to calculate retention age, ensuring in-progress scans are never incorrectly targeted for deletion. Do not edit manually.</w:t>
             </w:r>
           </w:p>
         </w:tc>
@@ -12759,7 +12851,7 @@
                 <w:color w:val="181818"/>
                 <w:sz w:val="20"/>
               </w:rPr>
-              <w:t>Processing_Cycle_Count__c</w:t>
+              <w:t>Engine_Execution_Count__c</w:t>
             </w:r>
           </w:p>
         </w:tc>
@@ -12774,7 +12866,7 @@
                 <w:color w:val="181818"/>
                 <w:sz w:val="20"/>
               </w:rPr>
-              <w:t>Number of times the async engine has re-queued itself. Used to detect stalls. Do not edit manually.</w:t>
+              <w:t>Number of times the async scan engine has re-queued itself for this job. Used to detect hot-loop stalls: if this count increases by the Stall Detection Threshold setting without any increase in Components Analyzed, the engine pauses the job automatically. Do not edit manually.</w:t>
             </w:r>
           </w:p>
         </w:tc>
@@ -13108,7 +13200,7 @@
                 <w:color w:val="181818"/>
                 <w:sz w:val="20"/>
               </w:rPr>
-              <w:t>Is_Processed__c</w:t>
+              <w:t>Dependencies_Fetched__c</w:t>
             </w:r>
           </w:p>
         </w:tc>
@@ -13123,7 +13215,7 @@
                 <w:color w:val="181818"/>
                 <w:sz w:val="20"/>
               </w:rPr>
-              <w:t>Internal engine flag. False = dependencies not yet fetched. True = processing complete or intentionally skipped. Do not edit manually.</w:t>
+              <w:t>False when this node's child dependencies have not yet been fetched from the Tooling API; true when child traversal is complete or intentionally skipped (circular nodes are marked true to prevent infinite re-traversal; dynamic reference nodes are marked true because they cannot be statically resolved). Do not edit manually.</w:t>
             </w:r>
           </w:p>
         </w:tc>
@@ -13364,7 +13456,7 @@
                 <w:color w:val="181818"/>
                 <w:sz w:val="20"/>
               </w:rPr>
-              <w:t>Ancestor_Hash_Prefixes__c</w:t>
+              <w:t>Cycle_Detection_Index__c</w:t>
             </w:r>
           </w:p>
         </w:tc>
@@ -13379,7 +13471,7 @@
                 <w:color w:val="181818"/>
                 <w:sz w:val="20"/>
               </w:rPr>
-              <w:t>Internal engine field. Stores concatenated 6-character hash prefixes of ancestor component IDs. Used as a fast lookup index for cycle detection. Do not edit manually.</w:t>
+              <w:t>Internal engine field. Stores concatenated 6-character hash prefixes of ancestor component IDs, used as a fast pre-check index before invoking the full ancestor string scan. If the index contains the short hash for a candidate node, the engine validates conclusively against Ancestor_Path__c before marking the node circular. Must be Long Text 32768 - Text 255 overflows at depth &gt;42. Do not edit manually.</w:t>
             </w:r>
           </w:p>
         </w:tc>

</xml_diff>

<commit_message>
Apply 26 design review fixes - v17.0 (C1-C6, H1-H9, M1-M7)
</commit_message>
<xml_diff>
--- a/projects/meta-mapper/MetaMapper_Technical_Design.docx
+++ b/projects/meta-mapper/MetaMapper_Technical_Design.docx
@@ -24,7 +24,7 @@
           <w:color w:val="706E6B"/>
           <w:sz w:val="26"/>
         </w:rPr>
-        <w:t>Technical Design Document  |  v16.0</w:t>
+        <w:t>Technical Design Document  |  v17.0</w:t>
       </w:r>
     </w:p>
     <w:p/>
@@ -679,7 +679,7 @@
                 <w:color w:val="181818"/>
                 <w:sz w:val="20"/>
               </w:rPr>
-              <w:t>Cycle_Detection_Index__c stores 6-char hash prefixes for fast pre-check before full string scan. Reduces CPU on deep trees.</w:t>
+              <w:t>Cycle_Detection_Index__c stores pipe-delimited 6-character prefixes of each ancestor Metadata_Id__c (e.g. "abc123|def456|..."). Fast bloom-filter pre-check before the full Ancestor_Path__c string scan. Long Text 32768 required - at 7 chars/entry, a 1,500-depth tree yields ~10,500 chars; Text 255 overflows at depth &gt;36. Negligible false-positive rate; full Ancestor_Path__c confirms before marking circular.</w:t>
             </w:r>
           </w:p>
         </w:tc>
@@ -898,7 +898,7 @@
                 <w:color w:val="181818"/>
                 <w:sz w:val="20"/>
               </w:rPr>
-              <w:t>On each self-chain, increment Engine_Execution_Count__c. If it increases by Stall_Detection_Threshold__c (default 5) without any change in Components_Analyzed__c, transition Job to Status__c = "Paused".</w:t>
+              <w:t>On each execution: increment Engine_Execution_Count__c. If Components_Analyzed__c increased, reset Last_Progress_Execution_Count__c = Engine_Execution_Count__c. If Engine_Execution_Count__c - Last_Progress_Execution_Count__c &gt;= Stall_Detection_Threshold__c, transition Job to "Paused". Both fields are persisted on the job record - transient variables are discarded on each new Queueable instance.</w:t>
             </w:r>
           </w:p>
         </w:tc>
@@ -1172,7 +1172,7 @@
                 <w:color w:val="181818"/>
                 <w:sz w:val="20"/>
               </w:rPr>
-              <w:t>DependencyNotificationService checks org daily PE allocation before each publish. If &gt;80% consumed, suppresses the event, flips Disable_Platform_Events__c = true on the CMDT Default record, and appends a notice to Error_Status_Message__c.</w:t>
+              <w:t>DependencyNotificationService checks OrgLimits.getMap().get("DailyStandardVolumePlatformEvents") before each publish. If (getValue() / getLimit()) &gt;= 0.80, suppresses the event, flips Disable_Platform_Events__c = true via Metadata.Operations.enqueueDeployment(), and appends a notice to Error_Status_Message__c.</w:t>
             </w:r>
           </w:p>
         </w:tc>
@@ -1819,7 +1819,7 @@
                 <w:color w:val="181818"/>
                 <w:sz w:val="20"/>
               </w:rPr>
-              <w:t>Incremented each self-chain. Used for hot-loop stall detection.</w:t>
+              <w:t>Incremented on every Queueable execution. Used together with Last_Progress_Execution_Count__c for stall detection.</w:t>
             </w:r>
           </w:p>
         </w:tc>
@@ -1836,7 +1836,7 @@
                 <w:color w:val="181818"/>
                 <w:sz w:val="20"/>
               </w:rPr>
-              <w:t>Scan_Summary_Text__c</w:t>
+              <w:t>Last_Progress_Execution_Count__c</w:t>
             </w:r>
           </w:p>
         </w:tc>
@@ -1851,7 +1851,7 @@
                 <w:color w:val="181818"/>
                 <w:sz w:val="20"/>
               </w:rPr>
-              <w:t>Long Text 32768</w:t>
+              <w:t>Number</w:t>
             </w:r>
           </w:p>
         </w:tc>
@@ -1866,7 +1866,7 @@
                 <w:color w:val="181818"/>
                 <w:sz w:val="20"/>
               </w:rPr>
-              <w:t>Plain-English summary built by ScanSummaryQueueable after Completed. Null until populated. LWC polls until non-null before rendering Summary Card.</w:t>
+              <w:t>Value of Engine_Execution_Count__c at the last execution that made progress (Components_Analyzed__c increased). Persisted on the job record - transient variables reset on each new Queueable instance. Stall condition: Engine_Execution_Count__c - Last_Progress_Execution_Count__c &gt;= Stall_Detection_Threshold__c.</w:t>
             </w:r>
           </w:p>
         </w:tc>
@@ -1883,7 +1883,7 @@
                 <w:color w:val="181818"/>
                 <w:sz w:val="20"/>
               </w:rPr>
-              <w:t>Result_File_Id__c</w:t>
+              <w:t>Scan_Summary_Text__c</w:t>
             </w:r>
           </w:p>
         </w:tc>
@@ -1898,7 +1898,7 @@
                 <w:color w:val="181818"/>
                 <w:sz w:val="20"/>
               </w:rPr>
-              <w:t>Text 18</w:t>
+              <w:t>Long Text 32768</w:t>
             </w:r>
           </w:p>
         </w:tc>
@@ -1906,6 +1906,53 @@
           <w:tcPr>
             <w:tcW w:type="dxa" w:w="3022"/>
             <w:shd w:val="clear" w:color="auto" w:fill="FFFFFF"/>
+          </w:tcPr>
+          <w:p>
+            <w:r>
+              <w:rPr>
+                <w:color w:val="181818"/>
+                <w:sz w:val="20"/>
+              </w:rPr>
+              <w:t>Plain-English summary built by ScanSummaryQueueable after Completed. Null until populated. LWC polls until non-null before rendering Summary Card.</w:t>
+            </w:r>
+          </w:p>
+        </w:tc>
+      </w:tr>
+      <w:tr>
+        <w:tc>
+          <w:tcPr>
+            <w:tcW w:type="dxa" w:w="3022"/>
+            <w:shd w:val="clear" w:color="auto" w:fill="F2F4F7"/>
+          </w:tcPr>
+          <w:p>
+            <w:r>
+              <w:rPr>
+                <w:color w:val="181818"/>
+                <w:sz w:val="20"/>
+              </w:rPr>
+              <w:t>Result_File_Id__c</w:t>
+            </w:r>
+          </w:p>
+        </w:tc>
+        <w:tc>
+          <w:tcPr>
+            <w:tcW w:type="dxa" w:w="3022"/>
+            <w:shd w:val="clear" w:color="auto" w:fill="F2F4F7"/>
+          </w:tcPr>
+          <w:p>
+            <w:r>
+              <w:rPr>
+                <w:color w:val="181818"/>
+                <w:sz w:val="20"/>
+              </w:rPr>
+              <w:t>Text 18</w:t>
+            </w:r>
+          </w:p>
+        </w:tc>
+        <w:tc>
+          <w:tcPr>
+            <w:tcW w:type="dxa" w:w="3022"/>
+            <w:shd w:val="clear" w:color="auto" w:fill="F2F4F7"/>
           </w:tcPr>
           <w:p>
             <w:r>
@@ -2113,7 +2160,7 @@
                 <w:color w:val="181818"/>
                 <w:sz w:val="20"/>
               </w:rPr>
-              <w:t>Builds hierarchical tree. Null for root.</w:t>
+              <w:t>Builds hierarchical tree. Null for root. Self-referential bulk DML constraint: Salesforce does not resolve self-referential lookups within a single bulk DML. The root node must be committed before any child can reference it by ID - insert root first, commit, then bulk-upsert children.</w:t>
             </w:r>
           </w:p>
         </w:tc>
@@ -2724,7 +2771,7 @@
                 <w:color w:val="181818"/>
                 <w:sz w:val="20"/>
               </w:rPr>
-              <w:t>Concatenated 6-char hash prefixes of ancestor IDs. Fast pre-check index for cycle detection - avoids a full string scan on most nodes. Must be Long Text 32768 - Text 255 overflows at depth &gt;42.</w:t>
+              <w:t>Pipe-delimited 6-character prefixes of each ancestor Metadata_Id__c (e.g. "abc123|def456|..."). Bloom-filter pre-screen before the expensive full Ancestor_Path__c check. If no prefix match, skip the full scan. If match found, confirm conclusively against Ancestor_Path__c before marking circular. Long Text 32768 required - 7 chars/entry, 1,500-depth tree = ~10,500 chars; Text 255 overflows at depth &gt;36.</w:t>
             </w:r>
           </w:p>
         </w:tc>
@@ -3604,7 +3651,7 @@
                 <w:color w:val="181818"/>
                 <w:sz w:val="20"/>
               </w:rPr>
-              <w:t>@AuraEnabled (USER_MODE): createJob() with async guard + concurrency guard + storage check + node cap enforcement + preflight check, getObjectList(), getJobStatus(), getNodeHierarchy(), cancelJob(), resumeJob(). Delegates to services - no SOQL/DML directly. Storage check: reads OrgLimits DataStorageMB before accepting a job. getNodeHierarchy() routing: if Status = Completed, reads the result JSON from ContentVersion via DependencyNodeSelector.getResultFile(job.Result_File_Id__c) - Metadata_Dependency__c records no longer exist for completed jobs. For active jobs, queries Metadata_Dependency__c directly. Both paths return the same flat node list shape - routing is transparent to the LWC.</w:t>
+              <w:t>@AuraEnabled (USER_MODE): createJob() with async guard + concurrency guard + storage check + node cap enforcement + preflight check, getObjectList(), getJobStatus(), getNodeHierarchy(), cancelJob(), resumeJob(). Delegates to services - no SOQL/DML directly. Storage check: reads OrgLimits DataStorageMB - free storage = orgLimit.getLimit() - orgLimit.getValue() - rejects if free &lt; Storage_Reserve_MB__c. getNodeHierarchy() routing: if Status = Completed, reads result JSON from ContentVersion via DependencyNodeSelector.getResultFile() - Metadata_Dependency__c records no longer exist for completed jobs. For all other statuses (Initializing, Processing, Paused, Cancelled, Failed), queries Metadata_Dependency__c directly - partial nodes from a Failed job are valid for export. Both paths return the same flat node list shape.</w:t>
             </w:r>
           </w:p>
         </w:tc>
@@ -3796,7 +3843,7 @@
                 <w:color w:val="181818"/>
                 <w:sz w:val="20"/>
               </w:rPr>
-              <w:t>Async engine. Savepoint/catch; cancel check; CMDT read via ISettingsProvider; hot-loop detection; pre-batch + mid-loop seven-limit guardrail; scoped dedup + upsert by Deduplication_Key__c; two-tier cycle detection; callouts; HTTP 414/431 reactive split-and-retry; handlers; one PE event per execution (suppressed if Disable_Platform_Events__c); self-chain. On completion: when no unprocessed nodes remain, enqueues ResultSerializerQueueable and exits. The engine does not transition Status itself - ResultSerializerQueueable owns the Completed transition. This separation keeps the engine's governor budget independent from the serialization work. DML bulkification: accumulate List&lt;&gt;, single upsert after loop.</w:t>
+              <w:t>Async engine. Savepoint/catch; cancel check; CMDT read via ISettingsProvider; hot-loop detection; pre-batch + mid-loop seven-limit guardrail; scoped dedup + upsert by Deduplication_Key__c; two-tier cycle detection; callouts; HTTP 414/431 reactive split-and-retry; handlers; one PE event per execution (suppressed if Disable_Platform_Events__c); self-chain. Node cap check: at start of execution, if Components_Analyzed__c &gt;= Max_Nodes__c, pause job. Note: soft ceiling - the final batch before the limit may push the count up to Max_Nodes__c + Scan_Batch_Size__c - 1; the check fires on the next execution. On completion: enqueues ResultSerializerQueueable and exits. DML bulkification: accumulate List&lt;&gt;, single upsert after loop.</w:t>
             </w:r>
           </w:p>
         </w:tc>
@@ -3828,7 +3875,7 @@
                 <w:color w:val="181818"/>
                 <w:sz w:val="20"/>
               </w:rPr>
-              <w:t>One-shot Queueable enqueued by the final DependencyQueueable execution. Reads all Metadata_Dependency__c for the job, serializes to JSON, creates ContentVersion with FirstPublishLocationId = jobId (links file directly to job record - no library link, no extra ContentDocumentLink), updates Result_File_Id__c on the job, bulk-deletes all node records, enforces ring buffer (deletes oldest Completed job if count &gt; Max_Stored_Jobs__c). Transitions job to Completed only after all steps succeed. On failure, transitions to Failed via updateJobFailed(). Offloaded from the engine because serializing 5,000+ node records consumes significant heap and CPU that would compete with the final batch of Tooling API work. CRITICAL: Must use Database.setSavepoint() / rollback(sp) pattern - without it, an exception after partial DML leaves the job permanently stuck in Processing. HEAP GUARD: check Limits.getHeapSize() before calling JSON.serialize() on the full node list. At ~2KB per node, 5,000 nodes approaches the 12MB async heap limit. If heap is &gt;50% before serialization, transition to Failed immediately with a descriptive message - do not attempt serialization and run out of heap mid-call. TERMINAL ON FAILURE: if the serializer fails, it transitions to Failed and does not retry. The admin must start a new scan. Partial node records are cleaned up by the nightly batch.</w:t>
+              <w:t>One-shot Queueable enqueued by the final DependencyQueueable execution. Must use Database.setSavepoint()/rollback(sp) - without it, an exception leaves the job stuck in Processing permanently. Steps: heap-check before serializing (at ~2KB/node, 5,000 nodes approaches 12MB async heap limit - fail fast if insufficient); serialize all Metadata_Dependency__c to JSON; create ContentVersion with FirstPublishLocationId = jobId; requery ContentDocumentId from the inserted ContentVersion (NOT available on the inserted record directly - must re-query before storing); set ShareType = V, Visibility = InternalUsers on the auto-created ContentDocumentLink; update Result_File_Id__c; compute and update Result_Summary__c (JSON map of {MetadataType: count} - must be set before Completed so ScanSummaryQueueable has data); bulk-delete node records via DependencyNodeCleanupBatch(jobId, false) (nodes only - job retained); transition to Completed; enforce ring buffer (count AFTER Completed transition - counting before gives off-by-one); enqueue ScanSummaryQueueable. TERMINAL ON FAILURE: transitions to Failed, not retryable.</w:t>
             </w:r>
           </w:p>
         </w:tc>
@@ -3860,7 +3907,7 @@
                 <w:color w:val="181818"/>
                 <w:sz w:val="20"/>
               </w:rPr>
-              <w:t>publishProgress() - one event per execution; checks org daily PE allocation via OrgLimits; auto-suppresses and flips CMDT flag if &gt;80% consumed; appends suppression notice to Error_Status_Message__c for admin visibility; sendCompletionNotification(); enqueues ScanSummaryQueueable at job Completed (does NOT build AI summary inline - offloaded to keep the final serializer's CPU/heap budget available).</w:t>
+              <w:t>publishProgress() - one event per execution; checks OrgLimits DailyStandardVolumePlatformEvents before publishing; auto-suppresses and flips CMDT flag if &gt;80% consumed; appends suppression notice to Error_Status_Message__c for admin visibility; sendCompletionNotification(). Does NOT enqueue ScanSummaryQueueable - that is the responsibility of ResultSerializerQueueable after the Completed transition.</w:t>
             </w:r>
           </w:p>
         </w:tc>
@@ -3924,7 +3971,7 @@
                 <w:color w:val="181818"/>
                 <w:sz w:val="20"/>
               </w:rPr>
-              <w:t>Job discovery batch. MUST implement Database.Stateful - accumulates job IDs across execute() chunks and passes them to finish(). Without Database.Stateful, Apex discards instance state between chunks and finish() receives an empty list, firing zero child batches. start() = Failed/Cancelled jobs past Retention_Hours__c threshold. Completed jobs managed by ring buffer, not time-based deletion. execute() = no DML, accumulates job IDs into a List&lt;Id&gt; instance variable. finish() = fires one DependencyNodeCleanupBatch per accumulated ID. Batch size 10.</w:t>
+              <w:t>Job discovery batch. MUST implement Database.Stateful - accumulates job IDs across execute() chunks. Without it, finish() receives an empty list and fires zero child batches. start() = Failed/Cancelled jobs past Retention_Hours__c. execute() = no DML - accumulates job IDs. finish() = fires one DependencyNodeCleanupBatch(jobId, true) per accumulated ID. Note: Salesforce limits Database.executeBatch() calls per transaction; if large numbers of expired jobs accumulate, finish() submits in groups and relies on subsequent nightly runs to clear the remainder. Batch size 10.</w:t>
             </w:r>
           </w:p>
         </w:tc>
@@ -3956,7 +4003,7 @@
                 <w:color w:val="181818"/>
                 <w:sz w:val="20"/>
               </w:rPr>
-              <w:t>Node + job deletion. Constructor accepts jobId. start() = QueryLocator for child nodes. execute() = delete scope. finish() = delete parent job. Batch size = Cleanup_Chunk_Size__c (default 2,000). No inner loops.</w:t>
+              <w:t>Node deletion batch with optional job deletion. Constructor: DependencyNodeCleanupBatch(String jobId, Boolean deleteJob). deleteJob = true: nightly cleanup path - deletes nodes then job record. deleteJob = false: serializer path - deletes nodes only, job record retained. start() = QueryLocator for child nodes. execute() = delete scope. finish() = deletes job only if deleteJob = true. Batch size = Cleanup_Chunk_Size__c (default 2,000). No inner loops.</w:t>
             </w:r>
           </w:p>
         </w:tc>
@@ -5625,7 +5672,7 @@
                 <w:color w:val="181818"/>
                 <w:sz w:val="20"/>
               </w:rPr>
-              <w:t>Setting FirstPublishLocationId causes Salesforce to automatically create the ContentDocumentLink tied to the job. A manual insert would create a duplicate and fail with a constraint violation.</w:t>
+              <w:t>FirstPublishLocationId causes Salesforce to auto-create the ContentDocumentLink. A manual insert creates a duplicate and fails with a constraint violation.</w:t>
             </w:r>
           </w:p>
         </w:tc>
@@ -5657,7 +5704,7 @@
                 <w:color w:val="181818"/>
                 <w:sz w:val="20"/>
               </w:rPr>
-              <w:t>Update Result_File_Id__c = ContentDocumentId on the job</w:t>
+              <w:t>Requery ContentDocumentId: [SELECT ContentDocumentId FROM ContentVersion WHERE Id = :cv.Id]</w:t>
             </w:r>
           </w:p>
         </w:tc>
@@ -5672,7 +5719,7 @@
                 <w:color w:val="181818"/>
                 <w:sz w:val="20"/>
               </w:rPr>
-              <w:t>Provides getNodeHierarchy() the pointer to load results without querying deleted records</w:t>
+              <w:t>ContentDocumentId is NOT available on the inserted record - Salesforce populates it after insert. Must requery before storing.</w:t>
             </w:r>
           </w:p>
         </w:tc>
@@ -5704,7 +5751,7 @@
                 <w:color w:val="181818"/>
                 <w:sz w:val="20"/>
               </w:rPr>
-              <w:t>Bulk-delete all Metadata_Dependency__c for the job via DependencyNodeCleanupBatch</w:t>
+              <w:t>Set ShareType = V, Visibility = InternalUsers on the auto-created ContentDocumentLink</w:t>
             </w:r>
           </w:p>
         </w:tc>
@@ -5719,7 +5766,7 @@
                 <w:color w:val="181818"/>
                 <w:sz w:val="20"/>
               </w:rPr>
-              <w:t>Frees Data Storage. Master-Detail cascade is bypassed by explicit chunked deletion to avoid the 10,000 DML row trap.</w:t>
+              <w:t>InternalUsers ensures the file is never visible to community or guest users. Do NOT use AllUsers.</w:t>
             </w:r>
           </w:p>
         </w:tc>
@@ -5751,7 +5798,7 @@
                 <w:color w:val="181818"/>
                 <w:sz w:val="20"/>
               </w:rPr>
-              <w:t>Ring buffer: if Completed job count &gt; Max_Stored_Jobs__c, delete oldest</w:t>
+              <w:t>Update Result_File_Id__c = ContentDocumentId on the job</w:t>
             </w:r>
           </w:p>
         </w:tc>
@@ -5766,7 +5813,7 @@
                 <w:color w:val="181818"/>
                 <w:sz w:val="20"/>
               </w:rPr>
-              <w:t>Keeps File Storage bounded regardless of scan volume</w:t>
+              <w:t>Provides getNodeHierarchy() the pointer to load results without querying deleted records</w:t>
             </w:r>
           </w:p>
         </w:tc>
@@ -5798,7 +5845,7 @@
                 <w:color w:val="181818"/>
                 <w:sz w:val="20"/>
               </w:rPr>
-              <w:t>Transition job to Status = Completed, fire notifications</w:t>
+              <w:t>Compute and update Result_Summary__c (JSON map of {MetadataType: count})</w:t>
             </w:r>
           </w:p>
         </w:tc>
@@ -5813,7 +5860,148 @@
                 <w:color w:val="181818"/>
                 <w:sz w:val="20"/>
               </w:rPr>
-              <w:t>Only on full success - ensures no partial state is marked complete</w:t>
+              <w:t>Must be set before transitioning to Completed so ScanSummaryQueueable has data to work with</w:t>
+            </w:r>
+          </w:p>
+        </w:tc>
+      </w:tr>
+      <w:tr>
+        <w:tc>
+          <w:tcPr>
+            <w:tcW w:type="dxa" w:w="3022"/>
+            <w:shd w:val="clear" w:color="auto" w:fill="FFFFFF"/>
+          </w:tcPr>
+          <w:p>
+            <w:r>
+              <w:rPr>
+                <w:color w:val="181818"/>
+                <w:sz w:val="20"/>
+              </w:rPr>
+              <w:t>8</w:t>
+            </w:r>
+          </w:p>
+        </w:tc>
+        <w:tc>
+          <w:tcPr>
+            <w:tcW w:type="dxa" w:w="3022"/>
+            <w:shd w:val="clear" w:color="auto" w:fill="FFFFFF"/>
+          </w:tcPr>
+          <w:p>
+            <w:r>
+              <w:rPr>
+                <w:color w:val="181818"/>
+                <w:sz w:val="20"/>
+              </w:rPr>
+              <w:t>Bulk-delete all Metadata_Dependency__c via DependencyNodeCleanupBatch(jobId, false)</w:t>
+            </w:r>
+          </w:p>
+        </w:tc>
+        <w:tc>
+          <w:tcPr>
+            <w:tcW w:type="dxa" w:w="3022"/>
+            <w:shd w:val="clear" w:color="auto" w:fill="FFFFFF"/>
+          </w:tcPr>
+          <w:p>
+            <w:r>
+              <w:rPr>
+                <w:color w:val="181818"/>
+                <w:sz w:val="20"/>
+              </w:rPr>
+              <w:t>deleteJob=false: nodes deleted, job record retained</w:t>
+            </w:r>
+          </w:p>
+        </w:tc>
+      </w:tr>
+      <w:tr>
+        <w:tc>
+          <w:tcPr>
+            <w:tcW w:type="dxa" w:w="3022"/>
+            <w:shd w:val="clear" w:color="auto" w:fill="F2F4F7"/>
+          </w:tcPr>
+          <w:p>
+            <w:r>
+              <w:rPr>
+                <w:color w:val="181818"/>
+                <w:sz w:val="20"/>
+              </w:rPr>
+              <w:t>9</w:t>
+            </w:r>
+          </w:p>
+        </w:tc>
+        <w:tc>
+          <w:tcPr>
+            <w:tcW w:type="dxa" w:w="3022"/>
+            <w:shd w:val="clear" w:color="auto" w:fill="F2F4F7"/>
+          </w:tcPr>
+          <w:p>
+            <w:r>
+              <w:rPr>
+                <w:color w:val="181818"/>
+                <w:sz w:val="20"/>
+              </w:rPr>
+              <w:t>Transition job to Status = Completed. THEN enforce ring buffer (count after Completed transition).</w:t>
+            </w:r>
+          </w:p>
+        </w:tc>
+        <w:tc>
+          <w:tcPr>
+            <w:tcW w:type="dxa" w:w="3022"/>
+            <w:shd w:val="clear" w:color="auto" w:fill="F2F4F7"/>
+          </w:tcPr>
+          <w:p>
+            <w:r>
+              <w:rPr>
+                <w:color w:val="181818"/>
+                <w:sz w:val="20"/>
+              </w:rPr>
+              <w:t>Counting before gives off-by-one - systematically over-retains one extra job</w:t>
+            </w:r>
+          </w:p>
+        </w:tc>
+      </w:tr>
+      <w:tr>
+        <w:tc>
+          <w:tcPr>
+            <w:tcW w:type="dxa" w:w="3022"/>
+            <w:shd w:val="clear" w:color="auto" w:fill="FFFFFF"/>
+          </w:tcPr>
+          <w:p>
+            <w:r>
+              <w:rPr>
+                <w:color w:val="181818"/>
+                <w:sz w:val="20"/>
+              </w:rPr>
+              <w:t>10</w:t>
+            </w:r>
+          </w:p>
+        </w:tc>
+        <w:tc>
+          <w:tcPr>
+            <w:tcW w:type="dxa" w:w="3022"/>
+            <w:shd w:val="clear" w:color="auto" w:fill="FFFFFF"/>
+          </w:tcPr>
+          <w:p>
+            <w:r>
+              <w:rPr>
+                <w:color w:val="181818"/>
+                <w:sz w:val="20"/>
+              </w:rPr>
+              <w:t>Enqueue ScanSummaryQueueable</w:t>
+            </w:r>
+          </w:p>
+        </w:tc>
+        <w:tc>
+          <w:tcPr>
+            <w:tcW w:type="dxa" w:w="3022"/>
+            <w:shd w:val="clear" w:color="auto" w:fill="FFFFFF"/>
+          </w:tcPr>
+          <w:p>
+            <w:r>
+              <w:rPr>
+                <w:color w:val="181818"/>
+                <w:sz w:val="20"/>
+              </w:rPr>
+              <w:t>Builds plain-English Scan_Summary_Text__c asynchronously</w:t>
             </w:r>
           </w:p>
         </w:tc>
@@ -6045,7 +6233,7 @@
                 <w:color w:val="181818"/>
                 <w:sz w:val="20"/>
               </w:rPr>
-              <w:t>AllUsers</w:t>
+              <w:t>InternalUsers</w:t>
             </w:r>
           </w:p>
         </w:tc>
@@ -6060,7 +6248,7 @@
                 <w:color w:val="181818"/>
                 <w:sz w:val="20"/>
               </w:rPr>
-              <w:t>Scoped by the linked record - "AllUsers" means anyone who can see the job record, which is governed by Private OWD + Permission Set</w:t>
+              <w:t>Ensures the file is never visible to community or guest users even if they have access to the job record. Do NOT use AllUsers - that value includes portal/community users with access to the parent record.</w:t>
             </w:r>
           </w:p>
         </w:tc>
@@ -6078,7 +6266,7 @@
           <w:color w:val="032D60"/>
           <w:sz w:val="19"/>
         </w:rPr>
-        <w:t>Net effect: the result file is visible only to the job owner and users with the MetaMapper_Admin permission set. Community and guest users cannot access it. No admin action is required to enforce this - it follows automatically from the job record's OWD.</w:t>
+        <w:t>ResultSerializerQueueable must query the auto-created ContentDocumentLink and explicitly set ShareType = V and Visibility = InternalUsers. The file is then visible only to the job owner and MetaMapper_Admin users. No admin action required.</w:t>
       </w:r>
     </w:p>
     <w:p>
@@ -6287,7 +6475,7 @@
                 <w:color w:val="181818"/>
                 <w:sz w:val="20"/>
               </w:rPr>
-              <w:t>DependencyCleanupBatch (discovery, batch size 10, no DML in execute()) fires one DependencyNodeCleanupBatch per job. DependencyNodeCleanupBatch deletes Metadata_Dependency__c records in chunks, then deletes the parent job in finish().</w:t>
+              <w:t>DependencyCleanupBatch (discovery, batch size 10, no DML in execute()) fires one DependencyNodeCleanupBatch(jobId, true) per job. deleteJob=true: nodes deleted then job record deleted. DependencyNodeCleanupBatch used with deleteJob=false by ResultSerializerQueueable (nodes only, job retained).</w:t>
             </w:r>
           </w:p>
         </w:tc>
@@ -6899,7 +7087,7 @@
                 <w:color w:val="181818"/>
                 <w:sz w:val="20"/>
               </w:rPr>
-              <w:t>Pause after N stuck retries</w:t>
+              <w:t>Pause after N empty processing cycles</w:t>
             </w:r>
           </w:p>
         </w:tc>
@@ -7145,7 +7333,7 @@
                 <w:color w:val="181818"/>
                 <w:sz w:val="20"/>
               </w:rPr>
-              <w:t>Hard cap on Components_Analyzed__c. When reached, engine pauses and warns the user. Default 5,000 limits peak transient Data Storage during the active scan to ~25MB. Set to 0 to disable. Raise to 50,000+ for production.</w:t>
+              <w:t>Hard cap on Components_Analyzed__c. When reached, engine pauses and warns the user. Serializer ceiling: ResultSerializerQueueable serializes all nodes in a single heap-bound operation. At ~2KB/node, the 12MB async heap supports ~5,000-6,000 nodes. Raising beyond this ceiling without redesigning the serializer for chunked streaming will cause the "results too large" failure. Set to 0 to disable (not recommended without a chunked serializer).</w:t>
             </w:r>
           </w:p>
         </w:tc>
@@ -7509,7 +7697,7 @@
                 <w:color w:val="181818"/>
                 <w:sz w:val="20"/>
               </w:rPr>
-              <w:t>ContentVersion.FirstPublishLocationId = job record Id. No library link. ShareType = V. Visibility = AllUsers (scoped by job OWD). Net effect: only the job owner and MetaMapper_Admin users can access the result file.</w:t>
+              <w:t>ContentVersion.FirstPublishLocationId = job record Id. No library link. ResultSerializerQueueable explicitly sets ShareType = V and Visibility = InternalUsers on the auto-created ContentDocumentLink. InternalUsers ensures community/guest users cannot access the file even if they have access to the job record.</w:t>
             </w:r>
           </w:p>
         </w:tc>
@@ -9380,7 +9568,7 @@
           <w:color w:val="181818"/>
           <w:sz w:val="21"/>
         </w:rPr>
-        <w:t>Keyboard legend: Shift+? opens popover (works even when focus is inside graph canvas). Lists: Ctrl+K = Search graph, Shift+? = Open keyboard legend, Esc = Clear focus/search, arrow keys = traverse nodes, Enter = Open in Setup, right-click = Context menu.</w:t>
+        <w:t>Keyboard legend: Shift+? opens popover (works even when focus is inside graph canvas). Lists: Ctrl+K = Search graph, Shift+? = Open keyboard legend, Esc = Clear focus/search, arrow keys = traverse nodes, Enter = Select node (open Node Details Panel), right-click = Context menu.</w:t>
       </w:r>
     </w:p>
     <w:p>
@@ -9779,7 +9967,7 @@
                 <w:color w:val="181818"/>
                 <w:sz w:val="20"/>
               </w:rPr>
-              <w:t>Click opens in Salesforce Setup</w:t>
+              <w:t>Click selects node and populates Node Details Panel. "Open in Setup" is a button in the panel.</w:t>
             </w:r>
           </w:p>
         </w:tc>
@@ -10759,7 +10947,7 @@
           <w:color w:val="181818"/>
           <w:sz w:val="21"/>
         </w:rPr>
-        <w:t>Keyboard navigation: Tab to focus graph container; arrow keys to traverse nodes; Enter to open in Setup; Shift+? to open keyboard legend from anywhere</w:t>
+        <w:t>Keyboard navigation: Tab to focus graph container; arrow keys to traverse nodes; Enter to select node (populates Node Details Panel); Shift+? to open keyboard legend from anywhere</w:t>
       </w:r>
     </w:p>
     <w:p>
@@ -11014,7 +11202,7 @@
                 <w:color w:val="181818"/>
                 <w:sz w:val="20"/>
               </w:rPr>
-              <w:t>Opens Einstein Copilot with Scan_Summary_Text__c pre-populated. Shown only if Copilot is enabled. If unavailable: show "Einstein Copilot not available in this org." in place of the button - do not hide silently.</w:t>
+              <w:t>Opens Einstein Copilot with Scan_Summary_Text__c pre-populated. Shown only if Copilot is enabled. If unavailable: show "Einstein Copilot not available in this org." in place of the button - do not hide silently. Note: the LWC API for programmatically opening Einstein Copilot with pre-populated text is platform-dependent and subject to Salesforce Copilot API availability - implementation details TBD.</w:t>
             </w:r>
           </w:p>
         </w:tc>
@@ -11503,7 +11691,7 @@
                 <w:color w:val="181818"/>
                 <w:sz w:val="20"/>
               </w:rPr>
-              <w:t>Pause after N stuck retries</w:t>
+              <w:t>Pause after N empty processing cycles</w:t>
             </w:r>
           </w:p>
         </w:tc>
@@ -11518,7 +11706,7 @@
                 <w:color w:val="181818"/>
                 <w:sz w:val="20"/>
               </w:rPr>
-              <w:t>If the analysis retries this many times without finding new components, it pauses and alerts you.</w:t>
+              <w:t>If the analysis runs this many cycles without finding new components, it pauses and alerts you.</w:t>
             </w:r>
           </w:p>
         </w:tc>
@@ -12880,7 +13068,7 @@
                 <w:color w:val="181818"/>
                 <w:sz w:val="20"/>
               </w:rPr>
-              <w:t>Number of times the async scan engine has re-queued itself for this job. Used to detect hot-loop stalls: if this count increases by the Stall Detection Threshold setting without any increase in Components Analyzed, the engine pauses the job automatically. Do not edit manually.</w:t>
+              <w:t>Number of times the async engine has processed a batch for this scan. Incremented on every execution. Used together with Last_Progress_Execution_Count__c for stall detection. Do not edit manually.</w:t>
             </w:r>
           </w:p>
         </w:tc>
@@ -12897,7 +13085,7 @@
                 <w:color w:val="181818"/>
                 <w:sz w:val="20"/>
               </w:rPr>
-              <w:t>Scan_Summary_Text__c</w:t>
+              <w:t>Last_Progress_Execution_Count__c</w:t>
             </w:r>
           </w:p>
         </w:tc>
@@ -12912,7 +13100,7 @@
                 <w:color w:val="181818"/>
                 <w:sz w:val="20"/>
               </w:rPr>
-              <w:t>Plain-English summary of scan results, generated after the scan completes. Displayed in the Scan Summary card. Populated asynchronously - may appear a few seconds after Status = Completed.</w:t>
+              <w:t>Value of Engine_Execution_Count__c at the last execution that made progress (Components_Analyzed__c increased). Reset when new components are found. If the gap between Engine_Execution_Count__c and this field reaches the Stall Detection Threshold, the scan is paused automatically. Persisted on the job record - transient variables reset on each new Queueable instance. Do not edit manually.</w:t>
             </w:r>
           </w:p>
         </w:tc>
@@ -12929,7 +13117,7 @@
                 <w:color w:val="181818"/>
                 <w:sz w:val="20"/>
               </w:rPr>
-              <w:t>Result_File_Id__c</w:t>
+              <w:t>Scan_Summary_Text__c</w:t>
             </w:r>
           </w:p>
         </w:tc>
@@ -12937,6 +13125,38 @@
           <w:tcPr>
             <w:tcW w:type="dxa" w:w="4533"/>
             <w:shd w:val="clear" w:color="auto" w:fill="FFFFFF"/>
+          </w:tcPr>
+          <w:p>
+            <w:r>
+              <w:rPr>
+                <w:color w:val="181818"/>
+                <w:sz w:val="20"/>
+              </w:rPr>
+              <w:t>Plain-English summary of scan results, generated after the scan completes. Displayed in the Scan Summary card. Populated asynchronously - may appear a few seconds after Status = Completed.</w:t>
+            </w:r>
+          </w:p>
+        </w:tc>
+      </w:tr>
+      <w:tr>
+        <w:tc>
+          <w:tcPr>
+            <w:tcW w:type="dxa" w:w="4533"/>
+            <w:shd w:val="clear" w:color="auto" w:fill="F2F4F7"/>
+          </w:tcPr>
+          <w:p>
+            <w:r>
+              <w:rPr>
+                <w:color w:val="181818"/>
+                <w:sz w:val="20"/>
+              </w:rPr>
+              <w:t>Result_File_Id__c</w:t>
+            </w:r>
+          </w:p>
+        </w:tc>
+        <w:tc>
+          <w:tcPr>
+            <w:tcW w:type="dxa" w:w="4533"/>
+            <w:shd w:val="clear" w:color="auto" w:fill="F2F4F7"/>
           </w:tcPr>
           <w:p>
             <w:r>
@@ -13069,7 +13289,7 @@
                 <w:color w:val="181818"/>
                 <w:sz w:val="20"/>
               </w:rPr>
-              <w:t>Reference to the parent dependency in the spanning tree. Null for the root component (the scan target itself). Used to reconstruct the dependency tree in the UI.</w:t>
+              <w:t>Reference to the parent dependency in the spanning tree. Null for the root component (the scan target itself). Self-referential bulk DML constraint: the root node must be committed before children can reference it - insert root first, commit, then bulk-upsert children. Used to reconstruct the dependency tree in the UI.</w:t>
             </w:r>
           </w:p>
         </w:tc>
@@ -13485,7 +13705,7 @@
                 <w:color w:val="181818"/>
                 <w:sz w:val="20"/>
               </w:rPr>
-              <w:t>Internal engine field. Stores concatenated 6-character hash prefixes of ancestor component IDs, used as a fast pre-check index before invoking the full ancestor string scan. If the index contains the short hash for a candidate node, the engine validates conclusively against Ancestor_Path__c before marking the node circular. Must be Long Text 32768 - Text 255 overflows at depth &gt;42. Do not edit manually.</w:t>
+              <w:t>Internal engine field. Stores pipe-delimited 6-character prefixes of each ancestor Metadata_Id__c (e.g. "abc123|def456|..."). Bloom-filter pre-screen: if no prefix match, skip the expensive full Ancestor_Path__c check. If match found, confirm conclusively before marking circular. Must be Long Text 32768 - 7 chars/entry, 1,500-depth tree = ~10,500 chars; Text 255 overflows at depth &gt;36. Do not edit manually.</w:t>
             </w:r>
           </w:p>
         </w:tc>
@@ -14116,7 +14336,7 @@
                 <w:color w:val="181818"/>
                 <w:sz w:val="20"/>
               </w:rPr>
-              <w:t>Maximum number of dependency records this scan is allowed to create. When reached, the scan pauses automatically and prompts the user to raise the limit or accept partial results. This limit is the primary control over peak transient Data Storage usage during an active scan. Default: 5,000 (safe for Developer Sandbox). Set to 0 to disable. Raise to 50,000+ for production orgs with ample storage.</w:t>
+              <w:t>Maximum number of dependency records this scan is allowed to create. When reached, the scan pauses automatically. Default: 5,000. Serializer ceiling: ResultSerializerQueueable serializes all nodes in a single heap-bound JSON operation. At ~2KB/node, the 12MB async heap supports ~5,000-6,000 nodes. Raising beyond this ceiling without redesigning the serializer for chunked streaming will cause the "results too large" failure. Set to 0 to disable (not recommended without a chunked serializer).</w:t>
             </w:r>
           </w:p>
         </w:tc>

</xml_diff>

<commit_message>
MetaMapper v19: fix 3 remaining LWC spec gaps
- Deep-link routing: metaMapperApp reads jobId+nodeId URL params via
  @wire(CurrentPageReference); handles expired job and missing node states
- Breadcrumb ID->Name resolution: Map built from loaded node list, no extra SOQL
- package.xml namespace detection rule: ^[A-Za-z]\w+__\w on Metadata_Name__c,
  field portion only for CustomField

Co-Authored-By: Claude Sonnet 4.6 <noreply@anthropic.com>
</commit_message>
<xml_diff>
--- a/projects/meta-mapper/MetaMapper_Technical_Design.docx
+++ b/projects/meta-mapper/MetaMapper_Technical_Design.docx
@@ -24,7 +24,7 @@
           <w:color w:val="706E6B"/>
           <w:sz w:val="26"/>
         </w:rPr>
-        <w:t>Technical Design Document  |  v18.0</w:t>
+        <w:t>Technical Design Document  |  v19.0</w:t>
       </w:r>
     </w:p>
     <w:p/>
@@ -7955,7 +7955,7 @@
                 <w:color w:val="181818"/>
                 <w:sz w:val="20"/>
               </w:rPr>
-              <w:t>Root shell. Owns jobId state. Switches between input, progress, and results views. Runs pre-flight Named Credential health check on mount.</w:t>
+              <w:t>Root shell. Owns jobId state. Switches between input, progress, and results views. Runs pre-flight Named Credential health check on mount. Deep-link routing: on mount, reads URL params via @wire(CurrentPageReference). If jobId param present, skips input screen and loads results for that job. If nodeId also present, selects that node and opens Node Details Panel after results load. Job expired: shows error state "This scan result is no longer available. It may have been automatically deleted." + "Start a new scan" button. Node not found: loads results normally, shows toast "The linked component could not be found in this scan result."</w:t>
             </w:r>
           </w:p>
         </w:tc>
@@ -8147,7 +8147,7 @@
                 <w:color w:val="181818"/>
                 <w:sz w:val="20"/>
               </w:rPr>
-              <w:t>Sidebar panel. Renders full node data on selection. "Open in Setup" primary action button. "Copy Link" button (deep-link: current URL + ?jobId= + &amp;nodeId=). Closes when selection cleared. Full-screen modal on viewports &lt;1024px.</w:t>
+              <w:t>Sidebar panel. Renders full node data on selection. Ancestor_Path__c breadcrumb: builds a Map&lt;id, name&gt; from the flat node list already loaded in metaMapperResults (passed as prop) - no extra SOQL. Looks up each pipe-delimited ID in the breadcrumb to display Metadata_Name__c. Fallback: render raw ID if not found in map. "Open in Setup" primary action button. "Copy Link" button (deep-link: current URL + ?jobId= + &amp;nodeId=). Closes when selection cleared. Full-screen modal on viewports &lt;1024px.</w:t>
             </w:r>
           </w:p>
         </w:tc>
@@ -12573,7 +12573,7 @@
                 <w:color w:val="181818"/>
                 <w:sz w:val="20"/>
               </w:rPr>
-              <w:t>Valid Salesforce deployment manifest grouped by &lt;types&gt;. Excludes managed package components (namespace prefix detected).</w:t>
+              <w:t>Valid Salesforce deployment manifest grouped by &lt;types&gt;. Excludes managed package components. Namespace detection rule: component excluded if Metadata_Name__c matches ^[A-Za-z]\w+__\w (one or more word characters + double underscore + at least one character). For CustomField (format Object.Field), check the field portion only - the segment after the last dot. Consistent with Salesforce CLI and sfdc-soup behavior.</w:t>
             </w:r>
           </w:p>
         </w:tc>

</xml_diff>

<commit_message>
MetaMapper Technical Design v20 - post-review renames and architecture fixes
Co-Authored-By: Claude Sonnet 4.6 <noreply@anthropic.com>
</commit_message>
<xml_diff>
--- a/projects/meta-mapper/MetaMapper_Technical_Design.docx
+++ b/projects/meta-mapper/MetaMapper_Technical_Design.docx
@@ -24,7 +24,7 @@
           <w:color w:val="706E6B"/>
           <w:sz w:val="26"/>
         </w:rPr>
-        <w:t>Technical Design Document  |  v19.0</w:t>
+        <w:t>Technical Design Document  |  v20.0</w:t>
       </w:r>
     </w:p>
     <w:p/>
@@ -679,7 +679,7 @@
                 <w:color w:val="181818"/>
                 <w:sz w:val="20"/>
               </w:rPr>
-              <w:t>Cycle_Prefix_Index__c stores pipe-delimited 6-character prefixes of each ancestor Metadata_Id__c (e.g. "abc123|def456|..."). Fast bloom-filter pre-check before the full Ancestor_Path__c string scan. Long Text 32768 required - at 7 chars/entry, a 1,500-depth tree yields ~10,500 chars; Text 255 overflows at depth &gt;36. Negligible false-positive rate; full Ancestor_Path__c confirms before marking circular.</w:t>
+              <w:t>Cycle_Detection_Index__c stores pipe-delimited 6-character prefixes of each ancestor Metadata_Id__c (e.g. "abc123|def456|..."). Fast bloom-filter pre-check before the full Ancestor_Path__c string scan. Long Text 32768 required - at 7 chars/entry, a 1,500-depth tree yields ~10,500 chars; Text 255 overflows at depth &gt;36. Negligible false-positive rate; full Ancestor_Path__c confirms before marking circular.</w:t>
             </w:r>
           </w:p>
         </w:tc>
@@ -2788,7 +2788,7 @@
                 <w:color w:val="181818"/>
                 <w:sz w:val="20"/>
               </w:rPr>
-              <w:t>Node_Uniqueness_Key__c</w:t>
+              <w:t>Component_Uniqueness_Key__c</w:t>
             </w:r>
           </w:p>
         </w:tc>
@@ -2835,7 +2835,7 @@
                 <w:color w:val="181818"/>
                 <w:sz w:val="20"/>
               </w:rPr>
-              <w:t>Cycle_Prefix_Index__c</w:t>
+              <w:t>Cycle_Detection_Index__c</w:t>
             </w:r>
           </w:p>
         </w:tc>
@@ -3841,7 +3841,7 @@
                 <w:color w:val="181818"/>
                 <w:sz w:val="20"/>
               </w:rPr>
-              <w:t>Supplemental: WorkflowFieldUpdate (95), ValidationRule regex (65), FlexiPage XML (60), CMT lookups (85), Lookup relationships (95). Regex safety: all patterns must be non-backtracking (no nested quantifiers). Before each regex call, check CPU usage - if &gt;= 60%, skip the field and log a diagnostic notice to Error_Status_Message__c. ValidationRule formula fields in complex orgs can be 10,000+ characters; unbounded backtracking will hit the CPU limit and fail the Queueable.</w:t>
+              <w:t>Supplemental: WorkflowFieldUpdate (95), ValidationRule regex (65), FlexiPage XML (60), CMT lookups (85), Lookup relationships (95). Architecture: all three sub-scans (WFU, VR, CMT) apply the first-parent-only pattern (parents.get(0)) - inserting one node per Metadata_Id__c per sub-scan - enforcing the spanning tree model and preventing duplicate Component_Uniqueness_Key__c values. WFU and VR queries include a pre-check against QUERY_ROW_RESERVE (500) before executing and bind a safeLimit calculated as LimitQueryRows - QueryRows - QUERY_ROW_RESERVE to prevent query row exhaustion. Both WFU and VR queries use List&lt;SObject&gt; + dynamic field access (record.get("FieldName")) rather than typed List&lt;WorkflowFieldUpdate&gt; / List&lt;ValidationRule&gt; - these SObject types are not compile-time accessible in all Salesforce org editions; dynamic access is the correct production-safe pattern. Regex safety: all patterns non-backtracking (no nested quantifiers); CPU check &gt;= 60% before each regex call - if exceeded, skip field and log diagnostic to Error_Status_Message__c.</w:t>
             </w:r>
           </w:p>
         </w:tc>
@@ -3937,7 +3937,7 @@
                 <w:color w:val="181818"/>
                 <w:sz w:val="20"/>
               </w:rPr>
-              <w:t>Async engine. Savepoint/catch; cancel check; CMDT read via IMetaMapperSettingsProvider; hot-loop detection; pre-batch + mid-loop seven-limit guardrail; scoped dedup + upsert by Node_Uniqueness_Key__c; two-tier cycle detection (Ancestor_Path__c depth guard: if (parent.Ancestor_Path__c?.length() ?? 0) + 20 &gt; 32000, mark child Is_Circular__c = true and skip); callouts (IN clause: check if 80 + (batchIds.size() * 19) &gt; 8000 before each call - max safe batch = ~418 IDs); HTTP 414/431 reactive split-and-retry (max 5 levels - at depth 5 mark affected nodes Dependencies_Fetched__c = true and continue); updates job.Last_Result_Count__c after each callout for queryMorePossible calculation; handlers; one PE event per execution (suppressed if Disable_Platform_Events__c); self-chain. updateJobFailed() pre-check: verify Status__c = "Processing" before updating to Failed - if job is already Completed or Cancelled, skip the Failed update entirely. cancelJob() failure handling: DML wrapped in try/catch; on failure throw DependencyJobException with human-readable message. resumeJob() writes Batch_Size_Override__c on job record (persisted, not transient - each new Queueable instance would lose a transient variable). Node cap: if Components_Analyzed__c &gt;= Max_Nodes__c, pause job. On completion: enqueues ResultSerializerQueueable. DML bulkification: accumulate List&lt;&gt;, single upsert after loop.</w:t>
+              <w:t>Async engine. Savepoint/catch; cancel check; CMDT read via IMetaMapperSettingsProvider; hot-loop detection; pre-batch + mid-loop seven-limit guardrail; scoped dedup + upsert by Component_Uniqueness_Key__c; two-tier cycle detection (Ancestor_Path__c depth guard: if (parent.Ancestor_Path__c?.length() ?? 0) + 20 &gt; 32000, mark child Is_Circular__c = true and skip); callouts (IN clause: check if 80 + (batchIds.size() * 19) &gt; 8000 before each call - max safe batch = ~418 IDs); HTTP 414/431 reactive split-and-retry (max 5 levels - at depth 5 mark affected nodes Dependencies_Fetched__c = true and continue); updates job.Last_Result_Count__c after each callout for queryMorePossible calculation; handlers; one PE event per execution (suppressed if Disable_Platform_Events__c); self-chain. updateJobFailed() pre-check: verify Status__c = "Processing" before updating to Failed - if job is already Completed or Cancelled, skip the Failed update entirely. cancelJob() failure handling: DML wrapped in try/catch; on failure throw DependencyJobException with human-readable message. resumeJob() writes Batch_Size_Override__c on job record (persisted, not transient - each new Queueable instance would lose a transient variable). Node cap: if Components_Analyzed__c &gt;= Max_Components__c, pause job. On completion: enqueues ResultSerializerQueueable. DML bulkification: accumulate List&lt;&gt;, single upsert after loop.</w:t>
             </w:r>
           </w:p>
         </w:tc>
@@ -3969,7 +3969,7 @@
                 <w:color w:val="181818"/>
                 <w:sz w:val="20"/>
               </w:rPr>
-              <w:t>One-shot Queueable enqueued by the final DependencyQueueable execution. Must use Database.setSavepoint()/rollback(sp) - without it, an exception leaves the job stuck in Processing permanently. Heap guard: check Components_Analyzed__c * avgBytesPerNode before serializing. Default estimate ~4-6KB/node for deep trees (Ancestor_Path__c and Component_Attributes__c add significant size beyond the base record). At 5,000 nodes that is 20-30MB against a 12MB async heap - practical safe ceiling is ~2,000-3,000 nodes for enterprise orgs with deeply nested metadata. Fail fast via updateJobFailed() with message: "Scan completed but results could not be saved - result set too large for available heap. Reduce Max_Nodes__c and run again." Steps: heap-check; serialize to JSON; create ContentVersion with FirstPublishLocationId = jobId; requery ContentDocumentId (NOT available on the inserted record); set ShareType = V, Visibility = InternalUsers on auto-created ContentDocumentLink; update Result_File_Id__c; compute and update Result_Summary__c (JSON map - must be set before Completed so ScanSummaryQueueable has data); bulk-delete nodes via DependencyNodeCleanupBatch(jobId, CleanupMode.NODES_ONLY); transition to Completed; enforce ring buffer (DELETE query uses FOR UPDATE + ORDER BY Status_Closed_At__c ASC, Id ASC - count AFTER Completed transition; wrap deletion in try/catch - ring buffer failure must NOT fail the job); enqueue ScanSummaryQueueable. TERMINAL ON FAILURE: transitions to Failed, not retryable.</w:t>
+              <w:t>One-shot Queueable enqueued by the final DependencyQueueable execution. Must use Database.setSavepoint()/rollback(sp) - without it, an exception leaves the job stuck in Processing permanently. Heap guard: check Components_Analyzed__c * avgBytesPerNode before serializing. Default estimate ~4-6KB/node for deep trees (Ancestor_Path__c and Component_Attributes__c add significant size beyond the base record). At 5,000 nodes that is 20-30MB against a 12MB async heap - practical safe ceiling is ~2,000-3,000 nodes for enterprise orgs with deeply nested metadata. Fail fast via updateJobFailed() with message: "Scan completed but results could not be saved - result set too large for available heap. Reduce Max_Components__c and run again." Steps: heap-check; serialize to JSON; create ContentVersion with FirstPublishLocationId = jobId; requery ContentDocumentId (NOT available on the inserted record); set ShareType = V, Visibility = InternalUsers on auto-created ContentDocumentLink; update Result_File_Id__c; compute and update Result_Summary__c (JSON map - must be set before Completed so ScanSummaryQueueable has data); bulk-delete nodes via DependencyNodeCleanupBatch(jobId, CleanupMode.NODES_ONLY); transition to Completed; enforce ring buffer (DELETE query uses FOR UPDATE + ORDER BY Status_Closed_At__c ASC, Id ASC - count AFTER Completed transition; wrap deletion in try/catch - ring buffer failure must NOT fail the job); enqueue ScanSummaryQueueable. TERMINAL ON FAILURE: transitions to Failed, not retryable.</w:t>
             </w:r>
           </w:p>
         </w:tc>
@@ -5537,7 +5537,7 @@
           <w:color w:val="181818"/>
           <w:sz w:val="21"/>
         </w:rPr>
-        <w:t>Why this matters: Developer Sandbox has 200MB of both Data Storage and File Storage. With the old model, node records would permanently consume 60-120MB per large scan - potentially exhausting the sandbox allocation. With the hybrid model, completed scans consume ~5KB of Data Storage (job record only) and ~1-3MB of File Storage (the result JSON). Nodes only occupy Data Storage transiently during the active scan, bounded by Max_Nodes__c.</w:t>
+        <w:t>Why this matters: Developer Sandbox has 200MB of both Data Storage and File Storage. With the old model, node records would permanently consume 60-120MB per large scan - potentially exhausting the sandbox allocation. With the hybrid model, completed scans consume ~5KB of Data Storage (job record only) and ~1-3MB of File Storage (the result JSON). Nodes only occupy Data Storage transiently during the active scan, bounded by Max_Components__c.</w:t>
       </w:r>
     </w:p>
     <w:p>
@@ -7367,7 +7367,7 @@
                 <w:color w:val="181818"/>
                 <w:sz w:val="20"/>
               </w:rPr>
-              <w:t>Max_Nodes__c</w:t>
+              <w:t>Max_Components__c</w:t>
             </w:r>
           </w:p>
         </w:tc>
@@ -7599,7 +7599,7 @@
           <w:color w:val="032D60"/>
           <w:sz w:val="19"/>
         </w:rPr>
-        <w:t>Sandbox vs. Production: Developer Sandbox has 200MB of both Data Storage and File Storage. MetaMapper detects IsSandbox = true on createJob() and applies conservative defaults automatically. Retention_Hours__c = 1 (limits Failed/Cancelled node accumulation). Max_Concurrent_Jobs__c = 1 (prevents simultaneous scan peaks). Max_Nodes__c = 5,000 (limits peak transient Data Storage to ~25MB). Storage_Reserve_MB__c = 50. Max_Stored_Jobs__c = 5. These apply only when the CMDT record has never been explicitly saved. Admin-saved values always take precedence.</w:t>
+        <w:t>Sandbox vs. Production: Developer Sandbox has 200MB of both Data Storage and File Storage. MetaMapper detects IsSandbox = true on createJob() and applies conservative defaults automatically. Retention_Hours__c = 1 (limits Failed/Cancelled node accumulation). Max_Concurrent_Jobs__c = 1 (prevents simultaneous scan peaks). Max_Components__c = 5,000 (limits peak transient Data Storage to ~25MB). Storage_Reserve_MB__c = 50. Max_Stored_Jobs__c = 5. These apply only when the CMDT record has never been explicitly saved. Admin-saved values always take precedence.</w:t>
       </w:r>
     </w:p>
     <w:p>
@@ -12332,7 +12332,7 @@
                 <w:color w:val="181818"/>
                 <w:sz w:val="20"/>
               </w:rPr>
-              <w:t>Max_Nodes__c</w:t>
+              <w:t>Max_Components__c</w:t>
             </w:r>
           </w:p>
         </w:tc>
@@ -12961,7 +12961,7 @@
                 <w:color w:val="181818"/>
                 <w:sz w:val="20"/>
               </w:rPr>
-              <w:t>Cycle_Prefix_Index__c 6-char prefix has a negligible collision probability. Full Ancestor_Path__c string is always used to confirm before setting Is_Circular__c = true.</w:t>
+              <w:t>Cycle_Detection_Index__c 6-char prefix has a negligible collision probability. Full Ancestor_Path__c string is always used to confirm before setting Is_Circular__c = true.</w:t>
             </w:r>
           </w:p>
         </w:tc>
@@ -13025,7 +13025,7 @@
                 <w:color w:val="181818"/>
                 <w:sz w:val="20"/>
               </w:rPr>
-              <w:t>MetaMapper uses a hybrid model - node records exist only during the active scan, then are serialized to a Salesforce File and deleted when the job completes. Data Storage impact for a completed job is ~5KB (job record only). File Storage impact is ~1-3MB per completed job. Developer Sandbox has 200MB of both Data Storage and File Storage. During an active scan, nodes temporarily occupy Data Storage - a 5,000-node scan (the sandbox default cap) consumes ~25MB at peak. Conservative sandbox defaults (Max_Nodes__c = 5,000, Storage_Reserve_MB__c = 50) ensure the transient peak stays within safe limits. Failed and Cancelled jobs may retain partial node records until the nightly cleanup batch removes them; Retention_Hours__c = 1 in sandboxes limits this window.</w:t>
+              <w:t>MetaMapper uses a hybrid model - node records exist only during the active scan, then are serialized to a Salesforce File and deleted when the job completes. Data Storage impact for a completed job is ~5KB (job record only). File Storage impact is ~1-3MB per completed job. Developer Sandbox has 200MB of both Data Storage and File Storage. During an active scan, nodes temporarily occupy Data Storage - a 5,000-node scan (the sandbox default cap) consumes ~25MB at peak. Conservative sandbox defaults (Max_Components__c = 5,000, Storage_Reserve_MB__c = 50) ensure the transient peak stays within safe limits. Failed and Cancelled jobs may retain partial node records until the nightly cleanup batch removes them; Retention_Hours__c = 1 in sandboxes limits this window.</w:t>
             </w:r>
           </w:p>
         </w:tc>
@@ -14284,7 +14284,7 @@
                 <w:color w:val="181818"/>
                 <w:sz w:val="20"/>
               </w:rPr>
-              <w:t>Node_Uniqueness_Key__c</w:t>
+              <w:t>Component_Uniqueness_Key__c</w:t>
             </w:r>
           </w:p>
         </w:tc>
@@ -14316,7 +14316,7 @@
                 <w:color w:val="181818"/>
                 <w:sz w:val="20"/>
               </w:rPr>
-              <w:t>Cycle_Prefix_Index__c</w:t>
+              <w:t>Cycle_Detection_Index__c</w:t>
             </w:r>
           </w:p>
         </w:tc>
@@ -14947,7 +14947,7 @@
                 <w:color w:val="181818"/>
                 <w:sz w:val="20"/>
               </w:rPr>
-              <w:t>Max_Nodes__c</w:t>
+              <w:t>Max_Components__c</w:t>
             </w:r>
           </w:p>
         </w:tc>

</xml_diff>